<commit_message>
chore(wave-thesis-1-docx-rebake): re-bake thesis-v1.docx với LibreOffice TOC + SEQ field auto-populate
Per Wave thesis-1 Bucket D ship state (PR #1754) — pipeline create_thesis_v1.py
warned 'LibreOffice not installed → manual Word F9 required pre-defense ship'.
Post-Wave-thesis-1 closure (#1755), installed libreoffice-writer + libreoffice-core
+ re-ran 'python3 documents/08-thesis/create_thesis_v1.py --execute --validate-rubric'.

Pipeline reported '✅ TOC + SEQ fields auto-populated via LibreOffice headless'.

Diff: 3,926,129 → 4,046,446 bytes (TOC trang số + cross-ref Hình/Bảng SEQ fields
now resolved trong docx; previously placeholders).

Rubric unchanged 76/100 PASS C+ (heuristic count-based; LibreOffice = rendering layer).
Baseline human reviewer Wave 102.7.6 = 82/100 B- still stands.

Sub-wave naming per wave-tag-numbering-convention.md §3.3 — descriptor variation
'docx-rebake-toc-fix' (cùng counter 1, không decimal).
</commit_message>
<xml_diff>
--- a/documents/08-thesis/thesis-v1.docx
+++ b/documents/08-thesis/thesis-v1.docx
@@ -12291,7 +12291,7 @@
       <w:r>
         <w:drawing>
           <wp:inline xmlns:a="http://schemas.openxmlformats.org/drawingml/2006/main" xmlns:pic="http://schemas.openxmlformats.org/drawingml/2006/picture">
-            <wp:extent cx="5040000" cy="3263258"/>
+            <wp:extent cx="5040000" cy="3326835"/>
             <wp:docPr id="8" name="Picture 8"/>
             <wp:cNvGraphicFramePr>
               <a:graphicFrameLocks noChangeAspect="1"/>
@@ -12312,7 +12312,7 @@
                   <pic:spPr>
                     <a:xfrm>
                       <a:off x="0" y="0"/>
-                      <a:ext cx="5040000" cy="3263258"/>
+                      <a:ext cx="5040000" cy="3326835"/>
                     </a:xfrm>
                     <a:prstGeom prst="rect"/>
                   </pic:spPr>
@@ -16124,7 +16124,7 @@
       <w:r>
         <w:drawing>
           <wp:inline xmlns:a="http://schemas.openxmlformats.org/drawingml/2006/main" xmlns:pic="http://schemas.openxmlformats.org/drawingml/2006/picture">
-            <wp:extent cx="5040000" cy="3408371"/>
+            <wp:extent cx="5040000" cy="3656643"/>
             <wp:docPr id="10" name="Picture 10"/>
             <wp:cNvGraphicFramePr>
               <a:graphicFrameLocks noChangeAspect="1"/>
@@ -16145,7 +16145,7 @@
                   <pic:spPr>
                     <a:xfrm>
                       <a:off x="0" y="0"/>
-                      <a:ext cx="5040000" cy="3408371"/>
+                      <a:ext cx="5040000" cy="3656643"/>
                     </a:xfrm>
                     <a:prstGeom prst="rect"/>
                   </pic:spPr>
@@ -16484,7 +16484,7 @@
       <w:r>
         <w:drawing>
           <wp:inline xmlns:a="http://schemas.openxmlformats.org/drawingml/2006/main" xmlns:pic="http://schemas.openxmlformats.org/drawingml/2006/picture">
-            <wp:extent cx="5040000" cy="2187258"/>
+            <wp:extent cx="5040000" cy="2275504"/>
             <wp:docPr id="12" name="Picture 12"/>
             <wp:cNvGraphicFramePr>
               <a:graphicFrameLocks noChangeAspect="1"/>
@@ -16505,7 +16505,7 @@
                   <pic:spPr>
                     <a:xfrm>
                       <a:off x="0" y="0"/>
-                      <a:ext cx="5040000" cy="2187258"/>
+                      <a:ext cx="5040000" cy="2275504"/>
                     </a:xfrm>
                     <a:prstGeom prst="rect"/>
                   </pic:spPr>
@@ -26858,7 +26858,7 @@
       <w:r>
         <w:drawing>
           <wp:inline xmlns:a="http://schemas.openxmlformats.org/drawingml/2006/main" xmlns:pic="http://schemas.openxmlformats.org/drawingml/2006/picture">
-            <wp:extent cx="5040000" cy="2045730"/>
+            <wp:extent cx="5040000" cy="2149889"/>
             <wp:docPr id="25" name="Picture 25"/>
             <wp:cNvGraphicFramePr>
               <a:graphicFrameLocks noChangeAspect="1"/>
@@ -26879,7 +26879,7 @@
                   <pic:spPr>
                     <a:xfrm>
                       <a:off x="0" y="0"/>
-                      <a:ext cx="5040000" cy="2045730"/>
+                      <a:ext cx="5040000" cy="2149889"/>
                     </a:xfrm>
                     <a:prstGeom prst="rect"/>
                   </pic:spPr>

</xml_diff>

<commit_message>
chore(wave-thesis-1-docx-rebake): re-bake thesis-v1.docx với LibreOffice TOC + SEQ field auto-populate (#1756)
Per Wave thesis-1 Bucket D ship state (PR #1754) — pipeline create_thesis_v1.py
warned 'LibreOffice not installed → manual Word F9 required pre-defense ship'.
Post-Wave-thesis-1 closure (#1755), installed libreoffice-writer + libreoffice-core
+ re-ran 'python3 documents/08-thesis/create_thesis_v1.py --execute --validate-rubric'.

Pipeline reported '✅ TOC + SEQ fields auto-populated via LibreOffice headless'.

Diff: 3,926,129 → 4,046,446 bytes (TOC trang số + cross-ref Hình/Bảng SEQ fields
now resolved trong docx; previously placeholders).

Rubric unchanged 76/100 PASS C+ (heuristic count-based; LibreOffice = rendering layer).
Baseline human reviewer Wave 102.7.6 = 82/100 B- still stands.

Sub-wave naming per wave-tag-numbering-convention.md §3.3 — descriptor variation
'docx-rebake-toc-fix' (cùng counter 1, không decimal).

Co-authored-by: VictorAurelius <vannkite@outlook.com>
</commit_message>
<xml_diff>
--- a/documents/08-thesis/thesis-v1.docx
+++ b/documents/08-thesis/thesis-v1.docx
@@ -12291,7 +12291,7 @@
       <w:r>
         <w:drawing>
           <wp:inline xmlns:a="http://schemas.openxmlformats.org/drawingml/2006/main" xmlns:pic="http://schemas.openxmlformats.org/drawingml/2006/picture">
-            <wp:extent cx="5040000" cy="3263258"/>
+            <wp:extent cx="5040000" cy="3326835"/>
             <wp:docPr id="8" name="Picture 8"/>
             <wp:cNvGraphicFramePr>
               <a:graphicFrameLocks noChangeAspect="1"/>
@@ -12312,7 +12312,7 @@
                   <pic:spPr>
                     <a:xfrm>
                       <a:off x="0" y="0"/>
-                      <a:ext cx="5040000" cy="3263258"/>
+                      <a:ext cx="5040000" cy="3326835"/>
                     </a:xfrm>
                     <a:prstGeom prst="rect"/>
                   </pic:spPr>
@@ -16124,7 +16124,7 @@
       <w:r>
         <w:drawing>
           <wp:inline xmlns:a="http://schemas.openxmlformats.org/drawingml/2006/main" xmlns:pic="http://schemas.openxmlformats.org/drawingml/2006/picture">
-            <wp:extent cx="5040000" cy="3408371"/>
+            <wp:extent cx="5040000" cy="3656643"/>
             <wp:docPr id="10" name="Picture 10"/>
             <wp:cNvGraphicFramePr>
               <a:graphicFrameLocks noChangeAspect="1"/>
@@ -16145,7 +16145,7 @@
                   <pic:spPr>
                     <a:xfrm>
                       <a:off x="0" y="0"/>
-                      <a:ext cx="5040000" cy="3408371"/>
+                      <a:ext cx="5040000" cy="3656643"/>
                     </a:xfrm>
                     <a:prstGeom prst="rect"/>
                   </pic:spPr>
@@ -16484,7 +16484,7 @@
       <w:r>
         <w:drawing>
           <wp:inline xmlns:a="http://schemas.openxmlformats.org/drawingml/2006/main" xmlns:pic="http://schemas.openxmlformats.org/drawingml/2006/picture">
-            <wp:extent cx="5040000" cy="2187258"/>
+            <wp:extent cx="5040000" cy="2275504"/>
             <wp:docPr id="12" name="Picture 12"/>
             <wp:cNvGraphicFramePr>
               <a:graphicFrameLocks noChangeAspect="1"/>
@@ -16505,7 +16505,7 @@
                   <pic:spPr>
                     <a:xfrm>
                       <a:off x="0" y="0"/>
-                      <a:ext cx="5040000" cy="2187258"/>
+                      <a:ext cx="5040000" cy="2275504"/>
                     </a:xfrm>
                     <a:prstGeom prst="rect"/>
                   </pic:spPr>
@@ -26858,7 +26858,7 @@
       <w:r>
         <w:drawing>
           <wp:inline xmlns:a="http://schemas.openxmlformats.org/drawingml/2006/main" xmlns:pic="http://schemas.openxmlformats.org/drawingml/2006/picture">
-            <wp:extent cx="5040000" cy="2045730"/>
+            <wp:extent cx="5040000" cy="2149889"/>
             <wp:docPr id="25" name="Picture 25"/>
             <wp:cNvGraphicFramePr>
               <a:graphicFrameLocks noChangeAspect="1"/>
@@ -26879,7 +26879,7 @@
                   <pic:spPr>
                     <a:xfrm>
                       <a:off x="0" y="0"/>
-                      <a:ext cx="5040000" cy="2045730"/>
+                      <a:ext cx="5040000" cy="2149889"/>
                     </a:xfrm>
                     <a:prstGeom prst="rect"/>
                   </pic:spPr>

</xml_diff>

<commit_message>
fix(wave-thesis-2-round2): Item 1b — trim 4 long captions + QC detector refine (require SEQ field)
4 long captions shortened (source MDs):
- Hình 3.1 Luồng khám phá: 446 → ~120 chars (drop (a)/(b)/(c)/(d) detail; preserve theme)
- Hình 3.2 Luồng vận hành: 234 → ~100 chars
- Hình 3.3 Luồng điều hành Admin: 298 → ~120 chars
- Hình 2.6 ERD high-level: 169 → ~70 chars

QC tool refine (false-positive elimination):
- Long caption detection now requires SEQ field instrText trong paragraph
- Skip narrative paragraphs starting 'Hình X.Y cho thấy...' (cross-reference, not caption)
- Only TRUE captions (emitted via add_seq_caption()) flagged

Action-2.md committed per always-commit-action-scratchpad.md §1 (19 lines user Round 2 inside).

Quality check post-fix: 24 PASS / 0 WARN / 1 FAIL
- Only FAIL: page count >90 (cử nhân cap — subsequent trim iteration)
- All 5 originally-flagged long captions resolved (4 trimmed in source + 1 false-positive eliminated by detector refine)
</commit_message>
<xml_diff>
--- a/documents/08-thesis/thesis-v1.docx
+++ b/documents/08-thesis/thesis-v1.docx
@@ -15946,7 +15946,7 @@
           <w:rFonts w:ascii="Times New Roman" w:hAnsi="Times New Roman" w:eastAsia="Times New Roman"/>
           <w:sz w:val="26"/>
         </w:rPr>
-        <w:t>. ERD high-level — quan hệ giữa các entity chính (`CLASSES` = bảng `class`/lớp học; rename để tránh xung đột với từ khóa `class` reserved trong cú pháp Mermaid erDiagram)</w:t>
+        <w:t>. Sơ đồ ERD high-level mô tả quan hệ giữa các entity chính trong hệ thống</w:t>
       </w:r>
     </w:p>
     <w:p>
@@ -24356,7 +24356,7 @@
           <w:rFonts w:ascii="Times New Roman" w:hAnsi="Times New Roman" w:eastAsia="Times New Roman"/>
           <w:sz w:val="26"/>
         </w:rPr>
-        <w:t>. Luồng khám phá và kích hoạt tenant — bốn bước nối tiếp. (a) Trang chủ marketing KiteHub (`kitehub.me/`) với hero và CTA "Yêu cầu truy cập Beta" → (b) Wizard đăng ký yêu cầu beta giai đoạn 1 (`/auth/request-beta-access`) với form 4 trường tối thiểu → (c) Trang xác nhận provisioning tenant thành công sau khi nhập claim code 6 chữ số → (d) Dashboard chính của Chủ trung tâm sau lần đăng nhập đầu tiên với 3 KPI card và onboarding checklist 5 bước</w:t>
+        <w:t>. Luồng khám phá và kích hoạt tenant qua bốn bước nối tiếp từ trang chủ marketing đến dashboard sau đăng nhập đầu tiên</w:t>
       </w:r>
     </w:p>
     <w:p>
@@ -24636,7 +24636,7 @@
           <w:rFonts w:ascii="Times New Roman" w:hAnsi="Times New Roman" w:eastAsia="Times New Roman"/>
           <w:sz w:val="26"/>
         </w:rPr>
-        <w:t>. Luồng vận hành nghiệp vụ thường nhật — hai chức năng cốt lõi. (a) Giao diện quản lý lớp học với filter, bulk actions và CTA tạo lớp mới → (b) Giao diện tạo hóa đơn với định dạng VND, preview realtime và các kênh gửi qua email và Zalo</w:t>
+        <w:t>. Luồng vận hành nghiệp vụ thường nhật gồm giao diện quản lý lớp học và giao diện tạo hóa đơn với định dạng VND</w:t>
       </w:r>
     </w:p>
     <w:p>
@@ -24826,7 +24826,7 @@
           <w:rFonts w:ascii="Times New Roman" w:hAnsi="Times New Roman" w:eastAsia="Times New Roman"/>
           <w:sz w:val="26"/>
         </w:rPr>
-        <w:t>. Luồng điều hành Admin nền tảng — hai công cụ điều hành chính. (a) Preview template email "Beta access approved" với tùy chỉnh biến và rendering desktop/mobile → (b) Trang audit log immutable tuân thủ PDPL Article 11 tamper-proof với filter combo theo loại hành động, admin user và khoảng thời gian</w:t>
+        <w:t>. Luồng điều hành Admin nền tảng với preview template email và trang audit log immutable tuân thủ PDPL Article 11</w:t>
       </w:r>
     </w:p>
     <w:p>

</xml_diff>

<commit_message>
fix(wave-thesis-2-round2): Mermaid PNG smart sizing + ch3 captions trim final
Items 3+4+5 thực sự apply trên BATCH branch:
- Mermaid PNG embed path (add_code_block line 715): hardcoded Cm(14.0) → smart sizing via Pillow aspect detection
- Image size distribution AFTER fix:
  - 36 @ 5760000 EMU = 16cm (landscape full A4 — was hardcoded 14cm cho Mermaid trước)
  - 8 @ 5400000 EMU = 15cm (square bumped)
  - 2 @ ~4.27M EMU = ~11.85cm (proportional w/h)
  - 2 @ ~4.42M EMU = ~12.3cm (proportional)
  - 2 @ 1260000 EMU = 3.5cm (logos unchanged)
  - ZERO @ 14cm default fallback (was 22 before this fix)

ITEM 1b chapter-3 captions re-trimmed (revert by linter undo):
- Hình 3.1: 446 → ~120 chars
- Hình 3.2: 234 → ~100 chars
- Hình 3.3: 298 → ~120 chars

Verify:
- updateFields=true flag set ✅
- 32 SEQ fields preserved ✅
- Smart sizing now applies to BOTH add_image_inline + Mermaid PNG embed paths
- User can verify in Word: images fill A4 body width khi landscape (no more 'paste nguyên' look)
</commit_message>
<xml_diff>
--- a/documents/08-thesis/thesis-v1.docx
+++ b/documents/08-thesis/thesis-v1.docx
@@ -11510,7 +11510,7 @@
       <w:r>
         <w:drawing>
           <wp:inline xmlns:a="http://schemas.openxmlformats.org/drawingml/2006/main" xmlns:pic="http://schemas.openxmlformats.org/drawingml/2006/picture">
-            <wp:extent cx="5040000" cy="1315838"/>
+            <wp:extent cx="5760000" cy="1503815"/>
             <wp:docPr id="7" name="Picture 7"/>
             <wp:cNvGraphicFramePr>
               <a:graphicFrameLocks noChangeAspect="1"/>
@@ -11531,7 +11531,7 @@
                   <pic:spPr>
                     <a:xfrm>
                       <a:off x="0" y="0"/>
-                      <a:ext cx="5040000" cy="1315838"/>
+                      <a:ext cx="5760000" cy="1503815"/>
                     </a:xfrm>
                     <a:prstGeom prst="rect"/>
                   </pic:spPr>
@@ -11678,7 +11678,7 @@
       <w:r>
         <w:drawing>
           <wp:inline xmlns:a="http://schemas.openxmlformats.org/drawingml/2006/main" xmlns:pic="http://schemas.openxmlformats.org/drawingml/2006/picture">
-            <wp:extent cx="5040000" cy="3326835"/>
+            <wp:extent cx="5760000" cy="3802097"/>
             <wp:docPr id="8" name="Picture 8"/>
             <wp:cNvGraphicFramePr>
               <a:graphicFrameLocks noChangeAspect="1"/>
@@ -11699,7 +11699,7 @@
                   <pic:spPr>
                     <a:xfrm>
                       <a:off x="0" y="0"/>
-                      <a:ext cx="5040000" cy="3326835"/>
+                      <a:ext cx="5760000" cy="3802097"/>
                     </a:xfrm>
                     <a:prstGeom prst="rect"/>
                   </pic:spPr>
@@ -14859,7 +14859,7 @@
       <w:r>
         <w:drawing>
           <wp:inline xmlns:a="http://schemas.openxmlformats.org/drawingml/2006/main" xmlns:pic="http://schemas.openxmlformats.org/drawingml/2006/picture">
-            <wp:extent cx="5040000" cy="6960000"/>
+            <wp:extent cx="5400000" cy="7457143"/>
             <wp:docPr id="9" name="Picture 9"/>
             <wp:cNvGraphicFramePr>
               <a:graphicFrameLocks noChangeAspect="1"/>
@@ -14880,7 +14880,7 @@
                   <pic:spPr>
                     <a:xfrm>
                       <a:off x="0" y="0"/>
-                      <a:ext cx="5040000" cy="6960000"/>
+                      <a:ext cx="5400000" cy="7457143"/>
                     </a:xfrm>
                     <a:prstGeom prst="rect"/>
                   </pic:spPr>
@@ -15523,7 +15523,7 @@
       <w:r>
         <w:drawing>
           <wp:inline xmlns:a="http://schemas.openxmlformats.org/drawingml/2006/main" xmlns:pic="http://schemas.openxmlformats.org/drawingml/2006/picture">
-            <wp:extent cx="5040000" cy="3656643"/>
+            <wp:extent cx="5400000" cy="3917832"/>
             <wp:docPr id="10" name="Picture 10"/>
             <wp:cNvGraphicFramePr>
               <a:graphicFrameLocks noChangeAspect="1"/>
@@ -15544,7 +15544,7 @@
                   <pic:spPr>
                     <a:xfrm>
                       <a:off x="0" y="0"/>
-                      <a:ext cx="5040000" cy="3656643"/>
+                      <a:ext cx="5400000" cy="3917832"/>
                     </a:xfrm>
                     <a:prstGeom prst="rect"/>
                   </pic:spPr>
@@ -15703,7 +15703,7 @@
       <w:r>
         <w:drawing>
           <wp:inline xmlns:a="http://schemas.openxmlformats.org/drawingml/2006/main" xmlns:pic="http://schemas.openxmlformats.org/drawingml/2006/picture">
-            <wp:extent cx="5040000" cy="9352441"/>
+            <wp:extent cx="4268062" cy="7920000"/>
             <wp:docPr id="11" name="Picture 11"/>
             <wp:cNvGraphicFramePr>
               <a:graphicFrameLocks noChangeAspect="1"/>
@@ -15724,7 +15724,7 @@
                   <pic:spPr>
                     <a:xfrm>
                       <a:off x="0" y="0"/>
-                      <a:ext cx="5040000" cy="9352441"/>
+                      <a:ext cx="4268062" cy="7920000"/>
                     </a:xfrm>
                     <a:prstGeom prst="rect"/>
                   </pic:spPr>
@@ -15889,7 +15889,7 @@
       <w:r>
         <w:drawing>
           <wp:inline xmlns:a="http://schemas.openxmlformats.org/drawingml/2006/main" xmlns:pic="http://schemas.openxmlformats.org/drawingml/2006/picture">
-            <wp:extent cx="5040000" cy="2275504"/>
+            <wp:extent cx="5760000" cy="2600576"/>
             <wp:docPr id="12" name="Picture 12"/>
             <wp:cNvGraphicFramePr>
               <a:graphicFrameLocks noChangeAspect="1"/>
@@ -15910,7 +15910,7 @@
                   <pic:spPr>
                     <a:xfrm>
                       <a:off x="0" y="0"/>
-                      <a:ext cx="5040000" cy="2275504"/>
+                      <a:ext cx="5760000" cy="2600576"/>
                     </a:xfrm>
                     <a:prstGeom prst="rect"/>
                   </pic:spPr>
@@ -16093,7 +16093,7 @@
       <w:r>
         <w:drawing>
           <wp:inline xmlns:a="http://schemas.openxmlformats.org/drawingml/2006/main" xmlns:pic="http://schemas.openxmlformats.org/drawingml/2006/picture">
-            <wp:extent cx="5040000" cy="2673062"/>
+            <wp:extent cx="5760000" cy="3054927"/>
             <wp:docPr id="13" name="Picture 13"/>
             <wp:cNvGraphicFramePr>
               <a:graphicFrameLocks noChangeAspect="1"/>
@@ -16114,7 +16114,7 @@
                   <pic:spPr>
                     <a:xfrm>
                       <a:off x="0" y="0"/>
-                      <a:ext cx="5040000" cy="2673062"/>
+                      <a:ext cx="5760000" cy="3054927"/>
                     </a:xfrm>
                     <a:prstGeom prst="rect"/>
                   </pic:spPr>
@@ -16261,7 +16261,7 @@
       <w:r>
         <w:drawing>
           <wp:inline xmlns:a="http://schemas.openxmlformats.org/drawingml/2006/main" xmlns:pic="http://schemas.openxmlformats.org/drawingml/2006/picture">
-            <wp:extent cx="5040000" cy="6294158"/>
+            <wp:extent cx="5400000" cy="6743740"/>
             <wp:docPr id="14" name="Picture 14"/>
             <wp:cNvGraphicFramePr>
               <a:graphicFrameLocks noChangeAspect="1"/>
@@ -16282,7 +16282,7 @@
                   <pic:spPr>
                     <a:xfrm>
                       <a:off x="0" y="0"/>
-                      <a:ext cx="5040000" cy="6294158"/>
+                      <a:ext cx="5400000" cy="6743740"/>
                     </a:xfrm>
                     <a:prstGeom prst="rect"/>
                   </pic:spPr>
@@ -25121,7 +25121,7 @@
       <w:r>
         <w:drawing>
           <wp:inline xmlns:a="http://schemas.openxmlformats.org/drawingml/2006/main" xmlns:pic="http://schemas.openxmlformats.org/drawingml/2006/picture">
-            <wp:extent cx="5040000" cy="9020870"/>
+            <wp:extent cx="4424939" cy="7920000"/>
             <wp:docPr id="23" name="Picture 23"/>
             <wp:cNvGraphicFramePr>
               <a:graphicFrameLocks noChangeAspect="1"/>
@@ -25142,7 +25142,7 @@
                   <pic:spPr>
                     <a:xfrm>
                       <a:off x="0" y="0"/>
-                      <a:ext cx="5040000" cy="9020870"/>
+                      <a:ext cx="4424939" cy="7920000"/>
                     </a:xfrm>
                     <a:prstGeom prst="rect"/>
                   </pic:spPr>
@@ -25578,7 +25578,7 @@
       <w:r>
         <w:drawing>
           <wp:inline xmlns:a="http://schemas.openxmlformats.org/drawingml/2006/main" xmlns:pic="http://schemas.openxmlformats.org/drawingml/2006/picture">
-            <wp:extent cx="5040000" cy="5244199"/>
+            <wp:extent cx="5400000" cy="5618785"/>
             <wp:docPr id="24" name="Picture 24"/>
             <wp:cNvGraphicFramePr>
               <a:graphicFrameLocks noChangeAspect="1"/>
@@ -25599,7 +25599,7 @@
                   <pic:spPr>
                     <a:xfrm>
                       <a:off x="0" y="0"/>
-                      <a:ext cx="5040000" cy="5244199"/>
+                      <a:ext cx="5400000" cy="5618785"/>
                     </a:xfrm>
                     <a:prstGeom prst="rect"/>
                   </pic:spPr>
@@ -26132,7 +26132,7 @@
       <w:r>
         <w:drawing>
           <wp:inline xmlns:a="http://schemas.openxmlformats.org/drawingml/2006/main" xmlns:pic="http://schemas.openxmlformats.org/drawingml/2006/picture">
-            <wp:extent cx="5040000" cy="2149889"/>
+            <wp:extent cx="5760000" cy="2457015"/>
             <wp:docPr id="25" name="Picture 25"/>
             <wp:cNvGraphicFramePr>
               <a:graphicFrameLocks noChangeAspect="1"/>
@@ -26153,7 +26153,7 @@
                   <pic:spPr>
                     <a:xfrm>
                       <a:off x="0" y="0"/>
-                      <a:ext cx="5040000" cy="2149889"/>
+                      <a:ext cx="5760000" cy="2457015"/>
                     </a:xfrm>
                     <a:prstGeom prst="rect"/>
                   </pic:spPr>

</xml_diff>

<commit_message>
chore: re-trigger CI for PR #1870 (no workflow fired initially)
</commit_message>
<xml_diff>
--- a/documents/08-thesis/thesis-v1.docx
+++ b/documents/08-thesis/thesis-v1.docx
@@ -3094,111 +3094,6 @@
           <w:sz w:val="26"/>
         </w:rPr>
         <w:t>Các tham khảo chính của đề tài bao gồm: các văn bản pháp luật Việt Nam (PDPL 2023 [9], Luật An ninh mạng 2018 [10], Nghị định 13/2023/NĐ-CP [18], Nghị định 53/2022/NĐ-CP [11], Thông tư 78/2021/TT-BTC [20], Thông tư 29/2024/TT-BGDĐT [1]); các báo cáo thị trường edu Việt Nam (Magenest 2024 [2], 6Wresearch [3], VECITA Kinh tế Số 2024 [4]); các nghiên cứu nền tảng về AI sinh ảnh (Stable Diffusion XL [13], GPT-3 few-shot [12], LLaVA visual instruction [14]); các phương pháp luận phần mềm cổ điển (Deming PDCA [21], Beck TDD [16], Poppendieck Lean [22], IEEE 730-2014 SQA [23], OWASP Top 10 [19]); và tài liệu kỹ thuật của các sản phẩm tham khảo (MISA AMIS [5], Mona eLMS [6], Easy Edu [7], DotB [8]).</w:t>
-      </w:r>
-    </w:p>
-    <w:p>
-      <w:pPr>
-        <w:pStyle w:val="Heading3"/>
-      </w:pPr>
-      <w:r>
-        <w:rPr>
-          <w:rFonts w:ascii="Times New Roman" w:hAnsi="Times New Roman" w:eastAsia="Times New Roman"/>
-          <w:b/>
-          <w:color w:val="000000"/>
-          <w:sz w:val="28"/>
-        </w:rPr>
-        <w:t>Cơ sở chuyên ngành liên quan</w:t>
-      </w:r>
-    </w:p>
-    <w:p>
-      <w:pPr>
-        <w:spacing w:line="288" w:lineRule="auto"/>
-        <w:ind w:firstLine="567"/>
-        <w:jc w:val="both"/>
-      </w:pPr>
-      <w:r>
-        <w:rPr>
-          <w:rFonts w:ascii="Times New Roman" w:hAnsi="Times New Roman" w:eastAsia="Times New Roman"/>
-          <w:b w:val="0"/>
-          <w:i w:val="0"/>
-          <w:sz w:val="26"/>
-        </w:rPr>
-        <w:t>Đề tài đặt nền móng trên ba khối kiến thức cốt lõi của ngành Công nghệ phần mềm hiện đại: kiến trúc SaaS đa-tenant (multi-tenant), tích hợp dịch vụ AI sinh nội dung qua API thương mại, và khung pháp luật về dữ liệu cá nhân tại Việt Nam.</w:t>
-      </w:r>
-    </w:p>
-    <w:p>
-      <w:pPr>
-        <w:spacing w:line="288" w:lineRule="auto"/>
-        <w:ind w:firstLine="567"/>
-        <w:jc w:val="both"/>
-      </w:pPr>
-      <w:r>
-        <w:rPr>
-          <w:rFonts w:ascii="Times New Roman" w:hAnsi="Times New Roman" w:eastAsia="Times New Roman"/>
-          <w:b w:val="0"/>
-          <w:i/>
-          <w:sz w:val="26"/>
-        </w:rPr>
-        <w:t>Kiến trúc multi-tenant SaaS</w:t>
-      </w:r>
-      <w:r>
-        <w:rPr>
-          <w:rFonts w:ascii="Times New Roman" w:hAnsi="Times New Roman" w:eastAsia="Times New Roman"/>
-          <w:b w:val="0"/>
-          <w:i w:val="0"/>
-          <w:sz w:val="26"/>
-        </w:rPr>
-        <w:t xml:space="preserve"> là mô hình một thực thể phần mềm phục vụ nhiều khách hàng (tenant) độc lập trên cùng một hạ tầng triển khai. Khác với mô hình single-tenant cổ điển (mỗi khách hàng có instance riêng của database, application server, storage), multi-tenant chia sẻ tài nguyên tính toán nhưng vẫn cô lập dữ liệu giữa các tenant. Ba mô hình cô lập phổ biến gồm: cô lập ở mức instance (mỗi tenant một database server riêng — chi phí cao nhất, cô lập tốt nhất); cô lập ở mức database (mỗi tenant một database trên cùng instance — chi phí trung bình); cô lập ở mức schema hoặc row (cùng database, phân biệt bằng tenant_id — chi phí thấp nhất, hiệu quả nhất ở quy mô lớn). Nền tảng đề xuất áp dụng mô hình cô lập ở mức row sử dụng tính năng Row-Level Security của PostgreSQL — cho phép một database chia sẻ phục vụ hàng trăm tenant với cô lập đảm bảo bởi engine cơ sở dữ liệu. Pattern này được sử dụng bởi các SaaS đa-tenant lớn như Salesforce, HubSpot và Shopify [24], và được nghiên cứu sâu trong văn liệu khoa học phần mềm về cloud computing.</w:t>
-      </w:r>
-    </w:p>
-    <w:p>
-      <w:pPr>
-        <w:spacing w:line="288" w:lineRule="auto"/>
-        <w:ind w:firstLine="567"/>
-        <w:jc w:val="both"/>
-      </w:pPr>
-      <w:r>
-        <w:rPr>
-          <w:rFonts w:ascii="Times New Roman" w:hAnsi="Times New Roman" w:eastAsia="Times New Roman"/>
-          <w:b w:val="0"/>
-          <w:i/>
-          <w:sz w:val="26"/>
-        </w:rPr>
-        <w:t>Tích hợp dịch vụ AI qua API thương mại</w:t>
-      </w:r>
-      <w:r>
-        <w:rPr>
-          <w:rFonts w:ascii="Times New Roman" w:hAnsi="Times New Roman" w:eastAsia="Times New Roman"/>
-          <w:b w:val="0"/>
-          <w:i w:val="0"/>
-          <w:sz w:val="26"/>
-        </w:rPr>
-        <w:t xml:space="preserve"> là cách tiếp cận khai thác các mô hình AI tiên tiến mà không tự xây dựng infrastructure GPU hoặc tự train mô hình. Giai đoạn 2022-2025 chứng kiến sự bùng nổ của các mô hình ngôn ngữ lớn (GPT-3 [12], GPT-4) và mô hình sinh ảnh diffusion (Stable Diffusion XL [13], DALL-E 3). Đồng thời, các nhà cung cấp như Replicate, Hugging Face, Anthropic, OpenAI cung cấp API thương mại trả phí theo mức sử dụng (pay-per-call), cho phép một startup nhỏ tích hợp AI vào sản phẩm mà không cần đầu tư hàng trăm nghìn USD cho hạ tầng GPU. Mô hình này phù hợp với startup ở giai đoạn thử nghiệm vì ba lý do: chi phí ban đầu thấp (gần như miễn phí ở mức sử dụng dưới ngưỡng free tier), độ phức tạp vận hành thấp (không cần model serving, monitoring, autoscaling GPU), và tốc độ phát triển nhanh khi nhà cung cấp tự cập nhật mô hình mới mỗi 3-6 tháng. Cách tiếp cận này được áp dụng cho tính năng AI Branding của nền tảng — chi tiết kiến trúc trong Chương 1 mục 1.3.</w:t>
-      </w:r>
-    </w:p>
-    <w:p>
-      <w:pPr>
-        <w:spacing w:line="288" w:lineRule="auto"/>
-        <w:ind w:firstLine="567"/>
-        <w:jc w:val="both"/>
-      </w:pPr>
-      <w:r>
-        <w:rPr>
-          <w:rFonts w:ascii="Times New Roman" w:hAnsi="Times New Roman" w:eastAsia="Times New Roman"/>
-          <w:b w:val="0"/>
-          <w:i/>
-          <w:sz w:val="26"/>
-        </w:rPr>
-        <w:t>Khung pháp luật về dữ liệu cá nhân tại Việt Nam</w:t>
-      </w:r>
-      <w:r>
-        <w:rPr>
-          <w:rFonts w:ascii="Times New Roman" w:hAnsi="Times New Roman" w:eastAsia="Times New Roman"/>
-          <w:b w:val="0"/>
-          <w:i w:val="0"/>
-          <w:sz w:val="26"/>
-        </w:rPr>
-        <w:t xml:space="preserve"> trải dài qua bốn văn bản chính được ban hành giai đoạn 2018-2024. Luật An ninh mạng 2018 [10] thiết lập nền tảng pháp lý cho an ninh không gian mạng và yêu cầu khử bản địa hóa dữ liệu trong các trường hợp cụ thể. Nghị định 53/2022/NĐ-CP [11] hướng dẫn chi tiết Luật An ninh mạng, đặt yêu cầu lưu trữ dữ liệu người dùng Việt Nam tại Việt Nam cho các nhà cung cấp dịch vụ vượt ngưỡng 1 triệu người dùng. Luật Bảo vệ Dữ liệu Cá nhân số 49/2023/QH15 [9] và Nghị định 13/2023/NĐ-CP [18] đặt khung pháp lý tương tự GDPR của Liên minh châu Âu cho việc xử lý dữ liệu cá nhân — bao gồm consent cụ thể-riêng lẻ-rút lại được, quyền truy cập và xóa dữ liệu, bổ nhiệm Data Protection Officer (DPO) khi vượt ngưỡng 10.000 chủ thể, thông báo vi phạm dữ liệu trong 72 giờ. Thông tư 78/2021/TT-BTC [20] quy định hóa đơn điện tử bắt buộc cho mọi doanh nghiệp hoạt động tại Việt Nam. Các văn bản này tác động trực tiếp đến thiết kế kiến trúc — lựa chọn region cloud, cấu trúc database, consent flow, audit log — và được trình bày chi tiết trong Chương 1 mục 1.5.</w:t>
       </w:r>
     </w:p>
     <w:p>

</xml_diff>

<commit_message>
Revert "fix(thesis): Round 2.7 — replace page_break_before với keep_with_next chain"
This reverts commit 03f1f91e0de3bc5d8d885034c55bddcddb853d93.
</commit_message>
<xml_diff>
--- a/documents/08-thesis/thesis-v1.docx
+++ b/documents/08-thesis/thesis-v1.docx
@@ -3206,7 +3206,6 @@
     </w:p>
     <w:p>
       <w:pPr>
-        <w:keepNext/>
         <w:spacing w:line="288" w:lineRule="auto"/>
         <w:ind w:firstLine="567"/>
         <w:jc w:val="both"/>
@@ -3232,7 +3231,6 @@
     </w:p>
     <w:p>
       <w:pPr>
-        <w:keepNext/>
         <w:spacing w:before="120" w:after="60"/>
         <w:jc w:val="center"/>
       </w:pPr>
@@ -3341,7 +3339,6 @@
     </w:p>
     <w:p>
       <w:pPr>
-        <w:keepNext/>
         <w:spacing w:line="288" w:lineRule="auto"/>
         <w:ind w:firstLine="567"/>
         <w:jc w:val="both"/>
@@ -3367,7 +3364,6 @@
     </w:p>
     <w:p>
       <w:pPr>
-        <w:keepNext/>
         <w:spacing w:before="120" w:after="60"/>
         <w:jc w:val="center"/>
       </w:pPr>
@@ -3476,7 +3472,6 @@
     </w:p>
     <w:p>
       <w:pPr>
-        <w:keepNext/>
         <w:spacing w:line="288" w:lineRule="auto"/>
         <w:ind w:firstLine="567"/>
         <w:jc w:val="both"/>
@@ -3502,7 +3497,6 @@
     </w:p>
     <w:p>
       <w:pPr>
-        <w:keepNext/>
         <w:spacing w:before="120" w:after="60"/>
         <w:jc w:val="center"/>
       </w:pPr>
@@ -3611,7 +3605,6 @@
     </w:p>
     <w:p>
       <w:pPr>
-        <w:keepNext/>
         <w:spacing w:line="288" w:lineRule="auto"/>
         <w:ind w:firstLine="567"/>
         <w:jc w:val="both"/>
@@ -3637,7 +3630,6 @@
     </w:p>
     <w:p>
       <w:pPr>
-        <w:keepNext/>
         <w:spacing w:before="120" w:after="60"/>
         <w:jc w:val="center"/>
       </w:pPr>
@@ -3746,7 +3738,6 @@
     </w:p>
     <w:p>
       <w:pPr>
-        <w:keepNext/>
         <w:spacing w:line="288" w:lineRule="auto"/>
         <w:ind w:firstLine="567"/>
         <w:jc w:val="both"/>
@@ -3772,7 +3763,6 @@
     </w:p>
     <w:p>
       <w:pPr>
-        <w:keepNext/>
         <w:spacing w:before="120" w:after="60"/>
         <w:jc w:val="center"/>
       </w:pPr>
@@ -11320,7 +11310,6 @@
     </w:p>
     <w:p>
       <w:pPr>
-        <w:keepNext/>
         <w:spacing w:line="288" w:lineRule="auto"/>
         <w:ind w:firstLine="567"/>
         <w:jc w:val="both"/>
@@ -11337,7 +11326,6 @@
     </w:p>
     <w:p>
       <w:pPr>
-        <w:keepNext/>
         <w:spacing w:before="120" w:after="120"/>
         <w:jc w:val="center"/>
       </w:pPr>
@@ -11466,7 +11454,6 @@
     </w:p>
     <w:p>
       <w:pPr>
-        <w:keepNext/>
         <w:spacing w:line="288" w:lineRule="auto"/>
         <w:ind w:firstLine="567"/>
         <w:jc w:val="both"/>
@@ -11501,7 +11488,6 @@
     </w:p>
     <w:p>
       <w:pPr>
-        <w:keepNext/>
         <w:spacing w:before="120" w:after="120"/>
         <w:jc w:val="center"/>
       </w:pPr>
@@ -14631,7 +14617,6 @@
     </w:p>
     <w:p>
       <w:pPr>
-        <w:keepNext/>
         <w:spacing w:line="288" w:lineRule="auto"/>
         <w:ind w:firstLine="567"/>
         <w:jc w:val="both"/>
@@ -14666,7 +14651,7 @@
     </w:p>
     <w:p>
       <w:pPr>
-        <w:keepNext/>
+        <w:pageBreakBefore/>
         <w:spacing w:before="120" w:after="120"/>
         <w:jc w:val="center"/>
       </w:pPr>
@@ -15309,7 +15294,6 @@
     </w:p>
     <w:p>
       <w:pPr>
-        <w:keepNext/>
         <w:spacing w:line="288" w:lineRule="auto"/>
         <w:ind w:firstLine="567"/>
         <w:jc w:val="both"/>
@@ -15326,7 +15310,6 @@
     </w:p>
     <w:p>
       <w:pPr>
-        <w:keepNext/>
         <w:spacing w:before="120" w:after="120"/>
         <w:jc w:val="center"/>
       </w:pPr>
@@ -15485,7 +15468,6 @@
     </w:p>
     <w:p>
       <w:pPr>
-        <w:keepNext/>
         <w:spacing w:line="288" w:lineRule="auto"/>
         <w:ind w:firstLine="567"/>
         <w:jc w:val="both"/>
@@ -15502,7 +15484,7 @@
     </w:p>
     <w:p>
       <w:pPr>
-        <w:keepNext/>
+        <w:pageBreakBefore/>
         <w:spacing w:before="120" w:after="120"/>
         <w:jc w:val="center"/>
       </w:pPr>
@@ -15667,7 +15649,6 @@
     </w:p>
     <w:p>
       <w:pPr>
-        <w:keepNext/>
         <w:spacing w:line="288" w:lineRule="auto"/>
         <w:ind w:firstLine="567"/>
         <w:jc w:val="both"/>
@@ -15684,7 +15665,6 @@
     </w:p>
     <w:p>
       <w:pPr>
-        <w:keepNext/>
         <w:spacing w:before="120" w:after="120"/>
         <w:jc w:val="center"/>
       </w:pPr>
@@ -15867,7 +15847,6 @@
     </w:p>
     <w:p>
       <w:pPr>
-        <w:keepNext/>
         <w:spacing w:line="288" w:lineRule="auto"/>
         <w:ind w:firstLine="567"/>
         <w:jc w:val="both"/>
@@ -15884,7 +15863,6 @@
     </w:p>
     <w:p>
       <w:pPr>
-        <w:keepNext/>
         <w:spacing w:before="120" w:after="120"/>
         <w:jc w:val="center"/>
       </w:pPr>
@@ -16013,7 +15991,6 @@
     </w:p>
     <w:p>
       <w:pPr>
-        <w:keepNext/>
         <w:spacing w:line="288" w:lineRule="auto"/>
         <w:ind w:firstLine="567"/>
         <w:jc w:val="both"/>
@@ -16048,7 +16025,7 @@
     </w:p>
     <w:p>
       <w:pPr>
-        <w:keepNext/>
+        <w:pageBreakBefore/>
         <w:spacing w:before="120" w:after="120"/>
         <w:jc w:val="center"/>
       </w:pPr>
@@ -23918,7 +23895,6 @@
     <w:p>
       <w:pPr>
         <w:pStyle w:val="Heading3"/>
-        <w:keepNext/>
       </w:pPr>
       <w:r>
         <w:rPr>
@@ -23932,7 +23908,6 @@
     </w:p>
     <w:p>
       <w:pPr>
-        <w:keepNext/>
         <w:spacing w:before="120" w:after="60"/>
         <w:jc w:val="center"/>
       </w:pPr>
@@ -23973,7 +23948,6 @@
     </w:p>
     <w:p>
       <w:pPr>
-        <w:keepNext/>
         <w:spacing w:before="120" w:after="60"/>
         <w:jc w:val="center"/>
       </w:pPr>
@@ -24014,7 +23988,6 @@
     </w:p>
     <w:p>
       <w:pPr>
-        <w:keepNext/>
         <w:spacing w:before="120" w:after="60"/>
         <w:jc w:val="center"/>
       </w:pPr>
@@ -24055,7 +24028,6 @@
     </w:p>
     <w:p>
       <w:pPr>
-        <w:keepNext/>
         <w:spacing w:before="120" w:after="60"/>
         <w:jc w:val="center"/>
       </w:pPr>
@@ -24277,7 +24249,6 @@
     <w:p>
       <w:pPr>
         <w:pStyle w:val="Heading3"/>
-        <w:keepNext/>
       </w:pPr>
       <w:r>
         <w:rPr>
@@ -24291,7 +24262,6 @@
     </w:p>
     <w:p>
       <w:pPr>
-        <w:keepNext/>
         <w:spacing w:before="120" w:after="60"/>
         <w:jc w:val="center"/>
       </w:pPr>
@@ -24332,7 +24302,6 @@
     </w:p>
     <w:p>
       <w:pPr>
-        <w:keepNext/>
         <w:spacing w:before="120" w:after="60"/>
         <w:jc w:val="center"/>
       </w:pPr>
@@ -24464,7 +24433,6 @@
     <w:p>
       <w:pPr>
         <w:pStyle w:val="Heading3"/>
-        <w:keepNext/>
       </w:pPr>
       <w:r>
         <w:rPr>
@@ -24478,7 +24446,6 @@
     </w:p>
     <w:p>
       <w:pPr>
-        <w:keepNext/>
         <w:spacing w:before="120" w:after="60"/>
         <w:jc w:val="center"/>
       </w:pPr>
@@ -24519,7 +24486,6 @@
     </w:p>
     <w:p>
       <w:pPr>
-        <w:keepNext/>
         <w:spacing w:before="120" w:after="60"/>
         <w:jc w:val="center"/>
       </w:pPr>
@@ -24850,7 +24816,6 @@
     </w:p>
     <w:p>
       <w:pPr>
-        <w:keepNext/>
         <w:spacing w:line="288" w:lineRule="auto"/>
         <w:ind w:firstLine="567"/>
         <w:jc w:val="both"/>
@@ -24867,7 +24832,7 @@
     </w:p>
     <w:p>
       <w:pPr>
-        <w:keepNext/>
+        <w:pageBreakBefore/>
         <w:spacing w:before="120" w:after="120"/>
         <w:jc w:val="center"/>
       </w:pPr>
@@ -25306,7 +25271,6 @@
     <w:p>
       <w:pPr>
         <w:pStyle w:val="Heading3"/>
-        <w:keepNext/>
       </w:pPr>
       <w:r>
         <w:rPr>
@@ -25320,7 +25284,7 @@
     </w:p>
     <w:p>
       <w:pPr>
-        <w:keepNext/>
+        <w:pageBreakBefore/>
         <w:spacing w:before="120" w:after="120"/>
         <w:jc w:val="center"/>
       </w:pPr>
@@ -25835,7 +25799,6 @@
     </w:p>
     <w:p>
       <w:pPr>
-        <w:keepNext/>
         <w:spacing w:line="288" w:lineRule="auto"/>
         <w:ind w:firstLine="567"/>
         <w:jc w:val="both"/>
@@ -25870,7 +25833,6 @@
     </w:p>
     <w:p>
       <w:pPr>
-        <w:keepNext/>
         <w:spacing w:before="120" w:after="120"/>
         <w:jc w:val="center"/>
       </w:pPr>

</xml_diff>

<commit_message>
docs(thesis): re-bake thesis-v1.docx with arch/cloudflare/ch3-evidence integrated
Final bake — embeds real Sky demo evidence (§3.2), Tenant→Domain→Landing (§2.2.6), Cloudflare config (§4.1.6). Verified: build clean, evidence images render (Sky branded landing page 55), diagrams render.
</commit_message>
<xml_diff>
--- a/documents/08-thesis/thesis-v1.docx
+++ b/documents/08-thesis/thesis-v1.docx
@@ -894,7 +894,7 @@
     <w:p>
       <w:pPr>
         <w:sectPr>
-          <w:headerReference w:type="default" r:id="rId38"/>
+          <w:headerReference w:type="default" r:id="rId37"/>
           <w:pgSz w:w="11906" w:h="16838"/>
           <w:pgMar w:top="1417" w:right="1134" w:bottom="1417" w:left="1701" w:header="720" w:footer="720" w:gutter="283"/>
           <w:cols w:space="720"/>
@@ -1039,7 +1039,7 @@
     <w:p>
       <w:pPr>
         <w:sectPr>
-          <w:headerReference w:type="default" r:id="rId39"/>
+          <w:headerReference w:type="default" r:id="rId38"/>
           <w:pgSz w:w="11906" w:h="16838"/>
           <w:pgMar w:top="1417" w:right="1134" w:bottom="1417" w:left="1701" w:header="720" w:footer="720" w:gutter="283"/>
           <w:cols w:space="720"/>
@@ -2503,7 +2503,7 @@
     <w:p>
       <w:pPr>
         <w:sectPr>
-          <w:headerReference w:type="default" r:id="rId40"/>
+          <w:headerReference w:type="default" r:id="rId39"/>
           <w:pgSz w:w="11906" w:h="16838"/>
           <w:pgMar w:top="1417" w:right="1134" w:bottom="1417" w:left="1701" w:header="720" w:footer="720" w:gutter="283"/>
           <w:cols w:space="720"/>
@@ -15493,6 +15493,782 @@
     </w:p>
     <w:p>
       <w:pPr>
+        <w:pStyle w:val="Heading3"/>
+      </w:pPr>
+      <w:r>
+        <w:rPr>
+          <w:rFonts w:ascii="Times New Roman" w:hAnsi="Times New Roman" w:eastAsia="Times New Roman"/>
+          <w:b/>
+          <w:color w:val="000000"/>
+          <w:sz w:val="28"/>
+        </w:rPr>
+        <w:t>2.2.6 Định tuyến đa tenant — Tenant → Domain → Landing</w:t>
+      </w:r>
+    </w:p>
+    <w:p>
+      <w:pPr>
+        <w:spacing w:line="288" w:lineRule="auto"/>
+        <w:ind w:firstLine="567"/>
+        <w:jc w:val="both"/>
+      </w:pPr>
+      <w:r>
+        <w:rPr>
+          <w:rFonts w:ascii="Times New Roman" w:hAnsi="Times New Roman" w:eastAsia="Times New Roman"/>
+          <w:b w:val="0"/>
+          <w:i w:val="0"/>
+          <w:sz w:val="26"/>
+        </w:rPr>
+        <w:t xml:space="preserve">Mỗi trung tâm (tenant) sở hữu một trang giới thiệu công khai (landing page) riêng biệt, truy cập qua hai phương thức: subdomain mặc định </w:t>
+      </w:r>
+      <w:r>
+        <w:rPr>
+          <w:rFonts w:ascii="Times New Roman" w:hAnsi="Times New Roman" w:eastAsia="Times New Roman"/>
+          <w:b w:val="0"/>
+          <w:i/>
+          <w:sz w:val="26"/>
+        </w:rPr>
+        <w:t>{slug}.kitehub.me</w:t>
+      </w:r>
+      <w:r>
+        <w:rPr>
+          <w:rFonts w:ascii="Times New Roman" w:hAnsi="Times New Roman" w:eastAsia="Times New Roman"/>
+          <w:b w:val="0"/>
+          <w:i w:val="0"/>
+          <w:sz w:val="26"/>
+        </w:rPr>
+        <w:t xml:space="preserve"> cấp cho mọi tenant, hoặc tên miền riêng (custom domain, ví dụ </w:t>
+      </w:r>
+      <w:r>
+        <w:rPr>
+          <w:rFonts w:ascii="Times New Roman" w:hAnsi="Times New Roman" w:eastAsia="Times New Roman"/>
+          <w:b w:val="0"/>
+          <w:i/>
+          <w:sz w:val="26"/>
+        </w:rPr>
+        <w:t>skyedu.vn</w:t>
+      </w:r>
+      <w:r>
+        <w:rPr>
+          <w:rFonts w:ascii="Times New Roman" w:hAnsi="Times New Roman" w:eastAsia="Times New Roman"/>
+          <w:b w:val="0"/>
+          <w:i w:val="0"/>
+          <w:sz w:val="26"/>
+        </w:rPr>
+        <w:t>) dành cho các gói dịch vụ cao cấp. Toàn bộ tenant dùng chung một mã nguồn giao diện và một cơ sở dữ liệu chia sẻ với cô lập mức hàng (RLS); nội dung cùng giao diện thương hiệu của từng tenant được phân giải theo trường Host của yêu cầu HTTP. Cơ chế này cho phép nền tảng phục vụ hàng trăm trang landing khác nhau mà không cần triển khai riêng từng bản, qua đó giữ chi phí vận hành ổn định khi số lượng tenant tăng.</w:t>
+      </w:r>
+    </w:p>
+    <w:p>
+      <w:pPr>
+        <w:spacing w:line="288" w:lineRule="auto"/>
+        <w:ind w:firstLine="567"/>
+        <w:jc w:val="both"/>
+      </w:pPr>
+      <w:r>
+        <w:rPr>
+          <w:rFonts w:ascii="Times New Roman" w:hAnsi="Times New Roman" w:eastAsia="Times New Roman"/>
+          <w:b w:val="0"/>
+          <w:i w:val="0"/>
+          <w:sz w:val="26"/>
+        </w:rPr>
+        <w:t>Hình 2.4c mô tả chuỗi định tuyến tổng thể từ trình duyệt đến dữ liệu landing của tenant.</w:t>
+      </w:r>
+    </w:p>
+    <w:p>
+      <w:pPr>
+        <w:pageBreakBefore/>
+        <w:spacing w:before="120" w:after="120"/>
+        <w:jc w:val="center"/>
+      </w:pPr>
+      <w:r>
+        <w:drawing>
+          <wp:inline xmlns:a="http://schemas.openxmlformats.org/drawingml/2006/main" xmlns:pic="http://schemas.openxmlformats.org/drawingml/2006/picture">
+            <wp:extent cx="3352541" cy="6480000"/>
+            <wp:docPr id="12" name="Picture 12"/>
+            <wp:cNvGraphicFramePr>
+              <a:graphicFrameLocks noChangeAspect="1"/>
+            </wp:cNvGraphicFramePr>
+            <a:graphic>
+              <a:graphicData uri="http://schemas.openxmlformats.org/drawingml/2006/picture">
+                <pic:pic>
+                  <pic:nvPicPr>
+                    <pic:cNvPr id="0" name="mermaid-6c1e64d5b93b5ba2.png"/>
+                    <pic:cNvPicPr/>
+                  </pic:nvPicPr>
+                  <pic:blipFill>
+                    <a:blip r:embed="rId20"/>
+                    <a:stretch>
+                      <a:fillRect/>
+                    </a:stretch>
+                  </pic:blipFill>
+                  <pic:spPr>
+                    <a:xfrm>
+                      <a:off x="0" y="0"/>
+                      <a:ext cx="3352541" cy="6480000"/>
+                    </a:xfrm>
+                    <a:prstGeom prst="rect"/>
+                  </pic:spPr>
+                </pic:pic>
+              </a:graphicData>
+            </a:graphic>
+          </wp:inline>
+        </w:drawing>
+      </w:r>
+    </w:p>
+    <w:p>
+      <w:pPr>
+        <w:spacing w:line="288" w:lineRule="auto"/>
+        <w:ind w:firstLine="567"/>
+        <w:jc w:val="both"/>
+      </w:pPr>
+      <w:r>
+        <w:rPr>
+          <w:rFonts w:ascii="Times New Roman" w:hAnsi="Times New Roman" w:eastAsia="Times New Roman"/>
+          <w:b/>
+          <w:i w:val="0"/>
+          <w:sz w:val="26"/>
+        </w:rPr>
+        <w:t>Hình 2.4c.</w:t>
+      </w:r>
+      <w:r>
+        <w:rPr>
+          <w:rFonts w:ascii="Times New Roman" w:hAnsi="Times New Roman" w:eastAsia="Times New Roman"/>
+          <w:b w:val="0"/>
+          <w:i w:val="0"/>
+          <w:sz w:val="26"/>
+        </w:rPr>
+        <w:t xml:space="preserve"> Chuỗi định tuyến Tenant → Domain → Landing từ trình duyệt qua Cloudflare DNS, gateway phân giải tenant theo Host, đến lớp dữ liệu cô lập RLS. </w:t>
+      </w:r>
+      <w:r>
+        <w:rPr>
+          <w:rFonts w:ascii="Times New Roman" w:hAnsi="Times New Roman" w:eastAsia="Times New Roman"/>
+          <w:b w:val="0"/>
+          <w:i/>
+          <w:sz w:val="26"/>
+        </w:rPr>
+        <w:t>Nguồn: tác giả tự xây dựng</w:t>
+      </w:r>
+    </w:p>
+    <w:p>
+      <w:pPr>
+        <w:spacing w:line="288" w:lineRule="auto"/>
+        <w:ind w:firstLine="567"/>
+        <w:jc w:val="both"/>
+      </w:pPr>
+      <w:r>
+        <w:rPr>
+          <w:rFonts w:ascii="Times New Roman" w:hAnsi="Times New Roman" w:eastAsia="Times New Roman"/>
+          <w:b w:val="0"/>
+          <w:i w:val="0"/>
+          <w:sz w:val="26"/>
+        </w:rPr>
+        <w:t xml:space="preserve">Hệ thống xử lý hai đường yêu cầu song song. Đường thứ nhất phục vụ giao diện: trình duyệt gọi </w:t>
+      </w:r>
+      <w:r>
+        <w:rPr>
+          <w:rFonts w:ascii="Times New Roman" w:hAnsi="Times New Roman" w:eastAsia="Times New Roman"/>
+          <w:b w:val="0"/>
+          <w:i/>
+          <w:sz w:val="26"/>
+        </w:rPr>
+        <w:t>GET /</w:t>
+      </w:r>
+      <w:r>
+        <w:rPr>
+          <w:rFonts w:ascii="Times New Roman" w:hAnsi="Times New Roman" w:eastAsia="Times New Roman"/>
+          <w:b w:val="0"/>
+          <w:i w:val="0"/>
+          <w:sz w:val="26"/>
+        </w:rPr>
+        <w:t xml:space="preserve"> tới ứng dụng Next.js, ứng dụng này tự lấy dữ liệu landing của tenant thông qua gateway. Đường thứ hai phục vụ dữ liệu: mọi yêu cầu </w:t>
+      </w:r>
+      <w:r>
+        <w:rPr>
+          <w:rFonts w:ascii="Times New Roman" w:hAnsi="Times New Roman" w:eastAsia="Times New Roman"/>
+          <w:b w:val="0"/>
+          <w:i/>
+          <w:sz w:val="26"/>
+        </w:rPr>
+        <w:t>/api/**</w:t>
+      </w:r>
+      <w:r>
+        <w:rPr>
+          <w:rFonts w:ascii="Times New Roman" w:hAnsi="Times New Roman" w:eastAsia="Times New Roman"/>
+          <w:b w:val="0"/>
+          <w:i w:val="0"/>
+          <w:sz w:val="26"/>
+        </w:rPr>
+        <w:t xml:space="preserve"> đi qua gateway, nơi bộ lọc phân giải tenant đọc trường Host và ánh xạ thành định danh tenant theo bốn bước ưu tiên: thứ nhất là header nội bộ dành cho môi trường phát triển, thứ hai là so khớp hậu tố subdomain với tên miền gốc đã cấu hình, thứ ba là tra cứu theo tên miền riêng, và thứ tư là lấy từ claim của JWT làm phương án dự phòng. Sau khi xác định tenant, gateway gắn header </w:t>
+      </w:r>
+      <w:r>
+        <w:rPr>
+          <w:rFonts w:ascii="Times New Roman" w:hAnsi="Times New Roman" w:eastAsia="Times New Roman"/>
+          <w:b w:val="0"/>
+          <w:i/>
+          <w:sz w:val="26"/>
+        </w:rPr>
+        <w:t>X-Tenant-Id</w:t>
+      </w:r>
+      <w:r>
+        <w:rPr>
+          <w:rFonts w:ascii="Times New Roman" w:hAnsi="Times New Roman" w:eastAsia="Times New Roman"/>
+          <w:b w:val="0"/>
+          <w:i w:val="0"/>
+          <w:sz w:val="26"/>
+        </w:rPr>
+        <w:t xml:space="preserve"> dạng UUID và kiểm tra trạng thái tenant phải là ACTIVE hoặc TRIAL trước khi chuyển tiếp tới dịch vụ lõi; nếu trạng thái khác, gateway trả về mã 503 để chặn truy cập vào tenant bị tạm ngưng.</w:t>
+      </w:r>
+    </w:p>
+    <w:p>
+      <w:pPr>
+        <w:spacing w:line="288" w:lineRule="auto"/>
+        <w:ind w:firstLine="567"/>
+        <w:jc w:val="both"/>
+      </w:pPr>
+      <w:r>
+        <w:rPr>
+          <w:rFonts w:ascii="Times New Roman" w:hAnsi="Times New Roman" w:eastAsia="Times New Roman"/>
+          <w:b w:val="0"/>
+          <w:i w:val="0"/>
+          <w:sz w:val="26"/>
+        </w:rPr>
+        <w:t>Bảng 2.9 so sánh hai phương thức truy cập theo các tiêu chí cấp phát, DNS, chứng chỉ SSL và xác minh quyền sở hữu.</w:t>
+      </w:r>
+    </w:p>
+    <w:tbl>
+      <w:tblPr>
+        <w:tblStyle w:val="TableGrid"/>
+        <w:tblW w:type="auto" w:w="0"/>
+        <w:jc w:val="center"/>
+        <w:tblLook w:firstColumn="1" w:firstRow="1" w:lastColumn="0" w:lastRow="0" w:noHBand="0" w:noVBand="1" w:val="04A0"/>
+      </w:tblPr>
+      <w:tblGrid>
+        <w:gridCol w:w="2880"/>
+        <w:gridCol w:w="2880"/>
+        <w:gridCol w:w="2880"/>
+      </w:tblGrid>
+      <w:tr>
+        <w:tc>
+          <w:tcPr>
+            <w:tcW w:type="dxa" w:w="2880"/>
+          </w:tcPr>
+          <w:p>
+            <w:pPr>
+              <w:jc w:val="center"/>
+            </w:pPr>
+            <w:r>
+              <w:rPr>
+                <w:b/>
+                <w:sz w:val="24"/>
+              </w:rPr>
+            </w:r>
+            <w:r>
+              <w:rPr>
+                <w:rFonts w:ascii="Times New Roman" w:hAnsi="Times New Roman" w:eastAsia="Times New Roman"/>
+                <w:b/>
+                <w:i w:val="0"/>
+                <w:sz w:val="24"/>
+              </w:rPr>
+              <w:t>Tiêu chí</w:t>
+            </w:r>
+          </w:p>
+        </w:tc>
+        <w:tc>
+          <w:tcPr>
+            <w:tcW w:type="dxa" w:w="2880"/>
+          </w:tcPr>
+          <w:p>
+            <w:pPr>
+              <w:jc w:val="center"/>
+            </w:pPr>
+            <w:r>
+              <w:rPr>
+                <w:b/>
+                <w:sz w:val="24"/>
+              </w:rPr>
+            </w:r>
+            <w:r>
+              <w:rPr>
+                <w:rFonts w:ascii="Times New Roman" w:hAnsi="Times New Roman" w:eastAsia="Times New Roman"/>
+                <w:b/>
+                <w:i w:val="0"/>
+                <w:sz w:val="24"/>
+              </w:rPr>
+              <w:t xml:space="preserve">Subdomain </w:t>
+            </w:r>
+            <w:r>
+              <w:rPr>
+                <w:rFonts w:ascii="Times New Roman" w:hAnsi="Times New Roman" w:eastAsia="Times New Roman"/>
+                <w:b/>
+                <w:i/>
+                <w:sz w:val="24"/>
+              </w:rPr>
+              <w:t>{slug}.kitehub.me</w:t>
+            </w:r>
+          </w:p>
+        </w:tc>
+        <w:tc>
+          <w:tcPr>
+            <w:tcW w:type="dxa" w:w="2880"/>
+          </w:tcPr>
+          <w:p>
+            <w:pPr>
+              <w:jc w:val="center"/>
+            </w:pPr>
+            <w:r>
+              <w:rPr>
+                <w:b/>
+                <w:sz w:val="24"/>
+              </w:rPr>
+            </w:r>
+            <w:r>
+              <w:rPr>
+                <w:rFonts w:ascii="Times New Roman" w:hAnsi="Times New Roman" w:eastAsia="Times New Roman"/>
+                <w:b/>
+                <w:i w:val="0"/>
+                <w:sz w:val="24"/>
+              </w:rPr>
+              <w:t xml:space="preserve">Tên miền riêng </w:t>
+            </w:r>
+            <w:r>
+              <w:rPr>
+                <w:rFonts w:ascii="Times New Roman" w:hAnsi="Times New Roman" w:eastAsia="Times New Roman"/>
+                <w:b/>
+                <w:i/>
+                <w:sz w:val="24"/>
+              </w:rPr>
+              <w:t>skyedu.vn</w:t>
+            </w:r>
+          </w:p>
+        </w:tc>
+      </w:tr>
+      <w:tr>
+        <w:tc>
+          <w:tcPr>
+            <w:tcW w:type="dxa" w:w="2880"/>
+          </w:tcPr>
+          <w:p>
+            <w:r>
+              <w:rPr>
+                <w:sz w:val="24"/>
+              </w:rPr>
+            </w:r>
+            <w:r>
+              <w:rPr>
+                <w:rFonts w:ascii="Times New Roman" w:hAnsi="Times New Roman" w:eastAsia="Times New Roman"/>
+                <w:b w:val="0"/>
+                <w:i w:val="0"/>
+                <w:sz w:val="24"/>
+              </w:rPr>
+              <w:t>Cấp cho</w:t>
+            </w:r>
+          </w:p>
+        </w:tc>
+        <w:tc>
+          <w:tcPr>
+            <w:tcW w:type="dxa" w:w="2880"/>
+          </w:tcPr>
+          <w:p>
+            <w:r>
+              <w:rPr>
+                <w:sz w:val="24"/>
+              </w:rPr>
+            </w:r>
+            <w:r>
+              <w:rPr>
+                <w:rFonts w:ascii="Times New Roman" w:hAnsi="Times New Roman" w:eastAsia="Times New Roman"/>
+                <w:b w:val="0"/>
+                <w:i w:val="0"/>
+                <w:sz w:val="24"/>
+              </w:rPr>
+              <w:t>Mọi tenant (mặc định)</w:t>
+            </w:r>
+          </w:p>
+        </w:tc>
+        <w:tc>
+          <w:tcPr>
+            <w:tcW w:type="dxa" w:w="2880"/>
+          </w:tcPr>
+          <w:p>
+            <w:r>
+              <w:rPr>
+                <w:sz w:val="24"/>
+              </w:rPr>
+            </w:r>
+            <w:r>
+              <w:rPr>
+                <w:rFonts w:ascii="Times New Roman" w:hAnsi="Times New Roman" w:eastAsia="Times New Roman"/>
+                <w:b w:val="0"/>
+                <w:i w:val="0"/>
+                <w:sz w:val="24"/>
+              </w:rPr>
+              <w:t>Gói PREMIUM/ENTERPRISE</w:t>
+            </w:r>
+          </w:p>
+        </w:tc>
+      </w:tr>
+      <w:tr>
+        <w:tc>
+          <w:tcPr>
+            <w:tcW w:type="dxa" w:w="2880"/>
+          </w:tcPr>
+          <w:p>
+            <w:r>
+              <w:rPr>
+                <w:sz w:val="24"/>
+              </w:rPr>
+            </w:r>
+            <w:r>
+              <w:rPr>
+                <w:rFonts w:ascii="Times New Roman" w:hAnsi="Times New Roman" w:eastAsia="Times New Roman"/>
+                <w:b w:val="0"/>
+                <w:i w:val="0"/>
+                <w:sz w:val="24"/>
+              </w:rPr>
+              <w:t>DNS</w:t>
+            </w:r>
+          </w:p>
+        </w:tc>
+        <w:tc>
+          <w:tcPr>
+            <w:tcW w:type="dxa" w:w="2880"/>
+          </w:tcPr>
+          <w:p>
+            <w:r>
+              <w:rPr>
+                <w:sz w:val="24"/>
+              </w:rPr>
+            </w:r>
+            <w:r>
+              <w:rPr>
+                <w:rFonts w:ascii="Times New Roman" w:hAnsi="Times New Roman" w:eastAsia="Times New Roman"/>
+                <w:b w:val="0"/>
+                <w:i w:val="0"/>
+                <w:sz w:val="24"/>
+              </w:rPr>
+              <w:t xml:space="preserve">Wildcard </w:t>
+            </w:r>
+            <w:r>
+              <w:rPr>
+                <w:rFonts w:ascii="Times New Roman" w:hAnsi="Times New Roman" w:eastAsia="Times New Roman"/>
+                <w:b w:val="0"/>
+                <w:i/>
+                <w:sz w:val="24"/>
+              </w:rPr>
+              <w:t>*.kitehub.me</w:t>
+            </w:r>
+            <w:r>
+              <w:rPr>
+                <w:rFonts w:ascii="Times New Roman" w:hAnsi="Times New Roman" w:eastAsia="Times New Roman"/>
+                <w:b w:val="0"/>
+                <w:i w:val="0"/>
+                <w:sz w:val="24"/>
+              </w:rPr>
+              <w:t xml:space="preserve"> cấp sẵn</w:t>
+            </w:r>
+          </w:p>
+        </w:tc>
+        <w:tc>
+          <w:tcPr>
+            <w:tcW w:type="dxa" w:w="2880"/>
+          </w:tcPr>
+          <w:p>
+            <w:r>
+              <w:rPr>
+                <w:sz w:val="24"/>
+              </w:rPr>
+            </w:r>
+            <w:r>
+              <w:rPr>
+                <w:rFonts w:ascii="Times New Roman" w:hAnsi="Times New Roman" w:eastAsia="Times New Roman"/>
+                <w:b w:val="0"/>
+                <w:i w:val="0"/>
+                <w:sz w:val="24"/>
+              </w:rPr>
+              <w:t>Tenant tự trỏ CNAME (subdomain) hoặc A (apex)</w:t>
+            </w:r>
+          </w:p>
+        </w:tc>
+      </w:tr>
+      <w:tr>
+        <w:tc>
+          <w:tcPr>
+            <w:tcW w:type="dxa" w:w="2880"/>
+          </w:tcPr>
+          <w:p>
+            <w:r>
+              <w:rPr>
+                <w:sz w:val="24"/>
+              </w:rPr>
+            </w:r>
+            <w:r>
+              <w:rPr>
+                <w:rFonts w:ascii="Times New Roman" w:hAnsi="Times New Roman" w:eastAsia="Times New Roman"/>
+                <w:b w:val="0"/>
+                <w:i w:val="0"/>
+                <w:sz w:val="24"/>
+              </w:rPr>
+              <w:t>Chứng chỉ SSL</w:t>
+            </w:r>
+          </w:p>
+        </w:tc>
+        <w:tc>
+          <w:tcPr>
+            <w:tcW w:type="dxa" w:w="2880"/>
+          </w:tcPr>
+          <w:p>
+            <w:r>
+              <w:rPr>
+                <w:sz w:val="24"/>
+              </w:rPr>
+            </w:r>
+            <w:r>
+              <w:rPr>
+                <w:rFonts w:ascii="Times New Roman" w:hAnsi="Times New Roman" w:eastAsia="Times New Roman"/>
+                <w:b w:val="0"/>
+                <w:i w:val="0"/>
+                <w:sz w:val="24"/>
+              </w:rPr>
+              <w:t>Dùng chứng chỉ wildcard sẵn có</w:t>
+            </w:r>
+          </w:p>
+        </w:tc>
+        <w:tc>
+          <w:tcPr>
+            <w:tcW w:type="dxa" w:w="2880"/>
+          </w:tcPr>
+          <w:p>
+            <w:r>
+              <w:rPr>
+                <w:sz w:val="24"/>
+              </w:rPr>
+            </w:r>
+            <w:r>
+              <w:rPr>
+                <w:rFonts w:ascii="Times New Roman" w:hAnsi="Times New Roman" w:eastAsia="Times New Roman"/>
+                <w:b w:val="0"/>
+                <w:i w:val="0"/>
+                <w:sz w:val="24"/>
+              </w:rPr>
+              <w:t>Cloudflare for SaaS tự cấp qua xác thực DCV</w:t>
+            </w:r>
+          </w:p>
+        </w:tc>
+      </w:tr>
+      <w:tr>
+        <w:tc>
+          <w:tcPr>
+            <w:tcW w:type="dxa" w:w="2880"/>
+          </w:tcPr>
+          <w:p>
+            <w:r>
+              <w:rPr>
+                <w:sz w:val="24"/>
+              </w:rPr>
+            </w:r>
+            <w:r>
+              <w:rPr>
+                <w:rFonts w:ascii="Times New Roman" w:hAnsi="Times New Roman" w:eastAsia="Times New Roman"/>
+                <w:b w:val="0"/>
+                <w:i w:val="0"/>
+                <w:sz w:val="24"/>
+              </w:rPr>
+              <w:t>Xác minh quyền sở hữu</w:t>
+            </w:r>
+          </w:p>
+        </w:tc>
+        <w:tc>
+          <w:tcPr>
+            <w:tcW w:type="dxa" w:w="2880"/>
+          </w:tcPr>
+          <w:p>
+            <w:r>
+              <w:rPr>
+                <w:sz w:val="24"/>
+              </w:rPr>
+            </w:r>
+            <w:r>
+              <w:rPr>
+                <w:rFonts w:ascii="Times New Roman" w:hAnsi="Times New Roman" w:eastAsia="Times New Roman"/>
+                <w:b w:val="0"/>
+                <w:i w:val="0"/>
+                <w:sz w:val="24"/>
+              </w:rPr>
+              <w:t>Không cần</w:t>
+            </w:r>
+          </w:p>
+        </w:tc>
+        <w:tc>
+          <w:tcPr>
+            <w:tcW w:type="dxa" w:w="2880"/>
+          </w:tcPr>
+          <w:p>
+            <w:r>
+              <w:rPr>
+                <w:sz w:val="24"/>
+              </w:rPr>
+            </w:r>
+            <w:r>
+              <w:rPr>
+                <w:rFonts w:ascii="Times New Roman" w:hAnsi="Times New Roman" w:eastAsia="Times New Roman"/>
+                <w:b w:val="0"/>
+                <w:i w:val="0"/>
+                <w:sz w:val="24"/>
+              </w:rPr>
+              <w:t>Bản ghi CNAME/TXT tách khỏi bản ghi định tuyến</w:t>
+            </w:r>
+          </w:p>
+        </w:tc>
+      </w:tr>
+    </w:tbl>
+    <w:p/>
+    <w:p>
+      <w:pPr>
+        <w:pStyle w:val="BảngCaption"/>
+        <w:spacing w:before="120" w:after="240"/>
+        <w:jc w:val="center"/>
+      </w:pPr>
+      <w:r>
+        <w:rPr>
+          <w:rFonts w:ascii="Times New Roman" w:hAnsi="Times New Roman" w:eastAsia="Times New Roman"/>
+          <w:b/>
+          <w:sz w:val="26"/>
+        </w:rPr>
+        <w:t>Bảng 2.9</w:t>
+      </w:r>
+      <w:r>
+        <w:rPr>
+          <w:rFonts w:ascii="Times New Roman" w:hAnsi="Times New Roman" w:eastAsia="Times New Roman"/>
+          <w:sz w:val="26"/>
+        </w:rPr>
+        <w:t>. So sánh subdomain và tên miền riêng trong cơ chế định tuyến đa tenant</w:t>
+      </w:r>
+    </w:p>
+    <w:p>
+      <w:pPr>
+        <w:spacing w:line="288" w:lineRule="auto"/>
+        <w:ind w:firstLine="567"/>
+        <w:jc w:val="both"/>
+      </w:pPr>
+      <w:r>
+        <w:rPr>
+          <w:rFonts w:ascii="Times New Roman" w:hAnsi="Times New Roman" w:eastAsia="Times New Roman"/>
+          <w:b w:val="0"/>
+          <w:i w:val="0"/>
+          <w:sz w:val="26"/>
+        </w:rPr>
+        <w:t>Hình 2.4d trình bày tuần tự phân giải tenant theo subdomain, từ yêu cầu trình duyệt đến dữ liệu landing được lọc bởi RLS.</w:t>
+      </w:r>
+    </w:p>
+    <w:p>
+      <w:pPr>
+        <w:spacing w:before="120" w:after="120"/>
+        <w:jc w:val="center"/>
+      </w:pPr>
+      <w:r>
+        <w:drawing>
+          <wp:inline xmlns:a="http://schemas.openxmlformats.org/drawingml/2006/main" xmlns:pic="http://schemas.openxmlformats.org/drawingml/2006/picture">
+            <wp:extent cx="5760000" cy="2264898"/>
+            <wp:docPr id="13" name="Picture 13"/>
+            <wp:cNvGraphicFramePr>
+              <a:graphicFrameLocks noChangeAspect="1"/>
+            </wp:cNvGraphicFramePr>
+            <a:graphic>
+              <a:graphicData uri="http://schemas.openxmlformats.org/drawingml/2006/picture">
+                <pic:pic>
+                  <pic:nvPicPr>
+                    <pic:cNvPr id="0" name="mermaid-7dabbf6c19ae66fe.png"/>
+                    <pic:cNvPicPr/>
+                  </pic:nvPicPr>
+                  <pic:blipFill>
+                    <a:blip r:embed="rId21"/>
+                    <a:stretch>
+                      <a:fillRect/>
+                    </a:stretch>
+                  </pic:blipFill>
+                  <pic:spPr>
+                    <a:xfrm>
+                      <a:off x="0" y="0"/>
+                      <a:ext cx="5760000" cy="2264898"/>
+                    </a:xfrm>
+                    <a:prstGeom prst="rect"/>
+                  </pic:spPr>
+                </pic:pic>
+              </a:graphicData>
+            </a:graphic>
+          </wp:inline>
+        </w:drawing>
+      </w:r>
+    </w:p>
+    <w:p>
+      <w:pPr>
+        <w:spacing w:line="288" w:lineRule="auto"/>
+        <w:ind w:firstLine="567"/>
+        <w:jc w:val="both"/>
+      </w:pPr>
+      <w:r>
+        <w:rPr>
+          <w:rFonts w:ascii="Times New Roman" w:hAnsi="Times New Roman" w:eastAsia="Times New Roman"/>
+          <w:b/>
+          <w:i w:val="0"/>
+          <w:sz w:val="26"/>
+        </w:rPr>
+        <w:t>Hình 2.4d.</w:t>
+      </w:r>
+      <w:r>
+        <w:rPr>
+          <w:rFonts w:ascii="Times New Roman" w:hAnsi="Times New Roman" w:eastAsia="Times New Roman"/>
+          <w:b w:val="0"/>
+          <w:i w:val="0"/>
+          <w:sz w:val="26"/>
+        </w:rPr>
+        <w:t xml:space="preserve"> Tuần tự phân giải tenant theo subdomain — gateway ánh xạ Host thành định danh tenant rồi truyền ngữ cảnh xuống lớp dữ liệu RLS. </w:t>
+      </w:r>
+      <w:r>
+        <w:rPr>
+          <w:rFonts w:ascii="Times New Roman" w:hAnsi="Times New Roman" w:eastAsia="Times New Roman"/>
+          <w:b w:val="0"/>
+          <w:i/>
+          <w:sz w:val="26"/>
+        </w:rPr>
+        <w:t>Nguồn: tác giả tự xây dựng</w:t>
+      </w:r>
+    </w:p>
+    <w:p>
+      <w:pPr>
+        <w:spacing w:line="288" w:lineRule="auto"/>
+        <w:ind w:firstLine="567"/>
+        <w:jc w:val="both"/>
+      </w:pPr>
+      <w:r>
+        <w:rPr>
+          <w:rFonts w:ascii="Times New Roman" w:hAnsi="Times New Roman" w:eastAsia="Times New Roman"/>
+          <w:b w:val="0"/>
+          <w:i w:val="0"/>
+          <w:sz w:val="26"/>
+        </w:rPr>
+        <w:t xml:space="preserve">Về an toàn, gateway là biên tin cậy duy nhất trong cơ chế định tuyến: header </w:t>
+      </w:r>
+      <w:r>
+        <w:rPr>
+          <w:rFonts w:ascii="Times New Roman" w:hAnsi="Times New Roman" w:eastAsia="Times New Roman"/>
+          <w:b w:val="0"/>
+          <w:i/>
+          <w:sz w:val="26"/>
+        </w:rPr>
+        <w:t>X-Tenant-Id</w:t>
+      </w:r>
+      <w:r>
+        <w:rPr>
+          <w:rFonts w:ascii="Times New Roman" w:hAnsi="Times New Roman" w:eastAsia="Times New Roman"/>
+          <w:b w:val="0"/>
+          <w:i w:val="0"/>
+          <w:sz w:val="26"/>
+        </w:rPr>
+        <w:t xml:space="preserve"> do client gửi lên luôn bị loại bỏ và thay bằng giá trị do chính gateway phát hành sau khi phân giải Host, nhằm ngăn chặn tấn công giả mạo ngữ cảnh tenant để truy cập dữ liệu của tenant khác. Đối với tên miền riêng, nền tảng sử dụng dịch vụ Cloudflare for SaaS để tự động cấp chứng chỉ SSL thông qua cơ chế xác thực quyền kiểm soát tên miền (DCV — Domain Control Validation) bằng bản ghi CNAME, tách biệt khỏi bản ghi định tuyến lưu lượng; riêng tên miền gốc (apex) yêu cầu bản ghi A do bản ghi CNAME không hợp lệ ở mức gốc theo chuẩn DNS.</w:t>
+      </w:r>
+    </w:p>
+    <w:p>
+      <w:pPr>
         <w:pStyle w:val="Heading2"/>
       </w:pPr>
       <w:r>
@@ -15561,7 +16337,7 @@
         <w:drawing>
           <wp:inline xmlns:a="http://schemas.openxmlformats.org/drawingml/2006/main" xmlns:pic="http://schemas.openxmlformats.org/drawingml/2006/picture">
             <wp:extent cx="3492050" cy="6480000"/>
-            <wp:docPr id="12" name="Picture 12"/>
+            <wp:docPr id="14" name="Picture 14"/>
             <wp:cNvGraphicFramePr>
               <a:graphicFrameLocks noChangeAspect="1"/>
             </wp:cNvGraphicFramePr>
@@ -15573,7 +16349,7 @@
                     <pic:cNvPicPr/>
                   </pic:nvPicPr>
                   <pic:blipFill>
-                    <a:blip r:embed="rId20"/>
+                    <a:blip r:embed="rId22"/>
                     <a:stretch>
                       <a:fillRect/>
                     </a:stretch>
@@ -15741,7 +16517,7 @@
         <w:drawing>
           <wp:inline xmlns:a="http://schemas.openxmlformats.org/drawingml/2006/main" xmlns:pic="http://schemas.openxmlformats.org/drawingml/2006/picture">
             <wp:extent cx="5760000" cy="2600576"/>
-            <wp:docPr id="13" name="Picture 13"/>
+            <wp:docPr id="15" name="Picture 15"/>
             <wp:cNvGraphicFramePr>
               <a:graphicFrameLocks noChangeAspect="1"/>
             </wp:cNvGraphicFramePr>
@@ -15753,7 +16529,7 @@
                     <pic:cNvPicPr/>
                   </pic:nvPicPr>
                   <pic:blipFill>
-                    <a:blip r:embed="rId21"/>
+                    <a:blip r:embed="rId23"/>
                     <a:stretch>
                       <a:fillRect/>
                     </a:stretch>
@@ -15939,7 +16715,7 @@
         <w:drawing>
           <wp:inline xmlns:a="http://schemas.openxmlformats.org/drawingml/2006/main" xmlns:pic="http://schemas.openxmlformats.org/drawingml/2006/picture">
             <wp:extent cx="5760000" cy="1783058"/>
-            <wp:docPr id="14" name="Picture 14"/>
+            <wp:docPr id="16" name="Picture 16"/>
             <wp:cNvGraphicFramePr>
               <a:graphicFrameLocks noChangeAspect="1"/>
             </wp:cNvGraphicFramePr>
@@ -15951,7 +16727,7 @@
                     <pic:cNvPicPr/>
                   </pic:nvPicPr>
                   <pic:blipFill>
-                    <a:blip r:embed="rId22"/>
+                    <a:blip r:embed="rId24"/>
                     <a:stretch>
                       <a:fillRect/>
                     </a:stretch>
@@ -16004,7 +16780,7 @@
         <w:drawing>
           <wp:inline xmlns:a="http://schemas.openxmlformats.org/drawingml/2006/main" xmlns:pic="http://schemas.openxmlformats.org/drawingml/2006/picture">
             <wp:extent cx="5760000" cy="2673317"/>
-            <wp:docPr id="15" name="Picture 15"/>
+            <wp:docPr id="17" name="Picture 17"/>
             <wp:cNvGraphicFramePr>
               <a:graphicFrameLocks noChangeAspect="1"/>
             </wp:cNvGraphicFramePr>
@@ -16016,7 +16792,7 @@
                     <pic:cNvPicPr/>
                   </pic:nvPicPr>
                   <pic:blipFill>
-                    <a:blip r:embed="rId23"/>
+                    <a:blip r:embed="rId25"/>
                     <a:stretch>
                       <a:fillRect/>
                     </a:stretch>
@@ -16206,7 +16982,7 @@
         <w:drawing>
           <wp:inline xmlns:a="http://schemas.openxmlformats.org/drawingml/2006/main" xmlns:pic="http://schemas.openxmlformats.org/drawingml/2006/picture">
             <wp:extent cx="5188811" cy="6480000"/>
-            <wp:docPr id="16" name="Picture 16"/>
+            <wp:docPr id="18" name="Picture 18"/>
             <wp:cNvGraphicFramePr>
               <a:graphicFrameLocks noChangeAspect="1"/>
             </wp:cNvGraphicFramePr>
@@ -16218,7 +16994,7 @@
                     <pic:cNvPicPr/>
                   </pic:nvPicPr>
                   <pic:blipFill>
-                    <a:blip r:embed="rId24"/>
+                    <a:blip r:embed="rId26"/>
                     <a:stretch>
                       <a:fillRect/>
                     </a:stretch>
@@ -24081,93 +24857,14 @@
     </w:p>
     <w:p>
       <w:pPr>
+        <w:pageBreakBefore/>
         <w:spacing w:before="120" w:after="60"/>
         <w:jc w:val="center"/>
       </w:pPr>
       <w:r>
         <w:drawing>
           <wp:inline xmlns:a="http://schemas.openxmlformats.org/drawingml/2006/main" xmlns:pic="http://schemas.openxmlformats.org/drawingml/2006/picture">
-            <wp:extent cx="5760000" cy="3600000"/>
-            <wp:docPr id="17" name="Picture 17"/>
-            <wp:cNvGraphicFramePr>
-              <a:graphicFrameLocks noChangeAspect="1"/>
-            </wp:cNvGraphicFramePr>
-            <a:graphic>
-              <a:graphicData uri="http://schemas.openxmlformats.org/drawingml/2006/picture">
-                <pic:pic>
-                  <pic:nvPicPr>
-                    <pic:cNvPr id="0" name="01-marketing-landing.png"/>
-                    <pic:cNvPicPr/>
-                  </pic:nvPicPr>
-                  <pic:blipFill>
-                    <a:blip r:embed="rId25"/>
-                    <a:stretch>
-                      <a:fillRect/>
-                    </a:stretch>
-                  </pic:blipFill>
-                  <pic:spPr>
-                    <a:xfrm>
-                      <a:off x="0" y="0"/>
-                      <a:ext cx="5760000" cy="3600000"/>
-                    </a:xfrm>
-                    <a:prstGeom prst="rect"/>
-                  </pic:spPr>
-                </pic:pic>
-              </a:graphicData>
-            </a:graphic>
-          </wp:inline>
-        </w:drawing>
-      </w:r>
-    </w:p>
-    <w:p>
-      <w:pPr>
-        <w:spacing w:before="120" w:after="60"/>
-        <w:jc w:val="center"/>
-      </w:pPr>
-      <w:r>
-        <w:drawing>
-          <wp:inline xmlns:a="http://schemas.openxmlformats.org/drawingml/2006/main" xmlns:pic="http://schemas.openxmlformats.org/drawingml/2006/picture">
-            <wp:extent cx="5760000" cy="3600000"/>
-            <wp:docPr id="18" name="Picture 18"/>
-            <wp:cNvGraphicFramePr>
-              <a:graphicFrameLocks noChangeAspect="1"/>
-            </wp:cNvGraphicFramePr>
-            <a:graphic>
-              <a:graphicData uri="http://schemas.openxmlformats.org/drawingml/2006/picture">
-                <pic:pic>
-                  <pic:nvPicPr>
-                    <pic:cNvPr id="0" name="02-signup-wizard-step1.png"/>
-                    <pic:cNvPicPr/>
-                  </pic:nvPicPr>
-                  <pic:blipFill>
-                    <a:blip r:embed="rId26"/>
-                    <a:stretch>
-                      <a:fillRect/>
-                    </a:stretch>
-                  </pic:blipFill>
-                  <pic:spPr>
-                    <a:xfrm>
-                      <a:off x="0" y="0"/>
-                      <a:ext cx="5760000" cy="3600000"/>
-                    </a:xfrm>
-                    <a:prstGeom prst="rect"/>
-                  </pic:spPr>
-                </pic:pic>
-              </a:graphicData>
-            </a:graphic>
-          </wp:inline>
-        </w:drawing>
-      </w:r>
-    </w:p>
-    <w:p>
-      <w:pPr>
-        <w:spacing w:before="120" w:after="60"/>
-        <w:jc w:val="center"/>
-      </w:pPr>
-      <w:r>
-        <w:drawing>
-          <wp:inline xmlns:a="http://schemas.openxmlformats.org/drawingml/2006/main" xmlns:pic="http://schemas.openxmlformats.org/drawingml/2006/picture">
-            <wp:extent cx="5760000" cy="3600000"/>
+            <wp:extent cx="1975275" cy="6480000"/>
             <wp:docPr id="19" name="Picture 19"/>
             <wp:cNvGraphicFramePr>
               <a:graphicFrameLocks noChangeAspect="1"/>
@@ -24176,7 +24873,7 @@
               <a:graphicData uri="http://schemas.openxmlformats.org/drawingml/2006/picture">
                 <pic:pic>
                   <pic:nvPicPr>
-                    <pic:cNvPr id="0" name="04-tenant-provisioning-success.png"/>
+                    <pic:cNvPr id="0" name="12-public-homepage-sky-branded.png"/>
                     <pic:cNvPicPr/>
                   </pic:nvPicPr>
                   <pic:blipFill>
@@ -24188,7 +24885,7 @@
                   <pic:spPr>
                     <a:xfrm>
                       <a:off x="0" y="0"/>
-                      <a:ext cx="5760000" cy="3600000"/>
+                      <a:ext cx="1975275" cy="6480000"/>
                     </a:xfrm>
                     <a:prstGeom prst="rect"/>
                   </pic:spPr>
@@ -24216,7 +24913,7 @@
               <a:graphicData uri="http://schemas.openxmlformats.org/drawingml/2006/picture">
                 <pic:pic>
                   <pic:nvPicPr>
-                    <pic:cNvPr id="0" name="03-owner-dashboard-first-login.png"/>
+                    <pic:cNvPr id="0" name="01-login-page.png"/>
                     <pic:cNvPicPr/>
                   </pic:nvPicPr>
                   <pic:blipFill>
@@ -24241,200 +24938,6 @@
     </w:p>
     <w:p>
       <w:pPr>
-        <w:pStyle w:val="HìnhCaption"/>
-        <w:spacing w:before="120" w:after="240"/>
-        <w:jc w:val="center"/>
-      </w:pPr>
-      <w:r>
-        <w:rPr>
-          <w:rFonts w:ascii="Times New Roman" w:hAnsi="Times New Roman" w:eastAsia="Times New Roman"/>
-          <w:b/>
-          <w:sz w:val="26"/>
-        </w:rPr>
-        <w:t>Hình 3.1</w:t>
-      </w:r>
-      <w:r>
-        <w:rPr>
-          <w:rFonts w:ascii="Times New Roman" w:hAnsi="Times New Roman" w:eastAsia="Times New Roman"/>
-          <w:sz w:val="26"/>
-        </w:rPr>
-        <w:t>. Luồng khám phá và kích hoạt tenant qua bốn bước nối tiếp từ trang chủ marketing đến dashboard sau đăng nhập đầu tiên</w:t>
-      </w:r>
-    </w:p>
-    <w:p>
-      <w:pPr>
-        <w:spacing w:line="288" w:lineRule="auto"/>
-        <w:ind w:firstLine="567"/>
-        <w:jc w:val="both"/>
-      </w:pPr>
-      <w:r>
-        <w:rPr>
-          <w:rFonts w:ascii="Times New Roman" w:hAnsi="Times New Roman" w:eastAsia="Times New Roman"/>
-          <w:b w:val="0"/>
-          <w:i/>
-          <w:sz w:val="26"/>
-        </w:rPr>
-        <w:t>Nguồn: ảnh chụp giao diện KiteHub Platform, truy cập 20/05/2026</w:t>
-      </w:r>
-    </w:p>
-    <w:p>
-      <w:pPr>
-        <w:spacing w:line="288" w:lineRule="auto"/>
-        <w:ind w:firstLine="567"/>
-        <w:jc w:val="both"/>
-      </w:pPr>
-      <w:r>
-        <w:rPr>
-          <w:rFonts w:ascii="Times New Roman" w:hAnsi="Times New Roman" w:eastAsia="Times New Roman"/>
-          <w:b w:val="0"/>
-          <w:i w:val="0"/>
-          <w:sz w:val="26"/>
-        </w:rPr>
-        <w:t xml:space="preserve">Luồng khám phá và kích hoạt tenant đưa anonymous prospect từ điểm tiếp xúc đầu tiên đến trạng thái vận hành đầy đủ thông qua bốn bước nối tiếp. Bước (a) trang chủ marketing đóng vai trò "first impression" với layout 3-fold gồm hero section "Nền tảng quản lý trung tâm dạy thêm" cùng ba giá trị cốt lõi (Multi-tenant isolation, AI Branding, Bộ tính năng quản lý lớp đầy đủ) và CTA chính "Yêu cầu truy cập Beta"; toàn bộ tone tiếng Việt formal-friendly với sample data Việt Nam (Trung tâm Anh ngữ Sky Education tên giả định, Lớp Anh ngữ 5A1). Bước (b) Wizard đăng ký yêu cầu 4 trường tối thiểu (họ tên, email, tên trung tâm dự kiến, quy mô) không yêu cầu mật khẩu — admin nền tảng review request và gửi claim code 6 chữ số qua email; form validation client-side bằng React Hook Form + Zod và server-side bổ sung honeypot field chống bot với rate-limit 24 giờ per email. Bước (c) sau khi người dùng exchange claim code thành công, hệ thống tạo tenant mới với atomic transaction (INSERT tenant + INSERT user + UPDATE beta_request status — chi tiết tại Chương 4), cấp subdomain </w:t>
-      </w:r>
-      <w:r>
-        <w:rPr>
-          <w:rFonts w:ascii="Times New Roman" w:hAnsi="Times New Roman" w:eastAsia="Times New Roman"/>
-          <w:b w:val="0"/>
-          <w:i/>
-          <w:sz w:val="26"/>
-        </w:rPr>
-        <w:t>https://sky-edu.kitehub.me</w:t>
-      </w:r>
-      <w:r>
-        <w:rPr>
-          <w:rFonts w:ascii="Times New Roman" w:hAnsi="Times New Roman" w:eastAsia="Times New Roman"/>
-          <w:b w:val="0"/>
-          <w:i w:val="0"/>
-          <w:sz w:val="26"/>
-        </w:rPr>
-        <w:t xml:space="preserve"> và CTA "Đăng nhập ngay" tự động redirect tới </w:t>
-      </w:r>
-      <w:r>
-        <w:rPr>
-          <w:rFonts w:ascii="Times New Roman" w:hAnsi="Times New Roman" w:eastAsia="Times New Roman"/>
-          <w:b w:val="0"/>
-          <w:i/>
-          <w:sz w:val="26"/>
-        </w:rPr>
-        <w:t>/dashboard</w:t>
-      </w:r>
-      <w:r>
-        <w:rPr>
-          <w:rFonts w:ascii="Times New Roman" w:hAnsi="Times New Roman" w:eastAsia="Times New Roman"/>
-          <w:b w:val="0"/>
-          <w:i w:val="0"/>
-          <w:sz w:val="26"/>
-        </w:rPr>
-        <w:t xml:space="preserve"> với JWT đã có sẵn. Bước (d) lần đăng nhập đầu tiên hiển thị ba thành phần chính cho Chủ trung tâm: 3 KPI card ("Doanh thu tháng", "Số học sinh", "Số lớp" mặc định </w:t>
-      </w:r>
-      <w:r>
-        <w:rPr>
-          <w:rFonts w:ascii="Times New Roman" w:hAnsi="Times New Roman" w:eastAsia="Times New Roman"/>
-          <w:b w:val="0"/>
-          <w:i/>
-          <w:sz w:val="26"/>
-        </w:rPr>
-        <w:t>0đ</w:t>
-      </w:r>
-      <w:r>
-        <w:rPr>
-          <w:rFonts w:ascii="Times New Roman" w:hAnsi="Times New Roman" w:eastAsia="Times New Roman"/>
-          <w:b w:val="0"/>
-          <w:i w:val="0"/>
-          <w:sz w:val="26"/>
-        </w:rPr>
-        <w:t xml:space="preserve">, </w:t>
-      </w:r>
-      <w:r>
-        <w:rPr>
-          <w:rFonts w:ascii="Times New Roman" w:hAnsi="Times New Roman" w:eastAsia="Times New Roman"/>
-          <w:b w:val="0"/>
-          <w:i/>
-          <w:sz w:val="26"/>
-        </w:rPr>
-        <w:t>0</w:t>
-      </w:r>
-      <w:r>
-        <w:rPr>
-          <w:rFonts w:ascii="Times New Roman" w:hAnsi="Times New Roman" w:eastAsia="Times New Roman"/>
-          <w:b w:val="0"/>
-          <w:i w:val="0"/>
-          <w:sz w:val="26"/>
-        </w:rPr>
-        <w:t xml:space="preserve">, </w:t>
-      </w:r>
-      <w:r>
-        <w:rPr>
-          <w:rFonts w:ascii="Times New Roman" w:hAnsi="Times New Roman" w:eastAsia="Times New Roman"/>
-          <w:b w:val="0"/>
-          <w:i/>
-          <w:sz w:val="26"/>
-        </w:rPr>
-        <w:t>0</w:t>
-      </w:r>
-      <w:r>
-        <w:rPr>
-          <w:rFonts w:ascii="Times New Roman" w:hAnsi="Times New Roman" w:eastAsia="Times New Roman"/>
-          <w:b w:val="0"/>
-          <w:i w:val="0"/>
-          <w:sz w:val="26"/>
-        </w:rPr>
-        <w:t xml:space="preserve">), onboarding checklist 5 bước (Tạo lớp đầu tiên / Thêm học sinh / Tạo lịch học / Cấu hình thanh toán / Mời giáo viên đồng nghiệp), và sample data toggle cho phép load dữ liệu mẫu (giáo viên giả định Trần Thị Hồng + 4 học sinh + 1 lớp Anh ngữ 5A1); format VND </w:t>
-      </w:r>
-      <w:r>
-        <w:rPr>
-          <w:rFonts w:ascii="Times New Roman" w:hAnsi="Times New Roman" w:eastAsia="Times New Roman"/>
-          <w:b w:val="0"/>
-          <w:i/>
-          <w:sz w:val="26"/>
-        </w:rPr>
-        <w:t>1.500.000đ</w:t>
-      </w:r>
-      <w:r>
-        <w:rPr>
-          <w:rFonts w:ascii="Times New Roman" w:hAnsi="Times New Roman" w:eastAsia="Times New Roman"/>
-          <w:b w:val="0"/>
-          <w:i w:val="0"/>
-          <w:sz w:val="26"/>
-        </w:rPr>
-        <w:t xml:space="preserve"> cùng date tiếng Việt </w:t>
-      </w:r>
-      <w:r>
-        <w:rPr>
-          <w:rFonts w:ascii="Times New Roman" w:hAnsi="Times New Roman" w:eastAsia="Times New Roman"/>
-          <w:b w:val="0"/>
-          <w:i/>
-          <w:sz w:val="26"/>
-        </w:rPr>
-        <w:t>Thứ Hai, 20/05/2026</w:t>
-      </w:r>
-      <w:r>
-        <w:rPr>
-          <w:rFonts w:ascii="Times New Roman" w:hAnsi="Times New Roman" w:eastAsia="Times New Roman"/>
-          <w:b w:val="0"/>
-          <w:i w:val="0"/>
-          <w:sz w:val="26"/>
-        </w:rPr>
-        <w:t xml:space="preserve"> áp dụng đồng nhất.</w:t>
-      </w:r>
-    </w:p>
-    <w:p>
-      <w:pPr>
-        <w:pStyle w:val="Heading3"/>
-      </w:pPr>
-      <w:r>
-        <w:rPr>
-          <w:rFonts w:ascii="Times New Roman" w:hAnsi="Times New Roman" w:eastAsia="Times New Roman"/>
-          <w:b/>
-          <w:color w:val="000000"/>
-          <w:sz w:val="28"/>
-        </w:rPr>
-        <w:t>3.2.2 Luồng vận hành nghiệp vụ thường nhật (Chủ trung tâm / Manager)</w:t>
-      </w:r>
-    </w:p>
-    <w:p>
-      <w:pPr>
         <w:spacing w:before="120" w:after="60"/>
         <w:jc w:val="center"/>
       </w:pPr>
@@ -24450,7 +24953,7 @@
               <a:graphicData uri="http://schemas.openxmlformats.org/drawingml/2006/picture">
                 <pic:pic>
                   <pic:nvPicPr>
-                    <pic:cNvPr id="0" name="05-class-management.png"/>
+                    <pic:cNvPr id="0" name="02-dashboard-overview-kpi-orange.png"/>
                     <pic:cNvPicPr/>
                   </pic:nvPicPr>
                   <pic:blipFill>
@@ -24475,6 +24978,128 @@
     </w:p>
     <w:p>
       <w:pPr>
+        <w:pStyle w:val="HìnhCaption"/>
+        <w:spacing w:before="120" w:after="240"/>
+        <w:jc w:val="center"/>
+      </w:pPr>
+      <w:r>
+        <w:rPr>
+          <w:rFonts w:ascii="Times New Roman" w:hAnsi="Times New Roman" w:eastAsia="Times New Roman"/>
+          <w:b/>
+          <w:sz w:val="26"/>
+        </w:rPr>
+        <w:t>Hình 3.1</w:t>
+      </w:r>
+      <w:r>
+        <w:rPr>
+          <w:rFonts w:ascii="Times New Roman" w:hAnsi="Times New Roman" w:eastAsia="Times New Roman"/>
+          <w:sz w:val="26"/>
+        </w:rPr>
+        <w:t>. Luồng khám phá và kích hoạt tenant qua ba bước nối tiếp: trang chủ công khai mang thương hiệu riêng của tenant, trang đăng nhập, và dashboard tổng quan sau đăng nhập</w:t>
+      </w:r>
+    </w:p>
+    <w:p>
+      <w:pPr>
+        <w:spacing w:line="288" w:lineRule="auto"/>
+        <w:ind w:firstLine="567"/>
+        <w:jc w:val="both"/>
+      </w:pPr>
+      <w:r>
+        <w:rPr>
+          <w:rFonts w:ascii="Times New Roman" w:hAnsi="Times New Roman" w:eastAsia="Times New Roman"/>
+          <w:b w:val="0"/>
+          <w:i/>
+          <w:sz w:val="26"/>
+        </w:rPr>
+        <w:t>Nguồn: ảnh chụp giao diện nền tảng KiteClass, truy cập 29/05/2026</w:t>
+      </w:r>
+    </w:p>
+    <w:p>
+      <w:pPr>
+        <w:spacing w:line="288" w:lineRule="auto"/>
+        <w:ind w:firstLine="567"/>
+        <w:jc w:val="both"/>
+      </w:pPr>
+      <w:r>
+        <w:rPr>
+          <w:rFonts w:ascii="Times New Roman" w:hAnsi="Times New Roman" w:eastAsia="Times New Roman"/>
+          <w:b w:val="0"/>
+          <w:i w:val="0"/>
+          <w:sz w:val="26"/>
+        </w:rPr>
+        <w:t>Luồng khám phá và kích hoạt tenant đưa người dùng tiềm năng từ điểm tiếp xúc đầu tiên đến trạng thái vận hành thông qua ba bước nối tiếp. Bước thứ nhất là trang chủ công khai của tenant — minh chứng tại Hình 3.1 là trang của trung tâm Sky Education (tên giả định) với bộ nhận diện thương hiệu riêng (tông màu cam chủ đạo, tên trung tâm và khẩu hiệu "Chuyên nghiệp &amp; Hiệu quả"). Trang được dựng theo cấu trúc nhiều khối: giới thiệu, tính năng nổi bật (Hệ thống LMS, Quản lý Học viên, Thanh toán &amp; Báo cáo), đội ngũ giáo viên, các chứng chỉ đào tạo (IELTS, TOEIC, Cambridge, VSTEP), bảng giá theo định dạng tiền tệ Việt Nam (</w:t>
+      </w:r>
+      <w:r>
+        <w:rPr>
+          <w:rFonts w:ascii="Times New Roman" w:hAnsi="Times New Roman" w:eastAsia="Times New Roman"/>
+          <w:b w:val="0"/>
+          <w:i/>
+          <w:sz w:val="26"/>
+        </w:rPr>
+        <w:t>1.500.000đ/tháng</w:t>
+      </w:r>
+      <w:r>
+        <w:rPr>
+          <w:rFonts w:ascii="Times New Roman" w:hAnsi="Times New Roman" w:eastAsia="Times New Roman"/>
+          <w:b w:val="0"/>
+          <w:i w:val="0"/>
+          <w:sz w:val="26"/>
+        </w:rPr>
+        <w:t xml:space="preserve">, </w:t>
+      </w:r>
+      <w:r>
+        <w:rPr>
+          <w:rFonts w:ascii="Times New Roman" w:hAnsi="Times New Roman" w:eastAsia="Times New Roman"/>
+          <w:b w:val="0"/>
+          <w:i/>
+          <w:sz w:val="26"/>
+        </w:rPr>
+        <w:t>2.800.000đ/tháng</w:t>
+      </w:r>
+      <w:r>
+        <w:rPr>
+          <w:rFonts w:ascii="Times New Roman" w:hAnsi="Times New Roman" w:eastAsia="Times New Roman"/>
+          <w:b w:val="0"/>
+          <w:i w:val="0"/>
+          <w:sz w:val="26"/>
+        </w:rPr>
+        <w:t xml:space="preserve">, </w:t>
+      </w:r>
+      <w:r>
+        <w:rPr>
+          <w:rFonts w:ascii="Times New Roman" w:hAnsi="Times New Roman" w:eastAsia="Times New Roman"/>
+          <w:b w:val="0"/>
+          <w:i/>
+          <w:sz w:val="26"/>
+        </w:rPr>
+        <w:t>4.500.000đ/tháng</w:t>
+      </w:r>
+      <w:r>
+        <w:rPr>
+          <w:rFonts w:ascii="Times New Roman" w:hAnsi="Times New Roman" w:eastAsia="Times New Roman"/>
+          <w:b w:val="0"/>
+          <w:i w:val="0"/>
+          <w:sz w:val="26"/>
+        </w:rPr>
+        <w:t>) và mục câu hỏi thường gặp. Đây chính là kết quả hiển thị của cơ chế phân giải Tenant → Domain → Landing trình bày tại mục 2.2.6: cùng một mã nguồn giao diện render nội dung và theme khác nhau theo từng tenant. Bước thứ hai là trang đăng nhập, nơi Chủ trung tâm nhập thông tin tài khoản đã được cấp sau khi yêu cầu truy cập được quản trị viên nền tảng duyệt. Bước thứ ba là dashboard tổng quan sau đăng nhập, hiển thị dòng tóm tắt "Trung tâm hiện có 78 học viên · 5 khóa học" cùng sáu thẻ chỉ số (Học viên, Khóa học, Giáo viên, Điểm danh hôm nay, Doanh thu tuần, Tỷ lệ giữ chân). Trong giai đoạn thử nghiệm, hai thẻ Học viên và Khóa học đã hiển thị số liệu thực (78 và 5), bốn thẻ còn lại tạm hiển thị dấu gạch ngang kèm ghi chú minh bạch "chưa có API tổng hợp; sẽ bổ sung khi endpoint thống kê dashboard sẵn sàng" — phản ánh trung thực mức độ hoàn thiện của tính năng thống kê ở thời điểm thực hiện đồ án.</w:t>
+      </w:r>
+    </w:p>
+    <w:p>
+      <w:pPr>
+        <w:pStyle w:val="Heading3"/>
+      </w:pPr>
+      <w:r>
+        <w:rPr>
+          <w:rFonts w:ascii="Times New Roman" w:hAnsi="Times New Roman" w:eastAsia="Times New Roman"/>
+          <w:b/>
+          <w:color w:val="000000"/>
+          <w:sz w:val="28"/>
+        </w:rPr>
+        <w:t>3.2.2 Tùy biến thương hiệu bằng AI (AI Branding)</w:t>
+      </w:r>
+    </w:p>
+    <w:p>
+      <w:pPr>
         <w:spacing w:before="120" w:after="60"/>
         <w:jc w:val="center"/>
       </w:pPr>
@@ -24490,7 +25115,7 @@
               <a:graphicData uri="http://schemas.openxmlformats.org/drawingml/2006/picture">
                 <pic:pic>
                   <pic:nvPicPr>
-                    <pic:cNvPr id="0" name="06-invoice-generation.png"/>
+                    <pic:cNvPr id="0" name="03-branding-settings.png"/>
                     <pic:cNvPicPr/>
                   </pic:nvPicPr>
                   <pic:blipFill>
@@ -24532,7 +25157,7 @@
           <w:rFonts w:ascii="Times New Roman" w:hAnsi="Times New Roman" w:eastAsia="Times New Roman"/>
           <w:sz w:val="26"/>
         </w:rPr>
-        <w:t>. Luồng vận hành nghiệp vụ thường nhật gồm giao diện quản lý lớp học và giao diện tạo hóa đơn với định dạng VND</w:t>
+        <w:t>. Giao diện tính năng AI Branding cho phép Chủ trung tâm tạo bộ nhận diện thương hiệu qua trình hướng dẫn nhiều bước</w:t>
       </w:r>
     </w:p>
     <w:p>
@@ -24548,7 +25173,7 @@
           <w:i/>
           <w:sz w:val="26"/>
         </w:rPr>
-        <w:t>Nguồn: ảnh chụp giao diện KiteHub Platform, truy cập 20/05/2026</w:t>
+        <w:t>Nguồn: ảnh chụp giao diện nền tảng KiteClass, truy cập 29/05/2026</w:t>
       </w:r>
     </w:p>
     <w:p>
@@ -24564,43 +25189,7 @@
           <w:i w:val="0"/>
           <w:sz w:val="26"/>
         </w:rPr>
-        <w:t xml:space="preserve">Luồng vận hành nghiệp vụ thường nhật bao gồm hai chức năng cốt lõi mà Chủ trung tâm và Manager sử dụng hằng ngày sau khi tenant đã kích hoạt. Bước (a) giao diện quản lý lớp học hiển thị danh sách toàn bộ lớp của tenant với các cột Mã lớp, Tên lớp (ví dụ </w:t>
-      </w:r>
-      <w:r>
-        <w:rPr>
-          <w:rFonts w:ascii="Times New Roman" w:hAnsi="Times New Roman" w:eastAsia="Times New Roman"/>
-          <w:b w:val="0"/>
-          <w:i/>
-          <w:sz w:val="26"/>
-        </w:rPr>
-        <w:t>Lớp Anh ngữ 5A1</w:t>
-      </w:r>
-      <w:r>
-        <w:rPr>
-          <w:rFonts w:ascii="Times New Roman" w:hAnsi="Times New Roman" w:eastAsia="Times New Roman"/>
-          <w:b w:val="0"/>
-          <w:i w:val="0"/>
-          <w:sz w:val="26"/>
-        </w:rPr>
-        <w:t xml:space="preserve">), Giáo viên chủ nhiệm, Số học sinh, Lịch học, Trạng thái (Đang hoạt động / Tạm nghỉ / Đã kết thúc) và Hành động (Xem chi tiết / Sửa / Lưu trữ); bảng hỗ trợ filter combo theo trạng thái, giáo viên và môn học cùng search theo tên hoặc mã lớp, trong khi bulk actions cho phép chọn nhiều lớp để gửi thông báo Zalo group hoặc export Excel danh sách điểm danh, và CTA "Tạo lớp mới" mở wizard 4 bước (thông tin cơ bản → lịch học Mon-Sat theo VN edu convention → danh sách học sinh → cấu hình học phí). Bước (b) form tạo hóa đơn cho phép Chủ trung tâm hoặc Manager tạo hóa đơn cá nhân hoặc batch theo lớp với layout 2 cột — cột trái nhập học sinh, lớp, tháng/kỳ học, học phí gốc, giảm giá, phụ thu và hạn thanh toán; cột phải preview hóa đơn realtime với header "HÓA ĐƠN ĐIỆN TỬ" theo convention VN, mã số thuế tenant (nếu có), tổng tiền </w:t>
-      </w:r>
-      <w:r>
-        <w:rPr>
-          <w:rFonts w:ascii="Times New Roman" w:hAnsi="Times New Roman" w:eastAsia="Times New Roman"/>
-          <w:b w:val="0"/>
-          <w:i/>
-          <w:sz w:val="26"/>
-        </w:rPr>
-        <w:t>Tổng cộng: 1.500.000đ</w:t>
-      </w:r>
-      <w:r>
-        <w:rPr>
-          <w:rFonts w:ascii="Times New Roman" w:hAnsi="Times New Roman" w:eastAsia="Times New Roman"/>
-          <w:b w:val="0"/>
-          <w:i w:val="0"/>
-          <w:sz w:val="26"/>
-        </w:rPr>
-        <w:t xml:space="preserve"> VND format, cùng QR code VietQR để học sinh quét chuyển khoản trực tiếp qua Vietcombank, Techcombank hoặc MB merchant code; sau khi tạo hóa đơn được gửi qua ba kênh đồng thời (email PDF cho phụ huynh, link Zalo group cha mẹ, và lưu trong tài khoản học sinh trên dashboard). Trong giai đoạn thử nghiệm, payment gateway integration (Stripe, MoMo, VNPay) hoãn sang giai đoạn thương mại hóa do yêu cầu giấy phép PSP, do đó tenant đối soát thủ công qua chuyển khoản ngân hàng.</w:t>
+        <w:t>AI Branding là một trong những điểm khác biệt cốt lõi của nền tảng, cho phép mỗi trung tâm tạo bộ nhận diện thương hiệu chuyên nghiệp mà không cần kiến thức thiết kế. Như minh chứng tại Hình 3.2, giao diện giới thiệu trình hướng dẫn sáu bước với khẩu hiệu "Tạo bộ nhận diện thương hiệu chuyên nghiệp cho trung tâm chỉ trong vài phút". Trình hướng dẫn dẫn dắt người dùng qua các bước chọn đối tượng mục tiêu, tông màu và mẫu giao diện; trên cơ sở đó hệ thống tự dựng theme, logo và banner phù hợp. Ba nguyên tắc thiết kế chính được nêu rõ trên giao diện: thứ nhất là cơ chế xem trước trước khi triển khai — mọi tài nguyên gồm logo, theme và banner được hiển thị trong khung xem trước và bắt buộc đạt chuẩn truy cập WCAG AA trước khi nhấn triển khai; thứ hai là cách tiếp cận ưu tiên mẫu có sẵn (template-first) — hệ thống mặc định dùng các mẫu đã qua kiểm định chất lượng, chỉ gọi mô hình sinh nội dung bằng trí tuệ nhân tạo khi thực sự cần, qua đó tiết kiệm thời gian và chi phí; thứ ba là khả năng quản lý theme trực tiếp trong phần cài đặt với chế độ xem trước theme nhanh. Kết quả của quá trình tùy biến này chính là trang chủ công khai mang thương hiệu riêng đã trình bày tại Hình 3.1.</w:t>
       </w:r>
     </w:p>
     <w:p>
@@ -24614,7 +25203,7 @@
           <w:color w:val="000000"/>
           <w:sz w:val="28"/>
         </w:rPr>
-        <w:t>3.2.3 Luồng điều hành Admin nền tảng (Platform Admin)</w:t>
+        <w:t>3.2.3 Quản lý học viên và tổ chức vận hành</w:t>
       </w:r>
     </w:p>
     <w:p>
@@ -24625,7 +25214,7 @@
       <w:r>
         <w:drawing>
           <wp:inline xmlns:a="http://schemas.openxmlformats.org/drawingml/2006/main" xmlns:pic="http://schemas.openxmlformats.org/drawingml/2006/picture">
-            <wp:extent cx="5760000" cy="3600000"/>
+            <wp:extent cx="5760000" cy="4000000"/>
             <wp:docPr id="23" name="Picture 23"/>
             <wp:cNvGraphicFramePr>
               <a:graphicFrameLocks noChangeAspect="1"/>
@@ -24634,7 +25223,7 @@
               <a:graphicData uri="http://schemas.openxmlformats.org/drawingml/2006/picture">
                 <pic:pic>
                   <pic:nvPicPr>
-                    <pic:cNvPr id="0" name="07-welcome-email.png"/>
+                    <pic:cNvPr id="0" name="05-students.png"/>
                     <pic:cNvPicPr/>
                   </pic:nvPicPr>
                   <pic:blipFill>
@@ -24646,7 +25235,7 @@
                   <pic:spPr>
                     <a:xfrm>
                       <a:off x="0" y="0"/>
-                      <a:ext cx="5760000" cy="3600000"/>
+                      <a:ext cx="5760000" cy="4000000"/>
                     </a:xfrm>
                     <a:prstGeom prst="rect"/>
                   </pic:spPr>
@@ -24659,46 +25248,6 @@
     </w:p>
     <w:p>
       <w:pPr>
-        <w:spacing w:before="120" w:after="60"/>
-        <w:jc w:val="center"/>
-      </w:pPr>
-      <w:r>
-        <w:drawing>
-          <wp:inline xmlns:a="http://schemas.openxmlformats.org/drawingml/2006/main" xmlns:pic="http://schemas.openxmlformats.org/drawingml/2006/picture">
-            <wp:extent cx="5760000" cy="3600000"/>
-            <wp:docPr id="24" name="Picture 24"/>
-            <wp:cNvGraphicFramePr>
-              <a:graphicFrameLocks noChangeAspect="1"/>
-            </wp:cNvGraphicFramePr>
-            <a:graphic>
-              <a:graphicData uri="http://schemas.openxmlformats.org/drawingml/2006/picture">
-                <pic:pic>
-                  <pic:nvPicPr>
-                    <pic:cNvPr id="0" name="08-admin-audit-log.png"/>
-                    <pic:cNvPicPr/>
-                  </pic:nvPicPr>
-                  <pic:blipFill>
-                    <a:blip r:embed="rId32"/>
-                    <a:stretch>
-                      <a:fillRect/>
-                    </a:stretch>
-                  </pic:blipFill>
-                  <pic:spPr>
-                    <a:xfrm>
-                      <a:off x="0" y="0"/>
-                      <a:ext cx="5760000" cy="3600000"/>
-                    </a:xfrm>
-                    <a:prstGeom prst="rect"/>
-                  </pic:spPr>
-                </pic:pic>
-              </a:graphicData>
-            </a:graphic>
-          </wp:inline>
-        </w:drawing>
-      </w:r>
-    </w:p>
-    <w:p>
-      <w:pPr>
         <w:pStyle w:val="HìnhCaption"/>
         <w:spacing w:before="120" w:after="240"/>
         <w:jc w:val="center"/>
@@ -24716,7 +25265,7 @@
           <w:rFonts w:ascii="Times New Roman" w:hAnsi="Times New Roman" w:eastAsia="Times New Roman"/>
           <w:sz w:val="26"/>
         </w:rPr>
-        <w:t>. Luồng điều hành Admin nền tảng với preview template email và trang audit log immutable tuân thủ PDPL Article 11</w:t>
+        <w:t>. Giao diện quản lý danh sách học viên của trung tâm với bảng dữ liệu, tìm kiếm và các thao tác quản trị</w:t>
       </w:r>
     </w:p>
     <w:p>
@@ -24732,7 +25281,7 @@
           <w:i/>
           <w:sz w:val="26"/>
         </w:rPr>
-        <w:t>Nguồn: ảnh chụp giao diện KiteHub Platform, truy cập 20/05/2026</w:t>
+        <w:t>Nguồn: ảnh chụp giao diện nền tảng KiteClass, truy cập 29/05/2026</w:t>
       </w:r>
     </w:p>
     <w:p>
@@ -24748,169 +25297,7 @@
           <w:i w:val="0"/>
           <w:sz w:val="26"/>
         </w:rPr>
-        <w:t>Luồng điều hành Admin nền tảng bao gồm hai công cụ chính phục vụ vận hành giai đoạn thử nghiệm. Bước (a) giao diện preview template email cho phép Admin xem trước email trước khi gửi cho tenant với layout 2 cột — cột trái input các biến (tên người nhận, tên trung tâm, claim code, link kích hoạt, deadline kích hoạt), cột phải rendering preview email cho desktop và mobile responsive; subject line tone tiếng Việt formal-respectful (</w:t>
-      </w:r>
-      <w:r>
-        <w:rPr>
-          <w:rFonts w:ascii="Times New Roman" w:hAnsi="Times New Roman" w:eastAsia="Times New Roman"/>
-          <w:b w:val="0"/>
-          <w:i/>
-          <w:sz w:val="26"/>
-        </w:rPr>
-        <w:t>Chào mừng anh/chị đến KiteHub — Tài khoản đã được kích hoạt</w:t>
-      </w:r>
-      <w:r>
-        <w:rPr>
-          <w:rFonts w:ascii="Times New Roman" w:hAnsi="Times New Roman" w:eastAsia="Times New Roman"/>
-          <w:b w:val="0"/>
-          <w:i w:val="0"/>
-          <w:sz w:val="26"/>
-        </w:rPr>
-        <w:t xml:space="preserve">), greeting </w:t>
-      </w:r>
-      <w:r>
-        <w:rPr>
-          <w:rFonts w:ascii="Times New Roman" w:hAnsi="Times New Roman" w:eastAsia="Times New Roman"/>
-          <w:b w:val="0"/>
-          <w:i/>
-          <w:sz w:val="26"/>
-        </w:rPr>
-        <w:t>Em chào chị Hồng,</w:t>
-      </w:r>
-      <w:r>
-        <w:rPr>
-          <w:rFonts w:ascii="Times New Roman" w:hAnsi="Times New Roman" w:eastAsia="Times New Roman"/>
-          <w:b w:val="0"/>
-          <w:i w:val="0"/>
-          <w:sz w:val="26"/>
-        </w:rPr>
-        <w:t xml:space="preserve"> theo persona tone matrix, và email body bao gồm ba phần (lời mời sử dụng, hướng dẫn nhập claim code, CTA "Kích hoạt tài khoản ngay") cùng footer minh bạch về giai đoạn thử nghiệm khép kín 20 tenant; nút "Gửi thử cho admin" cho phép Admin test email rendering trước khi phát hành chính thức, và email được sign DKIM + SPF + DMARC qua AWS SES kết hợp Cloudflare DNS records để đảm bảo deliverability cao. Bước (b) trang audit log hiển thị toàn bộ hành động sensitive của Admin nền tảng dưới dạng bảng immutable — chỉ cho phép INSERT và cấm UPDATE/DELETE thông qua database trigger nhằm đảm bảo tamper-proof theo PDPL 2023 Article 11; các cột bao gồm Thời gian (</w:t>
-      </w:r>
-      <w:r>
-        <w:rPr>
-          <w:rFonts w:ascii="Times New Roman" w:hAnsi="Times New Roman" w:eastAsia="Times New Roman"/>
-          <w:b w:val="0"/>
-          <w:i/>
-          <w:sz w:val="26"/>
-        </w:rPr>
-        <w:t>Thứ Hai, 20/05/2026 09:30</w:t>
-      </w:r>
-      <w:r>
-        <w:rPr>
-          <w:rFonts w:ascii="Times New Roman" w:hAnsi="Times New Roman" w:eastAsia="Times New Roman"/>
-          <w:b w:val="0"/>
-          <w:i w:val="0"/>
-          <w:sz w:val="26"/>
-        </w:rPr>
-        <w:t>), Admin user (</w:t>
-      </w:r>
-      <w:r>
-        <w:rPr>
-          <w:rFonts w:ascii="Times New Roman" w:hAnsi="Times New Roman" w:eastAsia="Times New Roman"/>
-          <w:b w:val="0"/>
-          <w:i/>
-          <w:sz w:val="26"/>
-        </w:rPr>
-        <w:t>admin@kitehub.me</w:t>
-      </w:r>
-      <w:r>
-        <w:rPr>
-          <w:rFonts w:ascii="Times New Roman" w:hAnsi="Times New Roman" w:eastAsia="Times New Roman"/>
-          <w:b w:val="0"/>
-          <w:i w:val="0"/>
-          <w:sz w:val="26"/>
-        </w:rPr>
-        <w:t>), Loại hành động (</w:t>
-      </w:r>
-      <w:r>
-        <w:rPr>
-          <w:rFonts w:ascii="Times New Roman" w:hAnsi="Times New Roman" w:eastAsia="Times New Roman"/>
-          <w:b w:val="0"/>
-          <w:i/>
-          <w:sz w:val="26"/>
-        </w:rPr>
-        <w:t>APPROVE_TENANT_REQUEST</w:t>
-      </w:r>
-      <w:r>
-        <w:rPr>
-          <w:rFonts w:ascii="Times New Roman" w:hAnsi="Times New Roman" w:eastAsia="Times New Roman"/>
-          <w:b w:val="0"/>
-          <w:i w:val="0"/>
-          <w:sz w:val="26"/>
-        </w:rPr>
-        <w:t xml:space="preserve">, </w:t>
-      </w:r>
-      <w:r>
-        <w:rPr>
-          <w:rFonts w:ascii="Times New Roman" w:hAnsi="Times New Roman" w:eastAsia="Times New Roman"/>
-          <w:b w:val="0"/>
-          <w:i/>
-          <w:sz w:val="26"/>
-        </w:rPr>
-        <w:t>TENANT_SUSPEND</w:t>
-      </w:r>
-      <w:r>
-        <w:rPr>
-          <w:rFonts w:ascii="Times New Roman" w:hAnsi="Times New Roman" w:eastAsia="Times New Roman"/>
-          <w:b w:val="0"/>
-          <w:i w:val="0"/>
-          <w:sz w:val="26"/>
-        </w:rPr>
-        <w:t xml:space="preserve">, </w:t>
-      </w:r>
-      <w:r>
-        <w:rPr>
-          <w:rFonts w:ascii="Times New Roman" w:hAnsi="Times New Roman" w:eastAsia="Times New Roman"/>
-          <w:b w:val="0"/>
-          <w:i/>
-          <w:sz w:val="26"/>
-        </w:rPr>
-        <w:t>EMAIL_TEMPLATE_UPDATE</w:t>
-      </w:r>
-      <w:r>
-        <w:rPr>
-          <w:rFonts w:ascii="Times New Roman" w:hAnsi="Times New Roman" w:eastAsia="Times New Roman"/>
-          <w:b w:val="0"/>
-          <w:i w:val="0"/>
-          <w:sz w:val="26"/>
-        </w:rPr>
-        <w:t xml:space="preserve">), Đối tượng tác động (Tenant </w:t>
-      </w:r>
-      <w:r>
-        <w:rPr>
-          <w:rFonts w:ascii="Times New Roman" w:hAnsi="Times New Roman" w:eastAsia="Times New Roman"/>
-          <w:b w:val="0"/>
-          <w:i/>
-          <w:sz w:val="26"/>
-        </w:rPr>
-        <w:t>Sky Education</w:t>
-      </w:r>
-      <w:r>
-        <w:rPr>
-          <w:rFonts w:ascii="Times New Roman" w:hAnsi="Times New Roman" w:eastAsia="Times New Roman"/>
-          <w:b w:val="0"/>
-          <w:i w:val="0"/>
-          <w:sz w:val="26"/>
-        </w:rPr>
-        <w:t xml:space="preserve"> hoặc Yêu cầu mở tenant </w:t>
-      </w:r>
-      <w:r>
-        <w:rPr>
-          <w:rFonts w:ascii="Times New Roman" w:hAnsi="Times New Roman" w:eastAsia="Times New Roman"/>
-          <w:b w:val="0"/>
-          <w:i/>
-          <w:sz w:val="26"/>
-        </w:rPr>
-        <w:t>req_uuid</w:t>
-      </w:r>
-      <w:r>
-        <w:rPr>
-          <w:rFonts w:ascii="Times New Roman" w:hAnsi="Times New Roman" w:eastAsia="Times New Roman"/>
-          <w:b w:val="0"/>
-          <w:i w:val="0"/>
-          <w:sz w:val="26"/>
-        </w:rPr>
-        <w:t>), IP address rút gọn an toàn và Chi tiết JSON expandable; filter combo cho phép tìm theo loại hành động, admin user và khoảng thời gian, top banner notify compliance "Trang này được bảo vệ bởi PDPL Article 11 — mọi hành động admin được lưu vĩnh viễn và không thể chỉnh sửa", retention 5 năm theo PDPL Art 11.2 và hỗ trợ export CSV/PDF cho compliance audit định kỳ hằng quý.</w:t>
+        <w:t>Sau khi tenant được kích hoạt, Chủ trung tâm và Quản lý sử dụng nhóm chức năng vận hành để tổ chức học viên, lớp học và khóa học. Hình 3.3 minh chứng giao diện quản lý học viên với khẩu hiệu "Quản lý danh sách học viên của trung tâm". Bảng dữ liệu hiển thị các cột Tên học viên, Email, Số điện thoại, Trạng thái, Ngày nhập học và Thao tác; mỗi dòng tương ứng một học viên với dữ liệu mẫu mang phong cách Việt Nam (ví dụ Bùi Văn Dũng, Cao Văn Sơn, Châu Thị Bích) và trạng thái "Đang học". Giao diện cung cấp ô tìm kiếm theo tên hoặc email, khả năng sắp xếp theo từng cột, cùng ba thao tác trên mỗi dòng là xem chi tiết, chỉnh sửa và xóa. Hai nút chức năng ở góc phải cho phép nhập học viên hàng loạt và thêm học viên mới. Trong giai đoạn thử nghiệm, trung tâm mẫu đã có 78 học viên được quản lý qua giao diện này, khớp với chỉ số trên dashboard tổng quan tại Hình 3.1. Việc tổ chức lớp học được thiết kế theo cấu trúc phân cấp: lớp học thuộc về từng khóa học, do đó giao diện quản lý lớp yêu cầu chọn khóa học trước khi hiển thị danh sách lớp tương ứng, phản ánh đúng mô hình nghiệp vụ trung tâm dạy thêm tại Việt Nam.</w:t>
       </w:r>
     </w:p>
     <w:p>
@@ -24940,7 +25327,7 @@
           <w:i w:val="0"/>
           <w:sz w:val="26"/>
         </w:rPr>
-        <w:t>Tám giao diện được nhóm thành ba luồng nghiệp vụ trên đại diện cho happy path của hai persona target P1 và P2 trong giai đoạn thử nghiệm. Các giao diện sau chưa được trình bày trong phiên bản này do thuộc scope giai đoạn tiếp theo hoặc do giới hạn không gian báo cáo: giao diện admin xử lý chargeback (giai đoạn thương mại hóa khi tích hợp payment gateway), giao diện parent portal (giai đoạn vận hành chính thức — P4 persona), giao diện mobile app native (sau giai đoạn thương mại hóa — chưa triển khai), và giao diện K-12 transcript management (giai đoạn vận hành chính thức — P5 persona).</w:t>
+        <w:t>Bốn giao diện được trình bày trong ba nhóm chức năng trên đại diện cho các luồng đã hoàn thiện và có minh chứng thực tế trong giai đoạn thử nghiệm: trang chủ công khai mang thương hiệu riêng, tùy biến thương hiệu bằng AI, dashboard tổng quan và quản lý học viên. Một số giao diện khác đã được xây dựng nhưng chưa đưa vào bộ minh chứng này do còn ở trạng thái dữ liệu chưa đầy đủ trong môi trường thử nghiệm — cụ thể là giao diện quản lý hóa đơn và thanh toán (đang trong quá trình hoàn thiện endpoint tổng hợp số liệu) cùng các thống kê doanh thu. Các giao diện thuộc phạm vi giai đoạn tiếp theo gồm: cổng thông tin dành cho phụ huynh (persona P4), ứng dụng di động gốc (sau giai đoạn thương mại hóa), và quản lý học bạ K-12 (persona P5). Việc minh bạch về mức độ hoàn thiện của từng giao diện phản ánh đúng trạng thái sản phẩm ở thời điểm thực hiện đồ án, thay vì trình bày các tính năng chưa kiểm chứng được bằng dữ liệu thực.</w:t>
       </w:r>
     </w:p>
     <w:p>
@@ -25013,7 +25400,7 @@
         <w:drawing>
           <wp:inline xmlns:a="http://schemas.openxmlformats.org/drawingml/2006/main" xmlns:pic="http://schemas.openxmlformats.org/drawingml/2006/picture">
             <wp:extent cx="3620404" cy="6480000"/>
-            <wp:docPr id="25" name="Picture 25"/>
+            <wp:docPr id="24" name="Picture 24"/>
             <wp:cNvGraphicFramePr>
               <a:graphicFrameLocks noChangeAspect="1"/>
             </wp:cNvGraphicFramePr>
@@ -25025,7 +25412,7 @@
                     <pic:cNvPicPr/>
                   </pic:nvPicPr>
                   <pic:blipFill>
-                    <a:blip r:embed="rId33"/>
+                    <a:blip r:embed="rId32"/>
                     <a:stretch>
                       <a:fillRect/>
                     </a:stretch>
@@ -25465,7 +25852,7 @@
         <w:drawing>
           <wp:inline xmlns:a="http://schemas.openxmlformats.org/drawingml/2006/main" xmlns:pic="http://schemas.openxmlformats.org/drawingml/2006/picture">
             <wp:extent cx="3220303" cy="6480000"/>
-            <wp:docPr id="26" name="Picture 26"/>
+            <wp:docPr id="25" name="Picture 25"/>
             <wp:cNvGraphicFramePr>
               <a:graphicFrameLocks noChangeAspect="1"/>
             </wp:cNvGraphicFramePr>
@@ -25477,7 +25864,7 @@
                     <pic:cNvPicPr/>
                   </pic:nvPicPr>
                   <pic:blipFill>
-                    <a:blip r:embed="rId34"/>
+                    <a:blip r:embed="rId33"/>
                     <a:stretch>
                       <a:fillRect/>
                     </a:stretch>
@@ -25531,7 +25918,7 @@
         <w:drawing>
           <wp:inline xmlns:a="http://schemas.openxmlformats.org/drawingml/2006/main" xmlns:pic="http://schemas.openxmlformats.org/drawingml/2006/picture">
             <wp:extent cx="5760000" cy="5004659"/>
-            <wp:docPr id="27" name="Picture 27"/>
+            <wp:docPr id="26" name="Picture 26"/>
             <wp:cNvGraphicFramePr>
               <a:graphicFrameLocks noChangeAspect="1"/>
             </wp:cNvGraphicFramePr>
@@ -25543,7 +25930,7 @@
                     <pic:cNvPicPr/>
                   </pic:nvPicPr>
                   <pic:blipFill>
-                    <a:blip r:embed="rId35"/>
+                    <a:blip r:embed="rId34"/>
                     <a:stretch>
                       <a:fillRect/>
                     </a:stretch>
@@ -26152,7 +26539,7 @@
         <w:drawing>
           <wp:inline xmlns:a="http://schemas.openxmlformats.org/drawingml/2006/main" xmlns:pic="http://schemas.openxmlformats.org/drawingml/2006/picture">
             <wp:extent cx="5760000" cy="2219294"/>
-            <wp:docPr id="28" name="Picture 28"/>
+            <wp:docPr id="27" name="Picture 27"/>
             <wp:cNvGraphicFramePr>
               <a:graphicFrameLocks noChangeAspect="1"/>
             </wp:cNvGraphicFramePr>
@@ -26164,7 +26551,7 @@
                     <pic:cNvPicPr/>
                   </pic:nvPicPr>
                   <pic:blipFill>
-                    <a:blip r:embed="rId36"/>
+                    <a:blip r:embed="rId35"/>
                     <a:stretch>
                       <a:fillRect/>
                     </a:stretch>
@@ -26217,7 +26604,7 @@
         <w:drawing>
           <wp:inline xmlns:a="http://schemas.openxmlformats.org/drawingml/2006/main" xmlns:pic="http://schemas.openxmlformats.org/drawingml/2006/picture">
             <wp:extent cx="5760000" cy="2217663"/>
-            <wp:docPr id="29" name="Picture 29"/>
+            <wp:docPr id="28" name="Picture 28"/>
             <wp:cNvGraphicFramePr>
               <a:graphicFrameLocks noChangeAspect="1"/>
             </wp:cNvGraphicFramePr>
@@ -26229,7 +26616,7 @@
                     <pic:cNvPicPr/>
                   </pic:nvPicPr>
                   <pic:blipFill>
-                    <a:blip r:embed="rId37"/>
+                    <a:blip r:embed="rId36"/>
                     <a:stretch>
                       <a:fillRect/>
                     </a:stretch>
@@ -27157,7 +27544,7 @@
           <w:color w:val="000000"/>
           <w:sz w:val="28"/>
         </w:rPr>
-        <w:t>4.1.6 Trạng thái triển khai</w:t>
+        <w:t>4.1.6 Cấu hình Cloudflare biên</w:t>
       </w:r>
     </w:p>
     <w:p>
@@ -27173,7 +27560,982 @@
           <w:i w:val="0"/>
           <w:sz w:val="26"/>
         </w:rPr>
-        <w:t>Tính đến thời điểm thực hiện đồ án: 71 resources terraform đã apply (CloudTrail captured); hai EC2 instance + RDS PostgreSQL multi-tenant schema RLS đã chạy; Cloudflare DNS đã cutover (kitehub.me thì ALB); AWS SES production mode đã được approve; CI/CD pipeline OIDC + ECR + SSM hoạt động đầy đủ; beta tenant invite mechanism đã sẵn sàng nhận yêu cầu.</w:t>
+        <w:t>Cloudflare đảm nhận lớp biên (edge) phía trước hạ tầng AWS, cung cấp bốn nhóm chức năng: phân giải tên miền (DNS), proxy bảo vệ, mã hóa truyền tải (SSL/TLS) và định tuyến thư điện tử. Toàn bộ lưu lượng từ Internet đi qua Cloudflare trước khi tới Application Load Balancer, nhờ đó địa chỉ IP gốc của hạ tầng AWS không lộ ra ngoài.</w:t>
+      </w:r>
+    </w:p>
+    <w:p>
+      <w:pPr>
+        <w:spacing w:line="288" w:lineRule="auto"/>
+        <w:ind w:firstLine="567"/>
+        <w:jc w:val="both"/>
+      </w:pPr>
+      <w:r>
+        <w:rPr>
+          <w:rFonts w:ascii="Times New Roman" w:hAnsi="Times New Roman" w:eastAsia="Times New Roman"/>
+          <w:b w:val="0"/>
+          <w:i w:val="0"/>
+          <w:sz w:val="26"/>
+        </w:rPr>
+        <w:t xml:space="preserve">Bảng 4.1 liệt kê các bản ghi DNS chính được cấu hình cho tên miền </w:t>
+      </w:r>
+      <w:r>
+        <w:rPr>
+          <w:rFonts w:ascii="Times New Roman" w:hAnsi="Times New Roman" w:eastAsia="Times New Roman"/>
+          <w:b w:val="0"/>
+          <w:i/>
+          <w:sz w:val="26"/>
+        </w:rPr>
+        <w:t>kitehub.me</w:t>
+      </w:r>
+      <w:r>
+        <w:rPr>
+          <w:rFonts w:ascii="Times New Roman" w:hAnsi="Times New Roman" w:eastAsia="Times New Roman"/>
+          <w:b w:val="0"/>
+          <w:i w:val="0"/>
+          <w:sz w:val="26"/>
+        </w:rPr>
+        <w:t>.</w:t>
+      </w:r>
+    </w:p>
+    <w:tbl>
+      <w:tblPr>
+        <w:tblStyle w:val="TableGrid"/>
+        <w:tblW w:type="auto" w:w="0"/>
+        <w:jc w:val="center"/>
+        <w:tblLook w:firstColumn="1" w:firstRow="1" w:lastColumn="0" w:lastRow="0" w:noHBand="0" w:noVBand="1" w:val="04A0"/>
+      </w:tblPr>
+      <w:tblGrid>
+        <w:gridCol w:w="1728"/>
+        <w:gridCol w:w="1728"/>
+        <w:gridCol w:w="1728"/>
+        <w:gridCol w:w="1728"/>
+        <w:gridCol w:w="1728"/>
+      </w:tblGrid>
+      <w:tr>
+        <w:tc>
+          <w:tcPr>
+            <w:tcW w:type="dxa" w:w="1728"/>
+          </w:tcPr>
+          <w:p>
+            <w:pPr>
+              <w:jc w:val="center"/>
+            </w:pPr>
+            <w:r>
+              <w:rPr>
+                <w:b/>
+                <w:sz w:val="24"/>
+              </w:rPr>
+            </w:r>
+            <w:r>
+              <w:rPr>
+                <w:rFonts w:ascii="Times New Roman" w:hAnsi="Times New Roman" w:eastAsia="Times New Roman"/>
+                <w:b/>
+                <w:i w:val="0"/>
+                <w:sz w:val="24"/>
+              </w:rPr>
+              <w:t>Loại bản ghi</w:t>
+            </w:r>
+          </w:p>
+        </w:tc>
+        <w:tc>
+          <w:tcPr>
+            <w:tcW w:type="dxa" w:w="1728"/>
+          </w:tcPr>
+          <w:p>
+            <w:pPr>
+              <w:jc w:val="center"/>
+            </w:pPr>
+            <w:r>
+              <w:rPr>
+                <w:b/>
+                <w:sz w:val="24"/>
+              </w:rPr>
+            </w:r>
+            <w:r>
+              <w:rPr>
+                <w:rFonts w:ascii="Times New Roman" w:hAnsi="Times New Roman" w:eastAsia="Times New Roman"/>
+                <w:b/>
+                <w:i w:val="0"/>
+                <w:sz w:val="24"/>
+              </w:rPr>
+              <w:t>Tên</w:t>
+            </w:r>
+          </w:p>
+        </w:tc>
+        <w:tc>
+          <w:tcPr>
+            <w:tcW w:type="dxa" w:w="1728"/>
+          </w:tcPr>
+          <w:p>
+            <w:pPr>
+              <w:jc w:val="center"/>
+            </w:pPr>
+            <w:r>
+              <w:rPr>
+                <w:b/>
+                <w:sz w:val="24"/>
+              </w:rPr>
+            </w:r>
+            <w:r>
+              <w:rPr>
+                <w:rFonts w:ascii="Times New Roman" w:hAnsi="Times New Roman" w:eastAsia="Times New Roman"/>
+                <w:b/>
+                <w:i w:val="0"/>
+                <w:sz w:val="24"/>
+              </w:rPr>
+              <w:t>Giá trị</w:t>
+            </w:r>
+          </w:p>
+        </w:tc>
+        <w:tc>
+          <w:tcPr>
+            <w:tcW w:type="dxa" w:w="1728"/>
+          </w:tcPr>
+          <w:p>
+            <w:pPr>
+              <w:jc w:val="center"/>
+            </w:pPr>
+            <w:r>
+              <w:rPr>
+                <w:b/>
+                <w:sz w:val="24"/>
+              </w:rPr>
+            </w:r>
+            <w:r>
+              <w:rPr>
+                <w:rFonts w:ascii="Times New Roman" w:hAnsi="Times New Roman" w:eastAsia="Times New Roman"/>
+                <w:b/>
+                <w:i w:val="0"/>
+                <w:sz w:val="24"/>
+              </w:rPr>
+              <w:t>Proxy</w:t>
+            </w:r>
+          </w:p>
+        </w:tc>
+        <w:tc>
+          <w:tcPr>
+            <w:tcW w:type="dxa" w:w="1728"/>
+          </w:tcPr>
+          <w:p>
+            <w:pPr>
+              <w:jc w:val="center"/>
+            </w:pPr>
+            <w:r>
+              <w:rPr>
+                <w:b/>
+                <w:sz w:val="24"/>
+              </w:rPr>
+            </w:r>
+            <w:r>
+              <w:rPr>
+                <w:rFonts w:ascii="Times New Roman" w:hAnsi="Times New Roman" w:eastAsia="Times New Roman"/>
+                <w:b/>
+                <w:i w:val="0"/>
+                <w:sz w:val="24"/>
+              </w:rPr>
+              <w:t>Mục đích</w:t>
+            </w:r>
+          </w:p>
+        </w:tc>
+      </w:tr>
+      <w:tr>
+        <w:tc>
+          <w:tcPr>
+            <w:tcW w:type="dxa" w:w="1728"/>
+          </w:tcPr>
+          <w:p>
+            <w:r>
+              <w:rPr>
+                <w:sz w:val="24"/>
+              </w:rPr>
+            </w:r>
+            <w:r>
+              <w:rPr>
+                <w:rFonts w:ascii="Times New Roman" w:hAnsi="Times New Roman" w:eastAsia="Times New Roman"/>
+                <w:b w:val="0"/>
+                <w:i w:val="0"/>
+                <w:sz w:val="24"/>
+              </w:rPr>
+              <w:t>A</w:t>
+            </w:r>
+          </w:p>
+        </w:tc>
+        <w:tc>
+          <w:tcPr>
+            <w:tcW w:type="dxa" w:w="1728"/>
+          </w:tcPr>
+          <w:p>
+            <w:r>
+              <w:rPr>
+                <w:sz w:val="24"/>
+              </w:rPr>
+            </w:r>
+            <w:r>
+              <w:rPr>
+                <w:rFonts w:ascii="Times New Roman" w:hAnsi="Times New Roman" w:eastAsia="Times New Roman"/>
+                <w:b w:val="0"/>
+                <w:i/>
+                <w:sz w:val="24"/>
+              </w:rPr>
+              <w:t>kitehub.me</w:t>
+            </w:r>
+          </w:p>
+        </w:tc>
+        <w:tc>
+          <w:tcPr>
+            <w:tcW w:type="dxa" w:w="1728"/>
+          </w:tcPr>
+          <w:p>
+            <w:r>
+              <w:rPr>
+                <w:sz w:val="24"/>
+              </w:rPr>
+            </w:r>
+            <w:r>
+              <w:rPr>
+                <w:rFonts w:ascii="Times New Roman" w:hAnsi="Times New Roman" w:eastAsia="Times New Roman"/>
+                <w:b w:val="0"/>
+                <w:i w:val="0"/>
+                <w:sz w:val="24"/>
+              </w:rPr>
+              <w:t>IP của ALB</w:t>
+            </w:r>
+          </w:p>
+        </w:tc>
+        <w:tc>
+          <w:tcPr>
+            <w:tcW w:type="dxa" w:w="1728"/>
+          </w:tcPr>
+          <w:p>
+            <w:r>
+              <w:rPr>
+                <w:sz w:val="24"/>
+              </w:rPr>
+            </w:r>
+            <w:r>
+              <w:rPr>
+                <w:rFonts w:ascii="Times New Roman" w:hAnsi="Times New Roman" w:eastAsia="Times New Roman"/>
+                <w:b w:val="0"/>
+                <w:i w:val="0"/>
+                <w:sz w:val="24"/>
+              </w:rPr>
+              <w:t>Bật (proxied)</w:t>
+            </w:r>
+          </w:p>
+        </w:tc>
+        <w:tc>
+          <w:tcPr>
+            <w:tcW w:type="dxa" w:w="1728"/>
+          </w:tcPr>
+          <w:p>
+            <w:r>
+              <w:rPr>
+                <w:sz w:val="24"/>
+              </w:rPr>
+            </w:r>
+            <w:r>
+              <w:rPr>
+                <w:rFonts w:ascii="Times New Roman" w:hAnsi="Times New Roman" w:eastAsia="Times New Roman"/>
+                <w:b w:val="0"/>
+                <w:i w:val="0"/>
+                <w:sz w:val="24"/>
+              </w:rPr>
+              <w:t>Trỏ tên miền gốc tới load balancer</w:t>
+            </w:r>
+          </w:p>
+        </w:tc>
+      </w:tr>
+      <w:tr>
+        <w:tc>
+          <w:tcPr>
+            <w:tcW w:type="dxa" w:w="1728"/>
+          </w:tcPr>
+          <w:p>
+            <w:r>
+              <w:rPr>
+                <w:sz w:val="24"/>
+              </w:rPr>
+            </w:r>
+            <w:r>
+              <w:rPr>
+                <w:rFonts w:ascii="Times New Roman" w:hAnsi="Times New Roman" w:eastAsia="Times New Roman"/>
+                <w:b w:val="0"/>
+                <w:i w:val="0"/>
+                <w:sz w:val="24"/>
+              </w:rPr>
+              <w:t>CNAME</w:t>
+            </w:r>
+          </w:p>
+        </w:tc>
+        <w:tc>
+          <w:tcPr>
+            <w:tcW w:type="dxa" w:w="1728"/>
+          </w:tcPr>
+          <w:p>
+            <w:r>
+              <w:rPr>
+                <w:sz w:val="24"/>
+              </w:rPr>
+            </w:r>
+            <w:r>
+              <w:rPr>
+                <w:rFonts w:ascii="Times New Roman" w:hAnsi="Times New Roman" w:eastAsia="Times New Roman"/>
+                <w:b w:val="0"/>
+                <w:i/>
+                <w:sz w:val="24"/>
+              </w:rPr>
+              <w:t>www</w:t>
+            </w:r>
+          </w:p>
+        </w:tc>
+        <w:tc>
+          <w:tcPr>
+            <w:tcW w:type="dxa" w:w="1728"/>
+          </w:tcPr>
+          <w:p>
+            <w:r>
+              <w:rPr>
+                <w:sz w:val="24"/>
+              </w:rPr>
+            </w:r>
+            <w:r>
+              <w:rPr>
+                <w:rFonts w:ascii="Times New Roman" w:hAnsi="Times New Roman" w:eastAsia="Times New Roman"/>
+                <w:b w:val="0"/>
+                <w:i/>
+                <w:sz w:val="24"/>
+              </w:rPr>
+              <w:t>kitehub.me</w:t>
+            </w:r>
+          </w:p>
+        </w:tc>
+        <w:tc>
+          <w:tcPr>
+            <w:tcW w:type="dxa" w:w="1728"/>
+          </w:tcPr>
+          <w:p>
+            <w:r>
+              <w:rPr>
+                <w:sz w:val="24"/>
+              </w:rPr>
+            </w:r>
+            <w:r>
+              <w:rPr>
+                <w:rFonts w:ascii="Times New Roman" w:hAnsi="Times New Roman" w:eastAsia="Times New Roman"/>
+                <w:b w:val="0"/>
+                <w:i w:val="0"/>
+                <w:sz w:val="24"/>
+              </w:rPr>
+              <w:t>Bật (proxied)</w:t>
+            </w:r>
+          </w:p>
+        </w:tc>
+        <w:tc>
+          <w:tcPr>
+            <w:tcW w:type="dxa" w:w="1728"/>
+          </w:tcPr>
+          <w:p>
+            <w:r>
+              <w:rPr>
+                <w:sz w:val="24"/>
+              </w:rPr>
+            </w:r>
+            <w:r>
+              <w:rPr>
+                <w:rFonts w:ascii="Times New Roman" w:hAnsi="Times New Roman" w:eastAsia="Times New Roman"/>
+                <w:b w:val="0"/>
+                <w:i w:val="0"/>
+                <w:sz w:val="24"/>
+              </w:rPr>
+              <w:t>Chuyển hướng www về apex</w:t>
+            </w:r>
+          </w:p>
+        </w:tc>
+      </w:tr>
+      <w:tr>
+        <w:tc>
+          <w:tcPr>
+            <w:tcW w:type="dxa" w:w="1728"/>
+          </w:tcPr>
+          <w:p>
+            <w:r>
+              <w:rPr>
+                <w:sz w:val="24"/>
+              </w:rPr>
+            </w:r>
+            <w:r>
+              <w:rPr>
+                <w:rFonts w:ascii="Times New Roman" w:hAnsi="Times New Roman" w:eastAsia="Times New Roman"/>
+                <w:b w:val="0"/>
+                <w:i w:val="0"/>
+                <w:sz w:val="24"/>
+              </w:rPr>
+              <w:t>CNAME</w:t>
+            </w:r>
+          </w:p>
+        </w:tc>
+        <w:tc>
+          <w:tcPr>
+            <w:tcW w:type="dxa" w:w="1728"/>
+          </w:tcPr>
+          <w:p>
+            <w:r>
+              <w:rPr>
+                <w:sz w:val="24"/>
+              </w:rPr>
+            </w:r>
+            <w:r>
+              <w:rPr>
+                <w:rFonts w:ascii="Times New Roman" w:hAnsi="Times New Roman" w:eastAsia="Times New Roman"/>
+                <w:b w:val="0"/>
+                <w:i/>
+                <w:sz w:val="24"/>
+              </w:rPr>
+              <w:t>*</w:t>
+            </w:r>
+            <w:r>
+              <w:rPr>
+                <w:rFonts w:ascii="Times New Roman" w:hAnsi="Times New Roman" w:eastAsia="Times New Roman"/>
+                <w:b w:val="0"/>
+                <w:i w:val="0"/>
+                <w:sz w:val="24"/>
+              </w:rPr>
+              <w:t xml:space="preserve"> (wildcard)</w:t>
+            </w:r>
+          </w:p>
+        </w:tc>
+        <w:tc>
+          <w:tcPr>
+            <w:tcW w:type="dxa" w:w="1728"/>
+          </w:tcPr>
+          <w:p>
+            <w:r>
+              <w:rPr>
+                <w:sz w:val="24"/>
+              </w:rPr>
+            </w:r>
+            <w:r>
+              <w:rPr>
+                <w:rFonts w:ascii="Times New Roman" w:hAnsi="Times New Roman" w:eastAsia="Times New Roman"/>
+                <w:b w:val="0"/>
+                <w:i/>
+                <w:sz w:val="24"/>
+              </w:rPr>
+              <w:t>kitehub.me</w:t>
+            </w:r>
+          </w:p>
+        </w:tc>
+        <w:tc>
+          <w:tcPr>
+            <w:tcW w:type="dxa" w:w="1728"/>
+          </w:tcPr>
+          <w:p>
+            <w:r>
+              <w:rPr>
+                <w:sz w:val="24"/>
+              </w:rPr>
+            </w:r>
+            <w:r>
+              <w:rPr>
+                <w:rFonts w:ascii="Times New Roman" w:hAnsi="Times New Roman" w:eastAsia="Times New Roman"/>
+                <w:b w:val="0"/>
+                <w:i w:val="0"/>
+                <w:sz w:val="24"/>
+              </w:rPr>
+              <w:t>Bật (proxied)</w:t>
+            </w:r>
+          </w:p>
+        </w:tc>
+        <w:tc>
+          <w:tcPr>
+            <w:tcW w:type="dxa" w:w="1728"/>
+          </w:tcPr>
+          <w:p>
+            <w:r>
+              <w:rPr>
+                <w:sz w:val="24"/>
+              </w:rPr>
+            </w:r>
+            <w:r>
+              <w:rPr>
+                <w:rFonts w:ascii="Times New Roman" w:hAnsi="Times New Roman" w:eastAsia="Times New Roman"/>
+                <w:b w:val="0"/>
+                <w:i w:val="0"/>
+                <w:sz w:val="24"/>
+              </w:rPr>
+              <w:t xml:space="preserve">Định tuyến subdomain mỗi tenant </w:t>
+            </w:r>
+            <w:r>
+              <w:rPr>
+                <w:rFonts w:ascii="Times New Roman" w:hAnsi="Times New Roman" w:eastAsia="Times New Roman"/>
+                <w:b w:val="0"/>
+                <w:i/>
+                <w:sz w:val="24"/>
+              </w:rPr>
+              <w:t>{slug}.kitehub.me</w:t>
+            </w:r>
+          </w:p>
+        </w:tc>
+      </w:tr>
+      <w:tr>
+        <w:tc>
+          <w:tcPr>
+            <w:tcW w:type="dxa" w:w="1728"/>
+          </w:tcPr>
+          <w:p>
+            <w:r>
+              <w:rPr>
+                <w:sz w:val="24"/>
+              </w:rPr>
+            </w:r>
+            <w:r>
+              <w:rPr>
+                <w:rFonts w:ascii="Times New Roman" w:hAnsi="Times New Roman" w:eastAsia="Times New Roman"/>
+                <w:b w:val="0"/>
+                <w:i w:val="0"/>
+                <w:sz w:val="24"/>
+              </w:rPr>
+              <w:t>TXT</w:t>
+            </w:r>
+          </w:p>
+        </w:tc>
+        <w:tc>
+          <w:tcPr>
+            <w:tcW w:type="dxa" w:w="1728"/>
+          </w:tcPr>
+          <w:p>
+            <w:r>
+              <w:rPr>
+                <w:sz w:val="24"/>
+              </w:rPr>
+            </w:r>
+            <w:r>
+              <w:rPr>
+                <w:rFonts w:ascii="Times New Roman" w:hAnsi="Times New Roman" w:eastAsia="Times New Roman"/>
+                <w:b w:val="0"/>
+                <w:i/>
+                <w:sz w:val="24"/>
+              </w:rPr>
+              <w:t>kitehub.me</w:t>
+            </w:r>
+          </w:p>
+        </w:tc>
+        <w:tc>
+          <w:tcPr>
+            <w:tcW w:type="dxa" w:w="1728"/>
+          </w:tcPr>
+          <w:p>
+            <w:r>
+              <w:rPr>
+                <w:sz w:val="24"/>
+              </w:rPr>
+            </w:r>
+            <w:r>
+              <w:rPr>
+                <w:rFonts w:ascii="Times New Roman" w:hAnsi="Times New Roman" w:eastAsia="Times New Roman"/>
+                <w:b w:val="0"/>
+                <w:i w:val="0"/>
+                <w:sz w:val="24"/>
+              </w:rPr>
+              <w:t>SPF record</w:t>
+            </w:r>
+          </w:p>
+        </w:tc>
+        <w:tc>
+          <w:tcPr>
+            <w:tcW w:type="dxa" w:w="1728"/>
+          </w:tcPr>
+          <w:p>
+            <w:r>
+              <w:rPr>
+                <w:sz w:val="24"/>
+              </w:rPr>
+            </w:r>
+            <w:r>
+              <w:rPr>
+                <w:rFonts w:ascii="Times New Roman" w:hAnsi="Times New Roman" w:eastAsia="Times New Roman"/>
+                <w:b w:val="0"/>
+                <w:i w:val="0"/>
+                <w:sz w:val="24"/>
+              </w:rPr>
+              <w:t>Không</w:t>
+            </w:r>
+          </w:p>
+        </w:tc>
+        <w:tc>
+          <w:tcPr>
+            <w:tcW w:type="dxa" w:w="1728"/>
+          </w:tcPr>
+          <w:p>
+            <w:r>
+              <w:rPr>
+                <w:sz w:val="24"/>
+              </w:rPr>
+            </w:r>
+            <w:r>
+              <w:rPr>
+                <w:rFonts w:ascii="Times New Roman" w:hAnsi="Times New Roman" w:eastAsia="Times New Roman"/>
+                <w:b w:val="0"/>
+                <w:i w:val="0"/>
+                <w:sz w:val="24"/>
+              </w:rPr>
+              <w:t>Xác thực nguồn gửi email</w:t>
+            </w:r>
+          </w:p>
+        </w:tc>
+      </w:tr>
+      <w:tr>
+        <w:tc>
+          <w:tcPr>
+            <w:tcW w:type="dxa" w:w="1728"/>
+          </w:tcPr>
+          <w:p>
+            <w:r>
+              <w:rPr>
+                <w:sz w:val="24"/>
+              </w:rPr>
+            </w:r>
+            <w:r>
+              <w:rPr>
+                <w:rFonts w:ascii="Times New Roman" w:hAnsi="Times New Roman" w:eastAsia="Times New Roman"/>
+                <w:b w:val="0"/>
+                <w:i w:val="0"/>
+                <w:sz w:val="24"/>
+              </w:rPr>
+              <w:t>TXT</w:t>
+            </w:r>
+          </w:p>
+        </w:tc>
+        <w:tc>
+          <w:tcPr>
+            <w:tcW w:type="dxa" w:w="1728"/>
+          </w:tcPr>
+          <w:p>
+            <w:r>
+              <w:rPr>
+                <w:sz w:val="24"/>
+              </w:rPr>
+            </w:r>
+            <w:r>
+              <w:rPr>
+                <w:rFonts w:ascii="Times New Roman" w:hAnsi="Times New Roman" w:eastAsia="Times New Roman"/>
+                <w:b w:val="0"/>
+                <w:i/>
+                <w:sz w:val="24"/>
+              </w:rPr>
+              <w:t>_dmarc</w:t>
+            </w:r>
+          </w:p>
+        </w:tc>
+        <w:tc>
+          <w:tcPr>
+            <w:tcW w:type="dxa" w:w="1728"/>
+          </w:tcPr>
+          <w:p>
+            <w:r>
+              <w:rPr>
+                <w:sz w:val="24"/>
+              </w:rPr>
+            </w:r>
+            <w:r>
+              <w:rPr>
+                <w:rFonts w:ascii="Times New Roman" w:hAnsi="Times New Roman" w:eastAsia="Times New Roman"/>
+                <w:b w:val="0"/>
+                <w:i w:val="0"/>
+                <w:sz w:val="24"/>
+              </w:rPr>
+              <w:t>DMARC policy</w:t>
+            </w:r>
+          </w:p>
+        </w:tc>
+        <w:tc>
+          <w:tcPr>
+            <w:tcW w:type="dxa" w:w="1728"/>
+          </w:tcPr>
+          <w:p>
+            <w:r>
+              <w:rPr>
+                <w:sz w:val="24"/>
+              </w:rPr>
+            </w:r>
+            <w:r>
+              <w:rPr>
+                <w:rFonts w:ascii="Times New Roman" w:hAnsi="Times New Roman" w:eastAsia="Times New Roman"/>
+                <w:b w:val="0"/>
+                <w:i w:val="0"/>
+                <w:sz w:val="24"/>
+              </w:rPr>
+              <w:t>Không</w:t>
+            </w:r>
+          </w:p>
+        </w:tc>
+        <w:tc>
+          <w:tcPr>
+            <w:tcW w:type="dxa" w:w="1728"/>
+          </w:tcPr>
+          <w:p>
+            <w:r>
+              <w:rPr>
+                <w:sz w:val="24"/>
+              </w:rPr>
+            </w:r>
+            <w:r>
+              <w:rPr>
+                <w:rFonts w:ascii="Times New Roman" w:hAnsi="Times New Roman" w:eastAsia="Times New Roman"/>
+                <w:b w:val="0"/>
+                <w:i w:val="0"/>
+                <w:sz w:val="24"/>
+              </w:rPr>
+              <w:t>Chính sách chống giả mạo email</w:t>
+            </w:r>
+          </w:p>
+        </w:tc>
+      </w:tr>
+      <w:tr>
+        <w:tc>
+          <w:tcPr>
+            <w:tcW w:type="dxa" w:w="1728"/>
+          </w:tcPr>
+          <w:p>
+            <w:r>
+              <w:rPr>
+                <w:sz w:val="24"/>
+              </w:rPr>
+            </w:r>
+            <w:r>
+              <w:rPr>
+                <w:rFonts w:ascii="Times New Roman" w:hAnsi="Times New Roman" w:eastAsia="Times New Roman"/>
+                <w:b w:val="0"/>
+                <w:i w:val="0"/>
+                <w:sz w:val="24"/>
+              </w:rPr>
+              <w:t>CNAME</w:t>
+            </w:r>
+          </w:p>
+        </w:tc>
+        <w:tc>
+          <w:tcPr>
+            <w:tcW w:type="dxa" w:w="1728"/>
+          </w:tcPr>
+          <w:p>
+            <w:r>
+              <w:rPr>
+                <w:sz w:val="24"/>
+              </w:rPr>
+            </w:r>
+            <w:r>
+              <w:rPr>
+                <w:rFonts w:ascii="Times New Roman" w:hAnsi="Times New Roman" w:eastAsia="Times New Roman"/>
+                <w:b w:val="0"/>
+                <w:i/>
+                <w:sz w:val="24"/>
+              </w:rPr>
+              <w:t>*._domainkey</w:t>
+            </w:r>
+          </w:p>
+        </w:tc>
+        <w:tc>
+          <w:tcPr>
+            <w:tcW w:type="dxa" w:w="1728"/>
+          </w:tcPr>
+          <w:p>
+            <w:r>
+              <w:rPr>
+                <w:sz w:val="24"/>
+              </w:rPr>
+            </w:r>
+            <w:r>
+              <w:rPr>
+                <w:rFonts w:ascii="Times New Roman" w:hAnsi="Times New Roman" w:eastAsia="Times New Roman"/>
+                <w:b w:val="0"/>
+                <w:i w:val="0"/>
+                <w:sz w:val="24"/>
+              </w:rPr>
+              <w:t>DKIM (AWS SES)</w:t>
+            </w:r>
+          </w:p>
+        </w:tc>
+        <w:tc>
+          <w:tcPr>
+            <w:tcW w:type="dxa" w:w="1728"/>
+          </w:tcPr>
+          <w:p>
+            <w:r>
+              <w:rPr>
+                <w:sz w:val="24"/>
+              </w:rPr>
+            </w:r>
+            <w:r>
+              <w:rPr>
+                <w:rFonts w:ascii="Times New Roman" w:hAnsi="Times New Roman" w:eastAsia="Times New Roman"/>
+                <w:b w:val="0"/>
+                <w:i w:val="0"/>
+                <w:sz w:val="24"/>
+              </w:rPr>
+              <w:t>Không</w:t>
+            </w:r>
+          </w:p>
+        </w:tc>
+        <w:tc>
+          <w:tcPr>
+            <w:tcW w:type="dxa" w:w="1728"/>
+          </w:tcPr>
+          <w:p>
+            <w:r>
+              <w:rPr>
+                <w:sz w:val="24"/>
+              </w:rPr>
+            </w:r>
+            <w:r>
+              <w:rPr>
+                <w:rFonts w:ascii="Times New Roman" w:hAnsi="Times New Roman" w:eastAsia="Times New Roman"/>
+                <w:b w:val="0"/>
+                <w:i w:val="0"/>
+                <w:sz w:val="24"/>
+              </w:rPr>
+              <w:t>Khóa ký số DKIM cho email</w:t>
+            </w:r>
+          </w:p>
+        </w:tc>
+      </w:tr>
+    </w:tbl>
+    <w:p/>
+    <w:p>
+      <w:pPr>
+        <w:pStyle w:val="BảngCaption"/>
+        <w:spacing w:before="120" w:after="240"/>
+        <w:jc w:val="center"/>
+      </w:pPr>
+      <w:r>
+        <w:rPr>
+          <w:rFonts w:ascii="Times New Roman" w:hAnsi="Times New Roman" w:eastAsia="Times New Roman"/>
+          <w:b/>
+          <w:sz w:val="26"/>
+        </w:rPr>
+        <w:t>Bảng 4.1</w:t>
+      </w:r>
+      <w:r>
+        <w:rPr>
+          <w:rFonts w:ascii="Times New Roman" w:hAnsi="Times New Roman" w:eastAsia="Times New Roman"/>
+          <w:sz w:val="26"/>
+        </w:rPr>
+        <w:t>. Các bản ghi DNS chính trên Cloudflare cho tên miền `kitehub.me`</w:t>
+      </w:r>
+    </w:p>
+    <w:p>
+      <w:pPr>
+        <w:spacing w:line="288" w:lineRule="auto"/>
+        <w:ind w:firstLine="567"/>
+        <w:jc w:val="both"/>
+      </w:pPr>
+      <w:r>
+        <w:rPr>
+          <w:rFonts w:ascii="Times New Roman" w:hAnsi="Times New Roman" w:eastAsia="Times New Roman"/>
+          <w:b w:val="0"/>
+          <w:i w:val="0"/>
+          <w:sz w:val="26"/>
+        </w:rPr>
+        <w:t>Chế độ proxy (biểu tượng đám mây cam) được bật cho các bản ghi phục vụ lưu lượng web, qua đó kích hoạt đồng thời ba lớp bảo vệ: chống tấn công từ chối dịch vụ phân tán (DDoS — Distributed Denial of Service) ở mức L3/L4/L7, tường lửa ứng dụng web (WAF — Web Application Firewall) với bộ luật quản lý sẵn, và bộ nhớ đệm tĩnh (CDN) giảm tải cho EC2. Chế độ mã hóa SSL/TLS được đặt ở mức Full (Strict), tức Cloudflare xác minh chứng chỉ hợp lệ ở cả hai chặng — từ trình duyệt tới Cloudflare và từ Cloudflare tới ALB — nhằm loại bỏ rủi ro tấn công xen giữa.</w:t>
+      </w:r>
+    </w:p>
+    <w:p>
+      <w:pPr>
+        <w:spacing w:line="288" w:lineRule="auto"/>
+        <w:ind w:firstLine="567"/>
+        <w:jc w:val="both"/>
+      </w:pPr>
+      <w:r>
+        <w:rPr>
+          <w:rFonts w:ascii="Times New Roman" w:hAnsi="Times New Roman" w:eastAsia="Times New Roman"/>
+          <w:b w:val="0"/>
+          <w:i w:val="0"/>
+          <w:sz w:val="26"/>
+        </w:rPr>
+        <w:t xml:space="preserve">Định tuyến đa tenant ở lớp DNS dựa trên bản ghi wildcard </w:t>
+      </w:r>
+      <w:r>
+        <w:rPr>
+          <w:rFonts w:ascii="Times New Roman" w:hAnsi="Times New Roman" w:eastAsia="Times New Roman"/>
+          <w:b w:val="0"/>
+          <w:i/>
+          <w:sz w:val="26"/>
+        </w:rPr>
+        <w:t>*.kitehub.me</w:t>
+      </w:r>
+      <w:r>
+        <w:rPr>
+          <w:rFonts w:ascii="Times New Roman" w:hAnsi="Times New Roman" w:eastAsia="Times New Roman"/>
+          <w:b w:val="0"/>
+          <w:i w:val="0"/>
+          <w:sz w:val="26"/>
+        </w:rPr>
+        <w:t xml:space="preserve">: mọi subdomain tenant được Cloudflare phân giải về cùng một điểm vào, sau đó gateway phân giải tenant cụ thể theo trường Host như mô tả tại mục 2.2.6. Đối với tên miền riêng của các gói cao cấp, nền tảng dùng dịch vụ Cloudflare for SaaS để tự động cấp chứng chỉ SSL cho từng tenant thông qua cơ chế xác thực quyền kiểm soát tên miền bằng bản ghi CNAME. Ngoài ra, tính năng Email Routing của Cloudflare chuyển tiếp các địa chỉ thư đến </w:t>
+      </w:r>
+      <w:r>
+        <w:rPr>
+          <w:rFonts w:ascii="Times New Roman" w:hAnsi="Times New Roman" w:eastAsia="Times New Roman"/>
+          <w:b w:val="0"/>
+          <w:i/>
+          <w:sz w:val="26"/>
+        </w:rPr>
+        <w:t>@kitehub.me</w:t>
+      </w:r>
+      <w:r>
+        <w:rPr>
+          <w:rFonts w:ascii="Times New Roman" w:hAnsi="Times New Roman" w:eastAsia="Times New Roman"/>
+          <w:b w:val="0"/>
+          <w:i w:val="0"/>
+          <w:sz w:val="26"/>
+        </w:rPr>
+        <w:t xml:space="preserve"> về hộp thư vận hành, bổ trợ cho luồng gửi email giao dịch qua AWS SES.</w:t>
+      </w:r>
+    </w:p>
+    <w:p>
+      <w:pPr>
+        <w:pStyle w:val="Heading3"/>
+      </w:pPr>
+      <w:r>
+        <w:rPr>
+          <w:rFonts w:ascii="Times New Roman" w:hAnsi="Times New Roman" w:eastAsia="Times New Roman"/>
+          <w:b/>
+          <w:color w:val="000000"/>
+          <w:sz w:val="28"/>
+        </w:rPr>
+        <w:t>4.1.7 Trạng thái triển khai</w:t>
+      </w:r>
+    </w:p>
+    <w:p>
+      <w:pPr>
+        <w:spacing w:line="288" w:lineRule="auto"/>
+        <w:ind w:firstLine="567"/>
+        <w:jc w:val="both"/>
+      </w:pPr>
+      <w:r>
+        <w:rPr>
+          <w:rFonts w:ascii="Times New Roman" w:hAnsi="Times New Roman" w:eastAsia="Times New Roman"/>
+          <w:b w:val="0"/>
+          <w:i w:val="0"/>
+          <w:sz w:val="26"/>
+        </w:rPr>
+        <w:t xml:space="preserve">Tính đến thời điểm thực hiện đồ án: 71 resources terraform đã apply (CloudTrail captured); hai EC2 instance + RDS PostgreSQL multi-tenant schema RLS đã chạy; Cloudflare DNS đã cutover (kitehub.me trỏ về ALB) cùng bản ghi wildcard </w:t>
+      </w:r>
+      <w:r>
+        <w:rPr>
+          <w:rFonts w:ascii="Times New Roman" w:hAnsi="Times New Roman" w:eastAsia="Times New Roman"/>
+          <w:b w:val="0"/>
+          <w:i/>
+          <w:sz w:val="26"/>
+        </w:rPr>
+        <w:t>*.kitehub.me</w:t>
+      </w:r>
+      <w:r>
+        <w:rPr>
+          <w:rFonts w:ascii="Times New Roman" w:hAnsi="Times New Roman" w:eastAsia="Times New Roman"/>
+          <w:b w:val="0"/>
+          <w:i w:val="0"/>
+          <w:sz w:val="26"/>
+        </w:rPr>
+        <w:t xml:space="preserve"> cho định tuyến landing đa tenant; cơ chế phân giải Tenant → Domain → Landing (mục 2.2.6) hoạt động trên lớp gateway, được minh chứng qua trang chủ công khai của tenant mẫu Sky Education với giao diện thương hiệu riêng (mục 4.2); AWS SES production mode đã được approve; CI/CD pipeline OIDC + ECR + SSM hoạt động đầy đủ; beta tenant invite mechanism đã sẵn sàng nhận yêu cầu.</w:t>
       </w:r>
     </w:p>
     <w:p>
@@ -29320,7 +30682,7 @@
       </w:r>
     </w:p>
     <w:sectPr>
-      <w:headerReference w:type="default" r:id="rId41"/>
+      <w:headerReference w:type="default" r:id="rId40"/>
       <w:pgSz w:w="11906" w:h="16838"/>
       <w:pgMar w:top="1417" w:right="1134" w:bottom="1417" w:left="1701" w:header="720" w:footer="720" w:gutter="283"/>
       <w:cols w:space="720"/>

</xml_diff>

<commit_message>
fix(thesis): cover — underline 'KHOA CÔNG NGHỆ THÔNG TIN' text (match BAO_CAO sample)
Bìa mẫu BAO_CAO_THUC_TAP.pdf dùng gạch chân chữ (text-underline, rộng bằng dòng chữ, canh giữa), KHÔNG phải đường kẻ ngang full content-width. Reverts 2026-05-20 full-width-line direction sau khi đối chiếu sample thật. Re-baked docx + action-2 item 5 sync.
</commit_message>
<xml_diff>
--- a/documents/08-thesis/thesis-v1.docx
+++ b/documents/08-thesis/thesis-v1.docx
@@ -19,7 +19,7 @@
     </w:p>
     <w:p>
       <w:pPr>
-        <w:spacing w:before="0" w:after="0"/>
+        <w:spacing w:before="0" w:after="120"/>
         <w:jc w:val="center"/>
       </w:pPr>
       <w:r>
@@ -28,18 +28,10 @@
           <w:b/>
           <w:i w:val="0"/>
           <w:sz w:val="28"/>
+          <w:u w:val="single"/>
         </w:rPr>
         <w:t>KHOA CÔNG NGHỆ THÔNG TIN</w:t>
       </w:r>
-    </w:p>
-    <w:p>
-      <w:pPr>
-        <w:spacing w:before="0" w:after="0"/>
-        <w:jc w:val="center"/>
-        <w:pBdr>
-          <w:bottom w:val="single" w:sz="8" w:space="1" w:color="000000"/>
-        </w:pBdr>
-      </w:pPr>
     </w:p>
     <w:p>
       <w:pPr>

</xml_diff>

<commit_message>
fix(thesis): cover rule — short centered line (≈text width) match BAO_CAO
Đường kẻ dưới KHOA CÔNG NGHỆ THÔNG TIN là separate rule NGẮN canh giữa (indent 4.5cm 2 bên + space_before gap), không phải underline cũng không full-width. Bìa mẫu BAO_CAO_THUC_TAP.pdf đối chiếu trực quan.
</commit_message>
<xml_diff>
--- a/documents/08-thesis/thesis-v1.docx
+++ b/documents/08-thesis/thesis-v1.docx
@@ -19,7 +19,7 @@
     </w:p>
     <w:p>
       <w:pPr>
-        <w:spacing w:before="0" w:after="120"/>
+        <w:spacing w:before="0" w:after="0"/>
         <w:jc w:val="center"/>
       </w:pPr>
       <w:r>
@@ -28,10 +28,19 @@
           <w:b/>
           <w:i w:val="0"/>
           <w:sz w:val="28"/>
-          <w:u w:val="single"/>
         </w:rPr>
         <w:t>KHOA CÔNG NGHỆ THÔNG TIN</w:t>
       </w:r>
+    </w:p>
+    <w:p>
+      <w:pPr>
+        <w:spacing w:before="80" w:after="0"/>
+        <w:ind w:left="2551" w:right="2551"/>
+        <w:jc w:val="center"/>
+        <w:pBdr>
+          <w:bottom w:val="single" w:sz="8" w:space="1" w:color="000000"/>
+        </w:pBdr>
+      </w:pPr>
     </w:p>
     <w:p>
       <w:pPr>

</xml_diff>

<commit_message>
fix(thesis): bìa phụ — short centered rule + logo-space exact 99.2pt align bìa chính
Bìa phụ: (1) đường kẻ KHOA CÔNG NGHỆ THÔNG TIN ngắn canh giữa khớp bìa chính; (2) thay empty-run spacer (co lại do paragraph mark về font mặc định) bằng EXACT line spacing 99.2pt = đúng chiều cao logo vuông Cm(3.5) → ĐỒ ÁN TỐT NGHIỆP + dòng dưới ngang hàng bìa chính.
</commit_message>
<xml_diff>
--- a/documents/08-thesis/thesis-v1.docx
+++ b/documents/08-thesis/thesis-v1.docx
@@ -495,7 +495,8 @@
     </w:p>
     <w:p>
       <w:pPr>
-        <w:spacing w:before="0" w:after="0"/>
+        <w:spacing w:before="80" w:after="0"/>
+        <w:ind w:left="2551" w:right="2551"/>
         <w:jc w:val="center"/>
         <w:pBdr>
           <w:bottom w:val="single" w:sz="8" w:space="1" w:color="000000"/>
@@ -504,7 +505,7 @@
     </w:p>
     <w:p>
       <w:pPr>
-        <w:spacing w:before="720" w:after="720"/>
+        <w:spacing w:before="720" w:after="720" w:lineRule="exact" w:line="1984"/>
         <w:jc w:val="center"/>
       </w:pPr>
       <w:r>
@@ -512,8 +513,9 @@
           <w:rFonts w:ascii="Times New Roman" w:hAnsi="Times New Roman" w:eastAsia="Times New Roman"/>
           <w:b w:val="0"/>
           <w:i w:val="0"/>
-          <w:sz w:val="198"/>
-        </w:rPr>
+          <w:sz w:val="24"/>
+        </w:rPr>
+        <w:t xml:space="preserve"> </w:t>
       </w:r>
     </w:p>
     <w:p>

</xml_diff>

<commit_message>
fix(thesis): đẩy 'Hà Nội – 2026' xuống sát cuối trang bìa (spacer 90pt)
add_bottom_spacer EXACT 90pt thay 2 đoạn rỗng → Hà Nội ~88% trang cả bìa chính + bìa phụ. 90pt = max an toàn (120pt làm 1 bìa tràn sang trang mới); chừa lề nhỏ tránh overflow khi mở bằng Word (render cao hơn LibreOffice).
</commit_message>
<xml_diff>
--- a/documents/08-thesis/thesis-v1.docx
+++ b/documents/08-thesis/thesis-v1.docx
@@ -436,13 +436,17 @@
     </w:tbl>
     <w:p>
       <w:pPr>
-        <w:spacing w:before="0" w:after="0"/>
-      </w:pPr>
-    </w:p>
-    <w:p>
-      <w:pPr>
-        <w:spacing w:before="0" w:after="0"/>
-      </w:pPr>
+        <w:spacing w:before="0" w:after="0" w:lineRule="exact" w:line="1800"/>
+      </w:pPr>
+      <w:r>
+        <w:rPr>
+          <w:rFonts w:ascii="Times New Roman" w:hAnsi="Times New Roman" w:eastAsia="Times New Roman"/>
+          <w:b w:val="0"/>
+          <w:i w:val="0"/>
+          <w:sz w:val="24"/>
+        </w:rPr>
+        <w:t xml:space="preserve"> </w:t>
+      </w:r>
     </w:p>
     <w:p>
       <w:pPr>
@@ -872,13 +876,17 @@
     </w:tbl>
     <w:p>
       <w:pPr>
-        <w:spacing w:before="0" w:after="0"/>
-      </w:pPr>
-    </w:p>
-    <w:p>
-      <w:pPr>
-        <w:spacing w:before="0" w:after="0"/>
-      </w:pPr>
+        <w:spacing w:before="0" w:after="0" w:lineRule="exact" w:line="1800"/>
+      </w:pPr>
+      <w:r>
+        <w:rPr>
+          <w:rFonts w:ascii="Times New Roman" w:hAnsi="Times New Roman" w:eastAsia="Times New Roman"/>
+          <w:b w:val="0"/>
+          <w:i w:val="0"/>
+          <w:sz w:val="24"/>
+        </w:rPr>
+        <w:t xml:space="preserve"> </w:t>
+      </w:r>
     </w:p>
     <w:p>
       <w:pPr>

</xml_diff>

<commit_message>
fix(thesis): thu hẹp khoảng cách đường kẻ với chữ KHOA CÔNG NGHỆ THÔNG TIN
Dòng rỗng chứa bottom-border mặc định cao ~13pt đẩy đường kẻ xa chữ; set EXACT line spacing 2pt → đường kẻ sát ngay dưới chữ (gap ~17pt → ~6pt), khớp khoảng cách bìa BAO_CAO. Áp cả bìa chính + bìa phụ.
</commit_message>
<xml_diff>
--- a/documents/08-thesis/thesis-v1.docx
+++ b/documents/08-thesis/thesis-v1.docx
@@ -34,7 +34,7 @@
     </w:p>
     <w:p>
       <w:pPr>
-        <w:spacing w:before="80" w:after="0"/>
+        <w:spacing w:before="80" w:after="0" w:lineRule="exact" w:line="40"/>
         <w:ind w:left="2551" w:right="2551"/>
         <w:jc w:val="center"/>
         <w:pBdr>
@@ -499,7 +499,7 @@
     </w:p>
     <w:p>
       <w:pPr>
-        <w:spacing w:before="80" w:after="0"/>
+        <w:spacing w:before="80" w:after="0" w:lineRule="exact" w:line="40"/>
         <w:ind w:left="2551" w:right="2551"/>
         <w:jc w:val="center"/>
         <w:pBdr>

</xml_diff>

<commit_message>
docs(thesis): lời cảm ơn — thêm 2 GV beta + bỏ tên SV + Hà Nội lên 1 dòng
Phần 4: cảm ơn cô Nguyễn Thị Hà (Tin học, TH Hòa Chính) + thầy Nguyễn Đình Nhì (Hóa học, THCS Phú Nam An) đã dùng thực tế sản phẩm + góp ý. Bỏ dòng tên 'Nguyễn Văn Kiệt' (ký tay khi in) + bỏ blank gap trước khối chữ ký → vừa trọn trang 3 (86 pages).
</commit_message>
<xml_diff>
--- a/documents/08-thesis/thesis-v1.docx
+++ b/documents/08-thesis/thesis-v1.docx
@@ -995,13 +995,27 @@
           <w:i w:val="0"/>
           <w:sz w:val="26"/>
         </w:rPr>
+        <w:t>Em xin gửi lời cảm ơn chân thành đến cô Nguyễn Thị Hà — giáo viên môn Tin học tại Trường Tiểu học Hòa Chính, và thầy Nguyễn Đình Nhì — giáo viên môn Hóa học tại Trường THCS Phú Nam An, đã trực tiếp sử dụng thử sản phẩm của đồ án trong thực tế giảng dạy và đóng góp nhiều ý kiến quý báu giúp em hoàn thiện hệ thống.</w:t>
+      </w:r>
+    </w:p>
+    <w:p>
+      <w:pPr>
+        <w:spacing w:line="288" w:lineRule="auto"/>
+        <w:ind w:firstLine="567"/>
+        <w:jc w:val="both"/>
+      </w:pPr>
+      <w:r>
+        <w:rPr>
+          <w:rFonts w:ascii="Times New Roman" w:hAnsi="Times New Roman" w:eastAsia="Times New Roman"/>
+          <w:b w:val="0"/>
+          <w:i w:val="0"/>
+          <w:sz w:val="26"/>
+        </w:rPr>
         <w:t>Cuối cùng, em xin gửi lời cảm ơn sâu sắc tới gia đình, bạn bè và những người thân đã luôn quan tâm, động viên và hỗ trợ em cả về tinh thần lẫn vật chất trong suốt thời gian học tập và thực hiện đồ án. Mặc dù đã rất cố gắng, song do thời gian và kinh nghiệm thực tiễn còn hạn chế, đồ án không tránh khỏi những thiếu sót; em rất mong nhận được sự đóng góp ý kiến từ quý thầy cô để đồ án được hoàn thiện hơn. Em xin chân thành cảm ơn!</w:t>
       </w:r>
     </w:p>
-    <w:p/>
     <w:p>
       <w:pPr>
-        <w:keepNext/>
         <w:spacing w:after="0"/>
         <w:jc w:val="right"/>
       </w:pPr>
@@ -1017,7 +1031,6 @@
     </w:p>
     <w:p>
       <w:pPr>
-        <w:keepNext/>
         <w:spacing w:after="0"/>
         <w:jc w:val="right"/>
       </w:pPr>
@@ -1029,22 +1042,6 @@
           <w:sz w:val="26"/>
         </w:rPr>
         <w:t>Sinh viên thực hiện</w:t>
-      </w:r>
-    </w:p>
-    <w:p/>
-    <w:p>
-      <w:pPr>
-        <w:keepNext w:val="0"/>
-        <w:jc w:val="right"/>
-      </w:pPr>
-      <w:r>
-        <w:rPr>
-          <w:rFonts w:ascii="Times New Roman" w:hAnsi="Times New Roman" w:eastAsia="Times New Roman"/>
-          <w:b/>
-          <w:i w:val="0"/>
-          <w:sz w:val="26"/>
-        </w:rPr>
-        <w:t>Nguyễn Văn Kiệt</w:t>
       </w:r>
     </w:p>
     <w:p>

</xml_diff>

<commit_message>
docs(thesis): Mở đầu scrub jargon + thống nhất methodology + đồng bộ cohort 2 GV
Nhóm 1 (jargon): bỏ 'theo ADR-025', 'sau mỗi wave'→'sau mỗi giai đoạn phát triển', 'trong cùng pull request'→diễn đạt academic.
Nhóm 2 (methodology): 'audit-driven development'→'Quality-Driven Development' nhất quán §2+§4.
Cohort: đồng bộ beta cohort = 2 giáo viên độc lập (1 free, 1 premium) ở Mở đầu §3 + Kết luận + ch.1-vn-law + ch.1-ai (cost calc 250→100 img, .75→.10). Giữ 30-50 trung tâm (giai đoạn thanh toán) + 100 tenant (load test).
</commit_message>
<xml_diff>
--- a/documents/08-thesis/thesis-v1.docx
+++ b/documents/08-thesis/thesis-v1.docx
@@ -2641,7 +2641,7 @@
           <w:i w:val="0"/>
           <w:sz w:val="26"/>
         </w:rPr>
-        <w:t>Áp dụng phương pháp luận audit-driven development để duy trì chất lượng code + docs trong quá trình phát triển dài hạn.</w:t>
+        <w:t>Áp dụng phương pháp luận Quality-Driven Development để duy trì chất lượng mã nguồn và tài liệu trong suốt quá trình phát triển dài hạn.</w:t>
       </w:r>
     </w:p>
     <w:p>
@@ -2671,7 +2671,7 @@
           <w:i w:val="0"/>
           <w:sz w:val="26"/>
         </w:rPr>
-        <w:t>Đồ án tập trung vào giai đoạn thử nghiệm tenant của nền tảng KiteHub, được giới hạn theo ba chiều: không gian, thời gian và đối tượng. Về không gian, hệ thống triển khai cloud trên AWS Singapore (ap-southeast-1) Free Tier theo ADR-025, phục vụ nhóm trung tâm giáo dục thương mại tại Việt Nam (Hà Nội, TP. Hồ Chí Minh và các tỉnh lân cận). Về thời gian, phạm vi triển khai kéo dài từ tháng 5/2026 đến hết giai đoạn thử nghiệm tenant (~tháng 9/2026), với cohort 7-10 trung tâm dùng miễn phí trong 9 tuần đầu để thu thập phản hồi.</w:t>
+        <w:t>Đồ án tập trung vào giai đoạn thử nghiệm tenant của nền tảng KiteHub, được giới hạn theo ba chiều: không gian, thời gian và đối tượng. Về không gian, hệ thống triển khai cloud trên AWS Singapore (ap-southeast-1) Free Tier, phục vụ nhóm trung tâm giáo dục thương mại tại Việt Nam (Hà Nội, TP. Hồ Chí Minh và các tỉnh lân cận). Về thời gian, phạm vi triển khai kéo dài từ tháng 5/2026 đến hết giai đoạn thử nghiệm tenant (~tháng 9/2026), với hai giáo viên độc lập (một dùng gói miễn phí, một dùng gói premium) trực tiếp sử dụng sản phẩm trong thực tế giảng dạy để thu thập phản hồi.</w:t>
       </w:r>
     </w:p>
     <w:p>
@@ -2765,7 +2765,7 @@
           <w:i w:val="0"/>
           <w:sz w:val="26"/>
         </w:rPr>
-        <w:t>Áp dụng phương pháp luận Quality-Driven Development bốn trụ cột (TDD per Beck 2002, DDD per Evans 2003, PDCA per Deming 1986, Lean per Poppendieck 2003) — mỗi miss được chuyển thành rule + cơ chế enforcement trong cùng pull request.</w:t>
+        <w:t>Áp dụng phương pháp luận Quality-Driven Development bốn trụ cột (TDD per Beck 2002, DDD per Evans 2003, PDCA per Deming 1986, Lean per Poppendieck 2003) — mỗi vấn đề phát hiện được chuyển hóa thành quy tắc kiểm soát kèm cơ chế kiểm tra tự động, tích hợp ngay trong quy trình phát triển.</w:t>
       </w:r>
     </w:p>
     <w:p>
@@ -2781,7 +2781,7 @@
           <w:i w:val="0"/>
           <w:sz w:val="26"/>
         </w:rPr>
-        <w:t>Đánh giá chất lượng hệ thống qua bộ audit bảy chiều (Quality, UI, Security, Performance, API Contract, Business Logic, Ops Readiness) chấm điểm /100 hoặc /128 định kỳ sau mỗi wave.</w:t>
+        <w:t>Đánh giá chất lượng hệ thống qua bộ audit bảy chiều (Quality, UI, Security, Performance, API Contract, Business Logic, Ops Readiness) chấm điểm /100 hoặc /128 định kỳ sau mỗi giai đoạn phát triển.</w:t>
       </w:r>
     </w:p>
     <w:p>
@@ -6155,7 +6155,7 @@
           <w:i w:val="0"/>
           <w:sz w:val="26"/>
         </w:rPr>
-        <w:t>Đề tài chia thành các giai đoạn triển khai để cân bằng giữa độ phức tạp kỹ thuật, ngưỡng tuân thủ pháp lý và quy mô thị trường mục tiêu. Giai đoạn thử nghiệm tenant gồm vận hành thử với khoảng 5-10 tenant pilot tại các trung tâm thí điểm, tập trung kiểm chứng onboarding wizard, AI Branding, kiến trúc multi-tenant và compliance baseline; phạm vi triển khai trong giai đoạn này không thu phí và chấp nhận chính sách giảm thiểu chi phí hạ tầng. Giai đoạn thanh toán thử nghiệm mở rộng tenant cohort lên 30-50 trung tâm với chính sách thu phí giới thiệu thấp hơn giá niêm yết, mục đích chính là validation pricing model, onboarding flow chính thức và hệ thống thanh toán chuyển khoản kèm đối soát tự động; giai đoạn này tích hợp eInvoice qua partnership với nhà cung cấp được Tổng cục Thuế cấp phép. Giai đoạn vận hành chính thức mở cho mọi trung tâm tự đăng ký không qua quy trình mời, đi kèm SLA cam kết uptime ≥99,5% và bổ sung các kênh hỗ trợ (live chat, Zalo OA support), ứng dụng di động native cho học viên và phụ huynh, đa cổng thanh toán tích hợp. Giai đoạn K-12 expansion mở rộng sang phân khúc trường công lập và tư thục cấp 1-2 với yêu cầu bổ nhiệm DPO chính thức, DPIA cho dữ liệu trẻ em theo Luật Bảo vệ Dữ liệu Cá nhân Điều 17 và Điều 26, hợp tác với Bộ Giáo dục và Đào tạo cùng các sở/phòng giáo dục địa phương cho phân phối.</w:t>
+        <w:t>Đề tài chia thành các giai đoạn triển khai để cân bằng giữa độ phức tạp kỹ thuật, ngưỡng tuân thủ pháp lý và quy mô thị trường mục tiêu. Giai đoạn thử nghiệm tenant gồm vận hành thử với hai giáo viên độc lập (một dùng gói miễn phí, một dùng gói premium), tập trung kiểm chứng onboarding wizard, AI Branding, kiến trúc multi-tenant và compliance baseline; phạm vi triển khai trong giai đoạn này không thu phí và chấp nhận chính sách giảm thiểu chi phí hạ tầng. Giai đoạn thanh toán thử nghiệm mở rộng tenant cohort lên 30-50 trung tâm với chính sách thu phí giới thiệu thấp hơn giá niêm yết, mục đích chính là validation pricing model, onboarding flow chính thức và hệ thống thanh toán chuyển khoản kèm đối soát tự động; giai đoạn này tích hợp eInvoice qua partnership với nhà cung cấp được Tổng cục Thuế cấp phép. Giai đoạn vận hành chính thức mở cho mọi trung tâm tự đăng ký không qua quy trình mời, đi kèm SLA cam kết uptime ≥99,5% và bổ sung các kênh hỗ trợ (live chat, Zalo OA support), ứng dụng di động native cho học viên và phụ huynh, đa cổng thanh toán tích hợp. Giai đoạn K-12 expansion mở rộng sang phân khúc trường công lập và tư thục cấp 1-2 với yêu cầu bổ nhiệm DPO chính thức, DPIA cho dữ liệu trẻ em theo Luật Bảo vệ Dữ liệu Cá nhân Điều 17 và Điều 26, hợp tác với Bộ Giáo dục và Đào tạo cùng các sở/phòng giáo dục địa phương cho phân phối.</w:t>
       </w:r>
     </w:p>
     <w:p>
@@ -28782,7 +28782,7 @@
           <w:i w:val="0"/>
           <w:sz w:val="26"/>
         </w:rPr>
-        <w:t>Một số KPI thực tế (Time to First Value, Daily Active Users, Monthly Recurring Revenue) chưa có số liệu thực tế do beta cohort 7-10 tenant đang trong giai đoạn triển khai 9 tuần.</w:t>
+        <w:t>Một số KPI thực tế (Time to First Value, Daily Active Users, Monthly Recurring Revenue) chưa có số liệu đầy đủ do giai đoạn thử nghiệm mới có hai giáo viên độc lập (một gói miễn phí, một gói premium) trực tiếp sử dụng để thu thập phản hồi.</w:t>
       </w:r>
     </w:p>
     <w:p>

</xml_diff>

<commit_message>
docs(thesis): Chương 1 tách Khảo sát (§1.1) và Bài toán (§1.2) thành 2 mục riêng
§1.1 Hiện trạng = khảo sát (lead-in + 1.1.1 bối cảnh + 1.1.2-1.1.6 năm đối thủ + 1.1.7 khảo sát người dùng + 1.1.8 bảng so sánh). §1.2 Bài toán = 1.2.1 khoảng trống+định vị + 1.2.2 cơ hội/rủi ro + 1.2.3 phạm vi/lộ trình. Bỏ 8 đoạn overview đầu §1.1 trùng Mở đầu (84 pages, -2).
</commit_message>
<xml_diff>
--- a/documents/08-thesis/thesis-v1.docx
+++ b/documents/08-thesis/thesis-v1.docx
@@ -2971,25 +2971,21 @@
           <w:i w:val="0"/>
           <w:sz w:val="26"/>
         </w:rPr>
-        <w:t xml:space="preserve">Đề tài tốt nghiệp được trình bày trong tài liệu này có tên đầy đủ là </w:t>
-      </w:r>
-      <w:r>
-        <w:rPr>
-          <w:rFonts w:ascii="Times New Roman" w:hAnsi="Times New Roman" w:eastAsia="Times New Roman"/>
-          <w:b w:val="0"/>
-          <w:i/>
-          <w:sz w:val="26"/>
-        </w:rPr>
-        <w:t>Xây dựng hệ thống SaaS cung cấp dịch vụ đào tạo</w:t>
-      </w:r>
-      <w:r>
-        <w:rPr>
-          <w:rFonts w:ascii="Times New Roman" w:hAnsi="Times New Roman" w:eastAsia="Times New Roman"/>
-          <w:b w:val="0"/>
-          <w:i w:val="0"/>
-          <w:sz w:val="26"/>
-        </w:rPr>
-        <w:t>, gọi tắt là nền tảng KiteHub. Đề tài hướng đến xây dựng một nền tảng phần mềm dạng dịch vụ (Software-as-a-Service) phục vụ các trung tâm giáo dục tư nhân quy mô nhỏ và vừa tại Việt Nam, với hai mục tiêu cốt lõi: (i) cung cấp một sản phẩm sẵn sàng vận hành cho các trung tâm trong giai đoạn thử nghiệm nội bộ, và (ii) chứng minh khả năng áp dụng đồng thời ba khối kỹ thuật then chốt của ngành Công nghệ phần mềm hiện đại — kiến trúc multi-tenant cô lập dữ liệu ở mức database, tích hợp dịch vụ AI sinh tài nguyên tự động, và tuân thủ pháp luật Việt Nam tích hợp từ thiết kế ban đầu.</w:t>
+        <w:t>Phần này khảo sát hiện trạng thị trường phần mềm quản lý trung tâm giáo dục tại Việt Nam, bao gồm bối cảnh và quy mô thị trường, các sản phẩm tương tự đang vận hành, nhu cầu thực tế từ các nhóm người dùng cuối, và bảng so sánh tổng hợp — làm cơ sở xác định khoảng trống mà đề tài hướng đến.</w:t>
+      </w:r>
+    </w:p>
+    <w:p>
+      <w:pPr>
+        <w:pStyle w:val="Heading3"/>
+      </w:pPr>
+      <w:r>
+        <w:rPr>
+          <w:rFonts w:ascii="Times New Roman" w:hAnsi="Times New Roman" w:eastAsia="Times New Roman"/>
+          <w:b/>
+          <w:color w:val="000000"/>
+          <w:sz w:val="28"/>
+        </w:rPr>
+        <w:t>1.1.1 Bối cảnh thị trường giáo dục SaaS Việt Nam</w:t>
       </w:r>
     </w:p>
     <w:p>
@@ -3005,7 +3001,7 @@
           <w:i w:val="0"/>
           <w:sz w:val="26"/>
         </w:rPr>
-        <w:t>Đối tượng nghiên cứu của đề tài là một nền tảng SaaS đa-tenant phục vụ các trung tâm giáo dục tư nhân tại Việt Nam, trong đó mỗi tenant tương ứng với một trung tâm (hoặc một chuỗi chi nhánh thuộc cùng pháp nhân). Nền tảng định vị phục vụ ba nhóm tenant chính trong giai đoạn đầu: giáo viên độc lập (Solo Teacher, 1-50 học viên), chủ trung tâm (Center Owner, 1-10 chi nhánh, 100-2000 học viên) và quản lý trung tâm (Center Manager). Nhóm phụ huynh và học viên được hỗ trợ qua các giao diện riêng nhưng chưa nằm trong phạm vi triển khai chính của giai đoạn thử nghiệm.</w:t>
+        <w:t>Thị trường phần mềm quản lý trung tâm giáo dục Việt Nam tăng trưởng mạnh giai đoạn 2020-2025, được thúc đẩy bởi ba yếu tố chính. Thứ nhất, ngành dạy thêm (trung tâm ngoại ngữ, tin học, năng khiếu) bùng nổ sau Thông tư 29/2024/TT-BGDĐT chính thức hóa hoạt động dạy thêm có thu phí [1], ước tính hơn 50.000 trung tâm hoạt động trên toàn quốc theo báo cáo công khai của Magenest 2024 [2] (truy cập ngày 20/05/2026). Thứ hai, phụ huynh Việt Nam có thói quen đầu tư mạnh cho giáo dục con cái, với mức chi trung bình 15-20% thu nhập hộ gia đình cho học thêm con theo công bố trên website của 6Wresearch [3] (truy cập ngày 20/05/2026) — chỉ số này phù hợp với báo cáo Kinh tế Số Việt Nam 2024 của VECITA về tăng trưởng chi tiêu EdTech trong cấu phần kinh tế số [4] (truy cập ngày 20/05/2026). Thứ ba, sau đại dịch COVID-19, các trung tâm buộc phải số hóa quy trình quản lý (điểm danh, học phí, lịch học, kênh liên lạc với phụ huynh) để duy trì hoạt động khi liên tục chuyển đổi giữa chế độ trực tuyến và trực tiếp.</w:t>
       </w:r>
     </w:p>
     <w:p>
@@ -3021,101 +3017,7 @@
           <w:i w:val="0"/>
           <w:sz w:val="26"/>
         </w:rPr>
-        <w:t>Phạm vi nghiên cứu của đề tài tập trung vào giai đoạn thử nghiệm tenant readiness — bao gồm bốn nhóm chức năng cốt lõi: (i) onboarding wizard tự phục vụ cho phép một trung tâm mới đăng ký và đưa vào vận hành trong 1-2 ngày thay vì 1-2 tuần; (ii) tính năng AI Branding tự sinh logo, hero image và social banner từ thông tin tenant; (iii) tenant lifecycle management bao gồm trial, kích hoạt, gia hạn và terminate; (iv) tuân thủ Luật Bảo vệ Dữ liệu Cá nhân (PDPL 2023), Luật An ninh mạng 2018 và quy định hóa đơn điện tử theo Thông tư 78/2021/TT-BTC. Các nhóm chức năng nâng cao như thanh toán tích hợp đa cổng, hóa đơn điện tử end-to-end, ứng dụng di động native, và mở rộng sang phân khúc K-12 trường công lập được đề cập trong lộ trình nhưng không nằm trong phạm vi triển khai của đề tài.</w:t>
-      </w:r>
-    </w:p>
-    <w:p>
-      <w:pPr>
-        <w:spacing w:line="288" w:lineRule="auto"/>
-        <w:ind w:firstLine="567"/>
-        <w:jc w:val="both"/>
-      </w:pPr>
-      <w:r>
-        <w:rPr>
-          <w:rFonts w:ascii="Times New Roman" w:hAnsi="Times New Roman" w:eastAsia="Times New Roman"/>
-          <w:b w:val="0"/>
-          <w:i w:val="0"/>
-          <w:sz w:val="26"/>
-        </w:rPr>
-        <w:t>Bối cảnh chuyên ngành của đề tài thuộc lĩnh vực Công nghệ phần mềm với trọng tâm vào kiến trúc microservice cloud-native, multi-tenant SaaS, ứng dụng AI sinh nội dung trong sản phẩm thương mại, và tuân thủ pháp luật về dữ liệu cá nhân. Bốn yếu tố này hội tụ tạo nên một đề tài có giá trị thực tiễn — phục vụ trực tiếp khoảng 50.000 trung tâm giáo dục tư nhân Việt Nam — đồng thời mang tính học thuật khi đặt ra các quyết định kỹ thuật cần đánh đổi giữa chi phí hạ tầng, tốc độ phát triển, chất lượng đầu ra và yêu cầu pháp lý.</w:t>
-      </w:r>
-    </w:p>
-    <w:p>
-      <w:pPr>
-        <w:spacing w:line="288" w:lineRule="auto"/>
-        <w:ind w:firstLine="567"/>
-        <w:jc w:val="both"/>
-      </w:pPr>
-      <w:r>
-        <w:rPr>
-          <w:rFonts w:ascii="Times New Roman" w:hAnsi="Times New Roman" w:eastAsia="Times New Roman"/>
-          <w:b w:val="0"/>
-          <w:i w:val="0"/>
-          <w:sz w:val="26"/>
-        </w:rPr>
-        <w:t>Lý do chọn đề tài xuất phát từ ba quan sát thực tế thị trường. Thứ nhất, phân khúc trung tâm giáo dục tư nhân Việt Nam đang tăng trưởng mạnh sau Thông tư 29/2024/TT-BGDĐT [1] công nhận hợp pháp hoạt động dạy thêm có thu phí, nhưng phần lớn vẫn dùng Excel kết hợp Zalo nhóm để quản lý vì các phần mềm hiện có hoặc quá phức tạp, hoặc chi phí cao, hoặc thiếu UX tiếng Việt thân thiện. Thứ hai, Luật Bảo vệ Dữ liệu Cá nhân năm 2023 [9] sẽ có hiệu lực từ tháng 7 năm 2026, đặt ra deadline pháp lý cứng cho các đơn vị xử lý dữ liệu cá nhân — đây là cơ hội đưa ra sản phẩm có compliance tích hợp từ thiết kế thay vì retrofit về sau. Thứ ba, các tiến bộ về mô hình AI sinh ảnh giai đoạn 2023-2025 (Stable Diffusion XL, DALL-E 3) lần đầu cho phép tự động hóa các tác vụ branding với chi phí hợp lý, mở ra cơ hội tích hợp AI vào sản phẩm phần mềm thương mại tier thấp.</w:t>
-      </w:r>
-    </w:p>
-    <w:p>
-      <w:pPr>
-        <w:spacing w:line="288" w:lineRule="auto"/>
-        <w:ind w:firstLine="567"/>
-        <w:jc w:val="both"/>
-      </w:pPr>
-      <w:r>
-        <w:rPr>
-          <w:rFonts w:ascii="Times New Roman" w:hAnsi="Times New Roman" w:eastAsia="Times New Roman"/>
-          <w:b w:val="0"/>
-          <w:i w:val="0"/>
-          <w:sz w:val="26"/>
-        </w:rPr>
-        <w:t>Mục tiêu cụ thể của đề tài bao gồm bốn nhóm. Mục tiêu chức năng yêu cầu xây dựng một nền tảng SaaS đa-tenant hoàn chỉnh với onboarding wizard, AI Branding, quản lý lifecycle tenant và compliance built-in. Mục tiêu phi chức năng yêu cầu đáp ứng các tiêu chí về hiệu năng (p95 ≤ 500 ms cho API trung bình), bảo mật (Row-Level Security tại tầng database, OWASP Top 10 baseline), khả năng mở rộng (multi-tenant cô lập schema-level, hỗ trợ tối thiểu 100 tenant trên 1 instance) và quan sát được (logs tập trung, metrics dashboard, alert real-time). Mục tiêu pháp lý yêu cầu nền tảng tuân thủ ba văn bản pháp luật then chốt PDPL 2023, Luật An ninh mạng 2018, và Thông tư 78/2021/TT-BTC. Mục tiêu phương pháp luận yêu cầu áp dụng các nguyên tắc Quality-Driven Development phù hợp với quy mô đề tài và deadline pháp lý cứng PDPL 2023.</w:t>
-      </w:r>
-    </w:p>
-    <w:p>
-      <w:pPr>
-        <w:spacing w:line="288" w:lineRule="auto"/>
-        <w:ind w:firstLine="567"/>
-        <w:jc w:val="both"/>
-      </w:pPr>
-      <w:r>
-        <w:rPr>
-          <w:rFonts w:ascii="Times New Roman" w:hAnsi="Times New Roman" w:eastAsia="Times New Roman"/>
-          <w:b w:val="0"/>
-          <w:i w:val="0"/>
-          <w:sz w:val="26"/>
-        </w:rPr>
-        <w:t>Phương pháp triển khai đề tài kết hợp ba cách tiếp cận. Tiếp cận theo iteration ngắn được áp dụng cho phát triển chức năng, mỗi iteration kéo dài 1-3 ngày bao gồm các bước design, implementation, testing, review và merge. Tiếp cận test-first được áp dụng cho mọi tính năng mới — unit test và integration test viết trước hoặc song song với implementation. Tiếp cận quality-driven meta-governance được áp dụng cho process: mọi sai lệch phát hiện đều chuyển hóa thành rule có enforcement tự động, mọi audit finding đều được track qua gap file kèm acceptance criteria — chi tiết các trụ cột này được trình bày trong Chương 1 mục 1.6.</w:t>
-      </w:r>
-    </w:p>
-    <w:p>
-      <w:pPr>
-        <w:spacing w:line="288" w:lineRule="auto"/>
-        <w:ind w:firstLine="567"/>
-        <w:jc w:val="both"/>
-      </w:pPr>
-      <w:r>
-        <w:rPr>
-          <w:rFonts w:ascii="Times New Roman" w:hAnsi="Times New Roman" w:eastAsia="Times New Roman"/>
-          <w:b w:val="0"/>
-          <w:i w:val="0"/>
-          <w:sz w:val="26"/>
-        </w:rPr>
-        <w:t>Các tham khảo chính của đề tài bao gồm: các văn bản pháp luật Việt Nam (PDPL 2023 [9], Luật An ninh mạng 2018 [10], Nghị định 13/2023/NĐ-CP [18], Nghị định 53/2022/NĐ-CP [11], Thông tư 78/2021/TT-BTC [20], Thông tư 29/2024/TT-BGDĐT [1]); các báo cáo thị trường edu Việt Nam (Magenest 2024 [2], 6Wresearch [3], VECITA Kinh tế Số 2024 [4]); các nghiên cứu nền tảng về AI sinh ảnh (Stable Diffusion XL [13], GPT-3 few-shot [12], LLaVA visual instruction [14]); các phương pháp luận phần mềm cổ điển (Deming PDCA [21], Beck TDD [16], Poppendieck Lean [22], IEEE 730-2014 SQA [23], OWASP Top 10 [19]); và tài liệu kỹ thuật của các sản phẩm tham khảo (MISA AMIS [5], Mona eLMS [6], Easy Edu [7], DotB [8]).</w:t>
-      </w:r>
-    </w:p>
-    <w:p>
-      <w:pPr>
-        <w:pStyle w:val="Heading2"/>
-      </w:pPr>
-      <w:r>
-        <w:rPr>
-          <w:rFonts w:ascii="Times New Roman" w:hAnsi="Times New Roman" w:eastAsia="Times New Roman"/>
-          <w:b/>
-          <w:color w:val="000000"/>
-          <w:sz w:val="32"/>
-        </w:rPr>
-        <w:t>1.2 Bài toán</w:t>
+        <w:t>Tuy nhiên, đa số trung tâm nhỏ và vừa (1-3 chi nhánh, dưới 500 học viên) vẫn dùng Excel kết hợp Zalo nhóm, thậm chí sổ ghi tay để quản lý. Lý do chính: phần mềm hiện có hoặc quá phức tạp (Cyber School, MISA EMIS hướng đến trường công lập K-12), hoặc thiếu UX tiếng Việt (LMS quốc tế như Moodle, Canvas), hoặc chi phí cao không phù hợp với phân khúc trung tâm tự phát (Speed Manager, EduCom với mức 50-100 USD/tháng/cơ sở).</w:t>
       </w:r>
     </w:p>
     <w:p>
@@ -3129,87 +3031,7 @@
           <w:color w:val="000000"/>
           <w:sz w:val="28"/>
         </w:rPr>
-        <w:t>1.2.1 Bối cảnh thị trường giáo dục SaaS Việt Nam</w:t>
-      </w:r>
-    </w:p>
-    <w:p>
-      <w:pPr>
-        <w:spacing w:line="288" w:lineRule="auto"/>
-        <w:ind w:firstLine="567"/>
-        <w:jc w:val="both"/>
-      </w:pPr>
-      <w:r>
-        <w:rPr>
-          <w:rFonts w:ascii="Times New Roman" w:hAnsi="Times New Roman" w:eastAsia="Times New Roman"/>
-          <w:b w:val="0"/>
-          <w:i w:val="0"/>
-          <w:sz w:val="26"/>
-        </w:rPr>
-        <w:t>Thị trường phần mềm quản lý trung tâm giáo dục Việt Nam tăng trưởng mạnh giai đoạn 2020-2025, được thúc đẩy bởi ba yếu tố chính. Thứ nhất, ngành dạy thêm (trung tâm ngoại ngữ, tin học, năng khiếu) bùng nổ sau Thông tư 29/2024/TT-BGDĐT chính thức hóa hoạt động dạy thêm có thu phí [1], ước tính hơn 50.000 trung tâm hoạt động trên toàn quốc theo báo cáo công khai của Magenest 2024 [2] (truy cập ngày 20/05/2026). Thứ hai, phụ huynh Việt Nam có thói quen đầu tư mạnh cho giáo dục con cái, với mức chi trung bình 15-20% thu nhập hộ gia đình cho học thêm con theo công bố trên website của 6Wresearch [3] (truy cập ngày 20/05/2026) — chỉ số này phù hợp với báo cáo Kinh tế Số Việt Nam 2024 của VECITA về tăng trưởng chi tiêu EdTech trong cấu phần kinh tế số [4] (truy cập ngày 20/05/2026). Thứ ba, sau đại dịch COVID-19, các trung tâm buộc phải số hóa quy trình quản lý (điểm danh, học phí, lịch học, kênh liên lạc với phụ huynh) để duy trì hoạt động khi liên tục chuyển đổi giữa chế độ trực tuyến và trực tiếp.</w:t>
-      </w:r>
-    </w:p>
-    <w:p>
-      <w:pPr>
-        <w:spacing w:line="288" w:lineRule="auto"/>
-        <w:ind w:firstLine="567"/>
-        <w:jc w:val="both"/>
-      </w:pPr>
-      <w:r>
-        <w:rPr>
-          <w:rFonts w:ascii="Times New Roman" w:hAnsi="Times New Roman" w:eastAsia="Times New Roman"/>
-          <w:b w:val="0"/>
-          <w:i w:val="0"/>
-          <w:sz w:val="26"/>
-        </w:rPr>
-        <w:t>Tuy nhiên, đa số trung tâm nhỏ và vừa (1-3 chi nhánh, dưới 500 học viên) vẫn dùng Excel kết hợp Zalo nhóm, thậm chí sổ ghi tay để quản lý. Lý do chính: phần mềm hiện có hoặc quá phức tạp (Cyber School, MISA EMIS hướng đến trường công lập K-12), hoặc thiếu UX tiếng Việt (LMS quốc tế như Moodle, Canvas), hoặc chi phí cao không phù hợp với phân khúc trung tâm tự phát (Speed Manager, EduCom với mức 50-100 USD/tháng/cơ sở).</w:t>
-      </w:r>
-    </w:p>
-    <w:p>
-      <w:pPr>
-        <w:spacing w:line="288" w:lineRule="auto"/>
-        <w:ind w:firstLine="567"/>
-        <w:jc w:val="both"/>
-      </w:pPr>
-      <w:r>
-        <w:rPr>
-          <w:rFonts w:ascii="Times New Roman" w:hAnsi="Times New Roman" w:eastAsia="Times New Roman"/>
-          <w:b w:val="0"/>
-          <w:i w:val="0"/>
-          <w:sz w:val="26"/>
-        </w:rPr>
-        <w:t xml:space="preserve">Khoảng trống thị trường mà đề tài hướng đến là </w:t>
-      </w:r>
-      <w:r>
-        <w:rPr>
-          <w:rFonts w:ascii="Times New Roman" w:hAnsi="Times New Roman" w:eastAsia="Times New Roman"/>
-          <w:b w:val="0"/>
-          <w:i/>
-          <w:sz w:val="26"/>
-        </w:rPr>
-        <w:t>trung tâm nhỏ và vừa (1-10 chi nhánh, 100-2000 học viên/cơ sở)</w:t>
-      </w:r>
-      <w:r>
-        <w:rPr>
-          <w:rFonts w:ascii="Times New Roman" w:hAnsi="Times New Roman" w:eastAsia="Times New Roman"/>
-          <w:b w:val="0"/>
-          <w:i w:val="0"/>
-          <w:sz w:val="26"/>
-        </w:rPr>
-        <w:t xml:space="preserve"> với mức giá 500.000-1.500.000đ/tháng, giao diện tiếng Việt, kiến trúc multi-tenant gốc cho phép mở rộng nhanh khi thành lập chi nhánh mới, và khả năng tự sinh tài nguyên branding bằng AI thay vì phải thuê thiết kế viên.</w:t>
-      </w:r>
-    </w:p>
-    <w:p>
-      <w:pPr>
-        <w:pStyle w:val="Heading3"/>
-      </w:pPr>
-      <w:r>
-        <w:rPr>
-          <w:rFonts w:ascii="Times New Roman" w:hAnsi="Times New Roman" w:eastAsia="Times New Roman"/>
-          <w:b/>
-          <w:color w:val="000000"/>
-          <w:sz w:val="28"/>
-        </w:rPr>
-        <w:t>1.2.2 BeeClass — phần mềm quản lý trung tâm tiếng Anh phổ biến</w:t>
+        <w:t>1.1.2 BeeClass — phần mềm quản lý trung tâm tiếng Anh phổ biến</w:t>
       </w:r>
     </w:p>
     <w:p>
@@ -3342,7 +3164,7 @@
           <w:color w:val="000000"/>
           <w:sz w:val="28"/>
         </w:rPr>
-        <w:t>1.2.3 MISA AMIS Trường Học — sản phẩm B2B trường công lập</w:t>
+        <w:t>1.1.3 MISA AMIS Trường Học — sản phẩm B2B trường công lập</w:t>
       </w:r>
     </w:p>
     <w:p>
@@ -3475,7 +3297,7 @@
           <w:color w:val="000000"/>
           <w:sz w:val="28"/>
         </w:rPr>
-        <w:t>1.2.4 Mona eLMS — chuyên ngoại ngữ và tin học</w:t>
+        <w:t>1.1.4 Mona eLMS — chuyên ngoại ngữ và tin học</w:t>
       </w:r>
     </w:p>
     <w:p>
@@ -3608,7 +3430,7 @@
           <w:color w:val="000000"/>
           <w:sz w:val="28"/>
         </w:rPr>
-        <w:t>1.2.5 Easy Edu — phân khúc trung tâm ngoại ngữ vừa và nhỏ</w:t>
+        <w:t>1.1.5 Easy Edu — phân khúc trung tâm ngoại ngữ vừa và nhỏ</w:t>
       </w:r>
     </w:p>
     <w:p>
@@ -3741,7 +3563,7 @@
           <w:color w:val="000000"/>
           <w:sz w:val="28"/>
         </w:rPr>
-        <w:t>1.2.6 DotB — phân khúc tầm trung và trường tư thục</w:t>
+        <w:t>1.1.6 DotB — phân khúc tầm trung và trường tư thục</w:t>
       </w:r>
     </w:p>
     <w:p>
@@ -3874,7 +3696,7 @@
           <w:color w:val="000000"/>
           <w:sz w:val="28"/>
         </w:rPr>
-        <w:t>1.2.7 Khảo sát nhu cầu sử dụng từ phía người dùng cuối</w:t>
+        <w:t>1.1.7 Khảo sát nhu cầu sử dụng từ phía người dùng cuối</w:t>
       </w:r>
     </w:p>
     <w:p>
@@ -4045,7 +3867,7 @@
           <w:color w:val="000000"/>
           <w:sz w:val="28"/>
         </w:rPr>
-        <w:t>1.2.8 Bảng so sánh tổng hợp</w:t>
+        <w:t>1.1.8 Bảng so sánh tổng hợp</w:t>
       </w:r>
     </w:p>
     <w:p>
@@ -5900,6 +5722,20 @@
     <w:p/>
     <w:p>
       <w:pPr>
+        <w:pStyle w:val="Heading2"/>
+      </w:pPr>
+      <w:r>
+        <w:rPr>
+          <w:rFonts w:ascii="Times New Roman" w:hAnsi="Times New Roman" w:eastAsia="Times New Roman"/>
+          <w:b/>
+          <w:color w:val="000000"/>
+          <w:sz w:val="32"/>
+        </w:rPr>
+        <w:t>1.2 Bài toán</w:t>
+      </w:r>
+    </w:p>
+    <w:p>
+      <w:pPr>
         <w:pStyle w:val="Heading3"/>
       </w:pPr>
       <w:r>
@@ -5909,7 +5745,7 @@
           <w:color w:val="000000"/>
           <w:sz w:val="28"/>
         </w:rPr>
-        <w:t>1.2.9 Định vị hệ thống đề xuất và yếu tố khác biệt</w:t>
+        <w:t>1.2.1 Khoảng trống thị trường và định vị hệ thống đề xuất</w:t>
       </w:r>
     </w:p>
     <w:p>
@@ -5925,7 +5761,25 @@
           <w:i w:val="0"/>
           <w:sz w:val="26"/>
         </w:rPr>
-        <w:t>Dựa trên phân tích năm hệ thống tham khảo, hệ thống đề xuất trong đề tài có bốn yếu tố khác biệt chính.</w:t>
+        <w:t xml:space="preserve">Khoảng trống thị trường mà đề tài hướng đến là </w:t>
+      </w:r>
+      <w:r>
+        <w:rPr>
+          <w:rFonts w:ascii="Times New Roman" w:hAnsi="Times New Roman" w:eastAsia="Times New Roman"/>
+          <w:b w:val="0"/>
+          <w:i/>
+          <w:sz w:val="26"/>
+        </w:rPr>
+        <w:t>trung tâm nhỏ và vừa (1-10 chi nhánh, 100-2000 học viên/cơ sở)</w:t>
+      </w:r>
+      <w:r>
+        <w:rPr>
+          <w:rFonts w:ascii="Times New Roman" w:hAnsi="Times New Roman" w:eastAsia="Times New Roman"/>
+          <w:b w:val="0"/>
+          <w:i w:val="0"/>
+          <w:sz w:val="26"/>
+        </w:rPr>
+        <w:t xml:space="preserve"> với mức giá 500.000-1.500.000đ/tháng, giao diện tiếng Việt, kiến trúc multi-tenant gốc cho phép mở rộng nhanh khi thành lập chi nhánh mới, và khả năng tự sinh tài nguyên branding bằng AI thay vì phải thuê thiết kế viên.</w:t>
       </w:r>
     </w:p>
     <w:p>
@@ -5938,19 +5792,10 @@
         <w:rPr>
           <w:rFonts w:ascii="Times New Roman" w:hAnsi="Times New Roman" w:eastAsia="Times New Roman"/>
           <w:b w:val="0"/>
-          <w:i/>
-          <w:sz w:val="26"/>
-        </w:rPr>
-        <w:t>Thứ nhất, kiến trúc multi-tenant gốc:</w:t>
-      </w:r>
-      <w:r>
-        <w:rPr>
-          <w:rFonts w:ascii="Times New Roman" w:hAnsi="Times New Roman" w:eastAsia="Times New Roman"/>
-          <w:b w:val="0"/>
-          <w:i w:val="0"/>
-          <w:sz w:val="26"/>
-        </w:rPr>
-        <w:t xml:space="preserve"> cả năm hệ thống tham khảo đều dùng triển khai single-tenant với mỗi khách hàng tương ứng một instance cơ sở dữ liệu riêng. Khi trung tâm mở rộng lên năm chi nhánh trở lên, chủ trung tâm phải cấp phát thêm instance, đồng bộ dữ liệu thủ công và sao chép cấu hình. Hệ thống đề xuất sử dụng kiến trúc multi-tenant gốc với cô lập ở mức cơ sở dữ liệu (schema-per-tenant), cho phép một trung tâm có 100 chi nhánh trên cùng một instance, tiết kiệm khoảng 80% chi phí hạ tầng khi mở rộng.</w:t>
+          <w:i w:val="0"/>
+          <w:sz w:val="26"/>
+        </w:rPr>
+        <w:t>Dựa trên phân tích năm hệ thống tham khảo, hệ thống đề xuất trong đề tài có bốn yếu tố khác biệt chính.</w:t>
       </w:r>
     </w:p>
     <w:p>
@@ -5966,16 +5811,16 @@
           <w:i/>
           <w:sz w:val="26"/>
         </w:rPr>
-        <w:t>Thứ hai, AI Branding tự động:</w:t>
-      </w:r>
-      <w:r>
-        <w:rPr>
-          <w:rFonts w:ascii="Times New Roman" w:hAnsi="Times New Roman" w:eastAsia="Times New Roman"/>
-          <w:b w:val="0"/>
-          <w:i w:val="0"/>
-          <w:sz w:val="26"/>
-        </w:rPr>
-        <w:t xml:space="preserve"> chủ trung tâm mới khai trương thường tốn 2-5 triệu đồng thuê thiết kế viên cho logo, banner và hero image marketing. AI Branding của hệ thống đề xuất tự động sinh các tài nguyên này từ prompt văn bản và màu thương hiệu, giảm thời gian sẵn sàng vận hành từ 1-2 tuần xuống còn vài giờ. Cả năm hệ thống tham khảo đều không có tính năng này.</w:t>
+        <w:t>Thứ nhất, kiến trúc multi-tenant gốc:</w:t>
+      </w:r>
+      <w:r>
+        <w:rPr>
+          <w:rFonts w:ascii="Times New Roman" w:hAnsi="Times New Roman" w:eastAsia="Times New Roman"/>
+          <w:b w:val="0"/>
+          <w:i w:val="0"/>
+          <w:sz w:val="26"/>
+        </w:rPr>
+        <w:t xml:space="preserve"> cả năm hệ thống tham khảo đều dùng triển khai single-tenant với mỗi khách hàng tương ứng một instance cơ sở dữ liệu riêng. Khi trung tâm mở rộng lên năm chi nhánh trở lên, chủ trung tâm phải cấp phát thêm instance, đồng bộ dữ liệu thủ công và sao chép cấu hình. Hệ thống đề xuất sử dụng kiến trúc multi-tenant gốc với cô lập ở mức cơ sở dữ liệu (schema-per-tenant), cho phép một trung tâm có 100 chi nhánh trên cùng một instance, tiết kiệm khoảng 80% chi phí hạ tầng khi mở rộng.</w:t>
       </w:r>
     </w:p>
     <w:p>
@@ -5991,16 +5836,16 @@
           <w:i/>
           <w:sz w:val="26"/>
         </w:rPr>
-        <w:t>Thứ ba, tuân thủ pháp luật Việt Nam built-in:</w:t>
-      </w:r>
-      <w:r>
-        <w:rPr>
-          <w:rFonts w:ascii="Times New Roman" w:hAnsi="Times New Roman" w:eastAsia="Times New Roman"/>
-          <w:b w:val="0"/>
-          <w:i w:val="0"/>
-          <w:sz w:val="26"/>
-        </w:rPr>
-        <w:t xml:space="preserve"> Luật Bảo vệ Dữ liệu Cá nhân năm 2023 (PDPL, thời hạn áp dụng 2026-07-01) [9], Luật An ninh mạng 2018 [10] và Nghị định 53/2022/NĐ-CP về bản địa hóa dữ liệu [11] là ba yêu cầu tuân thủ quan trọng cho mọi SaaS xử lý dữ liệu cá nhân tại Việt Nam. Hệ thống đề xuất tích hợp tuân thủ ngay từ thiết kế ban đầu thay vì bổ sung sau. Trong khi đó, Mona eLMS, Easy Edu và BeeClass đang trong quá trình triển khai PDPL; DotB và MISA AMIS có sẵn nhưng mức giá cao.</w:t>
+        <w:t>Thứ hai, AI Branding tự động:</w:t>
+      </w:r>
+      <w:r>
+        <w:rPr>
+          <w:rFonts w:ascii="Times New Roman" w:hAnsi="Times New Roman" w:eastAsia="Times New Roman"/>
+          <w:b w:val="0"/>
+          <w:i w:val="0"/>
+          <w:sz w:val="26"/>
+        </w:rPr>
+        <w:t xml:space="preserve"> chủ trung tâm mới khai trương thường tốn 2-5 triệu đồng thuê thiết kế viên cho logo, banner và hero image marketing. AI Branding của hệ thống đề xuất tự động sinh các tài nguyên này từ prompt văn bản và màu thương hiệu, giảm thời gian sẵn sàng vận hành từ 1-2 tuần xuống còn vài giờ. Cả năm hệ thống tham khảo đều không có tính năng này.</w:t>
       </w:r>
     </w:p>
     <w:p>
@@ -6016,6 +5861,31 @@
           <w:i/>
           <w:sz w:val="26"/>
         </w:rPr>
+        <w:t>Thứ ba, tuân thủ pháp luật Việt Nam built-in:</w:t>
+      </w:r>
+      <w:r>
+        <w:rPr>
+          <w:rFonts w:ascii="Times New Roman" w:hAnsi="Times New Roman" w:eastAsia="Times New Roman"/>
+          <w:b w:val="0"/>
+          <w:i w:val="0"/>
+          <w:sz w:val="26"/>
+        </w:rPr>
+        <w:t xml:space="preserve"> Luật Bảo vệ Dữ liệu Cá nhân năm 2023 (PDPL, thời hạn áp dụng 2026-07-01) [9], Luật An ninh mạng 2018 [10] và Nghị định 53/2022/NĐ-CP về bản địa hóa dữ liệu [11] là ba yêu cầu tuân thủ quan trọng cho mọi SaaS xử lý dữ liệu cá nhân tại Việt Nam. Hệ thống đề xuất tích hợp tuân thủ ngay từ thiết kế ban đầu thay vì bổ sung sau. Trong khi đó, Mona eLMS, Easy Edu và BeeClass đang trong quá trình triển khai PDPL; DotB và MISA AMIS có sẵn nhưng mức giá cao.</w:t>
+      </w:r>
+    </w:p>
+    <w:p>
+      <w:pPr>
+        <w:spacing w:line="288" w:lineRule="auto"/>
+        <w:ind w:firstLine="567"/>
+        <w:jc w:val="both"/>
+      </w:pPr>
+      <w:r>
+        <w:rPr>
+          <w:rFonts w:ascii="Times New Roman" w:hAnsi="Times New Roman" w:eastAsia="Times New Roman"/>
+          <w:b w:val="0"/>
+          <w:i/>
+          <w:sz w:val="26"/>
+        </w:rPr>
         <w:t>Thứ tư, UX Vietnamese-first:</w:t>
       </w:r>
       <w:r>
@@ -6075,7 +5945,7 @@
           <w:color w:val="000000"/>
           <w:sz w:val="28"/>
         </w:rPr>
-        <w:t>1.2.10 Cơ hội và rủi ro chiến lược</w:t>
+        <w:t>1.2.2 Cơ hội và rủi ro chiến lược</w:t>
       </w:r>
     </w:p>
     <w:p>
@@ -6139,7 +6009,7 @@
           <w:color w:val="000000"/>
           <w:sz w:val="28"/>
         </w:rPr>
-        <w:t>1.2.11 Phạm vi đề tài và lộ trình triển khai</w:t>
+        <w:t>1.2.3 Phạm vi đề tài và lộ trình triển khai</w:t>
       </w:r>
     </w:p>
     <w:p>

</xml_diff>

<commit_message>
docs(thesis): thân chương dùng giọng khách quan (bỏ 'em'/'tác giả' narrative)
Ch.2: 'em chọn mô hình' → 'khóa luận lựa chọn mô hình'; 'do tác giả tự thiết kế' → 'được xây dựng riêng'. Giọng thân chương thống nhất khách quan ('khóa luận'/bị động); Lời cảm ơn + Kết luận giữ 'em'. Nguồn hình 'Nguồn: tác giả tự xây dựng' giữ (convention S8).
</commit_message>
<xml_diff>
--- a/documents/08-thesis/thesis-v1.docx
+++ b/documents/08-thesis/thesis-v1.docx
@@ -9019,7 +9019,7 @@
           <w:i w:val="0"/>
           <w:sz w:val="26"/>
         </w:rPr>
-        <w:t>Quyết định kiến trúc bị neo bởi ràng buộc kinh tế: em chọn mô hình single-bucket multi-tenant với RLS (Pattern 4) thay vì per-tenant DB (Pattern 1) — chênh lệch chi phí khoảng 20× và chi phí vận hành tăng tuyến tính theo số tenant, không phù hợp với phân khúc trung tâm SMB ở giai đoạn thử nghiệm (chi tiết §2.2.3).</w:t>
+        <w:t>Quyết định kiến trúc bị neo bởi ràng buộc kinh tế: khóa luận lựa chọn mô hình single-bucket multi-tenant với RLS (Pattern 4) thay vì per-tenant DB (Pattern 1) — chênh lệch chi phí khoảng 20× và chi phí vận hành tăng tuyến tính theo số tenant, không phù hợp với phân khúc trung tâm SMB ở giai đoạn thử nghiệm (chi tiết §2.2.3).</w:t>
       </w:r>
     </w:p>
     <w:p>
@@ -12254,7 +12254,7 @@
           <w:i w:val="0"/>
           <w:sz w:val="26"/>
         </w:rPr>
-        <w:t>do tác giả tự thiết kế</w:t>
+        <w:t>được xây dựng riêng</w:t>
       </w:r>
       <w:r>
         <w:rPr>

</xml_diff>

<commit_message>
docs(thesis): 'chủ trung tâm' → 'chủ sở hữu trung tâm' (formal, giữ nghĩa Owner)
Thay 25 chỗ toàn thesis: thuật ngữ trang trọng hơn cho persona Owner, tránh lẫn với persona Manager ('Quản lý trung tâm'). Giữ tên persona Quản lý/Giáo viên độc lập nguyên.
</commit_message>
<xml_diff>
--- a/documents/08-thesis/thesis-v1.docx
+++ b/documents/08-thesis/thesis-v1.docx
@@ -2687,7 +2687,7 @@
           <w:i w:val="0"/>
           <w:sz w:val="26"/>
         </w:rPr>
-        <w:t>Về đối tượng, đồ án phục vụ ba persona chính: Solo Teacher (giáo viên độc lập, 1-50 học viên), Center Owner (chủ trung tâm, 1-10 chi nhánh, 100-2.000 học viên), và Center Manager (quản lý vận hành trung tâm). Persona K-12 Parent + Student được hoãn sang giai đoạn mở rộng K-12 do yêu cầu bổ sung DPO + DPIA theo Điều 26 Luật Bảo vệ Dữ liệu Cá nhân 2023. Kiến trúc hệ thống cấu thành từ ba lớp dịch vụ. Lớp nền tảng KiteHub gồm sáu dịch vụ độc lập đảm nhận các trách nhiệm khác nhau: quản trị (kitehub-admin), nhận diện thương hiệu (kitehub-branding), thư điện tử (kitehub-email), điều phối yêu cầu (kitehub-gateway), thư viện dùng chung (kitehub-platform) và quản lý đăng ký (kitehub-subscription). Lớp nghiệp vụ tenant KiteClass tập trung tại dịch vụ kiteclass-core. Lớp giao diện gồm hai ứng dụng Next.js phục vụ tập người dùng khác nhau.</w:t>
+        <w:t>Về đối tượng, đồ án phục vụ ba persona chính: Solo Teacher (giáo viên độc lập, 1-50 học viên), Center Owner (chủ sở hữu trung tâm, 1-10 chi nhánh, 100-2.000 học viên), và Center Manager (quản lý vận hành trung tâm). Persona K-12 Parent + Student được hoãn sang giai đoạn mở rộng K-12 do yêu cầu bổ sung DPO + DPIA theo Điều 26 Luật Bảo vệ Dữ liệu Cá nhân 2023. Kiến trúc hệ thống cấu thành từ ba lớp dịch vụ. Lớp nền tảng KiteHub gồm sáu dịch vụ độc lập đảm nhận các trách nhiệm khác nhau: quản trị (kitehub-admin), nhận diện thương hiệu (kitehub-branding), thư điện tử (kitehub-email), điều phối yêu cầu (kitehub-gateway), thư viện dùng chung (kitehub-platform) và quản lý đăng ký (kitehub-subscription). Lớp nghiệp vụ tenant KiteClass tập trung tại dịch vụ kiteclass-core. Lớp giao diện gồm hai ứng dụng Next.js phục vụ tập người dùng khác nhau.</w:t>
       </w:r>
     </w:p>
     <w:p>
@@ -3056,7 +3056,7 @@
           <w:i w:val="0"/>
           <w:sz w:val="26"/>
         </w:rPr>
-        <w:t xml:space="preserve"> [25] là sản phẩm phần mềm quản lý trung tâm ngoại ngữ phổ biến tại thị trường Việt Nam, được vận hành bởi nhóm phát triển trong nước, định vị phục vụ các trung tâm tiếng Anh quy mô vừa. Sản phẩm cung cấp các module quản lý học viên, lớp học, điểm danh, học phí, gửi thông báo cho phụ huynh qua Zalo và email, kèm dashboard tổng quan doanh thu cho chủ trung tâm. Theo thông tin công bố trên website chính thức [25] (truy cập ngày 20/05/2026), BeeClass có hàng trăm trung tâm khách hàng tại nhiều tỉnh thành.</w:t>
+        <w:t xml:space="preserve"> [25] là sản phẩm phần mềm quản lý trung tâm ngoại ngữ phổ biến tại thị trường Việt Nam, được vận hành bởi nhóm phát triển trong nước, định vị phục vụ các trung tâm tiếng Anh quy mô vừa. Sản phẩm cung cấp các module quản lý học viên, lớp học, điểm danh, học phí, gửi thông báo cho phụ huynh qua Zalo và email, kèm dashboard tổng quan doanh thu cho chủ sở hữu trung tâm. Theo thông tin công bố trên website chính thức [25] (truy cập ngày 20/05/2026), BeeClass có hàng trăm trung tâm khách hàng tại nhiều tỉnh thành.</w:t>
       </w:r>
     </w:p>
     <w:p>
@@ -3595,16 +3595,16 @@
           <w:i/>
           <w:sz w:val="26"/>
         </w:rPr>
-        <w:t>Chủ trung tâm (Owner):</w:t>
-      </w:r>
-      <w:r>
-        <w:rPr>
-          <w:rFonts w:ascii="Times New Roman" w:hAnsi="Times New Roman" w:eastAsia="Times New Roman"/>
-          <w:b w:val="0"/>
-          <w:i w:val="0"/>
-          <w:sz w:val="26"/>
-        </w:rPr>
-        <w:t xml:space="preserve"> theo các báo cáo Magenest 2024 [2] và 6Wresearch 2024 [3] (cả hai truy cập ngày 20/05/2026), chủ trung tâm vừa và nhỏ (1-10 chi nhánh, 100-2000 học viên) ưu tiên ba nhu cầu chính: (i) quản lý học phí và đối chiếu thanh toán tự động (khoảng 80% trung tâm vẫn dùng chuyển khoản ngân hàng kèm đối soát thủ công, chiếm 4-6 giờ/tuần làm việc văn phòng — theo báo cáo VECITA 2024 [4] truy cập ngày 20/05/2026); (ii) báo cáo doanh thu, tỷ lệ giữ chân học viên, chi phí vận hành theo thời gian thực để ra quyết định mở hoặc đóng lớp; (iii) chi phí phần mềm thấp dưới 1,5 triệu đồng/tháng phù hợp biên lợi nhuận hiện hành 25-30%.</w:t>
+        <w:t>Chủ sở hữu trung tâm (Owner):</w:t>
+      </w:r>
+      <w:r>
+        <w:rPr>
+          <w:rFonts w:ascii="Times New Roman" w:hAnsi="Times New Roman" w:eastAsia="Times New Roman"/>
+          <w:b w:val="0"/>
+          <w:i w:val="0"/>
+          <w:sz w:val="26"/>
+        </w:rPr>
+        <w:t xml:space="preserve"> theo các báo cáo Magenest 2024 [2] và 6Wresearch 2024 [3] (cả hai truy cập ngày 20/05/2026), chủ sở hữu trung tâm vừa và nhỏ (1-10 chi nhánh, 100-2000 học viên) ưu tiên ba nhu cầu chính: (i) quản lý học phí và đối chiếu thanh toán tự động (khoảng 80% trung tâm vẫn dùng chuyển khoản ngân hàng kèm đối soát thủ công, chiếm 4-6 giờ/tuần làm việc văn phòng — theo báo cáo VECITA 2024 [4] truy cập ngày 20/05/2026); (ii) báo cáo doanh thu, tỷ lệ giữ chân học viên, chi phí vận hành theo thời gian thực để ra quyết định mở hoặc đóng lớp; (iii) chi phí phần mềm thấp dưới 1,5 triệu đồng/tháng phù hợp biên lợi nhuận hiện hành 25-30%.</w:t>
       </w:r>
     </w:p>
     <w:p>
@@ -5430,7 +5430,7 @@
           <w:i w:val="0"/>
           <w:sz w:val="26"/>
         </w:rPr>
-        <w:t xml:space="preserve"> cả năm hệ thống tham khảo đều dùng triển khai single-tenant với mỗi khách hàng tương ứng một instance cơ sở dữ liệu riêng. Khi trung tâm mở rộng lên năm chi nhánh trở lên, chủ trung tâm phải cấp phát thêm instance, đồng bộ dữ liệu thủ công và sao chép cấu hình. Hệ thống đề xuất sử dụng kiến trúc multi-tenant gốc với cô lập ở mức cơ sở dữ liệu (schema-per-tenant), cho phép một trung tâm có 100 chi nhánh trên cùng một instance, tiết kiệm khoảng 80% chi phí hạ tầng khi mở rộng.</w:t>
+        <w:t xml:space="preserve"> cả năm hệ thống tham khảo đều dùng triển khai single-tenant với mỗi khách hàng tương ứng một instance cơ sở dữ liệu riêng. Khi trung tâm mở rộng lên năm chi nhánh trở lên, chủ sở hữu trung tâm phải cấp phát thêm instance, đồng bộ dữ liệu thủ công và sao chép cấu hình. Hệ thống đề xuất sử dụng kiến trúc multi-tenant gốc với cô lập ở mức cơ sở dữ liệu (schema-per-tenant), cho phép một trung tâm có 100 chi nhánh trên cùng một instance, tiết kiệm khoảng 80% chi phí hạ tầng khi mở rộng.</w:t>
       </w:r>
     </w:p>
     <w:p>
@@ -5455,7 +5455,7 @@
           <w:i w:val="0"/>
           <w:sz w:val="26"/>
         </w:rPr>
-        <w:t xml:space="preserve"> chủ trung tâm mới khai trương thường tốn 2-5 triệu đồng thuê thiết kế viên cho logo, banner và hero image marketing. AI Branding của hệ thống đề xuất tự động sinh các tài nguyên này từ prompt văn bản và màu thương hiệu, giảm thời gian sẵn sàng vận hành từ 1-2 tuần xuống còn vài giờ. Cả năm hệ thống tham khảo đều không có tính năng này.</w:t>
+        <w:t xml:space="preserve"> chủ sở hữu trung tâm mới khai trương thường tốn 2-5 triệu đồng thuê thiết kế viên cho logo, banner và hero image marketing. AI Branding của hệ thống đề xuất tự động sinh các tài nguyên này từ prompt văn bản và màu thương hiệu, giảm thời gian sẵn sàng vận hành từ 1-2 tuần xuống còn vài giờ. Cả năm hệ thống tham khảo đều không có tính năng này.</w:t>
       </w:r>
     </w:p>
     <w:p>
@@ -5815,7 +5815,7 @@
           <w:i w:val="0"/>
           <w:sz w:val="26"/>
         </w:rPr>
-        <w:t>Chủ trung tâm nhấn magic-link thì đặt mật khẩu lần đầu thì đăng nhập dashboard thì bắt đầu kỳ dùng thử 14 ngày</w:t>
+        <w:t>Chủ sở hữu trung tâm nhấn magic-link thì đặt mật khẩu lần đầu thì đăng nhập dashboard thì bắt đầu kỳ dùng thử 14 ngày</w:t>
       </w:r>
     </w:p>
     <w:p>
@@ -5863,7 +5863,7 @@
           <w:i w:val="0"/>
           <w:sz w:val="26"/>
         </w:rPr>
-        <w:t xml:space="preserve">Chủ trung tâm chọn gói dịch vụ (FREE / STARTER / PRO / PRO_PLUS) — ví dụ STARTER khoảng </w:t>
+        <w:t xml:space="preserve">Chủ sở hữu trung tâm chọn gói dịch vụ (FREE / STARTER / PRO / PRO_PLUS) — ví dụ STARTER khoảng </w:t>
       </w:r>
       <w:r>
         <w:rPr>
@@ -6395,7 +6395,7 @@
           <w:i w:val="0"/>
           <w:sz w:val="26"/>
         </w:rPr>
-        <w:t xml:space="preserve"> Chủ trung tâm phát hành hóa đơn </w:t>
+        <w:t xml:space="preserve"> Chủ sở hữu trung tâm phát hành hóa đơn </w:t>
       </w:r>
       <w:r>
         <w:rPr>
@@ -9180,7 +9180,7 @@
           <w:i w:val="0"/>
           <w:sz w:val="26"/>
         </w:rPr>
-        <w:t>P2 Chủ trung tâm</w:t>
+        <w:t>P2 Chủ sở hữu trung tâm</w:t>
       </w:r>
       <w:r>
         <w:rPr>
@@ -10829,7 +10829,7 @@
               <a:graphicData uri="http://schemas.openxmlformats.org/drawingml/2006/picture">
                 <pic:pic>
                   <pic:nvPicPr>
-                    <pic:cNvPr id="0" name="mermaid-973d5e0c88ffff67.png"/>
+                    <pic:cNvPr id="0" name="mermaid-f5a7d770a853ce87.png"/>
                     <pic:cNvPicPr/>
                   </pic:nvPicPr>
                   <pic:blipFill>
@@ -16191,7 +16191,7 @@
           <w:i w:val="0"/>
           <w:sz w:val="26"/>
         </w:rPr>
-        <w:t>Luồng cấp phát tenant từ lúc người dùng tiềm năng gửi yêu cầu beta đến khi chủ trung tâm đăng nhập lần đầu trải qua nhiều bước phối hợp giữa frontend, backend và các dịch vụ ngoài. Hình 2.7 trình bày tuần tự các bước theo ký pháp UML.</w:t>
+        <w:t>Luồng cấp phát tenant từ lúc người dùng tiềm năng gửi yêu cầu beta đến khi chủ sở hữu trung tâm đăng nhập lần đầu trải qua nhiều bước phối hợp giữa frontend, backend và các dịch vụ ngoài. Hình 2.7 trình bày tuần tự các bước theo ký pháp UML.</w:t>
       </w:r>
     </w:p>
     <w:p>
@@ -16409,7 +16409,7 @@
           <w:i w:val="0"/>
           <w:sz w:val="26"/>
         </w:rPr>
-        <w:t xml:space="preserve"> dựng template mặc định trong khi chờ chủ trung tâm xác thực — giảm thời gian onboarding khi user click magic-link.</w:t>
+        <w:t xml:space="preserve"> dựng template mặc định trong khi chờ chủ sở hữu trung tâm xác thực — giảm thời gian onboarding khi user click magic-link.</w:t>
       </w:r>
     </w:p>
     <w:p>
@@ -22847,7 +22847,7 @@
           <w:i w:val="0"/>
           <w:sz w:val="26"/>
         </w:rPr>
-        <w:t>Chủ trung tâm nhấn magic-link, đặt mật khẩu và đăng nhập lần đầu sẽ thấy dashboard wizard 5 bước: xác nhận thông tin trung tâm, upload logo (hoặc sinh tự động), thêm 3 lớp đầu tiên, mời quản lý/giáo viên, thiết lập phương thức thanh toán.</w:t>
+        <w:t>Chủ sở hữu trung tâm nhấn magic-link, đặt mật khẩu và đăng nhập lần đầu sẽ thấy dashboard wizard 5 bước: xác nhận thông tin trung tâm, upload logo (hoặc sinh tự động), thêm 3 lớp đầu tiên, mời quản lý/giáo viên, thiết lập phương thức thanh toán.</w:t>
       </w:r>
     </w:p>
     <w:p>
@@ -23690,7 +23690,7 @@
           <w:i w:val="0"/>
           <w:sz w:val="26"/>
         </w:rPr>
-        <w:t xml:space="preserve"> Giai đoạn thử nghiệm dùng VietQR thủ công: chủ trung tâm chuyển khoản theo nội dung VietQR và upload ảnh xác nhận, quản trị nền tảng đối soát bằng tay. Cách tiếp cận này khớp thói quen thanh toán phổ biến (bank transfer chiếm ~70% giao dịch giáo dục) và tránh phụ thuộc giấy phép trung gian thanh toán trong giai đoạn xác thực sản phẩm.</w:t>
+        <w:t xml:space="preserve"> Giai đoạn thử nghiệm dùng VietQR thủ công: chủ sở hữu trung tâm chuyển khoản theo nội dung VietQR và upload ảnh xác nhận, quản trị nền tảng đối soát bằng tay. Cách tiếp cận này khớp thói quen thanh toán phổ biến (bank transfer chiếm ~70% giao dịch giáo dục) và tránh phụ thuộc giấy phép trung gian thanh toán trong giai đoạn xác thực sản phẩm.</w:t>
       </w:r>
     </w:p>
     <w:p>
@@ -24326,7 +24326,7 @@
           <w:i w:val="0"/>
           <w:sz w:val="26"/>
         </w:rPr>
-        <w:t>Phần này trình bày kết quả triển khai các giao diện cốt lõi của KiteHub Platform trong giai đoạn thử nghiệm theo ba luồng nghiệp vụ liên kết: hành trình khám phá và kích hoạt tenant của Chủ trung tâm, các thao tác vận hành thường nhật, và bộ công cụ điều hành của Admin nền tảng. Các giao diện được nhóm theo flow nghiệp vụ thay vì liệt kê rời rạc nhằm phản ánh đúng trải nghiệm end-to-end của người dùng.</w:t>
+        <w:t>Phần này trình bày kết quả triển khai các giao diện cốt lõi của KiteHub Platform trong giai đoạn thử nghiệm theo ba luồng nghiệp vụ liên kết: hành trình khám phá và kích hoạt tenant của Chủ sở hữu trung tâm, các thao tác vận hành thường nhật, và bộ công cụ điều hành của Admin nền tảng. Các giao diện được nhóm theo flow nghiệp vụ thay vì liệt kê rời rạc nhằm phản ánh đúng trải nghiệm end-to-end của người dùng.</w:t>
       </w:r>
     </w:p>
     <w:p>
@@ -24340,7 +24340,7 @@
           <w:color w:val="000000"/>
           <w:sz w:val="28"/>
         </w:rPr>
-        <w:t>3.2.1 Luồng khám phá và kích hoạt tenant (Anonymous → Chủ trung tâm)</w:t>
+        <w:t>3.2.1 Luồng khám phá và kích hoạt tenant (Anonymous → Chủ sở hữu trung tâm)</w:t>
       </w:r>
     </w:p>
     <w:p>
@@ -24569,7 +24569,7 @@
           <w:i w:val="0"/>
           <w:sz w:val="26"/>
         </w:rPr>
-        <w:t>) và mục câu hỏi thường gặp. Đây chính là kết quả hiển thị của cơ chế phân giải Tenant → Domain → Landing trình bày tại mục 2.2.6: cùng một mã nguồn giao diện render nội dung và theme khác nhau theo từng tenant. Bước thứ hai là trang đăng nhập, nơi Chủ trung tâm nhập thông tin tài khoản đã được cấp sau khi yêu cầu truy cập được quản trị viên nền tảng duyệt. Bước thứ ba là dashboard tổng quan sau đăng nhập, hiển thị dòng tóm tắt "Trung tâm hiện có 78 học viên · 5 khóa học" cùng sáu thẻ chỉ số (Học viên, Khóa học, Giáo viên, Điểm danh hôm nay, Doanh thu tuần, Tỷ lệ giữ chân). Trong giai đoạn thử nghiệm, hai thẻ Học viên và Khóa học đã hiển thị số liệu thực (78 và 5), bốn thẻ còn lại tạm hiển thị dấu gạch ngang kèm ghi chú minh bạch "chưa có API tổng hợp; sẽ bổ sung khi endpoint thống kê dashboard sẵn sàng" — phản ánh trung thực mức độ hoàn thiện của tính năng thống kê ở thời điểm thực hiện đồ án.</w:t>
+        <w:t>) và mục câu hỏi thường gặp. Đây chính là kết quả hiển thị của cơ chế phân giải Tenant → Domain → Landing trình bày tại mục 2.2.6: cùng một mã nguồn giao diện render nội dung và theme khác nhau theo từng tenant. Bước thứ hai là trang đăng nhập, nơi Chủ sở hữu trung tâm nhập thông tin tài khoản đã được cấp sau khi yêu cầu truy cập được quản trị viên nền tảng duyệt. Bước thứ ba là dashboard tổng quan sau đăng nhập, hiển thị dòng tóm tắt "Trung tâm hiện có 78 học viên · 5 khóa học" cùng sáu thẻ chỉ số (Học viên, Khóa học, Giáo viên, Điểm danh hôm nay, Doanh thu tuần, Tỷ lệ giữ chân). Trong giai đoạn thử nghiệm, hai thẻ Học viên và Khóa học đã hiển thị số liệu thực (78 và 5), bốn thẻ còn lại tạm hiển thị dấu gạch ngang kèm ghi chú minh bạch "chưa có API tổng hợp; sẽ bổ sung khi endpoint thống kê dashboard sẵn sàng" — phản ánh trung thực mức độ hoàn thiện của tính năng thống kê ở thời điểm thực hiện đồ án.</w:t>
       </w:r>
     </w:p>
     <w:p>
@@ -24645,7 +24645,7 @@
           <w:rFonts w:ascii="Times New Roman" w:hAnsi="Times New Roman" w:eastAsia="Times New Roman"/>
           <w:sz w:val="26"/>
         </w:rPr>
-        <w:t>. Giao diện tính năng AI Branding cho phép Chủ trung tâm tạo bộ nhận diện thương hiệu qua trình hướng dẫn nhiều bước</w:t>
+        <w:t>. Giao diện tính năng AI Branding cho phép Chủ sở hữu trung tâm tạo bộ nhận diện thương hiệu qua trình hướng dẫn nhiều bước</w:t>
       </w:r>
     </w:p>
     <w:p>
@@ -24785,7 +24785,7 @@
           <w:i w:val="0"/>
           <w:sz w:val="26"/>
         </w:rPr>
-        <w:t>Sau khi tenant được kích hoạt, Chủ trung tâm và Quản lý sử dụng nhóm chức năng vận hành để tổ chức học viên, lớp học và khóa học. Hình 3.3 minh chứng giao diện quản lý học viên với khẩu hiệu "Quản lý danh sách học viên của trung tâm". Bảng dữ liệu hiển thị các cột Tên học viên, Email, Số điện thoại, Trạng thái, Ngày nhập học và Thao tác; mỗi dòng tương ứng một học viên với dữ liệu mẫu mang phong cách Việt Nam (ví dụ Bùi Văn Dũng, Cao Văn Sơn, Châu Thị Bích) và trạng thái "Đang học". Giao diện cung cấp ô tìm kiếm theo tên hoặc email, khả năng sắp xếp theo từng cột, cùng ba thao tác trên mỗi dòng là xem chi tiết, chỉnh sửa và xóa. Hai nút chức năng ở góc phải cho phép nhập học viên hàng loạt và thêm học viên mới. Trong giai đoạn thử nghiệm, trung tâm mẫu đã có 78 học viên được quản lý qua giao diện này, khớp với chỉ số trên dashboard tổng quan tại Hình 3.1. Việc tổ chức lớp học được thiết kế theo cấu trúc phân cấp: lớp học thuộc về từng khóa học, do đó giao diện quản lý lớp yêu cầu chọn khóa học trước khi hiển thị danh sách lớp tương ứng, phản ánh đúng mô hình nghiệp vụ trung tâm dạy thêm tại Việt Nam.</w:t>
+        <w:t>Sau khi tenant được kích hoạt, Chủ sở hữu trung tâm và Quản lý sử dụng nhóm chức năng vận hành để tổ chức học viên, lớp học và khóa học. Hình 3.3 minh chứng giao diện quản lý học viên với khẩu hiệu "Quản lý danh sách học viên của trung tâm". Bảng dữ liệu hiển thị các cột Tên học viên, Email, Số điện thoại, Trạng thái, Ngày nhập học và Thao tác; mỗi dòng tương ứng một học viên với dữ liệu mẫu mang phong cách Việt Nam (ví dụ Bùi Văn Dũng, Cao Văn Sơn, Châu Thị Bích) và trạng thái "Đang học". Giao diện cung cấp ô tìm kiếm theo tên hoặc email, khả năng sắp xếp theo từng cột, cùng ba thao tác trên mỗi dòng là xem chi tiết, chỉnh sửa và xóa. Hai nút chức năng ở góc phải cho phép nhập học viên hàng loạt và thêm học viên mới. Trong giai đoạn thử nghiệm, trung tâm mẫu đã có 78 học viên được quản lý qua giao diện này, khớp với chỉ số trên dashboard tổng quan tại Hình 3.1. Việc tổ chức lớp học được thiết kế theo cấu trúc phân cấp: lớp học thuộc về từng khóa học, do đó giao diện quản lý lớp yêu cầu chọn khóa học trước khi hiển thị danh sách lớp tương ứng, phản ánh đúng mô hình nghiệp vụ trung tâm dạy thêm tại Việt Nam.</w:t>
       </w:r>
     </w:p>
     <w:p>
@@ -28085,7 +28085,7 @@
           <w:i w:val="0"/>
           <w:sz w:val="26"/>
         </w:rPr>
-        <w:t>Trích dẫn feedback xác nhận từ chủ trung tâm và quản lý trung tâm về độ phù hợp của hệ thống với quy trình vận hành hiện tại.</w:t>
+        <w:t>Trích dẫn feedback xác nhận từ chủ sở hữu trung tâm và quản lý trung tâm về độ phù hợp của hệ thống với quy trình vận hành hiện tại.</w:t>
       </w:r>
     </w:p>
     <w:p>

</xml_diff>

<commit_message>
docs(thesis): giải nghĩa K-12 ở lần đầu + thêm vào danh mục viết tắt
K-12 trước đây chưa định nghĩa. Mở đầu §3: 'phân khúc K-12 (Kindergarten to Grade 12 — bậc giáo dục phổ thông từ mẫu giáo đến lớp 12)'. Thêm entry K-12 vào DANH MỤC TỪ VIẾT TẮT.
</commit_message>
<xml_diff>
--- a/documents/08-thesis/thesis-v1.docx
+++ b/documents/08-thesis/thesis-v1.docx
@@ -2010,6 +2010,40 @@
                 <w:i w:val="0"/>
                 <w:sz w:val="24"/>
               </w:rPr>
+              <w:t>K-12</w:t>
+            </w:r>
+          </w:p>
+        </w:tc>
+        <w:tc>
+          <w:tcPr>
+            <w:tcW w:type="dxa" w:w="7087"/>
+          </w:tcPr>
+          <w:p>
+            <w:r>
+              <w:rPr>
+                <w:rFonts w:ascii="Times New Roman" w:hAnsi="Times New Roman" w:eastAsia="Times New Roman"/>
+                <w:b w:val="0"/>
+                <w:i w:val="0"/>
+                <w:sz w:val="24"/>
+              </w:rPr>
+              <w:t>Kindergarten to Grade 12 — bậc giáo dục phổ thông từ mẫu giáo đến lớp 12</w:t>
+            </w:r>
+          </w:p>
+        </w:tc>
+      </w:tr>
+      <w:tr>
+        <w:tc>
+          <w:tcPr>
+            <w:tcW w:type="dxa" w:w="1984"/>
+          </w:tcPr>
+          <w:p>
+            <w:r>
+              <w:rPr>
+                <w:rFonts w:ascii="Times New Roman" w:hAnsi="Times New Roman" w:eastAsia="Times New Roman"/>
+                <w:b/>
+                <w:i w:val="0"/>
+                <w:sz w:val="24"/>
+              </w:rPr>
               <w:t>KMS</w:t>
             </w:r>
           </w:p>
@@ -2687,7 +2721,7 @@
           <w:i w:val="0"/>
           <w:sz w:val="26"/>
         </w:rPr>
-        <w:t>Về đối tượng, đồ án phục vụ ba persona chính: Solo Teacher (giáo viên độc lập, 1-50 học viên), Center Owner (chủ sở hữu trung tâm, 1-10 chi nhánh, 100-2.000 học viên), và Center Manager (quản lý vận hành trung tâm). Persona K-12 Parent + Student được hoãn sang giai đoạn mở rộng K-12 do yêu cầu bổ sung DPO + DPIA theo Điều 26 Luật Bảo vệ Dữ liệu Cá nhân 2023. Kiến trúc hệ thống cấu thành từ ba lớp dịch vụ. Lớp nền tảng KiteHub gồm sáu dịch vụ độc lập đảm nhận các trách nhiệm khác nhau: quản trị (kitehub-admin), nhận diện thương hiệu (kitehub-branding), thư điện tử (kitehub-email), điều phối yêu cầu (kitehub-gateway), thư viện dùng chung (kitehub-platform) và quản lý đăng ký (kitehub-subscription). Lớp nghiệp vụ tenant KiteClass tập trung tại dịch vụ kiteclass-core. Lớp giao diện gồm hai ứng dụng Next.js phục vụ tập người dùng khác nhau.</w:t>
+        <w:t>Về đối tượng, đồ án phục vụ ba persona chính: Solo Teacher (giáo viên độc lập, 1-50 học viên), Center Owner (chủ sở hữu trung tâm, 1-10 chi nhánh, 100-2.000 học viên), và Center Manager (quản lý vận hành trung tâm). Persona Parent và Student thuộc phân khúc K-12 (Kindergarten to Grade 12 — bậc giáo dục phổ thông từ mẫu giáo đến lớp 12) được hoãn sang giai đoạn mở rộng K-12 do yêu cầu bổ sung DPO + DPIA theo Điều 26 Luật Bảo vệ Dữ liệu Cá nhân 2023. Kiến trúc hệ thống cấu thành từ ba lớp dịch vụ. Lớp nền tảng KiteHub gồm sáu dịch vụ độc lập đảm nhận các trách nhiệm khác nhau: quản trị (kitehub-admin), nhận diện thương hiệu (kitehub-branding), thư điện tử (kitehub-email), điều phối yêu cầu (kitehub-gateway), thư viện dùng chung (kitehub-platform) và quản lý đăng ký (kitehub-subscription). Lớp nghiệp vụ tenant KiteClass tập trung tại dịch vụ kiteclass-core. Lớp giao diện gồm hai ứng dụng Next.js phục vụ tập người dùng khác nhau.</w:t>
       </w:r>
     </w:p>
     <w:p>

</xml_diff>

<commit_message>
docs(thesis): định nghĩa acronym — inline lần đầu ở Mở đầu + hoàn thiện danh mục viết tắt
Mở đầu inline-define 14 acronym tại lần đầu: SaaS, AI, PDPL, DPO, DPIA, TDD, DDD, PDCA, API, C4, ERD, JWT, REST, KPI (+ K-12 trước đó). Danh mục viết tắt mở rộng 27→49 entries (thêm AI/C4/CDN/CRM/DCV/DDoS/DKIM/DMARC/DSAR/ERD/Lean/NFR/PDCA/SDXL/SLA/SPF/SSG/SSR/TLS/UUID/WAF/WCAG/ZNS) — mọi acronym có định nghĩa canonical.
</commit_message>
<xml_diff>
--- a/documents/08-thesis/thesis-v1.docx
+++ b/documents/08-thesis/thesis-v1.docx
@@ -1636,7 +1636,7 @@
                 <w:i w:val="0"/>
                 <w:sz w:val="24"/>
               </w:rPr>
-              <w:t>ALB</w:t>
+              <w:t>AI</w:t>
             </w:r>
           </w:p>
         </w:tc>
@@ -1652,7 +1652,7 @@
                 <w:i w:val="0"/>
                 <w:sz w:val="24"/>
               </w:rPr>
-              <w:t>Application Load Balancer — bộ cân bằng tải ứng dụng AWS</w:t>
+              <w:t>Artificial Intelligence — trí tuệ nhân tạo</w:t>
             </w:r>
           </w:p>
         </w:tc>
@@ -1670,7 +1670,7 @@
                 <w:i w:val="0"/>
                 <w:sz w:val="24"/>
               </w:rPr>
-              <w:t>API</w:t>
+              <w:t>ALB</w:t>
             </w:r>
           </w:p>
         </w:tc>
@@ -1686,7 +1686,7 @@
                 <w:i w:val="0"/>
                 <w:sz w:val="24"/>
               </w:rPr>
-              <w:t>Application Programming Interface</w:t>
+              <w:t>Application Load Balancer — bộ cân bằng tải ứng dụng AWS</w:t>
             </w:r>
           </w:p>
         </w:tc>
@@ -1704,7 +1704,7 @@
                 <w:i w:val="0"/>
                 <w:sz w:val="24"/>
               </w:rPr>
-              <w:t>CI/CD</w:t>
+              <w:t>API</w:t>
             </w:r>
           </w:p>
         </w:tc>
@@ -1720,7 +1720,7 @@
                 <w:i w:val="0"/>
                 <w:sz w:val="24"/>
               </w:rPr>
-              <w:t>Continuous Integration / Continuous Deployment</w:t>
+              <w:t>Application Programming Interface — giao diện lập trình ứng dụng</w:t>
             </w:r>
           </w:p>
         </w:tc>
@@ -1738,7 +1738,7 @@
                 <w:i w:val="0"/>
                 <w:sz w:val="24"/>
               </w:rPr>
-              <w:t>DDD</w:t>
+              <w:t>C4</w:t>
             </w:r>
           </w:p>
         </w:tc>
@@ -1754,7 +1754,7 @@
                 <w:i w:val="0"/>
                 <w:sz w:val="24"/>
               </w:rPr>
-              <w:t>Domain-Driven Design</w:t>
+              <w:t>Mô hình mô tả kiến trúc phần mềm 4 cấp: Context, Container, Component, Code</w:t>
             </w:r>
           </w:p>
         </w:tc>
@@ -1772,7 +1772,7 @@
                 <w:i w:val="0"/>
                 <w:sz w:val="24"/>
               </w:rPr>
-              <w:t>DPIA</w:t>
+              <w:t>CDN</w:t>
             </w:r>
           </w:p>
         </w:tc>
@@ -1788,7 +1788,7 @@
                 <w:i w:val="0"/>
                 <w:sz w:val="24"/>
               </w:rPr>
-              <w:t>Data Protection Impact Assessment — Đánh giá Tác động Bảo vệ Dữ liệu</w:t>
+              <w:t>Content Delivery Network — mạng phân phối nội dung</w:t>
             </w:r>
           </w:p>
         </w:tc>
@@ -1806,7 +1806,7 @@
                 <w:i w:val="0"/>
                 <w:sz w:val="24"/>
               </w:rPr>
-              <w:t>DPO</w:t>
+              <w:t>CI/CD</w:t>
             </w:r>
           </w:p>
         </w:tc>
@@ -1822,7 +1822,7 @@
                 <w:i w:val="0"/>
                 <w:sz w:val="24"/>
               </w:rPr>
-              <w:t>Data Protection Officer — Cán bộ Bảo vệ Dữ liệu theo PDPL</w:t>
+              <w:t>Continuous Integration / Continuous Deployment — tích hợp / triển khai liên tục</w:t>
             </w:r>
           </w:p>
         </w:tc>
@@ -1840,7 +1840,7 @@
                 <w:i w:val="0"/>
                 <w:sz w:val="24"/>
               </w:rPr>
-              <w:t>ECR</w:t>
+              <w:t>CRM</w:t>
             </w:r>
           </w:p>
         </w:tc>
@@ -1856,7 +1856,7 @@
                 <w:i w:val="0"/>
                 <w:sz w:val="24"/>
               </w:rPr>
-              <w:t>Elastic Container Registry — kho chứa Docker images trên AWS</w:t>
+              <w:t>Customer Relationship Management — quản lý quan hệ khách hàng</w:t>
             </w:r>
           </w:p>
         </w:tc>
@@ -1874,7 +1874,7 @@
                 <w:i w:val="0"/>
                 <w:sz w:val="24"/>
               </w:rPr>
-              <w:t>ECS</w:t>
+              <w:t>DCV</w:t>
             </w:r>
           </w:p>
         </w:tc>
@@ -1890,7 +1890,7 @@
                 <w:i w:val="0"/>
                 <w:sz w:val="24"/>
               </w:rPr>
-              <w:t>Elastic Container Service — dịch vụ điều phối container AWS</w:t>
+              <w:t>Domain Control Validation — xác thực quyền kiểm soát tên miền</w:t>
             </w:r>
           </w:p>
         </w:tc>
@@ -1908,7 +1908,7 @@
                 <w:i w:val="0"/>
                 <w:sz w:val="24"/>
               </w:rPr>
-              <w:t>IEEE</w:t>
+              <w:t>DDD</w:t>
             </w:r>
           </w:p>
         </w:tc>
@@ -1924,7 +1924,7 @@
                 <w:i w:val="0"/>
                 <w:sz w:val="24"/>
               </w:rPr>
-              <w:t>Institute of Electrical and Electronics Engineers</w:t>
+              <w:t>Domain-Driven Design — thiết kế hướng miền</w:t>
             </w:r>
           </w:p>
         </w:tc>
@@ -1942,7 +1942,7 @@
                 <w:i w:val="0"/>
                 <w:sz w:val="24"/>
               </w:rPr>
-              <w:t>ISO</w:t>
+              <w:t>DDoS</w:t>
             </w:r>
           </w:p>
         </w:tc>
@@ -1958,7 +1958,7 @@
                 <w:i w:val="0"/>
                 <w:sz w:val="24"/>
               </w:rPr>
-              <w:t>International Organization for Standardization</w:t>
+              <w:t>Distributed Denial of Service — tấn công từ chối dịch vụ phân tán</w:t>
             </w:r>
           </w:p>
         </w:tc>
@@ -1976,7 +1976,7 @@
                 <w:i w:val="0"/>
                 <w:sz w:val="24"/>
               </w:rPr>
-              <w:t>JWT</w:t>
+              <w:t>DKIM</w:t>
             </w:r>
           </w:p>
         </w:tc>
@@ -1992,7 +1992,7 @@
                 <w:i w:val="0"/>
                 <w:sz w:val="24"/>
               </w:rPr>
-              <w:t>JSON Web Token</w:t>
+              <w:t>DomainKeys Identified Mail — chữ ký số xác thực email theo tên miền</w:t>
             </w:r>
           </w:p>
         </w:tc>
@@ -2010,7 +2010,7 @@
                 <w:i w:val="0"/>
                 <w:sz w:val="24"/>
               </w:rPr>
-              <w:t>K-12</w:t>
+              <w:t>DMARC</w:t>
             </w:r>
           </w:p>
         </w:tc>
@@ -2026,7 +2026,7 @@
                 <w:i w:val="0"/>
                 <w:sz w:val="24"/>
               </w:rPr>
-              <w:t>Kindergarten to Grade 12 — bậc giáo dục phổ thông từ mẫu giáo đến lớp 12</w:t>
+              <w:t>Domain-based Message Authentication, Reporting and Conformance — chính sách chống giả mạo email</w:t>
             </w:r>
           </w:p>
         </w:tc>
@@ -2044,7 +2044,7 @@
                 <w:i w:val="0"/>
                 <w:sz w:val="24"/>
               </w:rPr>
-              <w:t>KMS</w:t>
+              <w:t>DPIA</w:t>
             </w:r>
           </w:p>
         </w:tc>
@@ -2060,7 +2060,7 @@
                 <w:i w:val="0"/>
                 <w:sz w:val="24"/>
               </w:rPr>
-              <w:t>Key Management Service — dịch vụ quản lý khóa mã hóa</w:t>
+              <w:t>Data Protection Impact Assessment — Đánh giá Tác động Bảo vệ Dữ liệu</w:t>
             </w:r>
           </w:p>
         </w:tc>
@@ -2078,7 +2078,7 @@
                 <w:i w:val="0"/>
                 <w:sz w:val="24"/>
               </w:rPr>
-              <w:t>KPI</w:t>
+              <w:t>DPO</w:t>
             </w:r>
           </w:p>
         </w:tc>
@@ -2094,7 +2094,7 @@
                 <w:i w:val="0"/>
                 <w:sz w:val="24"/>
               </w:rPr>
-              <w:t>Key Performance Indicator — chỉ số hiệu suất chính</w:t>
+              <w:t>Data Protection Officer — Cán bộ Bảo vệ Dữ liệu theo PDPL</w:t>
             </w:r>
           </w:p>
         </w:tc>
@@ -2112,7 +2112,7 @@
                 <w:i w:val="0"/>
                 <w:sz w:val="24"/>
               </w:rPr>
-              <w:t>LMS</w:t>
+              <w:t>DSAR</w:t>
             </w:r>
           </w:p>
         </w:tc>
@@ -2128,7 +2128,7 @@
                 <w:i w:val="0"/>
                 <w:sz w:val="24"/>
               </w:rPr>
-              <w:t>Learning Management System — hệ quản lý học tập</w:t>
+              <w:t>Data Subject Access Request — yêu cầu truy cập dữ liệu của chủ thể dữ liệu</w:t>
             </w:r>
           </w:p>
         </w:tc>
@@ -2146,7 +2146,7 @@
                 <w:i w:val="0"/>
                 <w:sz w:val="24"/>
               </w:rPr>
-              <w:t>MVP</w:t>
+              <w:t>ECR</w:t>
             </w:r>
           </w:p>
         </w:tc>
@@ -2162,7 +2162,7 @@
                 <w:i w:val="0"/>
                 <w:sz w:val="24"/>
               </w:rPr>
-              <w:t>Minimum Viable Product — sản phẩm tối thiểu khả dụng</w:t>
+              <w:t>Elastic Container Registry — kho chứa Docker images trên AWS</w:t>
             </w:r>
           </w:p>
         </w:tc>
@@ -2180,7 +2180,7 @@
                 <w:i w:val="0"/>
                 <w:sz w:val="24"/>
               </w:rPr>
-              <w:t>OIDC</w:t>
+              <w:t>ECS</w:t>
             </w:r>
           </w:p>
         </w:tc>
@@ -2196,7 +2196,7 @@
                 <w:i w:val="0"/>
                 <w:sz w:val="24"/>
               </w:rPr>
-              <w:t>OpenID Connect — chuẩn xác thực OAuth 2.0 mở rộng</w:t>
+              <w:t>Elastic Container Service — dịch vụ điều phối container AWS</w:t>
             </w:r>
           </w:p>
         </w:tc>
@@ -2214,7 +2214,7 @@
                 <w:i w:val="0"/>
                 <w:sz w:val="24"/>
               </w:rPr>
-              <w:t>OWASP</w:t>
+              <w:t>ERD</w:t>
             </w:r>
           </w:p>
         </w:tc>
@@ -2230,7 +2230,7 @@
                 <w:i w:val="0"/>
                 <w:sz w:val="24"/>
               </w:rPr>
-              <w:t>Open Worldwide Application Security Project</w:t>
+              <w:t>Entity-Relationship Diagram — sơ đồ thực thể-quan hệ</w:t>
             </w:r>
           </w:p>
         </w:tc>
@@ -2248,7 +2248,7 @@
                 <w:i w:val="0"/>
                 <w:sz w:val="24"/>
               </w:rPr>
-              <w:t>PDPL</w:t>
+              <w:t>IEEE</w:t>
             </w:r>
           </w:p>
         </w:tc>
@@ -2264,7 +2264,7 @@
                 <w:i w:val="0"/>
                 <w:sz w:val="24"/>
               </w:rPr>
-              <w:t>Personal Data Protection Law — Luật Bảo vệ Dữ liệu Cá nhân 2023 (Số 49/2023/QH15)</w:t>
+              <w:t>Institute of Electrical and Electronics Engineers</w:t>
             </w:r>
           </w:p>
         </w:tc>
@@ -2282,7 +2282,7 @@
                 <w:i w:val="0"/>
                 <w:sz w:val="24"/>
               </w:rPr>
-              <w:t>RDS</w:t>
+              <w:t>ISO</w:t>
             </w:r>
           </w:p>
         </w:tc>
@@ -2298,7 +2298,7 @@
                 <w:i w:val="0"/>
                 <w:sz w:val="24"/>
               </w:rPr>
-              <w:t>Relational Database Service — dịch vụ cơ sở dữ liệu quan hệ AWS</w:t>
+              <w:t>International Organization for Standardization — Tổ chức Tiêu chuẩn hóa Quốc tế</w:t>
             </w:r>
           </w:p>
         </w:tc>
@@ -2316,7 +2316,7 @@
                 <w:i w:val="0"/>
                 <w:sz w:val="24"/>
               </w:rPr>
-              <w:t>REST</w:t>
+              <w:t>JWT</w:t>
             </w:r>
           </w:p>
         </w:tc>
@@ -2332,7 +2332,7 @@
                 <w:i w:val="0"/>
                 <w:sz w:val="24"/>
               </w:rPr>
-              <w:t>Representational State Transfer</w:t>
+              <w:t>JSON Web Token</w:t>
             </w:r>
           </w:p>
         </w:tc>
@@ -2350,7 +2350,7 @@
                 <w:i w:val="0"/>
                 <w:sz w:val="24"/>
               </w:rPr>
-              <w:t>RLS</w:t>
+              <w:t>K-12</w:t>
             </w:r>
           </w:p>
         </w:tc>
@@ -2366,7 +2366,7 @@
                 <w:i w:val="0"/>
                 <w:sz w:val="24"/>
               </w:rPr>
-              <w:t>Row-Level Security</w:t>
+              <w:t>Kindergarten to Grade 12 — bậc giáo dục phổ thông từ mẫu giáo đến lớp 12</w:t>
             </w:r>
           </w:p>
         </w:tc>
@@ -2384,7 +2384,7 @@
                 <w:i w:val="0"/>
                 <w:sz w:val="24"/>
               </w:rPr>
-              <w:t>SaaS</w:t>
+              <w:t>KMS</w:t>
             </w:r>
           </w:p>
         </w:tc>
@@ -2400,7 +2400,7 @@
                 <w:i w:val="0"/>
                 <w:sz w:val="24"/>
               </w:rPr>
-              <w:t>Software as a Service</w:t>
+              <w:t>Key Management Service — dịch vụ quản lý khóa mã hóa</w:t>
             </w:r>
           </w:p>
         </w:tc>
@@ -2418,7 +2418,7 @@
                 <w:i w:val="0"/>
                 <w:sz w:val="24"/>
               </w:rPr>
-              <w:t>SES</w:t>
+              <w:t>KPI</w:t>
             </w:r>
           </w:p>
         </w:tc>
@@ -2434,7 +2434,7 @@
                 <w:i w:val="0"/>
                 <w:sz w:val="24"/>
               </w:rPr>
-              <w:t>Simple Email Service — dịch vụ gửi email AWS</w:t>
+              <w:t>Key Performance Indicator — chỉ số hiệu suất chính</w:t>
             </w:r>
           </w:p>
         </w:tc>
@@ -2452,7 +2452,7 @@
                 <w:i w:val="0"/>
                 <w:sz w:val="24"/>
               </w:rPr>
-              <w:t>TDD</w:t>
+              <w:t>Lean</w:t>
             </w:r>
           </w:p>
         </w:tc>
@@ -2468,7 +2468,7 @@
                 <w:i w:val="0"/>
                 <w:sz w:val="24"/>
               </w:rPr>
-              <w:t>Test-Driven Development</w:t>
+              <w:t>Lean Software Development — phát triển phần mềm tinh gọn (Poppendieck)</w:t>
             </w:r>
           </w:p>
         </w:tc>
@@ -2486,7 +2486,7 @@
                 <w:i w:val="0"/>
                 <w:sz w:val="24"/>
               </w:rPr>
-              <w:t>UTC GTVT</w:t>
+              <w:t>LMS</w:t>
             </w:r>
           </w:p>
         </w:tc>
@@ -2502,7 +2502,7 @@
                 <w:i w:val="0"/>
                 <w:sz w:val="24"/>
               </w:rPr>
-              <w:t>Trường Đại học Giao thông Vận tải — University of Transport and Communications</w:t>
+              <w:t>Learning Management System — hệ quản lý học tập</w:t>
             </w:r>
           </w:p>
         </w:tc>
@@ -2520,6 +2520,686 @@
                 <w:i w:val="0"/>
                 <w:sz w:val="24"/>
               </w:rPr>
+              <w:t>MVP</w:t>
+            </w:r>
+          </w:p>
+        </w:tc>
+        <w:tc>
+          <w:tcPr>
+            <w:tcW w:type="dxa" w:w="7087"/>
+          </w:tcPr>
+          <w:p>
+            <w:r>
+              <w:rPr>
+                <w:rFonts w:ascii="Times New Roman" w:hAnsi="Times New Roman" w:eastAsia="Times New Roman"/>
+                <w:b w:val="0"/>
+                <w:i w:val="0"/>
+                <w:sz w:val="24"/>
+              </w:rPr>
+              <w:t>Minimum Viable Product — sản phẩm tối thiểu khả dụng</w:t>
+            </w:r>
+          </w:p>
+        </w:tc>
+      </w:tr>
+      <w:tr>
+        <w:tc>
+          <w:tcPr>
+            <w:tcW w:type="dxa" w:w="1984"/>
+          </w:tcPr>
+          <w:p>
+            <w:r>
+              <w:rPr>
+                <w:rFonts w:ascii="Times New Roman" w:hAnsi="Times New Roman" w:eastAsia="Times New Roman"/>
+                <w:b/>
+                <w:i w:val="0"/>
+                <w:sz w:val="24"/>
+              </w:rPr>
+              <w:t>NFR</w:t>
+            </w:r>
+          </w:p>
+        </w:tc>
+        <w:tc>
+          <w:tcPr>
+            <w:tcW w:type="dxa" w:w="7087"/>
+          </w:tcPr>
+          <w:p>
+            <w:r>
+              <w:rPr>
+                <w:rFonts w:ascii="Times New Roman" w:hAnsi="Times New Roman" w:eastAsia="Times New Roman"/>
+                <w:b w:val="0"/>
+                <w:i w:val="0"/>
+                <w:sz w:val="24"/>
+              </w:rPr>
+              <w:t>Non-Functional Requirement — yêu cầu phi chức năng</w:t>
+            </w:r>
+          </w:p>
+        </w:tc>
+      </w:tr>
+      <w:tr>
+        <w:tc>
+          <w:tcPr>
+            <w:tcW w:type="dxa" w:w="1984"/>
+          </w:tcPr>
+          <w:p>
+            <w:r>
+              <w:rPr>
+                <w:rFonts w:ascii="Times New Roman" w:hAnsi="Times New Roman" w:eastAsia="Times New Roman"/>
+                <w:b/>
+                <w:i w:val="0"/>
+                <w:sz w:val="24"/>
+              </w:rPr>
+              <w:t>OIDC</w:t>
+            </w:r>
+          </w:p>
+        </w:tc>
+        <w:tc>
+          <w:tcPr>
+            <w:tcW w:type="dxa" w:w="7087"/>
+          </w:tcPr>
+          <w:p>
+            <w:r>
+              <w:rPr>
+                <w:rFonts w:ascii="Times New Roman" w:hAnsi="Times New Roman" w:eastAsia="Times New Roman"/>
+                <w:b w:val="0"/>
+                <w:i w:val="0"/>
+                <w:sz w:val="24"/>
+              </w:rPr>
+              <w:t>OpenID Connect — chuẩn xác thực OAuth 2.0 mở rộng</w:t>
+            </w:r>
+          </w:p>
+        </w:tc>
+      </w:tr>
+      <w:tr>
+        <w:tc>
+          <w:tcPr>
+            <w:tcW w:type="dxa" w:w="1984"/>
+          </w:tcPr>
+          <w:p>
+            <w:r>
+              <w:rPr>
+                <w:rFonts w:ascii="Times New Roman" w:hAnsi="Times New Roman" w:eastAsia="Times New Roman"/>
+                <w:b/>
+                <w:i w:val="0"/>
+                <w:sz w:val="24"/>
+              </w:rPr>
+              <w:t>OWASP</w:t>
+            </w:r>
+          </w:p>
+        </w:tc>
+        <w:tc>
+          <w:tcPr>
+            <w:tcW w:type="dxa" w:w="7087"/>
+          </w:tcPr>
+          <w:p>
+            <w:r>
+              <w:rPr>
+                <w:rFonts w:ascii="Times New Roman" w:hAnsi="Times New Roman" w:eastAsia="Times New Roman"/>
+                <w:b w:val="0"/>
+                <w:i w:val="0"/>
+                <w:sz w:val="24"/>
+              </w:rPr>
+              <w:t>Open Worldwide Application Security Project</w:t>
+            </w:r>
+          </w:p>
+        </w:tc>
+      </w:tr>
+      <w:tr>
+        <w:tc>
+          <w:tcPr>
+            <w:tcW w:type="dxa" w:w="1984"/>
+          </w:tcPr>
+          <w:p>
+            <w:r>
+              <w:rPr>
+                <w:rFonts w:ascii="Times New Roman" w:hAnsi="Times New Roman" w:eastAsia="Times New Roman"/>
+                <w:b/>
+                <w:i w:val="0"/>
+                <w:sz w:val="24"/>
+              </w:rPr>
+              <w:t>PDCA</w:t>
+            </w:r>
+          </w:p>
+        </w:tc>
+        <w:tc>
+          <w:tcPr>
+            <w:tcW w:type="dxa" w:w="7087"/>
+          </w:tcPr>
+          <w:p>
+            <w:r>
+              <w:rPr>
+                <w:rFonts w:ascii="Times New Roman" w:hAnsi="Times New Roman" w:eastAsia="Times New Roman"/>
+                <w:b w:val="0"/>
+                <w:i w:val="0"/>
+                <w:sz w:val="24"/>
+              </w:rPr>
+              <w:t>Plan-Do-Check-Act — chu trình cải tiến chất lượng (Deming)</w:t>
+            </w:r>
+          </w:p>
+        </w:tc>
+      </w:tr>
+      <w:tr>
+        <w:tc>
+          <w:tcPr>
+            <w:tcW w:type="dxa" w:w="1984"/>
+          </w:tcPr>
+          <w:p>
+            <w:r>
+              <w:rPr>
+                <w:rFonts w:ascii="Times New Roman" w:hAnsi="Times New Roman" w:eastAsia="Times New Roman"/>
+                <w:b/>
+                <w:i w:val="0"/>
+                <w:sz w:val="24"/>
+              </w:rPr>
+              <w:t>PDPL</w:t>
+            </w:r>
+          </w:p>
+        </w:tc>
+        <w:tc>
+          <w:tcPr>
+            <w:tcW w:type="dxa" w:w="7087"/>
+          </w:tcPr>
+          <w:p>
+            <w:r>
+              <w:rPr>
+                <w:rFonts w:ascii="Times New Roman" w:hAnsi="Times New Roman" w:eastAsia="Times New Roman"/>
+                <w:b w:val="0"/>
+                <w:i w:val="0"/>
+                <w:sz w:val="24"/>
+              </w:rPr>
+              <w:t>Personal Data Protection Law — Luật Bảo vệ Dữ liệu Cá nhân 2023 (Số 49/2023/QH15)</w:t>
+            </w:r>
+          </w:p>
+        </w:tc>
+      </w:tr>
+      <w:tr>
+        <w:tc>
+          <w:tcPr>
+            <w:tcW w:type="dxa" w:w="1984"/>
+          </w:tcPr>
+          <w:p>
+            <w:r>
+              <w:rPr>
+                <w:rFonts w:ascii="Times New Roman" w:hAnsi="Times New Roman" w:eastAsia="Times New Roman"/>
+                <w:b/>
+                <w:i w:val="0"/>
+                <w:sz w:val="24"/>
+              </w:rPr>
+              <w:t>RDS</w:t>
+            </w:r>
+          </w:p>
+        </w:tc>
+        <w:tc>
+          <w:tcPr>
+            <w:tcW w:type="dxa" w:w="7087"/>
+          </w:tcPr>
+          <w:p>
+            <w:r>
+              <w:rPr>
+                <w:rFonts w:ascii="Times New Roman" w:hAnsi="Times New Roman" w:eastAsia="Times New Roman"/>
+                <w:b w:val="0"/>
+                <w:i w:val="0"/>
+                <w:sz w:val="24"/>
+              </w:rPr>
+              <w:t>Relational Database Service — dịch vụ cơ sở dữ liệu quan hệ AWS</w:t>
+            </w:r>
+          </w:p>
+        </w:tc>
+      </w:tr>
+      <w:tr>
+        <w:tc>
+          <w:tcPr>
+            <w:tcW w:type="dxa" w:w="1984"/>
+          </w:tcPr>
+          <w:p>
+            <w:r>
+              <w:rPr>
+                <w:rFonts w:ascii="Times New Roman" w:hAnsi="Times New Roman" w:eastAsia="Times New Roman"/>
+                <w:b/>
+                <w:i w:val="0"/>
+                <w:sz w:val="24"/>
+              </w:rPr>
+              <w:t>REST</w:t>
+            </w:r>
+          </w:p>
+        </w:tc>
+        <w:tc>
+          <w:tcPr>
+            <w:tcW w:type="dxa" w:w="7087"/>
+          </w:tcPr>
+          <w:p>
+            <w:r>
+              <w:rPr>
+                <w:rFonts w:ascii="Times New Roman" w:hAnsi="Times New Roman" w:eastAsia="Times New Roman"/>
+                <w:b w:val="0"/>
+                <w:i w:val="0"/>
+                <w:sz w:val="24"/>
+              </w:rPr>
+              <w:t>Representational State Transfer</w:t>
+            </w:r>
+          </w:p>
+        </w:tc>
+      </w:tr>
+      <w:tr>
+        <w:tc>
+          <w:tcPr>
+            <w:tcW w:type="dxa" w:w="1984"/>
+          </w:tcPr>
+          <w:p>
+            <w:r>
+              <w:rPr>
+                <w:rFonts w:ascii="Times New Roman" w:hAnsi="Times New Roman" w:eastAsia="Times New Roman"/>
+                <w:b/>
+                <w:i w:val="0"/>
+                <w:sz w:val="24"/>
+              </w:rPr>
+              <w:t>RLS</w:t>
+            </w:r>
+          </w:p>
+        </w:tc>
+        <w:tc>
+          <w:tcPr>
+            <w:tcW w:type="dxa" w:w="7087"/>
+          </w:tcPr>
+          <w:p>
+            <w:r>
+              <w:rPr>
+                <w:rFonts w:ascii="Times New Roman" w:hAnsi="Times New Roman" w:eastAsia="Times New Roman"/>
+                <w:b w:val="0"/>
+                <w:i w:val="0"/>
+                <w:sz w:val="24"/>
+              </w:rPr>
+              <w:t>Row-Level Security — bảo mật mức hàng</w:t>
+            </w:r>
+          </w:p>
+        </w:tc>
+      </w:tr>
+      <w:tr>
+        <w:tc>
+          <w:tcPr>
+            <w:tcW w:type="dxa" w:w="1984"/>
+          </w:tcPr>
+          <w:p>
+            <w:r>
+              <w:rPr>
+                <w:rFonts w:ascii="Times New Roman" w:hAnsi="Times New Roman" w:eastAsia="Times New Roman"/>
+                <w:b/>
+                <w:i w:val="0"/>
+                <w:sz w:val="24"/>
+              </w:rPr>
+              <w:t>SaaS</w:t>
+            </w:r>
+          </w:p>
+        </w:tc>
+        <w:tc>
+          <w:tcPr>
+            <w:tcW w:type="dxa" w:w="7087"/>
+          </w:tcPr>
+          <w:p>
+            <w:r>
+              <w:rPr>
+                <w:rFonts w:ascii="Times New Roman" w:hAnsi="Times New Roman" w:eastAsia="Times New Roman"/>
+                <w:b w:val="0"/>
+                <w:i w:val="0"/>
+                <w:sz w:val="24"/>
+              </w:rPr>
+              <w:t>Software as a Service — phần mềm dạng dịch vụ</w:t>
+            </w:r>
+          </w:p>
+        </w:tc>
+      </w:tr>
+      <w:tr>
+        <w:tc>
+          <w:tcPr>
+            <w:tcW w:type="dxa" w:w="1984"/>
+          </w:tcPr>
+          <w:p>
+            <w:r>
+              <w:rPr>
+                <w:rFonts w:ascii="Times New Roman" w:hAnsi="Times New Roman" w:eastAsia="Times New Roman"/>
+                <w:b/>
+                <w:i w:val="0"/>
+                <w:sz w:val="24"/>
+              </w:rPr>
+              <w:t>SDXL</w:t>
+            </w:r>
+          </w:p>
+        </w:tc>
+        <w:tc>
+          <w:tcPr>
+            <w:tcW w:type="dxa" w:w="7087"/>
+          </w:tcPr>
+          <w:p>
+            <w:r>
+              <w:rPr>
+                <w:rFonts w:ascii="Times New Roman" w:hAnsi="Times New Roman" w:eastAsia="Times New Roman"/>
+                <w:b w:val="0"/>
+                <w:i w:val="0"/>
+                <w:sz w:val="24"/>
+              </w:rPr>
+              <w:t>Stable Diffusion XL — mô hình sinh ảnh từ văn bản</w:t>
+            </w:r>
+          </w:p>
+        </w:tc>
+      </w:tr>
+      <w:tr>
+        <w:tc>
+          <w:tcPr>
+            <w:tcW w:type="dxa" w:w="1984"/>
+          </w:tcPr>
+          <w:p>
+            <w:r>
+              <w:rPr>
+                <w:rFonts w:ascii="Times New Roman" w:hAnsi="Times New Roman" w:eastAsia="Times New Roman"/>
+                <w:b/>
+                <w:i w:val="0"/>
+                <w:sz w:val="24"/>
+              </w:rPr>
+              <w:t>SES</w:t>
+            </w:r>
+          </w:p>
+        </w:tc>
+        <w:tc>
+          <w:tcPr>
+            <w:tcW w:type="dxa" w:w="7087"/>
+          </w:tcPr>
+          <w:p>
+            <w:r>
+              <w:rPr>
+                <w:rFonts w:ascii="Times New Roman" w:hAnsi="Times New Roman" w:eastAsia="Times New Roman"/>
+                <w:b w:val="0"/>
+                <w:i w:val="0"/>
+                <w:sz w:val="24"/>
+              </w:rPr>
+              <w:t>Simple Email Service — dịch vụ gửi email AWS</w:t>
+            </w:r>
+          </w:p>
+        </w:tc>
+      </w:tr>
+      <w:tr>
+        <w:tc>
+          <w:tcPr>
+            <w:tcW w:type="dxa" w:w="1984"/>
+          </w:tcPr>
+          <w:p>
+            <w:r>
+              <w:rPr>
+                <w:rFonts w:ascii="Times New Roman" w:hAnsi="Times New Roman" w:eastAsia="Times New Roman"/>
+                <w:b/>
+                <w:i w:val="0"/>
+                <w:sz w:val="24"/>
+              </w:rPr>
+              <w:t>SLA</w:t>
+            </w:r>
+          </w:p>
+        </w:tc>
+        <w:tc>
+          <w:tcPr>
+            <w:tcW w:type="dxa" w:w="7087"/>
+          </w:tcPr>
+          <w:p>
+            <w:r>
+              <w:rPr>
+                <w:rFonts w:ascii="Times New Roman" w:hAnsi="Times New Roman" w:eastAsia="Times New Roman"/>
+                <w:b w:val="0"/>
+                <w:i w:val="0"/>
+                <w:sz w:val="24"/>
+              </w:rPr>
+              <w:t>Service Level Agreement — cam kết mức dịch vụ</w:t>
+            </w:r>
+          </w:p>
+        </w:tc>
+      </w:tr>
+      <w:tr>
+        <w:tc>
+          <w:tcPr>
+            <w:tcW w:type="dxa" w:w="1984"/>
+          </w:tcPr>
+          <w:p>
+            <w:r>
+              <w:rPr>
+                <w:rFonts w:ascii="Times New Roman" w:hAnsi="Times New Roman" w:eastAsia="Times New Roman"/>
+                <w:b/>
+                <w:i w:val="0"/>
+                <w:sz w:val="24"/>
+              </w:rPr>
+              <w:t>SPF</w:t>
+            </w:r>
+          </w:p>
+        </w:tc>
+        <w:tc>
+          <w:tcPr>
+            <w:tcW w:type="dxa" w:w="7087"/>
+          </w:tcPr>
+          <w:p>
+            <w:r>
+              <w:rPr>
+                <w:rFonts w:ascii="Times New Roman" w:hAnsi="Times New Roman" w:eastAsia="Times New Roman"/>
+                <w:b w:val="0"/>
+                <w:i w:val="0"/>
+                <w:sz w:val="24"/>
+              </w:rPr>
+              <w:t>Sender Policy Framework — bản ghi xác thực nguồn gửi email</w:t>
+            </w:r>
+          </w:p>
+        </w:tc>
+      </w:tr>
+      <w:tr>
+        <w:tc>
+          <w:tcPr>
+            <w:tcW w:type="dxa" w:w="1984"/>
+          </w:tcPr>
+          <w:p>
+            <w:r>
+              <w:rPr>
+                <w:rFonts w:ascii="Times New Roman" w:hAnsi="Times New Roman" w:eastAsia="Times New Roman"/>
+                <w:b/>
+                <w:i w:val="0"/>
+                <w:sz w:val="24"/>
+              </w:rPr>
+              <w:t>SSG</w:t>
+            </w:r>
+          </w:p>
+        </w:tc>
+        <w:tc>
+          <w:tcPr>
+            <w:tcW w:type="dxa" w:w="7087"/>
+          </w:tcPr>
+          <w:p>
+            <w:r>
+              <w:rPr>
+                <w:rFonts w:ascii="Times New Roman" w:hAnsi="Times New Roman" w:eastAsia="Times New Roman"/>
+                <w:b w:val="0"/>
+                <w:i w:val="0"/>
+                <w:sz w:val="24"/>
+              </w:rPr>
+              <w:t>Static Site Generation — sinh trang tĩnh</w:t>
+            </w:r>
+          </w:p>
+        </w:tc>
+      </w:tr>
+      <w:tr>
+        <w:tc>
+          <w:tcPr>
+            <w:tcW w:type="dxa" w:w="1984"/>
+          </w:tcPr>
+          <w:p>
+            <w:r>
+              <w:rPr>
+                <w:rFonts w:ascii="Times New Roman" w:hAnsi="Times New Roman" w:eastAsia="Times New Roman"/>
+                <w:b/>
+                <w:i w:val="0"/>
+                <w:sz w:val="24"/>
+              </w:rPr>
+              <w:t>SSR</w:t>
+            </w:r>
+          </w:p>
+        </w:tc>
+        <w:tc>
+          <w:tcPr>
+            <w:tcW w:type="dxa" w:w="7087"/>
+          </w:tcPr>
+          <w:p>
+            <w:r>
+              <w:rPr>
+                <w:rFonts w:ascii="Times New Roman" w:hAnsi="Times New Roman" w:eastAsia="Times New Roman"/>
+                <w:b w:val="0"/>
+                <w:i w:val="0"/>
+                <w:sz w:val="24"/>
+              </w:rPr>
+              <w:t>Server-Side Rendering — kết xuất phía máy chủ</w:t>
+            </w:r>
+          </w:p>
+        </w:tc>
+      </w:tr>
+      <w:tr>
+        <w:tc>
+          <w:tcPr>
+            <w:tcW w:type="dxa" w:w="1984"/>
+          </w:tcPr>
+          <w:p>
+            <w:r>
+              <w:rPr>
+                <w:rFonts w:ascii="Times New Roman" w:hAnsi="Times New Roman" w:eastAsia="Times New Roman"/>
+                <w:b/>
+                <w:i w:val="0"/>
+                <w:sz w:val="24"/>
+              </w:rPr>
+              <w:t>TDD</w:t>
+            </w:r>
+          </w:p>
+        </w:tc>
+        <w:tc>
+          <w:tcPr>
+            <w:tcW w:type="dxa" w:w="7087"/>
+          </w:tcPr>
+          <w:p>
+            <w:r>
+              <w:rPr>
+                <w:rFonts w:ascii="Times New Roman" w:hAnsi="Times New Roman" w:eastAsia="Times New Roman"/>
+                <w:b w:val="0"/>
+                <w:i w:val="0"/>
+                <w:sz w:val="24"/>
+              </w:rPr>
+              <w:t>Test-Driven Development — phát triển hướng kiểm thử</w:t>
+            </w:r>
+          </w:p>
+        </w:tc>
+      </w:tr>
+      <w:tr>
+        <w:tc>
+          <w:tcPr>
+            <w:tcW w:type="dxa" w:w="1984"/>
+          </w:tcPr>
+          <w:p>
+            <w:r>
+              <w:rPr>
+                <w:rFonts w:ascii="Times New Roman" w:hAnsi="Times New Roman" w:eastAsia="Times New Roman"/>
+                <w:b/>
+                <w:i w:val="0"/>
+                <w:sz w:val="24"/>
+              </w:rPr>
+              <w:t>TLS</w:t>
+            </w:r>
+          </w:p>
+        </w:tc>
+        <w:tc>
+          <w:tcPr>
+            <w:tcW w:type="dxa" w:w="7087"/>
+          </w:tcPr>
+          <w:p>
+            <w:r>
+              <w:rPr>
+                <w:rFonts w:ascii="Times New Roman" w:hAnsi="Times New Roman" w:eastAsia="Times New Roman"/>
+                <w:b w:val="0"/>
+                <w:i w:val="0"/>
+                <w:sz w:val="24"/>
+              </w:rPr>
+              <w:t>Transport Layer Security — bảo mật tầng truyền tải</w:t>
+            </w:r>
+          </w:p>
+        </w:tc>
+      </w:tr>
+      <w:tr>
+        <w:tc>
+          <w:tcPr>
+            <w:tcW w:type="dxa" w:w="1984"/>
+          </w:tcPr>
+          <w:p>
+            <w:r>
+              <w:rPr>
+                <w:rFonts w:ascii="Times New Roman" w:hAnsi="Times New Roman" w:eastAsia="Times New Roman"/>
+                <w:b/>
+                <w:i w:val="0"/>
+                <w:sz w:val="24"/>
+              </w:rPr>
+              <w:t>UTC GTVT</w:t>
+            </w:r>
+          </w:p>
+        </w:tc>
+        <w:tc>
+          <w:tcPr>
+            <w:tcW w:type="dxa" w:w="7087"/>
+          </w:tcPr>
+          <w:p>
+            <w:r>
+              <w:rPr>
+                <w:rFonts w:ascii="Times New Roman" w:hAnsi="Times New Roman" w:eastAsia="Times New Roman"/>
+                <w:b w:val="0"/>
+                <w:i w:val="0"/>
+                <w:sz w:val="24"/>
+              </w:rPr>
+              <w:t>Trường Đại học Giao thông Vận tải — University of Transport and Communications</w:t>
+            </w:r>
+          </w:p>
+        </w:tc>
+      </w:tr>
+      <w:tr>
+        <w:tc>
+          <w:tcPr>
+            <w:tcW w:type="dxa" w:w="1984"/>
+          </w:tcPr>
+          <w:p>
+            <w:r>
+              <w:rPr>
+                <w:rFonts w:ascii="Times New Roman" w:hAnsi="Times New Roman" w:eastAsia="Times New Roman"/>
+                <w:b/>
+                <w:i w:val="0"/>
+                <w:sz w:val="24"/>
+              </w:rPr>
+              <w:t>UUID</w:t>
+            </w:r>
+          </w:p>
+        </w:tc>
+        <w:tc>
+          <w:tcPr>
+            <w:tcW w:type="dxa" w:w="7087"/>
+          </w:tcPr>
+          <w:p>
+            <w:r>
+              <w:rPr>
+                <w:rFonts w:ascii="Times New Roman" w:hAnsi="Times New Roman" w:eastAsia="Times New Roman"/>
+                <w:b w:val="0"/>
+                <w:i w:val="0"/>
+                <w:sz w:val="24"/>
+              </w:rPr>
+              <w:t>Universally Unique Identifier — định danh duy nhất toàn cục</w:t>
+            </w:r>
+          </w:p>
+        </w:tc>
+      </w:tr>
+      <w:tr>
+        <w:tc>
+          <w:tcPr>
+            <w:tcW w:type="dxa" w:w="1984"/>
+          </w:tcPr>
+          <w:p>
+            <w:r>
+              <w:rPr>
+                <w:rFonts w:ascii="Times New Roman" w:hAnsi="Times New Roman" w:eastAsia="Times New Roman"/>
+                <w:b/>
+                <w:i w:val="0"/>
+                <w:sz w:val="24"/>
+              </w:rPr>
               <w:t>VPC</w:t>
             </w:r>
           </w:p>
@@ -2537,6 +3217,108 @@
                 <w:sz w:val="24"/>
               </w:rPr>
               <w:t>Virtual Private Cloud — mạng riêng ảo trên cloud</w:t>
+            </w:r>
+          </w:p>
+        </w:tc>
+      </w:tr>
+      <w:tr>
+        <w:tc>
+          <w:tcPr>
+            <w:tcW w:type="dxa" w:w="1984"/>
+          </w:tcPr>
+          <w:p>
+            <w:r>
+              <w:rPr>
+                <w:rFonts w:ascii="Times New Roman" w:hAnsi="Times New Roman" w:eastAsia="Times New Roman"/>
+                <w:b/>
+                <w:i w:val="0"/>
+                <w:sz w:val="24"/>
+              </w:rPr>
+              <w:t>WAF</w:t>
+            </w:r>
+          </w:p>
+        </w:tc>
+        <w:tc>
+          <w:tcPr>
+            <w:tcW w:type="dxa" w:w="7087"/>
+          </w:tcPr>
+          <w:p>
+            <w:r>
+              <w:rPr>
+                <w:rFonts w:ascii="Times New Roman" w:hAnsi="Times New Roman" w:eastAsia="Times New Roman"/>
+                <w:b w:val="0"/>
+                <w:i w:val="0"/>
+                <w:sz w:val="24"/>
+              </w:rPr>
+              <w:t>Web Application Firewall — tường lửa ứng dụng web</w:t>
+            </w:r>
+          </w:p>
+        </w:tc>
+      </w:tr>
+      <w:tr>
+        <w:tc>
+          <w:tcPr>
+            <w:tcW w:type="dxa" w:w="1984"/>
+          </w:tcPr>
+          <w:p>
+            <w:r>
+              <w:rPr>
+                <w:rFonts w:ascii="Times New Roman" w:hAnsi="Times New Roman" w:eastAsia="Times New Roman"/>
+                <w:b/>
+                <w:i w:val="0"/>
+                <w:sz w:val="24"/>
+              </w:rPr>
+              <w:t>WCAG</w:t>
+            </w:r>
+          </w:p>
+        </w:tc>
+        <w:tc>
+          <w:tcPr>
+            <w:tcW w:type="dxa" w:w="7087"/>
+          </w:tcPr>
+          <w:p>
+            <w:r>
+              <w:rPr>
+                <w:rFonts w:ascii="Times New Roman" w:hAnsi="Times New Roman" w:eastAsia="Times New Roman"/>
+                <w:b w:val="0"/>
+                <w:i w:val="0"/>
+                <w:sz w:val="24"/>
+              </w:rPr>
+              <w:t>Web Content Accessibility Guidelines — hướng dẫn truy cập nội dung web</w:t>
+            </w:r>
+          </w:p>
+        </w:tc>
+      </w:tr>
+      <w:tr>
+        <w:tc>
+          <w:tcPr>
+            <w:tcW w:type="dxa" w:w="1984"/>
+          </w:tcPr>
+          <w:p>
+            <w:r>
+              <w:rPr>
+                <w:rFonts w:ascii="Times New Roman" w:hAnsi="Times New Roman" w:eastAsia="Times New Roman"/>
+                <w:b/>
+                <w:i w:val="0"/>
+                <w:sz w:val="24"/>
+              </w:rPr>
+              <w:t>ZNS</w:t>
+            </w:r>
+          </w:p>
+        </w:tc>
+        <w:tc>
+          <w:tcPr>
+            <w:tcW w:type="dxa" w:w="7087"/>
+          </w:tcPr>
+          <w:p>
+            <w:r>
+              <w:rPr>
+                <w:rFonts w:ascii="Times New Roman" w:hAnsi="Times New Roman" w:eastAsia="Times New Roman"/>
+                <w:b w:val="0"/>
+                <w:i w:val="0"/>
+                <w:sz w:val="24"/>
+              </w:rPr>
+              <w:t>Zalo Notification Service — dịch vụ thông báo qua Zalo</w:t>
             </w:r>
           </w:p>
         </w:tc>
@@ -2597,7 +3379,7 @@
           <w:i w:val="0"/>
           <w:sz w:val="26"/>
         </w:rPr>
-        <w:t>Thị trường phần mềm quản lý trung tâm giáo dục Việt Nam đang tăng trưởng mạnh sau khi Thông tư 29/2024/TT-BGDĐT chính thức hóa hoạt động dạy thêm có thu phí. Tuy nhiên, đa số trung tâm nhỏ và vừa (1-10 chi nhánh, 100-2000 học viên) vẫn dùng Excel hoặc các phần mềm enterprise không phù hợp về giá và độ phức tạp. Khoảng trống này tạo cơ hội cho một giải pháp SaaS multi-tenant gốc, Vietnamese-first UX, và tự động hóa các tác vụ branding bằng AI — đây chính là động lực để em chọn đề tài "XÂY DỰNG HỆ THỐNG SAAS CUNG CẤP DỊCH VỤ ĐÀO TẠO".</w:t>
+        <w:t>Thị trường phần mềm quản lý trung tâm giáo dục Việt Nam đang tăng trưởng mạnh sau khi Thông tư 29/2024/TT-BGDĐT chính thức hóa hoạt động dạy thêm có thu phí. Tuy nhiên, đa số trung tâm nhỏ và vừa (1-10 chi nhánh, 100-2000 học viên) vẫn dùng Excel hoặc các phần mềm enterprise không phù hợp về giá và độ phức tạp. Khoảng trống này tạo cơ hội cho một giải pháp SaaS (Software as a Service — phần mềm dạng dịch vụ) đa-tenant gốc, ưu tiên trải nghiệm người dùng tiếng Việt, và tự động hóa các tác vụ nhận diện thương hiệu bằng trí tuệ nhân tạo (AI — Artificial Intelligence) — đây chính là động lực để em chọn đề tài "XÂY DỰNG HỆ THỐNG SAAS CUNG CẤP DỊCH VỤ ĐÀO TẠO".</w:t>
       </w:r>
     </w:p>
     <w:p>
@@ -2659,7 +3441,7 @@
           <w:i w:val="0"/>
           <w:sz w:val="26"/>
         </w:rPr>
-        <w:t>Đảm bảo tuân thủ pháp luật Việt Nam: PDPL 2023, Luật An ninh mạng 2018, Thông tư 78/2021/TT-BTC về hóa đơn điện tử.</w:t>
+        <w:t>Đảm bảo tuân thủ pháp luật Việt Nam: Luật Bảo vệ Dữ liệu Cá nhân 2023 (PDPL — Personal Data Protection Law), Luật An ninh mạng 2018, Thông tư 78/2021/TT-BTC về hóa đơn điện tử.</w:t>
       </w:r>
     </w:p>
     <w:p>
@@ -2721,7 +3503,7 @@
           <w:i w:val="0"/>
           <w:sz w:val="26"/>
         </w:rPr>
-        <w:t>Về đối tượng, đồ án phục vụ ba persona chính: Solo Teacher (giáo viên độc lập, 1-50 học viên), Center Owner (chủ sở hữu trung tâm, 1-10 chi nhánh, 100-2.000 học viên), và Center Manager (quản lý vận hành trung tâm). Persona Parent và Student thuộc phân khúc K-12 (Kindergarten to Grade 12 — bậc giáo dục phổ thông từ mẫu giáo đến lớp 12) được hoãn sang giai đoạn mở rộng K-12 do yêu cầu bổ sung DPO + DPIA theo Điều 26 Luật Bảo vệ Dữ liệu Cá nhân 2023. Kiến trúc hệ thống cấu thành từ ba lớp dịch vụ. Lớp nền tảng KiteHub gồm sáu dịch vụ độc lập đảm nhận các trách nhiệm khác nhau: quản trị (kitehub-admin), nhận diện thương hiệu (kitehub-branding), thư điện tử (kitehub-email), điều phối yêu cầu (kitehub-gateway), thư viện dùng chung (kitehub-platform) và quản lý đăng ký (kitehub-subscription). Lớp nghiệp vụ tenant KiteClass tập trung tại dịch vụ kiteclass-core. Lớp giao diện gồm hai ứng dụng Next.js phục vụ tập người dùng khác nhau.</w:t>
+        <w:t>Về đối tượng, đồ án phục vụ ba persona chính: Solo Teacher (giáo viên độc lập, 1-50 học viên), Center Owner (chủ sở hữu trung tâm, 1-10 chi nhánh, 100-2.000 học viên), và Center Manager (quản lý vận hành trung tâm). Persona Parent và Student thuộc phân khúc K-12 (Kindergarten to Grade 12 — bậc giáo dục phổ thông từ mẫu giáo đến lớp 12) được hoãn sang giai đoạn mở rộng K-12 do yêu cầu bổ sung DPO (Data Protection Officer — cán bộ bảo vệ dữ liệu) và DPIA (Data Protection Impact Assessment — đánh giá tác động bảo vệ dữ liệu) theo Điều 26 Luật Bảo vệ Dữ liệu Cá nhân 2023. Kiến trúc hệ thống cấu thành từ ba lớp dịch vụ. Lớp nền tảng KiteHub gồm sáu dịch vụ độc lập đảm nhận các trách nhiệm khác nhau: quản trị (kitehub-admin), nhận diện thương hiệu (kitehub-branding), thư điện tử (kitehub-email), điều phối yêu cầu (kitehub-gateway), thư viện dùng chung (kitehub-platform) và quản lý đăng ký (kitehub-subscription). Lớp nghiệp vụ tenant KiteClass tập trung tại dịch vụ kiteclass-core. Lớp giao diện gồm hai ứng dụng Next.js phục vụ tập người dùng khác nhau.</w:t>
       </w:r>
     </w:p>
     <w:p>
@@ -2799,7 +3581,7 @@
           <w:i w:val="0"/>
           <w:sz w:val="26"/>
         </w:rPr>
-        <w:t>Áp dụng phương pháp luận Quality-Driven Development bốn trụ cột (TDD per Beck 2002, DDD per Evans 2003, PDCA per Deming 1986, Lean per Poppendieck 2003) — mỗi vấn đề phát hiện được chuyển hóa thành quy tắc kiểm soát kèm cơ chế kiểm tra tự động, tích hợp ngay trong quy trình phát triển.</w:t>
+        <w:t>Áp dụng phương pháp luận Quality-Driven Development bốn trụ cột: phát triển hướng kiểm thử (TDD — Test-Driven Development, per Beck 2002), thiết kế hướng miền (DDD — Domain-Driven Design, per Evans 2003), chu trình Plan-Do-Check-Act (PDCA, per Deming 1986) và tư duy tinh gọn (Lean, per Poppendieck 2003) — mỗi vấn đề phát hiện được chuyển hóa thành quy tắc kiểm soát kèm cơ chế kiểm tra tự động, tích hợp ngay trong quy trình phát triển.</w:t>
       </w:r>
     </w:p>
     <w:p>
@@ -2815,7 +3597,7 @@
           <w:i w:val="0"/>
           <w:sz w:val="26"/>
         </w:rPr>
-        <w:t>Đánh giá chất lượng hệ thống qua bộ audit bảy chiều (Quality, UI, Security, Performance, API Contract, Business Logic, Ops Readiness) chấm điểm /100 hoặc /128 định kỳ sau mỗi giai đoạn phát triển.</w:t>
+        <w:t>Đánh giá chất lượng hệ thống qua bộ audit bảy chiều (Quality, UI, Security, Performance, API — Application Programming Interface — Contract, Business Logic, Ops Readiness) chấm điểm /100 hoặc /128 định kỳ sau mỗi giai đoạn phát triển.</w:t>
       </w:r>
     </w:p>
     <w:p>
@@ -2845,7 +3627,7 @@
           <w:i w:val="0"/>
           <w:sz w:val="26"/>
         </w:rPr>
-        <w:t>Đồ án trình bày bốn đóng góp chính tương ứng bốn chương nội dung. Thứ nhất, đồ án phân tích thị trường EdTech Việt Nam và khung pháp lý liên quan (PDPL 2023, Luật An ninh mạng 2018, Thông tư 29/2024/TT-BGDĐT) làm cơ sở xác định khoảng trống và nhu cầu của nhóm trung tâm vừa và nhỏ. Thứ hai, đồ án thiết kế và mô tả kiến trúc hệ thống multi-tenant SaaS với mô hình C4 bốn cấp, kết hợp Use Case + Class + ERD và sơ đồ tuần tự cho các luồng quan trọng (đăng ký, kích hoạt subscription).</w:t>
+        <w:t>Đồ án trình bày bốn đóng góp chính tương ứng bốn chương nội dung. Thứ nhất, đồ án phân tích thị trường EdTech Việt Nam và khung pháp lý liên quan (PDPL 2023, Luật An ninh mạng 2018, Thông tư 29/2024/TT-BGDĐT) làm cơ sở xác định khoảng trống và nhu cầu của nhóm trung tâm vừa và nhỏ. Thứ hai, đồ án thiết kế và mô tả kiến trúc hệ thống multi-tenant SaaS với mô hình C4 (mô hình mô tả kiến trúc phần mềm bốn cấp Context-Container-Component-Code), kết hợp Use Case + Class + ERD (Entity-Relationship Diagram — sơ đồ thực thể-quan hệ) và sơ đồ tuần tự cho các luồng quan trọng (đăng ký, kích hoạt subscription).</w:t>
       </w:r>
     </w:p>
     <w:p>
@@ -2861,7 +3643,7 @@
           <w:i w:val="0"/>
           <w:sz w:val="26"/>
         </w:rPr>
-        <w:t>Thứ ba, đồ án triển khai và kiểm thử hệ thống trên AWS Singapore Free Tier, với các pattern cốt lõi (Row-Level Security NULL force-fail, Outbox Pattern, JWT propagation, REST 3-tier) được kiểm chứng qua unit test, integration test và E2E test. Thứ tư, đồ án trình bày kết quả triển khai thực tế trong giai đoạn thử nghiệm tenant kèm các KPI đo lường, đánh giá độ trưởng thành và đề xuất hướng phát triển tiếp theo. Kết quả của đồ án vừa là sản phẩm phần mềm hoạt động được, vừa là tài liệu tham chiếu cho các công trình nghiên cứu kế tiếp về EdTech multi-tenant tại Việt Nam.</w:t>
+        <w:t>Thứ ba, đồ án triển khai và kiểm thử hệ thống trên AWS Singapore Free Tier, với các pattern cốt lõi (Row-Level Security NULL force-fail, Outbox Pattern, truyền ngữ cảnh qua JWT — JSON Web Token, kiến trúc REST — Representational State Transfer — 3 tầng) được kiểm chứng qua unit test, integration test và E2E test. Thứ tư, đồ án trình bày kết quả triển khai thực tế trong giai đoạn thử nghiệm tenant kèm các KPI (Key Performance Indicator — chỉ số hiệu suất chính) đo lường, đánh giá độ trưởng thành và đề xuất hướng phát triển tiếp theo. Kết quả của đồ án vừa là sản phẩm phần mềm hoạt động được, vừa là tài liệu tham chiếu cho các công trình nghiên cứu kế tiếp về EdTech multi-tenant tại Việt Nam.</w:t>
       </w:r>
     </w:p>
     <w:p>

</xml_diff>

<commit_message>
docs(thesis): persona giai đoạn thử nghiệm → Việt-first nhất quán
Mở đầu §3 + Kết luận: 'Solo Teacher (giáo viên độc lập)' / 'Center Owner' / 'Center Manager' English-first → Việt-first: 'giáo viên độc lập (Solo Teacher)', 'chủ sở hữu trung tâm (Center Owner)', 'quản lý trung tâm (Center Manager)', 'phụ huynh (Parent)', 'học viên (Student)'. 'ba persona chính'→'ba nhóm người dùng chính'; 'K-12 expansion'→'mở rộng K-12'. §1.2.5 align gloss (Owner→Center Owner). Hết nửa-Anh-nửa-Việt.
</commit_message>
<xml_diff>
--- a/documents/08-thesis/thesis-v1.docx
+++ b/documents/08-thesis/thesis-v1.docx
@@ -3503,7 +3503,7 @@
           <w:i w:val="0"/>
           <w:sz w:val="26"/>
         </w:rPr>
-        <w:t>Về đối tượng, đồ án phục vụ ba persona chính: Solo Teacher (giáo viên độc lập, 1-50 học viên), Center Owner (chủ sở hữu trung tâm, 1-10 chi nhánh, 100-2.000 học viên), và Center Manager (quản lý vận hành trung tâm). Persona Parent và Student thuộc phân khúc K-12 (Kindergarten to Grade 12 — bậc giáo dục phổ thông từ mẫu giáo đến lớp 12) được hoãn sang giai đoạn mở rộng K-12 do yêu cầu bổ sung DPO (Data Protection Officer — cán bộ bảo vệ dữ liệu) và DPIA (Data Protection Impact Assessment — đánh giá tác động bảo vệ dữ liệu) theo Điều 26 Luật Bảo vệ Dữ liệu Cá nhân 2023. Kiến trúc hệ thống cấu thành từ ba lớp dịch vụ. Lớp nền tảng KiteHub gồm sáu dịch vụ độc lập đảm nhận các trách nhiệm khác nhau: quản trị (kitehub-admin), nhận diện thương hiệu (kitehub-branding), thư điện tử (kitehub-email), điều phối yêu cầu (kitehub-gateway), thư viện dùng chung (kitehub-platform) và quản lý đăng ký (kitehub-subscription). Lớp nghiệp vụ tenant KiteClass tập trung tại dịch vụ kiteclass-core. Lớp giao diện gồm hai ứng dụng Next.js phục vụ tập người dùng khác nhau.</w:t>
+        <w:t>Về đối tượng, đồ án phục vụ ba nhóm người dùng chính: giáo viên độc lập (Solo Teacher, 1-50 học viên), chủ sở hữu trung tâm (Center Owner, 1-10 chi nhánh, 100-2.000 học viên), và quản lý trung tâm (Center Manager). Nhóm phụ huynh (Parent) và học viên (Student) thuộc phân khúc K-12 (Kindergarten to Grade 12 — bậc giáo dục phổ thông từ mẫu giáo đến lớp 12) được hoãn sang giai đoạn mở rộng K-12 do yêu cầu bổ sung DPO (Data Protection Officer — cán bộ bảo vệ dữ liệu) và DPIA (Data Protection Impact Assessment — đánh giá tác động bảo vệ dữ liệu) theo Điều 26 Luật Bảo vệ Dữ liệu Cá nhân 2023. Kiến trúc hệ thống cấu thành từ ba lớp dịch vụ. Lớp nền tảng KiteHub gồm sáu dịch vụ độc lập đảm nhận các trách nhiệm khác nhau: quản trị (kitehub-admin), nhận diện thương hiệu (kitehub-branding), thư điện tử (kitehub-email), điều phối yêu cầu (kitehub-gateway), thư viện dùng chung (kitehub-platform) và quản lý đăng ký (kitehub-subscription). Lớp nghiệp vụ tenant KiteClass tập trung tại dịch vụ kiteclass-core. Lớp giao diện gồm hai ứng dụng Next.js phục vụ tập người dùng khác nhau.</w:t>
       </w:r>
     </w:p>
     <w:p>
@@ -4411,7 +4411,7 @@
           <w:i/>
           <w:sz w:val="26"/>
         </w:rPr>
-        <w:t>Chủ sở hữu trung tâm (Owner):</w:t>
+        <w:t>Chủ sở hữu trung tâm (Center Owner):</w:t>
       </w:r>
       <w:r>
         <w:rPr>
@@ -4436,7 +4436,7 @@
           <w:i/>
           <w:sz w:val="26"/>
         </w:rPr>
-        <w:t>Quản lý trung tâm (Manager):</w:t>
+        <w:t>Quản lý trung tâm (Center Manager):</w:t>
       </w:r>
       <w:r>
         <w:rPr>
@@ -29062,7 +29062,7 @@
           <w:i w:val="0"/>
           <w:sz w:val="26"/>
         </w:rPr>
-        <w:t>Phạm vi giai đoạn thử nghiệm tenant chỉ phục vụ 3 persona tenant (Solo Teacher, Center Owner, Center Manager); persona K-12 Parent + Student được hoãn sang giai đoạn K-12 expansion do yêu cầu DPO + DPIA bổ sung theo PDPL.</w:t>
+        <w:t>Phạm vi giai đoạn thử nghiệm tenant chỉ phục vụ ba nhóm người dùng (giáo viên độc lập, chủ sở hữu trung tâm, quản lý trung tâm); nhóm phụ huynh và học viên thuộc phân khúc K-12 được hoãn sang giai đoạn mở rộng K-12 do yêu cầu DPO + DPIA bổ sung theo PDPL.</w:t>
       </w:r>
     </w:p>
     <w:p>

</xml_diff>

<commit_message>
docs(thesis): re-bake thesis-v1.docx with all ch1-4 polish integrated
80 pages (was 84), 534 paragraphs (was 537).
Page count reduction = drop §2.1.3 redundant Bảng 2.4 + tighter VN narrative.
</commit_message>
<xml_diff>
--- a/documents/08-thesis/thesis-v1.docx
+++ b/documents/08-thesis/thesis-v1.docx
@@ -905,7 +905,7 @@
     <w:p>
       <w:pPr>
         <w:sectPr>
-          <w:headerReference w:type="default" r:id="rId36"/>
+          <w:headerReference w:type="default" r:id="rId31"/>
           <w:pgSz w:w="11906" w:h="16838"/>
           <w:pgMar w:top="1417" w:right="1134" w:bottom="1417" w:left="1701" w:header="720" w:footer="720" w:gutter="283"/>
           <w:cols w:space="720"/>
@@ -1047,7 +1047,7 @@
     <w:p>
       <w:pPr>
         <w:sectPr>
-          <w:headerReference w:type="default" r:id="rId37"/>
+          <w:headerReference w:type="default" r:id="rId32"/>
           <w:pgSz w:w="11906" w:h="16838"/>
           <w:pgMar w:top="1417" w:right="1134" w:bottom="1417" w:left="1701" w:header="720" w:footer="720" w:gutter="283"/>
           <w:cols w:space="720"/>
@@ -3327,7 +3327,7 @@
     <w:p>
       <w:pPr>
         <w:sectPr>
-          <w:headerReference w:type="default" r:id="rId38"/>
+          <w:headerReference w:type="default" r:id="rId33"/>
           <w:pgSz w:w="11906" w:h="16838"/>
           <w:pgMar w:top="1417" w:right="1134" w:bottom="1417" w:left="1701" w:header="720" w:footer="720" w:gutter="283"/>
           <w:cols w:space="720"/>
@@ -3808,6 +3808,280 @@
     </w:p>
     <w:p>
       <w:pPr>
+        <w:pStyle w:val="Heading3"/>
+      </w:pPr>
+      <w:r>
+        <w:rPr>
+          <w:rFonts w:ascii="Times New Roman" w:hAnsi="Times New Roman" w:eastAsia="Times New Roman"/>
+          <w:b/>
+          <w:color w:val="000000"/>
+          <w:sz w:val="28"/>
+        </w:rPr>
+        <w:t>1.1.1 Bối cảnh thị trường và mô hình học hỗn hợp</w:t>
+      </w:r>
+    </w:p>
+    <w:p>
+      <w:pPr>
+        <w:spacing w:line="288" w:lineRule="auto"/>
+        <w:ind w:firstLine="567"/>
+        <w:jc w:val="both"/>
+      </w:pPr>
+      <w:r>
+        <w:rPr>
+          <w:rFonts w:ascii="Times New Roman" w:hAnsi="Times New Roman" w:eastAsia="Times New Roman"/>
+          <w:b w:val="0"/>
+          <w:i w:val="0"/>
+          <w:sz w:val="26"/>
+        </w:rPr>
+        <w:t>Trung tâm dạy thêm tại Việt Nam vận hành theo mô hình học hỗn hợp (B-learning, blended learning) — kết hợp lớp học sau giờ chính khóa và cuối tuần, phân biệt với trường công lập chính khóa. Thị trường mục tiêu của đồ án là các trung tâm vừa và nhỏ với 50-500 học sinh; phạm vi K-12 (giáo dục phổ thông từ mầm non đến lớp 12) trường công có lớp tuân thủ pháp lý riêng (cán bộ bảo vệ dữ liệu DPO, đánh giá tác động bảo vệ dữ liệu DPIA, kiểm tra an ninh) được lùi sang giai đoạn vận hành chính thức.</w:t>
+      </w:r>
+    </w:p>
+    <w:p>
+      <w:pPr>
+        <w:spacing w:line="288" w:lineRule="auto"/>
+        <w:ind w:firstLine="567"/>
+        <w:jc w:val="both"/>
+      </w:pPr>
+      <w:r>
+        <w:rPr>
+          <w:rFonts w:ascii="Times New Roman" w:hAnsi="Times New Roman" w:eastAsia="Times New Roman"/>
+          <w:b w:val="0"/>
+          <w:i w:val="0"/>
+          <w:sz w:val="26"/>
+        </w:rPr>
+        <w:t xml:space="preserve">Đặc điểm mô hình học hỗn hợp tại Việt Nam theo Báo cáo Kinh tế Số Việt Nam 2024 [4, tr.42]: </w:t>
+      </w:r>
+      <w:r>
+        <w:rPr>
+          <w:rFonts w:ascii="Times New Roman" w:hAnsi="Times New Roman" w:eastAsia="Times New Roman"/>
+          <w:b w:val="0"/>
+          <w:i/>
+          <w:sz w:val="26"/>
+        </w:rPr>
+        <w:t>"Hơn 90% phụ huynh đô thị sử dụng Zalo group chat làm kênh chính trao đổi với trung tâm; email phục vụ tài liệu chính thức như hóa đơn và báo cáo."</w:t>
+      </w:r>
+      <w:r>
+        <w:rPr>
+          <w:rFonts w:ascii="Times New Roman" w:hAnsi="Times New Roman" w:eastAsia="Times New Roman"/>
+          <w:b w:val="0"/>
+          <w:i w:val="0"/>
+          <w:sz w:val="26"/>
+        </w:rPr>
+        <w:t xml:space="preserve"> Buổi học buổi tối và cuối tuần chiếm ưu thế (thứ 2 đến thứ 7 từ 17:00 đến 21:00; thứ 7 và Chủ nhật từ 8:00 đến 17:00). Niên khóa tháng 9 đến tháng 5 (năm học </w:t>
+      </w:r>
+      <w:r>
+        <w:rPr>
+          <w:rFonts w:ascii="Times New Roman" w:hAnsi="Times New Roman" w:eastAsia="Times New Roman"/>
+          <w:b w:val="0"/>
+          <w:i/>
+          <w:sz w:val="26"/>
+        </w:rPr>
+        <w:t>2025-2026</w:t>
+      </w:r>
+      <w:r>
+        <w:rPr>
+          <w:rFonts w:ascii="Times New Roman" w:hAnsi="Times New Roman" w:eastAsia="Times New Roman"/>
+          <w:b w:val="0"/>
+          <w:i w:val="0"/>
+          <w:sz w:val="26"/>
+        </w:rPr>
+        <w:t xml:space="preserve"> ứng tháng 9/2025 đến tháng 5/2026) gồm học kỳ 1 (tháng 9 đến tháng 12), học kỳ 2 (tháng 1 đến tháng 5) và học kỳ hè (tháng 6 đến tháng 8). Mẹ là đầu mối liên lạc chính cho việc học của con (~60%), bố dự phòng (35%), ông bà (5%). Khung Tết Nguyên Đán nghỉ 7-10 ngày cuối tháng 1, đầu tháng 2 yêu cầu lịch chạy tự động tính phí bỏ qua. Giai đoạn thử nghiệm hỗ trợ email; tích hợp Zalo OA cho phụ huynh là lộ trình giai đoạn vận hành chính thức.</w:t>
+      </w:r>
+    </w:p>
+    <w:p>
+      <w:pPr>
+        <w:pStyle w:val="Heading3"/>
+      </w:pPr>
+      <w:r>
+        <w:rPr>
+          <w:rFonts w:ascii="Times New Roman" w:hAnsi="Times New Roman" w:eastAsia="Times New Roman"/>
+          <w:b/>
+          <w:color w:val="000000"/>
+          <w:sz w:val="28"/>
+        </w:rPr>
+        <w:t>1.1.2 Phân tích nhóm người dùng đại diện giai đoạn thử nghiệm</w:t>
+      </w:r>
+    </w:p>
+    <w:p>
+      <w:pPr>
+        <w:spacing w:line="288" w:lineRule="auto"/>
+        <w:ind w:firstLine="567"/>
+        <w:jc w:val="both"/>
+      </w:pPr>
+      <w:r>
+        <w:rPr>
+          <w:rFonts w:ascii="Times New Roman" w:hAnsi="Times New Roman" w:eastAsia="Times New Roman"/>
+          <w:b w:val="0"/>
+          <w:i w:val="0"/>
+          <w:sz w:val="26"/>
+        </w:rPr>
+        <w:t xml:space="preserve">Đồ án tập trung bốn nhóm người dùng đại diện. </w:t>
+      </w:r>
+      <w:r>
+        <w:rPr>
+          <w:rFonts w:ascii="Times New Roman" w:hAnsi="Times New Roman" w:eastAsia="Times New Roman"/>
+          <w:b/>
+          <w:i w:val="0"/>
+          <w:sz w:val="26"/>
+        </w:rPr>
+        <w:t>P1 — Giáo viên độc lập</w:t>
+      </w:r>
+      <w:r>
+        <w:rPr>
+          <w:rFonts w:ascii="Times New Roman" w:hAnsi="Times New Roman" w:eastAsia="Times New Roman"/>
+          <w:b w:val="0"/>
+          <w:i w:val="0"/>
+          <w:sz w:val="26"/>
+        </w:rPr>
+        <w:t xml:space="preserve"> (28 tuổi, 5-50 học sinh, dạy IELTS/Toán) thay thế sổ tay giấy, Excel và Zalo thủ công bằng nền tảng tập trung, gói </w:t>
+      </w:r>
+      <w:r>
+        <w:rPr>
+          <w:rFonts w:ascii="Times New Roman" w:hAnsi="Times New Roman" w:eastAsia="Times New Roman"/>
+          <w:b w:val="0"/>
+          <w:i/>
+          <w:sz w:val="26"/>
+        </w:rPr>
+        <w:t>FREE</w:t>
+      </w:r>
+      <w:r>
+        <w:rPr>
+          <w:rFonts w:ascii="Times New Roman" w:hAnsi="Times New Roman" w:eastAsia="Times New Roman"/>
+          <w:b w:val="0"/>
+          <w:i w:val="0"/>
+          <w:sz w:val="26"/>
+        </w:rPr>
+        <w:t xml:space="preserve"> đủ dùng. </w:t>
+      </w:r>
+      <w:r>
+        <w:rPr>
+          <w:rFonts w:ascii="Times New Roman" w:hAnsi="Times New Roman" w:eastAsia="Times New Roman"/>
+          <w:b/>
+          <w:i w:val="0"/>
+          <w:sz w:val="26"/>
+        </w:rPr>
+        <w:t>P2 — Chủ sở hữu trung tâm</w:t>
+      </w:r>
+      <w:r>
+        <w:rPr>
+          <w:rFonts w:ascii="Times New Roman" w:hAnsi="Times New Roman" w:eastAsia="Times New Roman"/>
+          <w:b w:val="0"/>
+          <w:i w:val="0"/>
+          <w:sz w:val="26"/>
+        </w:rPr>
+        <w:t xml:space="preserve"> (35 tuổi, 20-100 học sinh, 2-5 giáo viên) thay ba công cụ rời rạc bằng nền tảng tích hợp, gói </w:t>
+      </w:r>
+      <w:r>
+        <w:rPr>
+          <w:rFonts w:ascii="Times New Roman" w:hAnsi="Times New Roman" w:eastAsia="Times New Roman"/>
+          <w:b w:val="0"/>
+          <w:i/>
+          <w:sz w:val="26"/>
+        </w:rPr>
+        <w:t>STARTER</w:t>
+      </w:r>
+      <w:r>
+        <w:rPr>
+          <w:rFonts w:ascii="Times New Roman" w:hAnsi="Times New Roman" w:eastAsia="Times New Roman"/>
+          <w:b w:val="0"/>
+          <w:i w:val="0"/>
+          <w:sz w:val="26"/>
+        </w:rPr>
+        <w:t xml:space="preserve"> </w:t>
+      </w:r>
+      <w:r>
+        <w:rPr>
+          <w:rFonts w:ascii="Times New Roman" w:hAnsi="Times New Roman" w:eastAsia="Times New Roman"/>
+          <w:b w:val="0"/>
+          <w:i/>
+          <w:sz w:val="26"/>
+        </w:rPr>
+        <w:t>500.000đ/tháng</w:t>
+      </w:r>
+      <w:r>
+        <w:rPr>
+          <w:rFonts w:ascii="Times New Roman" w:hAnsi="Times New Roman" w:eastAsia="Times New Roman"/>
+          <w:b w:val="0"/>
+          <w:i w:val="0"/>
+          <w:sz w:val="26"/>
+        </w:rPr>
+        <w:t xml:space="preserve">. </w:t>
+      </w:r>
+      <w:r>
+        <w:rPr>
+          <w:rFonts w:ascii="Times New Roman" w:hAnsi="Times New Roman" w:eastAsia="Times New Roman"/>
+          <w:b/>
+          <w:i w:val="0"/>
+          <w:sz w:val="26"/>
+        </w:rPr>
+        <w:t>P3 — Quản lý trung tâm</w:t>
+      </w:r>
+      <w:r>
+        <w:rPr>
+          <w:rFonts w:ascii="Times New Roman" w:hAnsi="Times New Roman" w:eastAsia="Times New Roman"/>
+          <w:b w:val="0"/>
+          <w:i w:val="0"/>
+          <w:sz w:val="26"/>
+        </w:rPr>
+        <w:t xml:space="preserve"> (24 tuổi, 100-500 học sinh, 5-15 giáo viên) cần nhập hàng loạt từ tệp CSV khoảng 300 dòng, phân quyền theo vai trò (vai trò quản lý không thấy mục thanh toán), nhật ký kiểm toán đầy đủ, gói </w:t>
+      </w:r>
+      <w:r>
+        <w:rPr>
+          <w:rFonts w:ascii="Times New Roman" w:hAnsi="Times New Roman" w:eastAsia="Times New Roman"/>
+          <w:b w:val="0"/>
+          <w:i/>
+          <w:sz w:val="26"/>
+        </w:rPr>
+        <w:t>PRO</w:t>
+      </w:r>
+      <w:r>
+        <w:rPr>
+          <w:rFonts w:ascii="Times New Roman" w:hAnsi="Times New Roman" w:eastAsia="Times New Roman"/>
+          <w:b w:val="0"/>
+          <w:i w:val="0"/>
+          <w:sz w:val="26"/>
+        </w:rPr>
+        <w:t xml:space="preserve"> </w:t>
+      </w:r>
+      <w:r>
+        <w:rPr>
+          <w:rFonts w:ascii="Times New Roman" w:hAnsi="Times New Roman" w:eastAsia="Times New Roman"/>
+          <w:b w:val="0"/>
+          <w:i/>
+          <w:sz w:val="26"/>
+        </w:rPr>
+        <w:t>1.500.000đ/tháng</w:t>
+      </w:r>
+      <w:r>
+        <w:rPr>
+          <w:rFonts w:ascii="Times New Roman" w:hAnsi="Times New Roman" w:eastAsia="Times New Roman"/>
+          <w:b w:val="0"/>
+          <w:i w:val="0"/>
+          <w:sz w:val="26"/>
+        </w:rPr>
+        <w:t xml:space="preserve">. </w:t>
+      </w:r>
+      <w:r>
+        <w:rPr>
+          <w:rFonts w:ascii="Times New Roman" w:hAnsi="Times New Roman" w:eastAsia="Times New Roman"/>
+          <w:b/>
+          <w:i w:val="0"/>
+          <w:sz w:val="26"/>
+        </w:rPr>
+        <w:t>Phụ huynh và học sinh</w:t>
+      </w:r>
+      <w:r>
+        <w:rPr>
+          <w:rFonts w:ascii="Times New Roman" w:hAnsi="Times New Roman" w:eastAsia="Times New Roman"/>
+          <w:b w:val="0"/>
+          <w:i w:val="0"/>
+          <w:sz w:val="26"/>
+        </w:rPr>
+        <w:t xml:space="preserve"> — phụ huynh nhận thông báo email cho tài liệu chính thức trong giai đoạn thử nghiệm và nhóm Zalo cho cập nhật thường xuyên ở giai đoạn vận hành chính thức; học sinh truy cập qua thiết bị di động chiếm 85% phiên.</w:t>
+      </w:r>
+    </w:p>
+    <w:p>
+      <w:pPr>
         <w:pStyle w:val="Heading2"/>
       </w:pPr>
       <w:r>
@@ -3833,7 +4107,7 @@
           <w:i w:val="0"/>
           <w:sz w:val="26"/>
         </w:rPr>
-        <w:t>Để xác định cơ hội và định vị sản phẩm, đề tài tiến hành khảo sát hai khía cạnh bổ trợ: các sản phẩm phần mềm quản lý trung tâm hiện có trên thị trường, và nhu cầu thực tế từ các nhóm người dùng cuối. Phần điều tra đối thủ dưới đây phân tích bốn sản phẩm tiêu biểu trong phân khúc trung tâm giáo dục tư nhân — BeeClass, Mona eLMS, Easy Edu và DotB — theo các tiêu chí phân khúc mục tiêu, mức giá, kiến trúc, khả năng tích hợp AI và mức tuân thủ pháp luật Việt Nam.</w:t>
+        <w:t>Để xác định cơ hội và định vị sản phẩm, đề tài tiến hành khảo sát hai khía cạnh bổ trợ: các sản phẩm phần mềm quản lý trung tâm hiện có trên thị trường, và nhu cầu thực tế từ các nhóm người dùng cuối. Phần khảo sát các hệ thống tham khảo dưới đây phân tích bốn sản phẩm tiêu biểu trong phân khúc trung tâm giáo dục tư nhân — BeeClass, Mona eLMS, Easy Edu và DotB — theo các tiêu chí phân khúc mục tiêu, mức giá, kiến trúc, khả năng tích hợp AI và mức tuân thủ pháp luật Việt Nam.</w:t>
       </w:r>
     </w:p>
     <w:p>
@@ -3966,7 +4240,7 @@
           <w:i w:val="0"/>
           <w:sz w:val="26"/>
         </w:rPr>
-        <w:t>Thế mạnh chính của BeeClass là giao diện tiếng Việt thân thiện và hỗ trợ workflow đặc thù của trung tâm tiếng Anh (lịch lớp định kỳ theo tuần, đăng ký lớp thử miễn phí, theo dõi tiến độ học viên theo từng kỹ năng nghe-nói-đọc-viết). Mức giá tham khảo công bố nằm trong khoảng 1-3 triệu đồng/tháng tùy gói và số lượng học viên. Điểm yếu chính của BeeClass tương tự các sản phẩm trong phân khúc: kiến trúc single-tenant theo từng trung tâm (mỗi khách hàng có instance database riêng, khó mở rộng khi trung tâm mở chi nhánh thứ 5 trở lên); chưa có tính năng AI sinh tài nguyên branding; onboarding yêu cầu liên hệ bộ phận kinh doanh chứ chưa hoàn toàn tự phục vụ; mức giá tuy phải chăng hơn các sản phẩm enterprise nhưng vẫn cao hơn mức 500.000đ/tháng mà phân khúc trung tâm tự phát nhỏ kỳ vọng.</w:t>
+        <w:t>Thế mạnh chính của BeeClass là giao diện tiếng Việt thân thiện và hỗ trợ quy trình đặc thù của trung tâm tiếng Anh (lịch lớp định kỳ theo tuần, đăng ký lớp thử miễn phí, theo dõi tiến độ học viên theo từng kỹ năng nghe-nói-đọc-viết). Mức giá tham khảo công bố nằm trong khoảng 1-3 triệu đồng/tháng tùy gói và số lượng học viên. Điểm yếu chính của BeeClass tương tự các sản phẩm trong phân khúc: kiến trúc đơn tenant (single-tenant) — mỗi khách hàng có một thực thể cơ sở dữ liệu riêng, khó mở rộng khi trung tâm mở chi nhánh thứ năm trở lên; chưa có tính năng tự sinh tài nguyên thương hiệu bằng AI; quy trình khởi tạo yêu cầu liên hệ bộ phận kinh doanh chứ chưa hoàn toàn tự phục vụ; mức giá tuy phải chăng hơn các sản phẩm hướng doanh nghiệp nhưng vẫn cao hơn mức 500.000đ/tháng mà phân khúc trung tâm tự phát nhỏ kỳ vọng.</w:t>
       </w:r>
     </w:p>
     <w:p>
@@ -4232,7 +4506,7 @@
           <w:i w:val="0"/>
           <w:sz w:val="26"/>
         </w:rPr>
-        <w:t>Tập tính năng đầy đủ gồm quản lý học viên, lớp học, học phí, điểm danh, báo cáo, tích hợp Zalo OA, ứng dụng di động cho phụ huynh, với mức giá phải chăng từ 800.000 đồng/tháng cho gói cơ bản phục vụ 200 học viên. Điểm yếu chính: kiến trúc single-tenant theo từng trung tâm (khó mở rộng nhượng quyền), không có khả năng tự sinh tài nguyên branding bằng AI, onboarding yêu cầu liên hệ bộ phận kinh doanh chứ chưa tự phục vụ.</w:t>
+        <w:t>Tập tính năng đầy đủ gồm quản lý học viên, lớp học, học phí, điểm danh, báo cáo, tích hợp Zalo OA, ứng dụng di động cho phụ huynh, với mức giá phải chăng từ 800.000 đồng/tháng cho gói cơ bản phục vụ 200 học viên. Điểm yếu chính: kiến trúc đơn tenant theo từng trung tâm (khó mở rộng nhượng quyền), không có khả năng tự sinh tài nguyên thương hiệu bằng AI, quy trình khởi tạo yêu cầu liên hệ bộ phận kinh doanh chứ chưa tự phục vụ.</w:t>
       </w:r>
     </w:p>
     <w:p>
@@ -4395,7 +4669,7 @@
           <w:i w:val="0"/>
           <w:sz w:val="26"/>
         </w:rPr>
-        <w:t>Bên cạnh khảo sát các hệ thống đang có trên thị trường, đề tài tổng hợp nhu cầu sử dụng từ năm nhóm người dùng cuối (end-user) dựa trên các báo cáo ngành công khai. Phân tích này giúp xác định những tính năng cốt lõi cần ưu tiên trong giai đoạn đầu của hệ thống đề xuất.</w:t>
+        <w:t>Bên cạnh khảo sát các hệ thống đang có trên thị trường, đề tài tổng hợp nhu cầu sử dụng từ năm nhóm người dùng cuối dựa trên các báo cáo ngành công khai. Phân tích này giúp xác định những tính năng cốt lõi cần ưu tiên trong giai đoạn đầu của hệ thống đề xuất.</w:t>
       </w:r>
     </w:p>
     <w:p>
@@ -4536,7 +4810,7 @@
           <w:i w:val="0"/>
           <w:sz w:val="26"/>
         </w:rPr>
-        <w:t>Tổng hợp năm nhóm end-user cho thấy nhu cầu chung là một nền tảng đa-persona (multi-persona) với phân quyền rõ ràng theo vai trò, giá thấp phù hợp phân khúc nhỏ và vừa, tích hợp Zalo cho kênh giao tiếp với phụ huynh — tất cả các tiêu chí này đều được xem xét trong định hướng kiến trúc hệ thống đề xuất.</w:t>
+        <w:t>Tổng hợp năm nhóm người dùng cuối cho thấy nhu cầu chung là một nền tảng phục vụ nhiều nhóm vai trò khác nhau (đa nhóm người dùng đại diện) với phân quyền rõ ràng theo vai trò, giá thấp phù hợp phân khúc nhỏ và vừa, tích hợp Zalo cho kênh giao tiếp với phụ huynh — tất cả các tiêu chí này đều được xem xét trong định hướng kiến trúc hệ thống đề xuất.</w:t>
       </w:r>
     </w:p>
     <w:p>
@@ -6237,16 +6511,16 @@
           <w:i/>
           <w:sz w:val="26"/>
         </w:rPr>
-        <w:t>Thứ nhất, kiến trúc multi-tenant gốc:</w:t>
-      </w:r>
-      <w:r>
-        <w:rPr>
-          <w:rFonts w:ascii="Times New Roman" w:hAnsi="Times New Roman" w:eastAsia="Times New Roman"/>
-          <w:b w:val="0"/>
-          <w:i w:val="0"/>
-          <w:sz w:val="26"/>
-        </w:rPr>
-        <w:t xml:space="preserve"> cả năm hệ thống tham khảo đều dùng triển khai single-tenant với mỗi khách hàng tương ứng một instance cơ sở dữ liệu riêng. Khi trung tâm mở rộng lên năm chi nhánh trở lên, chủ sở hữu trung tâm phải cấp phát thêm instance, đồng bộ dữ liệu thủ công và sao chép cấu hình. Hệ thống đề xuất sử dụng kiến trúc multi-tenant gốc với cô lập ở mức cơ sở dữ liệu (schema-per-tenant), cho phép một trung tâm có 100 chi nhánh trên cùng một instance, tiết kiệm khoảng 80% chi phí hạ tầng khi mở rộng.</w:t>
+        <w:t>Thứ nhất, kiến trúc đa tenant nguyên bản:</w:t>
+      </w:r>
+      <w:r>
+        <w:rPr>
+          <w:rFonts w:ascii="Times New Roman" w:hAnsi="Times New Roman" w:eastAsia="Times New Roman"/>
+          <w:b w:val="0"/>
+          <w:i w:val="0"/>
+          <w:sz w:val="26"/>
+        </w:rPr>
+        <w:t xml:space="preserve"> cả năm hệ thống tham khảo đều triển khai theo mô hình đơn tenant — mỗi khách hàng tương ứng một thực thể cơ sở dữ liệu riêng. Khi trung tâm mở rộng lên năm chi nhánh trở lên, chủ sở hữu trung tâm phải cấp phát thêm thực thể, đồng bộ dữ liệu thủ công và sao chép cấu hình. Hệ thống đề xuất sử dụng kiến trúc đa tenant nguyên bản với cô lập ở mức cơ sở dữ liệu (mỗi tenant một schema riêng), cho phép một trung tâm có 100 chi nhánh trên cùng một thực thể, tiết kiệm khoảng 80% chi phí hạ tầng khi mở rộng.</w:t>
       </w:r>
     </w:p>
     <w:p>
@@ -6396,7 +6670,7 @@
           <w:i w:val="0"/>
           <w:sz w:val="26"/>
         </w:rPr>
-        <w:t xml:space="preserve"> phân khúc trung tâm nhỏ (1-3 chi nhánh, 100-500 học viên) chiếm khoảng 60% thị trường nhưng đa số hệ thống hiện hữu nhắm vào phân khúc trung và lớn — mô hình product-led growth (PLG) có thể bắt đầu từ phân khúc này và mở rộng lên cao hơn khi sản phẩm trưởng thành. Thời hạn PDPL 2026-07-01 yêu cầu hơn 50.000 trung tâm phải tuân thủ trong khoảng bảy tuần (đến cuối tháng 6/2026), tạo lợi thế cạnh tranh tại thời điểm vàng cho hệ thống đề xuất với tuân thủ built-in. Bên cạnh đó, mô hình nhượng quyền (Apollo English, ILA, Wall Street English) đang phát triển — kiến trúc multi-tenant phù hợp với lộ trình mở rộng nhượng quyền tốt hơn so với kiến trúc single-tenant.</w:t>
+        <w:t xml:space="preserve"> phân khúc trung tâm nhỏ (1-3 chi nhánh, 100-500 học viên) chiếm khoảng 60% thị trường nhưng đa số hệ thống hiện hữu nhắm vào phân khúc trung và lớn — mô hình tăng trưởng dẫn dắt bởi sản phẩm (PLG — Product-Led Growth) có thể bắt đầu từ phân khúc này và mở rộng lên cao hơn khi sản phẩm trưởng thành. Thời hạn PDPL ngày 01/07/2026 yêu cầu hơn 50.000 trung tâm phải tuân thủ trong khoảng bảy tuần (đến cuối tháng 6/2026), tạo lợi thế cạnh tranh tại thời điểm vàng cho hệ thống đề xuất với khả năng tuân thủ tích hợp sẵn. Bên cạnh đó, mô hình nhượng quyền (Apollo English, ILA, Wall Street English) đang phát triển — kiến trúc đa tenant phù hợp với lộ trình mở rộng nhượng quyền tốt hơn so với kiến trúc đơn tenant.</w:t>
       </w:r>
     </w:p>
     <w:p>
@@ -6421,7 +6695,7 @@
           <w:i w:val="0"/>
           <w:sz w:val="26"/>
         </w:rPr>
-        <w:t xml:space="preserve"> việc lùi ứng dụng di động native và tích hợp Zalo ZNS sang các phiên bản sau có rủi ro mất khách so với Mona eLMS và Easy Edu vốn đã có ứng dụng native — giải pháp giảm thiểu là web responsive kết hợp Zalo group chat trong phiên bản đầu, ưu tiên ứng dụng native ở phiên bản kế tiếp. Cổng thanh toán cũng là điểm yếu khi DotB có sẵn ba cổng tích hợp — phiên bản đầu của hệ thống đề xuất sử dụng chuyển khoản ngân hàng kết hợp VietQR (không cần cổng), phiên bản kế tiếp hợp tác với một cổng chính (VNPay). Cuối cùng, nhận diện thương hiệu là rào cản khi Easy Edu và Mona eLMS có nhiều năm hiện diện thị trường trong khi hệ thống đề xuất mới ra mắt — giải pháp giảm thiểu là tiếp cận PLG, marketing nội dung tiếng Việt và chương trình người dùng tiên phong với các trung tâm beta.</w:t>
+        <w:t xml:space="preserve"> việc lùi ứng dụng di động gốc và tích hợp Zalo ZNS sang các phiên bản sau có rủi ro mất khách so với Mona eLMS và Easy Edu vốn đã có ứng dụng gốc — giải pháp giảm thiểu là giao diện web đáp ứng kết hợp nhóm Zalo trong phiên bản đầu, ưu tiên ứng dụng gốc ở phiên bản kế tiếp. Cổng thanh toán cũng là điểm yếu khi DotB có sẵn ba cổng tích hợp — phiên bản đầu của hệ thống đề xuất sử dụng chuyển khoản ngân hàng kết hợp VietQR (không cần cổng), phiên bản kế tiếp hợp tác với một cổng chính (VNPay). Cuối cùng, nhận diện thương hiệu là rào cản khi Easy Edu và Mona eLMS có nhiều năm hiện diện thị trường trong khi hệ thống đề xuất mới ra mắt — giải pháp giảm thiểu là tiếp cận tăng trưởng dẫn dắt bởi sản phẩm, tiếp thị nội dung tiếng Việt và chương trình người dùng tiên phong với các trung tâm thử nghiệm.</w:t>
       </w:r>
     </w:p>
     <w:p>
@@ -6451,7 +6725,7 @@
           <w:i w:val="0"/>
           <w:sz w:val="26"/>
         </w:rPr>
-        <w:t>Đề tài chia thành các giai đoạn triển khai để cân bằng giữa độ phức tạp kỹ thuật, ngưỡng tuân thủ pháp lý và quy mô thị trường mục tiêu. Giai đoạn thử nghiệm tenant gồm vận hành thử với hai giáo viên độc lập (một dùng gói miễn phí, một dùng gói premium), tập trung kiểm chứng onboarding wizard, AI Branding, kiến trúc multi-tenant và compliance baseline; phạm vi triển khai trong giai đoạn này không thu phí và chấp nhận chính sách giảm thiểu chi phí hạ tầng. Giai đoạn thanh toán thử nghiệm mở rộng tenant cohort lên 30-50 trung tâm với chính sách thu phí giới thiệu thấp hơn giá niêm yết, mục đích chính là validation pricing model, onboarding flow chính thức và hệ thống thanh toán chuyển khoản kèm đối soát tự động; giai đoạn này tích hợp eInvoice qua partnership với nhà cung cấp được Tổng cục Thuế cấp phép. Giai đoạn vận hành chính thức mở cho mọi trung tâm tự đăng ký không qua quy trình mời, đi kèm SLA cam kết uptime ≥99,5% và bổ sung các kênh hỗ trợ (live chat, Zalo OA support), ứng dụng di động native cho học viên và phụ huynh, đa cổng thanh toán tích hợp. Giai đoạn K-12 expansion mở rộng sang phân khúc trường công lập và tư thục cấp 1-2 với yêu cầu bổ nhiệm DPO chính thức, DPIA cho dữ liệu trẻ em theo Luật Bảo vệ Dữ liệu Cá nhân Điều 17 và Điều 26, hợp tác với Bộ Giáo dục và Đào tạo cùng các sở/phòng giáo dục địa phương cho phân phối.</w:t>
+        <w:t>Đề tài chia thành các giai đoạn triển khai để cân bằng giữa độ phức tạp kỹ thuật, ngưỡng tuân thủ pháp lý và quy mô thị trường mục tiêu. Giai đoạn thử nghiệm tenant gồm vận hành thử với hai giáo viên độc lập (một dùng gói miễn phí, một dùng gói trả phí), tập trung kiểm chứng trình hướng dẫn khởi tạo tenant, mô-đun AI Branding, kiến trúc đa tenant và ngưỡng tuân thủ pháp lý cơ bản; phạm vi triển khai trong giai đoạn này không thu phí và chấp nhận chính sách giảm thiểu chi phí hạ tầng. Giai đoạn thanh toán thử nghiệm mở rộng nhóm tenant thử nghiệm lên 30-50 trung tâm với chính sách thu phí giới thiệu thấp hơn giá niêm yết, mục đích chính là kiểm chứng mô hình giá, luồng khởi tạo chính thức và hệ thống thanh toán chuyển khoản kèm đối soát tự động; giai đoạn này tích hợp hóa đơn điện tử (eInvoice) qua hợp tác với nhà cung cấp được Tổng cục Thuế cấp phép. Giai đoạn vận hành chính thức mở cho mọi trung tâm tự đăng ký không qua quy trình mời, đi kèm thỏa thuận mức dịch vụ (SLA — Service Level Agreement) cam kết thời gian hoạt động ≥99,5% và bổ sung các kênh hỗ trợ (trò chuyện trực tuyến, kênh hỗ trợ Zalo OA), ứng dụng di động gốc cho học viên và phụ huynh, đa cổng thanh toán tích hợp. Giai đoạn mở rộng sang khối phổ thông K-12 phục vụ trường công lập và tư thục cấp 1-2 với yêu cầu bổ nhiệm cán bộ bảo vệ dữ liệu (DPO — Data Protection Officer) chính thức, đánh giá tác động bảo vệ dữ liệu (DPIA — Data Protection Impact Assessment) cho dữ liệu trẻ em theo Luật Bảo vệ Dữ liệu Cá nhân Điều 17 và Điều 26, hợp tác với Bộ Giáo dục và Đào tạo cùng các sở phòng giáo dục địa phương cho phân phối.</w:t>
       </w:r>
     </w:p>
     <w:p>
@@ -6467,7 +6741,7 @@
           <w:i w:val="0"/>
           <w:sz w:val="26"/>
         </w:rPr>
-        <w:t>Phạm vi triển khai của đề tài chủ yếu tập trung vào giai đoạn thử nghiệm tenant readiness — bao gồm core onboarding wizard, AI Branding tự động, quản lý lifecycle tenant đầy đủ, và compliance pháp luật Việt Nam (PDPL, Cybersecurity, eInvoice baseline). Các giai đoạn thanh toán thử nghiệm, vận hành chính thức và K-12 expansion được trình bày làm roadmap kỹ thuật nhưng không nằm trong phạm vi triển khai thực tế của đề tài. Việc tách giai đoạn này phù hợp với phương pháp luận MVP (Minimum Viable Product) trong khởi nghiệp phần mềm — ship sản phẩm tối giản đáp ứng nhu cầu cốt lõi của persona ưu tiên trước, sau đó mở rộng dần các tính năng nâng cao theo phản hồi thị trường.</w:t>
+        <w:t>Phạm vi triển khai của đề tài chủ yếu tập trung vào giai đoạn thử nghiệm tenant — bao gồm trình hướng dẫn khởi tạo cốt lõi, mô-đun AI Branding tự động, quản lý vòng đời tenant đầy đủ và tuân thủ pháp luật Việt Nam (PDPL, Luật An ninh mạng, ngưỡng hóa đơn điện tử). Các giai đoạn thanh toán thử nghiệm, vận hành chính thức và mở rộng sang khối K-12 được trình bày như lộ trình kỹ thuật nhưng không nằm trong phạm vi triển khai thực tế của đề tài. Việc tách giai đoạn này phù hợp với phương pháp luận sản phẩm tối giản khả thi (MVP — Minimum Viable Product) trong khởi nghiệp phần mềm — phát hành sản phẩm tối giản đáp ứng nhu cầu cốt lõi của nhóm người dùng đại diện ưu tiên trước, sau đó mở rộng dần các tính năng nâng cao theo phản hồi thị trường.</w:t>
       </w:r>
     </w:p>
     <w:p>
@@ -7948,7 +8222,7 @@
           <w:i w:val="0"/>
           <w:sz w:val="26"/>
         </w:rPr>
-        <w:t xml:space="preserve"> Tác giả đặt mục tiêu hiệu năng cho giai đoạn thử nghiệm như sau:</w:t>
+        <w:t xml:space="preserve"> Mục tiêu hiệu năng cho giai đoạn thử nghiệm được đặt như sau:</w:t>
       </w:r>
     </w:p>
     <w:tbl>
@@ -9840,20 +10114,6 @@
     </w:p>
     <w:p>
       <w:pPr>
-        <w:pStyle w:val="Heading3"/>
-      </w:pPr>
-      <w:r>
-        <w:rPr>
-          <w:rFonts w:ascii="Times New Roman" w:hAnsi="Times New Roman" w:eastAsia="Times New Roman"/>
-          <w:b/>
-          <w:color w:val="000000"/>
-          <w:sz w:val="28"/>
-        </w:rPr>
-        <w:t>2.1.3 Bối cảnh thị trường mục tiêu</w:t>
-      </w:r>
-    </w:p>
-    <w:p>
-      <w:pPr>
         <w:spacing w:line="288" w:lineRule="auto"/>
         <w:ind w:firstLine="567"/>
         <w:jc w:val="both"/>
@@ -9865,262 +10125,16 @@
           <w:i w:val="0"/>
           <w:sz w:val="26"/>
         </w:rPr>
-        <w:t>Mô hình B-learning Việt Nam.</w:t>
-      </w:r>
-      <w:r>
-        <w:rPr>
-          <w:rFonts w:ascii="Times New Roman" w:hAnsi="Times New Roman" w:eastAsia="Times New Roman"/>
-          <w:b w:val="0"/>
-          <w:i w:val="0"/>
-          <w:sz w:val="26"/>
-        </w:rPr>
-        <w:t xml:space="preserve"> Trung tâm dạy thêm tại Việt Nam vận hành theo mô hình học thêm sau giờ chính khóa và cuối tuần — phân biệt với trường công lập chính khóa. Thị trường mục tiêu của đồ án là các trung tâm vừa và nhỏ với 50-500 học sinh; phạm vi K-12 trường công có lớp tuân thủ pháp lý riêng (DPO, DPIA, kiểm tra an ninh) được lùi sang giai đoạn vận hành chính thức.</w:t>
-      </w:r>
-    </w:p>
-    <w:p>
-      <w:pPr>
-        <w:spacing w:line="288" w:lineRule="auto"/>
-        <w:ind w:firstLine="567"/>
-        <w:jc w:val="both"/>
-      </w:pPr>
-      <w:r>
-        <w:rPr>
-          <w:rFonts w:ascii="Times New Roman" w:hAnsi="Times New Roman" w:eastAsia="Times New Roman"/>
-          <w:b w:val="0"/>
-          <w:i w:val="0"/>
-          <w:sz w:val="26"/>
-        </w:rPr>
-        <w:t xml:space="preserve">Đặc điểm B-learning tại Việt Nam theo Báo cáo Kinh tế Số Việt Nam 2024 [4, tr.42]: </w:t>
-      </w:r>
-      <w:r>
-        <w:rPr>
-          <w:rFonts w:ascii="Times New Roman" w:hAnsi="Times New Roman" w:eastAsia="Times New Roman"/>
-          <w:b w:val="0"/>
-          <w:i/>
-          <w:sz w:val="26"/>
-        </w:rPr>
-        <w:t>"Hơn 90% phụ huynh đô thị sử dụng Zalo group chat làm kênh chính trao đổi với trung tâm; email phục vụ tài liệu chính thức như hóa đơn và báo cáo."</w:t>
-      </w:r>
-      <w:r>
-        <w:rPr>
-          <w:rFonts w:ascii="Times New Roman" w:hAnsi="Times New Roman" w:eastAsia="Times New Roman"/>
-          <w:b w:val="0"/>
-          <w:i w:val="0"/>
-          <w:sz w:val="26"/>
-        </w:rPr>
-        <w:t xml:space="preserve"> Buổi học buổi tối và cuối tuần chiếm ưu thế (thứ 2-7 từ 17:00-21:00; thứ 7-CN 8:00-17:00) — bảng </w:t>
-      </w:r>
-      <w:r>
-        <w:rPr>
-          <w:rFonts w:ascii="Times New Roman" w:hAnsi="Times New Roman" w:eastAsia="Times New Roman"/>
-          <w:b w:val="0"/>
-          <w:i/>
-          <w:sz w:val="26"/>
-        </w:rPr>
-        <w:t>class_schedule_slots</w:t>
-      </w:r>
-      <w:r>
-        <w:rPr>
-          <w:rFonts w:ascii="Times New Roman" w:hAnsi="Times New Roman" w:eastAsia="Times New Roman"/>
-          <w:b w:val="0"/>
-          <w:i w:val="0"/>
-          <w:sz w:val="26"/>
-        </w:rPr>
-        <w:t xml:space="preserve"> mặc định cấu hình 6 ngày/tuần. Niên khóa 9-5 (năm học </w:t>
-      </w:r>
-      <w:r>
-        <w:rPr>
-          <w:rFonts w:ascii="Times New Roman" w:hAnsi="Times New Roman" w:eastAsia="Times New Roman"/>
-          <w:b w:val="0"/>
-          <w:i/>
-          <w:sz w:val="26"/>
-        </w:rPr>
-        <w:t>2025-2026</w:t>
-      </w:r>
-      <w:r>
-        <w:rPr>
-          <w:rFonts w:ascii="Times New Roman" w:hAnsi="Times New Roman" w:eastAsia="Times New Roman"/>
-          <w:b w:val="0"/>
-          <w:i w:val="0"/>
-          <w:sz w:val="26"/>
-        </w:rPr>
-        <w:t xml:space="preserve"> ứng tháng 9/2025 đến tháng 5/2026) gồm HK1 (9-12), HK2 (1-5), HK_Hè (6-8). Mẹ là đầu mối liên lạc chính cho việc học của con (~60%), bố dự phòng (35%), ông bà (5%). Khung Tết Nguyên Đán nghỉ 7-10 ngày cuối tháng 1 — đầu tháng 2 yêu cầu cron tính phí bỏ qua. Giai đoạn thử nghiệm hỗ trợ email; tích hợp Zalo OA cho phụ huynh là lộ trình giai đoạn vận hành chính thức.</w:t>
-      </w:r>
-    </w:p>
-    <w:p>
-      <w:pPr>
-        <w:spacing w:line="288" w:lineRule="auto"/>
-        <w:ind w:firstLine="567"/>
-        <w:jc w:val="both"/>
-      </w:pPr>
-      <w:r>
-        <w:rPr>
-          <w:rFonts w:ascii="Times New Roman" w:hAnsi="Times New Roman" w:eastAsia="Times New Roman"/>
-          <w:b/>
-          <w:i w:val="0"/>
-          <w:sz w:val="26"/>
-        </w:rPr>
-        <w:t>Phân tích persona giai đoạn thử nghiệm.</w:t>
-      </w:r>
-      <w:r>
-        <w:rPr>
-          <w:rFonts w:ascii="Times New Roman" w:hAnsi="Times New Roman" w:eastAsia="Times New Roman"/>
-          <w:b w:val="0"/>
-          <w:i w:val="0"/>
-          <w:sz w:val="26"/>
-        </w:rPr>
-        <w:t xml:space="preserve"> Đồ án tập trung 4 persona chính. </w:t>
-      </w:r>
-      <w:r>
-        <w:rPr>
-          <w:rFonts w:ascii="Times New Roman" w:hAnsi="Times New Roman" w:eastAsia="Times New Roman"/>
-          <w:b/>
-          <w:i w:val="0"/>
-          <w:sz w:val="26"/>
-        </w:rPr>
-        <w:t>P1 Giáo viên độc lập</w:t>
-      </w:r>
-      <w:r>
-        <w:rPr>
-          <w:rFonts w:ascii="Times New Roman" w:hAnsi="Times New Roman" w:eastAsia="Times New Roman"/>
-          <w:b w:val="0"/>
-          <w:i w:val="0"/>
-          <w:sz w:val="26"/>
-        </w:rPr>
-        <w:t xml:space="preserve"> (28 tuổi, 5-50 học sinh, dạy IELTS/Toán) — thay thế sổ tay giấy + Excel + Zalo thủ công, gói FREE đủ dùng. </w:t>
-      </w:r>
-      <w:r>
-        <w:rPr>
-          <w:rFonts w:ascii="Times New Roman" w:hAnsi="Times New Roman" w:eastAsia="Times New Roman"/>
-          <w:b/>
-          <w:i w:val="0"/>
-          <w:sz w:val="26"/>
-        </w:rPr>
-        <w:t>P2 Chủ sở hữu trung tâm</w:t>
-      </w:r>
-      <w:r>
-        <w:rPr>
-          <w:rFonts w:ascii="Times New Roman" w:hAnsi="Times New Roman" w:eastAsia="Times New Roman"/>
-          <w:b w:val="0"/>
-          <w:i w:val="0"/>
-          <w:sz w:val="26"/>
-        </w:rPr>
-        <w:t xml:space="preserve"> (35 tuổi, 20-100 học sinh, 2-5 giáo viên) — thay 3 công cụ rời rạc bằng platform tích hợp, gói STARTER </w:t>
-      </w:r>
-      <w:r>
-        <w:rPr>
-          <w:rFonts w:ascii="Times New Roman" w:hAnsi="Times New Roman" w:eastAsia="Times New Roman"/>
-          <w:b w:val="0"/>
-          <w:i/>
-          <w:sz w:val="26"/>
-        </w:rPr>
-        <w:t>500.000đ/tháng</w:t>
-      </w:r>
-      <w:r>
-        <w:rPr>
-          <w:rFonts w:ascii="Times New Roman" w:hAnsi="Times New Roman" w:eastAsia="Times New Roman"/>
-          <w:b w:val="0"/>
-          <w:i w:val="0"/>
-          <w:sz w:val="26"/>
-        </w:rPr>
-        <w:t xml:space="preserve">. </w:t>
-      </w:r>
-      <w:r>
-        <w:rPr>
-          <w:rFonts w:ascii="Times New Roman" w:hAnsi="Times New Roman" w:eastAsia="Times New Roman"/>
-          <w:b/>
-          <w:i w:val="0"/>
-          <w:sz w:val="26"/>
-        </w:rPr>
-        <w:t>P3 Quản lý trung tâm</w:t>
-      </w:r>
-      <w:r>
-        <w:rPr>
-          <w:rFonts w:ascii="Times New Roman" w:hAnsi="Times New Roman" w:eastAsia="Times New Roman"/>
-          <w:b w:val="0"/>
-          <w:i w:val="0"/>
-          <w:sz w:val="26"/>
-        </w:rPr>
-        <w:t xml:space="preserve"> (24 tuổi, 100-500 học sinh, 5-15 giáo viên) — cần bulk import CSV ~300 dòng, phân quyền theo vai trò (manager không thấy mục thanh toán), audit log, gói PRO </w:t>
-      </w:r>
-      <w:r>
-        <w:rPr>
-          <w:rFonts w:ascii="Times New Roman" w:hAnsi="Times New Roman" w:eastAsia="Times New Roman"/>
-          <w:b w:val="0"/>
-          <w:i/>
-          <w:sz w:val="26"/>
-        </w:rPr>
-        <w:t>1.500.000đ/tháng</w:t>
-      </w:r>
-      <w:r>
-        <w:rPr>
-          <w:rFonts w:ascii="Times New Roman" w:hAnsi="Times New Roman" w:eastAsia="Times New Roman"/>
-          <w:b w:val="0"/>
-          <w:i w:val="0"/>
-          <w:sz w:val="26"/>
-        </w:rPr>
-        <w:t xml:space="preserve">. </w:t>
-      </w:r>
-      <w:r>
-        <w:rPr>
-          <w:rFonts w:ascii="Times New Roman" w:hAnsi="Times New Roman" w:eastAsia="Times New Roman"/>
-          <w:b/>
-          <w:i w:val="0"/>
-          <w:sz w:val="26"/>
-        </w:rPr>
-        <w:t>Phụ huynh và học sinh</w:t>
-      </w:r>
-      <w:r>
-        <w:rPr>
-          <w:rFonts w:ascii="Times New Roman" w:hAnsi="Times New Roman" w:eastAsia="Times New Roman"/>
-          <w:b w:val="0"/>
-          <w:i w:val="0"/>
-          <w:sz w:val="26"/>
-        </w:rPr>
-        <w:t xml:space="preserve"> — phụ huynh nhận thông báo email cho tài liệu chính thức (giai đoạn thử nghiệm) + Zalo group cho cập nhật thường xuyên (giai đoạn vận hành chính thức); học sinh truy cập mobile chiếm 85% phiên.</w:t>
-      </w:r>
-    </w:p>
-    <w:p>
-      <w:pPr>
-        <w:spacing w:line="288" w:lineRule="auto"/>
-        <w:ind w:firstLine="567"/>
-        <w:jc w:val="both"/>
-      </w:pPr>
-      <w:r>
-        <w:rPr>
-          <w:rFonts w:ascii="Times New Roman" w:hAnsi="Times New Roman" w:eastAsia="Times New Roman"/>
-          <w:b/>
-          <w:i w:val="0"/>
-          <w:sz w:val="26"/>
-        </w:rPr>
-        <w:t>Đặc trưng thị trường giáo dục Việt Nam.</w:t>
-      </w:r>
-      <w:r>
-        <w:rPr>
-          <w:rFonts w:ascii="Times New Roman" w:hAnsi="Times New Roman" w:eastAsia="Times New Roman"/>
-          <w:b w:val="0"/>
-          <w:i w:val="0"/>
-          <w:sz w:val="26"/>
-        </w:rPr>
-        <w:t xml:space="preserve"> Bảng 2.3 tổng hợp đặc trưng thị trường ảnh hưởng tới quyết định kiến trúc — locale mặc định </w:t>
-      </w:r>
-      <w:r>
-        <w:rPr>
-          <w:rFonts w:ascii="Times New Roman" w:hAnsi="Times New Roman" w:eastAsia="Times New Roman"/>
-          <w:b w:val="0"/>
-          <w:i/>
-          <w:sz w:val="26"/>
-        </w:rPr>
-        <w:t>vi-VN</w:t>
-      </w:r>
-      <w:r>
-        <w:rPr>
-          <w:rFonts w:ascii="Times New Roman" w:hAnsi="Times New Roman" w:eastAsia="Times New Roman"/>
-          <w:b w:val="0"/>
-          <w:i w:val="0"/>
-          <w:sz w:val="26"/>
-        </w:rPr>
-        <w:t>, ma trận xưng hô email phù hợp vai trò ("Em chào chị Hằng" trang trọng cho Owner, "Chào em" thân mật cho giáo viên độc lập).</w:t>
+        <w:t>Đặc trưng thị trường Việt Nam và hệ quả NFR.</w:t>
+      </w:r>
+      <w:r>
+        <w:rPr>
+          <w:rFonts w:ascii="Times New Roman" w:hAnsi="Times New Roman" w:eastAsia="Times New Roman"/>
+          <w:b w:val="0"/>
+          <w:i w:val="0"/>
+          <w:sz w:val="26"/>
+        </w:rPr>
+        <w:t xml:space="preserve"> Bối cảnh người dùng được trình bày tại Chương 1 §1.1 trực tiếp ảnh hưởng tới NFR thuộc nhóm Compatibility (i18n locale, định dạng tiền tệ, ngày tháng), Usability (xưng hô email phù hợp vai trò, kênh giao tiếp Zalo cho phụ huynh) và Reliability (khung lịch tải đỉnh buổi tối, cron tính phí bỏ qua khung Tết). Bảng 2.3 ánh xạ các đặc trưng này sang yêu cầu thiết kế cụ thể.</w:t>
       </w:r>
     </w:p>
     <w:p>
@@ -10142,7 +10156,7 @@
           <w:rFonts w:ascii="Times New Roman" w:hAnsi="Times New Roman" w:eastAsia="Times New Roman"/>
           <w:sz w:val="26"/>
         </w:rPr>
-        <w:t>. Đặc trưng thị trường giáo dục Việt Nam và hệ quả thiết kế</w:t>
+        <w:t>. Đặc trưng thị trường Việt Nam và hệ quả NFR thiết kế</w:t>
       </w:r>
     </w:p>
     <w:tbl>
@@ -10229,7 +10243,7 @@
                 <w:i w:val="0"/>
                 <w:sz w:val="24"/>
               </w:rPr>
-              <w:t>Hệ quả thiết kế</w:t>
+              <w:t>Hệ quả NFR</w:t>
             </w:r>
           </w:p>
         </w:tc>
@@ -10312,7 +10326,7 @@
                 <w:i w:val="0"/>
                 <w:sz w:val="24"/>
               </w:rPr>
-              <w:t>Format VND bắt buộc trên mọi giao diện, hóa đơn, dashboard</w:t>
+              <w:t>Compatibility: format VND bắt buộc trên mọi giao diện, hóa đơn, dashboard</w:t>
             </w:r>
           </w:p>
         </w:tc>
@@ -10404,7 +10418,7 @@
                 <w:i w:val="0"/>
                 <w:sz w:val="24"/>
               </w:rPr>
-              <w:t xml:space="preserve">i18n qua </w:t>
+              <w:t xml:space="preserve">Compatibility: i18n qua </w:t>
             </w:r>
             <w:r>
               <w:rPr>
@@ -10487,7 +10501,7 @@
                 <w:i w:val="0"/>
                 <w:sz w:val="24"/>
               </w:rPr>
-              <w:t xml:space="preserve">Bảng </w:t>
+              <w:t xml:space="preserve">Usability: bảng </w:t>
             </w:r>
             <w:r>
               <w:rPr>
@@ -10570,7 +10584,7 @@
                 <w:i w:val="0"/>
                 <w:sz w:val="24"/>
               </w:rPr>
-              <w:t>Giai đoạn thử nghiệm VietQR; mở rộng VNPay/MoMo giai đoạn vận hành chính thức</w:t>
+              <w:t>Functional Suitability: giai đoạn thử nghiệm VietQR; mở rộng VNPay/MoMo giai đoạn vận hành chính thức</w:t>
             </w:r>
           </w:p>
         </w:tc>
@@ -10680,7 +10694,7 @@
                 <w:i w:val="0"/>
                 <w:sz w:val="24"/>
               </w:rPr>
-              <w:t>Phân loại vai trò theo quy ước Việt Nam</w:t>
+              <w:t>Usability: phân loại vai trò theo quy ước Việt Nam</w:t>
             </w:r>
           </w:p>
         </w:tc>
@@ -10745,7 +10759,7 @@
                 <w:i w:val="0"/>
                 <w:sz w:val="24"/>
               </w:rPr>
-              <w:t>Schedule slot mặc định 6 ngày, đỉnh tải buổi tối</w:t>
+              <w:t>Performance: lịch slot mặc định 6 ngày, đỉnh tải buổi tối</w:t>
             </w:r>
           </w:p>
         </w:tc>
@@ -10810,7 +10824,7 @@
                 <w:i w:val="0"/>
                 <w:sz w:val="24"/>
               </w:rPr>
-              <w:t>Tích hợp Zalo OA cho phụ huynh là yêu cầu giai đoạn vận hành chính thức</w:t>
+              <w:t>Usability: tích hợp Zalo OA cho phụ huynh là yêu cầu giai đoạn vận hành chính thức</w:t>
             </w:r>
           </w:p>
         </w:tc>
@@ -10875,683 +10889,13 @@
                 <w:i w:val="0"/>
                 <w:sz w:val="24"/>
               </w:rPr>
-              <w:t>Cron tính phí + lịch lớp bỏ qua khung Tết</w:t>
+              <w:t>Reliability: cron tính phí + lịch lớp bỏ qua khung Tết</w:t>
             </w:r>
           </w:p>
         </w:tc>
       </w:tr>
     </w:tbl>
     <w:p/>
-    <w:p>
-      <w:pPr>
-        <w:spacing w:line="288" w:lineRule="auto"/>
-        <w:ind w:firstLine="567"/>
-        <w:jc w:val="both"/>
-      </w:pPr>
-      <w:r>
-        <w:rPr>
-          <w:rFonts w:ascii="Times New Roman" w:hAnsi="Times New Roman" w:eastAsia="Times New Roman"/>
-          <w:b/>
-          <w:i w:val="0"/>
-          <w:sz w:val="26"/>
-        </w:rPr>
-        <w:t>Định vị cạnh tranh.</w:t>
-      </w:r>
-      <w:r>
-        <w:rPr>
-          <w:rFonts w:ascii="Times New Roman" w:hAnsi="Times New Roman" w:eastAsia="Times New Roman"/>
-          <w:b w:val="0"/>
-          <w:i w:val="0"/>
-          <w:sz w:val="26"/>
-        </w:rPr>
-        <w:t xml:space="preserve"> Tham khảo phân tích Chương 1, Kite Platform đối sánh với hệ thống tương tự trong nhóm SaaS giáo dục Việt Nam (Bảng 2.4).</w:t>
-      </w:r>
-    </w:p>
-    <w:p>
-      <w:pPr>
-        <w:pStyle w:val="BảngCaption"/>
-        <w:spacing w:before="120" w:after="240"/>
-        <w:jc w:val="center"/>
-      </w:pPr>
-      <w:r>
-        <w:rPr>
-          <w:rFonts w:ascii="Times New Roman" w:hAnsi="Times New Roman" w:eastAsia="Times New Roman"/>
-          <w:b/>
-          <w:sz w:val="26"/>
-        </w:rPr>
-        <w:t>Bảng 2.4</w:t>
-      </w:r>
-      <w:r>
-        <w:rPr>
-          <w:rFonts w:ascii="Times New Roman" w:hAnsi="Times New Roman" w:eastAsia="Times New Roman"/>
-          <w:sz w:val="26"/>
-        </w:rPr>
-        <w:t>. So sánh với hệ thống tương tự trong nhóm SaaS giáo dục Việt Nam</w:t>
-      </w:r>
-    </w:p>
-    <w:tbl>
-      <w:tblPr>
-        <w:tblStyle w:val="TableGrid"/>
-        <w:tblW w:type="auto" w:w="0"/>
-        <w:jc w:val="center"/>
-        <w:tblLook w:firstColumn="1" w:firstRow="1" w:lastColumn="0" w:lastRow="0" w:noHBand="0" w:noVBand="1" w:val="04A0"/>
-      </w:tblPr>
-      <w:tblGrid>
-        <w:gridCol w:w="1728"/>
-        <w:gridCol w:w="1728"/>
-        <w:gridCol w:w="1728"/>
-        <w:gridCol w:w="1728"/>
-        <w:gridCol w:w="1728"/>
-      </w:tblGrid>
-      <w:tr>
-        <w:tc>
-          <w:tcPr>
-            <w:tcW w:type="dxa" w:w="1728"/>
-          </w:tcPr>
-          <w:p>
-            <w:pPr>
-              <w:jc w:val="center"/>
-            </w:pPr>
-            <w:r>
-              <w:rPr>
-                <w:b/>
-                <w:sz w:val="24"/>
-              </w:rPr>
-            </w:r>
-            <w:r>
-              <w:rPr>
-                <w:rFonts w:ascii="Times New Roman" w:hAnsi="Times New Roman" w:eastAsia="Times New Roman"/>
-                <w:b/>
-                <w:i w:val="0"/>
-                <w:sz w:val="24"/>
-              </w:rPr>
-              <w:t>Hệ thống tham khảo</w:t>
-            </w:r>
-          </w:p>
-        </w:tc>
-        <w:tc>
-          <w:tcPr>
-            <w:tcW w:type="dxa" w:w="1728"/>
-          </w:tcPr>
-          <w:p>
-            <w:pPr>
-              <w:jc w:val="center"/>
-            </w:pPr>
-            <w:r>
-              <w:rPr>
-                <w:b/>
-                <w:sz w:val="24"/>
-              </w:rPr>
-            </w:r>
-            <w:r>
-              <w:rPr>
-                <w:rFonts w:ascii="Times New Roman" w:hAnsi="Times New Roman" w:eastAsia="Times New Roman"/>
-                <w:b/>
-                <w:i w:val="0"/>
-                <w:sz w:val="24"/>
-              </w:rPr>
-              <w:t>Đối tượng chính</w:t>
-            </w:r>
-          </w:p>
-        </w:tc>
-        <w:tc>
-          <w:tcPr>
-            <w:tcW w:type="dxa" w:w="1728"/>
-          </w:tcPr>
-          <w:p>
-            <w:pPr>
-              <w:jc w:val="center"/>
-            </w:pPr>
-            <w:r>
-              <w:rPr>
-                <w:b/>
-                <w:sz w:val="24"/>
-              </w:rPr>
-            </w:r>
-            <w:r>
-              <w:rPr>
-                <w:rFonts w:ascii="Times New Roman" w:hAnsi="Times New Roman" w:eastAsia="Times New Roman"/>
-                <w:b/>
-                <w:i w:val="0"/>
-                <w:sz w:val="24"/>
-              </w:rPr>
-              <w:t>Mức phí</w:t>
-            </w:r>
-          </w:p>
-        </w:tc>
-        <w:tc>
-          <w:tcPr>
-            <w:tcW w:type="dxa" w:w="1728"/>
-          </w:tcPr>
-          <w:p>
-            <w:pPr>
-              <w:jc w:val="center"/>
-            </w:pPr>
-            <w:r>
-              <w:rPr>
-                <w:b/>
-                <w:sz w:val="24"/>
-              </w:rPr>
-            </w:r>
-            <w:r>
-              <w:rPr>
-                <w:rFonts w:ascii="Times New Roman" w:hAnsi="Times New Roman" w:eastAsia="Times New Roman"/>
-                <w:b/>
-                <w:i w:val="0"/>
-                <w:sz w:val="24"/>
-              </w:rPr>
-              <w:t>Điểm mạnh</w:t>
-            </w:r>
-          </w:p>
-        </w:tc>
-        <w:tc>
-          <w:tcPr>
-            <w:tcW w:type="dxa" w:w="1728"/>
-          </w:tcPr>
-          <w:p>
-            <w:pPr>
-              <w:jc w:val="center"/>
-            </w:pPr>
-            <w:r>
-              <w:rPr>
-                <w:b/>
-                <w:sz w:val="24"/>
-              </w:rPr>
-            </w:r>
-            <w:r>
-              <w:rPr>
-                <w:rFonts w:ascii="Times New Roman" w:hAnsi="Times New Roman" w:eastAsia="Times New Roman"/>
-                <w:b/>
-                <w:i w:val="0"/>
-                <w:sz w:val="24"/>
-              </w:rPr>
-              <w:t>Hướng tiếp cận của đồ án</w:t>
-            </w:r>
-          </w:p>
-        </w:tc>
-      </w:tr>
-      <w:tr>
-        <w:tc>
-          <w:tcPr>
-            <w:tcW w:type="dxa" w:w="1728"/>
-          </w:tcPr>
-          <w:p>
-            <w:r>
-              <w:rPr>
-                <w:sz w:val="24"/>
-              </w:rPr>
-            </w:r>
-            <w:r>
-              <w:rPr>
-                <w:rFonts w:ascii="Times New Roman" w:hAnsi="Times New Roman" w:eastAsia="Times New Roman"/>
-                <w:b w:val="0"/>
-                <w:i w:val="0"/>
-                <w:sz w:val="24"/>
-              </w:rPr>
-              <w:t>MISA EMIS</w:t>
-            </w:r>
-          </w:p>
-        </w:tc>
-        <w:tc>
-          <w:tcPr>
-            <w:tcW w:type="dxa" w:w="1728"/>
-          </w:tcPr>
-          <w:p>
-            <w:r>
-              <w:rPr>
-                <w:sz w:val="24"/>
-              </w:rPr>
-            </w:r>
-            <w:r>
-              <w:rPr>
-                <w:rFonts w:ascii="Times New Roman" w:hAnsi="Times New Roman" w:eastAsia="Times New Roman"/>
-                <w:b w:val="0"/>
-                <w:i w:val="0"/>
-                <w:sz w:val="24"/>
-              </w:rPr>
-              <w:t>Trường công + tư K-12</w:t>
-            </w:r>
-          </w:p>
-        </w:tc>
-        <w:tc>
-          <w:tcPr>
-            <w:tcW w:type="dxa" w:w="1728"/>
-          </w:tcPr>
-          <w:p>
-            <w:r>
-              <w:rPr>
-                <w:sz w:val="24"/>
-              </w:rPr>
-            </w:r>
-            <w:r>
-              <w:rPr>
-                <w:rFonts w:ascii="Times New Roman" w:hAnsi="Times New Roman" w:eastAsia="Times New Roman"/>
-                <w:b w:val="0"/>
-                <w:i w:val="0"/>
-                <w:sz w:val="24"/>
-              </w:rPr>
-              <w:t>Báo giá doanh nghiệp</w:t>
-            </w:r>
-          </w:p>
-        </w:tc>
-        <w:tc>
-          <w:tcPr>
-            <w:tcW w:type="dxa" w:w="1728"/>
-          </w:tcPr>
-          <w:p>
-            <w:r>
-              <w:rPr>
-                <w:sz w:val="24"/>
-              </w:rPr>
-            </w:r>
-            <w:r>
-              <w:rPr>
-                <w:rFonts w:ascii="Times New Roman" w:hAnsi="Times New Roman" w:eastAsia="Times New Roman"/>
-                <w:b w:val="0"/>
-                <w:i w:val="0"/>
-                <w:sz w:val="24"/>
-              </w:rPr>
-              <w:t>Tích hợp Bộ Giáo dục</w:t>
-            </w:r>
-          </w:p>
-        </w:tc>
-        <w:tc>
-          <w:tcPr>
-            <w:tcW w:type="dxa" w:w="1728"/>
-          </w:tcPr>
-          <w:p>
-            <w:r>
-              <w:rPr>
-                <w:sz w:val="24"/>
-              </w:rPr>
-            </w:r>
-            <w:r>
-              <w:rPr>
-                <w:rFonts w:ascii="Times New Roman" w:hAnsi="Times New Roman" w:eastAsia="Times New Roman"/>
-                <w:b w:val="0"/>
-                <w:i w:val="0"/>
-                <w:sz w:val="24"/>
-              </w:rPr>
-              <w:t>Tập trung trung tâm dạy thêm SMB, không cạnh tranh K-12 ở giai đoạn thử nghiệm</w:t>
-            </w:r>
-          </w:p>
-        </w:tc>
-      </w:tr>
-      <w:tr>
-        <w:tc>
-          <w:tcPr>
-            <w:tcW w:type="dxa" w:w="1728"/>
-          </w:tcPr>
-          <w:p>
-            <w:r>
-              <w:rPr>
-                <w:sz w:val="24"/>
-              </w:rPr>
-            </w:r>
-            <w:r>
-              <w:rPr>
-                <w:rFonts w:ascii="Times New Roman" w:hAnsi="Times New Roman" w:eastAsia="Times New Roman"/>
-                <w:b w:val="0"/>
-                <w:i w:val="0"/>
-                <w:sz w:val="24"/>
-              </w:rPr>
-              <w:t>Mona Media</w:t>
-            </w:r>
-          </w:p>
-        </w:tc>
-        <w:tc>
-          <w:tcPr>
-            <w:tcW w:type="dxa" w:w="1728"/>
-          </w:tcPr>
-          <w:p>
-            <w:r>
-              <w:rPr>
-                <w:sz w:val="24"/>
-              </w:rPr>
-            </w:r>
-            <w:r>
-              <w:rPr>
-                <w:rFonts w:ascii="Times New Roman" w:hAnsi="Times New Roman" w:eastAsia="Times New Roman"/>
-                <w:b w:val="0"/>
-                <w:i w:val="0"/>
-                <w:sz w:val="24"/>
-              </w:rPr>
-              <w:t>Chuỗi trung tâm Anh ngữ</w:t>
-            </w:r>
-          </w:p>
-        </w:tc>
-        <w:tc>
-          <w:tcPr>
-            <w:tcW w:type="dxa" w:w="1728"/>
-          </w:tcPr>
-          <w:p>
-            <w:r>
-              <w:rPr>
-                <w:sz w:val="24"/>
-              </w:rPr>
-            </w:r>
-            <w:r>
-              <w:rPr>
-                <w:rFonts w:ascii="Times New Roman" w:hAnsi="Times New Roman" w:eastAsia="Times New Roman"/>
-                <w:b w:val="0"/>
-                <w:i/>
-                <w:sz w:val="24"/>
-              </w:rPr>
-              <w:t>2-5 triệu/tháng</w:t>
-            </w:r>
-          </w:p>
-        </w:tc>
-        <w:tc>
-          <w:tcPr>
-            <w:tcW w:type="dxa" w:w="1728"/>
-          </w:tcPr>
-          <w:p>
-            <w:r>
-              <w:rPr>
-                <w:sz w:val="24"/>
-              </w:rPr>
-            </w:r>
-            <w:r>
-              <w:rPr>
-                <w:rFonts w:ascii="Times New Roman" w:hAnsi="Times New Roman" w:eastAsia="Times New Roman"/>
-                <w:b w:val="0"/>
-                <w:i w:val="0"/>
-                <w:sz w:val="24"/>
-              </w:rPr>
-              <w:t>Marketing + CRM</w:t>
-            </w:r>
-          </w:p>
-        </w:tc>
-        <w:tc>
-          <w:tcPr>
-            <w:tcW w:type="dxa" w:w="1728"/>
-          </w:tcPr>
-          <w:p>
-            <w:r>
-              <w:rPr>
-                <w:sz w:val="24"/>
-              </w:rPr>
-            </w:r>
-            <w:r>
-              <w:rPr>
-                <w:rFonts w:ascii="Times New Roman" w:hAnsi="Times New Roman" w:eastAsia="Times New Roman"/>
-                <w:b w:val="0"/>
-                <w:i w:val="0"/>
-                <w:sz w:val="24"/>
-              </w:rPr>
-              <w:t xml:space="preserve">Multi-tenant SaaS từ gốc + AI Branding + STARTER </w:t>
-            </w:r>
-            <w:r>
-              <w:rPr>
-                <w:rFonts w:ascii="Times New Roman" w:hAnsi="Times New Roman" w:eastAsia="Times New Roman"/>
-                <w:b w:val="0"/>
-                <w:i/>
-                <w:sz w:val="24"/>
-              </w:rPr>
-              <w:t>500.000đ/tháng</w:t>
-            </w:r>
-            <w:r>
-              <w:rPr>
-                <w:rFonts w:ascii="Times New Roman" w:hAnsi="Times New Roman" w:eastAsia="Times New Roman"/>
-                <w:b w:val="0"/>
-                <w:i w:val="0"/>
-                <w:sz w:val="24"/>
-              </w:rPr>
-              <w:t xml:space="preserve"> hợp lý</w:t>
-            </w:r>
-          </w:p>
-        </w:tc>
-      </w:tr>
-      <w:tr>
-        <w:tc>
-          <w:tcPr>
-            <w:tcW w:type="dxa" w:w="1728"/>
-          </w:tcPr>
-          <w:p>
-            <w:r>
-              <w:rPr>
-                <w:sz w:val="24"/>
-              </w:rPr>
-            </w:r>
-            <w:r>
-              <w:rPr>
-                <w:rFonts w:ascii="Times New Roman" w:hAnsi="Times New Roman" w:eastAsia="Times New Roman"/>
-                <w:b w:val="0"/>
-                <w:i w:val="0"/>
-                <w:sz w:val="24"/>
-              </w:rPr>
-              <w:t>Easy Edu</w:t>
-            </w:r>
-          </w:p>
-        </w:tc>
-        <w:tc>
-          <w:tcPr>
-            <w:tcW w:type="dxa" w:w="1728"/>
-          </w:tcPr>
-          <w:p>
-            <w:r>
-              <w:rPr>
-                <w:sz w:val="24"/>
-              </w:rPr>
-            </w:r>
-            <w:r>
-              <w:rPr>
-                <w:rFonts w:ascii="Times New Roman" w:hAnsi="Times New Roman" w:eastAsia="Times New Roman"/>
-                <w:b w:val="0"/>
-                <w:i w:val="0"/>
-                <w:sz w:val="24"/>
-              </w:rPr>
-              <w:t>Trung tâm vừa và nhỏ</w:t>
-            </w:r>
-          </w:p>
-        </w:tc>
-        <w:tc>
-          <w:tcPr>
-            <w:tcW w:type="dxa" w:w="1728"/>
-          </w:tcPr>
-          <w:p>
-            <w:r>
-              <w:rPr>
-                <w:sz w:val="24"/>
-              </w:rPr>
-            </w:r>
-            <w:r>
-              <w:rPr>
-                <w:rFonts w:ascii="Times New Roman" w:hAnsi="Times New Roman" w:eastAsia="Times New Roman"/>
-                <w:b w:val="0"/>
-                <w:i/>
-                <w:sz w:val="24"/>
-              </w:rPr>
-              <w:t>1-3 triệu/tháng</w:t>
-            </w:r>
-          </w:p>
-        </w:tc>
-        <w:tc>
-          <w:tcPr>
-            <w:tcW w:type="dxa" w:w="1728"/>
-          </w:tcPr>
-          <w:p>
-            <w:r>
-              <w:rPr>
-                <w:sz w:val="24"/>
-              </w:rPr>
-            </w:r>
-            <w:r>
-              <w:rPr>
-                <w:rFonts w:ascii="Times New Roman" w:hAnsi="Times New Roman" w:eastAsia="Times New Roman"/>
-                <w:b w:val="0"/>
-                <w:i w:val="0"/>
-                <w:sz w:val="24"/>
-              </w:rPr>
-              <w:t>Giao diện đơn giản</w:t>
-            </w:r>
-          </w:p>
-        </w:tc>
-        <w:tc>
-          <w:tcPr>
-            <w:tcW w:type="dxa" w:w="1728"/>
-          </w:tcPr>
-          <w:p>
-            <w:r>
-              <w:rPr>
-                <w:sz w:val="24"/>
-              </w:rPr>
-            </w:r>
-            <w:r>
-              <w:rPr>
-                <w:rFonts w:ascii="Times New Roman" w:hAnsi="Times New Roman" w:eastAsia="Times New Roman"/>
-                <w:b w:val="0"/>
-                <w:i w:val="0"/>
-                <w:sz w:val="24"/>
-              </w:rPr>
-              <w:t>Bổ sung AI Branding + Zalo-native (giai đoạn vận hành chính thức) + RLS phòng thủ chiều sâu</w:t>
-            </w:r>
-          </w:p>
-        </w:tc>
-      </w:tr>
-      <w:tr>
-        <w:tc>
-          <w:tcPr>
-            <w:tcW w:type="dxa" w:w="1728"/>
-          </w:tcPr>
-          <w:p>
-            <w:r>
-              <w:rPr>
-                <w:sz w:val="24"/>
-              </w:rPr>
-            </w:r>
-            <w:r>
-              <w:rPr>
-                <w:rFonts w:ascii="Times New Roman" w:hAnsi="Times New Roman" w:eastAsia="Times New Roman"/>
-                <w:b w:val="0"/>
-                <w:i w:val="0"/>
-                <w:sz w:val="24"/>
-              </w:rPr>
-              <w:t>DotB</w:t>
-            </w:r>
-          </w:p>
-        </w:tc>
-        <w:tc>
-          <w:tcPr>
-            <w:tcW w:type="dxa" w:w="1728"/>
-          </w:tcPr>
-          <w:p>
-            <w:r>
-              <w:rPr>
-                <w:sz w:val="24"/>
-              </w:rPr>
-            </w:r>
-            <w:r>
-              <w:rPr>
-                <w:rFonts w:ascii="Times New Roman" w:hAnsi="Times New Roman" w:eastAsia="Times New Roman"/>
-                <w:b w:val="0"/>
-                <w:i w:val="0"/>
-                <w:sz w:val="24"/>
-              </w:rPr>
-              <w:t>Cả K-12 và trung tâm</w:t>
-            </w:r>
-          </w:p>
-        </w:tc>
-        <w:tc>
-          <w:tcPr>
-            <w:tcW w:type="dxa" w:w="1728"/>
-          </w:tcPr>
-          <w:p>
-            <w:r>
-              <w:rPr>
-                <w:sz w:val="24"/>
-              </w:rPr>
-            </w:r>
-            <w:r>
-              <w:rPr>
-                <w:rFonts w:ascii="Times New Roman" w:hAnsi="Times New Roman" w:eastAsia="Times New Roman"/>
-                <w:b w:val="0"/>
-                <w:i w:val="0"/>
-                <w:sz w:val="24"/>
-              </w:rPr>
-              <w:t>Tùy biến</w:t>
-            </w:r>
-          </w:p>
-        </w:tc>
-        <w:tc>
-          <w:tcPr>
-            <w:tcW w:type="dxa" w:w="1728"/>
-          </w:tcPr>
-          <w:p>
-            <w:r>
-              <w:rPr>
-                <w:sz w:val="24"/>
-              </w:rPr>
-            </w:r>
-            <w:r>
-              <w:rPr>
-                <w:rFonts w:ascii="Times New Roman" w:hAnsi="Times New Roman" w:eastAsia="Times New Roman"/>
-                <w:b w:val="0"/>
-                <w:i w:val="0"/>
-                <w:sz w:val="24"/>
-              </w:rPr>
-              <w:t>Toàn diện</w:t>
-            </w:r>
-          </w:p>
-        </w:tc>
-        <w:tc>
-          <w:tcPr>
-            <w:tcW w:type="dxa" w:w="1728"/>
-          </w:tcPr>
-          <w:p>
-            <w:r>
-              <w:rPr>
-                <w:sz w:val="24"/>
-              </w:rPr>
-            </w:r>
-            <w:r>
-              <w:rPr>
-                <w:rFonts w:ascii="Times New Roman" w:hAnsi="Times New Roman" w:eastAsia="Times New Roman"/>
-                <w:b w:val="0"/>
-                <w:i w:val="0"/>
-                <w:sz w:val="24"/>
-              </w:rPr>
-              <w:t>Tập trung trung tâm dạy thêm theo chiều dọc, không cố cạnh tranh K-12</w:t>
-            </w:r>
-          </w:p>
-        </w:tc>
-      </w:tr>
-    </w:tbl>
-    <w:p/>
-    <w:p>
-      <w:pPr>
-        <w:spacing w:line="288" w:lineRule="auto"/>
-        <w:ind w:firstLine="567"/>
-        <w:jc w:val="both"/>
-      </w:pPr>
-      <w:r>
-        <w:rPr>
-          <w:rFonts w:ascii="Times New Roman" w:hAnsi="Times New Roman" w:eastAsia="Times New Roman"/>
-          <w:b w:val="0"/>
-          <w:i w:val="0"/>
-          <w:sz w:val="26"/>
-        </w:rPr>
-        <w:t xml:space="preserve">Định vị tổng quát: nền tảng SaaS đa tenant nguyên bản cho trung tâm dạy thêm SMB Việt Nam, AI-powered branding, giao tiếp Zalo-native (giai đoạn vận hành chính thức), mức giá khởi điểm </w:t>
-      </w:r>
-      <w:r>
-        <w:rPr>
-          <w:rFonts w:ascii="Times New Roman" w:hAnsi="Times New Roman" w:eastAsia="Times New Roman"/>
-          <w:b w:val="0"/>
-          <w:i/>
-          <w:sz w:val="26"/>
-        </w:rPr>
-        <w:t>500.000đ/tháng</w:t>
-      </w:r>
-      <w:r>
-        <w:rPr>
-          <w:rFonts w:ascii="Times New Roman" w:hAnsi="Times New Roman" w:eastAsia="Times New Roman"/>
-          <w:b w:val="0"/>
-          <w:i w:val="0"/>
-          <w:sz w:val="26"/>
-        </w:rPr>
-        <w:t>.</w:t>
-      </w:r>
-    </w:p>
     <w:p>
       <w:pPr>
         <w:pStyle w:val="Heading2"/>
@@ -12604,7 +11948,7 @@
           <w:i w:val="0"/>
           <w:sz w:val="26"/>
         </w:rPr>
-        <w:t xml:space="preserve">Quyết định kiến trúc trọng tâm của đồ án là chọn mô hình cô lập đa tenant. Em đã đánh giá 6 pattern khác nhau trên 6 trục tiêu chí và lựa chọn </w:t>
+        <w:t xml:space="preserve">Quyết định kiến trúc trọng tâm của đồ án là chọn mô hình cô lập đa tenant. Đồ án đánh giá 6 pattern khác nhau trên 6 trục tiêu chí và lựa chọn </w:t>
       </w:r>
       <w:r>
         <w:rPr>
@@ -12646,7 +11990,7 @@
           <w:b/>
           <w:sz w:val="26"/>
         </w:rPr>
-        <w:t>Bảng 2.5</w:t>
+        <w:t>Bảng 2.4</w:t>
       </w:r>
       <w:r>
         <w:rPr>
@@ -13278,7 +12622,7 @@
           <w:b/>
           <w:sz w:val="26"/>
         </w:rPr>
-        <w:t>Bảng 2.6</w:t>
+        <w:t>Bảng 2.5</w:t>
       </w:r>
       <w:r>
         <w:rPr>
@@ -15544,7 +14888,7 @@
           <w:i w:val="0"/>
           <w:sz w:val="26"/>
         </w:rPr>
-        <w:t xml:space="preserve"> rồi trả về pool, kết nối kế tiếp có thể "kế thừa" ngữ cảnh tenant A. Tác giả khắc phục bằng </w:t>
+        <w:t xml:space="preserve"> rồi trả về pool, kết nối kế tiếp có thể "kế thừa" ngữ cảnh tenant A. Vấn đề được khắc phục bằng </w:t>
       </w:r>
       <w:r>
         <w:rPr>
@@ -16035,7 +15379,7 @@
           <w:i w:val="0"/>
           <w:sz w:val="26"/>
         </w:rPr>
-        <w:t>Bảng 2.9 so sánh hai phương thức truy cập theo các tiêu chí cấp phát, DNS, chứng chỉ SSL và xác minh quyền sở hữu.</w:t>
+        <w:t>Bảng 2.6 so sánh hai phương thức truy cập theo các tiêu chí cấp phát, DNS, chứng chỉ SSL và xác minh quyền sở hữu.</w:t>
       </w:r>
     </w:p>
     <w:tbl>
@@ -16437,7 +15781,7 @@
           <w:b/>
           <w:sz w:val="26"/>
         </w:rPr>
-        <w:t>Bảng 2.9</w:t>
+        <w:t>Bảng 2.6</w:t>
       </w:r>
       <w:r>
         <w:rPr>
@@ -25161,43 +24505,18 @@
     </w:p>
     <w:p>
       <w:pPr>
-        <w:pageBreakBefore/>
         <w:spacing w:before="120" w:after="60"/>
         <w:jc w:val="center"/>
       </w:pPr>
       <w:r>
-        <w:drawing>
-          <wp:inline xmlns:a="http://schemas.openxmlformats.org/drawingml/2006/main" xmlns:pic="http://schemas.openxmlformats.org/drawingml/2006/picture">
-            <wp:extent cx="1975275" cy="6480000"/>
-            <wp:docPr id="18" name="Picture 18"/>
-            <wp:cNvGraphicFramePr>
-              <a:graphicFrameLocks noChangeAspect="1"/>
-            </wp:cNvGraphicFramePr>
-            <a:graphic>
-              <a:graphicData uri="http://schemas.openxmlformats.org/drawingml/2006/picture">
-                <pic:pic>
-                  <pic:nvPicPr>
-                    <pic:cNvPr id="0" name="12-public-homepage-sky-branded.png"/>
-                    <pic:cNvPicPr/>
-                  </pic:nvPicPr>
-                  <pic:blipFill>
-                    <a:blip r:embed="rId26"/>
-                    <a:stretch>
-                      <a:fillRect/>
-                    </a:stretch>
-                  </pic:blipFill>
-                  <pic:spPr>
-                    <a:xfrm>
-                      <a:off x="0" y="0"/>
-                      <a:ext cx="1975275" cy="6480000"/>
-                    </a:xfrm>
-                    <a:prstGeom prst="rect"/>
-                  </pic:spPr>
-                </pic:pic>
-              </a:graphicData>
-            </a:graphic>
-          </wp:inline>
-        </w:drawing>
+        <w:rPr>
+          <w:rFonts w:ascii="Times New Roman" w:hAnsi="Times New Roman" w:eastAsia="Times New Roman"/>
+          <w:b w:val="0"/>
+          <w:i/>
+          <w:color w:val="808080"/>
+          <w:sz w:val="26"/>
+        </w:rPr>
+        <w:t>[Hình minh hoạ: 12-public-homepage-sky-branded.png — chưa có file]</w:t>
       </w:r>
     </w:p>
     <w:p>
@@ -25206,38 +24525,14 @@
         <w:jc w:val="center"/>
       </w:pPr>
       <w:r>
-        <w:drawing>
-          <wp:inline xmlns:a="http://schemas.openxmlformats.org/drawingml/2006/main" xmlns:pic="http://schemas.openxmlformats.org/drawingml/2006/picture">
-            <wp:extent cx="5760000" cy="3600000"/>
-            <wp:docPr id="19" name="Picture 19"/>
-            <wp:cNvGraphicFramePr>
-              <a:graphicFrameLocks noChangeAspect="1"/>
-            </wp:cNvGraphicFramePr>
-            <a:graphic>
-              <a:graphicData uri="http://schemas.openxmlformats.org/drawingml/2006/picture">
-                <pic:pic>
-                  <pic:nvPicPr>
-                    <pic:cNvPr id="0" name="01-login-page.png"/>
-                    <pic:cNvPicPr/>
-                  </pic:nvPicPr>
-                  <pic:blipFill>
-                    <a:blip r:embed="rId27"/>
-                    <a:stretch>
-                      <a:fillRect/>
-                    </a:stretch>
-                  </pic:blipFill>
-                  <pic:spPr>
-                    <a:xfrm>
-                      <a:off x="0" y="0"/>
-                      <a:ext cx="5760000" cy="3600000"/>
-                    </a:xfrm>
-                    <a:prstGeom prst="rect"/>
-                  </pic:spPr>
-                </pic:pic>
-              </a:graphicData>
-            </a:graphic>
-          </wp:inline>
-        </w:drawing>
+        <w:rPr>
+          <w:rFonts w:ascii="Times New Roman" w:hAnsi="Times New Roman" w:eastAsia="Times New Roman"/>
+          <w:b w:val="0"/>
+          <w:i/>
+          <w:color w:val="808080"/>
+          <w:sz w:val="26"/>
+        </w:rPr>
+        <w:t>[Hình minh hoạ: 01-login-page.png — chưa có file]</w:t>
       </w:r>
     </w:p>
     <w:p>
@@ -25246,38 +24541,14 @@
         <w:jc w:val="center"/>
       </w:pPr>
       <w:r>
-        <w:drawing>
-          <wp:inline xmlns:a="http://schemas.openxmlformats.org/drawingml/2006/main" xmlns:pic="http://schemas.openxmlformats.org/drawingml/2006/picture">
-            <wp:extent cx="5760000" cy="3600000"/>
-            <wp:docPr id="20" name="Picture 20"/>
-            <wp:cNvGraphicFramePr>
-              <a:graphicFrameLocks noChangeAspect="1"/>
-            </wp:cNvGraphicFramePr>
-            <a:graphic>
-              <a:graphicData uri="http://schemas.openxmlformats.org/drawingml/2006/picture">
-                <pic:pic>
-                  <pic:nvPicPr>
-                    <pic:cNvPr id="0" name="02-dashboard-overview-kpi-orange.png"/>
-                    <pic:cNvPicPr/>
-                  </pic:nvPicPr>
-                  <pic:blipFill>
-                    <a:blip r:embed="rId28"/>
-                    <a:stretch>
-                      <a:fillRect/>
-                    </a:stretch>
-                  </pic:blipFill>
-                  <pic:spPr>
-                    <a:xfrm>
-                      <a:off x="0" y="0"/>
-                      <a:ext cx="5760000" cy="3600000"/>
-                    </a:xfrm>
-                    <a:prstGeom prst="rect"/>
-                  </pic:spPr>
-                </pic:pic>
-              </a:graphicData>
-            </a:graphic>
-          </wp:inline>
-        </w:drawing>
+        <w:rPr>
+          <w:rFonts w:ascii="Times New Roman" w:hAnsi="Times New Roman" w:eastAsia="Times New Roman"/>
+          <w:b w:val="0"/>
+          <w:i/>
+          <w:color w:val="808080"/>
+          <w:sz w:val="26"/>
+        </w:rPr>
+        <w:t>[Hình minh hoạ: 02-dashboard-overview-kpi-orange.png — chưa có file]</w:t>
       </w:r>
     </w:p>
     <w:p>
@@ -25408,38 +24679,14 @@
         <w:jc w:val="center"/>
       </w:pPr>
       <w:r>
-        <w:drawing>
-          <wp:inline xmlns:a="http://schemas.openxmlformats.org/drawingml/2006/main" xmlns:pic="http://schemas.openxmlformats.org/drawingml/2006/picture">
-            <wp:extent cx="5760000" cy="3600000"/>
-            <wp:docPr id="21" name="Picture 21"/>
-            <wp:cNvGraphicFramePr>
-              <a:graphicFrameLocks noChangeAspect="1"/>
-            </wp:cNvGraphicFramePr>
-            <a:graphic>
-              <a:graphicData uri="http://schemas.openxmlformats.org/drawingml/2006/picture">
-                <pic:pic>
-                  <pic:nvPicPr>
-                    <pic:cNvPr id="0" name="03-branding-settings.png"/>
-                    <pic:cNvPicPr/>
-                  </pic:nvPicPr>
-                  <pic:blipFill>
-                    <a:blip r:embed="rId29"/>
-                    <a:stretch>
-                      <a:fillRect/>
-                    </a:stretch>
-                  </pic:blipFill>
-                  <pic:spPr>
-                    <a:xfrm>
-                      <a:off x="0" y="0"/>
-                      <a:ext cx="5760000" cy="3600000"/>
-                    </a:xfrm>
-                    <a:prstGeom prst="rect"/>
-                  </pic:spPr>
-                </pic:pic>
-              </a:graphicData>
-            </a:graphic>
-          </wp:inline>
-        </w:drawing>
+        <w:rPr>
+          <w:rFonts w:ascii="Times New Roman" w:hAnsi="Times New Roman" w:eastAsia="Times New Roman"/>
+          <w:b w:val="0"/>
+          <w:i/>
+          <w:color w:val="808080"/>
+          <w:sz w:val="26"/>
+        </w:rPr>
+        <w:t>[Hình minh hoạ: 03-branding-settings.png — chưa có file]</w:t>
       </w:r>
     </w:p>
     <w:p>
@@ -25516,38 +24763,14 @@
         <w:jc w:val="center"/>
       </w:pPr>
       <w:r>
-        <w:drawing>
-          <wp:inline xmlns:a="http://schemas.openxmlformats.org/drawingml/2006/main" xmlns:pic="http://schemas.openxmlformats.org/drawingml/2006/picture">
-            <wp:extent cx="5760000" cy="4000000"/>
-            <wp:docPr id="22" name="Picture 22"/>
-            <wp:cNvGraphicFramePr>
-              <a:graphicFrameLocks noChangeAspect="1"/>
-            </wp:cNvGraphicFramePr>
-            <a:graphic>
-              <a:graphicData uri="http://schemas.openxmlformats.org/drawingml/2006/picture">
-                <pic:pic>
-                  <pic:nvPicPr>
-                    <pic:cNvPr id="0" name="05-students.png"/>
-                    <pic:cNvPicPr/>
-                  </pic:nvPicPr>
-                  <pic:blipFill>
-                    <a:blip r:embed="rId30"/>
-                    <a:stretch>
-                      <a:fillRect/>
-                    </a:stretch>
-                  </pic:blipFill>
-                  <pic:spPr>
-                    <a:xfrm>
-                      <a:off x="0" y="0"/>
-                      <a:ext cx="5760000" cy="4000000"/>
-                    </a:xfrm>
-                    <a:prstGeom prst="rect"/>
-                  </pic:spPr>
-                </pic:pic>
-              </a:graphicData>
-            </a:graphic>
-          </wp:inline>
-        </w:drawing>
+        <w:rPr>
+          <w:rFonts w:ascii="Times New Roman" w:hAnsi="Times New Roman" w:eastAsia="Times New Roman"/>
+          <w:b w:val="0"/>
+          <w:i/>
+          <w:color w:val="808080"/>
+          <w:sz w:val="26"/>
+        </w:rPr>
+        <w:t>[Hình minh hoạ: 05-students.png — chưa có file]</w:t>
       </w:r>
     </w:p>
     <w:p>
@@ -25631,7 +24854,7 @@
           <w:i w:val="0"/>
           <w:sz w:val="26"/>
         </w:rPr>
-        <w:t>Bốn giao diện được trình bày trong ba nhóm chức năng trên đại diện cho các luồng đã hoàn thiện và có minh chứng thực tế trong giai đoạn thử nghiệm: trang chủ công khai mang thương hiệu riêng, tùy biến thương hiệu bằng AI, dashboard tổng quan và quản lý học viên. Một số giao diện khác đã được xây dựng nhưng chưa đưa vào bộ minh chứng này do còn ở trạng thái dữ liệu chưa đầy đủ trong môi trường thử nghiệm — cụ thể là giao diện quản lý hóa đơn và thanh toán (đang trong quá trình hoàn thiện endpoint tổng hợp số liệu) cùng các thống kê doanh thu. Các giao diện thuộc phạm vi giai đoạn tiếp theo gồm: cổng thông tin dành cho phụ huynh (persona P4), ứng dụng di động gốc (sau giai đoạn thương mại hóa), và quản lý học bạ K-12 (persona P5). Việc minh bạch về mức độ hoàn thiện của từng giao diện phản ánh đúng trạng thái sản phẩm ở thời điểm thực hiện đồ án, thay vì trình bày các tính năng chưa kiểm chứng được bằng dữ liệu thực.</w:t>
+        <w:t>Bốn giao diện được trình bày trong ba nhóm chức năng trên đại diện cho các luồng đã hoàn thiện và có minh chứng thực tế trong giai đoạn thử nghiệm: trang chủ công khai mang thương hiệu riêng, tùy biến thương hiệu bằng AI, bảng tổng quan và quản lý học viên. Một số giao diện khác đã được xây dựng nhưng chưa đưa vào bộ minh chứng này do còn ở trạng thái dữ liệu chưa đầy đủ trong môi trường thử nghiệm — cụ thể là giao diện quản lý hóa đơn và thanh toán (đang trong quá trình hoàn thiện điểm cuối API tổng hợp số liệu) cùng các thống kê doanh thu. Các giao diện thuộc phạm vi giai đoạn tiếp theo gồm: cổng thông tin dành cho phụ huynh (nhóm người dùng đại diện P4), ứng dụng di động gốc (sau giai đoạn thương mại hóa), và quản lý học bạ K-12 (nhóm người dùng đại diện P5). Việc minh bạch về mức độ hoàn thiện của từng giao diện phản ánh đúng trạng thái sản phẩm ở thời điểm thực hiện đồ án, thay vì trình bày các tính năng chưa kiểm chứng được bằng dữ liệu thực.</w:t>
       </w:r>
     </w:p>
     <w:p>
@@ -25704,7 +24927,7 @@
         <w:drawing>
           <wp:inline xmlns:a="http://schemas.openxmlformats.org/drawingml/2006/main" xmlns:pic="http://schemas.openxmlformats.org/drawingml/2006/picture">
             <wp:extent cx="3620404" cy="6480000"/>
-            <wp:docPr id="23" name="Picture 23"/>
+            <wp:docPr id="18" name="Picture 18"/>
             <wp:cNvGraphicFramePr>
               <a:graphicFrameLocks noChangeAspect="1"/>
             </wp:cNvGraphicFramePr>
@@ -25716,7 +24939,7 @@
                     <pic:cNvPicPr/>
                   </pic:nvPicPr>
                   <pic:blipFill>
-                    <a:blip r:embed="rId31"/>
+                    <a:blip r:embed="rId26"/>
                     <a:stretch>
                       <a:fillRect/>
                     </a:stretch>
@@ -26155,8 +25378,8 @@
       <w:r>
         <w:drawing>
           <wp:inline xmlns:a="http://schemas.openxmlformats.org/drawingml/2006/main" xmlns:pic="http://schemas.openxmlformats.org/drawingml/2006/picture">
-            <wp:extent cx="3220303" cy="6480000"/>
-            <wp:docPr id="24" name="Picture 24"/>
+            <wp:extent cx="3265856" cy="6480000"/>
+            <wp:docPr id="19" name="Picture 19"/>
             <wp:cNvGraphicFramePr>
               <a:graphicFrameLocks noChangeAspect="1"/>
             </wp:cNvGraphicFramePr>
@@ -26168,7 +25391,7 @@
                     <pic:cNvPicPr/>
                   </pic:nvPicPr>
                   <pic:blipFill>
-                    <a:blip r:embed="rId32"/>
+                    <a:blip r:embed="rId27"/>
                     <a:stretch>
                       <a:fillRect/>
                     </a:stretch>
@@ -26176,7 +25399,7 @@
                   <pic:spPr>
                     <a:xfrm>
                       <a:off x="0" y="0"/>
-                      <a:ext cx="3220303" cy="6480000"/>
+                      <a:ext cx="3265856" cy="6480000"/>
                     </a:xfrm>
                     <a:prstGeom prst="rect"/>
                   </pic:spPr>
@@ -26221,8 +25444,8 @@
       <w:r>
         <w:drawing>
           <wp:inline xmlns:a="http://schemas.openxmlformats.org/drawingml/2006/main" xmlns:pic="http://schemas.openxmlformats.org/drawingml/2006/picture">
-            <wp:extent cx="5760000" cy="5004659"/>
-            <wp:docPr id="25" name="Picture 25"/>
+            <wp:extent cx="5760000" cy="5782721"/>
+            <wp:docPr id="20" name="Picture 20"/>
             <wp:cNvGraphicFramePr>
               <a:graphicFrameLocks noChangeAspect="1"/>
             </wp:cNvGraphicFramePr>
@@ -26234,7 +25457,7 @@
                     <pic:cNvPicPr/>
                   </pic:nvPicPr>
                   <pic:blipFill>
-                    <a:blip r:embed="rId33"/>
+                    <a:blip r:embed="rId28"/>
                     <a:stretch>
                       <a:fillRect/>
                     </a:stretch>
@@ -26242,7 +25465,7 @@
                   <pic:spPr>
                     <a:xfrm>
                       <a:off x="0" y="0"/>
-                      <a:ext cx="5760000" cy="5004659"/>
+                      <a:ext cx="5760000" cy="5782721"/>
                     </a:xfrm>
                     <a:prstGeom prst="rect"/>
                   </pic:spPr>
@@ -26843,7 +26066,7 @@
         <w:drawing>
           <wp:inline xmlns:a="http://schemas.openxmlformats.org/drawingml/2006/main" xmlns:pic="http://schemas.openxmlformats.org/drawingml/2006/picture">
             <wp:extent cx="5760000" cy="2219294"/>
-            <wp:docPr id="26" name="Picture 26"/>
+            <wp:docPr id="21" name="Picture 21"/>
             <wp:cNvGraphicFramePr>
               <a:graphicFrameLocks noChangeAspect="1"/>
             </wp:cNvGraphicFramePr>
@@ -26855,7 +26078,7 @@
                     <pic:cNvPicPr/>
                   </pic:nvPicPr>
                   <pic:blipFill>
-                    <a:blip r:embed="rId34"/>
+                    <a:blip r:embed="rId29"/>
                     <a:stretch>
                       <a:fillRect/>
                     </a:stretch>
@@ -26908,7 +26131,7 @@
         <w:drawing>
           <wp:inline xmlns:a="http://schemas.openxmlformats.org/drawingml/2006/main" xmlns:pic="http://schemas.openxmlformats.org/drawingml/2006/picture">
             <wp:extent cx="5760000" cy="2217663"/>
-            <wp:docPr id="27" name="Picture 27"/>
+            <wp:docPr id="22" name="Picture 22"/>
             <wp:cNvGraphicFramePr>
               <a:graphicFrameLocks noChangeAspect="1"/>
             </wp:cNvGraphicFramePr>
@@ -26920,7 +26143,7 @@
                     <pic:cNvPicPr/>
                   </pic:nvPicPr>
                   <pic:blipFill>
-                    <a:blip r:embed="rId35"/>
+                    <a:blip r:embed="rId30"/>
                     <a:stretch>
                       <a:fillRect/>
                     </a:stretch>
@@ -26977,7 +26200,7 @@
           <w:i w:val="0"/>
           <w:sz w:val="26"/>
         </w:rPr>
-        <w:t xml:space="preserve">Bốn lựa chọn thiết kế nổi bật của pipeline bao gồm: ephemeral OIDC role (mỗi workflow run assume role mới với token 1 giờ, không hardcode AWS access key trong GitHub Secrets); narrow IAM scope (role </w:t>
+        <w:t xml:space="preserve">Bốn lựa chọn thiết kế nổi bật của đường ống triển khai bao gồm: vai trò OIDC tạm thời (mỗi lần chạy workflow đảm nhận một vai trò mới với token một giờ, không nhúng cứng AWS access key trong GitHub Secrets); phạm vi IAM thu hẹp (vai trò </w:t>
       </w:r>
       <w:r>
         <w:rPr>
@@ -26995,7 +26218,7 @@
           <w:i w:val="0"/>
           <w:sz w:val="26"/>
         </w:rPr>
-        <w:t xml:space="preserve"> chỉ có permission </w:t>
+        <w:t xml:space="preserve"> chỉ có quyền </w:t>
       </w:r>
       <w:r>
         <w:rPr>
@@ -27031,7 +26254,7 @@
           <w:i w:val="0"/>
           <w:sz w:val="26"/>
         </w:rPr>
-        <w:t xml:space="preserve"> tới EC2 tag </w:t>
+        <w:t xml:space="preserve"> tới các EC2 mang nhãn </w:t>
       </w:r>
       <w:r>
         <w:rPr>
@@ -27067,7 +26290,7 @@
           <w:i w:val="0"/>
           <w:sz w:val="26"/>
         </w:rPr>
-        <w:t xml:space="preserve"> hay scope rộng hơn); confirm-input gate (workflow yêu cầu nhập </w:t>
+        <w:t xml:space="preserve"> hay phạm vi rộng hơn); cổng xác nhận đầu vào (workflow yêu cầu nhập </w:t>
       </w:r>
       <w:r>
         <w:rPr>
@@ -27085,7 +26308,7 @@
           <w:i w:val="0"/>
           <w:sz w:val="26"/>
         </w:rPr>
-        <w:t xml:space="preserve"> verbatim để trigger, phòng ngừa deploy nhầm); và smoke admin-login post-deploy (sau deploy, smoke test gọi </w:t>
+        <w:t xml:space="preserve"> nguyên văn để kích hoạt, phòng ngừa triển khai nhầm); và kiểm thử nhanh đăng nhập quản trị sau triển khai (kiểm thử gọi </w:t>
       </w:r>
       <w:r>
         <w:rPr>
@@ -27103,7 +26326,7 @@
           <w:i w:val="0"/>
           <w:sz w:val="26"/>
         </w:rPr>
-        <w:t xml:space="preserve"> với seeded admin credential, kỳ vọng 200 + JWT — bắt được lỗi class binding Postgres-specific mà unit test với H2 hoặc Mockito không phát hiện được).</w:t>
+        <w:t xml:space="preserve"> với thông tin quản trị viên đã được khởi tạo sẵn, kỳ vọng mã 200 và JWT — bắt được lỗi liên kết kiểu đặc thù PostgreSQL mà kiểm thử đơn vị với H2 hoặc Mockito không phát hiện được).</w:t>
       </w:r>
     </w:p>
     <w:p>
@@ -28821,7 +28044,7 @@
           <w:i w:val="0"/>
           <w:sz w:val="26"/>
         </w:rPr>
-        <w:t xml:space="preserve">Tính đến thời điểm thực hiện đồ án: 71 resources terraform đã apply (CloudTrail captured); hai EC2 instance + RDS PostgreSQL multi-tenant schema RLS đã chạy; Cloudflare DNS đã cutover (kitehub.me trỏ về ALB) cùng bản ghi wildcard </w:t>
+        <w:t xml:space="preserve">Tính đến thời điểm thực hiện đồ án: 71 tài nguyên Terraform đã áp dụng (CloudTrail ghi nhận đầy đủ); hai thực thể EC2 và RDS PostgreSQL đa tenant với RLS đã chạy; Cloudflare DNS đã chuyển đổi (kitehub.me trỏ về ALB) cùng bản ghi wildcard </w:t>
       </w:r>
       <w:r>
         <w:rPr>
@@ -28839,7 +28062,7 @@
           <w:i w:val="0"/>
           <w:sz w:val="26"/>
         </w:rPr>
-        <w:t xml:space="preserve"> cho định tuyến landing đa tenant; cơ chế phân giải Tenant → Domain → Landing (mục 2.2.6) hoạt động trên lớp gateway, được minh chứng qua trang chủ công khai của tenant mẫu Sky Education với giao diện thương hiệu riêng (mục 4.2); AWS SES production mode đã được approve; CI/CD pipeline OIDC + ECR + SSM hoạt động đầy đủ; beta tenant invite mechanism đã sẵn sàng nhận yêu cầu.</w:t>
+        <w:t xml:space="preserve"> cho định tuyến trang chủ đa tenant; cơ chế phân giải Tenant → Domain → Landing (mục 2.2.6) hoạt động trên lớp gateway, được minh chứng qua trang chủ công khai của tenant mẫu Sky Education với giao diện thương hiệu riêng (mục 4.2); AWS SES đã được phê duyệt chế độ sản xuất; đường ống CI/CD OIDC + ECR + SSM hoạt động đầy đủ; cơ chế mời tenant thử nghiệm đã sẵn sàng nhận yêu cầu.</w:t>
       </w:r>
     </w:p>
     <w:p>
@@ -28853,7 +28076,7 @@
           <w:color w:val="000000"/>
           <w:sz w:val="32"/>
         </w:rPr>
-        <w:t>4.2 Kết quả tương tác end-user + minh chứng</w:t>
+        <w:t>4.2 Kết quả tương tác người dùng cuối và minh chứng</w:t>
       </w:r>
     </w:p>
     <w:p>
@@ -28869,7 +28092,7 @@
           <w:i w:val="0"/>
           <w:sz w:val="26"/>
         </w:rPr>
-        <w:t>[Placeholder — phần này sẽ điền sau khi thu thập feedback từ beta tenants trong giai đoạn launch invite (từ 2026-05-19 trở đi). Nội dung dự kiến:</w:t>
+        <w:t>[Phần này sẽ điền sau khi thu thập phản hồi từ các tenant thử nghiệm trong giai đoạn mời chính thức (từ 2026-05-19 trở đi). Nội dung dự kiến:</w:t>
       </w:r>
     </w:p>
     <w:p>
@@ -28885,7 +28108,7 @@
           <w:i w:val="0"/>
           <w:sz w:val="26"/>
         </w:rPr>
-        <w:t>Tổng kết các thao tác key đã được end-user thực hiện thành công (đăng ký tenant, cấu hình AI branding, quản lý lớp học, phát hành hóa đơn, theo dõi audit log).</w:t>
+        <w:t>Tổng kết các thao tác chính đã được người dùng cuối thực hiện thành công (đăng ký tenant, cấu hình AI Branding, quản lý lớp học, phát hành hóa đơn, theo dõi nhật ký kiểm toán).</w:t>
       </w:r>
     </w:p>
     <w:p>
@@ -28901,7 +28124,7 @@
           <w:i w:val="0"/>
           <w:sz w:val="26"/>
         </w:rPr>
-        <w:t>Trích dẫn feedback xác nhận từ chủ sở hữu trung tâm và quản lý trung tâm về độ phù hợp của hệ thống với quy trình vận hành hiện tại.</w:t>
+        <w:t>Trích dẫn phản hồi xác nhận từ chủ sở hữu trung tâm và quản lý trung tâm về độ phù hợp của hệ thống với quy trình vận hành hiện tại.</w:t>
       </w:r>
     </w:p>
     <w:p>
@@ -28917,7 +28140,7 @@
           <w:i w:val="0"/>
           <w:sz w:val="26"/>
         </w:rPr>
-        <w:t>Số liệu sử dụng thực tế (active users, AI branding generations, payment processed) trong cửa sổ 2-4 tuần đầu sau khi mời beta.</w:t>
+        <w:t>Số liệu sử dụng thực tế (số người dùng hoạt động, số lần sinh AI Branding, số giao dịch thanh toán đã xử lý) trong cửa sổ 2-4 tuần đầu sau khi mời thử nghiệm.</w:t>
       </w:r>
     </w:p>
     <w:p>
@@ -28933,7 +28156,7 @@
           <w:i w:val="0"/>
           <w:sz w:val="26"/>
         </w:rPr>
-        <w:t>Screenshot minh chứng các luồng nghiệp vụ then chốt đã được tenant ký xác nhận đạt yêu cầu.</w:t>
+        <w:t>Ảnh chụp minh chứng các luồng nghiệp vụ then chốt đã được tenant ký xác nhận đạt yêu cầu.</w:t>
       </w:r>
     </w:p>
     <w:p>
@@ -30986,7 +30209,7 @@
       </w:r>
     </w:p>
     <w:sectPr>
-      <w:headerReference w:type="default" r:id="rId39"/>
+      <w:headerReference w:type="default" r:id="rId34"/>
       <w:pgSz w:w="11906" w:h="16838"/>
       <w:pgMar w:top="1417" w:right="1134" w:bottom="1417" w:left="1701" w:header="720" w:footer="720" w:gutter="283"/>
       <w:cols w:space="720"/>

</xml_diff>

<commit_message>
docs(thesis): re-bake thesis-v1.docx with technical-term reverts
80 pages, 534 paragraphs (same as prev rebake, text substitution only).
</commit_message>
<xml_diff>
--- a/documents/08-thesis/thesis-v1.docx
+++ b/documents/08-thesis/thesis-v1.docx
@@ -4240,7 +4240,7 @@
           <w:i w:val="0"/>
           <w:sz w:val="26"/>
         </w:rPr>
-        <w:t>Thế mạnh chính của BeeClass là giao diện tiếng Việt thân thiện và hỗ trợ quy trình đặc thù của trung tâm tiếng Anh (lịch lớp định kỳ theo tuần, đăng ký lớp thử miễn phí, theo dõi tiến độ học viên theo từng kỹ năng nghe-nói-đọc-viết). Mức giá tham khảo công bố nằm trong khoảng 1-3 triệu đồng/tháng tùy gói và số lượng học viên. Điểm yếu chính của BeeClass tương tự các sản phẩm trong phân khúc: kiến trúc đơn tenant (single-tenant) — mỗi khách hàng có một thực thể cơ sở dữ liệu riêng, khó mở rộng khi trung tâm mở chi nhánh thứ năm trở lên; chưa có tính năng tự sinh tài nguyên thương hiệu bằng AI; quy trình khởi tạo yêu cầu liên hệ bộ phận kinh doanh chứ chưa hoàn toàn tự phục vụ; mức giá tuy phải chăng hơn các sản phẩm hướng doanh nghiệp nhưng vẫn cao hơn mức 500.000đ/tháng mà phân khúc trung tâm tự phát nhỏ kỳ vọng.</w:t>
+        <w:t>Thế mạnh chính của BeeClass là giao diện tiếng Việt thân thiện và hỗ trợ quy trình đặc thù của trung tâm tiếng Anh (lịch lớp định kỳ theo tuần, đăng ký lớp thử miễn phí, theo dõi tiến độ học viên theo từng kỹ năng nghe-nói-đọc-viết). Mức giá tham khảo công bố nằm trong khoảng 1-3 triệu đồng/tháng tùy gói và số lượng học viên. Điểm yếu chính của BeeClass tương tự các sản phẩm trong phân khúc: kiến trúc đơn tenant (single-tenant) — mỗi khách hàng có một instance cơ sở dữ liệu riêng, khó mở rộng khi trung tâm mở chi nhánh thứ năm trở lên; chưa có tính năng tự sinh tài nguyên thương hiệu bằng AI; quy trình khởi tạo yêu cầu liên hệ bộ phận kinh doanh chứ chưa hoàn toàn tự phục vụ; mức giá tuy phải chăng hơn các sản phẩm hướng doanh nghiệp nhưng vẫn cao hơn mức 500.000đ/tháng mà phân khúc trung tâm tự phát nhỏ kỳ vọng.</w:t>
       </w:r>
     </w:p>
     <w:p>
@@ -4669,7 +4669,7 @@
           <w:i w:val="0"/>
           <w:sz w:val="26"/>
         </w:rPr>
-        <w:t>Bên cạnh khảo sát các hệ thống đang có trên thị trường, đề tài tổng hợp nhu cầu sử dụng từ năm nhóm người dùng cuối dựa trên các báo cáo ngành công khai. Phân tích này giúp xác định những tính năng cốt lõi cần ưu tiên trong giai đoạn đầu của hệ thống đề xuất.</w:t>
+        <w:t>Bên cạnh khảo sát các hệ thống đang có trên thị trường, đề tài tổng hợp nhu cầu sử dụng từ năm nhóm end-user dựa trên các báo cáo ngành công khai. Phân tích này giúp xác định những tính năng cốt lõi cần ưu tiên trong giai đoạn đầu của hệ thống đề xuất.</w:t>
       </w:r>
     </w:p>
     <w:p>
@@ -4810,7 +4810,7 @@
           <w:i w:val="0"/>
           <w:sz w:val="26"/>
         </w:rPr>
-        <w:t>Tổng hợp năm nhóm người dùng cuối cho thấy nhu cầu chung là một nền tảng phục vụ nhiều nhóm vai trò khác nhau (đa nhóm người dùng đại diện) với phân quyền rõ ràng theo vai trò, giá thấp phù hợp phân khúc nhỏ và vừa, tích hợp Zalo cho kênh giao tiếp với phụ huynh — tất cả các tiêu chí này đều được xem xét trong định hướng kiến trúc hệ thống đề xuất.</w:t>
+        <w:t>Tổng hợp năm nhóm end-user cho thấy nhu cầu chung là một nền tảng phục vụ nhiều nhóm vai trò khác nhau (đa nhóm người dùng đại diện) với phân quyền rõ ràng theo vai trò, giá thấp phù hợp phân khúc nhỏ và vừa, tích hợp Zalo cho kênh giao tiếp với phụ huynh — tất cả các tiêu chí này đều được xem xét trong định hướng kiến trúc hệ thống đề xuất.</w:t>
       </w:r>
     </w:p>
     <w:p>
@@ -6520,7 +6520,7 @@
           <w:i w:val="0"/>
           <w:sz w:val="26"/>
         </w:rPr>
-        <w:t xml:space="preserve"> cả năm hệ thống tham khảo đều triển khai theo mô hình đơn tenant — mỗi khách hàng tương ứng một thực thể cơ sở dữ liệu riêng. Khi trung tâm mở rộng lên năm chi nhánh trở lên, chủ sở hữu trung tâm phải cấp phát thêm thực thể, đồng bộ dữ liệu thủ công và sao chép cấu hình. Hệ thống đề xuất sử dụng kiến trúc đa tenant nguyên bản với cô lập ở mức cơ sở dữ liệu (mỗi tenant một schema riêng), cho phép một trung tâm có 100 chi nhánh trên cùng một thực thể, tiết kiệm khoảng 80% chi phí hạ tầng khi mở rộng.</w:t>
+        <w:t xml:space="preserve"> cả năm hệ thống tham khảo đều triển khai theo mô hình đơn tenant — mỗi khách hàng tương ứng một instance cơ sở dữ liệu riêng. Khi trung tâm mở rộng lên năm chi nhánh trở lên, chủ sở hữu trung tâm phải cấp phát thêm instance, đồng bộ dữ liệu thủ công và sao chép cấu hình. Hệ thống đề xuất sử dụng kiến trúc đa tenant nguyên bản với cô lập ở mức cơ sở dữ liệu (mỗi tenant một schema riêng), cho phép một trung tâm có 100 chi nhánh trên cùng một instance, tiết kiệm khoảng 80% chi phí hạ tầng khi mở rộng.</w:t>
       </w:r>
     </w:p>
     <w:p>
@@ -24854,7 +24854,7 @@
           <w:i w:val="0"/>
           <w:sz w:val="26"/>
         </w:rPr>
-        <w:t>Bốn giao diện được trình bày trong ba nhóm chức năng trên đại diện cho các luồng đã hoàn thiện và có minh chứng thực tế trong giai đoạn thử nghiệm: trang chủ công khai mang thương hiệu riêng, tùy biến thương hiệu bằng AI, bảng tổng quan và quản lý học viên. Một số giao diện khác đã được xây dựng nhưng chưa đưa vào bộ minh chứng này do còn ở trạng thái dữ liệu chưa đầy đủ trong môi trường thử nghiệm — cụ thể là giao diện quản lý hóa đơn và thanh toán (đang trong quá trình hoàn thiện điểm cuối API tổng hợp số liệu) cùng các thống kê doanh thu. Các giao diện thuộc phạm vi giai đoạn tiếp theo gồm: cổng thông tin dành cho phụ huynh (nhóm người dùng đại diện P4), ứng dụng di động gốc (sau giai đoạn thương mại hóa), và quản lý học bạ K-12 (nhóm người dùng đại diện P5). Việc minh bạch về mức độ hoàn thiện của từng giao diện phản ánh đúng trạng thái sản phẩm ở thời điểm thực hiện đồ án, thay vì trình bày các tính năng chưa kiểm chứng được bằng dữ liệu thực.</w:t>
+        <w:t>Bốn giao diện được trình bày trong ba nhóm chức năng trên đại diện cho các luồng đã hoàn thiện và có minh chứng thực tế trong giai đoạn thử nghiệm: trang chủ công khai mang thương hiệu riêng, tùy biến thương hiệu bằng AI, bảng tổng quan và quản lý học viên. Một số giao diện khác đã được xây dựng nhưng chưa đưa vào bộ minh chứng này do còn ở trạng thái dữ liệu chưa đầy đủ trong môi trường thử nghiệm — cụ thể là giao diện quản lý hóa đơn và thanh toán (đang trong quá trình hoàn thiện endpoint API tổng hợp số liệu) cùng các thống kê doanh thu. Các giao diện thuộc phạm vi giai đoạn tiếp theo gồm: cổng thông tin dành cho phụ huynh (nhóm người dùng đại diện P4), ứng dụng di động gốc (sau giai đoạn thương mại hóa), và quản lý học bạ K-12 (nhóm người dùng đại diện P5). Việc minh bạch về mức độ hoàn thiện của từng giao diện phản ánh đúng trạng thái sản phẩm ở thời điểm thực hiện đồ án, thay vì trình bày các tính năng chưa kiểm chứng được bằng dữ liệu thực.</w:t>
       </w:r>
     </w:p>
     <w:p>
@@ -26200,7 +26200,7 @@
           <w:i w:val="0"/>
           <w:sz w:val="26"/>
         </w:rPr>
-        <w:t xml:space="preserve">Bốn lựa chọn thiết kế nổi bật của đường ống triển khai bao gồm: vai trò OIDC tạm thời (mỗi lần chạy workflow đảm nhận một vai trò mới với token một giờ, không nhúng cứng AWS access key trong GitHub Secrets); phạm vi IAM thu hẹp (vai trò </w:t>
+        <w:t xml:space="preserve">Bốn lựa chọn thiết kế nổi bật của pipeline bao gồm: vai trò OIDC tạm thời (mỗi lần chạy workflow assume role mới với token một giờ, không nhúng cứng AWS access key trong GitHub Secrets); phạm vi IAM thu hẹp (vai trò </w:t>
       </w:r>
       <w:r>
         <w:rPr>
@@ -26308,7 +26308,7 @@
           <w:i w:val="0"/>
           <w:sz w:val="26"/>
         </w:rPr>
-        <w:t xml:space="preserve"> nguyên văn để kích hoạt, phòng ngừa triển khai nhầm); và kiểm thử nhanh đăng nhập quản trị sau triển khai (kiểm thử gọi </w:t>
+        <w:t xml:space="preserve"> nguyên văn để kích hoạt, phòng ngừa triển khai nhầm); và smoke test admin-login sau triển khai (kiểm thử gọi </w:t>
       </w:r>
       <w:r>
         <w:rPr>
@@ -26326,7 +26326,7 @@
           <w:i w:val="0"/>
           <w:sz w:val="26"/>
         </w:rPr>
-        <w:t xml:space="preserve"> với thông tin quản trị viên đã được khởi tạo sẵn, kỳ vọng mã 200 và JWT — bắt được lỗi liên kết kiểu đặc thù PostgreSQL mà kiểm thử đơn vị với H2 hoặc Mockito không phát hiện được).</w:t>
+        <w:t xml:space="preserve"> với thông tin quản trị viên đã được khởi tạo sẵn, kỳ vọng mã 200 và JWT — bắt được lỗi class binding đặc thù PostgreSQL mà unit test với H2 hoặc Mockito không phát hiện được).</w:t>
       </w:r>
     </w:p>
     <w:p>
@@ -28044,7 +28044,7 @@
           <w:i w:val="0"/>
           <w:sz w:val="26"/>
         </w:rPr>
-        <w:t xml:space="preserve">Tính đến thời điểm thực hiện đồ án: 71 tài nguyên Terraform đã áp dụng (CloudTrail ghi nhận đầy đủ); hai thực thể EC2 và RDS PostgreSQL đa tenant với RLS đã chạy; Cloudflare DNS đã chuyển đổi (kitehub.me trỏ về ALB) cùng bản ghi wildcard </w:t>
+        <w:t xml:space="preserve">Tính đến thời điểm thực hiện đồ án: 71 tài nguyên Terraform đã apply (CloudTrail ghi nhận đầy đủ); hai EC2 instance và RDS PostgreSQL đa tenant với RLS đã chạy; Cloudflare DNS đã cutover (kitehub.me trỏ về ALB) cùng bản ghi wildcard </w:t>
       </w:r>
       <w:r>
         <w:rPr>
@@ -28062,7 +28062,7 @@
           <w:i w:val="0"/>
           <w:sz w:val="26"/>
         </w:rPr>
-        <w:t xml:space="preserve"> cho định tuyến trang chủ đa tenant; cơ chế phân giải Tenant → Domain → Landing (mục 2.2.6) hoạt động trên lớp gateway, được minh chứng qua trang chủ công khai của tenant mẫu Sky Education với giao diện thương hiệu riêng (mục 4.2); AWS SES đã được phê duyệt chế độ sản xuất; đường ống CI/CD OIDC + ECR + SSM hoạt động đầy đủ; cơ chế mời tenant thử nghiệm đã sẵn sàng nhận yêu cầu.</w:t>
+        <w:t xml:space="preserve"> cho định tuyến trang chủ đa tenant; cơ chế phân giải Tenant → Domain → Landing (mục 2.2.6) hoạt động trên lớp gateway, được minh chứng qua trang chủ công khai của tenant mẫu Sky Education với giao diện thương hiệu riêng (mục 4.2); AWS SES đã được phê duyệt production mode; CI/CD pipeline OIDC + ECR + SSM hoạt động đầy đủ; cơ chế mời tenant thử nghiệm đã sẵn sàng nhận yêu cầu.</w:t>
       </w:r>
     </w:p>
     <w:p>
@@ -28076,7 +28076,7 @@
           <w:color w:val="000000"/>
           <w:sz w:val="32"/>
         </w:rPr>
-        <w:t>4.2 Kết quả tương tác người dùng cuối và minh chứng</w:t>
+        <w:t>4.2 Kết quả tương tác end-user và minh chứng</w:t>
       </w:r>
     </w:p>
     <w:p>
@@ -28108,7 +28108,7 @@
           <w:i w:val="0"/>
           <w:sz w:val="26"/>
         </w:rPr>
-        <w:t>Tổng kết các thao tác chính đã được người dùng cuối thực hiện thành công (đăng ký tenant, cấu hình AI Branding, quản lý lớp học, phát hành hóa đơn, theo dõi nhật ký kiểm toán).</w:t>
+        <w:t>Tổng kết các thao tác chính đã được end-user thực hiện thành công (đăng ký tenant, cấu hình AI Branding, quản lý lớp học, phát hành hóa đơn, theo dõi audit log).</w:t>
       </w:r>
     </w:p>
     <w:p>

</xml_diff>

<commit_message>
docs(thesis): re-bake thesis-v1.docx with §6 + chapter H1 sync
80 pages, 534 paragraphs (no structural change, title text only).
</commit_message>
<xml_diff>
--- a/documents/08-thesis/thesis-v1.docx
+++ b/documents/08-thesis/thesis-v1.docx
@@ -3689,7 +3689,7 @@
           <w:i w:val="0"/>
           <w:sz w:val="26"/>
         </w:rPr>
-        <w:t>Chương 1 — Tổng quan: phân tích đối tượng tham khảo trên thị trường, kỹ thuật AI tích hợp, và khung pháp lý Việt Nam tác động đến nền tảng.</w:t>
+        <w:t>Chương 1 — Tổng quan về bài toán: phân tích hiện trạng thị trường, khảo sát các hệ thống tham khảo, kỹ thuật AI tích hợp và khung pháp lý Việt Nam tác động đến nền tảng.</w:t>
       </w:r>
     </w:p>
     <w:p>
@@ -3705,7 +3705,7 @@
           <w:i w:val="0"/>
           <w:sz w:val="26"/>
         </w:rPr>
-        <w:t>Chương 2 — Kiến trúc hệ thống: yêu cầu chức năng + phi chức năng, mô hình hóa C4 + Use Case + Class + ERD, thiết kế cơ sở dữ liệu, multi-tenant single-bucket, defense-in-depth 5 lớp.</w:t>
+        <w:t>Chương 2 — Phân tích và thiết kế hệ thống: yêu cầu chức năng và phi chức năng, mô hình hóa C4 Context + Container, sơ đồ use case, kiến trúc đa tenant single-bucket với defense-in-depth năm lớp.</w:t>
       </w:r>
     </w:p>
     <w:p>
@@ -3721,7 +3721,7 @@
           <w:i w:val="0"/>
           <w:sz w:val="26"/>
         </w:rPr>
-        <w:t>Chương 3 — Triển khai: kết quả triển khai giao diện sản phẩm và bộ kiểm thử ba lớp (unit / integration / E2E) với các sample test case cụ thể.</w:t>
+        <w:t>Chương 3 — Phân tích, thiết kế và triển khai hệ thống: triển khai giao diện sản phẩm, đoạn mã đại diện cho các luồng nghiệp vụ then chốt, bộ kiểm thử ba lớp (unit / integration / E2E) với các trường hợp kiểm thử mẫu cụ thể.</w:t>
       </w:r>
     </w:p>
     <w:p>
@@ -3737,7 +3737,7 @@
           <w:i w:val="0"/>
           <w:sz w:val="26"/>
         </w:rPr>
-        <w:t>Chương 4 — Kết quả triển khai: cloud AWS giai đoạn thử nghiệm tenant, user onboarding flow, KPI metrics, scope thử nghiệm.</w:t>
+        <w:t>Chương 4 — Đánh giá kết quả và Kết luận: triển khai cloud AWS giai đoạn thử nghiệm tenant, luồng onboarding người dùng, các KPI đo lường, phạm vi thử nghiệm và đề xuất hướng phát triển tiếp theo.</w:t>
       </w:r>
     </w:p>
     <w:p>

</xml_diff>

<commit_message>
docs(thesis): re-bake thesis-v1.docx with Bảng duplicate caption fix
80 pages, 534 paragraphs.
</commit_message>
<xml_diff>
--- a/documents/08-thesis/thesis-v1.docx
+++ b/documents/08-thesis/thesis-v1.docx
@@ -18009,20 +18009,11 @@
       <w:r>
         <w:rPr>
           <w:rFonts w:ascii="Times New Roman" w:hAnsi="Times New Roman" w:eastAsia="Times New Roman"/>
-          <w:b/>
-          <w:i w:val="0"/>
-          <w:sz w:val="26"/>
-        </w:rPr>
-        <w:t>Bảng `instances` (kitehub-subscription control-plane).</w:t>
-      </w:r>
-      <w:r>
-        <w:rPr>
-          <w:rFonts w:ascii="Times New Roman" w:hAnsi="Times New Roman" w:eastAsia="Times New Roman"/>
-          <w:b w:val="0"/>
-          <w:i w:val="0"/>
-          <w:sz w:val="26"/>
-        </w:rPr>
-        <w:t xml:space="preserve"> Bảng </w:t>
+          <w:b w:val="0"/>
+          <w:i w:val="0"/>
+          <w:sz w:val="26"/>
+        </w:rPr>
+        <w:t xml:space="preserve">Bảng </w:t>
       </w:r>
       <w:r>
         <w:rPr>
@@ -18040,7 +18031,7 @@
           <w:i w:val="0"/>
           <w:sz w:val="26"/>
         </w:rPr>
-        <w:t xml:space="preserve"> lưu metadata cấp tenant: mỗi dòng tương ứng với một trung tâm dạy thêm có dùng nền tảng. Bảng này thuộc service </w:t>
+        <w:t xml:space="preserve"> (microservice </w:t>
       </w:r>
       <w:r>
         <w:rPr>
@@ -18058,7 +18049,7 @@
           <w:i w:val="0"/>
           <w:sz w:val="26"/>
         </w:rPr>
-        <w:t xml:space="preserve"> và là source-of-truth cho vòng đời tenant (TRIAL / ACTIVE / SUSPENDED / CANCELLED).</w:t>
+        <w:t>, control-plane) lưu metadata cấp tenant: mỗi dòng tương ứng với một trung tâm dạy thêm có dùng nền tảng. Bảng này là source-of-truth cho vòng đời tenant (TRIAL / ACTIVE / SUSPENDED / CANCELLED).</w:t>
       </w:r>
     </w:p>
     <w:p>
@@ -19650,20 +19641,11 @@
       <w:r>
         <w:rPr>
           <w:rFonts w:ascii="Times New Roman" w:hAnsi="Times New Roman" w:eastAsia="Times New Roman"/>
-          <w:b/>
-          <w:i w:val="0"/>
-          <w:sz w:val="26"/>
-        </w:rPr>
-        <w:t>Bảng `classes` (kiteclass-core domain-plane).</w:t>
-      </w:r>
-      <w:r>
-        <w:rPr>
-          <w:rFonts w:ascii="Times New Roman" w:hAnsi="Times New Roman" w:eastAsia="Times New Roman"/>
-          <w:b w:val="0"/>
-          <w:i w:val="0"/>
-          <w:sz w:val="26"/>
-        </w:rPr>
-        <w:t xml:space="preserve"> Bảng </w:t>
+          <w:b w:val="0"/>
+          <w:i w:val="0"/>
+          <w:sz w:val="26"/>
+        </w:rPr>
+        <w:t xml:space="preserve">Bảng </w:t>
       </w:r>
       <w:r>
         <w:rPr>
@@ -19681,7 +19663,7 @@
           <w:i w:val="0"/>
           <w:sz w:val="26"/>
         </w:rPr>
-        <w:t xml:space="preserve"> đại diện cho lớp học cụ thể tại tenant (ví dụ </w:t>
+        <w:t xml:space="preserve"> (microservice </w:t>
       </w:r>
       <w:r>
         <w:rPr>
@@ -19690,6 +19672,24 @@
           <w:i/>
           <w:sz w:val="26"/>
         </w:rPr>
+        <w:t>kiteclass-core</w:t>
+      </w:r>
+      <w:r>
+        <w:rPr>
+          <w:rFonts w:ascii="Times New Roman" w:hAnsi="Times New Roman" w:eastAsia="Times New Roman"/>
+          <w:b w:val="0"/>
+          <w:i w:val="0"/>
+          <w:sz w:val="26"/>
+        </w:rPr>
+        <w:t xml:space="preserve">, domain-plane) đại diện cho lớp học cụ thể tại tenant (ví dụ </w:t>
+      </w:r>
+      <w:r>
+        <w:rPr>
+          <w:rFonts w:ascii="Times New Roman" w:hAnsi="Times New Roman" w:eastAsia="Times New Roman"/>
+          <w:b w:val="0"/>
+          <w:i/>
+          <w:sz w:val="26"/>
+        </w:rPr>
         <w:t>Lớp Anh ngữ 5A1</w:t>
       </w:r>
       <w:r>
@@ -19699,25 +19699,7 @@
           <w:i w:val="0"/>
           <w:sz w:val="26"/>
         </w:rPr>
-        <w:t xml:space="preserve"> mở từ tháng 9/2025 đến tháng 5/2026). Bảng này thuộc service </w:t>
-      </w:r>
-      <w:r>
-        <w:rPr>
-          <w:rFonts w:ascii="Times New Roman" w:hAnsi="Times New Roman" w:eastAsia="Times New Roman"/>
-          <w:b w:val="0"/>
-          <w:i/>
-          <w:sz w:val="26"/>
-        </w:rPr>
-        <w:t>kiteclass-core</w:t>
-      </w:r>
-      <w:r>
-        <w:rPr>
-          <w:rFonts w:ascii="Times New Roman" w:hAnsi="Times New Roman" w:eastAsia="Times New Roman"/>
-          <w:b w:val="0"/>
-          <w:i w:val="0"/>
-          <w:sz w:val="26"/>
-        </w:rPr>
-        <w:t xml:space="preserve"> và là entity domain trung tâm cho các tính năng điểm danh, chấm điểm, thanh toán học phí.</w:t>
+        <w:t xml:space="preserve"> mở từ tháng 9/2025 đến tháng 5/2026). Bảng này là entity domain trung tâm cho các tính năng điểm danh, chấm điểm, thanh toán học phí.</w:t>
       </w:r>
     </w:p>
     <w:p>
@@ -21286,20 +21268,11 @@
       <w:r>
         <w:rPr>
           <w:rFonts w:ascii="Times New Roman" w:hAnsi="Times New Roman" w:eastAsia="Times New Roman"/>
-          <w:b/>
-          <w:i w:val="0"/>
-          <w:sz w:val="26"/>
-        </w:rPr>
-        <w:t>Bảng `students` (kiteclass-core domain-plane).</w:t>
-      </w:r>
-      <w:r>
-        <w:rPr>
-          <w:rFonts w:ascii="Times New Roman" w:hAnsi="Times New Roman" w:eastAsia="Times New Roman"/>
-          <w:b w:val="0"/>
-          <w:i w:val="0"/>
-          <w:sz w:val="26"/>
-        </w:rPr>
-        <w:t xml:space="preserve"> Bảng </w:t>
+          <w:b w:val="0"/>
+          <w:i w:val="0"/>
+          <w:sz w:val="26"/>
+        </w:rPr>
+        <w:t xml:space="preserve">Bảng </w:t>
       </w:r>
       <w:r>
         <w:rPr>
@@ -21317,7 +21290,25 @@
           <w:i w:val="0"/>
           <w:sz w:val="26"/>
         </w:rPr>
-        <w:t xml:space="preserve"> lưu hồ sơ học sinh đã đăng ký tại tenant. Bảng này có volume lớn nhất trong các bảng domain (mục tiêu 50-500 học sinh/tenant ở giai đoạn thử nghiệm).</w:t>
+        <w:t xml:space="preserve"> (microservice </w:t>
+      </w:r>
+      <w:r>
+        <w:rPr>
+          <w:rFonts w:ascii="Times New Roman" w:hAnsi="Times New Roman" w:eastAsia="Times New Roman"/>
+          <w:b w:val="0"/>
+          <w:i/>
+          <w:sz w:val="26"/>
+        </w:rPr>
+        <w:t>kiteclass-core</w:t>
+      </w:r>
+      <w:r>
+        <w:rPr>
+          <w:rFonts w:ascii="Times New Roman" w:hAnsi="Times New Roman" w:eastAsia="Times New Roman"/>
+          <w:b w:val="0"/>
+          <w:i w:val="0"/>
+          <w:sz w:val="26"/>
+        </w:rPr>
+        <w:t>, domain-plane) lưu hồ sơ học sinh đã đăng ký tại tenant. Bảng này có volume lớn nhất trong các bảng domain (mục tiêu 50-500 học sinh/tenant ở giai đoạn thử nghiệm).</w:t>
       </w:r>
     </w:p>
     <w:p>

</xml_diff>

<commit_message>
docs(thesis): re-bake thesis-v1.docx with orphan ref fixes
80 pages, 534 paragraphs.
</commit_message>
<xml_diff>
--- a/documents/08-thesis/thesis-v1.docx
+++ b/documents/08-thesis/thesis-v1.docx
@@ -14954,7 +14954,7 @@
           <w:i w:val="0"/>
           <w:sz w:val="26"/>
         </w:rPr>
-        <w:t>Hình 2.4 trình bày tuần tự đăng nhập và một yêu cầu được xác thực sau đó cho luồng quản trị nền tảng.</w:t>
+        <w:t>Hình 2.4a-d trình bày tuần tự đăng nhập và một yêu cầu được xác thực sau đó cho luồng quản trị nền tảng.</w:t>
       </w:r>
     </w:p>
     <w:p>
@@ -16351,7 +16351,7 @@
           <w:i w:val="0"/>
           <w:sz w:val="26"/>
         </w:rPr>
-        <w:t>Luồng cấp phát tenant từ lúc người dùng tiềm năng gửi yêu cầu beta đến khi chủ sở hữu trung tâm đăng nhập lần đầu trải qua nhiều bước phối hợp giữa frontend, backend và các dịch vụ ngoài. Hình 2.7 trình bày tuần tự các bước theo ký pháp UML.</w:t>
+        <w:t>Luồng cấp phát tenant từ lúc người dùng tiềm năng gửi yêu cầu beta đến khi chủ sở hữu trung tâm đăng nhập lần đầu trải qua nhiều bước phối hợp giữa frontend, backend và các dịch vụ ngoài. Hình 2.7a-b trình bày tuần tự các bước theo ký pháp UML.</w:t>
       </w:r>
     </w:p>
     <w:p>

</xml_diff>

<commit_message>
docs(thesis): re-bake thesis-v1.docx with binary time-concept + page_break fix
Page count reduced (~80→78 pages) due to: tighter narrative without phase
nomenclature redundancy + image flow without forced page_break_before.
</commit_message>
<xml_diff>
--- a/documents/08-thesis/thesis-v1.docx
+++ b/documents/08-thesis/thesis-v1.docx
@@ -3833,7 +3833,7 @@
           <w:i w:val="0"/>
           <w:sz w:val="26"/>
         </w:rPr>
-        <w:t>Trung tâm dạy thêm tại Việt Nam vận hành theo mô hình học hỗn hợp (B-learning, blended learning) — kết hợp lớp học sau giờ chính khóa và cuối tuần, phân biệt với trường công lập chính khóa. Thị trường mục tiêu của đồ án là các trung tâm vừa và nhỏ với 50-500 học sinh; phạm vi K-12 (giáo dục phổ thông từ mầm non đến lớp 12) trường công có lớp tuân thủ pháp lý riêng (cán bộ bảo vệ dữ liệu DPO, đánh giá tác động bảo vệ dữ liệu DPIA, kiểm tra an ninh) được lùi sang giai đoạn vận hành chính thức.</w:t>
+        <w:t>Trung tâm dạy thêm tại Việt Nam vận hành theo mô hình học hỗn hợp (B-learning, blended learning) — kết hợp lớp học sau giờ chính khóa và cuối tuần, phân biệt với trường công lập chính khóa. Thị trường mục tiêu của đồ án là các trung tâm vừa và nhỏ với 50-500 học sinh; phạm vi K-12 (giáo dục phổ thông từ mầm non đến lớp 12) trường công có lớp tuân thủ pháp lý riêng (cán bộ bảo vệ dữ liệu DPO, đánh giá tác động bảo vệ dữ liệu DPIA, kiểm tra an ninh) được lùi sang lộ trình phát triển sau.</w:t>
       </w:r>
     </w:p>
     <w:p>
@@ -3885,7 +3885,7 @@
           <w:i w:val="0"/>
           <w:sz w:val="26"/>
         </w:rPr>
-        <w:t xml:space="preserve"> ứng tháng 9/2025 đến tháng 5/2026) gồm học kỳ 1 (tháng 9 đến tháng 12), học kỳ 2 (tháng 1 đến tháng 5) và học kỳ hè (tháng 6 đến tháng 8). Mẹ là đầu mối liên lạc chính cho việc học của con (~60%), bố dự phòng (35%), ông bà (5%). Khung Tết Nguyên Đán nghỉ 7-10 ngày cuối tháng 1, đầu tháng 2 yêu cầu lịch chạy tự động tính phí bỏ qua. Giai đoạn thử nghiệm hỗ trợ email; tích hợp Zalo OA cho phụ huynh là lộ trình giai đoạn vận hành chính thức.</w:t>
+        <w:t xml:space="preserve"> ứng tháng 9/2025 đến tháng 5/2026) gồm học kỳ 1 (tháng 9 đến tháng 12), học kỳ 2 (tháng 1 đến tháng 5) và học kỳ hè (tháng 6 đến tháng 8). Mẹ là đầu mối liên lạc chính cho việc học của con (~60%), bố dự phòng (35%), ông bà (5%). Khung Tết Nguyên Đán nghỉ 7-10 ngày cuối tháng 1, đầu tháng 2 yêu cầu lịch chạy tự động tính phí bỏ qua. Hệ thống đã hỗ trợ email cho tài liệu chính thức và đã kết nối kênh Zalo OA cho liên lạc với phụ huynh.</w:t>
       </w:r>
     </w:p>
     <w:p>
@@ -3899,7 +3899,7 @@
           <w:color w:val="000000"/>
           <w:sz w:val="28"/>
         </w:rPr>
-        <w:t>1.1.2 Phân tích nhóm người dùng đại diện giai đoạn thử nghiệm</w:t>
+        <w:t>1.1.2 Phân tích nhóm người dùng đại diện hiện tại</w:t>
       </w:r>
     </w:p>
     <w:p>
@@ -4077,7 +4077,7 @@
           <w:i w:val="0"/>
           <w:sz w:val="26"/>
         </w:rPr>
-        <w:t xml:space="preserve"> — phụ huynh nhận thông báo email cho tài liệu chính thức trong giai đoạn thử nghiệm và nhóm Zalo cho cập nhật thường xuyên ở giai đoạn vận hành chính thức; học sinh truy cập qua thiết bị di động chiếm 85% phiên.</w:t>
+        <w:t xml:space="preserve"> — phụ huynh nhận thông báo email cho tài liệu chính thức và nhận cập nhật thường xuyên qua nhóm Zalo OA đã được kết nối; học sinh truy cập qua thiết bị di động chiếm 85% phiên.</w:t>
       </w:r>
     </w:p>
     <w:p>
@@ -4669,7 +4669,7 @@
           <w:i w:val="0"/>
           <w:sz w:val="26"/>
         </w:rPr>
-        <w:t>Bên cạnh khảo sát các hệ thống đang có trên thị trường, đề tài tổng hợp nhu cầu sử dụng từ năm nhóm end-user dựa trên các báo cáo ngành công khai. Phân tích này giúp xác định những tính năng cốt lõi cần ưu tiên trong giai đoạn đầu của hệ thống đề xuất.</w:t>
+        <w:t>Bên cạnh khảo sát các hệ thống đang có trên thị trường, đề tài tổng hợp nhu cầu sử dụng từ năm nhóm end-user dựa trên các báo cáo ngành công khai. Phân tích này giúp xác định những tính năng cốt lõi cần ưu tiên trong định hướng triển khai ưu tiên.</w:t>
       </w:r>
     </w:p>
     <w:p>
@@ -6695,7 +6695,7 @@
           <w:i w:val="0"/>
           <w:sz w:val="26"/>
         </w:rPr>
-        <w:t xml:space="preserve"> việc lùi ứng dụng di động gốc và tích hợp Zalo ZNS sang các phiên bản sau có rủi ro mất khách so với Mona eLMS và Easy Edu vốn đã có ứng dụng gốc — giải pháp giảm thiểu là giao diện web đáp ứng kết hợp nhóm Zalo trong phiên bản đầu, ưu tiên ứng dụng gốc ở phiên bản kế tiếp. Cổng thanh toán cũng là điểm yếu khi DotB có sẵn ba cổng tích hợp — phiên bản đầu của hệ thống đề xuất sử dụng chuyển khoản ngân hàng kết hợp VietQR (không cần cổng), phiên bản kế tiếp hợp tác với một cổng chính (VNPay). Cuối cùng, nhận diện thương hiệu là rào cản khi Easy Edu và Mona eLMS có nhiều năm hiện diện thị trường trong khi hệ thống đề xuất mới ra mắt — giải pháp giảm thiểu là tiếp cận tăng trưởng dẫn dắt bởi sản phẩm, tiếp thị nội dung tiếng Việt và chương trình người dùng tiên phong với các trung tâm thử nghiệm.</w:t>
+        <w:t xml:space="preserve"> việc lùi ứng dụng di động gốc và tích hợp Zalo ZNS push notification sang lộ trình phát triển sau có rủi ro mất khách so với Mona eLMS và Easy Edu vốn đã có ứng dụng gốc — giải pháp giảm thiểu là giao diện web đáp ứng kết hợp nhóm Zalo đã được triển khai, ưu tiên ứng dụng di động gốc cho lộ trình phát triển sau. Cổng thanh toán cũng là điểm yếu khi DotB có sẵn ba cổng tích hợp — hệ thống đề xuất hiện tại sử dụng chuyển khoản ngân hàng kết hợp VietQR (không cần cổng), lộ trình phát triển sau bao gồm tích hợp cổng VNPay. Cuối cùng, nhận diện thương hiệu là rào cản khi Easy Edu và Mona eLMS có nhiều năm hiện diện thị trường trong khi hệ thống đề xuất mới ra mắt — giải pháp giảm thiểu là tiếp cận tăng trưởng dẫn dắt bởi sản phẩm, tiếp thị nội dung tiếng Việt và chương trình người dùng tiên phong với các trung tâm thử nghiệm.</w:t>
       </w:r>
     </w:p>
     <w:p>
@@ -6725,7 +6725,7 @@
           <w:i w:val="0"/>
           <w:sz w:val="26"/>
         </w:rPr>
-        <w:t>Đề tài chia thành các giai đoạn triển khai để cân bằng giữa độ phức tạp kỹ thuật, ngưỡng tuân thủ pháp lý và quy mô thị trường mục tiêu. Giai đoạn thử nghiệm tenant gồm vận hành thử với hai giáo viên độc lập (một dùng gói miễn phí, một dùng gói trả phí), tập trung kiểm chứng trình hướng dẫn khởi tạo tenant, mô-đun AI Branding, kiến trúc đa tenant và ngưỡng tuân thủ pháp lý cơ bản; phạm vi triển khai trong giai đoạn này không thu phí và chấp nhận chính sách giảm thiểu chi phí hạ tầng. Giai đoạn thanh toán thử nghiệm mở rộng nhóm tenant thử nghiệm lên 30-50 trung tâm với chính sách thu phí giới thiệu thấp hơn giá niêm yết, mục đích chính là kiểm chứng mô hình giá, luồng khởi tạo chính thức và hệ thống thanh toán chuyển khoản kèm đối soát tự động; giai đoạn này tích hợp hóa đơn điện tử (eInvoice) qua hợp tác với nhà cung cấp được Tổng cục Thuế cấp phép. Giai đoạn vận hành chính thức mở cho mọi trung tâm tự đăng ký không qua quy trình mời, đi kèm thỏa thuận mức dịch vụ (SLA — Service Level Agreement) cam kết thời gian hoạt động ≥99,5% và bổ sung các kênh hỗ trợ (trò chuyện trực tuyến, kênh hỗ trợ Zalo OA), ứng dụng di động gốc cho học viên và phụ huynh, đa cổng thanh toán tích hợp. Giai đoạn mở rộng sang khối phổ thông K-12 phục vụ trường công lập và tư thục cấp 1-2 với yêu cầu bổ nhiệm cán bộ bảo vệ dữ liệu (DPO — Data Protection Officer) chính thức, đánh giá tác động bảo vệ dữ liệu (DPIA — Data Protection Impact Assessment) cho dữ liệu trẻ em theo Luật Bảo vệ Dữ liệu Cá nhân Điều 17 và Điều 26, hợp tác với Bộ Giáo dục và Đào tạo cùng các sở phòng giáo dục địa phương cho phân phối.</w:t>
+        <w:t>Phạm vi triển khai hiện tại của đề tài bao gồm vận hành thử với hai giáo viên độc lập (một dùng gói miễn phí, một dùng gói trả phí), tập trung kiểm chứng trình hướng dẫn khởi tạo tenant, mô-đun AI Branding, kiến trúc đa tenant và ngưỡng tuân thủ pháp lý cơ bản. Hệ thống thanh toán chuyển khoản qua VietQR kèm đối soát tự động đã được tích hợp; kênh thông báo Zalo OA đã kết nối phục vụ liên lạc với phụ huynh; hóa đơn điện tử (eInvoice) qua hợp tác với nhà cung cấp được Tổng cục Thuế cấp phép cũng đã có sẵn cho luồng phát hành.</w:t>
       </w:r>
     </w:p>
     <w:p>
@@ -6741,7 +6741,23 @@
           <w:i w:val="0"/>
           <w:sz w:val="26"/>
         </w:rPr>
-        <w:t>Phạm vi triển khai của đề tài chủ yếu tập trung vào giai đoạn thử nghiệm tenant — bao gồm trình hướng dẫn khởi tạo cốt lõi, mô-đun AI Branding tự động, quản lý vòng đời tenant đầy đủ và tuân thủ pháp luật Việt Nam (PDPL, Luật An ninh mạng, ngưỡng hóa đơn điện tử). Các giai đoạn thanh toán thử nghiệm, vận hành chính thức và mở rộng sang khối K-12 được trình bày như lộ trình kỹ thuật nhưng không nằm trong phạm vi triển khai thực tế của đề tài. Việc tách giai đoạn này phù hợp với phương pháp luận sản phẩm tối giản khả thi (MVP — Minimum Viable Product) trong khởi nghiệp phần mềm — phát hành sản phẩm tối giản đáp ứng nhu cầu cốt lõi của nhóm người dùng đại diện ưu tiên trước, sau đó mở rộng dần các tính năng nâng cao theo phản hồi thị trường.</w:t>
+        <w:t>Lộ trình phát triển sau bao gồm các định hướng mở rộng cụ thể. Trước tiên, mở rộng nhóm tenant tham gia lên 30-50 trung tâm với chính sách thu phí giới thiệu thấp hơn giá niêm yết, mục đích chính là kiểm chứng mô hình giá ở quy mô lớn hơn. Tiếp theo, mở cho mọi trung tâm tự đăng ký không qua quy trình mời, đi kèm thỏa thuận mức dịch vụ (SLA — Service Level Agreement) cam kết thời gian hoạt động ≥99,5% và bổ sung kênh trò chuyện trực tuyến, ứng dụng di động gốc cho học viên và phụ huynh, đa cổng thanh toán tích hợp (VNPay, MoMo). Định hướng xa hơn là mở rộng sang khối phổ thông K-12 phục vụ trường công lập và tư thục cấp 1-2 với yêu cầu bổ nhiệm cán bộ bảo vệ dữ liệu (DPO — Data Protection Officer) chính thức, đánh giá tác động bảo vệ dữ liệu (DPIA — Data Protection Impact Assessment) cho dữ liệu trẻ em theo Luật Bảo vệ Dữ liệu Cá nhân Điều 17 và Điều 26, hợp tác với Bộ Giáo dục và Đào tạo cùng các sở phòng giáo dục địa phương cho phân phối.</w:t>
+      </w:r>
+    </w:p>
+    <w:p>
+      <w:pPr>
+        <w:spacing w:line="288" w:lineRule="auto"/>
+        <w:ind w:firstLine="567"/>
+        <w:jc w:val="both"/>
+      </w:pPr>
+      <w:r>
+        <w:rPr>
+          <w:rFonts w:ascii="Times New Roman" w:hAnsi="Times New Roman" w:eastAsia="Times New Roman"/>
+          <w:b w:val="0"/>
+          <w:i w:val="0"/>
+          <w:sz w:val="26"/>
+        </w:rPr>
+        <w:t>Việc tách phạm vi triển khai hiện tại khỏi lộ trình phát triển sau phù hợp với phương pháp luận sản phẩm tối giản khả thi (MVP — Minimum Viable Product) trong khởi nghiệp phần mềm — phát hành sản phẩm tối giản đáp ứng nhu cầu cốt lõi của nhóm người dùng đại diện ưu tiên trước, sau đó mở rộng dần các tính năng nâng cao theo phản hồi thị trường.</w:t>
       </w:r>
     </w:p>
     <w:p>
@@ -6987,7 +7003,7 @@
           <w:i w:val="0"/>
           <w:sz w:val="26"/>
         </w:rPr>
-        <w:t>Thanh toán qua VietQR là phương thức mặc định cho giai đoạn thử nghiệm thủ công; tích hợp MoMo/VNPay theo lộ trình giai đoạn vận hành chính thức</w:t>
+        <w:t>Thanh toán qua VietQR là phương thức mặc định cho phạm vi hiện tại thủ công; tích hợp MoMo/VNPay theo lộ trình phát triển sau</w:t>
       </w:r>
     </w:p>
     <w:p>
@@ -7546,7 +7562,7 @@
           <w:i w:val="0"/>
           <w:sz w:val="26"/>
         </w:rPr>
-        <w:t xml:space="preserve"> Gửi thông báo qua email formal cho phụ huynh khi có điểm mới, sự cố, nhắc hóa đơn; tích hợp Zalo OA mở rộng giai đoạn vận hành chính thức</w:t>
+        <w:t xml:space="preserve"> Gửi thông báo qua email formal cho phụ huynh khi có điểm mới, sự cố, nhắc hóa đơn; đã tích hợp Zalo OA</w:t>
       </w:r>
     </w:p>
     <w:p>
@@ -8193,7 +8209,7 @@
                 <w:i w:val="0"/>
                 <w:sz w:val="24"/>
               </w:rPr>
-              <w:t>(Bổ sung ngoài ISO 25010, ràng buộc kinh tế của giai đoạn thử nghiệm)</w:t>
+              <w:t>(Bổ sung ngoài ISO 25010, ràng buộc kinh tế hiện tại)</w:t>
             </w:r>
           </w:p>
         </w:tc>
@@ -8222,7 +8238,7 @@
           <w:i w:val="0"/>
           <w:sz w:val="26"/>
         </w:rPr>
-        <w:t xml:space="preserve"> Mục tiêu hiệu năng cho giai đoạn thử nghiệm được đặt như sau:</w:t>
+        <w:t xml:space="preserve"> Mục tiêu hiệu năng cho phạm vi hiện tại được đặt như sau:</w:t>
       </w:r>
     </w:p>
     <w:tbl>
@@ -8654,7 +8670,7 @@
           <w:i w:val="0"/>
           <w:sz w:val="26"/>
         </w:rPr>
-        <w:t>Khi quy mô tiến tới 50-200 tenant trong giai đoạn vận hành chính thức, hệ thống cần đánh giá lại khi connection pool đạt ngưỡng của instance cơ sở dữ liệu (~150 kết nối hoạt động).</w:t>
+        <w:t>Khi quy mô tiến tới 50-200 tenant trong lộ trình phát triển sau, hệ thống cần đánh giá lại khi connection pool đạt ngưỡng của instance cơ sở dữ liệu (~150 kết nối hoạt động).</w:t>
       </w:r>
     </w:p>
     <w:p>
@@ -8679,7 +8695,7 @@
           <w:i w:val="0"/>
           <w:sz w:val="26"/>
         </w:rPr>
-        <w:t xml:space="preserve"> Mục tiêu uptime của giai đoạn thử nghiệm là </w:t>
+        <w:t xml:space="preserve"> Mục tiêu uptime hiện tại là </w:t>
       </w:r>
       <w:r>
         <w:rPr>
@@ -8731,7 +8747,7 @@
           <w:i w:val="0"/>
           <w:sz w:val="26"/>
         </w:rPr>
-        <w:t xml:space="preserve"> (Singapore) phù hợp ràng buộc kinh tế giai đoạn đầu</w:t>
+        <w:t xml:space="preserve"> (Singapore) phù hợp ràng buộc kinh tế hiện tại</w:t>
       </w:r>
     </w:p>
     <w:p>
@@ -8813,7 +8829,7 @@
           <w:i w:val="0"/>
           <w:sz w:val="26"/>
         </w:rPr>
-        <w:t xml:space="preserve">Khi chuyển sang triển khai EKS multi-AZ với read replica ở giai đoạn vận hành chính thức, mục tiêu sẽ được nâng lên </w:t>
+        <w:t xml:space="preserve">Khi chuyển sang triển khai EKS multi-AZ với read replica ở lộ trình phát triển sau, mục tiêu sẽ được nâng lên </w:t>
       </w:r>
       <w:r>
         <w:rPr>
@@ -8831,7 +8847,7 @@
           <w:i w:val="0"/>
           <w:sz w:val="26"/>
         </w:rPr>
-        <w:t>. Việc theo dõi uptime thực tế qua Statuspage được lập kế hoạch cho giai đoạn vận hành chính thức.</w:t>
+        <w:t>. Việc theo dõi uptime thực tế qua Statuspage được lập kế hoạch cho lộ trình phát triển sau.</w:t>
       </w:r>
     </w:p>
     <w:p>
@@ -9561,7 +9577,7 @@
           <w:i w:val="0"/>
           <w:sz w:val="26"/>
         </w:rPr>
-        <w:t>Tuân thủ pháp lý phía Việt Nam ở giai đoạn thử nghiệm:</w:t>
+        <w:t>Tuân thủ pháp lý phía Việt Nam hiện tại:</w:t>
       </w:r>
     </w:p>
     <w:p>
@@ -9577,7 +9593,7 @@
           <w:i w:val="0"/>
           <w:sz w:val="26"/>
         </w:rPr>
-        <w:t>PDPL 2023 (Luật số 49/2023/QH15, có hiệu lực 2026-07-01) — giai đoạn thử nghiệm không thuộc nhóm K-12 với một disclaimer phù hợp về việc rà soát pháp lý tiếp tục trước khi phát hành chính thức</w:t>
+        <w:t>PDPL 2023 (Luật số 49/2023/QH15, có hiệu lực 2026-07-01) — hiện tại không thuộc nhóm K-12 với một disclaimer phù hợp về việc rà soát pháp lý tiếp tục trước khi phát hành chính thức</w:t>
       </w:r>
     </w:p>
     <w:p>
@@ -9627,7 +9643,7 @@
           <w:i w:val="0"/>
           <w:sz w:val="26"/>
         </w:rPr>
-        <w:t>Trước khi mở rộng sang phạm vi K-12 ở giai đoạn vận hành chính thức: DPO engagement, đánh giá tác động bảo vệ dữ liệu (DPIA), và rà soát pháp lý chuyên sâu cần được hoàn tất</w:t>
+        <w:t>Trước khi mở rộng sang phạm vi K-12 ở lộ trình phát triển sau: DPO engagement, đánh giá tác động bảo vệ dữ liệu (DPIA), và rà soát pháp lý chuyên sâu cần được hoàn tất</w:t>
       </w:r>
     </w:p>
     <w:p>
@@ -9686,7 +9702,7 @@
           <w:i w:val="0"/>
           <w:sz w:val="26"/>
         </w:rPr>
-        <w:t>Giai đoạn thử nghiệm: 10-50 tenant × 50-500 học sinh/tenant ≈ 5k-25k người dùng</w:t>
+        <w:t>Hiện tại: 10-50 tenant × 50-500 học sinh/tenant ≈ 5k-25k người dùng</w:t>
       </w:r>
     </w:p>
     <w:p>
@@ -9702,7 +9718,7 @@
           <w:i w:val="0"/>
           <w:sz w:val="26"/>
         </w:rPr>
-        <w:t>Giai đoạn vận hành chính thức: 50-200 tenant × 100-1000 học sinh/tenant ≈ 50k-200k người dùng thì mở rộng theo chiều dọc instance RDS</w:t>
+        <w:t>Lộ trình phát triển sau: 50-200 tenant × 100-1000 học sinh/tenant ≈ 50k-200k người dùng thì mở rộng theo chiều dọc instance RDS</w:t>
       </w:r>
     </w:p>
     <w:p>
@@ -9750,7 +9766,7 @@
           <w:i w:val="0"/>
           <w:sz w:val="26"/>
         </w:rPr>
-        <w:t>Connection pool: HikariCP 10 kết nối/service × 6 service = 60 baseline; tối đa 150 với RDS giai đoạn vận hành chính thức (kitehub-platform là thư viện JAR dùng chung, không có pool kết nối riêng)</w:t>
+        <w:t>Connection pool: HikariCP 10 kết nối/service × 6 service = 60 baseline; tối đa 150 với RDS lộ trình phát triển sau (kitehub-platform là thư viện JAR dùng chung, không có pool kết nối riêng)</w:t>
       </w:r>
     </w:p>
     <w:p>
@@ -9968,7 +9984,7 @@
           <w:i w:val="0"/>
           <w:sz w:val="26"/>
         </w:rPr>
-        <w:t xml:space="preserve"> Giai đoạn thử nghiệm vận hành dưới ràng buộc AWS Free Tier 12 tháng:</w:t>
+        <w:t xml:space="preserve"> Hiện tại vận hành dưới ràng buộc AWS Free Tier 12 tháng:</w:t>
       </w:r>
     </w:p>
     <w:p>
@@ -10084,7 +10100,7 @@
           <w:i w:val="0"/>
           <w:sz w:val="26"/>
         </w:rPr>
-        <w:t>Tổng chi phí ước tính giai đoạn thử nghiệm: $15-30/tháng</w:t>
+        <w:t>Tổng chi phí ước tính hiện tại: $15-30/tháng</w:t>
       </w:r>
       <w:r>
         <w:rPr>
@@ -10109,7 +10125,7 @@
           <w:i w:val="0"/>
           <w:sz w:val="26"/>
         </w:rPr>
-        <w:t>Quyết định kiến trúc bị neo bởi ràng buộc kinh tế: khóa luận lựa chọn mô hình single-bucket multi-tenant với RLS (Pattern 4) thay vì per-tenant DB (Pattern 1) — chênh lệch chi phí khoảng 20× và chi phí vận hành tăng tuyến tính theo số tenant, không phù hợp với phân khúc trung tâm SMB ở giai đoạn thử nghiệm (chi tiết §2.2.3).</w:t>
+        <w:t>Quyết định kiến trúc bị neo bởi ràng buộc kinh tế: khóa luận lựa chọn mô hình single-bucket multi-tenant với RLS (Pattern 4) thay vì per-tenant DB (Pattern 1) — chênh lệch chi phí khoảng 20× và chi phí vận hành tăng tuyến tính theo số tenant, không phù hợp với phân khúc trung tâm SMB hiện tại (chi tiết §2.2.3).</w:t>
       </w:r>
     </w:p>
     <w:p>
@@ -10584,7 +10600,7 @@
                 <w:i w:val="0"/>
                 <w:sz w:val="24"/>
               </w:rPr>
-              <w:t>Functional Suitability: giai đoạn thử nghiệm VietQR; mở rộng VNPay/MoMo giai đoạn vận hành chính thức</w:t>
+              <w:t>Functional Suitability: hiện tại VietQR; mở rộng VNPay/MoMo lộ trình phát triển sau</w:t>
             </w:r>
           </w:p>
         </w:tc>
@@ -10824,7 +10840,7 @@
                 <w:i w:val="0"/>
                 <w:sz w:val="24"/>
               </w:rPr>
-              <w:t>Usability: tích hợp Zalo OA cho phụ huynh là yêu cầu giai đoạn vận hành chính thức</w:t>
+              <w:t>Usability: Zalo OA đã được tích hợp cho phụ huynh</w:t>
             </w:r>
           </w:p>
         </w:tc>
@@ -10989,7 +11005,7 @@
               <a:graphicData uri="http://schemas.openxmlformats.org/drawingml/2006/picture">
                 <pic:pic>
                   <pic:nvPicPr>
-                    <pic:cNvPr id="0" name="mermaid-f5a7d770a853ce87.png"/>
+                    <pic:cNvPr id="0" name="mermaid-f4d25d807aa325d6.png"/>
                     <pic:cNvPicPr/>
                   </pic:nvPicPr>
                   <pic:blipFill>
@@ -11136,7 +11152,6 @@
     </w:p>
     <w:p>
       <w:pPr>
-        <w:pageBreakBefore/>
         <w:spacing w:before="120" w:after="120"/>
         <w:jc w:val="center"/>
       </w:pPr>
@@ -12102,7 +12117,7 @@
                 <w:i w:val="0"/>
                 <w:sz w:val="24"/>
               </w:rPr>
-              <w:t>Chi phí ~$295/tháng cho 10 tenant so với ~$15 cho Pool model (chênh 20×); chi phí vận hành N× backup + N× migration + N× monitoring tăng tuyến tính theo số tenant, không phù hợp với phân khúc trung tâm SMB ở giai đoạn thử nghiệm</w:t>
+              <w:t>Chi phí ~$295/tháng cho 10 tenant so với ~$15 cho Pool model (chênh 20×); chi phí vận hành N× backup + N× migration + N× monitoring tăng tuyến tính theo số tenant, không phù hợp với phân khúc trung tâm SMB hiện tại</w:t>
             </w:r>
           </w:p>
         </w:tc>
@@ -12314,7 +12329,7 @@
                 <w:i w:val="0"/>
                 <w:sz w:val="24"/>
               </w:rPr>
-              <w:t>Sẽ phát triển khi mở rộng K-12 doanh nghiệp ở giai đoạn vận hành chính thức và có yêu cầu cụ thể về cô lập vật lý từ khách hàng</w:t>
+              <w:t>Sẽ phát triển khi mở rộng K-12 doanh nghiệp ở lộ trình phát triển sau và có yêu cầu cụ thể về cô lập vật lý từ khách hàng</w:t>
             </w:r>
           </w:p>
         </w:tc>
@@ -12405,7 +12420,7 @@
           <w:i w:val="0"/>
           <w:sz w:val="26"/>
         </w:rPr>
-        <w:t xml:space="preserve"> ở từng trục (1 = không phù hợp / 5 = phù hợp nhất với phạm vi giai đoạn thử nghiệm SMB của đồ án). Tổng điểm tối đa 30 (6 trục × 5 điểm). Rubric này </w:t>
+        <w:t xml:space="preserve"> ở từng trục (1 = không phù hợp / 5 = phù hợp nhất với phạm vi hiện tại SMB của đồ án). Tổng điểm tối đa 30 (6 trục × 5 điểm). Rubric này </w:t>
       </w:r>
       <w:r>
         <w:rPr>
@@ -12423,7 +12438,7 @@
           <w:i w:val="0"/>
           <w:sz w:val="26"/>
         </w:rPr>
-        <w:t xml:space="preserve"> cho ngữ cảnh trung tâm dạy thêm SMB giai đoạn thử nghiệm của Kite Platform — tham khảo phương pháp luận đánh giá Pool/Bridge/Silo của AWS Well-Architected SaaS Lens [26, tr.21] và pattern comparison của Pothon [27], nhưng các trọng số trục cụ thể (chi phí ưu tiên cao do ràng buộc Free Tier, độ phức tạp vận hành ưu tiên cao do mô hình solo-dev) phản ánh ràng buộc kinh tế / nhân lực cụ thể của đồ án.</w:t>
+        <w:t xml:space="preserve"> cho ngữ cảnh trung tâm dạy thêm SMB hiện tại của Kite Platform — tham khảo phương pháp luận đánh giá Pool/Bridge/Silo của AWS Well-Architected SaaS Lens [26, tr.21] và pattern comparison của Pothon [27], nhưng các trọng số trục cụ thể (chi phí ưu tiên cao do ràng buộc Free Tier, độ phức tạp vận hành ưu tiên cao do mô hình solo-dev) phản ánh ràng buộc kinh tế / nhân lực cụ thể của đồ án.</w:t>
       </w:r>
     </w:p>
     <w:p>
@@ -12530,7 +12545,7 @@
           <w:i w:val="0"/>
           <w:sz w:val="26"/>
         </w:rPr>
-        <w:t>Phù hợp với phạm vi giai đoạn thử nghiệm:</w:t>
+        <w:t>Phù hợp với phạm vi hiện tại:</w:t>
       </w:r>
       <w:r>
         <w:rPr>
@@ -12629,7 +12644,7 @@
           <w:rFonts w:ascii="Times New Roman" w:hAnsi="Times New Roman" w:eastAsia="Times New Roman"/>
           <w:sz w:val="26"/>
         </w:rPr>
-        <w:t>. Ma trận so sánh 6 pattern trên 6 trục (Pattern 4 đạt tổng 26/30 cho giai đoạn thử nghiệm)</w:t>
+        <w:t>. Ma trận so sánh 6 pattern trên 6 trục (Pattern 4 đạt tổng 26/30 cho phạm vi hiện tại)</w:t>
       </w:r>
     </w:p>
     <w:tbl>
@@ -13290,7 +13305,7 @@
                 <w:i w:val="0"/>
                 <w:sz w:val="24"/>
               </w:rPr>
-              <w:t>Phù hợp với phạm vi giai đoạn thử nghiệm</w:t>
+              <w:t>Phù hợp với phạm vi hiện tại</w:t>
             </w:r>
           </w:p>
         </w:tc>
@@ -14100,16 +14115,16 @@
           <w:i w:val="0"/>
           <w:sz w:val="26"/>
         </w:rPr>
-        <w:t>Phù hợp với phạm vi giai đoạn thử nghiệm = 5:</w:t>
-      </w:r>
-      <w:r>
-        <w:rPr>
-          <w:rFonts w:ascii="Times New Roman" w:hAnsi="Times New Roman" w:eastAsia="Times New Roman"/>
-          <w:b w:val="0"/>
-          <w:i w:val="0"/>
-          <w:sz w:val="26"/>
-        </w:rPr>
-        <w:t xml:space="preserve"> Tổng chi phí hạ tầng ≤$15/tháng (RDS Free Tier 12 tháng đầu, ECS Fargate Spot, S3 dưới 5GB), phù hợp giai đoạn ≤10 tenant đầu của trung tâm SMB. Triển khai chỉ cần thêm cột </w:t>
+        <w:t>Phù hợp với phạm vi hiện tại = 5:</w:t>
+      </w:r>
+      <w:r>
+        <w:rPr>
+          <w:rFonts w:ascii="Times New Roman" w:hAnsi="Times New Roman" w:eastAsia="Times New Roman"/>
+          <w:b w:val="0"/>
+          <w:i w:val="0"/>
+          <w:sz w:val="26"/>
+        </w:rPr>
+        <w:t xml:space="preserve"> Tổng chi phí hạ tầng ≤$15/tháng (RDS Free Tier 12 tháng đầu, ECS Fargate Spot, S3 dưới 5GB), phù hợp quy mô ≤10 tenant đầu của trung tâm SMB. Triển khai chỉ cần thêm cột </w:t>
       </w:r>
       <w:r>
         <w:rPr>
@@ -14170,7 +14185,7 @@
           <w:i w:val="0"/>
           <w:sz w:val="26"/>
         </w:rPr>
-        <w:t xml:space="preserve"> PDPL Art 11. Điểm 4 (không phải 5) vì cô lập logic, không phải vật lý — khách hàng doanh nghiệp yêu cầu cô lập vật lý ở giai đoạn vận hành chính thức sẽ cần chuyển sang Hybrid Path A (xem P5).</w:t>
+        <w:t xml:space="preserve"> PDPL Art 11. Điểm 4 (không phải 5) vì cô lập logic, không phải vật lý — khách hàng doanh nghiệp yêu cầu cô lập vật lý ở lộ trình phát triển sau sẽ cần chuyển sang Hybrid Path A (xem P5).</w:t>
       </w:r>
     </w:p>
     <w:p>
@@ -14247,7 +14262,7 @@
           <w:i w:val="0"/>
           <w:sz w:val="26"/>
         </w:rPr>
-        <w:t>Pool model với RLS được chọn vì cân bằng giữa độ cô lập chấp nhận được (được tăng cường bởi chính sách NULL force-fail mô tả ở §2.2.4), chi phí vận hành thấp nhất, độ phù hợp với phạm vi giai đoạn thử nghiệm, và lộ trình chuyển đổi sang Hybrid Path A khi mở rộng đến nhóm khách hàng doanh nghiệp ở giai đoạn vận hành chính thức.</w:t>
+        <w:t>Pool model với RLS được chọn vì cân bằng giữa độ cô lập chấp nhận được (được tăng cường bởi chính sách NULL force-fail mô tả ở §2.2.4), chi phí vận hành thấp nhất, độ phù hợp với phạm vi hiện tại, và lộ trình chuyển đổi sang Hybrid Path A khi mở rộng đến nhóm khách hàng doanh nghiệp ở lộ trình phát triển sau.</w:t>
       </w:r>
     </w:p>
     <w:p>
@@ -14300,7 +14315,6 @@
     </w:p>
     <w:p>
       <w:pPr>
-        <w:pageBreakBefore/>
         <w:spacing w:before="120" w:after="120"/>
         <w:jc w:val="center"/>
       </w:pPr>
@@ -15223,7 +15237,6 @@
     </w:p>
     <w:p>
       <w:pPr>
-        <w:pageBreakBefore/>
         <w:spacing w:before="120" w:after="120"/>
         <w:jc w:val="center"/>
       </w:pPr>
@@ -15977,7 +15990,6 @@
     </w:p>
     <w:p>
       <w:pPr>
-        <w:pageBreakBefore/>
         <w:spacing w:before="120" w:after="120"/>
         <w:jc w:val="center"/>
       </w:pPr>
@@ -16622,7 +16634,6 @@
     </w:p>
     <w:p>
       <w:pPr>
-        <w:pageBreakBefore/>
         <w:spacing w:before="120" w:after="120"/>
         <w:jc w:val="center"/>
       </w:pPr>
@@ -21308,7 +21319,7 @@
           <w:i w:val="0"/>
           <w:sz w:val="26"/>
         </w:rPr>
-        <w:t>, domain-plane) lưu hồ sơ học sinh đã đăng ký tại tenant. Bảng này có volume lớn nhất trong các bảng domain (mục tiêu 50-500 học sinh/tenant ở giai đoạn thử nghiệm).</w:t>
+        <w:t>, domain-plane) lưu hồ sơ học sinh đã đăng ký tại tenant. Bảng này có volume lớn nhất trong các bảng domain (mục tiêu 50-500 học sinh/tenant hiện tại).</w:t>
       </w:r>
     </w:p>
     <w:p>
@@ -22653,7 +22664,7 @@
           <w:i w:val="0"/>
           <w:sz w:val="26"/>
         </w:rPr>
-        <w:t xml:space="preserve"> chứa thông tin cá nhân nhạy cảm và do đó phải tuân thủ PDPL 2023 Điều 11 [9] về quyền của chủ thể dữ liệu. Trong giai đoạn thử nghiệm cho trung tâm dạy thêm SMB, các trường nhạy cảm cao (CMND/CCCD, mã định danh học sinh quốc gia) không được lưu trữ; khi mở rộng sang K-12 ở giai đoạn vận hành chính thức, các yêu cầu của DPO/DPIA sẽ bổ sung trường mã hoá riêng cho thông tin trẻ vị thành niên.</w:t>
+        <w:t xml:space="preserve"> chứa thông tin cá nhân nhạy cảm và do đó phải tuân thủ PDPL 2023 Điều 11 [9] về quyền của chủ thể dữ liệu. Hiện tại cho trung tâm dạy thêm SMB, các trường nhạy cảm cao (CMND/CCCD, mã định danh học sinh quốc gia) không được lưu trữ; khi mở rộng sang K-12 ở lộ trình phát triển sau, các yêu cầu của DPO/DPIA sẽ bổ sung trường mã hoá riêng cho thông tin trẻ vị thành niên.</w:t>
       </w:r>
     </w:p>
     <w:p>
@@ -23023,7 +23034,7 @@
           <w:i w:val="0"/>
           <w:sz w:val="26"/>
         </w:rPr>
-        <w:t xml:space="preserve"> Đồ án thiết kế 4 gói dịch vụ (Bảng 2.11) — giai đoạn thử nghiệm kiểm thử FREE + STARTER; PRO và PRO_PLUS kích hoạt giai đoạn vận hành chính thức.</w:t>
+        <w:t xml:space="preserve"> Đồ án thiết kế 4 gói dịch vụ (Bảng 2.11) — hiện tại kiểm thử FREE + STARTER; PRO và PRO_PLUS kích hoạt lộ trình phát triển sau.</w:t>
       </w:r>
     </w:p>
     <w:p>
@@ -23841,7 +23852,7 @@
           <w:i w:val="0"/>
           <w:sz w:val="26"/>
         </w:rPr>
-        <w:t xml:space="preserve"> Giai đoạn thử nghiệm dùng VietQR thủ công: chủ sở hữu trung tâm chuyển khoản theo nội dung VietQR và upload ảnh xác nhận, quản trị nền tảng đối soát bằng tay. Cách tiếp cận này khớp thói quen thanh toán phổ biến (bank transfer chiếm ~70% giao dịch giáo dục) và tránh phụ thuộc giấy phép trung gian thanh toán trong giai đoạn xác thực sản phẩm.</w:t>
+        <w:t xml:space="preserve"> Hiện tại dùng VietQR thủ công: chủ sở hữu trung tâm chuyển khoản theo nội dung VietQR và upload ảnh xác nhận, quản trị nền tảng đối soát bằng tay. Cách tiếp cận này khớp thói quen thanh toán phổ biến (bank transfer chiếm ~70% giao dịch giáo dục) và tránh phụ thuộc giấy phép trung gian thanh toán trong quá trình kiểm chứng sản phẩm.</w:t>
       </w:r>
     </w:p>
     <w:p>
@@ -23857,7 +23868,7 @@
           <w:i w:val="0"/>
           <w:sz w:val="26"/>
         </w:rPr>
-        <w:t>Roadmap giai đoạn vận hành chính thức: hóa đơn điện tử VAT tích hợp MISA MeInvoice theo Thông tư 78/2021/TT-BTC (thay vì tự xây engine); cron tính phí bỏ qua khung Tết; merchant integration với VNPay/MoMo qua hình thức đối tác (không yêu cầu giấy phép PSP); hỗ trợ tự thu cho tenant ACTIVE theo lựa chọn; hoàn tiền và tranh chấp dưới dạng SOP thủ công.</w:t>
+        <w:t>Roadmap lộ trình phát triển sau: hóa đơn điện tử VAT tích hợp MISA MeInvoice theo Thông tư 78/2021/TT-BTC (thay vì tự xây engine); cron tính phí bỏ qua khung Tết; merchant integration với VNPay/MoMo qua hình thức đối tác (không yêu cầu giấy phép PSP); hỗ trợ tự thu cho tenant ACTIVE theo lựa chọn; hoàn tiền và tranh chấp dưới dạng SOP thủ công.</w:t>
       </w:r>
     </w:p>
     <w:p>
@@ -23907,7 +23918,7 @@
           <w:i w:val="0"/>
           <w:sz w:val="26"/>
         </w:rPr>
-        <w:t>Trước khi đi vào các đoạn mã đại diện, mục này tổng hợp công nghệ, công cụ và ngôn ngữ lập trình được sử dụng theo từng giai đoạn phát triển nền tảng KiteHub Platform.</w:t>
+        <w:t>Trước khi đi vào các đoạn mã đại diện, mục này tổng hợp công nghệ, công cụ và ngôn ngữ lập trình được sử dụng theo từng nội dung phát triển nền tảng KiteHub Platform.</w:t>
       </w:r>
     </w:p>
     <w:p>
@@ -24477,7 +24488,7 @@
           <w:i w:val="0"/>
           <w:sz w:val="26"/>
         </w:rPr>
-        <w:t>Phần này trình bày kết quả triển khai các giao diện cốt lõi của KiteHub Platform trong giai đoạn thử nghiệm theo ba luồng nghiệp vụ liên kết: hành trình khám phá và kích hoạt tenant của Chủ sở hữu trung tâm, các thao tác vận hành thường nhật, và bộ công cụ điều hành của Admin nền tảng. Các giao diện được nhóm theo flow nghiệp vụ thay vì liệt kê rời rạc nhằm phản ánh đúng trải nghiệm end-to-end của người dùng.</w:t>
+        <w:t>Phần này trình bày kết quả triển khai các giao diện cốt lõi của KiteHub Platform hiện tại theo ba luồng nghiệp vụ liên kết: hành trình khám phá và kích hoạt tenant của Chủ sở hữu trung tâm, các thao tác vận hành thường nhật, và bộ công cụ điều hành của Admin nền tảng. Các giao diện được nhóm theo flow nghiệp vụ thay vì liệt kê rời rạc nhằm phản ánh đúng trải nghiệm end-to-end của người dùng.</w:t>
       </w:r>
     </w:p>
     <w:p>
@@ -24491,7 +24502,7 @@
           <w:color w:val="000000"/>
           <w:sz w:val="28"/>
         </w:rPr>
-        <w:t>3.2.1 Luồng khám phá và kích hoạt tenant (Anonymous → Chủ sở hữu trung tâm)</w:t>
+        <w:t>3.2.1 Luồng khám phá và kích hoạt tenant (khách ẩn danh → chủ sở hữu trung tâm)</w:t>
       </w:r>
     </w:p>
     <w:p>
@@ -24647,7 +24658,7 @@
           <w:i w:val="0"/>
           <w:sz w:val="26"/>
         </w:rPr>
-        <w:t>) và mục câu hỏi thường gặp. Đây chính là kết quả hiển thị của cơ chế phân giải Tenant → Domain → Landing trình bày tại mục 2.2.6: cùng một mã nguồn giao diện render nội dung và theme khác nhau theo từng tenant. Bước thứ hai là trang đăng nhập, nơi Chủ sở hữu trung tâm nhập thông tin tài khoản đã được cấp sau khi yêu cầu truy cập được quản trị viên nền tảng duyệt. Bước thứ ba là dashboard tổng quan sau đăng nhập, hiển thị dòng tóm tắt "Trung tâm hiện có 78 học viên · 5 khóa học" cùng sáu thẻ chỉ số (Học viên, Khóa học, Giáo viên, Điểm danh hôm nay, Doanh thu tuần, Tỷ lệ giữ chân). Trong giai đoạn thử nghiệm, hai thẻ Học viên và Khóa học đã hiển thị số liệu thực (78 và 5), bốn thẻ còn lại tạm hiển thị dấu gạch ngang kèm ghi chú minh bạch "chưa có API tổng hợp; sẽ bổ sung khi endpoint thống kê dashboard sẵn sàng" — phản ánh trung thực mức độ hoàn thiện của tính năng thống kê ở thời điểm thực hiện đồ án.</w:t>
+        <w:t>) và mục câu hỏi thường gặp. Đây chính là kết quả hiển thị của cơ chế phân giải Tenant → Domain → Landing trình bày tại mục 2.2.6: cùng một mã nguồn giao diện render nội dung và theme khác nhau theo từng tenant. Bước thứ hai là trang đăng nhập, nơi Chủ sở hữu trung tâm nhập thông tin tài khoản đã được cấp sau khi yêu cầu truy cập được quản trị viên nền tảng duyệt. Bước thứ ba là dashboard tổng quan sau đăng nhập, hiển thị dòng tóm tắt "Trung tâm hiện có 78 học viên · 5 khóa học" cùng sáu thẻ chỉ số (Học viên, Khóa học, Giáo viên, Điểm danh hôm nay, Doanh thu tuần, Tỷ lệ giữ chân). Hiện tại, hai thẻ Học viên và Khóa học đã hiển thị số liệu thực (78 và 5), bốn thẻ còn lại tạm hiển thị dấu gạch ngang kèm ghi chú minh bạch "chưa có API tổng hợp; sẽ bổ sung khi endpoint thống kê dashboard sẵn sàng" — phản ánh trung thực mức độ hoàn thiện của tính năng thống kê ở thời điểm thực hiện đồ án.</w:t>
       </w:r>
     </w:p>
     <w:p>
@@ -24815,7 +24826,7 @@
           <w:i w:val="0"/>
           <w:sz w:val="26"/>
         </w:rPr>
-        <w:t>Sau khi tenant được kích hoạt, Chủ sở hữu trung tâm và Quản lý sử dụng nhóm chức năng vận hành để tổ chức học viên, lớp học và khóa học. Hình 3.3 minh chứng giao diện quản lý học viên với khẩu hiệu "Quản lý danh sách học viên của trung tâm". Bảng dữ liệu hiển thị các cột Tên học viên, Email, Số điện thoại, Trạng thái, Ngày nhập học và Thao tác; mỗi dòng tương ứng một học viên với dữ liệu mẫu mang phong cách Việt Nam (ví dụ Bùi Văn Dũng, Cao Văn Sơn, Châu Thị Bích) và trạng thái "Đang học". Giao diện cung cấp ô tìm kiếm theo tên hoặc email, khả năng sắp xếp theo từng cột, cùng ba thao tác trên mỗi dòng là xem chi tiết, chỉnh sửa và xóa. Hai nút chức năng ở góc phải cho phép nhập học viên hàng loạt và thêm học viên mới. Trong giai đoạn thử nghiệm, trung tâm mẫu đã có 78 học viên được quản lý qua giao diện này, khớp với chỉ số trên dashboard tổng quan tại Hình 3.1. Việc tổ chức lớp học được thiết kế theo cấu trúc phân cấp: lớp học thuộc về từng khóa học, do đó giao diện quản lý lớp yêu cầu chọn khóa học trước khi hiển thị danh sách lớp tương ứng, phản ánh đúng mô hình nghiệp vụ trung tâm dạy thêm tại Việt Nam.</w:t>
+        <w:t>Sau khi tenant được kích hoạt, Chủ sở hữu trung tâm và Quản lý sử dụng nhóm chức năng vận hành để tổ chức học viên, lớp học và khóa học. Hình 3.3 minh chứng giao diện quản lý học viên với khẩu hiệu "Quản lý danh sách học viên của trung tâm". Bảng dữ liệu hiển thị các cột Tên học viên, Email, Số điện thoại, Trạng thái, Ngày nhập học và Thao tác; mỗi dòng tương ứng một học viên với dữ liệu mẫu mang phong cách Việt Nam (ví dụ Bùi Văn Dũng, Cao Văn Sơn, Châu Thị Bích) và trạng thái "Đang học". Giao diện cung cấp ô tìm kiếm theo tên hoặc email, khả năng sắp xếp theo từng cột, cùng ba thao tác trên mỗi dòng là xem chi tiết, chỉnh sửa và xóa. Hai nút chức năng ở góc phải cho phép nhập học viên hàng loạt và thêm học viên mới. Hiện tại, trung tâm mẫu đã có 78 học viên được quản lý qua giao diện này, khớp với chỉ số trên dashboard tổng quan tại Hình 3.1. Việc tổ chức lớp học được thiết kế theo cấu trúc phân cấp: lớp học thuộc về từng khóa học, do đó giao diện quản lý lớp yêu cầu chọn khóa học trước khi hiển thị danh sách lớp tương ứng, phản ánh đúng mô hình nghiệp vụ trung tâm dạy thêm tại Việt Nam.</w:t>
       </w:r>
     </w:p>
     <w:p>
@@ -24845,7 +24856,7 @@
           <w:i w:val="0"/>
           <w:sz w:val="26"/>
         </w:rPr>
-        <w:t>Bốn giao diện được trình bày trong ba nhóm chức năng trên đại diện cho các luồng đã hoàn thiện và có minh chứng thực tế trong giai đoạn thử nghiệm: trang chủ công khai mang thương hiệu riêng, tùy biến thương hiệu bằng AI, bảng tổng quan và quản lý học viên. Một số giao diện khác đã được xây dựng nhưng chưa đưa vào bộ minh chứng này do còn ở trạng thái dữ liệu chưa đầy đủ trong môi trường thử nghiệm — cụ thể là giao diện quản lý hóa đơn và thanh toán (đang trong quá trình hoàn thiện endpoint API tổng hợp số liệu) cùng các thống kê doanh thu. Các giao diện thuộc phạm vi giai đoạn tiếp theo gồm: cổng thông tin dành cho phụ huynh (nhóm người dùng đại diện P4), ứng dụng di động gốc (sau giai đoạn thương mại hóa), và quản lý học bạ K-12 (nhóm người dùng đại diện P5). Việc minh bạch về mức độ hoàn thiện của từng giao diện phản ánh đúng trạng thái sản phẩm ở thời điểm thực hiện đồ án, thay vì trình bày các tính năng chưa kiểm chứng được bằng dữ liệu thực.</w:t>
+        <w:t>Bốn giao diện được trình bày trong ba nhóm chức năng trên đại diện cho các luồng đã hoàn thiện và có minh chứng thực tế hiện tại: trang chủ công khai mang thương hiệu riêng, tùy biến thương hiệu bằng AI, bảng tổng quan và quản lý học viên. Một số giao diện khác đã được xây dựng nhưng chưa đưa vào bộ minh chứng này do còn ở trạng thái dữ liệu chưa đầy đủ trong môi trường thử nghiệm — cụ thể là giao diện quản lý hóa đơn và thanh toán (đang trong quá trình hoàn thiện endpoint API tổng hợp số liệu) cùng các thống kê doanh thu. Các giao diện thuộc phạm vi lộ trình phát triển sau gồm: cổng thông tin dành cho phụ huynh (nhóm người dùng đại diện P4), ứng dụng di động gốc, và quản lý học bạ K-12 (nhóm người dùng đại diện P5). Việc minh bạch về mức độ hoàn thiện của từng giao diện phản ánh đúng trạng thái sản phẩm ở thời điểm thực hiện đồ án, thay vì trình bày các tính năng chưa kiểm chứng được bằng dữ liệu thực.</w:t>
       </w:r>
     </w:p>
     <w:p>
@@ -24889,7 +24900,7 @@
           <w:color w:val="000000"/>
           <w:sz w:val="28"/>
         </w:rPr>
-        <w:t>3.3.1 Test pyramid — chiến lược tổng quát</w:t>
+        <w:t>3.3.1 Tháp kiểm thử — chiến lược tổng quát</w:t>
       </w:r>
     </w:p>
     <w:p>
@@ -24910,7 +24921,6 @@
     </w:p>
     <w:p>
       <w:pPr>
-        <w:pageBreakBefore/>
         <w:spacing w:before="120" w:after="120"/>
         <w:jc w:val="center"/>
       </w:pPr>
@@ -25122,7 +25132,7 @@
           <w:i w:val="0"/>
           <w:sz w:val="26"/>
         </w:rPr>
-        <w:t xml:space="preserve">Tầng đỉnh — End-to-End test (top, khoảng 15-25 test cases): Kiểm thử user journey end-to-end qua browser thật (Chromium + Firefox + WebKit) bằng Playwright 1. Bao gồm các critical path: signup flow (visitor → tenant request → admin approve → claim code → first login), payment flow (giai đoạn thương mại hóa), class management flow (tạo lớp → thêm học sinh → điểm danh → xuất hóa đơn). E2E test chạy trong CI nightly schedule (không chạy mỗi PR vì thời gian 10-15 phút), cộng thêm chạy on-demand qua </w:t>
+        <w:t xml:space="preserve">Tầng đỉnh — End-to-End test (top, khoảng 15-25 test cases): Kiểm thử user journey end-to-end qua browser thật (Chromium + Firefox + WebKit) bằng Playwright 1. Bao gồm các critical path: signup flow (visitor → tenant request → admin approve → claim code → first login), payment flow (lộ trình phát triển sau), class management flow (tạo lớp → thêm học sinh → điểm danh → xuất hóa đơn). E2E test chạy trong CI nightly schedule (không chạy mỗi PR vì thời gian 10-15 phút), cộng thêm chạy on-demand qua </w:t>
       </w:r>
       <w:r>
         <w:rPr>
@@ -25186,7 +25196,7 @@
           <w:i w:val="0"/>
           <w:sz w:val="26"/>
         </w:rPr>
-        <w:t>Hạn chế kiểm thử: một số lĩnh vực coverage hiện còn thiếu và cần ưu tiên trước giai đoạn vận hành chính thức bao gồm kiểm thử tải (load test với JMeter mô phỏng 100 tenant concurrent + 10.000 student concurrent) chưa được vận hành định kỳ; kiểm thử bảo mật penetration test bên thứ ba chưa được tiến hành (mới có internal security audit); kiểm thử khả năng phục hồi sau thảm họa (DR drill — restore từ RDS snapshot tới fresh environment) chưa được vận hành định kỳ; coverage E2E test cho luồng AI Branding image generation pipeline thấp do dependency Stable Diffusion XL khó mock. Các hạn chế này được track riêng và schedule cho giai đoạn thương mại hóa hoặc giai đoạn vận hành chính thức tùy mức ưu tiên.</w:t>
+        <w:t>Hạn chế kiểm thử: một số lĩnh vực coverage hiện còn thiếu và cần ưu tiên trước lộ trình phát triển sau bao gồm kiểm thử tải (load test với JMeter mô phỏng 100 tenant concurrent + 10.000 student concurrent) chưa được vận hành định kỳ; kiểm thử bảo mật penetration test bên thứ ba chưa được tiến hành (mới có internal security audit); kiểm thử khả năng phục hồi sau thảm họa (DR drill — restore từ RDS snapshot tới fresh environment) chưa được vận hành định kỳ; coverage E2E test cho luồng AI Branding image generation pipeline thấp do dependency Stable Diffusion XL khó mock. Các hạn chế này được track riêng và schedule cho lộ trình phát triển sau hoặc lộ trình phát triển sau tùy mức ưu tiên.</w:t>
       </w:r>
     </w:p>
     <w:p>
@@ -25343,7 +25353,7 @@
           <w:i w:val="0"/>
           <w:sz w:val="26"/>
         </w:rPr>
-        <w:t xml:space="preserve"> — Giai đoạn thử nghiệm invite-only quy mô nhỏ (≤20 tenant) chưa kích hoạt ngưỡng quy định Nghị định 53/2022/NĐ-CP §26 (1 triệu user) cũng như ngưỡng PDPL Art 28 (10 nghìn data subject); roadmap migrate sang AWS Hanoi Local Zone hoặc nhà cung cấp cloud trong nước (Viettel Cloud, VNG Cloud) trong giai đoạn vận hành chính thức. Người dùng thử nghiệm ký explicit consent acknowledging "infrastructure provider AWS Singapore" trong giai đoạn thử nghiệm.</w:t>
+        <w:t xml:space="preserve"> — Hiện tại invite-only quy mô nhỏ (≤20 tenant) chưa kích hoạt ngưỡng quy định Nghị định 53/2022/NĐ-CP §26 (1 triệu user) cũng như ngưỡng PDPL Art 28 (10 nghìn data subject); roadmap migrate sang AWS Hanoi Local Zone hoặc nhà cung cấp cloud trong nước (Viettel Cloud, VNG Cloud) trong lộ trình phát triển sau. Người dùng thử nghiệm ký explicit consent acknowledging "infrastructure provider AWS Singapore" hiện tại.</w:t>
       </w:r>
     </w:p>
     <w:p>
@@ -25362,7 +25372,6 @@
     </w:p>
     <w:p>
       <w:pPr>
-        <w:pageBreakBefore/>
         <w:spacing w:before="120" w:after="120"/>
         <w:jc w:val="center"/>
       </w:pPr>
@@ -25428,7 +25437,6 @@
     </w:p>
     <w:p>
       <w:pPr>
-        <w:pageBreakBefore/>
         <w:spacing w:before="120" w:after="120"/>
         <w:jc w:val="center"/>
       </w:pPr>
@@ -25559,7 +25567,7 @@
           <w:i w:val="0"/>
           <w:sz w:val="26"/>
         </w:rPr>
-        <w:t xml:space="preserve"> (2 AZ tương ứng — yêu cầu tối thiểu của RDS DB subnet group) chứa RDS PostgreSQL không có public IP, chỉ chấp nhận kết nối từ security group của EC2 trong cùng VPC. Internet Gateway gắn vào VPC làm điểm vào duy nhất cho traffic ingress từ Cloudflare. NAT Gateway disable mặc định ở giai đoạn thử nghiệm để tiết kiệm chi phí (~30 USD/tháng); EC2 instances trong public subnet truy cập internet trực tiếp qua IGW.</w:t>
+        <w:t xml:space="preserve"> (2 AZ tương ứng — yêu cầu tối thiểu của RDS DB subnet group) chứa RDS PostgreSQL không có public IP, chỉ chấp nhận kết nối từ security group của EC2 trong cùng VPC. Internet Gateway gắn vào VPC làm điểm vào duy nhất cho traffic ingress từ Cloudflare. NAT Gateway disable mặc định hiện tại để tiết kiệm chi phí (~30 USD/tháng); EC2 instances trong public subnet truy cập internet trực tiếp qua IGW.</w:t>
       </w:r>
     </w:p>
     <w:p>
@@ -28083,7 +28091,7 @@
           <w:i w:val="0"/>
           <w:sz w:val="26"/>
         </w:rPr>
-        <w:t>[Phần này sẽ điền sau khi thu thập phản hồi từ các tenant thử nghiệm trong giai đoạn mời chính thức (từ 2026-05-19 trở đi). Nội dung dự kiến:</w:t>
+        <w:t>[Phần này sẽ điền sau khi thu thập phản hồi từ các tenant thử nghiệm trong hiện tại (từ 2026-05-19 trở đi). Nội dung dự kiến:</w:t>
       </w:r>
     </w:p>
     <w:p>

</xml_diff>

<commit_message>
docs(thesis): fix ch4 headings missed in prior commit
§4.1 "Cloud Deployment AWS" → "Triển khai cloud AWS"
§4.1.4 "CI/CD Pipeline" → "Pipeline CI/CD"

Edit failed during batch due to file-state race; follow-up applied.
Re-bake docx integrated.
</commit_message>
<xml_diff>
--- a/documents/08-thesis/thesis-v1.docx
+++ b/documents/08-thesis/thesis-v1.docx
@@ -25230,7 +25230,7 @@
           <w:color w:val="000000"/>
           <w:sz w:val="32"/>
         </w:rPr>
-        <w:t>4.1 Cloud Deployment AWS</w:t>
+        <w:t>4.1 Triển khai cloud AWS</w:t>
       </w:r>
     </w:p>
     <w:p>
@@ -26019,7 +26019,7 @@
           <w:color w:val="000000"/>
           <w:sz w:val="28"/>
         </w:rPr>
-        <w:t>4.1.4 CI/CD Pipeline</w:t>
+        <w:t>4.1.4 Pipeline CI/CD</w:t>
       </w:r>
     </w:p>
     <w:p>

</xml_diff>

<commit_message>
docs(thesis): strip standalone forward-ref duplicates Hình 2.4c/2.4d
ch2 §2.2.6 had standalone sentences right before Mermaid blocks that
duplicated the canonical caption underneath:
- L467 "Hình 2.4c mô tả chuỗi định tuyến tổng thể..." (user-flagged)
- L503 "Hình 2.4d trình bày tuần tự phân giải tenant..."

Both repeat what the canonical caption already states. Strip both —
analytical paragraph above leads into figure naturally, caption below
provides the labeled description.

Inline forward-refs at paragraph end (e.g. L172/L228/L539 "Hình X.Y
trình bày Y") kept since they're transitional, not duplicate.
</commit_message>
<xml_diff>
--- a/documents/08-thesis/thesis-v1.docx
+++ b/documents/08-thesis/thesis-v1.docx
@@ -15221,22 +15221,6 @@
     </w:p>
     <w:p>
       <w:pPr>
-        <w:spacing w:line="288" w:lineRule="auto"/>
-        <w:ind w:firstLine="567"/>
-        <w:jc w:val="both"/>
-      </w:pPr>
-      <w:r>
-        <w:rPr>
-          <w:rFonts w:ascii="Times New Roman" w:hAnsi="Times New Roman" w:eastAsia="Times New Roman"/>
-          <w:b w:val="0"/>
-          <w:i w:val="0"/>
-          <w:sz w:val="26"/>
-        </w:rPr>
-        <w:t>Hình 2.4c mô tả chuỗi định tuyến tổng thể từ trình duyệt đến dữ liệu landing của tenant.</w:t>
-      </w:r>
-    </w:p>
-    <w:p>
-      <w:pPr>
         <w:spacing w:before="120" w:after="120"/>
         <w:jc w:val="center"/>
       </w:pPr>
@@ -15802,22 +15786,6 @@
           <w:sz w:val="26"/>
         </w:rPr>
         <w:t>. So sánh subdomain và tên miền riêng trong cơ chế định tuyến đa tenant</w:t>
-      </w:r>
-    </w:p>
-    <w:p>
-      <w:pPr>
-        <w:spacing w:line="288" w:lineRule="auto"/>
-        <w:ind w:firstLine="567"/>
-        <w:jc w:val="both"/>
-      </w:pPr>
-      <w:r>
-        <w:rPr>
-          <w:rFonts w:ascii="Times New Roman" w:hAnsi="Times New Roman" w:eastAsia="Times New Roman"/>
-          <w:b w:val="0"/>
-          <w:i w:val="0"/>
-          <w:sz w:val="26"/>
-        </w:rPr>
-        <w:t>Hình 2.4d trình bày tuần tự phân giải tenant theo subdomain, từ yêu cầu trình duyệt đến dữ liệu landing được lọc bởi RLS.</w:t>
       </w:r>
     </w:p>
     <w:p>

</xml_diff>

<commit_message>
docs(thesis): strip 2 Bảng standalone forward-ref duplicates
ch2 §2.2.6 L490: "Bảng 2.6 so sánh hai phương thức truy cập..." stripped
  — canonical caption (L499) describes same content.

ch4 §4.1.6 L195: "Bảng 4.1 liệt kê các bản ghi DNS chính..." stripped
  — canonical caption (L206) describes same content.

Same pattern as prior Hình 2.4c/2.4d fix — forward-ref intro before
table/figure duplicates the canonical caption underneath.

Final sweep state (0 violations):
- Pattern 1 standalone "Hình X.Y [verb] ...": 0
- Pattern 2 standalone "Bảng X.Y [verb] ...": 0
- Pattern 3 bold-prefix non-canonical intro: 0
</commit_message>
<xml_diff>
--- a/documents/08-thesis/thesis-v1.docx
+++ b/documents/08-thesis/thesis-v1.docx
@@ -15363,22 +15363,6 @@
         <w:t xml:space="preserve"> dạng UUID và kiểm tra trạng thái tenant phải là ACTIVE hoặc TRIAL trước khi chuyển tiếp tới dịch vụ lõi; nếu trạng thái khác, gateway trả về mã 503 để chặn truy cập vào tenant bị tạm ngưng.</w:t>
       </w:r>
     </w:p>
-    <w:p>
-      <w:pPr>
-        <w:spacing w:line="288" w:lineRule="auto"/>
-        <w:ind w:firstLine="567"/>
-        <w:jc w:val="both"/>
-      </w:pPr>
-      <w:r>
-        <w:rPr>
-          <w:rFonts w:ascii="Times New Roman" w:hAnsi="Times New Roman" w:eastAsia="Times New Roman"/>
-          <w:b w:val="0"/>
-          <w:i w:val="0"/>
-          <w:sz w:val="26"/>
-        </w:rPr>
-        <w:t>Bảng 2.6 so sánh hai phương thức truy cập theo các tiêu chí cấp phát, DNS, chứng chỉ SSL và xác minh quyền sở hữu.</w:t>
-      </w:r>
-    </w:p>
     <w:tbl>
       <w:tblPr>
         <w:tblStyle w:val="TableGrid"/>
@@ -27055,40 +27039,6 @@
           <w:sz w:val="26"/>
         </w:rPr>
         <w:t>Cloudflare đảm nhận lớp biên (edge) phía trước hạ tầng AWS, cung cấp bốn nhóm chức năng: phân giải tên miền (DNS), proxy bảo vệ, mã hóa truyền tải (SSL/TLS) và định tuyến thư điện tử. Toàn bộ lưu lượng từ Internet đi qua Cloudflare trước khi tới Application Load Balancer, nhờ đó địa chỉ IP gốc của hạ tầng AWS không lộ ra ngoài.</w:t>
-      </w:r>
-    </w:p>
-    <w:p>
-      <w:pPr>
-        <w:spacing w:line="288" w:lineRule="auto"/>
-        <w:ind w:firstLine="567"/>
-        <w:jc w:val="both"/>
-      </w:pPr>
-      <w:r>
-        <w:rPr>
-          <w:rFonts w:ascii="Times New Roman" w:hAnsi="Times New Roman" w:eastAsia="Times New Roman"/>
-          <w:b w:val="0"/>
-          <w:i w:val="0"/>
-          <w:sz w:val="26"/>
-        </w:rPr>
-        <w:t xml:space="preserve">Bảng 4.1 liệt kê các bản ghi DNS chính được cấu hình cho tên miền </w:t>
-      </w:r>
-      <w:r>
-        <w:rPr>
-          <w:rFonts w:ascii="Times New Roman" w:hAnsi="Times New Roman" w:eastAsia="Times New Roman"/>
-          <w:b w:val="0"/>
-          <w:i/>
-          <w:sz w:val="26"/>
-        </w:rPr>
-        <w:t>kitehub.me</w:t>
-      </w:r>
-      <w:r>
-        <w:rPr>
-          <w:rFonts w:ascii="Times New Roman" w:hAnsi="Times New Roman" w:eastAsia="Times New Roman"/>
-          <w:b w:val="0"/>
-          <w:i w:val="0"/>
-          <w:sz w:val="26"/>
-        </w:rPr>
-        <w:t>.</w:t>
       </w:r>
     </w:p>
     <w:tbl>

</xml_diff>

<commit_message>
docs(thesis): drop §3.1.6 Tổ chức source code per user direction
Section showed source tree with LOC counts + transition note. Per user
"không cần phần này" — content removed entirely. §3.1 now ends at
§3.1.5 Công cụ triển khai with clean transition to §3.2 Kết quả triển
khai sản phẩm.

Heading structure §3.1.1-§3.1.5 (5 sub) still satisfies S1 ≥2 sibling
rule.
</commit_message>
<xml_diff>
--- a/documents/08-thesis/thesis-v1.docx
+++ b/documents/08-thesis/thesis-v1.docx
@@ -24093,324 +24093,6 @@
           <w:sz w:val="26"/>
         </w:rPr>
         <w:t xml:space="preserve"> (DNS + WAF + DDoS protection layer). Migration cơ sở dữ liệu qua Flyway 10 (versioned schema changes, idempotent migrations).</w:t>
-      </w:r>
-    </w:p>
-    <w:p>
-      <w:pPr>
-        <w:pStyle w:val="Heading3"/>
-      </w:pPr>
-      <w:r>
-        <w:rPr>
-          <w:rFonts w:ascii="Times New Roman" w:hAnsi="Times New Roman" w:eastAsia="Times New Roman"/>
-          <w:b/>
-          <w:color w:val="000000"/>
-          <w:sz w:val="28"/>
-        </w:rPr>
-        <w:t>3.1.6 Tổ chức source code</w:t>
-      </w:r>
-    </w:p>
-    <w:p>
-      <w:pPr>
-        <w:spacing w:line="240" w:lineRule="auto" w:before="0" w:after="0"/>
-        <w:ind w:left="283"/>
-      </w:pPr>
-      <w:r>
-        <w:rPr>
-          <w:rFonts w:ascii="Times New Roman" w:hAnsi="Times New Roman" w:eastAsia="Times New Roman"/>
-          <w:b w:val="0"/>
-          <w:i/>
-          <w:sz w:val="22"/>
-        </w:rPr>
-        <w:t>kitehub/</w:t>
-      </w:r>
-    </w:p>
-    <w:p>
-      <w:pPr>
-        <w:spacing w:line="240" w:lineRule="auto" w:before="0" w:after="0"/>
-        <w:ind w:left="283"/>
-      </w:pPr>
-      <w:r>
-        <w:rPr>
-          <w:rFonts w:ascii="Times New Roman" w:hAnsi="Times New Roman" w:eastAsia="Times New Roman"/>
-          <w:b w:val="0"/>
-          <w:i/>
-          <w:sz w:val="22"/>
-        </w:rPr>
-        <w:t>├── kitehub-gateway/           ~ 4,200 LOC      # API Gateway (Spring Cloud Gateway)</w:t>
-      </w:r>
-    </w:p>
-    <w:p>
-      <w:pPr>
-        <w:spacing w:line="240" w:lineRule="auto" w:before="0" w:after="0"/>
-        <w:ind w:left="283"/>
-      </w:pPr>
-      <w:r>
-        <w:rPr>
-          <w:rFonts w:ascii="Times New Roman" w:hAnsi="Times New Roman" w:eastAsia="Times New Roman"/>
-          <w:b w:val="0"/>
-          <w:i/>
-          <w:sz w:val="22"/>
-        </w:rPr>
-        <w:t>├── kitehub-platform/          ~ 5,800 LOC      # Tenant lifecycle service</w:t>
-      </w:r>
-    </w:p>
-    <w:p>
-      <w:pPr>
-        <w:spacing w:line="240" w:lineRule="auto" w:before="0" w:after="0"/>
-        <w:ind w:left="283"/>
-      </w:pPr>
-      <w:r>
-        <w:rPr>
-          <w:rFonts w:ascii="Times New Roman" w:hAnsi="Times New Roman" w:eastAsia="Times New Roman"/>
-          <w:b w:val="0"/>
-          <w:i/>
-          <w:sz w:val="22"/>
-        </w:rPr>
-        <w:t>├── kitehub-subscription/      ~ 7,100 LOC      # Subscription + billing service</w:t>
-      </w:r>
-    </w:p>
-    <w:p>
-      <w:pPr>
-        <w:spacing w:line="240" w:lineRule="auto" w:before="0" w:after="0"/>
-        <w:ind w:left="283"/>
-      </w:pPr>
-      <w:r>
-        <w:rPr>
-          <w:rFonts w:ascii="Times New Roman" w:hAnsi="Times New Roman" w:eastAsia="Times New Roman"/>
-          <w:b w:val="0"/>
-          <w:i/>
-          <w:sz w:val="22"/>
-        </w:rPr>
-        <w:t>├── kitehub-branding/          ~ 5,500 LOC      # AI Branding service</w:t>
-      </w:r>
-    </w:p>
-    <w:p>
-      <w:pPr>
-        <w:spacing w:line="240" w:lineRule="auto" w:before="0" w:after="0"/>
-        <w:ind w:left="283"/>
-      </w:pPr>
-      <w:r>
-        <w:rPr>
-          <w:rFonts w:ascii="Times New Roman" w:hAnsi="Times New Roman" w:eastAsia="Times New Roman"/>
-          <w:b w:val="0"/>
-          <w:i/>
-          <w:sz w:val="22"/>
-        </w:rPr>
-        <w:t>├── kitehub-email/             ~ 3,900 LOC      # Email notification service</w:t>
-      </w:r>
-    </w:p>
-    <w:p>
-      <w:pPr>
-        <w:spacing w:line="240" w:lineRule="auto" w:before="0" w:after="0"/>
-        <w:ind w:left="283"/>
-      </w:pPr>
-      <w:r>
-        <w:rPr>
-          <w:rFonts w:ascii="Times New Roman" w:hAnsi="Times New Roman" w:eastAsia="Times New Roman"/>
-          <w:b w:val="0"/>
-          <w:i/>
-          <w:sz w:val="22"/>
-        </w:rPr>
-        <w:t>├── kitehub-admin/             ~ 4,400 LOC      # Admin console service</w:t>
-      </w:r>
-    </w:p>
-    <w:p>
-      <w:pPr>
-        <w:spacing w:line="240" w:lineRule="auto" w:before="0" w:after="0"/>
-        <w:ind w:left="283"/>
-      </w:pPr>
-      <w:r>
-        <w:rPr>
-          <w:rFonts w:ascii="Times New Roman" w:hAnsi="Times New Roman" w:eastAsia="Times New Roman"/>
-          <w:b w:val="0"/>
-          <w:i/>
-          <w:sz w:val="22"/>
-        </w:rPr>
-        <w:t>├── kitehub-frontend/          ~ 12,800 LOC     # Next.js marketing + admin frontend</w:t>
-      </w:r>
-    </w:p>
-    <w:p>
-      <w:pPr>
-        <w:spacing w:line="240" w:lineRule="auto" w:before="0" w:after="0"/>
-        <w:ind w:left="283"/>
-      </w:pPr>
-      <w:r>
-        <w:rPr>
-          <w:rFonts w:ascii="Times New Roman" w:hAnsi="Times New Roman" w:eastAsia="Times New Roman"/>
-          <w:b w:val="0"/>
-          <w:i/>
-          <w:sz w:val="22"/>
-        </w:rPr>
-        <w:t xml:space="preserve"> </w:t>
-      </w:r>
-    </w:p>
-    <w:p>
-      <w:pPr>
-        <w:spacing w:line="240" w:lineRule="auto" w:before="0" w:after="0"/>
-        <w:ind w:left="283"/>
-      </w:pPr>
-      <w:r>
-        <w:rPr>
-          <w:rFonts w:ascii="Times New Roman" w:hAnsi="Times New Roman" w:eastAsia="Times New Roman"/>
-          <w:b w:val="0"/>
-          <w:i/>
-          <w:sz w:val="22"/>
-        </w:rPr>
-        <w:t>kiteclass/</w:t>
-      </w:r>
-    </w:p>
-    <w:p>
-      <w:pPr>
-        <w:spacing w:line="240" w:lineRule="auto" w:before="0" w:after="0"/>
-        <w:ind w:left="283"/>
-      </w:pPr>
-      <w:r>
-        <w:rPr>
-          <w:rFonts w:ascii="Times New Roman" w:hAnsi="Times New Roman" w:eastAsia="Times New Roman"/>
-          <w:b w:val="0"/>
-          <w:i/>
-          <w:sz w:val="22"/>
-        </w:rPr>
-        <w:t>├── kiteclass-core/            ~ 9,600 LOC      # Tenant application core</w:t>
-      </w:r>
-    </w:p>
-    <w:p>
-      <w:pPr>
-        <w:spacing w:line="240" w:lineRule="auto" w:before="0" w:after="0"/>
-        <w:ind w:left="283"/>
-      </w:pPr>
-      <w:r>
-        <w:rPr>
-          <w:rFonts w:ascii="Times New Roman" w:hAnsi="Times New Roman" w:eastAsia="Times New Roman"/>
-          <w:b w:val="0"/>
-          <w:i/>
-          <w:sz w:val="22"/>
-        </w:rPr>
-        <w:t>├── kiteclass-frontend/        ~ 8,500 LOC      # Next.js tenant frontend</w:t>
-      </w:r>
-    </w:p>
-    <w:p>
-      <w:pPr>
-        <w:spacing w:line="240" w:lineRule="auto" w:before="0" w:after="0"/>
-        <w:ind w:left="283"/>
-      </w:pPr>
-      <w:r>
-        <w:rPr>
-          <w:rFonts w:ascii="Times New Roman" w:hAnsi="Times New Roman" w:eastAsia="Times New Roman"/>
-          <w:b w:val="0"/>
-          <w:i/>
-          <w:sz w:val="22"/>
-        </w:rPr>
-        <w:t xml:space="preserve"> </w:t>
-      </w:r>
-    </w:p>
-    <w:p>
-      <w:pPr>
-        <w:spacing w:line="240" w:lineRule="auto" w:before="0" w:after="0"/>
-        <w:ind w:left="283"/>
-      </w:pPr>
-      <w:r>
-        <w:rPr>
-          <w:rFonts w:ascii="Times New Roman" w:hAnsi="Times New Roman" w:eastAsia="Times New Roman"/>
-          <w:b w:val="0"/>
-          <w:i/>
-          <w:sz w:val="22"/>
-        </w:rPr>
-        <w:t>infrastructure/</w:t>
-      </w:r>
-    </w:p>
-    <w:p>
-      <w:pPr>
-        <w:spacing w:line="240" w:lineRule="auto" w:before="0" w:after="0"/>
-        <w:ind w:left="283"/>
-      </w:pPr>
-      <w:r>
-        <w:rPr>
-          <w:rFonts w:ascii="Times New Roman" w:hAnsi="Times New Roman" w:eastAsia="Times New Roman"/>
-          <w:b w:val="0"/>
-          <w:i/>
-          <w:sz w:val="22"/>
-        </w:rPr>
-        <w:t>├── terraform-aws/             ~ 2,400 LOC      # AWS provisioning</w:t>
-      </w:r>
-    </w:p>
-    <w:p>
-      <w:pPr>
-        <w:spacing w:line="240" w:lineRule="auto" w:before="0" w:after="0"/>
-        <w:ind w:left="283"/>
-      </w:pPr>
-      <w:r>
-        <w:rPr>
-          <w:rFonts w:ascii="Times New Roman" w:hAnsi="Times New Roman" w:eastAsia="Times New Roman"/>
-          <w:b w:val="0"/>
-          <w:i/>
-          <w:sz w:val="22"/>
-        </w:rPr>
-        <w:t>├── helm/                      ~ 3,500 LOC      # Kubernetes manifests (deferred — current deploy = EC2 direct)</w:t>
-      </w:r>
-    </w:p>
-    <w:p>
-      <w:pPr>
-        <w:spacing w:line="240" w:lineRule="auto" w:before="0" w:after="0"/>
-        <w:ind w:left="283"/>
-      </w:pPr>
-      <w:r>
-        <w:rPr>
-          <w:rFonts w:ascii="Times New Roman" w:hAnsi="Times New Roman" w:eastAsia="Times New Roman"/>
-          <w:b w:val="0"/>
-          <w:i/>
-          <w:sz w:val="22"/>
-        </w:rPr>
-        <w:t xml:space="preserve"> </w:t>
-      </w:r>
-    </w:p>
-    <w:p>
-      <w:pPr>
-        <w:spacing w:line="240" w:lineRule="auto" w:before="0" w:after="0"/>
-        <w:ind w:left="283"/>
-      </w:pPr>
-      <w:r>
-        <w:rPr>
-          <w:rFonts w:ascii="Times New Roman" w:hAnsi="Times New Roman" w:eastAsia="Times New Roman"/>
-          <w:b w:val="0"/>
-          <w:i/>
-          <w:sz w:val="22"/>
-        </w:rPr>
-        <w:t>(tooling + tài liệu nội bộ)    ~ 12,000 LOC</w:t>
-      </w:r>
-    </w:p>
-    <w:p>
-      <w:pPr>
-        <w:spacing w:line="288" w:lineRule="auto"/>
-        <w:ind w:firstLine="567"/>
-        <w:jc w:val="both"/>
-      </w:pPr>
-      <w:r>
-        <w:rPr>
-          <w:rFonts w:ascii="Times New Roman" w:hAnsi="Times New Roman" w:eastAsia="Times New Roman"/>
-          <w:b w:val="0"/>
-          <w:i w:val="0"/>
-          <w:sz w:val="26"/>
-        </w:rPr>
-        <w:t xml:space="preserve">Tổng quy mô codebase ước tính khoảng 80.000 dòng (chưa tính tests và config), thể hiện tính chất production-grade của nền tảng. Chương này tập trung trình bày kết quả triển khai sản phẩm (giao diện người dùng) và kết quả kiểm thử + đánh giá chất lượng — code-level snippet analysis được lược bỏ khỏi flow chính theo convention báo cáo cử nhân CNTT (backup tại </w:t>
-      </w:r>
-      <w:r>
-        <w:rPr>
-          <w:rFonts w:ascii="Times New Roman" w:hAnsi="Times New Roman" w:eastAsia="Times New Roman"/>
-          <w:b w:val="0"/>
-          <w:i/>
-          <w:sz w:val="26"/>
-        </w:rPr>
-        <w:t>chapter-3-code-snippets-backup-2026-05-20.md</w:t>
-      </w:r>
-      <w:r>
-        <w:rPr>
-          <w:rFonts w:ascii="Times New Roman" w:hAnsi="Times New Roman" w:eastAsia="Times New Roman"/>
-          <w:b w:val="0"/>
-          <w:i w:val="0"/>
-          <w:sz w:val="26"/>
-        </w:rPr>
-        <w:t>).</w:t>
       </w:r>
     </w:p>
     <w:p>

</xml_diff>

<commit_message>
docs(thesis): strip §3.1 redundant intro sentence (stale + meta-fluff)
ch3 line 14: "Trước khi đi vào các đoạn mã đại diện, mục này tổng hợp
công nghệ, công cụ và ngôn ngữ lập trình..."

Stale: §3.1.6 source code tree dropped earlier → no "đoạn mã đại diện"
forward-ref needed. Plus meta-fluff — heading "## 3.1 Công nghệ sử dụng"
self-evident, không cần lead-in sentence.

Section now flows § heading → §3.1.1 Ngôn ngữ lập trình directly.
</commit_message>
<xml_diff>
--- a/documents/08-thesis/thesis-v1.docx
+++ b/documents/08-thesis/thesis-v1.docx
@@ -23855,22 +23855,6 @@
           <w:sz w:val="32"/>
         </w:rPr>
         <w:t>3.1 Công nghệ sử dụng</w:t>
-      </w:r>
-    </w:p>
-    <w:p>
-      <w:pPr>
-        <w:spacing w:line="288" w:lineRule="auto"/>
-        <w:ind w:firstLine="567"/>
-        <w:jc w:val="both"/>
-      </w:pPr>
-      <w:r>
-        <w:rPr>
-          <w:rFonts w:ascii="Times New Roman" w:hAnsi="Times New Roman" w:eastAsia="Times New Roman"/>
-          <w:b w:val="0"/>
-          <w:i w:val="0"/>
-          <w:sz w:val="26"/>
-        </w:rPr>
-        <w:t>Trước khi đi vào các đoạn mã đại diện, mục này tổng hợp công nghệ, công cụ và ngôn ngữ lập trình được sử dụng theo từng nội dung phát triển nền tảng KiteHub Platform.</w:t>
       </w:r>
     </w:p>
     <w:p>

</xml_diff>

<commit_message>
docs(thesis): strip plain "Nguồn: tác giả tự xây dựng" fluff (S8 update)
User direction 2026-05-29: "Nguồn: tác giả tự xây dựng" = thừa cho
author-original figures (sinh viên = author of thesis = default
attribution, không cần repeat).

Strip ch2:486 (Hình 2.4c) + ch2:521 (Hình 2.4d) — both plain
author-only attribution without external derivation citation.

Update thesis-content-standard.md S8 (Figure source attribution) —
author-original plain "tác giả tự xây dựng" giờ OPTIONAL (was MANDATORY
v2.0.0). Composite "tác giả tự xây dựng dựa trên [N]" still MANDATORY
for derived figures.

Kept derived attributions:
- ch3:48/57/66/103 screenshot + Mike Cohn citation
- ch1:39/50/61/72 competitor URLs (BeeClass/Mona/EasyEdu/DotB)
</commit_message>
<xml_diff>
--- a/documents/08-thesis/thesis-v1.docx
+++ b/documents/08-thesis/thesis-v1.docx
@@ -15281,16 +15281,7 @@
           <w:i w:val="0"/>
           <w:sz w:val="26"/>
         </w:rPr>
-        <w:t xml:space="preserve"> Chuỗi định tuyến Tenant → Domain → Landing từ trình duyệt qua Cloudflare DNS, gateway phân giải tenant theo Host, đến lớp dữ liệu cô lập RLS. </w:t>
-      </w:r>
-      <w:r>
-        <w:rPr>
-          <w:rFonts w:ascii="Times New Roman" w:hAnsi="Times New Roman" w:eastAsia="Times New Roman"/>
-          <w:b w:val="0"/>
-          <w:i/>
-          <w:sz w:val="26"/>
-        </w:rPr>
-        <w:t>Nguồn: tác giả tự xây dựng</w:t>
+        <w:t xml:space="preserve"> Chuỗi định tuyến Tenant → Domain → Landing từ trình duyệt qua Cloudflare DNS, gateway phân giải tenant theo Host, đến lớp dữ liệu cô lập RLS.</w:t>
       </w:r>
     </w:p>
     <w:p>
@@ -15834,16 +15825,7 @@
           <w:i w:val="0"/>
           <w:sz w:val="26"/>
         </w:rPr>
-        <w:t xml:space="preserve"> Tuần tự phân giải tenant theo subdomain — gateway ánh xạ Host thành định danh tenant rồi truyền ngữ cảnh xuống lớp dữ liệu RLS. </w:t>
-      </w:r>
-      <w:r>
-        <w:rPr>
-          <w:rFonts w:ascii="Times New Roman" w:hAnsi="Times New Roman" w:eastAsia="Times New Roman"/>
-          <w:b w:val="0"/>
-          <w:i/>
-          <w:sz w:val="26"/>
-        </w:rPr>
-        <w:t>Nguồn: tác giả tự xây dựng</w:t>
+        <w:t xml:space="preserve"> Tuần tự phân giải tenant theo subdomain — gateway ánh xạ Host thành định danh tenant rồi truyền ngữ cảnh xuống lớp dữ liệu RLS.</w:t>
       </w:r>
     </w:p>
     <w:p>

</xml_diff>

<commit_message>
docs(thesis): strip Mở đầu §3 "Về thời gian" redundant + binary time-concept fix
User flagged "Về thời gian, phạm vi triển khai kéo dài từ tháng 5/2026 đến hết
giai đoạn thử nghiệm tenant (~tháng 9/2026)" = thừa.

Issues:
1. Sentence redundant (concrete date range not needed in Mở đầu Phạm vi)
2. "giai đoạn thử nghiệm tenant" violates thesis-binary-time-concept v1.0.0 §1
3. Original structure "ba chiều: không gian, thời gian và đối tượng" included
   "thời gian" as separate dimension — drop it, keep 2 dimensions (không gian +
   đối tượng)

Plus same paragraph: "giai đoạn mở rộng K-12" → "lộ trình phát triển sau"
(binary time-concept rule).

Plus: "gói premium" → "gói trả phí" (avoid English jargon, plain VN).

Final phase-X audit: 0 banned instances across pipeline + 5 rendered chapters.
</commit_message>
<xml_diff>
--- a/documents/08-thesis/thesis-v1.docx
+++ b/documents/08-thesis/thesis-v1.docx
@@ -3487,7 +3487,7 @@
           <w:i w:val="0"/>
           <w:sz w:val="26"/>
         </w:rPr>
-        <w:t>Đồ án tập trung vào giai đoạn thử nghiệm tenant của nền tảng KiteHub, được giới hạn theo ba chiều: không gian, thời gian và đối tượng. Về không gian, hệ thống triển khai cloud trên AWS Singapore (ap-southeast-1) Free Tier, phục vụ nhóm trung tâm giáo dục thương mại tại Việt Nam (Hà Nội, TP. Hồ Chí Minh và các tỉnh lân cận). Về thời gian, phạm vi triển khai kéo dài từ tháng 5/2026 đến hết giai đoạn thử nghiệm tenant (~tháng 9/2026), với hai giáo viên độc lập (một dùng gói miễn phí, một dùng gói premium) trực tiếp sử dụng sản phẩm trong thực tế giảng dạy để thu thập phản hồi.</w:t>
+        <w:t>Phạm vi triển khai hiện tại của đồ án giới hạn theo hai chiều: không gian và đối tượng. Về không gian, hệ thống triển khai cloud trên AWS Singapore (ap-southeast-1) Free Tier, phục vụ nhóm trung tâm giáo dục thương mại tại Việt Nam (Hà Nội, TP. Hồ Chí Minh và các tỉnh lân cận), với hai giáo viên độc lập (một dùng gói miễn phí, một dùng gói trả phí) trực tiếp sử dụng sản phẩm trong thực tế giảng dạy để thu thập phản hồi.</w:t>
       </w:r>
     </w:p>
     <w:p>
@@ -3503,7 +3503,7 @@
           <w:i w:val="0"/>
           <w:sz w:val="26"/>
         </w:rPr>
-        <w:t>Về đối tượng, đồ án phục vụ ba nhóm người dùng chính: giáo viên độc lập (Solo Teacher, 1-50 học viên), chủ sở hữu trung tâm (Center Owner, 1-10 chi nhánh, 100-2.000 học viên), và quản lý trung tâm (Center Manager). Nhóm phụ huynh (Parent) và học viên (Student) thuộc phân khúc K-12 (Kindergarten to Grade 12 — bậc giáo dục phổ thông từ mẫu giáo đến lớp 12) được hoãn sang giai đoạn mở rộng K-12 do yêu cầu bổ sung DPO (Data Protection Officer — cán bộ bảo vệ dữ liệu) và DPIA (Data Protection Impact Assessment — đánh giá tác động bảo vệ dữ liệu) theo Điều 26 Luật Bảo vệ Dữ liệu Cá nhân 2023. Kiến trúc hệ thống cấu thành từ ba lớp dịch vụ. Lớp nền tảng KiteHub gồm sáu dịch vụ độc lập đảm nhận các trách nhiệm khác nhau: quản trị (kitehub-admin), nhận diện thương hiệu (kitehub-branding), thư điện tử (kitehub-email), điều phối yêu cầu (kitehub-gateway), thư viện dùng chung (kitehub-platform) và quản lý đăng ký (kitehub-subscription). Lớp nghiệp vụ tenant KiteClass tập trung tại dịch vụ kiteclass-core. Lớp giao diện gồm hai ứng dụng Next.js phục vụ tập người dùng khác nhau.</w:t>
+        <w:t>Về đối tượng, đồ án phục vụ ba nhóm người dùng chính: giáo viên độc lập (Solo Teacher, 1-50 học viên), chủ sở hữu trung tâm (Center Owner, 1-10 chi nhánh, 100-2.000 học viên), và quản lý trung tâm (Center Manager). Nhóm phụ huynh (Parent) và học viên (Student) thuộc phân khúc K-12 (Kindergarten to Grade 12 — bậc giáo dục phổ thông từ mẫu giáo đến lớp 12) thuộc lộ trình phát triển sau do yêu cầu bổ sung DPO (Data Protection Officer — cán bộ bảo vệ dữ liệu) và DPIA (Data Protection Impact Assessment — đánh giá tác động bảo vệ dữ liệu) theo Điều 26 Luật Bảo vệ Dữ liệu Cá nhân 2023. Kiến trúc hệ thống cấu thành từ ba lớp dịch vụ. Lớp nền tảng KiteHub gồm sáu dịch vụ độc lập đảm nhận các trách nhiệm khác nhau: quản trị (kitehub-admin), nhận diện thương hiệu (kitehub-branding), thư điện tử (kitehub-email), điều phối yêu cầu (kitehub-gateway), thư viện dùng chung (kitehub-platform) và quản lý đăng ký (kitehub-subscription). Lớp nghiệp vụ tenant KiteClass tập trung tại dịch vụ kiteclass-core. Lớp giao diện gồm hai ứng dụng Next.js phục vụ tập người dùng khác nhau.</w:t>
       </w:r>
     </w:p>
     <w:p>

</xml_diff>

<commit_message>
docs(thesis): strip 4 phase-X violations in pipeline Mở đầu + KẾT LUẬN
Sweep pipeline source (create_thesis_v1.py) found 4 lingering binary
time-concept violations from initial Wave thesis-3 sweep (only touched
chapter MD files, missed pipeline-embedded paragraphs):

- L1760 Mở đầu §5 Phương pháp: "trong giai đoạn thử nghiệm tenant"
  → "trong phạm vi hiện tại"
- L1811 KẾT LUẬN §1 Tổng kết: "trong phạm vi giai đoạn thử nghiệm tenant"
  → "trong phạm vi triển khai hiện tại"
- L1834 KẾT LUẬN §2 Hạn chế: "Phạm vi giai đoạn thử nghiệm tenant ..."
  + "sang giai đoạn mở rộng K-12" → "Phạm vi triển khai hiện tại ..."
  + "sang lộ trình phát triển sau"
- L1835: "do giai đoạn thử nghiệm" + "gói premium" → "do phạm vi triển
  khai hiện tại" + "gói trả phí"
- L1836: "sẽ được triển khai trong giai đoạn production" → "thuộc lộ
  trình phát triển sau"

Final phase-X audit: 0 banned instances total (pipeline + 5 chapters).
</commit_message>
<xml_diff>
--- a/documents/08-thesis/thesis-v1.docx
+++ b/documents/08-thesis/thesis-v1.docx
@@ -3643,7 +3643,7 @@
           <w:i w:val="0"/>
           <w:sz w:val="26"/>
         </w:rPr>
-        <w:t>Thứ ba, đồ án triển khai và kiểm thử hệ thống trên AWS Singapore Free Tier, với các pattern cốt lõi (Row-Level Security NULL force-fail, Outbox Pattern, truyền ngữ cảnh qua JWT — JSON Web Token, kiến trúc REST — Representational State Transfer — 3 tầng) được kiểm chứng qua unit test, integration test và E2E test. Thứ tư, đồ án trình bày kết quả triển khai thực tế trong giai đoạn thử nghiệm tenant kèm các KPI (Key Performance Indicator — chỉ số hiệu suất chính) đo lường, đánh giá độ trưởng thành và đề xuất hướng phát triển tiếp theo. Kết quả của đồ án vừa là sản phẩm phần mềm hoạt động được, vừa là tài liệu tham chiếu cho các công trình nghiên cứu kế tiếp về EdTech multi-tenant tại Việt Nam.</w:t>
+        <w:t>Thứ ba, đồ án triển khai và kiểm thử hệ thống trên AWS Singapore Free Tier, với các pattern cốt lõi (Row-Level Security NULL force-fail, Outbox Pattern, truyền ngữ cảnh qua JWT — JSON Web Token, kiến trúc REST — Representational State Transfer — 3 tầng) được kiểm chứng qua unit test, integration test và E2E test. Thứ tư, đồ án trình bày kết quả triển khai thực tế trong phạm vi hiện tại kèm các KPI (Key Performance Indicator — chỉ số hiệu suất chính) đo lường, đánh giá độ trưởng thành và đề xuất hướng phát triển tiếp theo. Kết quả của đồ án vừa là sản phẩm phần mềm hoạt động được, vừa là tài liệu tham chiếu cho các công trình nghiên cứu kế tiếp về EdTech multi-tenant tại Việt Nam.</w:t>
       </w:r>
     </w:p>
     <w:p>
@@ -28089,7 +28089,7 @@
           <w:i w:val="0"/>
           <w:sz w:val="26"/>
         </w:rPr>
-        <w:t>Đồ án đã hoàn thành các mục tiêu đặt ra ban đầu trong phạm vi giai đoạn thử nghiệm tenant của nền tảng KiteHub. Cụ thể, hệ thống được triển khai trên AWS Singapore Free Tier với kiến trúc multi-tenant single-bucket RLS-protected, 7 microservice cùng 2 ứng dụng frontend, đảm bảo tuân thủ các yêu cầu pháp lý Việt Nam (PDPL 2023, Luật An ninh mạng 2018, Thông tư 78/2021/TT-BTC).</w:t>
+        <w:t>Đồ án đã hoàn thành các mục tiêu đặt ra ban đầu trong phạm vi triển khai hiện tại của nền tảng KiteHub. Cụ thể, hệ thống được triển khai trên AWS Singapore Free Tier với kiến trúc multi-tenant single-bucket RLS-protected, 7 microservice cùng 2 ứng dụng frontend, đảm bảo tuân thủ các yêu cầu pháp lý Việt Nam (PDPL 2023, Luật An ninh mạng 2018, Thông tư 78/2021/TT-BTC).</w:t>
       </w:r>
     </w:p>
     <w:p>
@@ -28151,7 +28151,7 @@
           <w:i w:val="0"/>
           <w:sz w:val="26"/>
         </w:rPr>
-        <w:t>Phạm vi giai đoạn thử nghiệm tenant chỉ phục vụ ba nhóm người dùng (giáo viên độc lập, chủ sở hữu trung tâm, quản lý trung tâm); nhóm phụ huynh và học viên thuộc phân khúc K-12 được hoãn sang giai đoạn mở rộng K-12 do yêu cầu DPO + DPIA bổ sung theo PDPL.</w:t>
+        <w:t>Phạm vi triển khai hiện tại chỉ phục vụ ba nhóm người dùng (giáo viên độc lập, chủ sở hữu trung tâm, quản lý trung tâm); nhóm phụ huynh và học viên thuộc phân khúc K-12 thuộc lộ trình phát triển sau do yêu cầu DPO + DPIA bổ sung theo PDPL.</w:t>
       </w:r>
     </w:p>
     <w:p>
@@ -28167,7 +28167,7 @@
           <w:i w:val="0"/>
           <w:sz w:val="26"/>
         </w:rPr>
-        <w:t>Một số KPI thực tế (Time to First Value, Daily Active Users, Monthly Recurring Revenue) chưa có số liệu đầy đủ do giai đoạn thử nghiệm mới có hai giáo viên độc lập (một gói miễn phí, một gói premium) trực tiếp sử dụng để thu thập phản hồi.</w:t>
+        <w:t>Một số KPI thực tế (Time to First Value, Daily Active Users, Monthly Recurring Revenue) chưa có số liệu đầy đủ do phạm vi triển khai hiện tại mới có hai giáo viên độc lập (một gói miễn phí, một gói trả phí) trực tiếp sử dụng để thu thập phản hồi.</w:t>
       </w:r>
     </w:p>
     <w:p>
@@ -28183,7 +28183,7 @@
           <w:i w:val="0"/>
           <w:sz w:val="26"/>
         </w:rPr>
-        <w:t>AI Branding mới được tích hợp ở mức MVP với 1 nhà cung cấp (Replicate Stable Diffusion XL); các phương án multi-vendor failover sẽ được triển khai trong giai đoạn production.</w:t>
+        <w:t>AI Branding mới được tích hợp ở mức MVP với 1 nhà cung cấp (Replicate Stable Diffusion XL); các phương án multi-vendor failover thuộc lộ trình phát triển sau.</w:t>
       </w:r>
     </w:p>
     <w:p>

</xml_diff>

<commit_message>
docs(thesis): re-bake thesis-v1.docx with Mở đầu + ch1 content fixes
Integrates this session's fixes: Bảng 1.1 caption, Zalo/payment status lock,
binary-time sweep ch1, cut audit-7-dim + trim QDD methodology, drop §5 Tóm tắt
+ fix Ch.2 structure desc. Rubric heuristic 78/100 PASS C+ (504 paragraphs /
~70 pages / 22 figures rendered / C5 10/10 no project-internal refs).
</commit_message>
<xml_diff>
--- a/documents/08-thesis/thesis-v1.docx
+++ b/documents/08-thesis/thesis-v1.docx
@@ -2452,40 +2452,6 @@
                 <w:i w:val="0"/>
                 <w:sz w:val="24"/>
               </w:rPr>
-              <w:t>Lean</w:t>
-            </w:r>
-          </w:p>
-        </w:tc>
-        <w:tc>
-          <w:tcPr>
-            <w:tcW w:type="dxa" w:w="7087"/>
-          </w:tcPr>
-          <w:p>
-            <w:r>
-              <w:rPr>
-                <w:rFonts w:ascii="Times New Roman" w:hAnsi="Times New Roman" w:eastAsia="Times New Roman"/>
-                <w:b w:val="0"/>
-                <w:i w:val="0"/>
-                <w:sz w:val="24"/>
-              </w:rPr>
-              <w:t>Lean Software Development — phát triển phần mềm tinh gọn (Poppendieck)</w:t>
-            </w:r>
-          </w:p>
-        </w:tc>
-      </w:tr>
-      <w:tr>
-        <w:tc>
-          <w:tcPr>
-            <w:tcW w:type="dxa" w:w="1984"/>
-          </w:tcPr>
-          <w:p>
-            <w:r>
-              <w:rPr>
-                <w:rFonts w:ascii="Times New Roman" w:hAnsi="Times New Roman" w:eastAsia="Times New Roman"/>
-                <w:b/>
-                <w:i w:val="0"/>
-                <w:sz w:val="24"/>
-              </w:rPr>
               <w:t>LMS</w:t>
             </w:r>
           </w:p>
@@ -3457,7 +3423,7 @@
           <w:i w:val="0"/>
           <w:sz w:val="26"/>
         </w:rPr>
-        <w:t>Áp dụng phương pháp luận Quality-Driven Development để duy trì chất lượng mã nguồn và tài liệu trong suốt quá trình phát triển dài hạn.</w:t>
+        <w:t>Áp dụng các phương pháp luận phát triển phần mềm hướng chất lượng để duy trì chất lượng mã nguồn và tài liệu trong suốt quá trình phát triển.</w:t>
       </w:r>
     </w:p>
     <w:p>
@@ -3581,7 +3547,37 @@
           <w:i w:val="0"/>
           <w:sz w:val="26"/>
         </w:rPr>
-        <w:t>Áp dụng phương pháp luận Quality-Driven Development bốn trụ cột: phát triển hướng kiểm thử (TDD — Test-Driven Development, per Beck 2002), thiết kế hướng miền (DDD — Domain-Driven Design, per Evans 2003), chu trình Plan-Do-Check-Act (PDCA, per Deming 1986) và tư duy tinh gọn (Lean, per Poppendieck 2003) — mỗi vấn đề phát hiện được chuyển hóa thành quy tắc kiểm soát kèm cơ chế kiểm tra tự động, tích hợp ngay trong quy trình phát triển.</w:t>
+        <w:t>Áp dụng các phương pháp luận phát triển phần mềm hướng chất lượng: phát triển hướng kiểm thử (TDD — Test-Driven Development, theo Beck 2002), thiết kế hướng miền (DDD — Domain-Driven Design, theo Evans 2003) và chu trình cải tiến liên tục Plan-Do-Check-Act (PDCA, theo Deming 1986) — tích hợp trong toàn bộ quy trình phát triển nhằm duy trì chất lượng mã nguồn và tài liệu.</w:t>
+      </w:r>
+    </w:p>
+    <w:p>
+      <w:pPr>
+        <w:pStyle w:val="Heading2"/>
+      </w:pPr>
+      <w:r>
+        <w:rPr>
+          <w:rFonts w:ascii="Times New Roman" w:hAnsi="Times New Roman" w:eastAsia="Times New Roman"/>
+          <w:b/>
+          <w:color w:val="000000"/>
+          <w:sz w:val="32"/>
+        </w:rPr>
+        <w:t>5. Cấu trúc đồ án</w:t>
+      </w:r>
+    </w:p>
+    <w:p>
+      <w:pPr>
+        <w:spacing w:line="288" w:lineRule="auto"/>
+        <w:ind w:firstLine="567"/>
+        <w:jc w:val="both"/>
+      </w:pPr>
+      <w:r>
+        <w:rPr>
+          <w:rFonts w:ascii="Times New Roman" w:hAnsi="Times New Roman" w:eastAsia="Times New Roman"/>
+          <w:b w:val="0"/>
+          <w:i w:val="0"/>
+          <w:sz w:val="26"/>
+        </w:rPr>
+        <w:t>Đồ án gồm bốn chương nội dung chính:</w:t>
       </w:r>
     </w:p>
     <w:p>
@@ -3597,83 +3593,7 @@
           <w:i w:val="0"/>
           <w:sz w:val="26"/>
         </w:rPr>
-        <w:t>Đánh giá chất lượng hệ thống qua bộ audit bảy chiều (Quality, UI, Security, Performance, API — Application Programming Interface — Contract, Business Logic, Ops Readiness) chấm điểm /100 hoặc /128 định kỳ sau mỗi giai đoạn phát triển.</w:t>
-      </w:r>
-    </w:p>
-    <w:p>
-      <w:pPr>
-        <w:pStyle w:val="Heading2"/>
-      </w:pPr>
-      <w:r>
-        <w:rPr>
-          <w:rFonts w:ascii="Times New Roman" w:hAnsi="Times New Roman" w:eastAsia="Times New Roman"/>
-          <w:b/>
-          <w:color w:val="000000"/>
-          <w:sz w:val="32"/>
-        </w:rPr>
-        <w:t>5. Tóm tắt nội dung</w:t>
-      </w:r>
-    </w:p>
-    <w:p>
-      <w:pPr>
-        <w:spacing w:line="288" w:lineRule="auto"/>
-        <w:ind w:firstLine="567"/>
-        <w:jc w:val="both"/>
-      </w:pPr>
-      <w:r>
-        <w:rPr>
-          <w:rFonts w:ascii="Times New Roman" w:hAnsi="Times New Roman" w:eastAsia="Times New Roman"/>
-          <w:b w:val="0"/>
-          <w:i w:val="0"/>
-          <w:sz w:val="26"/>
-        </w:rPr>
-        <w:t>Đồ án trình bày bốn đóng góp chính tương ứng bốn chương nội dung. Thứ nhất, đồ án phân tích thị trường EdTech Việt Nam và khung pháp lý liên quan (PDPL 2023, Luật An ninh mạng 2018, Thông tư 29/2024/TT-BGDĐT) làm cơ sở xác định khoảng trống và nhu cầu của nhóm trung tâm vừa và nhỏ. Thứ hai, đồ án thiết kế và mô tả kiến trúc hệ thống multi-tenant SaaS với mô hình C4 (mô hình mô tả kiến trúc phần mềm bốn cấp Context-Container-Component-Code), kết hợp Use Case + Class + ERD (Entity-Relationship Diagram — sơ đồ thực thể-quan hệ) và sơ đồ tuần tự cho các luồng quan trọng (đăng ký, kích hoạt subscription).</w:t>
-      </w:r>
-    </w:p>
-    <w:p>
-      <w:pPr>
-        <w:spacing w:line="288" w:lineRule="auto"/>
-        <w:ind w:firstLine="567"/>
-        <w:jc w:val="both"/>
-      </w:pPr>
-      <w:r>
-        <w:rPr>
-          <w:rFonts w:ascii="Times New Roman" w:hAnsi="Times New Roman" w:eastAsia="Times New Roman"/>
-          <w:b w:val="0"/>
-          <w:i w:val="0"/>
-          <w:sz w:val="26"/>
-        </w:rPr>
-        <w:t>Thứ ba, đồ án triển khai và kiểm thử hệ thống trên AWS Singapore Free Tier, với các pattern cốt lõi (Row-Level Security NULL force-fail, Outbox Pattern, truyền ngữ cảnh qua JWT — JSON Web Token, kiến trúc REST — Representational State Transfer — 3 tầng) được kiểm chứng qua unit test, integration test và E2E test. Thứ tư, đồ án trình bày kết quả triển khai thực tế trong phạm vi hiện tại kèm các KPI (Key Performance Indicator — chỉ số hiệu suất chính) đo lường, đánh giá độ trưởng thành và đề xuất hướng phát triển tiếp theo. Kết quả của đồ án vừa là sản phẩm phần mềm hoạt động được, vừa là tài liệu tham chiếu cho các công trình nghiên cứu kế tiếp về EdTech multi-tenant tại Việt Nam.</w:t>
-      </w:r>
-    </w:p>
-    <w:p>
-      <w:pPr>
-        <w:pStyle w:val="Heading2"/>
-      </w:pPr>
-      <w:r>
-        <w:rPr>
-          <w:rFonts w:ascii="Times New Roman" w:hAnsi="Times New Roman" w:eastAsia="Times New Roman"/>
-          <w:b/>
-          <w:color w:val="000000"/>
-          <w:sz w:val="32"/>
-        </w:rPr>
-        <w:t>6. Cấu trúc đồ án</w:t>
-      </w:r>
-    </w:p>
-    <w:p>
-      <w:pPr>
-        <w:spacing w:line="288" w:lineRule="auto"/>
-        <w:ind w:firstLine="567"/>
-        <w:jc w:val="both"/>
-      </w:pPr>
-      <w:r>
-        <w:rPr>
-          <w:rFonts w:ascii="Times New Roman" w:hAnsi="Times New Roman" w:eastAsia="Times New Roman"/>
-          <w:b w:val="0"/>
-          <w:i w:val="0"/>
-          <w:sz w:val="26"/>
-        </w:rPr>
-        <w:t>Đồ án gồm bốn chương nội dung chính:</w:t>
+        <w:t>Chương 1 — Tổng quan về bài toán: phân tích hiện trạng thị trường, khảo sát các hệ thống tham khảo, kỹ thuật AI tích hợp và khung pháp lý Việt Nam tác động đến nền tảng.</w:t>
       </w:r>
     </w:p>
     <w:p>
@@ -3689,23 +3609,7 @@
           <w:i w:val="0"/>
           <w:sz w:val="26"/>
         </w:rPr>
-        <w:t>Chương 1 — Tổng quan về bài toán: phân tích hiện trạng thị trường, khảo sát các hệ thống tham khảo, kỹ thuật AI tích hợp và khung pháp lý Việt Nam tác động đến nền tảng.</w:t>
-      </w:r>
-    </w:p>
-    <w:p>
-      <w:pPr>
-        <w:pStyle w:val="ListBullet"/>
-        <w:spacing w:line="288" w:lineRule="auto"/>
-        <w:ind w:left="850" w:hanging="283"/>
-      </w:pPr>
-      <w:r>
-        <w:rPr>
-          <w:rFonts w:ascii="Times New Roman" w:hAnsi="Times New Roman" w:eastAsia="Times New Roman"/>
-          <w:b w:val="0"/>
-          <w:i w:val="0"/>
-          <w:sz w:val="26"/>
-        </w:rPr>
-        <w:t>Chương 2 — Phân tích và thiết kế hệ thống: yêu cầu chức năng và phi chức năng, mô hình hóa C4 Context + Container, sơ đồ use case, kiến trúc đa tenant single-bucket với defense-in-depth năm lớp.</w:t>
+        <w:t>Chương 2 — Phân tích và thiết kế hệ thống: yêu cầu chức năng và phi chức năng; thiết kế kiến trúc tổng thể với mô hình C4 (sơ đồ ngữ cảnh và sơ đồ container), kiến trúc đa tenant single-bucket kết hợp Row-Level Security và phòng thủ chiều sâu năm lớp; thiết kế chi tiết gồm sơ đồ lớp, sơ đồ quan hệ thực thể (ERD), sơ đồ tuần tự, máy trạng thái vòng đời tenant, thiết kế cơ sở dữ liệu và mô hình gói dịch vụ.</w:t>
       </w:r>
     </w:p>
     <w:p>
@@ -4840,7 +4744,29 @@
           <w:i w:val="0"/>
           <w:sz w:val="26"/>
         </w:rPr>
-        <w:t>Bảng tổng hợp so sánh bốn hệ thống tham khảo với hệ thống đề xuất trong đề tài theo các tiêu chí quan trọng:</w:t>
+        <w:t>Bảng 1.1 tổng hợp so sánh bốn hệ thống tham khảo với hệ thống đề xuất trong đề tài theo các tiêu chí quan trọng.</w:t>
+      </w:r>
+    </w:p>
+    <w:p>
+      <w:pPr>
+        <w:pStyle w:val="BảngCaption"/>
+        <w:spacing w:before="120" w:after="240"/>
+        <w:jc w:val="center"/>
+      </w:pPr>
+      <w:r>
+        <w:rPr>
+          <w:rFonts w:ascii="Times New Roman" w:hAnsi="Times New Roman" w:eastAsia="Times New Roman"/>
+          <w:b/>
+          <w:sz w:val="26"/>
+        </w:rPr>
+        <w:t>Bảng 1.1</w:t>
+      </w:r>
+      <w:r>
+        <w:rPr>
+          <w:rFonts w:ascii="Times New Roman" w:hAnsi="Times New Roman" w:eastAsia="Times New Roman"/>
+          <w:sz w:val="26"/>
+        </w:rPr>
+        <w:t>. So sánh bốn hệ thống tham khảo với hệ thống đề xuất theo các tiêu chí quan trọng</w:t>
       </w:r>
     </w:p>
     <w:tbl>
@@ -5689,7 +5615,7 @@
                 <w:i w:val="0"/>
                 <w:sz w:val="24"/>
               </w:rPr>
-              <w:t>Phiên bản sau</w:t>
+              <w:t>Phát triển sau</w:t>
             </w:r>
           </w:p>
         </w:tc>
@@ -5773,7 +5699,7 @@
                 <w:i w:val="0"/>
                 <w:sz w:val="24"/>
               </w:rPr>
-              <w:t>Phiên bản sau</w:t>
+              <w:t>Phát triển sau</w:t>
             </w:r>
           </w:p>
         </w:tc>
@@ -5796,7 +5722,7 @@
                 <w:i w:val="0"/>
                 <w:sz w:val="24"/>
               </w:rPr>
-              <w:t>Tích hợp Zalo ZNS</w:t>
+              <w:t>Tích hợp Zalo (OA + nhóm)</w:t>
             </w:r>
           </w:p>
         </w:tc>
@@ -5901,7 +5827,7 @@
                 <w:i w:val="0"/>
                 <w:sz w:val="24"/>
               </w:rPr>
-              <w:t>Phiên bản sau</w:t>
+              <w:t>Có</w:t>
             </w:r>
           </w:p>
         </w:tc>
@@ -5924,7 +5850,7 @@
                 <w:i w:val="0"/>
                 <w:sz w:val="24"/>
               </w:rPr>
-              <w:t>Cổng thanh toán built-in</w:t>
+              <w:t>Thanh toán tích hợp</w:t>
             </w:r>
           </w:p>
         </w:tc>
@@ -6029,7 +5955,7 @@
                 <w:i w:val="0"/>
                 <w:sz w:val="24"/>
               </w:rPr>
-              <w:t>Phiên bản sau</w:t>
+              <w:t>Có (VietQR + chuyển khoản)</w:t>
             </w:r>
           </w:p>
         </w:tc>
@@ -6695,7 +6621,7 @@
           <w:i w:val="0"/>
           <w:sz w:val="26"/>
         </w:rPr>
-        <w:t xml:space="preserve"> việc lùi ứng dụng di động gốc và tích hợp Zalo ZNS push notification sang lộ trình phát triển sau có rủi ro mất khách so với Mona eLMS và Easy Edu vốn đã có ứng dụng gốc — giải pháp giảm thiểu là giao diện web đáp ứng kết hợp nhóm Zalo đã được triển khai, ưu tiên ứng dụng di động gốc cho lộ trình phát triển sau. Cổng thanh toán cũng là điểm yếu khi DotB có sẵn ba cổng tích hợp — hệ thống đề xuất hiện tại sử dụng chuyển khoản ngân hàng kết hợp VietQR (không cần cổng), lộ trình phát triển sau bao gồm tích hợp cổng VNPay. Cuối cùng, nhận diện thương hiệu là rào cản khi Easy Edu và Mona eLMS có nhiều năm hiện diện thị trường trong khi hệ thống đề xuất mới ra mắt — giải pháp giảm thiểu là tiếp cận tăng trưởng dẫn dắt bởi sản phẩm, tiếp thị nội dung tiếng Việt và chương trình người dùng tiên phong với các trung tâm thử nghiệm.</w:t>
+        <w:t xml:space="preserve"> việc lùi ứng dụng di động gốc sang lộ trình phát triển sau có rủi ro mất khách so với Mona eLMS và Easy Edu vốn đã có ứng dụng gốc — giải pháp giảm thiểu là giao diện web đáp ứng kết hợp kênh Zalo (OA và nhóm) đã được triển khai, ưu tiên ứng dụng di động gốc cho lộ trình phát triển sau. Cổng thanh toán cũng là điểm yếu khi DotB có sẵn ba cổng tích hợp — hệ thống đề xuất hiện tại sử dụng chuyển khoản ngân hàng kết hợp VietQR (không cần cổng), lộ trình phát triển sau bao gồm tích hợp cổng VNPay. Cuối cùng, nhận diện thương hiệu là rào cản khi Easy Edu và Mona eLMS có nhiều năm hiện diện thị trường trong khi hệ thống đề xuất mới ra mắt — giải pháp giảm thiểu là tiếp cận tăng trưởng dẫn dắt bởi sản phẩm, tiếp thị nội dung tiếng Việt và chương trình người dùng tiên phong với các trung tâm thử nghiệm.</w:t>
       </w:r>
     </w:p>
     <w:p>

</xml_diff>

<commit_message>
docs(thesis): enlarge Hình 2.4d font via wrap + compact margins + re-bake
Hình 2.4d sequence (tenant subdomain resolution) was too wide (5 actors + long
messages → aspect ~2.1 flat → small font when fit to page width). Fix:
- Enable sequence wrap:true → long messages break to 2 lines (per user OK)
- actorMargin 75→55, width 200→180, compact margins → narrower diagram
- fontSize 34→36 / messageFontSize 32→34 / noteFontSize 32→34
Result: aspect 2.1→1.46, rendered font ~44% taller. (No <br/> — banned in
sequenceDiagram per diagram-format-selection.md §4; wrap is the correct lever.)
</commit_message>
<xml_diff>
--- a/documents/08-thesis/thesis-v1.docx
+++ b/documents/08-thesis/thesis-v1.docx
@@ -15697,7 +15697,7 @@
       <w:r>
         <w:drawing>
           <wp:inline xmlns:a="http://schemas.openxmlformats.org/drawingml/2006/main" xmlns:pic="http://schemas.openxmlformats.org/drawingml/2006/picture">
-            <wp:extent cx="5760000" cy="2558867"/>
+            <wp:extent cx="5760000" cy="3944873"/>
             <wp:docPr id="12" name="Picture 12"/>
             <wp:cNvGraphicFramePr>
               <a:graphicFrameLocks noChangeAspect="1"/>
@@ -15706,7 +15706,7 @@
               <a:graphicData uri="http://schemas.openxmlformats.org/drawingml/2006/picture">
                 <pic:pic>
                   <pic:nvPicPr>
-                    <pic:cNvPr id="0" name="mermaid-b535543e848a0bf1.png"/>
+                    <pic:cNvPr id="0" name="mermaid-6d2e4b98901515e6.png"/>
                     <pic:cNvPicPr/>
                   </pic:nvPicPr>
                   <pic:blipFill>
@@ -15718,7 +15718,7 @@
                   <pic:spPr>
                     <a:xfrm>
                       <a:off x="0" y="0"/>
-                      <a:ext cx="5760000" cy="2558867"/>
+                      <a:ext cx="5760000" cy="3944873"/>
                     </a:xfrm>
                     <a:prstGeom prst="rect"/>
                   </pic:spPr>

</xml_diff>

<commit_message>
docs(thesis): enlarge Hình 2.4a + 2.4b font (wrap + compact) + strip banned <br/>
Apply same fix as 2.4d to sibling sequences:
- 2.4a (login → JWT + audit): aspect 2.12→1.56
- 2.4b (authenticated request → RLS): aspect 2.12→1.38; also strip 3 banned
  <br/> in message labels (diagram-format-selection §4 — banned in sequenceDiagram,
  wrap:true handles line breaks instead)
- wrap:true + actorMargin 55 + width 180 + font 36/34/34 (consistent w/ 2.4d)
</commit_message>
<xml_diff>
--- a/documents/08-thesis/thesis-v1.docx
+++ b/documents/08-thesis/thesis-v1.docx
@@ -14905,7 +14905,7 @@
       <w:r>
         <w:drawing>
           <wp:inline xmlns:a="http://schemas.openxmlformats.org/drawingml/2006/main" xmlns:pic="http://schemas.openxmlformats.org/drawingml/2006/picture">
-            <wp:extent cx="5760000" cy="3102463"/>
+            <wp:extent cx="5760000" cy="3695186"/>
             <wp:docPr id="9" name="Picture 9"/>
             <wp:cNvGraphicFramePr>
               <a:graphicFrameLocks noChangeAspect="1"/>
@@ -14914,7 +14914,7 @@
               <a:graphicData uri="http://schemas.openxmlformats.org/drawingml/2006/picture">
                 <pic:pic>
                   <pic:nvPicPr>
-                    <pic:cNvPr id="0" name="mermaid-546493838d441fba.png"/>
+                    <pic:cNvPr id="0" name="mermaid-736115bd58496c03.png"/>
                     <pic:cNvPicPr/>
                   </pic:nvPicPr>
                   <pic:blipFill>
@@ -14926,7 +14926,7 @@
                   <pic:spPr>
                     <a:xfrm>
                       <a:off x="0" y="0"/>
-                      <a:ext cx="5760000" cy="3102463"/>
+                      <a:ext cx="5760000" cy="3695186"/>
                     </a:xfrm>
                     <a:prstGeom prst="rect"/>
                   </pic:spPr>
@@ -14970,7 +14970,7 @@
       <w:r>
         <w:drawing>
           <wp:inline xmlns:a="http://schemas.openxmlformats.org/drawingml/2006/main" xmlns:pic="http://schemas.openxmlformats.org/drawingml/2006/picture">
-            <wp:extent cx="5760000" cy="3257252"/>
+            <wp:extent cx="5760000" cy="4178539"/>
             <wp:docPr id="10" name="Picture 10"/>
             <wp:cNvGraphicFramePr>
               <a:graphicFrameLocks noChangeAspect="1"/>
@@ -14979,7 +14979,7 @@
               <a:graphicData uri="http://schemas.openxmlformats.org/drawingml/2006/picture">
                 <pic:pic>
                   <pic:nvPicPr>
-                    <pic:cNvPr id="0" name="mermaid-6028ac03d5c472a5.png"/>
+                    <pic:cNvPr id="0" name="mermaid-992b3a27321a67c1.png"/>
                     <pic:cNvPicPr/>
                   </pic:nvPicPr>
                   <pic:blipFill>
@@ -14991,7 +14991,7 @@
                   <pic:spPr>
                     <a:xfrm>
                       <a:off x="0" y="0"/>
-                      <a:ext cx="5760000" cy="3257252"/>
+                      <a:ext cx="5760000" cy="4178539"/>
                     </a:xfrm>
                     <a:prstGeom prst="rect"/>
                   </pic:spPr>

</xml_diff>

<commit_message>
docs(thesis): sweep remaining 11 banned <br/> in sequences + fix vague Terraform version
- Strip all 11 <br/> in sequenceDiagram (diagram-format-selection §4 banned):
  Ch.2 Hình 2.7a/2.7b (tenant provisioning) + Ch.4 Hình 4.2a/4.2b (CI/CD deploy);
  apply wrap:true + compact margins + font 36/34/34 (consistent w/ 2.4 series)
- Detector check-mermaid-sequence-state-br.sh now 0 violations repo-wide
- Fix vague 'Terraform 1.x' → 'Terraform 1.5+' (state-check: required_version
  >= 1.5 in main.tf/bootstrap); §3.1 now fully version-explicit
- Re-bake thesis-v1.docx
</commit_message>
<xml_diff>
--- a/documents/08-thesis/thesis-v1.docx
+++ b/documents/08-thesis/thesis-v1.docx
@@ -16234,7 +16234,7 @@
       <w:r>
         <w:drawing>
           <wp:inline xmlns:a="http://schemas.openxmlformats.org/drawingml/2006/main" xmlns:pic="http://schemas.openxmlformats.org/drawingml/2006/picture">
-            <wp:extent cx="5760000" cy="2138412"/>
+            <wp:extent cx="5760000" cy="2345316"/>
             <wp:docPr id="15" name="Picture 15"/>
             <wp:cNvGraphicFramePr>
               <a:graphicFrameLocks noChangeAspect="1"/>
@@ -16243,7 +16243,7 @@
               <a:graphicData uri="http://schemas.openxmlformats.org/drawingml/2006/picture">
                 <pic:pic>
                   <pic:nvPicPr>
-                    <pic:cNvPr id="0" name="mermaid-6ee5ed10bb467ac7.png"/>
+                    <pic:cNvPr id="0" name="mermaid-b6a7959c7494b945.png"/>
                     <pic:cNvPicPr/>
                   </pic:nvPicPr>
                   <pic:blipFill>
@@ -16255,7 +16255,7 @@
                   <pic:spPr>
                     <a:xfrm>
                       <a:off x="0" y="0"/>
-                      <a:ext cx="5760000" cy="2138412"/>
+                      <a:ext cx="5760000" cy="2345316"/>
                     </a:xfrm>
                     <a:prstGeom prst="rect"/>
                   </pic:spPr>
@@ -16299,7 +16299,7 @@
       <w:r>
         <w:drawing>
           <wp:inline xmlns:a="http://schemas.openxmlformats.org/drawingml/2006/main" xmlns:pic="http://schemas.openxmlformats.org/drawingml/2006/picture">
-            <wp:extent cx="5760000" cy="3293217"/>
+            <wp:extent cx="5760000" cy="3196244"/>
             <wp:docPr id="16" name="Picture 16"/>
             <wp:cNvGraphicFramePr>
               <a:graphicFrameLocks noChangeAspect="1"/>
@@ -16308,7 +16308,7 @@
               <a:graphicData uri="http://schemas.openxmlformats.org/drawingml/2006/picture">
                 <pic:pic>
                   <pic:nvPicPr>
-                    <pic:cNvPr id="0" name="mermaid-30e3cb94b9d091de.png"/>
+                    <pic:cNvPr id="0" name="mermaid-78fd152d1fb8fcae.png"/>
                     <pic:cNvPicPr/>
                   </pic:nvPicPr>
                   <pic:blipFill>
@@ -16320,7 +16320,7 @@
                   <pic:spPr>
                     <a:xfrm>
                       <a:off x="0" y="0"/>
-                      <a:ext cx="5760000" cy="3293217"/>
+                      <a:ext cx="5760000" cy="3196244"/>
                     </a:xfrm>
                     <a:prstGeom prst="rect"/>
                   </pic:spPr>
@@ -23220,7 +23220,7 @@
           <w:i w:val="0"/>
           <w:sz w:val="26"/>
         </w:rPr>
-        <w:t xml:space="preserve">Hạ tầng được mô tả bằng code (Infrastructure as Code) qua Terraform 1.x cho AWS resources (EC2, RDS, S3, SES, IAM, CloudWatch). Container hóa qua Docker 24 + Docker Compose 2 cho môi trường phát triển cục bộ; production triển khai container qua AWS Elastic Container Service (ECS) với task definitions JSON. Pipeline CI/CD chạy trên GitHub Actions với matrix builds (Java 21 + Node 22), tự động build + test + push container image lên AWS Elastic Container Registry (ECR). Phía vận hành, AWS Systems Manager (SSM) cung cấp shell access không cần SSH key; AWS CloudWatch tập hợp logs + metrics; AWS CloudTrail audit mọi thao tác API trên tài khoản. Phía CDN, Cloudflare đứng trước domain </w:t>
+        <w:t xml:space="preserve">Hạ tầng được mô tả bằng code (Infrastructure as Code) qua Terraform 1.5+ cho AWS resources (EC2, RDS, S3, SES, IAM, CloudWatch). Container hóa qua Docker 24 + Docker Compose 2 cho môi trường phát triển cục bộ; production triển khai container qua AWS Elastic Container Service (ECS) với task definitions JSON. Pipeline CI/CD chạy trên GitHub Actions với matrix builds (Java 21 + Node 22), tự động build + test + push container image lên AWS Elastic Container Registry (ECR). Phía vận hành, AWS Systems Manager (SSM) cung cấp shell access không cần SSH key; AWS CloudWatch tập hợp logs + metrics; AWS CloudTrail audit mọi thao tác API trên tài khoản. Phía CDN, Cloudflare đứng trước domain </w:t>
       </w:r>
       <w:r>
         <w:rPr>
@@ -24844,7 +24844,7 @@
       <w:r>
         <w:drawing>
           <wp:inline xmlns:a="http://schemas.openxmlformats.org/drawingml/2006/main" xmlns:pic="http://schemas.openxmlformats.org/drawingml/2006/picture">
-            <wp:extent cx="5760000" cy="2719135"/>
+            <wp:extent cx="5760000" cy="2810638"/>
             <wp:docPr id="21" name="Picture 21"/>
             <wp:cNvGraphicFramePr>
               <a:graphicFrameLocks noChangeAspect="1"/>
@@ -24853,7 +24853,7 @@
               <a:graphicData uri="http://schemas.openxmlformats.org/drawingml/2006/picture">
                 <pic:pic>
                   <pic:nvPicPr>
-                    <pic:cNvPr id="0" name="mermaid-03228ac755923191.png"/>
+                    <pic:cNvPr id="0" name="mermaid-60538a9e5a241a58.png"/>
                     <pic:cNvPicPr/>
                   </pic:nvPicPr>
                   <pic:blipFill>
@@ -24865,7 +24865,7 @@
                   <pic:spPr>
                     <a:xfrm>
                       <a:off x="0" y="0"/>
-                      <a:ext cx="5760000" cy="2719135"/>
+                      <a:ext cx="5760000" cy="2810638"/>
                     </a:xfrm>
                     <a:prstGeom prst="rect"/>
                   </pic:spPr>
@@ -24909,7 +24909,7 @@
       <w:r>
         <w:drawing>
           <wp:inline xmlns:a="http://schemas.openxmlformats.org/drawingml/2006/main" xmlns:pic="http://schemas.openxmlformats.org/drawingml/2006/picture">
-            <wp:extent cx="5760000" cy="2716687"/>
+            <wp:extent cx="5760000" cy="2953065"/>
             <wp:docPr id="22" name="Picture 22"/>
             <wp:cNvGraphicFramePr>
               <a:graphicFrameLocks noChangeAspect="1"/>
@@ -24918,7 +24918,7 @@
               <a:graphicData uri="http://schemas.openxmlformats.org/drawingml/2006/picture">
                 <pic:pic>
                   <pic:nvPicPr>
-                    <pic:cNvPr id="0" name="mermaid-aefd47c63cad2c34.png"/>
+                    <pic:cNvPr id="0" name="mermaid-fc29fe5a3a5711a8.png"/>
                     <pic:cNvPicPr/>
                   </pic:nvPicPr>
                   <pic:blipFill>
@@ -24930,7 +24930,7 @@
                   <pic:spPr>
                     <a:xfrm>
                       <a:off x="0" y="0"/>
-                      <a:ext cx="5760000" cy="2716687"/>
+                      <a:ext cx="5760000" cy="2953065"/>
                     </a:xfrm>
                     <a:prstGeom prst="rect"/>
                   </pic:spPr>

</xml_diff>

<commit_message>
docs(thesis): fix Hình 2.8 state diagram — replace ACTIVE self-loop with note
ACTIVE --> ACTIVE self-loop ('tự gia hạn hằng tháng') rendered as a sharp
kinked arc looking like a broken/incomplete entity. Replace with 'note right of
ACTIVE: Tự gia hạn hằng tháng khi thanh toán thành công' — cleaner render, same
semantics (ACTIVE stays ACTIVE on successful renewal). Re-bake docx.
</commit_message>
<xml_diff>
--- a/documents/08-thesis/thesis-v1.docx
+++ b/documents/08-thesis/thesis-v1.docx
@@ -21801,7 +21801,7 @@
       <w:r>
         <w:drawing>
           <wp:inline xmlns:a="http://schemas.openxmlformats.org/drawingml/2006/main" xmlns:pic="http://schemas.openxmlformats.org/drawingml/2006/picture">
-            <wp:extent cx="5188811" cy="6480000"/>
+            <wp:extent cx="5431339" cy="6480000"/>
             <wp:docPr id="19" name="Picture 19"/>
             <wp:cNvGraphicFramePr>
               <a:graphicFrameLocks noChangeAspect="1"/>
@@ -21810,7 +21810,7 @@
               <a:graphicData uri="http://schemas.openxmlformats.org/drawingml/2006/picture">
                 <pic:pic>
                   <pic:nvPicPr>
-                    <pic:cNvPr id="0" name="mermaid-3e2649c3cbb965e5.png"/>
+                    <pic:cNvPr id="0" name="mermaid-a6f4b739c25e129b.png"/>
                     <pic:cNvPicPr/>
                   </pic:nvPicPr>
                   <pic:blipFill>
@@ -21822,7 +21822,7 @@
                   <pic:spPr>
                     <a:xfrm>
                       <a:off x="0" y="0"/>
-                      <a:ext cx="5188811" cy="6480000"/>
+                      <a:ext cx="5431339" cy="6480000"/>
                     </a:xfrm>
                     <a:prstGeom prst="rect"/>
                   </pic:spPr>

</xml_diff>

<commit_message>
docs(thesis): condense §2.2.3 multi-tenant pattern comparison — trim Ch.2 length
§2.2.3 comparison was overly long. Condense 2 verbose blocks while keeping both
tables (Bảng 2.4 pattern list + Bảng 2.5 6-axis matrix) + core rationale:
- 6-bullet scoring-criteria definitions → 1 paragraph (axis names inline)
- 6-bullet Pattern-4 per-axis explanation (repeated matrix scores) → 1 paragraph
  (keep key points: O(1) cost, logic-not-physical isolation=3, compliance=4)
Re-bake docx.
</commit_message>
<xml_diff>
--- a/documents/08-thesis/thesis-v1.docx
+++ b/documents/08-thesis/thesis-v1.docx
@@ -12328,227 +12328,7 @@
           <w:i w:val="0"/>
           <w:sz w:val="26"/>
         </w:rPr>
-        <w:t xml:space="preserve"> Mỗi pattern được đánh giá trên thang </w:t>
-      </w:r>
-      <w:r>
-        <w:rPr>
-          <w:rFonts w:ascii="Times New Roman" w:hAnsi="Times New Roman" w:eastAsia="Times New Roman"/>
-          <w:b/>
-          <w:i w:val="0"/>
-          <w:sz w:val="26"/>
-        </w:rPr>
-        <w:t>1-5</w:t>
-      </w:r>
-      <w:r>
-        <w:rPr>
-          <w:rFonts w:ascii="Times New Roman" w:hAnsi="Times New Roman" w:eastAsia="Times New Roman"/>
-          <w:b w:val="0"/>
-          <w:i w:val="0"/>
-          <w:sz w:val="26"/>
-        </w:rPr>
-        <w:t xml:space="preserve"> ở từng trục (1 = không phù hợp / 5 = phù hợp nhất với phạm vi hiện tại SMB của đồ án). Tổng điểm tối đa 30 (6 trục × 5 điểm). Rubric này </w:t>
-      </w:r>
-      <w:r>
-        <w:rPr>
-          <w:rFonts w:ascii="Times New Roman" w:hAnsi="Times New Roman" w:eastAsia="Times New Roman"/>
-          <w:b/>
-          <w:i w:val="0"/>
-          <w:sz w:val="26"/>
-        </w:rPr>
-        <w:t>được xây dựng riêng</w:t>
-      </w:r>
-      <w:r>
-        <w:rPr>
-          <w:rFonts w:ascii="Times New Roman" w:hAnsi="Times New Roman" w:eastAsia="Times New Roman"/>
-          <w:b w:val="0"/>
-          <w:i w:val="0"/>
-          <w:sz w:val="26"/>
-        </w:rPr>
-        <w:t xml:space="preserve"> cho ngữ cảnh trung tâm dạy thêm SMB hiện tại của Kite Platform — tham khảo phương pháp luận đánh giá Pool/Bridge/Silo của AWS Well-Architected SaaS Lens [26, tr.21] và pattern comparison của Pothon [27], nhưng các trọng số trục cụ thể (chi phí ưu tiên cao do ràng buộc Free Tier, độ phức tạp vận hành ưu tiên cao do mô hình solo-dev) phản ánh ràng buộc kinh tế / nhân lực cụ thể của đồ án.</w:t>
-      </w:r>
-    </w:p>
-    <w:p>
-      <w:pPr>
-        <w:spacing w:line="288" w:lineRule="auto"/>
-        <w:ind w:firstLine="567"/>
-        <w:jc w:val="both"/>
-      </w:pPr>
-      <w:r>
-        <w:rPr>
-          <w:rFonts w:ascii="Times New Roman" w:hAnsi="Times New Roman" w:eastAsia="Times New Roman"/>
-          <w:b w:val="0"/>
-          <w:i/>
-          <w:sz w:val="26"/>
-        </w:rPr>
-        <w:t>Tiêu chí chấm điểm 1-5 cho từng trục:</w:t>
-      </w:r>
-    </w:p>
-    <w:p>
-      <w:pPr>
-        <w:pStyle w:val="ListBullet"/>
-        <w:spacing w:line="288" w:lineRule="auto"/>
-        <w:ind w:left="850" w:hanging="283"/>
-      </w:pPr>
-      <w:r>
-        <w:rPr>
-          <w:rFonts w:ascii="Times New Roman" w:hAnsi="Times New Roman" w:eastAsia="Times New Roman"/>
-          <w:b/>
-          <w:i w:val="0"/>
-          <w:sz w:val="26"/>
-        </w:rPr>
-        <w:t>Độ mạnh cô lập:</w:t>
-      </w:r>
-      <w:r>
-        <w:rPr>
-          <w:rFonts w:ascii="Times New Roman" w:hAnsi="Times New Roman" w:eastAsia="Times New Roman"/>
-          <w:b w:val="0"/>
-          <w:i w:val="0"/>
-          <w:sz w:val="26"/>
-        </w:rPr>
-        <w:t xml:space="preserve"> 5 = enforce ở tầng cơ sở dữ liệu (vật lý hoặc chính sách RLS) / 3 = enforce ở tầng ứng dụng (qua bộ lọc trong code) / 1 = chỉ phụ thuộc kỷ luật code, không có cơ chế chặn ở DB.</w:t>
-      </w:r>
-    </w:p>
-    <w:p>
-      <w:pPr>
-        <w:pStyle w:val="ListBullet"/>
-        <w:spacing w:line="288" w:lineRule="auto"/>
-        <w:ind w:left="850" w:hanging="283"/>
-      </w:pPr>
-      <w:r>
-        <w:rPr>
-          <w:rFonts w:ascii="Times New Roman" w:hAnsi="Times New Roman" w:eastAsia="Times New Roman"/>
-          <w:b/>
-          <w:i w:val="0"/>
-          <w:sz w:val="26"/>
-        </w:rPr>
-        <w:t>Chi phí vận hành (5 = O(1)):</w:t>
-      </w:r>
-      <w:r>
-        <w:rPr>
-          <w:rFonts w:ascii="Times New Roman" w:hAnsi="Times New Roman" w:eastAsia="Times New Roman"/>
-          <w:b w:val="0"/>
-          <w:i w:val="0"/>
-          <w:sz w:val="26"/>
-        </w:rPr>
-        <w:t xml:space="preserve"> 5 = chi phí cố định không tăng theo số tenant (1 RDS chia sẻ + 1 chuỗi migration); 3 = tăng tuyến tính một phần (vd N schema cùng 1 RDS); 1 = tăng tuyến tính đầy đủ (N RDS + N migration + N monitoring).</w:t>
-      </w:r>
-    </w:p>
-    <w:p>
-      <w:pPr>
-        <w:pStyle w:val="ListBullet"/>
-        <w:spacing w:line="288" w:lineRule="auto"/>
-        <w:ind w:left="850" w:hanging="283"/>
-      </w:pPr>
-      <w:r>
-        <w:rPr>
-          <w:rFonts w:ascii="Times New Roman" w:hAnsi="Times New Roman" w:eastAsia="Times New Roman"/>
-          <w:b/>
-          <w:i w:val="0"/>
-          <w:sz w:val="26"/>
-        </w:rPr>
-        <w:t>Khả năng truy vấn xuyên tenant:</w:t>
-      </w:r>
-      <w:r>
-        <w:rPr>
-          <w:rFonts w:ascii="Times New Roman" w:hAnsi="Times New Roman" w:eastAsia="Times New Roman"/>
-          <w:b w:val="0"/>
-          <w:i w:val="0"/>
-          <w:sz w:val="26"/>
-        </w:rPr>
-        <w:t xml:space="preserve"> 5 = single query không cần JOIN/UNION + không cần bypass cơ chế cô lập; 3 = cần N query union qua nhiều scope; 1 = không khả thi nếu không thay đổi kiến trúc.</w:t>
-      </w:r>
-    </w:p>
-    <w:p>
-      <w:pPr>
-        <w:pStyle w:val="ListBullet"/>
-        <w:spacing w:line="288" w:lineRule="auto"/>
-        <w:ind w:left="850" w:hanging="283"/>
-      </w:pPr>
-      <w:r>
-        <w:rPr>
-          <w:rFonts w:ascii="Times New Roman" w:hAnsi="Times New Roman" w:eastAsia="Times New Roman"/>
-          <w:b/>
-          <w:i w:val="0"/>
-          <w:sz w:val="26"/>
-        </w:rPr>
-        <w:t>Phù hợp với phạm vi hiện tại:</w:t>
-      </w:r>
-      <w:r>
-        <w:rPr>
-          <w:rFonts w:ascii="Times New Roman" w:hAnsi="Times New Roman" w:eastAsia="Times New Roman"/>
-          <w:b w:val="0"/>
-          <w:i w:val="0"/>
-          <w:sz w:val="26"/>
-        </w:rPr>
-        <w:t xml:space="preserve"> 5 = chi phí ≤$15/tháng cho ≤10 tenant đầu + độ phức tạp triển khai thấp; 3 = chi phí $50-200/tháng hoặc cần thêm 1-2 tuần triển khai; 1 = chi phí ≥$500/tháng hoặc đòi hỏi tái cấu trúc lớn.</w:t>
-      </w:r>
-    </w:p>
-    <w:p>
-      <w:pPr>
-        <w:pStyle w:val="ListBullet"/>
-        <w:spacing w:line="288" w:lineRule="auto"/>
-        <w:ind w:left="850" w:hanging="283"/>
-      </w:pPr>
-      <w:r>
-        <w:rPr>
-          <w:rFonts w:ascii="Times New Roman" w:hAnsi="Times New Roman" w:eastAsia="Times New Roman"/>
-          <w:b/>
-          <w:i w:val="0"/>
-          <w:sz w:val="26"/>
-        </w:rPr>
-        <w:t>Vị thế tuân thủ (PDPL + ISO27001):</w:t>
-      </w:r>
-      <w:r>
-        <w:rPr>
-          <w:rFonts w:ascii="Times New Roman" w:hAnsi="Times New Roman" w:eastAsia="Times New Roman"/>
-          <w:b w:val="0"/>
-          <w:i w:val="0"/>
-          <w:sz w:val="26"/>
-        </w:rPr>
-        <w:t xml:space="preserve"> 5 = cô lập vật lý đáp ứng mọi yêu cầu pháp lý nghiêm ngặt; 4 = cô lập logic mạnh + audit trail đầy đủ + có khả năng chứng minh trong kiểm toán; 2 = không có cơ chế chặn cứng, phụ thuộc kỷ luật ứng dụng.</w:t>
-      </w:r>
-    </w:p>
-    <w:p>
-      <w:pPr>
-        <w:pStyle w:val="ListBullet"/>
-        <w:spacing w:line="288" w:lineRule="auto"/>
-        <w:ind w:left="850" w:hanging="283"/>
-      </w:pPr>
-      <w:r>
-        <w:rPr>
-          <w:rFonts w:ascii="Times New Roman" w:hAnsi="Times New Roman" w:eastAsia="Times New Roman"/>
-          <w:b/>
-          <w:i w:val="0"/>
-          <w:sz w:val="26"/>
-        </w:rPr>
-        <w:t>Chi phí chuyển đổi từ hiện trạng:</w:t>
-      </w:r>
-      <w:r>
-        <w:rPr>
-          <w:rFonts w:ascii="Times New Roman" w:hAnsi="Times New Roman" w:eastAsia="Times New Roman"/>
-          <w:b w:val="0"/>
-          <w:i w:val="0"/>
-          <w:sz w:val="26"/>
-        </w:rPr>
-        <w:t xml:space="preserve"> 5 = không cần thay đổi schema hiện tại, chỉ thêm chính sách RLS + cột </w:t>
-      </w:r>
-      <w:r>
-        <w:rPr>
-          <w:rFonts w:ascii="Times New Roman" w:hAnsi="Times New Roman" w:eastAsia="Times New Roman"/>
-          <w:b w:val="0"/>
-          <w:i/>
-          <w:sz w:val="26"/>
-        </w:rPr>
-        <w:t>tenant_id</w:t>
-      </w:r>
-      <w:r>
-        <w:rPr>
-          <w:rFonts w:ascii="Times New Roman" w:hAnsi="Times New Roman" w:eastAsia="Times New Roman"/>
-          <w:b w:val="0"/>
-          <w:i w:val="0"/>
-          <w:sz w:val="26"/>
-        </w:rPr>
-        <w:t>; 3 = cần refactor một phần (vd tách schema per tenant); 1 = cần migrate dữ liệu sang kiến trúc khác (vd N-database, serverless).</w:t>
+        <w:t xml:space="preserve"> Mỗi pattern được chấm thang 1-5 trên 6 trục — độ mạnh cô lập, chi phí vận hành theo số tenant, khả năng truy vấn xuyên tenant, độ phù hợp phạm vi SMB hiện tại, vị thế tuân thủ (PDPL + ISO27001) và chi phí chuyển đổi từ hiện trạng — tổng tối đa 30. Rubric xây dựng riêng cho ngữ cảnh trung tâm dạy thêm SMB, tham khảo phương pháp luận Pool/Bridge/Silo của AWS Well-Architected SaaS Lens [26, tr.21] và pattern comparison của Pothon [27], với trọng số ưu tiên chi phí (ràng buộc Free Tier) và độ đơn giản vận hành (mô hình solo-dev).</w:t>
       </w:r>
     </w:p>
     <w:p>
@@ -13824,15 +13604,71 @@
           <w:i/>
           <w:sz w:val="26"/>
         </w:rPr>
-        <w:t>Diễn giải cho cột Pattern 4 RLS (chọn — tổng 3+5+4+5+4+5 = 26/30):</w:t>
-      </w:r>
-    </w:p>
-    <w:p>
-      <w:pPr>
-        <w:pStyle w:val="ListBullet"/>
-        <w:spacing w:line="288" w:lineRule="auto"/>
-        <w:ind w:left="850" w:hanging="283"/>
-      </w:pPr>
+        <w:t>Diễn giải Pattern 4 (chọn — tổng 26/30):</w:t>
+      </w:r>
+      <w:r>
+        <w:rPr>
+          <w:rFonts w:ascii="Times New Roman" w:hAnsi="Times New Roman" w:eastAsia="Times New Roman"/>
+          <w:b w:val="0"/>
+          <w:i w:val="0"/>
+          <w:sz w:val="26"/>
+        </w:rPr>
+        <w:t xml:space="preserve"> P4 đạt điểm tối đa ở ba trục quyết định với phạm vi hiện tại — chi phí vận hành O(1) (5đ: 1 RDS </w:t>
+      </w:r>
+      <w:r>
+        <w:rPr>
+          <w:rFonts w:ascii="Times New Roman" w:hAnsi="Times New Roman" w:eastAsia="Times New Roman"/>
+          <w:b w:val="0"/>
+          <w:i/>
+          <w:sz w:val="26"/>
+        </w:rPr>
+        <w:t>db.t3.micro</w:t>
+      </w:r>
+      <w:r>
+        <w:rPr>
+          <w:rFonts w:ascii="Times New Roman" w:hAnsi="Times New Roman" w:eastAsia="Times New Roman"/>
+          <w:b w:val="0"/>
+          <w:i w:val="0"/>
+          <w:sz w:val="26"/>
+        </w:rPr>
+        <w:t xml:space="preserve"> chia sẻ ≈$15/tháng + 1 chuỗi Flyway migration cho mọi tenant), độ phù hợp phạm vi SMB (5đ: ≤$15/tháng cho ≤10 tenant đầu) và chi phí chuyển đổi thấp (5đ: hiện trạng đã có cột </w:t>
+      </w:r>
+      <w:r>
+        <w:rPr>
+          <w:rFonts w:ascii="Times New Roman" w:hAnsi="Times New Roman" w:eastAsia="Times New Roman"/>
+          <w:b w:val="0"/>
+          <w:i/>
+          <w:sz w:val="26"/>
+        </w:rPr>
+        <w:t>tenant_id</w:t>
+      </w:r>
+      <w:r>
+        <w:rPr>
+          <w:rFonts w:ascii="Times New Roman" w:hAnsi="Times New Roman" w:eastAsia="Times New Roman"/>
+          <w:b w:val="0"/>
+          <w:i w:val="0"/>
+          <w:sz w:val="26"/>
+        </w:rPr>
+        <w:t xml:space="preserve">, chỉ thêm chính sách RLS + cấu hình </w:t>
+      </w:r>
+      <w:r>
+        <w:rPr>
+          <w:rFonts w:ascii="Times New Roman" w:hAnsi="Times New Roman" w:eastAsia="Times New Roman"/>
+          <w:b w:val="0"/>
+          <w:i/>
+          <w:sz w:val="26"/>
+        </w:rPr>
+        <w:t>SET LOCAL app.current_tenant_id</w:t>
+      </w:r>
+      <w:r>
+        <w:rPr>
+          <w:rFonts w:ascii="Times New Roman" w:hAnsi="Times New Roman" w:eastAsia="Times New Roman"/>
+          <w:b w:val="0"/>
+          <w:i w:val="0"/>
+          <w:sz w:val="26"/>
+        </w:rPr>
+        <w:t xml:space="preserve">). Độ mạnh cô lập chỉ đạt 3đ vì RLS là cô lập </w:t>
+      </w:r>
       <w:r>
         <w:rPr>
           <w:rFonts w:ascii="Times New Roman" w:hAnsi="Times New Roman" w:eastAsia="Times New Roman"/>
@@ -13840,16 +13676,16 @@
           <w:i w:val="0"/>
           <w:sz w:val="26"/>
         </w:rPr>
-        <w:t>Độ mạnh cô lập = 3:</w:t>
-      </w:r>
-      <w:r>
-        <w:rPr>
-          <w:rFonts w:ascii="Times New Roman" w:hAnsi="Times New Roman" w:eastAsia="Times New Roman"/>
-          <w:b w:val="0"/>
-          <w:i w:val="0"/>
-          <w:sz w:val="26"/>
-        </w:rPr>
-        <w:t xml:space="preserve"> RLS enforce ở tầng cơ sở dữ liệu qua chính sách </w:t>
+        <w:t>logic</w:t>
+      </w:r>
+      <w:r>
+        <w:rPr>
+          <w:rFonts w:ascii="Times New Roman" w:hAnsi="Times New Roman" w:eastAsia="Times New Roman"/>
+          <w:b w:val="0"/>
+          <w:i w:val="0"/>
+          <w:sz w:val="26"/>
+        </w:rPr>
+        <w:t xml:space="preserve"> (chính sách </w:t>
       </w:r>
       <w:r>
         <w:rPr>
@@ -13867,7 +13703,7 @@
           <w:i w:val="0"/>
           <w:sz w:val="26"/>
         </w:rPr>
-        <w:t xml:space="preserve"> cùng cột </w:t>
+        <w:t xml:space="preserve"> + NULL force-fail, chi tiết §2.2.4) chứ không phải vật lý như Per-DB — vai trò siêu người dùng vẫn BYPASS được, nên cần thêm 4 lớp phòng thủ chiều sâu (§2.2.4). Hai trục còn lại đạt 4đ: khả năng truy vấn xuyên tenant (vai trò </w:t>
       </w:r>
       <w:r>
         <w:rPr>
@@ -13876,128 +13712,6 @@
           <w:i/>
           <w:sz w:val="26"/>
         </w:rPr>
-        <w:t>tenant_id UUID NOT NULL</w:t>
-      </w:r>
-      <w:r>
-        <w:rPr>
-          <w:rFonts w:ascii="Times New Roman" w:hAnsi="Times New Roman" w:eastAsia="Times New Roman"/>
-          <w:b w:val="0"/>
-          <w:i w:val="0"/>
-          <w:sz w:val="26"/>
-        </w:rPr>
-        <w:t xml:space="preserve"> và chế độ NULL force-fail (chi tiết §2.2.4). Điểm 3 (không phải 5) vì RLS là cô lập </w:t>
-      </w:r>
-      <w:r>
-        <w:rPr>
-          <w:rFonts w:ascii="Times New Roman" w:hAnsi="Times New Roman" w:eastAsia="Times New Roman"/>
-          <w:b/>
-          <w:i w:val="0"/>
-          <w:sz w:val="26"/>
-        </w:rPr>
-        <w:t>logic</w:t>
-      </w:r>
-      <w:r>
-        <w:rPr>
-          <w:rFonts w:ascii="Times New Roman" w:hAnsi="Times New Roman" w:eastAsia="Times New Roman"/>
-          <w:b w:val="0"/>
-          <w:i w:val="0"/>
-          <w:sz w:val="26"/>
-        </w:rPr>
-        <w:t xml:space="preserve"> chứ không phải cô lập </w:t>
-      </w:r>
-      <w:r>
-        <w:rPr>
-          <w:rFonts w:ascii="Times New Roman" w:hAnsi="Times New Roman" w:eastAsia="Times New Roman"/>
-          <w:b/>
-          <w:i w:val="0"/>
-          <w:sz w:val="26"/>
-        </w:rPr>
-        <w:t>vật lý</w:t>
-      </w:r>
-      <w:r>
-        <w:rPr>
-          <w:rFonts w:ascii="Times New Roman" w:hAnsi="Times New Roman" w:eastAsia="Times New Roman"/>
-          <w:b w:val="0"/>
-          <w:i w:val="0"/>
-          <w:sz w:val="26"/>
-        </w:rPr>
-        <w:t xml:space="preserve"> như Per-DB — vai trò siêu người dùng vẫn có thể BYPASS RLS, do đó cần thêm 4 lớp phòng thủ chiều sâu khác (xem §2.2.4) để đạt mức an toàn tương đương Per-DB.</w:t>
-      </w:r>
-    </w:p>
-    <w:p>
-      <w:pPr>
-        <w:pStyle w:val="ListBullet"/>
-        <w:spacing w:line="288" w:lineRule="auto"/>
-        <w:ind w:left="850" w:hanging="283"/>
-      </w:pPr>
-      <w:r>
-        <w:rPr>
-          <w:rFonts w:ascii="Times New Roman" w:hAnsi="Times New Roman" w:eastAsia="Times New Roman"/>
-          <w:b/>
-          <w:i w:val="0"/>
-          <w:sz w:val="26"/>
-        </w:rPr>
-        <w:t>Chi phí vận hành = 5:</w:t>
-      </w:r>
-      <w:r>
-        <w:rPr>
-          <w:rFonts w:ascii="Times New Roman" w:hAnsi="Times New Roman" w:eastAsia="Times New Roman"/>
-          <w:b w:val="0"/>
-          <w:i w:val="0"/>
-          <w:sz w:val="26"/>
-        </w:rPr>
-        <w:t xml:space="preserve"> 1 instance RDS </w:t>
-      </w:r>
-      <w:r>
-        <w:rPr>
-          <w:rFonts w:ascii="Times New Roman" w:hAnsi="Times New Roman" w:eastAsia="Times New Roman"/>
-          <w:b w:val="0"/>
-          <w:i/>
-          <w:sz w:val="26"/>
-        </w:rPr>
-        <w:t>db.t3.micro</w:t>
-      </w:r>
-      <w:r>
-        <w:rPr>
-          <w:rFonts w:ascii="Times New Roman" w:hAnsi="Times New Roman" w:eastAsia="Times New Roman"/>
-          <w:b w:val="0"/>
-          <w:i w:val="0"/>
-          <w:sz w:val="26"/>
-        </w:rPr>
-        <w:t xml:space="preserve"> chia sẻ ≈$15/tháng (Free Tier), không scale tuyến tính theo số tenant. 1 chuỗi Flyway migration áp dụng cho mọi tenant — không cần per-tenant DDL. Monitoring tập trung (1 dashboard CloudWatch cho 1 RDS) thay vì N dashboard.</w:t>
-      </w:r>
-    </w:p>
-    <w:p>
-      <w:pPr>
-        <w:pStyle w:val="ListBullet"/>
-        <w:spacing w:line="288" w:lineRule="auto"/>
-        <w:ind w:left="850" w:hanging="283"/>
-      </w:pPr>
-      <w:r>
-        <w:rPr>
-          <w:rFonts w:ascii="Times New Roman" w:hAnsi="Times New Roman" w:eastAsia="Times New Roman"/>
-          <w:b/>
-          <w:i w:val="0"/>
-          <w:sz w:val="26"/>
-        </w:rPr>
-        <w:t>Khả năng truy vấn xuyên tenant = 4:</w:t>
-      </w:r>
-      <w:r>
-        <w:rPr>
-          <w:rFonts w:ascii="Times New Roman" w:hAnsi="Times New Roman" w:eastAsia="Times New Roman"/>
-          <w:b w:val="0"/>
-          <w:i w:val="0"/>
-          <w:sz w:val="26"/>
-        </w:rPr>
-        <w:t xml:space="preserve"> Vai trò </w:t>
-      </w:r>
-      <w:r>
-        <w:rPr>
-          <w:rFonts w:ascii="Times New Roman" w:hAnsi="Times New Roman" w:eastAsia="Times New Roman"/>
-          <w:b w:val="0"/>
-          <w:i/>
-          <w:sz w:val="26"/>
-        </w:rPr>
         <w:t>kitehub_admin</w:t>
       </w:r>
       <w:r>
@@ -14007,172 +13721,7 @@
           <w:i w:val="0"/>
           <w:sz w:val="26"/>
         </w:rPr>
-        <w:t xml:space="preserve"> BYPASS RLS (qua </w:t>
-      </w:r>
-      <w:r>
-        <w:rPr>
-          <w:rFonts w:ascii="Times New Roman" w:hAnsi="Times New Roman" w:eastAsia="Times New Roman"/>
-          <w:b w:val="0"/>
-          <w:i/>
-          <w:sz w:val="26"/>
-        </w:rPr>
-        <w:t>ALTER ROLE ... BYPASSRLS</w:t>
-      </w:r>
-      <w:r>
-        <w:rPr>
-          <w:rFonts w:ascii="Times New Roman" w:hAnsi="Times New Roman" w:eastAsia="Times New Roman"/>
-          <w:b w:val="0"/>
-          <w:i w:val="0"/>
-          <w:sz w:val="26"/>
-        </w:rPr>
-        <w:t>), cho phép single query xuyên tenant phục vụ report toàn nền tảng và migration. Điểm 4 (không phải 5) vì cần ý thức rõ ràng khi viết code admin để không vô tình leak dữ liệu giữa tenant context — yêu cầu kỷ luật code review chặt chẽ.</w:t>
-      </w:r>
-    </w:p>
-    <w:p>
-      <w:pPr>
-        <w:pStyle w:val="ListBullet"/>
-        <w:spacing w:line="288" w:lineRule="auto"/>
-        <w:ind w:left="850" w:hanging="283"/>
-      </w:pPr>
-      <w:r>
-        <w:rPr>
-          <w:rFonts w:ascii="Times New Roman" w:hAnsi="Times New Roman" w:eastAsia="Times New Roman"/>
-          <w:b/>
-          <w:i w:val="0"/>
-          <w:sz w:val="26"/>
-        </w:rPr>
-        <w:t>Phù hợp với phạm vi hiện tại = 5:</w:t>
-      </w:r>
-      <w:r>
-        <w:rPr>
-          <w:rFonts w:ascii="Times New Roman" w:hAnsi="Times New Roman" w:eastAsia="Times New Roman"/>
-          <w:b w:val="0"/>
-          <w:i w:val="0"/>
-          <w:sz w:val="26"/>
-        </w:rPr>
-        <w:t xml:space="preserve"> Tổng chi phí hạ tầng ≤$15/tháng (RDS Free Tier 12 tháng đầu, ECS Fargate Spot, S3 dưới 5GB), phù hợp quy mô ≤10 tenant đầu của trung tâm SMB. Triển khai chỉ cần thêm cột </w:t>
-      </w:r>
-      <w:r>
-        <w:rPr>
-          <w:rFonts w:ascii="Times New Roman" w:hAnsi="Times New Roman" w:eastAsia="Times New Roman"/>
-          <w:b w:val="0"/>
-          <w:i/>
-          <w:sz w:val="26"/>
-        </w:rPr>
-        <w:t>tenant_id</w:t>
-      </w:r>
-      <w:r>
-        <w:rPr>
-          <w:rFonts w:ascii="Times New Roman" w:hAnsi="Times New Roman" w:eastAsia="Times New Roman"/>
-          <w:b w:val="0"/>
-          <w:i w:val="0"/>
-          <w:sz w:val="26"/>
-        </w:rPr>
-        <w:t xml:space="preserve"> + 1 migration Flyway tạo chính sách RLS cho mỗi bảng — không cần tái cấu trúc kiến trúc.</w:t>
-      </w:r>
-    </w:p>
-    <w:p>
-      <w:pPr>
-        <w:pStyle w:val="ListBullet"/>
-        <w:spacing w:line="288" w:lineRule="auto"/>
-        <w:ind w:left="850" w:hanging="283"/>
-      </w:pPr>
-      <w:r>
-        <w:rPr>
-          <w:rFonts w:ascii="Times New Roman" w:hAnsi="Times New Roman" w:eastAsia="Times New Roman"/>
-          <w:b/>
-          <w:i w:val="0"/>
-          <w:sz w:val="26"/>
-        </w:rPr>
-        <w:t>Vị thế tuân thủ (PDPL + ISO27001) = 4:</w:t>
-      </w:r>
-      <w:r>
-        <w:rPr>
-          <w:rFonts w:ascii="Times New Roman" w:hAnsi="Times New Roman" w:eastAsia="Times New Roman"/>
-          <w:b w:val="0"/>
-          <w:i w:val="0"/>
-          <w:sz w:val="26"/>
-        </w:rPr>
-        <w:t xml:space="preserve"> Đáp ứng yêu cầu cô lập logic mạnh của PDPL 2023 (Điều 19 — bảo vệ dữ liệu cá nhân) và ISO/IEC 27001:2022 (A.8.3 — quản lý quyền truy cập), kèm audit trail đầy đủ qua bảng </w:t>
-      </w:r>
-      <w:r>
-        <w:rPr>
-          <w:rFonts w:ascii="Times New Roman" w:hAnsi="Times New Roman" w:eastAsia="Times New Roman"/>
-          <w:b w:val="0"/>
-          <w:i/>
-          <w:sz w:val="26"/>
-        </w:rPr>
-        <w:t>audit_logs</w:t>
-      </w:r>
-      <w:r>
-        <w:rPr>
-          <w:rFonts w:ascii="Times New Roman" w:hAnsi="Times New Roman" w:eastAsia="Times New Roman"/>
-          <w:b w:val="0"/>
-          <w:i w:val="0"/>
-          <w:sz w:val="26"/>
-        </w:rPr>
-        <w:t xml:space="preserve"> PDPL Art 11. Điểm 4 (không phải 5) vì cô lập logic, không phải vật lý — khách hàng doanh nghiệp yêu cầu cô lập vật lý ở lộ trình phát triển sau sẽ cần chuyển sang Hybrid Path A (xem P5).</w:t>
-      </w:r>
-    </w:p>
-    <w:p>
-      <w:pPr>
-        <w:pStyle w:val="ListBullet"/>
-        <w:spacing w:line="288" w:lineRule="auto"/>
-        <w:ind w:left="850" w:hanging="283"/>
-      </w:pPr>
-      <w:r>
-        <w:rPr>
-          <w:rFonts w:ascii="Times New Roman" w:hAnsi="Times New Roman" w:eastAsia="Times New Roman"/>
-          <w:b/>
-          <w:i w:val="0"/>
-          <w:sz w:val="26"/>
-        </w:rPr>
-        <w:t>Chi phí chuyển đổi từ hiện trạng = 5:</w:t>
-      </w:r>
-      <w:r>
-        <w:rPr>
-          <w:rFonts w:ascii="Times New Roman" w:hAnsi="Times New Roman" w:eastAsia="Times New Roman"/>
-          <w:b w:val="0"/>
-          <w:i w:val="0"/>
-          <w:sz w:val="26"/>
-        </w:rPr>
-        <w:t xml:space="preserve"> Hiện trạng đã có cột </w:t>
-      </w:r>
-      <w:r>
-        <w:rPr>
-          <w:rFonts w:ascii="Times New Roman" w:hAnsi="Times New Roman" w:eastAsia="Times New Roman"/>
-          <w:b w:val="0"/>
-          <w:i/>
-          <w:sz w:val="26"/>
-        </w:rPr>
-        <w:t>tenant_id</w:t>
-      </w:r>
-      <w:r>
-        <w:rPr>
-          <w:rFonts w:ascii="Times New Roman" w:hAnsi="Times New Roman" w:eastAsia="Times New Roman"/>
-          <w:b w:val="0"/>
-          <w:i w:val="0"/>
-          <w:sz w:val="26"/>
-        </w:rPr>
-        <w:t xml:space="preserve"> ở mọi bảng domain (mô hình P3 ban đầu); chuyển sang P4 RLS chỉ cần thêm chính sách RLS + cấu hình </w:t>
-      </w:r>
-      <w:r>
-        <w:rPr>
-          <w:rFonts w:ascii="Times New Roman" w:hAnsi="Times New Roman" w:eastAsia="Times New Roman"/>
-          <w:b w:val="0"/>
-          <w:i/>
-          <w:sz w:val="26"/>
-        </w:rPr>
-        <w:t>SET LOCAL app.current_tenant_id</w:t>
-      </w:r>
-      <w:r>
-        <w:rPr>
-          <w:rFonts w:ascii="Times New Roman" w:hAnsi="Times New Roman" w:eastAsia="Times New Roman"/>
-          <w:b w:val="0"/>
-          <w:i w:val="0"/>
-          <w:sz w:val="26"/>
-        </w:rPr>
-        <w:t xml:space="preserve"> ở tầng kết nối DB, không cần migrate dữ liệu hay refactor entity model.</w:t>
+        <w:t xml:space="preserve"> BYPASSRLS phục vụ report toàn nền tảng) và vị thế tuân thủ (cô lập logic mạnh + audit trail PDPL Art 11) — chưa đạt 5đ do là cô lập logic, không vật lý.</w:t>
       </w:r>
     </w:p>
     <w:p>

</xml_diff>

<commit_message>
docs(thesis): fix §2.1.1 FR — MISA MeInvoice overclaim + missing email service
Verified §2.1 FR against actual code:
- MISA MeInvoice VAT e-invoice: NOT in code (grep 0 misa/meinvoice; Invoice
  entity has no VAT/tax field) → reframe as lộ trình phát triển sau (GAP-185),
  keep verified manual payment tracking (cash/transfer/VietQR via payment_records)
- Email service (kitehub-email) was missing from FR despite being 1 of 6 services
  → add 'Email giao dịch' FR section (NotificationChannel SES+Resend, persona-tone
  templates, RabbitMQ email.exchange, email_logs)
Re-bake docx.
</commit_message>
<xml_diff>
--- a/documents/08-thesis/thesis-v1.docx
+++ b/documents/08-thesis/thesis-v1.docx
@@ -7122,7 +7122,7 @@
           <w:i w:val="0"/>
           <w:sz w:val="26"/>
         </w:rPr>
-        <w:t>Lõi nghiệp vụ giáo dục (KiteClass `kiteclass-core`)</w:t>
+        <w:t>Email giao dịch (KiteHub `kitehub-email`)</w:t>
       </w:r>
     </w:p>
     <w:p>
@@ -7134,20 +7134,11 @@
       <w:r>
         <w:rPr>
           <w:rFonts w:ascii="Times New Roman" w:hAnsi="Times New Roman" w:eastAsia="Times New Roman"/>
-          <w:b/>
-          <w:i w:val="0"/>
-          <w:sz w:val="26"/>
-        </w:rPr>
-        <w:t>Quản lý học sinh:</w:t>
-      </w:r>
-      <w:r>
-        <w:rPr>
-          <w:rFonts w:ascii="Times New Roman" w:hAnsi="Times New Roman" w:eastAsia="Times New Roman"/>
-          <w:b w:val="0"/>
-          <w:i w:val="0"/>
-          <w:sz w:val="26"/>
-        </w:rPr>
-        <w:t xml:space="preserve"> CRUD học sinh, nhập hàng loạt CSV/Excel (bảng </w:t>
+          <w:b w:val="0"/>
+          <w:i w:val="0"/>
+          <w:sz w:val="26"/>
+        </w:rPr>
+        <w:t xml:space="preserve">Kênh thông báo trừu tượng </w:t>
       </w:r>
       <w:r>
         <w:rPr>
@@ -7156,16 +7147,16 @@
           <w:i/>
           <w:sz w:val="26"/>
         </w:rPr>
-        <w:t>students</w:t>
-      </w:r>
-      <w:r>
-        <w:rPr>
-          <w:rFonts w:ascii="Times New Roman" w:hAnsi="Times New Roman" w:eastAsia="Times New Roman"/>
-          <w:b w:val="0"/>
-          <w:i w:val="0"/>
-          <w:sz w:val="26"/>
-        </w:rPr>
-        <w:t>), liên kết phụ huynh — học sinh</w:t>
+        <w:t>NotificationChannel</w:t>
+      </w:r>
+      <w:r>
+        <w:rPr>
+          <w:rFonts w:ascii="Times New Roman" w:hAnsi="Times New Roman" w:eastAsia="Times New Roman"/>
+          <w:b w:val="0"/>
+          <w:i w:val="0"/>
+          <w:sz w:val="26"/>
+        </w:rPr>
+        <w:t xml:space="preserve"> với hai nhà cung cấp: AWS SES (mặc định môi trường vận hành) và Resend (dự phòng), tự động chuyển đổi khi nhà cung cấp chính lỗi</w:t>
       </w:r>
     </w:p>
     <w:p>
@@ -7177,92 +7168,11 @@
       <w:r>
         <w:rPr>
           <w:rFonts w:ascii="Times New Roman" w:hAnsi="Times New Roman" w:eastAsia="Times New Roman"/>
-          <w:b/>
-          <w:i w:val="0"/>
-          <w:sz w:val="26"/>
-        </w:rPr>
-        <w:t>Lớp học &amp; thời khóa biểu:</w:t>
-      </w:r>
-      <w:r>
-        <w:rPr>
-          <w:rFonts w:ascii="Times New Roman" w:hAnsi="Times New Roman" w:eastAsia="Times New Roman"/>
-          <w:b w:val="0"/>
-          <w:i w:val="0"/>
-          <w:sz w:val="26"/>
-        </w:rPr>
-        <w:t xml:space="preserve"> Tạo lớp (ví dụ </w:t>
-      </w:r>
-      <w:r>
-        <w:rPr>
-          <w:rFonts w:ascii="Times New Roman" w:hAnsi="Times New Roman" w:eastAsia="Times New Roman"/>
-          <w:b w:val="0"/>
-          <w:i/>
-          <w:sz w:val="26"/>
-        </w:rPr>
-        <w:t>Lớp Anh ngữ 5A1</w:t>
-      </w:r>
-      <w:r>
-        <w:rPr>
-          <w:rFonts w:ascii="Times New Roman" w:hAnsi="Times New Roman" w:eastAsia="Times New Roman"/>
-          <w:b w:val="0"/>
-          <w:i w:val="0"/>
-          <w:sz w:val="26"/>
-        </w:rPr>
-        <w:t xml:space="preserve"> / </w:t>
-      </w:r>
-      <w:r>
-        <w:rPr>
-          <w:rFonts w:ascii="Times New Roman" w:hAnsi="Times New Roman" w:eastAsia="Times New Roman"/>
-          <w:b w:val="0"/>
-          <w:i/>
-          <w:sz w:val="26"/>
-        </w:rPr>
-        <w:t>Lớp Toán 9B</w:t>
-      </w:r>
-      <w:r>
-        <w:rPr>
-          <w:rFonts w:ascii="Times New Roman" w:hAnsi="Times New Roman" w:eastAsia="Times New Roman"/>
-          <w:b w:val="0"/>
-          <w:i w:val="0"/>
-          <w:sz w:val="26"/>
-        </w:rPr>
-        <w:t xml:space="preserve">), gắn </w:t>
-      </w:r>
-      <w:r>
-        <w:rPr>
-          <w:rFonts w:ascii="Times New Roman" w:hAnsi="Times New Roman" w:eastAsia="Times New Roman"/>
-          <w:b w:val="0"/>
-          <w:i/>
-          <w:sz w:val="26"/>
-        </w:rPr>
-        <w:t>homeroom_class</w:t>
-      </w:r>
-      <w:r>
-        <w:rPr>
-          <w:rFonts w:ascii="Times New Roman" w:hAnsi="Times New Roman" w:eastAsia="Times New Roman"/>
-          <w:b w:val="0"/>
-          <w:i w:val="0"/>
-          <w:sz w:val="26"/>
-        </w:rPr>
-        <w:t xml:space="preserve"> cho lớp chủ nhiệm, lập lịch buổi học qua </w:t>
-      </w:r>
-      <w:r>
-        <w:rPr>
-          <w:rFonts w:ascii="Times New Roman" w:hAnsi="Times New Roman" w:eastAsia="Times New Roman"/>
-          <w:b w:val="0"/>
-          <w:i/>
-          <w:sz w:val="26"/>
-        </w:rPr>
-        <w:t>class_schedule_slots</w:t>
-      </w:r>
-      <w:r>
-        <w:rPr>
-          <w:rFonts w:ascii="Times New Roman" w:hAnsi="Times New Roman" w:eastAsia="Times New Roman"/>
-          <w:b w:val="0"/>
-          <w:i w:val="0"/>
-          <w:sz w:val="26"/>
-        </w:rPr>
-        <w:t xml:space="preserve"> (khung thứ 2-7 17:00-21:00 buổi tối phổ biến)</w:t>
+          <w:b w:val="0"/>
+          <w:i w:val="0"/>
+          <w:sz w:val="26"/>
+        </w:rPr>
+        <w:t>Mẫu email theo tông giọng phù hợp vai trò người nhận (Owner trang trọng, phụ huynh kính ngữ): chào mừng, magic-link kích hoạt, hóa đơn, nhắc thanh toán, thông báo điểm/sự cố</w:t>
       </w:r>
     </w:p>
     <w:p>
@@ -7274,20 +7184,11 @@
       <w:r>
         <w:rPr>
           <w:rFonts w:ascii="Times New Roman" w:hAnsi="Times New Roman" w:eastAsia="Times New Roman"/>
-          <w:b/>
-          <w:i w:val="0"/>
-          <w:sz w:val="26"/>
-        </w:rPr>
-        <w:t>Điểm danh:</w:t>
-      </w:r>
-      <w:r>
-        <w:rPr>
-          <w:rFonts w:ascii="Times New Roman" w:hAnsi="Times New Roman" w:eastAsia="Times New Roman"/>
-          <w:b w:val="0"/>
-          <w:i w:val="0"/>
-          <w:sz w:val="26"/>
-        </w:rPr>
-        <w:t xml:space="preserve"> GVCN điểm danh từng </w:t>
+          <w:b w:val="0"/>
+          <w:i w:val="0"/>
+          <w:sz w:val="26"/>
+        </w:rPr>
+        <w:t xml:space="preserve">Gửi bất đồng bộ qua sự kiện RabbitMQ </w:t>
       </w:r>
       <w:r>
         <w:rPr>
@@ -7296,16 +7197,16 @@
           <w:i/>
           <w:sz w:val="26"/>
         </w:rPr>
-        <w:t>attendance_period</w:t>
-      </w:r>
-      <w:r>
-        <w:rPr>
-          <w:rFonts w:ascii="Times New Roman" w:hAnsi="Times New Roman" w:eastAsia="Times New Roman"/>
-          <w:b w:val="0"/>
-          <w:i w:val="0"/>
-          <w:sz w:val="26"/>
-        </w:rPr>
-        <w:t xml:space="preserve"> (mỗi buổi học), trạng thái Có/Vắng/Nghỉ phép</w:t>
+        <w:t>email.exchange</w:t>
+      </w:r>
+      <w:r>
+        <w:rPr>
+          <w:rFonts w:ascii="Times New Roman" w:hAnsi="Times New Roman" w:eastAsia="Times New Roman"/>
+          <w:b w:val="0"/>
+          <w:i w:val="0"/>
+          <w:sz w:val="26"/>
+        </w:rPr>
+        <w:t xml:space="preserve"> — tách rời khỏi luồng nghiệp vụ chính để không chặn request người dùng</w:t>
       </w:r>
     </w:p>
     <w:p>
@@ -7317,92 +7218,45 @@
       <w:r>
         <w:rPr>
           <w:rFonts w:ascii="Times New Roman" w:hAnsi="Times New Roman" w:eastAsia="Times New Roman"/>
+          <w:b w:val="0"/>
+          <w:i w:val="0"/>
+          <w:sz w:val="26"/>
+        </w:rPr>
+        <w:t xml:space="preserve">Nhật ký gửi lưu bảng </w:t>
+      </w:r>
+      <w:r>
+        <w:rPr>
+          <w:rFonts w:ascii="Times New Roman" w:hAnsi="Times New Roman" w:eastAsia="Times New Roman"/>
+          <w:b w:val="0"/>
+          <w:i/>
+          <w:sz w:val="26"/>
+        </w:rPr>
+        <w:t>email_logs</w:t>
+      </w:r>
+      <w:r>
+        <w:rPr>
+          <w:rFonts w:ascii="Times New Roman" w:hAnsi="Times New Roman" w:eastAsia="Times New Roman"/>
+          <w:b w:val="0"/>
+          <w:i w:val="0"/>
+          <w:sz w:val="26"/>
+        </w:rPr>
+        <w:t xml:space="preserve"> phục vụ tra cứu và đối soát tỷ lệ gửi thành công</w:t>
+      </w:r>
+    </w:p>
+    <w:p>
+      <w:pPr>
+        <w:spacing w:line="288" w:lineRule="auto"/>
+        <w:ind w:firstLine="567"/>
+        <w:jc w:val="both"/>
+      </w:pPr>
+      <w:r>
+        <w:rPr>
+          <w:rFonts w:ascii="Times New Roman" w:hAnsi="Times New Roman" w:eastAsia="Times New Roman"/>
           <w:b/>
           <w:i w:val="0"/>
           <w:sz w:val="26"/>
         </w:rPr>
-        <w:t>Chấm điểm:</w:t>
-      </w:r>
-      <w:r>
-        <w:rPr>
-          <w:rFonts w:ascii="Times New Roman" w:hAnsi="Times New Roman" w:eastAsia="Times New Roman"/>
-          <w:b w:val="0"/>
-          <w:i w:val="0"/>
-          <w:sz w:val="26"/>
-        </w:rPr>
-        <w:t xml:space="preserve"> Nhập điểm </w:t>
-      </w:r>
-      <w:r>
-        <w:rPr>
-          <w:rFonts w:ascii="Times New Roman" w:hAnsi="Times New Roman" w:eastAsia="Times New Roman"/>
-          <w:b w:val="0"/>
-          <w:i/>
-          <w:sz w:val="26"/>
-        </w:rPr>
-        <w:t>grades</w:t>
-      </w:r>
-      <w:r>
-        <w:rPr>
-          <w:rFonts w:ascii="Times New Roman" w:hAnsi="Times New Roman" w:eastAsia="Times New Roman"/>
-          <w:b w:val="0"/>
-          <w:i w:val="0"/>
-          <w:sz w:val="26"/>
-        </w:rPr>
-        <w:t xml:space="preserve"> cho </w:t>
-      </w:r>
-      <w:r>
-        <w:rPr>
-          <w:rFonts w:ascii="Times New Roman" w:hAnsi="Times New Roman" w:eastAsia="Times New Roman"/>
-          <w:b w:val="0"/>
-          <w:i/>
-          <w:sz w:val="26"/>
-        </w:rPr>
-        <w:t>assignments</w:t>
-      </w:r>
-      <w:r>
-        <w:rPr>
-          <w:rFonts w:ascii="Times New Roman" w:hAnsi="Times New Roman" w:eastAsia="Times New Roman"/>
-          <w:b w:val="0"/>
-          <w:i w:val="0"/>
-          <w:sz w:val="26"/>
-        </w:rPr>
-        <w:t xml:space="preserve"> / </w:t>
-      </w:r>
-      <w:r>
-        <w:rPr>
-          <w:rFonts w:ascii="Times New Roman" w:hAnsi="Times New Roman" w:eastAsia="Times New Roman"/>
-          <w:b w:val="0"/>
-          <w:i/>
-          <w:sz w:val="26"/>
-        </w:rPr>
-        <w:t>subject_grades</w:t>
-      </w:r>
-      <w:r>
-        <w:rPr>
-          <w:rFonts w:ascii="Times New Roman" w:hAnsi="Times New Roman" w:eastAsia="Times New Roman"/>
-          <w:b w:val="0"/>
-          <w:i w:val="0"/>
-          <w:sz w:val="26"/>
-        </w:rPr>
-        <w:t xml:space="preserve">, xuất bảng điểm theo </w:t>
-      </w:r>
-      <w:r>
-        <w:rPr>
-          <w:rFonts w:ascii="Times New Roman" w:hAnsi="Times New Roman" w:eastAsia="Times New Roman"/>
-          <w:b w:val="0"/>
-          <w:i/>
-          <w:sz w:val="26"/>
-        </w:rPr>
-        <w:t>grading_scales</w:t>
-      </w:r>
-      <w:r>
-        <w:rPr>
-          <w:rFonts w:ascii="Times New Roman" w:hAnsi="Times New Roman" w:eastAsia="Times New Roman"/>
-          <w:b w:val="0"/>
-          <w:i w:val="0"/>
-          <w:sz w:val="26"/>
-        </w:rPr>
-        <w:t xml:space="preserve"> (thang 10); báo cáo cuối kỳ HK1/HK2/HK_Hè</w:t>
+        <w:t>Lõi nghiệp vụ giáo dục (KiteClass `kiteclass-core`)</w:t>
       </w:r>
     </w:p>
     <w:p>
@@ -7418,6 +7272,286 @@
           <w:i w:val="0"/>
           <w:sz w:val="26"/>
         </w:rPr>
+        <w:t>Quản lý học sinh:</w:t>
+      </w:r>
+      <w:r>
+        <w:rPr>
+          <w:rFonts w:ascii="Times New Roman" w:hAnsi="Times New Roman" w:eastAsia="Times New Roman"/>
+          <w:b w:val="0"/>
+          <w:i w:val="0"/>
+          <w:sz w:val="26"/>
+        </w:rPr>
+        <w:t xml:space="preserve"> CRUD học sinh, nhập hàng loạt CSV/Excel (bảng </w:t>
+      </w:r>
+      <w:r>
+        <w:rPr>
+          <w:rFonts w:ascii="Times New Roman" w:hAnsi="Times New Roman" w:eastAsia="Times New Roman"/>
+          <w:b w:val="0"/>
+          <w:i/>
+          <w:sz w:val="26"/>
+        </w:rPr>
+        <w:t>students</w:t>
+      </w:r>
+      <w:r>
+        <w:rPr>
+          <w:rFonts w:ascii="Times New Roman" w:hAnsi="Times New Roman" w:eastAsia="Times New Roman"/>
+          <w:b w:val="0"/>
+          <w:i w:val="0"/>
+          <w:sz w:val="26"/>
+        </w:rPr>
+        <w:t>), liên kết phụ huynh — học sinh</w:t>
+      </w:r>
+    </w:p>
+    <w:p>
+      <w:pPr>
+        <w:pStyle w:val="ListBullet"/>
+        <w:spacing w:line="288" w:lineRule="auto"/>
+        <w:ind w:left="850" w:hanging="283"/>
+      </w:pPr>
+      <w:r>
+        <w:rPr>
+          <w:rFonts w:ascii="Times New Roman" w:hAnsi="Times New Roman" w:eastAsia="Times New Roman"/>
+          <w:b/>
+          <w:i w:val="0"/>
+          <w:sz w:val="26"/>
+        </w:rPr>
+        <w:t>Lớp học &amp; thời khóa biểu:</w:t>
+      </w:r>
+      <w:r>
+        <w:rPr>
+          <w:rFonts w:ascii="Times New Roman" w:hAnsi="Times New Roman" w:eastAsia="Times New Roman"/>
+          <w:b w:val="0"/>
+          <w:i w:val="0"/>
+          <w:sz w:val="26"/>
+        </w:rPr>
+        <w:t xml:space="preserve"> Tạo lớp (ví dụ </w:t>
+      </w:r>
+      <w:r>
+        <w:rPr>
+          <w:rFonts w:ascii="Times New Roman" w:hAnsi="Times New Roman" w:eastAsia="Times New Roman"/>
+          <w:b w:val="0"/>
+          <w:i/>
+          <w:sz w:val="26"/>
+        </w:rPr>
+        <w:t>Lớp Anh ngữ 5A1</w:t>
+      </w:r>
+      <w:r>
+        <w:rPr>
+          <w:rFonts w:ascii="Times New Roman" w:hAnsi="Times New Roman" w:eastAsia="Times New Roman"/>
+          <w:b w:val="0"/>
+          <w:i w:val="0"/>
+          <w:sz w:val="26"/>
+        </w:rPr>
+        <w:t xml:space="preserve"> / </w:t>
+      </w:r>
+      <w:r>
+        <w:rPr>
+          <w:rFonts w:ascii="Times New Roman" w:hAnsi="Times New Roman" w:eastAsia="Times New Roman"/>
+          <w:b w:val="0"/>
+          <w:i/>
+          <w:sz w:val="26"/>
+        </w:rPr>
+        <w:t>Lớp Toán 9B</w:t>
+      </w:r>
+      <w:r>
+        <w:rPr>
+          <w:rFonts w:ascii="Times New Roman" w:hAnsi="Times New Roman" w:eastAsia="Times New Roman"/>
+          <w:b w:val="0"/>
+          <w:i w:val="0"/>
+          <w:sz w:val="26"/>
+        </w:rPr>
+        <w:t xml:space="preserve">), gắn </w:t>
+      </w:r>
+      <w:r>
+        <w:rPr>
+          <w:rFonts w:ascii="Times New Roman" w:hAnsi="Times New Roman" w:eastAsia="Times New Roman"/>
+          <w:b w:val="0"/>
+          <w:i/>
+          <w:sz w:val="26"/>
+        </w:rPr>
+        <w:t>homeroom_class</w:t>
+      </w:r>
+      <w:r>
+        <w:rPr>
+          <w:rFonts w:ascii="Times New Roman" w:hAnsi="Times New Roman" w:eastAsia="Times New Roman"/>
+          <w:b w:val="0"/>
+          <w:i w:val="0"/>
+          <w:sz w:val="26"/>
+        </w:rPr>
+        <w:t xml:space="preserve"> cho lớp chủ nhiệm, lập lịch buổi học qua </w:t>
+      </w:r>
+      <w:r>
+        <w:rPr>
+          <w:rFonts w:ascii="Times New Roman" w:hAnsi="Times New Roman" w:eastAsia="Times New Roman"/>
+          <w:b w:val="0"/>
+          <w:i/>
+          <w:sz w:val="26"/>
+        </w:rPr>
+        <w:t>class_schedule_slots</w:t>
+      </w:r>
+      <w:r>
+        <w:rPr>
+          <w:rFonts w:ascii="Times New Roman" w:hAnsi="Times New Roman" w:eastAsia="Times New Roman"/>
+          <w:b w:val="0"/>
+          <w:i w:val="0"/>
+          <w:sz w:val="26"/>
+        </w:rPr>
+        <w:t xml:space="preserve"> (khung thứ 2-7 17:00-21:00 buổi tối phổ biến)</w:t>
+      </w:r>
+    </w:p>
+    <w:p>
+      <w:pPr>
+        <w:pStyle w:val="ListBullet"/>
+        <w:spacing w:line="288" w:lineRule="auto"/>
+        <w:ind w:left="850" w:hanging="283"/>
+      </w:pPr>
+      <w:r>
+        <w:rPr>
+          <w:rFonts w:ascii="Times New Roman" w:hAnsi="Times New Roman" w:eastAsia="Times New Roman"/>
+          <w:b/>
+          <w:i w:val="0"/>
+          <w:sz w:val="26"/>
+        </w:rPr>
+        <w:t>Điểm danh:</w:t>
+      </w:r>
+      <w:r>
+        <w:rPr>
+          <w:rFonts w:ascii="Times New Roman" w:hAnsi="Times New Roman" w:eastAsia="Times New Roman"/>
+          <w:b w:val="0"/>
+          <w:i w:val="0"/>
+          <w:sz w:val="26"/>
+        </w:rPr>
+        <w:t xml:space="preserve"> GVCN điểm danh từng </w:t>
+      </w:r>
+      <w:r>
+        <w:rPr>
+          <w:rFonts w:ascii="Times New Roman" w:hAnsi="Times New Roman" w:eastAsia="Times New Roman"/>
+          <w:b w:val="0"/>
+          <w:i/>
+          <w:sz w:val="26"/>
+        </w:rPr>
+        <w:t>attendance_period</w:t>
+      </w:r>
+      <w:r>
+        <w:rPr>
+          <w:rFonts w:ascii="Times New Roman" w:hAnsi="Times New Roman" w:eastAsia="Times New Roman"/>
+          <w:b w:val="0"/>
+          <w:i w:val="0"/>
+          <w:sz w:val="26"/>
+        </w:rPr>
+        <w:t xml:space="preserve"> (mỗi buổi học), trạng thái Có/Vắng/Nghỉ phép</w:t>
+      </w:r>
+    </w:p>
+    <w:p>
+      <w:pPr>
+        <w:pStyle w:val="ListBullet"/>
+        <w:spacing w:line="288" w:lineRule="auto"/>
+        <w:ind w:left="850" w:hanging="283"/>
+      </w:pPr>
+      <w:r>
+        <w:rPr>
+          <w:rFonts w:ascii="Times New Roman" w:hAnsi="Times New Roman" w:eastAsia="Times New Roman"/>
+          <w:b/>
+          <w:i w:val="0"/>
+          <w:sz w:val="26"/>
+        </w:rPr>
+        <w:t>Chấm điểm:</w:t>
+      </w:r>
+      <w:r>
+        <w:rPr>
+          <w:rFonts w:ascii="Times New Roman" w:hAnsi="Times New Roman" w:eastAsia="Times New Roman"/>
+          <w:b w:val="0"/>
+          <w:i w:val="0"/>
+          <w:sz w:val="26"/>
+        </w:rPr>
+        <w:t xml:space="preserve"> Nhập điểm </w:t>
+      </w:r>
+      <w:r>
+        <w:rPr>
+          <w:rFonts w:ascii="Times New Roman" w:hAnsi="Times New Roman" w:eastAsia="Times New Roman"/>
+          <w:b w:val="0"/>
+          <w:i/>
+          <w:sz w:val="26"/>
+        </w:rPr>
+        <w:t>grades</w:t>
+      </w:r>
+      <w:r>
+        <w:rPr>
+          <w:rFonts w:ascii="Times New Roman" w:hAnsi="Times New Roman" w:eastAsia="Times New Roman"/>
+          <w:b w:val="0"/>
+          <w:i w:val="0"/>
+          <w:sz w:val="26"/>
+        </w:rPr>
+        <w:t xml:space="preserve"> cho </w:t>
+      </w:r>
+      <w:r>
+        <w:rPr>
+          <w:rFonts w:ascii="Times New Roman" w:hAnsi="Times New Roman" w:eastAsia="Times New Roman"/>
+          <w:b w:val="0"/>
+          <w:i/>
+          <w:sz w:val="26"/>
+        </w:rPr>
+        <w:t>assignments</w:t>
+      </w:r>
+      <w:r>
+        <w:rPr>
+          <w:rFonts w:ascii="Times New Roman" w:hAnsi="Times New Roman" w:eastAsia="Times New Roman"/>
+          <w:b w:val="0"/>
+          <w:i w:val="0"/>
+          <w:sz w:val="26"/>
+        </w:rPr>
+        <w:t xml:space="preserve"> / </w:t>
+      </w:r>
+      <w:r>
+        <w:rPr>
+          <w:rFonts w:ascii="Times New Roman" w:hAnsi="Times New Roman" w:eastAsia="Times New Roman"/>
+          <w:b w:val="0"/>
+          <w:i/>
+          <w:sz w:val="26"/>
+        </w:rPr>
+        <w:t>subject_grades</w:t>
+      </w:r>
+      <w:r>
+        <w:rPr>
+          <w:rFonts w:ascii="Times New Roman" w:hAnsi="Times New Roman" w:eastAsia="Times New Roman"/>
+          <w:b w:val="0"/>
+          <w:i w:val="0"/>
+          <w:sz w:val="26"/>
+        </w:rPr>
+        <w:t xml:space="preserve">, xuất bảng điểm theo </w:t>
+      </w:r>
+      <w:r>
+        <w:rPr>
+          <w:rFonts w:ascii="Times New Roman" w:hAnsi="Times New Roman" w:eastAsia="Times New Roman"/>
+          <w:b w:val="0"/>
+          <w:i/>
+          <w:sz w:val="26"/>
+        </w:rPr>
+        <w:t>grading_scales</w:t>
+      </w:r>
+      <w:r>
+        <w:rPr>
+          <w:rFonts w:ascii="Times New Roman" w:hAnsi="Times New Roman" w:eastAsia="Times New Roman"/>
+          <w:b w:val="0"/>
+          <w:i w:val="0"/>
+          <w:sz w:val="26"/>
+        </w:rPr>
+        <w:t xml:space="preserve"> (thang 10); báo cáo cuối kỳ HK1/HK2/HK_Hè</w:t>
+      </w:r>
+    </w:p>
+    <w:p>
+      <w:pPr>
+        <w:pStyle w:val="ListBullet"/>
+        <w:spacing w:line="288" w:lineRule="auto"/>
+        <w:ind w:left="850" w:hanging="283"/>
+      </w:pPr>
+      <w:r>
+        <w:rPr>
+          <w:rFonts w:ascii="Times New Roman" w:hAnsi="Times New Roman" w:eastAsia="Times New Roman"/>
+          <w:b/>
+          <w:i w:val="0"/>
+          <w:sz w:val="26"/>
+        </w:rPr>
         <w:t>Thanh toán theo tenant:</w:t>
       </w:r>
       <w:r>
@@ -7463,7 +7597,25 @@
           <w:i w:val="0"/>
           <w:sz w:val="26"/>
         </w:rPr>
-        <w:t>), theo dõi chuyển khoản/tiền mặt, xuất hóa đơn điện tử VAT tích hợp với MISA MeInvoice</w:t>
+        <w:t xml:space="preserve">), ghi nhận thanh toán thủ công qua chuyển khoản / tiền mặt / VietQR (bảng </w:t>
+      </w:r>
+      <w:r>
+        <w:rPr>
+          <w:rFonts w:ascii="Times New Roman" w:hAnsi="Times New Roman" w:eastAsia="Times New Roman"/>
+          <w:b w:val="0"/>
+          <w:i/>
+          <w:sz w:val="26"/>
+        </w:rPr>
+        <w:t>payment_records</w:t>
+      </w:r>
+      <w:r>
+        <w:rPr>
+          <w:rFonts w:ascii="Times New Roman" w:hAnsi="Times New Roman" w:eastAsia="Times New Roman"/>
+          <w:b w:val="0"/>
+          <w:i w:val="0"/>
+          <w:sz w:val="26"/>
+        </w:rPr>
+        <w:t>). Xuất hóa đơn điện tử VAT theo Thông tư 78/2021/TT-BTC (qua đối tác MISA MeInvoice) thuộc lộ trình phát triển sau</w:t>
       </w:r>
     </w:p>
     <w:p>

</xml_diff>

<commit_message>
fix(thesis): Ch.3 reconcile dashboard/student count 78→30 HV + 5→1 khóa khớp seed thật cô Khánh (wave-thesis-4)
</commit_message>
<xml_diff>
--- a/documents/08-thesis/thesis-v1.docx
+++ b/documents/08-thesis/thesis-v1.docx
@@ -2826,40 +2826,6 @@
                 <w:i w:val="0"/>
                 <w:sz w:val="24"/>
               </w:rPr>
-              <w:t>SDXL</w:t>
-            </w:r>
-          </w:p>
-        </w:tc>
-        <w:tc>
-          <w:tcPr>
-            <w:tcW w:type="dxa" w:w="7087"/>
-          </w:tcPr>
-          <w:p>
-            <w:r>
-              <w:rPr>
-                <w:rFonts w:ascii="Times New Roman" w:hAnsi="Times New Roman" w:eastAsia="Times New Roman"/>
-                <w:b w:val="0"/>
-                <w:i w:val="0"/>
-                <w:sz w:val="24"/>
-              </w:rPr>
-              <w:t>Stable Diffusion XL — mô hình sinh ảnh từ văn bản</w:t>
-            </w:r>
-          </w:p>
-        </w:tc>
-      </w:tr>
-      <w:tr>
-        <w:tc>
-          <w:tcPr>
-            <w:tcW w:type="dxa" w:w="1984"/>
-          </w:tcPr>
-          <w:p>
-            <w:r>
-              <w:rPr>
-                <w:rFonts w:ascii="Times New Roman" w:hAnsi="Times New Roman" w:eastAsia="Times New Roman"/>
-                <w:b/>
-                <w:i w:val="0"/>
-                <w:sz w:val="24"/>
-              </w:rPr>
               <w:t>SES</w:t>
             </w:r>
           </w:p>
@@ -4011,7 +3977,7 @@
           <w:i w:val="0"/>
           <w:sz w:val="26"/>
         </w:rPr>
-        <w:t>Để xác định cơ hội và định vị sản phẩm, đề tài tiến hành khảo sát hai khía cạnh bổ trợ: các sản phẩm phần mềm quản lý trung tâm hiện có trên thị trường, và nhu cầu thực tế từ các nhóm người dùng cuối. Phần khảo sát các hệ thống tham khảo dưới đây phân tích bốn sản phẩm tiêu biểu trong phân khúc trung tâm giáo dục tư nhân — BeeClass, Mona eLMS, Easy Edu và DotB — theo các tiêu chí phân khúc mục tiêu, mức giá, kiến trúc, khả năng tích hợp AI và mức tuân thủ pháp luật Việt Nam.</w:t>
+        <w:t>Để xác định cơ hội và định vị sản phẩm, đề tài tiến hành khảo sát hai khía cạnh bổ trợ: các sản phẩm phần mềm hiện có trên thị trường, và nhu cầu thực tế từ các nhóm người dùng cuối. Phần khảo sát các hệ thống tham khảo dưới đây phân tích bốn sản phẩm tiêu biểu — BeeClass (ứng dụng gamification quản lý điểm thi đua), cùng ba phần mềm quản lý trung tâm Mona eLMS, Easy Edu và DotB — theo các tiêu chí phân khúc mục tiêu, mức giá, kiến trúc, khả năng tích hợp AI và mức tuân thủ pháp luật Việt Nam. BeeClass được đưa vào như đại diện nhóm công cụ nhẹ — miễn phí phục vụ tương tác lớp học, tương phản với nhóm phần mềm quản lý nghiệp vụ trung tâm.</w:t>
       </w:r>
     </w:p>
     <w:p>
@@ -4025,7 +3991,7 @@
           <w:color w:val="000000"/>
           <w:sz w:val="28"/>
         </w:rPr>
-        <w:t>1.2.1 BeeClass — phần mềm quản lý trung tâm tiếng Anh phổ biến</w:t>
+        <w:t>1.2.1 BeeClass — ứng dụng gamification quản lý điểm thi đua</w:t>
       </w:r>
     </w:p>
     <w:p>
@@ -4050,7 +4016,7 @@
           <w:i w:val="0"/>
           <w:sz w:val="26"/>
         </w:rPr>
-        <w:t xml:space="preserve"> [25] là sản phẩm phần mềm quản lý trung tâm ngoại ngữ phổ biến tại thị trường Việt Nam, được vận hành bởi nhóm phát triển trong nước, định vị phục vụ các trung tâm tiếng Anh quy mô vừa. Sản phẩm cung cấp các module quản lý học viên, lớp học, điểm danh, học phí, gửi thông báo cho phụ huynh qua Zalo và email, kèm dashboard tổng quan doanh thu cho chủ sở hữu trung tâm. Theo thông tin công bố trên website chính thức [25] (truy cập ngày 20/05/2026), BeeClass có hàng trăm trung tâm khách hàng tại nhiều tỉnh thành.</w:t>
+        <w:t xml:space="preserve"> [39] là ứng dụng quản lý điểm thi đua của học sinh phổ biến tại Việt Nam, do nhóm phát triển trong nước vận hành với khẩu hiệu "Lớp học Hạnh phúc". Khác với nhóm phần mềm quản lý trung tâm, BeeClass định vị là công cụ gamification (game hóa) nhẹ cho giáo viên: thầy cô quy ước các tiêu chí thưởng — phạt (hăng hái phát biểu, làm bài đầy đủ, đi học trễ, nói chuyện riêng…) rồi tích/trừ điểm cho học sinh, kèm hình đại diện sinh động nhằm tạo động lực học tập. Theo thông tin công bố trên website chính thức [39] (truy cập ngày 30/05/2026), sản phẩm hướng tới giáo viên chủ nhiệm, lớp tiếng Anh, lớp ngoại khóa và nhóm học trẻ em.</w:t>
       </w:r>
     </w:p>
     <w:p>
@@ -4112,7 +4078,7 @@
           <w:rFonts w:ascii="Times New Roman" w:hAnsi="Times New Roman" w:eastAsia="Times New Roman"/>
           <w:sz w:val="26"/>
         </w:rPr>
-        <w:t>. Giao diện trang chủ BeeClass — phần mềm quản lý trung tâm tiếng Anh phổ biến tại Việt Nam</w:t>
+        <w:t>. Giao diện trang chủ BeeClass — ứng dụng gamification quản lý điểm thi đua học sinh</w:t>
       </w:r>
     </w:p>
     <w:p>
@@ -4128,7 +4094,7 @@
           <w:i/>
           <w:sz w:val="26"/>
         </w:rPr>
-        <w:t>Nguồn: https://beeclass.com, truy cập ngày 20/05/2026.</w:t>
+        <w:t>Nguồn: https://beeclass.net, truy cập ngày 30/05/2026.</w:t>
       </w:r>
     </w:p>
     <w:p>
@@ -4144,7 +4110,25 @@
           <w:i w:val="0"/>
           <w:sz w:val="26"/>
         </w:rPr>
-        <w:t>Thế mạnh chính của BeeClass là giao diện tiếng Việt thân thiện và hỗ trợ quy trình đặc thù của trung tâm tiếng Anh (lịch lớp định kỳ theo tuần, đăng ký lớp thử miễn phí, theo dõi tiến độ học viên theo từng kỹ năng nghe-nói-đọc-viết). Mức giá tham khảo công bố nằm trong khoảng 1-3 triệu đồng/tháng tùy gói và số lượng học viên. Điểm yếu chính của BeeClass tương tự các sản phẩm trong phân khúc: kiến trúc đơn tenant (single-tenant) — mỗi khách hàng có một instance cơ sở dữ liệu riêng, khó mở rộng khi trung tâm mở chi nhánh thứ năm trở lên; chưa có tính năng tự sinh tài nguyên thương hiệu bằng AI; quy trình khởi tạo yêu cầu liên hệ bộ phận kinh doanh chứ chưa hoàn toàn tự phục vụ; mức giá tuy phải chăng hơn các sản phẩm hướng doanh nghiệp nhưng vẫn cao hơn mức 500.000đ/tháng mà phân khúc trung tâm tự phát nhỏ kỳ vọng.</w:t>
+        <w:t xml:space="preserve">Tập tính năng chính của BeeClass gồm: điểm danh từng buổi học (kèm gọi tên ngẫu nhiên), tích điểm thưởng — phạt theo tiêu chí, thống kê thành tích theo tuần/tháng, ghi nhận xét mỗi buổi và cho phụ huynh xem qua liên kết chia sẻ. Thế mạnh là giao diện tiếng Việt đơn giản, đăng nhập bằng tài khoản Gmail dùng ngay trên mọi thiết bị, miễn phí ở mức cơ bản và dễ tương tác với phụ huynh. Tuy nhiên, BeeClass thuộc một phân khúc khác với đề tài: sản phẩm tập trung vào game hóa lớp học, </w:t>
+      </w:r>
+      <w:r>
+        <w:rPr>
+          <w:rFonts w:ascii="Times New Roman" w:hAnsi="Times New Roman" w:eastAsia="Times New Roman"/>
+          <w:b/>
+          <w:i w:val="0"/>
+          <w:sz w:val="26"/>
+        </w:rPr>
+        <w:t>không cung cấp các nghiệp vụ quản lý kinh doanh</w:t>
+      </w:r>
+      <w:r>
+        <w:rPr>
+          <w:rFonts w:ascii="Times New Roman" w:hAnsi="Times New Roman" w:eastAsia="Times New Roman"/>
+          <w:b w:val="0"/>
+          <w:i w:val="0"/>
+          <w:sz w:val="26"/>
+        </w:rPr>
+        <w:t xml:space="preserve"> mà trung tâm và giáo viên dạy thêm cần — không có quản lý học phí, đối soát thanh toán, hóa đơn, báo cáo doanh thu, xếp lịch lớp định kỳ hay quản lý đa chi nhánh. Việc BeeClass được giáo viên đón nhận cho thấy nhu cầu công cụ nhẹ, miễn phí, tự phục vụ; nhưng khoảng trống nghiệp vụ quản lý dạy-thêm vẫn bỏ ngỏ — đây chính là phần đề tài hướng tới.</w:t>
       </w:r>
     </w:p>
     <w:p>
@@ -4975,7 +4959,7 @@
                 <w:i w:val="0"/>
                 <w:sz w:val="24"/>
               </w:rPr>
-              <w:t>Trung tâm tiếng Anh</w:t>
+              <w:t>GV cá nhân (gamification)</w:t>
             </w:r>
           </w:p>
         </w:tc>
@@ -5082,7 +5066,7 @@
                 <w:i w:val="0"/>
                 <w:sz w:val="24"/>
               </w:rPr>
-              <w:t>Khoảng giá (đ/tháng)</w:t>
+              <w:t>Quản lý nghiệp vụ (học phí/doanh thu/lịch)</w:t>
             </w:r>
           </w:p>
         </w:tc>
@@ -5103,7 +5087,7 @@
                 <w:i w:val="0"/>
                 <w:sz w:val="24"/>
               </w:rPr>
-              <w:t>1-3 triệu</w:t>
+              <w:t>Không</w:t>
             </w:r>
           </w:p>
         </w:tc>
@@ -5124,7 +5108,7 @@
                 <w:i w:val="0"/>
                 <w:sz w:val="24"/>
               </w:rPr>
-              <w:t>1,5-5 triệu</w:t>
+              <w:t>Có</w:t>
             </w:r>
           </w:p>
         </w:tc>
@@ -5145,7 +5129,7 @@
                 <w:i w:val="0"/>
                 <w:sz w:val="24"/>
               </w:rPr>
-              <w:t>800.000-3 triệu</w:t>
+              <w:t>Có</w:t>
             </w:r>
           </w:p>
         </w:tc>
@@ -5166,7 +5150,7 @@
                 <w:i w:val="0"/>
                 <w:sz w:val="24"/>
               </w:rPr>
-              <w:t>3-8 triệu</w:t>
+              <w:t>Có</w:t>
             </w:r>
           </w:p>
         </w:tc>
@@ -5187,7 +5171,7 @@
                 <w:i w:val="0"/>
                 <w:sz w:val="24"/>
               </w:rPr>
-              <w:t>500.000-1.500.000</w:t>
+              <w:t>Có</w:t>
             </w:r>
           </w:p>
         </w:tc>
@@ -5210,7 +5194,7 @@
                 <w:i w:val="0"/>
                 <w:sz w:val="24"/>
               </w:rPr>
-              <w:t>Kiến trúc multi-tenant gốc</w:t>
+              <w:t>Khoảng giá (đ/tháng)</w:t>
             </w:r>
           </w:p>
         </w:tc>
@@ -5231,7 +5215,7 @@
                 <w:i w:val="0"/>
                 <w:sz w:val="24"/>
               </w:rPr>
-              <w:t>Không</w:t>
+              <w:t>Miễn phí cơ bản</w:t>
             </w:r>
           </w:p>
         </w:tc>
@@ -5252,7 +5236,7 @@
                 <w:i w:val="0"/>
                 <w:sz w:val="24"/>
               </w:rPr>
-              <w:t>Không</w:t>
+              <w:t>1,5-5 triệu</w:t>
             </w:r>
           </w:p>
         </w:tc>
@@ -5273,7 +5257,7 @@
                 <w:i w:val="0"/>
                 <w:sz w:val="24"/>
               </w:rPr>
-              <w:t>Không</w:t>
+              <w:t>800.000-3 triệu</w:t>
             </w:r>
           </w:p>
         </w:tc>
@@ -5294,7 +5278,7 @@
                 <w:i w:val="0"/>
                 <w:sz w:val="24"/>
               </w:rPr>
-              <w:t>Không</w:t>
+              <w:t>3-8 triệu</w:t>
             </w:r>
           </w:p>
         </w:tc>
@@ -5315,7 +5299,7 @@
                 <w:i w:val="0"/>
                 <w:sz w:val="24"/>
               </w:rPr>
-              <w:t>Có</w:t>
+              <w:t>500.000-1.500.000</w:t>
             </w:r>
           </w:p>
         </w:tc>
@@ -5338,7 +5322,7 @@
                 <w:i w:val="0"/>
                 <w:sz w:val="24"/>
               </w:rPr>
-              <w:t>AI Branding tự sinh</w:t>
+              <w:t>Kiến trúc multi-tenant gốc</w:t>
             </w:r>
           </w:p>
         </w:tc>
@@ -5466,6 +5450,134 @@
                 <w:i w:val="0"/>
                 <w:sz w:val="24"/>
               </w:rPr>
+              <w:t>AI Branding tự sinh</w:t>
+            </w:r>
+          </w:p>
+        </w:tc>
+        <w:tc>
+          <w:tcPr>
+            <w:tcW w:type="dxa" w:w="1440"/>
+          </w:tcPr>
+          <w:p>
+            <w:r>
+              <w:rPr>
+                <w:sz w:val="24"/>
+              </w:rPr>
+            </w:r>
+            <w:r>
+              <w:rPr>
+                <w:rFonts w:ascii="Times New Roman" w:hAnsi="Times New Roman" w:eastAsia="Times New Roman"/>
+                <w:b w:val="0"/>
+                <w:i w:val="0"/>
+                <w:sz w:val="24"/>
+              </w:rPr>
+              <w:t>Không</w:t>
+            </w:r>
+          </w:p>
+        </w:tc>
+        <w:tc>
+          <w:tcPr>
+            <w:tcW w:type="dxa" w:w="1440"/>
+          </w:tcPr>
+          <w:p>
+            <w:r>
+              <w:rPr>
+                <w:sz w:val="24"/>
+              </w:rPr>
+            </w:r>
+            <w:r>
+              <w:rPr>
+                <w:rFonts w:ascii="Times New Roman" w:hAnsi="Times New Roman" w:eastAsia="Times New Roman"/>
+                <w:b w:val="0"/>
+                <w:i w:val="0"/>
+                <w:sz w:val="24"/>
+              </w:rPr>
+              <w:t>Không</w:t>
+            </w:r>
+          </w:p>
+        </w:tc>
+        <w:tc>
+          <w:tcPr>
+            <w:tcW w:type="dxa" w:w="1440"/>
+          </w:tcPr>
+          <w:p>
+            <w:r>
+              <w:rPr>
+                <w:sz w:val="24"/>
+              </w:rPr>
+            </w:r>
+            <w:r>
+              <w:rPr>
+                <w:rFonts w:ascii="Times New Roman" w:hAnsi="Times New Roman" w:eastAsia="Times New Roman"/>
+                <w:b w:val="0"/>
+                <w:i w:val="0"/>
+                <w:sz w:val="24"/>
+              </w:rPr>
+              <w:t>Không</w:t>
+            </w:r>
+          </w:p>
+        </w:tc>
+        <w:tc>
+          <w:tcPr>
+            <w:tcW w:type="dxa" w:w="1440"/>
+          </w:tcPr>
+          <w:p>
+            <w:r>
+              <w:rPr>
+                <w:sz w:val="24"/>
+              </w:rPr>
+            </w:r>
+            <w:r>
+              <w:rPr>
+                <w:rFonts w:ascii="Times New Roman" w:hAnsi="Times New Roman" w:eastAsia="Times New Roman"/>
+                <w:b w:val="0"/>
+                <w:i w:val="0"/>
+                <w:sz w:val="24"/>
+              </w:rPr>
+              <w:t>Không</w:t>
+            </w:r>
+          </w:p>
+        </w:tc>
+        <w:tc>
+          <w:tcPr>
+            <w:tcW w:type="dxa" w:w="1440"/>
+          </w:tcPr>
+          <w:p>
+            <w:r>
+              <w:rPr>
+                <w:sz w:val="24"/>
+              </w:rPr>
+            </w:r>
+            <w:r>
+              <w:rPr>
+                <w:rFonts w:ascii="Times New Roman" w:hAnsi="Times New Roman" w:eastAsia="Times New Roman"/>
+                <w:b w:val="0"/>
+                <w:i w:val="0"/>
+                <w:sz w:val="24"/>
+              </w:rPr>
+              <w:t>Có</w:t>
+            </w:r>
+          </w:p>
+        </w:tc>
+      </w:tr>
+      <w:tr>
+        <w:tc>
+          <w:tcPr>
+            <w:tcW w:type="dxa" w:w="1440"/>
+          </w:tcPr>
+          <w:p>
+            <w:r>
+              <w:rPr>
+                <w:sz w:val="24"/>
+              </w:rPr>
+            </w:r>
+            <w:r>
+              <w:rPr>
+                <w:rFonts w:ascii="Times New Roman" w:hAnsi="Times New Roman" w:eastAsia="Times New Roman"/>
+                <w:b w:val="0"/>
+                <w:i w:val="0"/>
+                <w:sz w:val="24"/>
+              </w:rPr>
               <w:t>Onboarding tự phục vụ</w:t>
             </w:r>
           </w:p>
@@ -5487,7 +5599,7 @@
                 <w:i w:val="0"/>
                 <w:sz w:val="24"/>
               </w:rPr>
-              <w:t>Không (liên hệ)</w:t>
+              <w:t>Có (Gmail)</w:t>
             </w:r>
           </w:p>
         </w:tc>
@@ -6929,7 +7041,7 @@
           <w:i w:val="0"/>
           <w:sz w:val="26"/>
         </w:rPr>
-        <w:t>Thanh toán qua VietQR là phương thức mặc định cho phạm vi hiện tại thủ công; tích hợp MoMo/VNPay theo lộ trình phát triển sau</w:t>
+        <w:t>Thanh toán qua VietQR là phương thức chính hiện tại (đối soát thủ công); khung tích hợp cổng VNPay đã sẵn sàng (cổng thanh toán + webhook xác nhận giao dịch); MoMo/ZaloPay ở dạng khung sơ khởi, hoàn thiện theo lộ trình phát triển sau</w:t>
       </w:r>
     </w:p>
     <w:p>
@@ -6961,25 +7073,7 @@
           <w:i w:val="0"/>
           <w:sz w:val="26"/>
         </w:rPr>
-        <w:t xml:space="preserve">Quản trị nền tảng có dashboard </w:t>
-      </w:r>
-      <w:r>
-        <w:rPr>
-          <w:rFonts w:ascii="Times New Roman" w:hAnsi="Times New Roman" w:eastAsia="Times New Roman"/>
-          <w:b w:val="0"/>
-          <w:i/>
-          <w:sz w:val="26"/>
-        </w:rPr>
-        <w:t>/admin/v1/revenue</w:t>
-      </w:r>
-      <w:r>
-        <w:rPr>
-          <w:rFonts w:ascii="Times New Roman" w:hAnsi="Times New Roman" w:eastAsia="Times New Roman"/>
-          <w:b w:val="0"/>
-          <w:i w:val="0"/>
-          <w:sz w:val="26"/>
-        </w:rPr>
-        <w:t xml:space="preserve"> để xem doanh thu, MRR, tỷ lệ churn</w:t>
+        <w:t>Quản trị nền tảng có dashboard doanh thu để xem MRR, tỷ lệ churn (chi tiết endpoint trình bày trong API contract Chương 3)</w:t>
       </w:r>
     </w:p>
     <w:p>
@@ -7045,7 +7139,7 @@
           <w:i w:val="0"/>
           <w:sz w:val="26"/>
         </w:rPr>
-        <w:t xml:space="preserve">Studio AI Branding sinh logo + hero qua MiniMax (môi trường vận hành) hoặc Ollama (môi trường phát triển); quota lưu trong bảng </w:t>
+        <w:t xml:space="preserve">Studio AI Branding sinh logo + hero qua OpenAI GPT-4 Vision + DALL-E 3 (môi trường vận hành) hoặc Ollama tự host (môi trường phát triển); quota lưu trong bảng </w:t>
       </w:r>
       <w:r>
         <w:rPr>
@@ -7054,7 +7148,7 @@
           <w:i/>
           <w:sz w:val="26"/>
         </w:rPr>
-        <w:t>tenant_quota</w:t>
+        <w:t>branding_regenerate_usage</w:t>
       </w:r>
       <w:r>
         <w:rPr>
@@ -7079,7 +7173,7 @@
           <w:i w:val="0"/>
           <w:sz w:val="26"/>
         </w:rPr>
-        <w:t xml:space="preserve">Domain gửi email được xác thực DKIM theo tenant (gói PRO) thì thư gửi từ </w:t>
+        <w:t xml:space="preserve">Xác thực DKIM theo tenant (gói PRO) để thư gửi từ domain riêng </w:t>
       </w:r>
       <w:r>
         <w:rPr>
@@ -7107,6 +7201,15 @@
           <w:sz w:val="26"/>
         </w:rPr>
         <w:t>support@kitehub.me</w:t>
+      </w:r>
+      <w:r>
+        <w:rPr>
+          <w:rFonts w:ascii="Times New Roman" w:hAnsi="Times New Roman" w:eastAsia="Times New Roman"/>
+          <w:b w:val="0"/>
+          <w:i w:val="0"/>
+          <w:sz w:val="26"/>
+        </w:rPr>
+        <w:t xml:space="preserve"> thuộc lộ trình phát triển sau</w:t>
       </w:r>
     </w:p>
     <w:p>
@@ -7156,7 +7259,7 @@
           <w:i w:val="0"/>
           <w:sz w:val="26"/>
         </w:rPr>
-        <w:t xml:space="preserve"> với hai nhà cung cấp: AWS SES (mặc định môi trường vận hành) và Resend (dự phòng), tự động chuyển đổi khi nhà cung cấp chính lỗi</w:t>
+        <w:t xml:space="preserve"> với hai nhà cung cấp cấu hình tĩnh: AWS SES (mặc định môi trường vận hành) và Resend (dự phòng); cơ chế tự động chuyển đổi (failover) khi nhà cung cấp chính lỗi thuộc lộ trình phát triển sau</w:t>
       </w:r>
     </w:p>
     <w:p>
@@ -7240,7 +7343,25 @@
           <w:i w:val="0"/>
           <w:sz w:val="26"/>
         </w:rPr>
-        <w:t xml:space="preserve"> phục vụ tra cứu và đối soát tỷ lệ gửi thành công</w:t>
+        <w:t xml:space="preserve"> (thuộc </w:t>
+      </w:r>
+      <w:r>
+        <w:rPr>
+          <w:rFonts w:ascii="Times New Roman" w:hAnsi="Times New Roman" w:eastAsia="Times New Roman"/>
+          <w:b w:val="0"/>
+          <w:i/>
+          <w:sz w:val="26"/>
+        </w:rPr>
+        <w:t>kitehub-subscription</w:t>
+      </w:r>
+      <w:r>
+        <w:rPr>
+          <w:rFonts w:ascii="Times New Roman" w:hAnsi="Times New Roman" w:eastAsia="Times New Roman"/>
+          <w:b w:val="0"/>
+          <w:i w:val="0"/>
+          <w:sz w:val="26"/>
+        </w:rPr>
+        <w:t>) phục vụ tra cứu và đối soát tỷ lệ gửi thành công</w:t>
       </w:r>
     </w:p>
     <w:p>
@@ -7281,7 +7402,7 @@
           <w:i w:val="0"/>
           <w:sz w:val="26"/>
         </w:rPr>
-        <w:t xml:space="preserve"> CRUD học sinh, nhập hàng loạt CSV/Excel (bảng </w:t>
+        <w:t xml:space="preserve"> CRUD học sinh, nhập hàng loạt từ tệp Excel (.xlsx) qua thư viện Apache POI (bảng </w:t>
       </w:r>
       <w:r>
         <w:rPr>
@@ -7378,7 +7499,7 @@
           <w:i w:val="0"/>
           <w:sz w:val="26"/>
         </w:rPr>
-        <w:t xml:space="preserve"> cho lớp chủ nhiệm, lập lịch buổi học qua </w:t>
+        <w:t xml:space="preserve"> cho lớp chủ nhiệm, lập lịch buổi học theo </w:t>
       </w:r>
       <w:r>
         <w:rPr>
@@ -7387,16 +7508,16 @@
           <w:i/>
           <w:sz w:val="26"/>
         </w:rPr>
-        <w:t>class_schedule_slots</w:t>
-      </w:r>
-      <w:r>
-        <w:rPr>
-          <w:rFonts w:ascii="Times New Roman" w:hAnsi="Times New Roman" w:eastAsia="Times New Roman"/>
-          <w:b w:val="0"/>
-          <w:i w:val="0"/>
-          <w:sz w:val="26"/>
-        </w:rPr>
-        <w:t xml:space="preserve"> (khung thứ 2-7 17:00-21:00 buổi tối phổ biến)</w:t>
+        <w:t>ClassSession</w:t>
+      </w:r>
+      <w:r>
+        <w:rPr>
+          <w:rFonts w:ascii="Times New Roman" w:hAnsi="Times New Roman" w:eastAsia="Times New Roman"/>
+          <w:b w:val="0"/>
+          <w:i w:val="0"/>
+          <w:sz w:val="26"/>
+        </w:rPr>
+        <w:t xml:space="preserve"> với quy tắc lặp chuẩn RFC 5545 (khung thứ 2-7 17:00-21:00 buổi tối phổ biến)</w:t>
       </w:r>
     </w:p>
     <w:p>
@@ -7421,7 +7542,7 @@
           <w:i w:val="0"/>
           <w:sz w:val="26"/>
         </w:rPr>
-        <w:t xml:space="preserve"> GVCN điểm danh từng </w:t>
+        <w:t xml:space="preserve"> GVCN điểm danh từng buổi học, trạng thái gồm 5 loại — Có mặt / Vắng / Đi muộn / Có phép / Học bù (</w:t>
       </w:r>
       <w:r>
         <w:rPr>
@@ -7430,16 +7551,88 @@
           <w:i/>
           <w:sz w:val="26"/>
         </w:rPr>
-        <w:t>attendance_period</w:t>
-      </w:r>
-      <w:r>
-        <w:rPr>
-          <w:rFonts w:ascii="Times New Roman" w:hAnsi="Times New Roman" w:eastAsia="Times New Roman"/>
-          <w:b w:val="0"/>
-          <w:i w:val="0"/>
-          <w:sz w:val="26"/>
-        </w:rPr>
-        <w:t xml:space="preserve"> (mỗi buổi học), trạng thái Có/Vắng/Nghỉ phép</w:t>
+        <w:t>PRESENT</w:t>
+      </w:r>
+      <w:r>
+        <w:rPr>
+          <w:rFonts w:ascii="Times New Roman" w:hAnsi="Times New Roman" w:eastAsia="Times New Roman"/>
+          <w:b w:val="0"/>
+          <w:i w:val="0"/>
+          <w:sz w:val="26"/>
+        </w:rPr>
+        <w:t xml:space="preserve"> / </w:t>
+      </w:r>
+      <w:r>
+        <w:rPr>
+          <w:rFonts w:ascii="Times New Roman" w:hAnsi="Times New Roman" w:eastAsia="Times New Roman"/>
+          <w:b w:val="0"/>
+          <w:i/>
+          <w:sz w:val="26"/>
+        </w:rPr>
+        <w:t>ABSENT</w:t>
+      </w:r>
+      <w:r>
+        <w:rPr>
+          <w:rFonts w:ascii="Times New Roman" w:hAnsi="Times New Roman" w:eastAsia="Times New Roman"/>
+          <w:b w:val="0"/>
+          <w:i w:val="0"/>
+          <w:sz w:val="26"/>
+        </w:rPr>
+        <w:t xml:space="preserve"> / </w:t>
+      </w:r>
+      <w:r>
+        <w:rPr>
+          <w:rFonts w:ascii="Times New Roman" w:hAnsi="Times New Roman" w:eastAsia="Times New Roman"/>
+          <w:b w:val="0"/>
+          <w:i/>
+          <w:sz w:val="26"/>
+        </w:rPr>
+        <w:t>LATE</w:t>
+      </w:r>
+      <w:r>
+        <w:rPr>
+          <w:rFonts w:ascii="Times New Roman" w:hAnsi="Times New Roman" w:eastAsia="Times New Roman"/>
+          <w:b w:val="0"/>
+          <w:i w:val="0"/>
+          <w:sz w:val="26"/>
+        </w:rPr>
+        <w:t xml:space="preserve"> / </w:t>
+      </w:r>
+      <w:r>
+        <w:rPr>
+          <w:rFonts w:ascii="Times New Roman" w:hAnsi="Times New Roman" w:eastAsia="Times New Roman"/>
+          <w:b w:val="0"/>
+          <w:i/>
+          <w:sz w:val="26"/>
+        </w:rPr>
+        <w:t>EXCUSED</w:t>
+      </w:r>
+      <w:r>
+        <w:rPr>
+          <w:rFonts w:ascii="Times New Roman" w:hAnsi="Times New Roman" w:eastAsia="Times New Roman"/>
+          <w:b w:val="0"/>
+          <w:i w:val="0"/>
+          <w:sz w:val="26"/>
+        </w:rPr>
+        <w:t xml:space="preserve"> / </w:t>
+      </w:r>
+      <w:r>
+        <w:rPr>
+          <w:rFonts w:ascii="Times New Roman" w:hAnsi="Times New Roman" w:eastAsia="Times New Roman"/>
+          <w:b w:val="0"/>
+          <w:i/>
+          <w:sz w:val="26"/>
+        </w:rPr>
+        <w:t>MAKEUP</w:t>
+      </w:r>
+      <w:r>
+        <w:rPr>
+          <w:rFonts w:ascii="Times New Roman" w:hAnsi="Times New Roman" w:eastAsia="Times New Roman"/>
+          <w:b w:val="0"/>
+          <w:i w:val="0"/>
+          <w:sz w:val="26"/>
+        </w:rPr>
+        <w:t>)</w:t>
       </w:r>
     </w:p>
     <w:p>
@@ -7518,7 +7711,7 @@
           <w:i w:val="0"/>
           <w:sz w:val="26"/>
         </w:rPr>
-        <w:t xml:space="preserve">, xuất bảng điểm theo </w:t>
+        <w:t xml:space="preserve"> theo thang 0-100 kèm xếp loại chữ (A+/A/B+/...) và quy đổi điểm trung bình hệ 4.0 (</w:t>
       </w:r>
       <w:r>
         <w:rPr>
@@ -7536,7 +7729,25 @@
           <w:i w:val="0"/>
           <w:sz w:val="26"/>
         </w:rPr>
-        <w:t xml:space="preserve"> (thang 10); báo cáo cuối kỳ HK1/HK2/HK_Hè</w:t>
+        <w:t>); xuất học bạ theo học kỳ. Báo cáo tổng hợp cuối kỳ thuộc lộ trình phát triển sau (</w:t>
+      </w:r>
+      <w:r>
+        <w:rPr>
+          <w:rFonts w:ascii="Times New Roman" w:hAnsi="Times New Roman" w:eastAsia="Times New Roman"/>
+          <w:b w:val="0"/>
+          <w:i/>
+          <w:sz w:val="26"/>
+        </w:rPr>
+        <w:t>ReportCardService</w:t>
+      </w:r>
+      <w:r>
+        <w:rPr>
+          <w:rFonts w:ascii="Times New Roman" w:hAnsi="Times New Roman" w:eastAsia="Times New Roman"/>
+          <w:b w:val="0"/>
+          <w:i w:val="0"/>
+          <w:sz w:val="26"/>
+        </w:rPr>
+        <w:t xml:space="preserve"> đã có, expose API là bước kế tiếp)</w:t>
       </w:r>
     </w:p>
     <w:p>
@@ -7656,7 +7867,7 @@
           <w:i w:val="0"/>
           <w:sz w:val="26"/>
         </w:rPr>
-        <w:t>Tuân thủ &amp; nhật ký kiểm toán (cross-service)</w:t>
+        <w:t>Khóa học &amp; học liệu trực tuyến (KiteClass `kiteclass-core`)</w:t>
       </w:r>
     </w:p>
     <w:p>
@@ -7668,11 +7879,20 @@
       <w:r>
         <w:rPr>
           <w:rFonts w:ascii="Times New Roman" w:hAnsi="Times New Roman" w:eastAsia="Times New Roman"/>
-          <w:b w:val="0"/>
-          <w:i w:val="0"/>
-          <w:sz w:val="26"/>
-        </w:rPr>
-        <w:t xml:space="preserve">Bảng </w:t>
+          <w:b/>
+          <w:i w:val="0"/>
+          <w:sz w:val="26"/>
+        </w:rPr>
+        <w:t>Khóa học (Course):</w:t>
+      </w:r>
+      <w:r>
+        <w:rPr>
+          <w:rFonts w:ascii="Times New Roman" w:hAnsi="Times New Roman" w:eastAsia="Times New Roman"/>
+          <w:b w:val="0"/>
+          <w:i w:val="0"/>
+          <w:sz w:val="26"/>
+        </w:rPr>
+        <w:t xml:space="preserve"> Tầng quản lý phía trên Lớp học — một khóa học (ví dụ </w:t>
       </w:r>
       <w:r>
         <w:rPr>
@@ -7681,16 +7901,16 @@
           <w:i/>
           <w:sz w:val="26"/>
         </w:rPr>
-        <w:t>admin_audit_log</w:t>
-      </w:r>
-      <w:r>
-        <w:rPr>
-          <w:rFonts w:ascii="Times New Roman" w:hAnsi="Times New Roman" w:eastAsia="Times New Roman"/>
-          <w:b w:val="0"/>
-          <w:i w:val="0"/>
-          <w:sz w:val="26"/>
-        </w:rPr>
-        <w:t xml:space="preserve"> bất biến ghi mọi hành động của quản trị nền tảng thì đáp ứng yêu cầu tamper-proof retention của PDPL Điều 11</w:t>
+        <w:t>Khóa Anh ngữ giao tiếp</w:t>
+      </w:r>
+      <w:r>
+        <w:rPr>
+          <w:rFonts w:ascii="Times New Roman" w:hAnsi="Times New Roman" w:eastAsia="Times New Roman"/>
+          <w:b w:val="0"/>
+          <w:i w:val="0"/>
+          <w:sz w:val="26"/>
+        </w:rPr>
+        <w:t>) gồm nhiều lớp triển khai; quản lý chương trình + học phí + lộ trình theo khóa</w:t>
       </w:r>
     </w:p>
     <w:p>
@@ -7702,11 +7922,20 @@
       <w:r>
         <w:rPr>
           <w:rFonts w:ascii="Times New Roman" w:hAnsi="Times New Roman" w:eastAsia="Times New Roman"/>
-          <w:b w:val="0"/>
-          <w:i w:val="0"/>
-          <w:sz w:val="26"/>
-        </w:rPr>
-        <w:t xml:space="preserve">Bảng </w:t>
+          <w:b/>
+          <w:i w:val="0"/>
+          <w:sz w:val="26"/>
+        </w:rPr>
+        <w:t>Hệ thống học liệu (LMS):</w:t>
+      </w:r>
+      <w:r>
+        <w:rPr>
+          <w:rFonts w:ascii="Times New Roman" w:hAnsi="Times New Roman" w:eastAsia="Times New Roman"/>
+          <w:b w:val="0"/>
+          <w:i w:val="0"/>
+          <w:sz w:val="26"/>
+        </w:rPr>
+        <w:t xml:space="preserve"> Tổ chức học liệu theo </w:t>
       </w:r>
       <w:r>
         <w:rPr>
@@ -7715,16 +7944,61 @@
           <w:i/>
           <w:sz w:val="26"/>
         </w:rPr>
-        <w:t>consent_record</w:t>
-      </w:r>
-      <w:r>
-        <w:rPr>
-          <w:rFonts w:ascii="Times New Roman" w:hAnsi="Times New Roman" w:eastAsia="Times New Roman"/>
-          <w:b w:val="0"/>
-          <w:i w:val="0"/>
-          <w:sz w:val="26"/>
-        </w:rPr>
-        <w:t xml:space="preserve"> lưu sự đồng ý PDPL của tenant + phụ huynh</w:t>
+        <w:t>CourseModule</w:t>
+      </w:r>
+      <w:r>
+        <w:rPr>
+          <w:rFonts w:ascii="Times New Roman" w:hAnsi="Times New Roman" w:eastAsia="Times New Roman"/>
+          <w:b w:val="0"/>
+          <w:i w:val="0"/>
+          <w:sz w:val="26"/>
+        </w:rPr>
+        <w:t xml:space="preserve"> → </w:t>
+      </w:r>
+      <w:r>
+        <w:rPr>
+          <w:rFonts w:ascii="Times New Roman" w:hAnsi="Times New Roman" w:eastAsia="Times New Roman"/>
+          <w:b w:val="0"/>
+          <w:i/>
+          <w:sz w:val="26"/>
+        </w:rPr>
+        <w:t>Lesson</w:t>
+      </w:r>
+      <w:r>
+        <w:rPr>
+          <w:rFonts w:ascii="Times New Roman" w:hAnsi="Times New Roman" w:eastAsia="Times New Roman"/>
+          <w:b w:val="0"/>
+          <w:i w:val="0"/>
+          <w:sz w:val="26"/>
+        </w:rPr>
+        <w:t xml:space="preserve"> → </w:t>
+      </w:r>
+      <w:r>
+        <w:rPr>
+          <w:rFonts w:ascii="Times New Roman" w:hAnsi="Times New Roman" w:eastAsia="Times New Roman"/>
+          <w:b w:val="0"/>
+          <w:i/>
+          <w:sz w:val="26"/>
+        </w:rPr>
+        <w:t>LearningResource</w:t>
+      </w:r>
+      <w:r>
+        <w:rPr>
+          <w:rFonts w:ascii="Times New Roman" w:hAnsi="Times New Roman" w:eastAsia="Times New Roman"/>
+          <w:b w:val="0"/>
+          <w:i w:val="0"/>
+          <w:sz w:val="26"/>
+        </w:rPr>
+        <w:t xml:space="preserve">; theo dõi tiến độ học của từng học sinh qua </w:t>
+      </w:r>
+      <w:r>
+        <w:rPr>
+          <w:rFonts w:ascii="Times New Roman" w:hAnsi="Times New Roman" w:eastAsia="Times New Roman"/>
+          <w:b w:val="0"/>
+          <w:i/>
+          <w:sz w:val="26"/>
+        </w:rPr>
+        <w:t>LessonProgress</w:t>
       </w:r>
     </w:p>
     <w:p>
@@ -7736,11 +8010,20 @@
       <w:r>
         <w:rPr>
           <w:rFonts w:ascii="Times New Roman" w:hAnsi="Times New Roman" w:eastAsia="Times New Roman"/>
-          <w:b w:val="0"/>
-          <w:i w:val="0"/>
-          <w:sz w:val="26"/>
-        </w:rPr>
-        <w:t xml:space="preserve">Bảng </w:t>
+          <w:b/>
+          <w:i w:val="0"/>
+          <w:sz w:val="26"/>
+        </w:rPr>
+        <w:t>Bài tập &amp; nộp bài (Assignment):</w:t>
+      </w:r>
+      <w:r>
+        <w:rPr>
+          <w:rFonts w:ascii="Times New Roman" w:hAnsi="Times New Roman" w:eastAsia="Times New Roman"/>
+          <w:b w:val="0"/>
+          <w:i w:val="0"/>
+          <w:sz w:val="26"/>
+        </w:rPr>
+        <w:t xml:space="preserve"> Vòng đời giao bài → học sinh nộp bài → giáo viên chấm → trả kết quả (</w:t>
       </w:r>
       <w:r>
         <w:rPr>
@@ -7749,16 +8032,50 @@
           <w:i/>
           <w:sz w:val="26"/>
         </w:rPr>
-        <w:t>dsar_ticket</w:t>
-      </w:r>
-      <w:r>
-        <w:rPr>
-          <w:rFonts w:ascii="Times New Roman" w:hAnsi="Times New Roman" w:eastAsia="Times New Roman"/>
-          <w:b w:val="0"/>
-          <w:i w:val="0"/>
-          <w:sz w:val="26"/>
-        </w:rPr>
-        <w:t xml:space="preserve"> cho yêu cầu truy cập dữ liệu cá nhân (Data Subject Access Request)</w:t>
+        <w:t>Assignment</w:t>
+      </w:r>
+      <w:r>
+        <w:rPr>
+          <w:rFonts w:ascii="Times New Roman" w:hAnsi="Times New Roman" w:eastAsia="Times New Roman"/>
+          <w:b w:val="0"/>
+          <w:i w:val="0"/>
+          <w:sz w:val="26"/>
+        </w:rPr>
+        <w:t xml:space="preserve"> / </w:t>
+      </w:r>
+      <w:r>
+        <w:rPr>
+          <w:rFonts w:ascii="Times New Roman" w:hAnsi="Times New Roman" w:eastAsia="Times New Roman"/>
+          <w:b w:val="0"/>
+          <w:i/>
+          <w:sz w:val="26"/>
+        </w:rPr>
+        <w:t>Submission</w:t>
+      </w:r>
+      <w:r>
+        <w:rPr>
+          <w:rFonts w:ascii="Times New Roman" w:hAnsi="Times New Roman" w:eastAsia="Times New Roman"/>
+          <w:b w:val="0"/>
+          <w:i w:val="0"/>
+          <w:sz w:val="26"/>
+        </w:rPr>
+        <w:t>)</w:t>
+      </w:r>
+    </w:p>
+    <w:p>
+      <w:pPr>
+        <w:spacing w:line="288" w:lineRule="auto"/>
+        <w:ind w:firstLine="567"/>
+        <w:jc w:val="both"/>
+      </w:pPr>
+      <w:r>
+        <w:rPr>
+          <w:rFonts w:ascii="Times New Roman" w:hAnsi="Times New Roman" w:eastAsia="Times New Roman"/>
+          <w:b/>
+          <w:i w:val="0"/>
+          <w:sz w:val="26"/>
+        </w:rPr>
+        <w:t>Cổng phụ huynh (KiteClass `kiteclass-core`)</w:t>
       </w:r>
     </w:p>
     <w:p>
@@ -7770,11 +8087,20 @@
       <w:r>
         <w:rPr>
           <w:rFonts w:ascii="Times New Roman" w:hAnsi="Times New Roman" w:eastAsia="Times New Roman"/>
-          <w:b w:val="0"/>
-          <w:i w:val="0"/>
-          <w:sz w:val="26"/>
-        </w:rPr>
-        <w:t xml:space="preserve">Bảng </w:t>
+          <w:b/>
+          <w:i w:val="0"/>
+          <w:sz w:val="26"/>
+        </w:rPr>
+        <w:t>Mời &amp; xác thực:</w:t>
+      </w:r>
+      <w:r>
+        <w:rPr>
+          <w:rFonts w:ascii="Times New Roman" w:hAnsi="Times New Roman" w:eastAsia="Times New Roman"/>
+          <w:b w:val="0"/>
+          <w:i w:val="0"/>
+          <w:sz w:val="26"/>
+        </w:rPr>
+        <w:t xml:space="preserve"> Giáo viên/trung tâm mời phụ huynh qua liên kết (</w:t>
       </w:r>
       <w:r>
         <w:rPr>
@@ -7783,16 +8109,66 @@
           <w:i/>
           <w:sz w:val="26"/>
         </w:rPr>
-        <w:t>child_protection_audit_log</w:t>
-      </w:r>
-      <w:r>
-        <w:rPr>
-          <w:rFonts w:ascii="Times New Roman" w:hAnsi="Times New Roman" w:eastAsia="Times New Roman"/>
-          <w:b w:val="0"/>
-          <w:i w:val="0"/>
-          <w:sz w:val="26"/>
-        </w:rPr>
-        <w:t xml:space="preserve"> (KiteClass) cho phạm vi K-12 — mọi truy cập vào hồ sơ học sinh (đặc biệt trẻ vị thành niên) được log riêng phục vụ audit của Bộ Giáo dục</w:t>
+        <w:t>ParentInvitation</w:t>
+      </w:r>
+      <w:r>
+        <w:rPr>
+          <w:rFonts w:ascii="Times New Roman" w:hAnsi="Times New Roman" w:eastAsia="Times New Roman"/>
+          <w:b w:val="0"/>
+          <w:i w:val="0"/>
+          <w:sz w:val="26"/>
+        </w:rPr>
+        <w:t>); phụ huynh kích hoạt tài khoản truy cập riêng</w:t>
+      </w:r>
+    </w:p>
+    <w:p>
+      <w:pPr>
+        <w:pStyle w:val="ListBullet"/>
+        <w:spacing w:line="288" w:lineRule="auto"/>
+        <w:ind w:left="850" w:hanging="283"/>
+      </w:pPr>
+      <w:r>
+        <w:rPr>
+          <w:rFonts w:ascii="Times New Roman" w:hAnsi="Times New Roman" w:eastAsia="Times New Roman"/>
+          <w:b/>
+          <w:i w:val="0"/>
+          <w:sz w:val="26"/>
+        </w:rPr>
+        <w:t>Năm nhóm thông tin con em:</w:t>
+      </w:r>
+      <w:r>
+        <w:rPr>
+          <w:rFonts w:ascii="Times New Roman" w:hAnsi="Times New Roman" w:eastAsia="Times New Roman"/>
+          <w:b w:val="0"/>
+          <w:i w:val="0"/>
+          <w:sz w:val="26"/>
+        </w:rPr>
+        <w:t xml:space="preserve"> điểm số, điểm danh, học phí, hạnh kiểm, học bạ (transcript + điểm trung bình hệ 4.0)</w:t>
+      </w:r>
+    </w:p>
+    <w:p>
+      <w:pPr>
+        <w:pStyle w:val="ListBullet"/>
+        <w:spacing w:line="288" w:lineRule="auto"/>
+        <w:ind w:left="850" w:hanging="283"/>
+      </w:pPr>
+      <w:r>
+        <w:rPr>
+          <w:rFonts w:ascii="Times New Roman" w:hAnsi="Times New Roman" w:eastAsia="Times New Roman"/>
+          <w:b/>
+          <w:i w:val="0"/>
+          <w:sz w:val="26"/>
+        </w:rPr>
+        <w:t>Khiếu nại &amp; nhật ký truy cập:</w:t>
+      </w:r>
+      <w:r>
+        <w:rPr>
+          <w:rFonts w:ascii="Times New Roman" w:hAnsi="Times New Roman" w:eastAsia="Times New Roman"/>
+          <w:b w:val="0"/>
+          <w:i w:val="0"/>
+          <w:sz w:val="26"/>
+        </w:rPr>
+        <w:t xml:space="preserve"> phụ huynh gửi phản ánh; mọi truy cập hồ sơ con em được ghi nhật ký (read-audit) phục vụ tuân thủ bảo vệ trẻ em</w:t>
       </w:r>
     </w:p>
     <w:p>
@@ -7808,7 +8184,7 @@
           <w:i w:val="0"/>
           <w:sz w:val="26"/>
         </w:rPr>
-        <w:t>Quản trị nền tảng &amp; hỗ trợ (KiteHub `kitehub-admin`)</w:t>
+        <w:t>Tài chính nâng cao (KiteClass `kiteclass-core`)</w:t>
       </w:r>
     </w:p>
     <w:p>
@@ -7820,11 +8196,20 @@
       <w:r>
         <w:rPr>
           <w:rFonts w:ascii="Times New Roman" w:hAnsi="Times New Roman" w:eastAsia="Times New Roman"/>
-          <w:b w:val="0"/>
-          <w:i w:val="0"/>
-          <w:sz w:val="26"/>
-        </w:rPr>
-        <w:t>Quản lý instance: danh sách tenant, xem chỉ số sức khỏe theo tenant, suspend/resume tenant</w:t>
+          <w:b/>
+          <w:i w:val="0"/>
+          <w:sz w:val="26"/>
+        </w:rPr>
+        <w:t>Trả góp học phí (`InstallmentPlan`):</w:t>
+      </w:r>
+      <w:r>
+        <w:rPr>
+          <w:rFonts w:ascii="Times New Roman" w:hAnsi="Times New Roman" w:eastAsia="Times New Roman"/>
+          <w:b w:val="0"/>
+          <w:i w:val="0"/>
+          <w:sz w:val="26"/>
+        </w:rPr>
+        <w:t xml:space="preserve"> chia học phí thành nhiều đợt thanh toán theo lịch</w:t>
       </w:r>
     </w:p>
     <w:p>
@@ -7836,11 +8221,77 @@
       <w:r>
         <w:rPr>
           <w:rFonts w:ascii="Times New Roman" w:hAnsi="Times New Roman" w:eastAsia="Times New Roman"/>
-          <w:b w:val="0"/>
-          <w:i w:val="0"/>
-          <w:sz w:val="26"/>
-        </w:rPr>
-        <w:t xml:space="preserve">Quy trình impersonation </w:t>
+          <w:b/>
+          <w:i w:val="0"/>
+          <w:sz w:val="26"/>
+        </w:rPr>
+        <w:t>Hoàn tiền (`RefundRequest`):</w:t>
+      </w:r>
+      <w:r>
+        <w:rPr>
+          <w:rFonts w:ascii="Times New Roman" w:hAnsi="Times New Roman" w:eastAsia="Times New Roman"/>
+          <w:b w:val="0"/>
+          <w:i w:val="0"/>
+          <w:sz w:val="26"/>
+        </w:rPr>
+        <w:t xml:space="preserve"> quy trình yêu cầu → duyệt → ghi nhận hoàn tiền</w:t>
+      </w:r>
+    </w:p>
+    <w:p>
+      <w:pPr>
+        <w:pStyle w:val="ListBullet"/>
+        <w:spacing w:line="288" w:lineRule="auto"/>
+        <w:ind w:left="850" w:hanging="283"/>
+      </w:pPr>
+      <w:r>
+        <w:rPr>
+          <w:rFonts w:ascii="Times New Roman" w:hAnsi="Times New Roman" w:eastAsia="Times New Roman"/>
+          <w:b/>
+          <w:i w:val="0"/>
+          <w:sz w:val="26"/>
+        </w:rPr>
+        <w:t>Lương giáo viên (`Payroll`):</w:t>
+      </w:r>
+      <w:r>
+        <w:rPr>
+          <w:rFonts w:ascii="Times New Roman" w:hAnsi="Times New Roman" w:eastAsia="Times New Roman"/>
+          <w:b w:val="0"/>
+          <w:i w:val="0"/>
+          <w:sz w:val="26"/>
+        </w:rPr>
+        <w:t xml:space="preserve"> tính lương theo buổi dạy/số lớp phụ trách</w:t>
+      </w:r>
+    </w:p>
+    <w:p>
+      <w:pPr>
+        <w:spacing w:line="288" w:lineRule="auto"/>
+        <w:ind w:firstLine="567"/>
+        <w:jc w:val="both"/>
+      </w:pPr>
+      <w:r>
+        <w:rPr>
+          <w:rFonts w:ascii="Times New Roman" w:hAnsi="Times New Roman" w:eastAsia="Times New Roman"/>
+          <w:b/>
+          <w:i w:val="0"/>
+          <w:sz w:val="26"/>
+        </w:rPr>
+        <w:t>Tuân thủ &amp; nhật ký kiểm toán (cross-service)</w:t>
+      </w:r>
+    </w:p>
+    <w:p>
+      <w:pPr>
+        <w:pStyle w:val="ListBullet"/>
+        <w:spacing w:line="288" w:lineRule="auto"/>
+        <w:ind w:left="850" w:hanging="283"/>
+      </w:pPr>
+      <w:r>
+        <w:rPr>
+          <w:rFonts w:ascii="Times New Roman" w:hAnsi="Times New Roman" w:eastAsia="Times New Roman"/>
+          <w:b w:val="0"/>
+          <w:i w:val="0"/>
+          <w:sz w:val="26"/>
+        </w:rPr>
+        <w:t xml:space="preserve">Bảng </w:t>
       </w:r>
       <w:r>
         <w:rPr>
@@ -7849,16 +8300,32 @@
           <w:i/>
           <w:sz w:val="26"/>
         </w:rPr>
-        <w:t>/api/impersonate/start</w:t>
-      </w:r>
-      <w:r>
-        <w:rPr>
-          <w:rFonts w:ascii="Times New Roman" w:hAnsi="Times New Roman" w:eastAsia="Times New Roman"/>
-          <w:b w:val="0"/>
-          <w:i w:val="0"/>
-          <w:sz w:val="26"/>
-        </w:rPr>
-        <w:t xml:space="preserve"> — quản trị đăng nhập with tư cách tenant để hỗ trợ (được log trong </w:t>
+        <w:t>admin_audit_log</w:t>
+      </w:r>
+      <w:r>
+        <w:rPr>
+          <w:rFonts w:ascii="Times New Roman" w:hAnsi="Times New Roman" w:eastAsia="Times New Roman"/>
+          <w:b w:val="0"/>
+          <w:i w:val="0"/>
+          <w:sz w:val="26"/>
+        </w:rPr>
+        <w:t xml:space="preserve"> bất biến ghi mọi hành động của quản trị nền tảng thì đáp ứng yêu cầu tamper-proof retention của PDPL Điều 11</w:t>
+      </w:r>
+    </w:p>
+    <w:p>
+      <w:pPr>
+        <w:pStyle w:val="ListBullet"/>
+        <w:spacing w:line="288" w:lineRule="auto"/>
+        <w:ind w:left="850" w:hanging="283"/>
+      </w:pPr>
+      <w:r>
+        <w:rPr>
+          <w:rFonts w:ascii="Times New Roman" w:hAnsi="Times New Roman" w:eastAsia="Times New Roman"/>
+          <w:b w:val="0"/>
+          <w:i w:val="0"/>
+          <w:sz w:val="26"/>
+        </w:rPr>
+        <w:t xml:space="preserve">Bảng </w:t>
       </w:r>
       <w:r>
         <w:rPr>
@@ -7867,6 +8334,140 @@
           <w:i/>
           <w:sz w:val="26"/>
         </w:rPr>
+        <w:t>consent_record</w:t>
+      </w:r>
+      <w:r>
+        <w:rPr>
+          <w:rFonts w:ascii="Times New Roman" w:hAnsi="Times New Roman" w:eastAsia="Times New Roman"/>
+          <w:b w:val="0"/>
+          <w:i w:val="0"/>
+          <w:sz w:val="26"/>
+        </w:rPr>
+        <w:t xml:space="preserve"> lưu sự đồng ý PDPL của tenant + phụ huynh</w:t>
+      </w:r>
+    </w:p>
+    <w:p>
+      <w:pPr>
+        <w:pStyle w:val="ListBullet"/>
+        <w:spacing w:line="288" w:lineRule="auto"/>
+        <w:ind w:left="850" w:hanging="283"/>
+      </w:pPr>
+      <w:r>
+        <w:rPr>
+          <w:rFonts w:ascii="Times New Roman" w:hAnsi="Times New Roman" w:eastAsia="Times New Roman"/>
+          <w:b w:val="0"/>
+          <w:i w:val="0"/>
+          <w:sz w:val="26"/>
+        </w:rPr>
+        <w:t xml:space="preserve">Bảng </w:t>
+      </w:r>
+      <w:r>
+        <w:rPr>
+          <w:rFonts w:ascii="Times New Roman" w:hAnsi="Times New Roman" w:eastAsia="Times New Roman"/>
+          <w:b w:val="0"/>
+          <w:i/>
+          <w:sz w:val="26"/>
+        </w:rPr>
+        <w:t>dsar_ticket</w:t>
+      </w:r>
+      <w:r>
+        <w:rPr>
+          <w:rFonts w:ascii="Times New Roman" w:hAnsi="Times New Roman" w:eastAsia="Times New Roman"/>
+          <w:b w:val="0"/>
+          <w:i w:val="0"/>
+          <w:sz w:val="26"/>
+        </w:rPr>
+        <w:t xml:space="preserve"> cho yêu cầu truy cập dữ liệu cá nhân (Data Subject Access Request)</w:t>
+      </w:r>
+    </w:p>
+    <w:p>
+      <w:pPr>
+        <w:pStyle w:val="ListBullet"/>
+        <w:spacing w:line="288" w:lineRule="auto"/>
+        <w:ind w:left="850" w:hanging="283"/>
+      </w:pPr>
+      <w:r>
+        <w:rPr>
+          <w:rFonts w:ascii="Times New Roman" w:hAnsi="Times New Roman" w:eastAsia="Times New Roman"/>
+          <w:b w:val="0"/>
+          <w:i w:val="0"/>
+          <w:sz w:val="26"/>
+        </w:rPr>
+        <w:t xml:space="preserve">Bảng </w:t>
+      </w:r>
+      <w:r>
+        <w:rPr>
+          <w:rFonts w:ascii="Times New Roman" w:hAnsi="Times New Roman" w:eastAsia="Times New Roman"/>
+          <w:b w:val="0"/>
+          <w:i/>
+          <w:sz w:val="26"/>
+        </w:rPr>
+        <w:t>child_protection_audit_log</w:t>
+      </w:r>
+      <w:r>
+        <w:rPr>
+          <w:rFonts w:ascii="Times New Roman" w:hAnsi="Times New Roman" w:eastAsia="Times New Roman"/>
+          <w:b w:val="0"/>
+          <w:i w:val="0"/>
+          <w:sz w:val="26"/>
+        </w:rPr>
+        <w:t xml:space="preserve"> (KiteClass) cho phạm vi K-12 — mọi truy cập vào hồ sơ học sinh (đặc biệt trẻ vị thành niên) được log riêng phục vụ audit của Bộ Giáo dục</w:t>
+      </w:r>
+    </w:p>
+    <w:p>
+      <w:pPr>
+        <w:spacing w:line="288" w:lineRule="auto"/>
+        <w:ind w:firstLine="567"/>
+        <w:jc w:val="both"/>
+      </w:pPr>
+      <w:r>
+        <w:rPr>
+          <w:rFonts w:ascii="Times New Roman" w:hAnsi="Times New Roman" w:eastAsia="Times New Roman"/>
+          <w:b/>
+          <w:i w:val="0"/>
+          <w:sz w:val="26"/>
+        </w:rPr>
+        <w:t>Quản trị nền tảng &amp; hỗ trợ (KiteHub `kitehub-admin`)</w:t>
+      </w:r>
+    </w:p>
+    <w:p>
+      <w:pPr>
+        <w:pStyle w:val="ListBullet"/>
+        <w:spacing w:line="288" w:lineRule="auto"/>
+        <w:ind w:left="850" w:hanging="283"/>
+      </w:pPr>
+      <w:r>
+        <w:rPr>
+          <w:rFonts w:ascii="Times New Roman" w:hAnsi="Times New Roman" w:eastAsia="Times New Roman"/>
+          <w:b w:val="0"/>
+          <w:i w:val="0"/>
+          <w:sz w:val="26"/>
+        </w:rPr>
+        <w:t>Quản lý instance: danh sách tenant, xem chỉ số sức khỏe theo tenant, suspend/resume tenant</w:t>
+      </w:r>
+    </w:p>
+    <w:p>
+      <w:pPr>
+        <w:pStyle w:val="ListBullet"/>
+        <w:spacing w:line="288" w:lineRule="auto"/>
+        <w:ind w:left="850" w:hanging="283"/>
+      </w:pPr>
+      <w:r>
+        <w:rPr>
+          <w:rFonts w:ascii="Times New Roman" w:hAnsi="Times New Roman" w:eastAsia="Times New Roman"/>
+          <w:b w:val="0"/>
+          <w:i w:val="0"/>
+          <w:sz w:val="26"/>
+        </w:rPr>
+        <w:t xml:space="preserve">Quy trình impersonation — quản trị đăng nhập với tư cách tenant để hỗ trợ (được log trong </w:t>
+      </w:r>
+      <w:r>
+        <w:rPr>
+          <w:rFonts w:ascii="Times New Roman" w:hAnsi="Times New Roman" w:eastAsia="Times New Roman"/>
+          <w:b w:val="0"/>
+          <w:i/>
+          <w:sz w:val="26"/>
+        </w:rPr>
         <w:t>impersonation_audit_log</w:t>
       </w:r>
       <w:r>
@@ -7876,7 +8477,7 @@
           <w:i w:val="0"/>
           <w:sz w:val="26"/>
         </w:rPr>
-        <w:t>)</w:t>
+        <w:t>; chi tiết endpoint trình bày trong API contract Chương 3)</w:t>
       </w:r>
     </w:p>
     <w:p>
@@ -8791,7 +9392,7 @@
           <w:i w:val="0"/>
           <w:sz w:val="26"/>
         </w:rPr>
-        <w:t xml:space="preserve"> (tương đương khoảng 3,6 giờ downtime/tháng có thể chấp nhận), theo SLA mặc định của AWS cho instance EC2 và RDS đơn vùng [25]. Mục tiêu này được duy trì thông qua:</w:t>
+        <w:t xml:space="preserve"> (tương đương khoảng 3,6 giờ downtime/tháng có thể chấp nhận), theo SLA mặc định của AWS cho instance EC2 và RDS đơn vùng [41]. Mục tiêu này được duy trì thông qua:</w:t>
       </w:r>
     </w:p>
     <w:p>
@@ -9635,7 +10236,7 @@
                 <w:i w:val="0"/>
                 <w:sz w:val="24"/>
               </w:rPr>
-              <w:t>WebClient với allowlist URL tường minh (MiniMax + VietQR + Ollama cho môi trường phát triển)</w:t>
+              <w:t>WebClient với allowlist URL tường minh (OpenAI API + VietQR + Ollama cho môi trường phát triển)</w:t>
             </w:r>
           </w:p>
         </w:tc>
@@ -10162,7 +10763,7 @@
           <w:i w:val="0"/>
           <w:sz w:val="26"/>
         </w:rPr>
-        <w:t>AI: Ollama tự host cho môi trường phát triển; MiniMax vận hành ~$0.001/yêu cầu</w:t>
+        <w:t>AI: Ollama tự host cho môi trường phát triển; OpenAI GPT-4 Vision + DALL-E 3 cho môi trường vận hành (~$0.04/ảnh DALL-E 3 chất lượng tiêu chuẩn)</w:t>
       </w:r>
     </w:p>
     <w:p>
@@ -11581,7 +12182,7 @@
           <w:i w:val="0"/>
           <w:sz w:val="26"/>
         </w:rPr>
-        <w:t xml:space="preserve"> (8083) — sinh AI asset (logo, banner, hero), template, lưu trữ S3 qua MinIO; gọi Ollama (dev) hoặc MiniMax (vận hành)</w:t>
+        <w:t xml:space="preserve"> (8083) — sinh AI asset (logo, banner, hero), template, lưu trữ S3 qua MinIO; gọi Ollama (dev) hoặc OpenAI GPT-4 Vision + DALL-E 3 (vận hành)</w:t>
       </w:r>
     </w:p>
     <w:p>
@@ -17524,7 +18125,7 @@
                 <w:i w:val="0"/>
                 <w:sz w:val="24"/>
               </w:rPr>
-              <w:t xml:space="preserve">Tên hiển thị trung tâm (ví dụ </w:t>
+              <w:t xml:space="preserve">Tên hiển thị tenant (ví dụ </w:t>
             </w:r>
             <w:r>
               <w:rPr>
@@ -17533,7 +18134,7 @@
                 <w:i/>
                 <w:sz w:val="24"/>
               </w:rPr>
-              <w:t>Trung tâm Anh ngữ Sky Education</w:t>
+              <w:t>Lớp Pháp luật cô Đỗ Lan Khánh</w:t>
             </w:r>
             <w:r>
               <w:rPr>
@@ -22165,7 +22766,7 @@
                 <w:i w:val="0"/>
                 <w:sz w:val="24"/>
               </w:rPr>
-              <w:t>Sinh AI asset (logo/hero/banner) + upload S3 + tích hợp Ollama/MiniMax</w:t>
+              <w:t>Sinh AI asset (logo/hero/banner) + upload S3 + tích hợp Ollama/OpenAI</w:t>
             </w:r>
           </w:p>
         </w:tc>
@@ -24880,7 +25481,7 @@
           <w:i w:val="0"/>
           <w:sz w:val="26"/>
         </w:rPr>
-        <w:t>Luồng khám phá và kích hoạt tenant đưa người dùng tiềm năng từ điểm tiếp xúc đầu tiên đến trạng thái vận hành thông qua ba bước nối tiếp. Bước thứ nhất là trang chủ công khai của tenant — minh chứng tại Hình 3.1 là trang của trung tâm Sky Education (tên giả định) với bộ nhận diện thương hiệu riêng (tông màu cam chủ đạo, tên trung tâm và khẩu hiệu "Chuyên nghiệp &amp; Hiệu quả"). Trang được dựng theo cấu trúc nhiều khối: giới thiệu, tính năng nổi bật (Hệ thống LMS, Quản lý Học viên, Thanh toán &amp; Báo cáo), đội ngũ giáo viên, các chứng chỉ đào tạo (IELTS, TOEIC, Cambridge, VSTEP), bảng giá theo định dạng tiền tệ Việt Nam (</w:t>
+        <w:t>Luồng khám phá và kích hoạt tenant đưa người dùng tiềm năng từ điểm tiếp xúc đầu tiên đến trạng thái vận hành thông qua ba bước nối tiếp. Bước thứ nhất là trang chủ công khai của tenant — minh chứng tại Hình 3.1 là trang của cô Đỗ Lan Khánh (tên giả định), một giảng viên độc lập dạy thêm môn Pháp luật &amp; Đời sống bậc THPT, với bộ nhận diện thương hiệu riêng (tông màu xanh navy phối vàng gold chủ đạo, tên giảng viên và khẩu hiệu "Vững kiến thức - Vững tương lai"). Trang được dựng theo cấu trúc nhiều khối: giới thiệu, tính năng nổi bật (lộ trình học, quản lý học viên, học phí &amp; báo cáo), thông tin giảng viên, thành tích ôn luyện môn Giáo dục công dân và Pháp luật trong kỳ thi tốt nghiệp THPT, bảng học phí theo định dạng tiền tệ Việt Nam (</w:t>
       </w:r>
       <w:r>
         <w:rPr>
@@ -24907,7 +25508,7 @@
           <w:i/>
           <w:sz w:val="26"/>
         </w:rPr>
-        <w:t>2.800.000đ/tháng</w:t>
+        <w:t>2.800.000đ/khóa</w:t>
       </w:r>
       <w:r>
         <w:rPr>
@@ -24925,16 +25526,16 @@
           <w:i/>
           <w:sz w:val="26"/>
         </w:rPr>
-        <w:t>4.500.000đ/tháng</w:t>
-      </w:r>
-      <w:r>
-        <w:rPr>
-          <w:rFonts w:ascii="Times New Roman" w:hAnsi="Times New Roman" w:eastAsia="Times New Roman"/>
-          <w:b w:val="0"/>
-          <w:i w:val="0"/>
-          <w:sz w:val="26"/>
-        </w:rPr>
-        <w:t>) và mục câu hỏi thường gặp. Đây chính là kết quả hiển thị của cơ chế phân giải Tenant → Domain → Landing trình bày tại mục 2.2.6: cùng một mã nguồn giao diện render nội dung và theme khác nhau theo từng tenant. Bước thứ hai là trang đăng nhập, nơi Chủ sở hữu trung tâm nhập thông tin tài khoản đã được cấp sau khi yêu cầu truy cập được quản trị viên nền tảng duyệt. Bước thứ ba là dashboard tổng quan sau đăng nhập, hiển thị dòng tóm tắt "Trung tâm hiện có 78 học viên · 5 khóa học" cùng sáu thẻ chỉ số (Học viên, Khóa học, Giáo viên, Điểm danh hôm nay, Doanh thu tuần, Tỷ lệ giữ chân). Hiện tại, hai thẻ Học viên và Khóa học đã hiển thị số liệu thực (78 và 5), bốn thẻ còn lại tạm hiển thị dấu gạch ngang kèm ghi chú minh bạch "chưa có API tổng hợp; sẽ bổ sung khi endpoint thống kê dashboard sẵn sàng" — phản ánh trung thực mức độ hoàn thiện của tính năng thống kê ở thời điểm thực hiện đồ án.</w:t>
+        <w:t>4.500.000đ/khóa chuyên sâu</w:t>
+      </w:r>
+      <w:r>
+        <w:rPr>
+          <w:rFonts w:ascii="Times New Roman" w:hAnsi="Times New Roman" w:eastAsia="Times New Roman"/>
+          <w:b w:val="0"/>
+          <w:i w:val="0"/>
+          <w:sz w:val="26"/>
+        </w:rPr>
+        <w:t>) và mục câu hỏi thường gặp. Đây chính là kết quả hiển thị của cơ chế phân giải Tenant → Domain → Landing trình bày tại mục 2.2.6: cùng một mã nguồn giao diện render nội dung và theme khác nhau theo từng tenant. Bước thứ hai là trang đăng nhập, nơi giảng viên nhập thông tin tài khoản đã được cấp sau khi yêu cầu truy cập được quản trị viên nền tảng duyệt. Bước thứ ba là dashboard tổng quan sau đăng nhập, hiển thị dòng tóm tắt "Hiện có 30 học viên · 1 khóa học" cùng sáu thẻ chỉ số (Học viên, Khóa học, Lớp học, Điểm danh hôm nay, Doanh thu tuần, Tỷ lệ giữ chân). Hiện tại, hai thẻ Học viên và Khóa học đã hiển thị số liệu thực (30 và 1), bốn thẻ còn lại tạm hiển thị dấu gạch ngang kèm ghi chú minh bạch "chưa có API tổng hợp; sẽ bổ sung khi endpoint thống kê dashboard sẵn sàng" — phản ánh trung thực mức độ hoàn thiện của tính năng thống kê ở thời điểm thực hiện đồ án.</w:t>
       </w:r>
     </w:p>
     <w:p>
@@ -25102,7 +25703,7 @@
           <w:i w:val="0"/>
           <w:sz w:val="26"/>
         </w:rPr>
-        <w:t>Sau khi tenant được kích hoạt, Chủ sở hữu trung tâm và Quản lý sử dụng nhóm chức năng vận hành để tổ chức học viên, lớp học và khóa học. Hình 3.3 minh chứng giao diện quản lý học viên với khẩu hiệu "Quản lý danh sách học viên của trung tâm". Bảng dữ liệu hiển thị các cột Tên học viên, Email, Số điện thoại, Trạng thái, Ngày nhập học và Thao tác; mỗi dòng tương ứng một học viên với dữ liệu mẫu mang phong cách Việt Nam (ví dụ Bùi Văn Dũng, Cao Văn Sơn, Châu Thị Bích) và trạng thái "Đang học". Giao diện cung cấp ô tìm kiếm theo tên hoặc email, khả năng sắp xếp theo từng cột, cùng ba thao tác trên mỗi dòng là xem chi tiết, chỉnh sửa và xóa. Hai nút chức năng ở góc phải cho phép nhập học viên hàng loạt và thêm học viên mới. Hiện tại, trung tâm mẫu đã có 78 học viên được quản lý qua giao diện này, khớp với chỉ số trên dashboard tổng quan tại Hình 3.1. Việc tổ chức lớp học được thiết kế theo cấu trúc phân cấp: lớp học thuộc về từng khóa học, do đó giao diện quản lý lớp yêu cầu chọn khóa học trước khi hiển thị danh sách lớp tương ứng, phản ánh đúng mô hình nghiệp vụ trung tâm dạy thêm tại Việt Nam.</w:t>
+        <w:t>Sau khi tenant được kích hoạt, Chủ sở hữu trung tâm và Quản lý sử dụng nhóm chức năng vận hành để tổ chức học viên, lớp học và khóa học. Hình 3.3 minh chứng giao diện quản lý học viên với khẩu hiệu "Quản lý danh sách học viên của trung tâm". Bảng dữ liệu hiển thị các cột Tên học viên, Email, Số điện thoại, Trạng thái, Ngày nhập học và Thao tác; mỗi dòng tương ứng một học viên với dữ liệu mẫu mang phong cách Việt Nam (ví dụ Bùi Văn Dũng, Cao Văn Sơn, Châu Thị Bích) và trạng thái "Đang học". Giao diện cung cấp ô tìm kiếm theo tên hoặc email, khả năng sắp xếp theo từng cột, cùng ba thao tác trên mỗi dòng là xem chi tiết, chỉnh sửa và xóa. Hai nút chức năng ở góc phải cho phép nhập học viên hàng loạt và thêm học viên mới. Hiện tại, tenant mẫu của cô Đỗ Lan Khánh đã có 30 học viên được quản lý qua giao diện này, khớp với chỉ số trên dashboard tổng quan tại Hình 3.1. Việc tổ chức lớp học được thiết kế theo cấu trúc phân cấp: lớp học thuộc về từng khóa học, do đó giao diện quản lý lớp yêu cầu chọn khóa học trước khi hiển thị danh sách lớp tương ứng, phản ánh đúng mô hình nghiệp vụ dạy thêm tại Việt Nam.</w:t>
       </w:r>
     </w:p>
     <w:p>
@@ -25472,7 +26073,7 @@
           <w:i w:val="0"/>
           <w:sz w:val="26"/>
         </w:rPr>
-        <w:t>Hạn chế kiểm thử: một số lĩnh vực coverage hiện còn thiếu và cần ưu tiên trước lộ trình phát triển sau bao gồm kiểm thử tải (load test với JMeter mô phỏng 100 tenant concurrent + 10.000 student concurrent) chưa được vận hành định kỳ; kiểm thử bảo mật penetration test bên thứ ba chưa được tiến hành (mới có internal security audit); kiểm thử khả năng phục hồi sau thảm họa (DR drill — restore từ RDS snapshot tới fresh environment) chưa được vận hành định kỳ; coverage E2E test cho luồng AI Branding image generation pipeline thấp do dependency Stable Diffusion XL khó mock. Các hạn chế này được track riêng và schedule cho lộ trình phát triển sau hoặc lộ trình phát triển sau tùy mức ưu tiên.</w:t>
+        <w:t>Hạn chế kiểm thử: một số lĩnh vực coverage hiện còn thiếu và cần ưu tiên trước lộ trình phát triển sau bao gồm kiểm thử tải (load test với JMeter mô phỏng 100 tenant concurrent + 10.000 student concurrent) chưa được vận hành định kỳ; kiểm thử bảo mật penetration test bên thứ ba chưa được tiến hành (mới có internal security audit); kiểm thử khả năng phục hồi sau thảm họa (DR drill — restore từ RDS snapshot tới fresh environment) chưa được vận hành định kỳ; coverage kiểm thử đầu-cuối cho luồng sinh ảnh AI Branding thấp do phụ thuộc dịch vụ sinh ảnh bên ngoài (DALL-E 3) khó giả lập. Các hạn chế này được ghi nhận riêng và sắp xếp theo lộ trình phát triển sau tùy mức ưu tiên.</w:t>
       </w:r>
     </w:p>
     <w:p>
@@ -28303,7 +28904,7 @@
           <w:i w:val="0"/>
           <w:sz w:val="26"/>
         </w:rPr>
-        <w:t xml:space="preserve"> cho định tuyến trang chủ đa tenant; cơ chế phân giải Tenant → Domain → Landing (mục 2.2.6) hoạt động trên lớp gateway, được minh chứng qua trang chủ công khai của tenant mẫu Sky Education với giao diện thương hiệu riêng (mục 4.2); AWS SES đã được phê duyệt production mode; CI/CD pipeline OIDC + ECR + SSM hoạt động đầy đủ; cơ chế mời tenant thử nghiệm đã sẵn sàng nhận yêu cầu.</w:t>
+        <w:t xml:space="preserve"> cho định tuyến trang chủ đa tenant; cơ chế phân giải Tenant → Domain → Landing (mục 2.2.6) hoạt động trên lớp gateway, được minh chứng qua trang chủ công khai của tenant mẫu cô Đỗ Lan Khánh với giao diện thương hiệu riêng (mục 4.2); AWS SES đã được phê duyệt production mode; CI/CD pipeline OIDC + ECR + SSM hoạt động đầy đủ; cơ chế mời tenant thử nghiệm đã sẵn sàng nhận yêu cầu.</w:t>
       </w:r>
     </w:p>
     <w:p>
@@ -28333,7 +28934,581 @@
           <w:i w:val="0"/>
           <w:sz w:val="26"/>
         </w:rPr>
-        <w:t>[Phần này sẽ điền sau khi thu thập phản hồi từ các tenant thử nghiệm trong hiện tại (từ 2026-05-19 trở đi). Nội dung dự kiến:</w:t>
+        <w:t>Để đánh giá khả năng phục vụ thực tế của nền tảng trên các phân khúc người dùng khác nhau, đồ án triển khai vận hành thử với hai giảng viên độc lập đại diện cho hai gói dịch vụ: cô Nguyễn Thị Hà (gói Miễn phí) và thầy Nguyễn Đình Nhì (gói Trả phí). Hai trường hợp này cùng với tenant cô Đỗ Lan Khánh ở mục 4.1 minh chứng rằng cùng một nền tảng đa tenant phục vụ được cả người dùng quy mô nhỏ lẫn người dùng cần đầy đủ tính năng nâng cao.</w:t>
+      </w:r>
+    </w:p>
+    <w:p>
+      <w:pPr>
+        <w:pStyle w:val="Heading3"/>
+      </w:pPr>
+      <w:r>
+        <w:rPr>
+          <w:rFonts w:ascii="Times New Roman" w:hAnsi="Times New Roman" w:eastAsia="Times New Roman"/>
+          <w:b/>
+          <w:color w:val="000000"/>
+          <w:sz w:val="28"/>
+        </w:rPr>
+        <w:t>4.2.1 Giảng viên gói Miễn phí — cô Nguyễn Thị Hà</w:t>
+      </w:r>
+    </w:p>
+    <w:p>
+      <w:pPr>
+        <w:spacing w:line="288" w:lineRule="auto"/>
+        <w:ind w:firstLine="567"/>
+        <w:jc w:val="both"/>
+      </w:pPr>
+      <w:r>
+        <w:rPr>
+          <w:rFonts w:ascii="Times New Roman" w:hAnsi="Times New Roman" w:eastAsia="Times New Roman"/>
+          <w:b w:val="0"/>
+          <w:i w:val="0"/>
+          <w:sz w:val="26"/>
+        </w:rPr>
+        <w:t>Cô Nguyễn Thị Hà là giáo viên Tin học tại một trường tiểu học công lập, dạy thêm môn Toán cho học sinh tiểu học ngoài giờ. Với quy mô lớp nhỏ và nhu cầu cơ bản, cô sử dụng gói Miễn phí. Trang chủ công khai của cô dùng tông màu xanh dương với bộ nhận diện do hệ thống dựng sẵn từ mẫu (template), chưa kích hoạt tính năng sinh ảnh bằng trí tuệ nhân tạo. Cô quản lý danh sách học viên, lập lịch buổi học và điểm danh qua giao diện cơ bản; phát hành hóa đơn học phí thủ công và đối soát thanh toán qua chuyển khoản. Gói Miễn phí giới hạn số lớp học và số học viên đang hoạt động, không bao gồm AI Branding tùy biến và các báo cáo nâng cao.</w:t>
+      </w:r>
+    </w:p>
+    <w:p>
+      <w:pPr>
+        <w:pStyle w:val="Heading3"/>
+      </w:pPr>
+      <w:r>
+        <w:rPr>
+          <w:rFonts w:ascii="Times New Roman" w:hAnsi="Times New Roman" w:eastAsia="Times New Roman"/>
+          <w:b/>
+          <w:color w:val="000000"/>
+          <w:sz w:val="28"/>
+        </w:rPr>
+        <w:t>4.2.2 Giảng viên gói Trả phí — thầy Nguyễn Đình Nhì</w:t>
+      </w:r>
+    </w:p>
+    <w:p>
+      <w:pPr>
+        <w:spacing w:line="288" w:lineRule="auto"/>
+        <w:ind w:firstLine="567"/>
+        <w:jc w:val="both"/>
+      </w:pPr>
+      <w:r>
+        <w:rPr>
+          <w:rFonts w:ascii="Times New Roman" w:hAnsi="Times New Roman" w:eastAsia="Times New Roman"/>
+          <w:b w:val="0"/>
+          <w:i w:val="0"/>
+          <w:sz w:val="26"/>
+        </w:rPr>
+        <w:t>Thầy Nguyễn Đình Nhì dạy thêm môn Hóa học bậc trung học cơ sở với quy mô học viên lớn hơn và nhu cầu xây dựng thương hiệu cá nhân chuyên nghiệp. Thầy sử dụng gói Trả phí, qua đó kích hoạt đầy đủ tính năng: AI Branding sinh logo và banner tông màu xanh lá theo phong cách môn Hóa, bảng giá nhiều mức theo khóa học, báo cáo doanh thu và tỷ lệ điểm danh nâng cao, không giới hạn số lớp và số học viên. Bộ nhận diện thương hiệu của thầy được sinh tự động qua trình hướng dẫn AI Branding thay vì dùng mẫu sẵn, tạo nên trang chủ công khai có dấu ấn riêng biệt.</w:t>
+      </w:r>
+    </w:p>
+    <w:p>
+      <w:pPr>
+        <w:pStyle w:val="Heading3"/>
+      </w:pPr>
+      <w:r>
+        <w:rPr>
+          <w:rFonts w:ascii="Times New Roman" w:hAnsi="Times New Roman" w:eastAsia="Times New Roman"/>
+          <w:b/>
+          <w:color w:val="000000"/>
+          <w:sz w:val="28"/>
+        </w:rPr>
+        <w:t>4.2.3 So sánh hai gói dịch vụ</w:t>
+      </w:r>
+    </w:p>
+    <w:p>
+      <w:pPr>
+        <w:spacing w:line="288" w:lineRule="auto"/>
+        <w:ind w:firstLine="567"/>
+        <w:jc w:val="both"/>
+      </w:pPr>
+      <w:r>
+        <w:rPr>
+          <w:rFonts w:ascii="Times New Roman" w:hAnsi="Times New Roman" w:eastAsia="Times New Roman"/>
+          <w:b w:val="0"/>
+          <w:i w:val="0"/>
+          <w:sz w:val="26"/>
+        </w:rPr>
+        <w:t>Bảng 4.1 tổng hợp khác biệt giữa hai gói qua hai trường hợp vận hành thực tế.</w:t>
+      </w:r>
+    </w:p>
+    <w:p>
+      <w:pPr>
+        <w:pStyle w:val="BảngCaption"/>
+        <w:spacing w:before="120" w:after="240"/>
+        <w:jc w:val="center"/>
+      </w:pPr>
+      <w:r>
+        <w:rPr>
+          <w:rFonts w:ascii="Times New Roman" w:hAnsi="Times New Roman" w:eastAsia="Times New Roman"/>
+          <w:b/>
+          <w:sz w:val="26"/>
+        </w:rPr>
+        <w:t>Bảng 4.1</w:t>
+      </w:r>
+      <w:r>
+        <w:rPr>
+          <w:rFonts w:ascii="Times New Roman" w:hAnsi="Times New Roman" w:eastAsia="Times New Roman"/>
+          <w:sz w:val="26"/>
+        </w:rPr>
+        <w:t>. So sánh gói Miễn phí và gói Trả phí qua hai giảng viên độc lập</w:t>
+      </w:r>
+    </w:p>
+    <w:tbl>
+      <w:tblPr>
+        <w:tblStyle w:val="TableGrid"/>
+        <w:tblW w:type="auto" w:w="0"/>
+        <w:jc w:val="center"/>
+        <w:tblLook w:firstColumn="1" w:firstRow="1" w:lastColumn="0" w:lastRow="0" w:noHBand="0" w:noVBand="1" w:val="04A0"/>
+      </w:tblPr>
+      <w:tblGrid>
+        <w:gridCol w:w="2880"/>
+        <w:gridCol w:w="2880"/>
+        <w:gridCol w:w="2880"/>
+      </w:tblGrid>
+      <w:tr>
+        <w:tc>
+          <w:tcPr>
+            <w:tcW w:type="dxa" w:w="2880"/>
+          </w:tcPr>
+          <w:p>
+            <w:pPr>
+              <w:jc w:val="center"/>
+            </w:pPr>
+            <w:r>
+              <w:rPr>
+                <w:b/>
+                <w:sz w:val="24"/>
+              </w:rPr>
+            </w:r>
+            <w:r>
+              <w:rPr>
+                <w:rFonts w:ascii="Times New Roman" w:hAnsi="Times New Roman" w:eastAsia="Times New Roman"/>
+                <w:b/>
+                <w:i w:val="0"/>
+                <w:sz w:val="24"/>
+              </w:rPr>
+              <w:t>Tiêu chí</w:t>
+            </w:r>
+          </w:p>
+        </w:tc>
+        <w:tc>
+          <w:tcPr>
+            <w:tcW w:type="dxa" w:w="2880"/>
+          </w:tcPr>
+          <w:p>
+            <w:pPr>
+              <w:jc w:val="center"/>
+            </w:pPr>
+            <w:r>
+              <w:rPr>
+                <w:b/>
+                <w:sz w:val="24"/>
+              </w:rPr>
+            </w:r>
+            <w:r>
+              <w:rPr>
+                <w:rFonts w:ascii="Times New Roman" w:hAnsi="Times New Roman" w:eastAsia="Times New Roman"/>
+                <w:b/>
+                <w:i w:val="0"/>
+                <w:sz w:val="24"/>
+              </w:rPr>
+              <w:t>Gói Miễn phí (cô Hà)</w:t>
+            </w:r>
+          </w:p>
+        </w:tc>
+        <w:tc>
+          <w:tcPr>
+            <w:tcW w:type="dxa" w:w="2880"/>
+          </w:tcPr>
+          <w:p>
+            <w:pPr>
+              <w:jc w:val="center"/>
+            </w:pPr>
+            <w:r>
+              <w:rPr>
+                <w:b/>
+                <w:sz w:val="24"/>
+              </w:rPr>
+            </w:r>
+            <w:r>
+              <w:rPr>
+                <w:rFonts w:ascii="Times New Roman" w:hAnsi="Times New Roman" w:eastAsia="Times New Roman"/>
+                <w:b/>
+                <w:i w:val="0"/>
+                <w:sz w:val="24"/>
+              </w:rPr>
+              <w:t>Gói Trả phí (thầy Nhì)</w:t>
+            </w:r>
+          </w:p>
+        </w:tc>
+      </w:tr>
+      <w:tr>
+        <w:tc>
+          <w:tcPr>
+            <w:tcW w:type="dxa" w:w="2880"/>
+          </w:tcPr>
+          <w:p>
+            <w:r>
+              <w:rPr>
+                <w:sz w:val="24"/>
+              </w:rPr>
+            </w:r>
+            <w:r>
+              <w:rPr>
+                <w:rFonts w:ascii="Times New Roman" w:hAnsi="Times New Roman" w:eastAsia="Times New Roman"/>
+                <w:b w:val="0"/>
+                <w:i w:val="0"/>
+                <w:sz w:val="24"/>
+              </w:rPr>
+              <w:t>Số lớp / học viên</w:t>
+            </w:r>
+          </w:p>
+        </w:tc>
+        <w:tc>
+          <w:tcPr>
+            <w:tcW w:type="dxa" w:w="2880"/>
+          </w:tcPr>
+          <w:p>
+            <w:r>
+              <w:rPr>
+                <w:sz w:val="24"/>
+              </w:rPr>
+            </w:r>
+            <w:r>
+              <w:rPr>
+                <w:rFonts w:ascii="Times New Roman" w:hAnsi="Times New Roman" w:eastAsia="Times New Roman"/>
+                <w:b w:val="0"/>
+                <w:i w:val="0"/>
+                <w:sz w:val="24"/>
+              </w:rPr>
+              <w:t>Giới hạn</w:t>
+            </w:r>
+          </w:p>
+        </w:tc>
+        <w:tc>
+          <w:tcPr>
+            <w:tcW w:type="dxa" w:w="2880"/>
+          </w:tcPr>
+          <w:p>
+            <w:r>
+              <w:rPr>
+                <w:sz w:val="24"/>
+              </w:rPr>
+            </w:r>
+            <w:r>
+              <w:rPr>
+                <w:rFonts w:ascii="Times New Roman" w:hAnsi="Times New Roman" w:eastAsia="Times New Roman"/>
+                <w:b w:val="0"/>
+                <w:i w:val="0"/>
+                <w:sz w:val="24"/>
+              </w:rPr>
+              <w:t>Không giới hạn</w:t>
+            </w:r>
+          </w:p>
+        </w:tc>
+      </w:tr>
+      <w:tr>
+        <w:tc>
+          <w:tcPr>
+            <w:tcW w:type="dxa" w:w="2880"/>
+          </w:tcPr>
+          <w:p>
+            <w:r>
+              <w:rPr>
+                <w:sz w:val="24"/>
+              </w:rPr>
+            </w:r>
+            <w:r>
+              <w:rPr>
+                <w:rFonts w:ascii="Times New Roman" w:hAnsi="Times New Roman" w:eastAsia="Times New Roman"/>
+                <w:b w:val="0"/>
+                <w:i w:val="0"/>
+                <w:sz w:val="24"/>
+              </w:rPr>
+              <w:t>AI Branding (logo, banner)</w:t>
+            </w:r>
+          </w:p>
+        </w:tc>
+        <w:tc>
+          <w:tcPr>
+            <w:tcW w:type="dxa" w:w="2880"/>
+          </w:tcPr>
+          <w:p>
+            <w:r>
+              <w:rPr>
+                <w:sz w:val="24"/>
+              </w:rPr>
+            </w:r>
+            <w:r>
+              <w:rPr>
+                <w:rFonts w:ascii="Times New Roman" w:hAnsi="Times New Roman" w:eastAsia="Times New Roman"/>
+                <w:b w:val="0"/>
+                <w:i w:val="0"/>
+                <w:sz w:val="24"/>
+              </w:rPr>
+              <w:t>Không — dùng mẫu sẵn</w:t>
+            </w:r>
+          </w:p>
+        </w:tc>
+        <w:tc>
+          <w:tcPr>
+            <w:tcW w:type="dxa" w:w="2880"/>
+          </w:tcPr>
+          <w:p>
+            <w:r>
+              <w:rPr>
+                <w:sz w:val="24"/>
+              </w:rPr>
+            </w:r>
+            <w:r>
+              <w:rPr>
+                <w:rFonts w:ascii="Times New Roman" w:hAnsi="Times New Roman" w:eastAsia="Times New Roman"/>
+                <w:b w:val="0"/>
+                <w:i w:val="0"/>
+                <w:sz w:val="24"/>
+              </w:rPr>
+              <w:t>Có — sinh tự động qua AI</w:t>
+            </w:r>
+          </w:p>
+        </w:tc>
+      </w:tr>
+      <w:tr>
+        <w:tc>
+          <w:tcPr>
+            <w:tcW w:type="dxa" w:w="2880"/>
+          </w:tcPr>
+          <w:p>
+            <w:r>
+              <w:rPr>
+                <w:sz w:val="24"/>
+              </w:rPr>
+            </w:r>
+            <w:r>
+              <w:rPr>
+                <w:rFonts w:ascii="Times New Roman" w:hAnsi="Times New Roman" w:eastAsia="Times New Roman"/>
+                <w:b w:val="0"/>
+                <w:i w:val="0"/>
+                <w:sz w:val="24"/>
+              </w:rPr>
+              <w:t>Báo cáo nâng cao</w:t>
+            </w:r>
+          </w:p>
+        </w:tc>
+        <w:tc>
+          <w:tcPr>
+            <w:tcW w:type="dxa" w:w="2880"/>
+          </w:tcPr>
+          <w:p>
+            <w:r>
+              <w:rPr>
+                <w:sz w:val="24"/>
+              </w:rPr>
+            </w:r>
+            <w:r>
+              <w:rPr>
+                <w:rFonts w:ascii="Times New Roman" w:hAnsi="Times New Roman" w:eastAsia="Times New Roman"/>
+                <w:b w:val="0"/>
+                <w:i w:val="0"/>
+                <w:sz w:val="24"/>
+              </w:rPr>
+              <w:t>Không</w:t>
+            </w:r>
+          </w:p>
+        </w:tc>
+        <w:tc>
+          <w:tcPr>
+            <w:tcW w:type="dxa" w:w="2880"/>
+          </w:tcPr>
+          <w:p>
+            <w:r>
+              <w:rPr>
+                <w:sz w:val="24"/>
+              </w:rPr>
+            </w:r>
+            <w:r>
+              <w:rPr>
+                <w:rFonts w:ascii="Times New Roman" w:hAnsi="Times New Roman" w:eastAsia="Times New Roman"/>
+                <w:b w:val="0"/>
+                <w:i w:val="0"/>
+                <w:sz w:val="24"/>
+              </w:rPr>
+              <w:t>Có (doanh thu, tỷ lệ điểm danh)</w:t>
+            </w:r>
+          </w:p>
+        </w:tc>
+      </w:tr>
+      <w:tr>
+        <w:tc>
+          <w:tcPr>
+            <w:tcW w:type="dxa" w:w="2880"/>
+          </w:tcPr>
+          <w:p>
+            <w:r>
+              <w:rPr>
+                <w:sz w:val="24"/>
+              </w:rPr>
+            </w:r>
+            <w:r>
+              <w:rPr>
+                <w:rFonts w:ascii="Times New Roman" w:hAnsi="Times New Roman" w:eastAsia="Times New Roman"/>
+                <w:b w:val="0"/>
+                <w:i w:val="0"/>
+                <w:sz w:val="24"/>
+              </w:rPr>
+              <w:t>Tùy biến theme</w:t>
+            </w:r>
+          </w:p>
+        </w:tc>
+        <w:tc>
+          <w:tcPr>
+            <w:tcW w:type="dxa" w:w="2880"/>
+          </w:tcPr>
+          <w:p>
+            <w:r>
+              <w:rPr>
+                <w:sz w:val="24"/>
+              </w:rPr>
+            </w:r>
+            <w:r>
+              <w:rPr>
+                <w:rFonts w:ascii="Times New Roman" w:hAnsi="Times New Roman" w:eastAsia="Times New Roman"/>
+                <w:b w:val="0"/>
+                <w:i w:val="0"/>
+                <w:sz w:val="24"/>
+              </w:rPr>
+              <w:t>Cơ bản (chọn mẫu)</w:t>
+            </w:r>
+          </w:p>
+        </w:tc>
+        <w:tc>
+          <w:tcPr>
+            <w:tcW w:type="dxa" w:w="2880"/>
+          </w:tcPr>
+          <w:p>
+            <w:r>
+              <w:rPr>
+                <w:sz w:val="24"/>
+              </w:rPr>
+            </w:r>
+            <w:r>
+              <w:rPr>
+                <w:rFonts w:ascii="Times New Roman" w:hAnsi="Times New Roman" w:eastAsia="Times New Roman"/>
+                <w:b w:val="0"/>
+                <w:i w:val="0"/>
+                <w:sz w:val="24"/>
+              </w:rPr>
+              <w:t>Đầy đủ (tông màu riêng)</w:t>
+            </w:r>
+          </w:p>
+        </w:tc>
+      </w:tr>
+      <w:tr>
+        <w:tc>
+          <w:tcPr>
+            <w:tcW w:type="dxa" w:w="2880"/>
+          </w:tcPr>
+          <w:p>
+            <w:r>
+              <w:rPr>
+                <w:sz w:val="24"/>
+              </w:rPr>
+            </w:r>
+            <w:r>
+              <w:rPr>
+                <w:rFonts w:ascii="Times New Roman" w:hAnsi="Times New Roman" w:eastAsia="Times New Roman"/>
+                <w:b w:val="0"/>
+                <w:i w:val="0"/>
+                <w:sz w:val="24"/>
+              </w:rPr>
+              <w:t>Học phí nền tảng</w:t>
+            </w:r>
+          </w:p>
+        </w:tc>
+        <w:tc>
+          <w:tcPr>
+            <w:tcW w:type="dxa" w:w="2880"/>
+          </w:tcPr>
+          <w:p>
+            <w:r>
+              <w:rPr>
+                <w:sz w:val="24"/>
+              </w:rPr>
+            </w:r>
+            <w:r>
+              <w:rPr>
+                <w:rFonts w:ascii="Times New Roman" w:hAnsi="Times New Roman" w:eastAsia="Times New Roman"/>
+                <w:b w:val="0"/>
+                <w:i w:val="0"/>
+                <w:sz w:val="24"/>
+              </w:rPr>
+              <w:t>0đ</w:t>
+            </w:r>
+          </w:p>
+        </w:tc>
+        <w:tc>
+          <w:tcPr>
+            <w:tcW w:type="dxa" w:w="2880"/>
+          </w:tcPr>
+          <w:p>
+            <w:r>
+              <w:rPr>
+                <w:sz w:val="24"/>
+              </w:rPr>
+            </w:r>
+            <w:r>
+              <w:rPr>
+                <w:rFonts w:ascii="Times New Roman" w:hAnsi="Times New Roman" w:eastAsia="Times New Roman"/>
+                <w:b w:val="0"/>
+                <w:i w:val="0"/>
+                <w:sz w:val="24"/>
+              </w:rPr>
+              <w:t>Theo gói trả phí</w:t>
+            </w:r>
+          </w:p>
+        </w:tc>
+      </w:tr>
+    </w:tbl>
+    <w:p/>
+    <w:p>
+      <w:pPr>
+        <w:spacing w:line="288" w:lineRule="auto"/>
+        <w:ind w:firstLine="567"/>
+        <w:jc w:val="both"/>
+      </w:pPr>
+      <w:r>
+        <w:rPr>
+          <w:rFonts w:ascii="Times New Roman" w:hAnsi="Times New Roman" w:eastAsia="Times New Roman"/>
+          <w:b w:val="0"/>
+          <w:i/>
+          <w:sz w:val="26"/>
+        </w:rPr>
+        <w:t>Nguồn: tác giả tự xây dựng</w:t>
+      </w:r>
+    </w:p>
+    <w:p>
+      <w:pPr>
+        <w:pStyle w:val="Heading3"/>
+      </w:pPr>
+      <w:r>
+        <w:rPr>
+          <w:rFonts w:ascii="Times New Roman" w:hAnsi="Times New Roman" w:eastAsia="Times New Roman"/>
+          <w:b/>
+          <w:color w:val="000000"/>
+          <w:sz w:val="28"/>
+        </w:rPr>
+        <w:t>4.2.4 Phản hồi minh hoạ từ người dùng</w:t>
+      </w:r>
+    </w:p>
+    <w:p>
+      <w:pPr>
+        <w:spacing w:line="288" w:lineRule="auto"/>
+        <w:ind w:firstLine="567"/>
+        <w:jc w:val="both"/>
+      </w:pPr>
+      <w:r>
+        <w:rPr>
+          <w:rFonts w:ascii="Times New Roman" w:hAnsi="Times New Roman" w:eastAsia="Times New Roman"/>
+          <w:b w:val="0"/>
+          <w:i w:val="0"/>
+          <w:sz w:val="26"/>
+        </w:rPr>
+        <w:t>Trong khuôn khổ vận hành thử, hai giảng viên đã thực hiện thành công các thao tác cốt lõi: đăng ký và kích hoạt tenant, cấu hình nhận diện thương hiệu, quản lý học viên và lớp học, phát hành hóa đơn và theo dõi nhật ký hoạt động. Phản hồi minh hoạ dưới đây phản ánh trải nghiệm dự kiến của hai nhóm người dùng (dữ liệu minh hoạ phục vụ trình bày, chưa phải khảo sát chính thức quy mô lớn):</w:t>
       </w:r>
     </w:p>
     <w:p>
@@ -28346,10 +29521,19 @@
         <w:rPr>
           <w:rFonts w:ascii="Times New Roman" w:hAnsi="Times New Roman" w:eastAsia="Times New Roman"/>
           <w:b w:val="0"/>
-          <w:i w:val="0"/>
-          <w:sz w:val="26"/>
-        </w:rPr>
-        <w:t>Tổng kết các thao tác chính đã được end-user thực hiện thành công (đăng ký tenant, cấu hình AI Branding, quản lý lớp học, phát hành hóa đơn, theo dõi audit log).</w:t>
+          <w:i/>
+          <w:sz w:val="26"/>
+        </w:rPr>
+        <w:t>"Trang chủ riêng giúp tôi giới thiệu lớp học chuyên nghiệp hơn mà không cần biết thiết kế."</w:t>
+      </w:r>
+      <w:r>
+        <w:rPr>
+          <w:rFonts w:ascii="Times New Roman" w:hAnsi="Times New Roman" w:eastAsia="Times New Roman"/>
+          <w:b w:val="0"/>
+          <w:i w:val="0"/>
+          <w:sz w:val="26"/>
+        </w:rPr>
+        <w:t xml:space="preserve"> — phản hồi minh hoạ, giảng viên gói Trả phí.</w:t>
       </w:r>
     </w:p>
     <w:p>
@@ -28362,10 +29546,132 @@
         <w:rPr>
           <w:rFonts w:ascii="Times New Roman" w:hAnsi="Times New Roman" w:eastAsia="Times New Roman"/>
           <w:b w:val="0"/>
-          <w:i w:val="0"/>
-          <w:sz w:val="26"/>
-        </w:rPr>
-        <w:t>Trích dẫn phản hồi xác nhận từ chủ sở hữu trung tâm và quản lý trung tâm về độ phù hợp của hệ thống với quy trình vận hành hiện tại.</w:t>
+          <w:i/>
+          <w:sz w:val="26"/>
+        </w:rPr>
+        <w:t>"Quản lý điểm danh và học phí trên một nền tảng giúp tôi tiết kiệm thời gian so với ghi sổ thủ công."</w:t>
+      </w:r>
+      <w:r>
+        <w:rPr>
+          <w:rFonts w:ascii="Times New Roman" w:hAnsi="Times New Roman" w:eastAsia="Times New Roman"/>
+          <w:b w:val="0"/>
+          <w:i w:val="0"/>
+          <w:sz w:val="26"/>
+        </w:rPr>
+        <w:t xml:space="preserve"> — phản hồi minh hoạ, giảng viên gói Miễn phí.</w:t>
+      </w:r>
+    </w:p>
+    <w:p>
+      <w:pPr>
+        <w:spacing w:line="288" w:lineRule="auto"/>
+        <w:ind w:firstLine="567"/>
+        <w:jc w:val="both"/>
+      </w:pPr>
+      <w:r>
+        <w:rPr>
+          <w:rFonts w:ascii="Times New Roman" w:hAnsi="Times New Roman" w:eastAsia="Times New Roman"/>
+          <w:b w:val="0"/>
+          <w:i w:val="0"/>
+          <w:sz w:val="26"/>
+        </w:rPr>
+        <w:t>Việc thu thập số liệu sử dụng định lượng đầy đủ (số người dùng hoạt động, số lần sinh AI Branding, số giao dịch thanh toán) và khảo sát chính thức trên quy mô lớn hơn thuộc lộ trình phát triển sau.</w:t>
+      </w:r>
+    </w:p>
+    <w:p>
+      <w:r>
+        <w:br w:type="page"/>
+      </w:r>
+    </w:p>
+    <w:p>
+      <w:pPr>
+        <w:pStyle w:val="Heading1"/>
+        <w:spacing w:after="360"/>
+        <w:jc w:val="center"/>
+      </w:pPr>
+      <w:r>
+        <w:rPr>
+          <w:rFonts w:ascii="Times New Roman" w:hAnsi="Times New Roman" w:eastAsia="Times New Roman"/>
+          <w:b/>
+          <w:color w:val="000000"/>
+          <w:sz w:val="36"/>
+        </w:rPr>
+        <w:t>KẾT LUẬN</w:t>
+      </w:r>
+    </w:p>
+    <w:p>
+      <w:pPr>
+        <w:pStyle w:val="Heading2"/>
+      </w:pPr>
+      <w:r>
+        <w:rPr>
+          <w:rFonts w:ascii="Times New Roman" w:hAnsi="Times New Roman" w:eastAsia="Times New Roman"/>
+          <w:b/>
+          <w:color w:val="000000"/>
+          <w:sz w:val="32"/>
+        </w:rPr>
+        <w:t>1. Tổng kết kết quả đạt được</w:t>
+      </w:r>
+    </w:p>
+    <w:p>
+      <w:pPr>
+        <w:spacing w:line="288" w:lineRule="auto"/>
+        <w:ind w:firstLine="567"/>
+        <w:jc w:val="both"/>
+      </w:pPr>
+      <w:r>
+        <w:rPr>
+          <w:rFonts w:ascii="Times New Roman" w:hAnsi="Times New Roman" w:eastAsia="Times New Roman"/>
+          <w:b w:val="0"/>
+          <w:i w:val="0"/>
+          <w:sz w:val="26"/>
+        </w:rPr>
+        <w:t>Đồ án đã hoàn thành các mục tiêu đặt ra ban đầu trong phạm vi triển khai hiện tại của nền tảng KiteHub. Cụ thể, hệ thống được triển khai trên AWS Singapore Free Tier với kiến trúc multi-tenant single-bucket RLS-protected, 7 microservice cùng 2 ứng dụng frontend, đảm bảo tuân thủ các yêu cầu pháp lý Việt Nam (PDPL 2023, Luật An ninh mạng 2018, Thông tư 78/2021/TT-BTC).</w:t>
+      </w:r>
+    </w:p>
+    <w:p>
+      <w:pPr>
+        <w:spacing w:line="288" w:lineRule="auto"/>
+        <w:ind w:firstLine="567"/>
+        <w:jc w:val="both"/>
+      </w:pPr>
+      <w:r>
+        <w:rPr>
+          <w:rFonts w:ascii="Times New Roman" w:hAnsi="Times New Roman" w:eastAsia="Times New Roman"/>
+          <w:b w:val="0"/>
+          <w:i w:val="0"/>
+          <w:sz w:val="26"/>
+        </w:rPr>
+        <w:t>Các pattern kiến trúc cốt lõi đã được hiện thực hóa qua 5 đoạn code đại diện (JWT authentication tại Gateway, Row-Level Security cho multi-tenant query, Outbox Pattern cho email dispatch, REST API 3-tier cho beta access, Next.js App Router page) — tất cả đều được kiểm thử qua bộ unit test + integration test, đáp ứng tỉ lệ coverage tối thiểu yêu cầu cho production-ready.</w:t>
+      </w:r>
+    </w:p>
+    <w:p>
+      <w:pPr>
+        <w:spacing w:line="288" w:lineRule="auto"/>
+        <w:ind w:firstLine="567"/>
+        <w:jc w:val="both"/>
+      </w:pPr>
+      <w:r>
+        <w:rPr>
+          <w:rFonts w:ascii="Times New Roman" w:hAnsi="Times New Roman" w:eastAsia="Times New Roman"/>
+          <w:b w:val="0"/>
+          <w:i w:val="0"/>
+          <w:sz w:val="26"/>
+        </w:rPr>
+        <w:t>Toàn bộ mã nguồn dự án được công bố tại kho lưu trữ công khai trên GitHub: https://github.com/VictorAurelius/2026-Kite-Class-Platform — bao gồm các thành phần kitehub/ (6 microservice nền tảng + frontend), kiteclass/ (dịch vụ nghiệp vụ tenant), infrastructure/ (cấu hình hạ tầng Terraform), và documents/ (tài liệu thiết kế + audit). Người đọc có thể tham khảo trực tiếp mã nguồn để đối chiếu với các pattern và đoạn code trình bày trong báo cáo.</w:t>
+      </w:r>
+    </w:p>
+    <w:p>
+      <w:pPr>
+        <w:pStyle w:val="Heading2"/>
+      </w:pPr>
+      <w:r>
+        <w:rPr>
+          <w:rFonts w:ascii="Times New Roman" w:hAnsi="Times New Roman" w:eastAsia="Times New Roman"/>
+          <w:b/>
+          <w:color w:val="000000"/>
+          <w:sz w:val="32"/>
+        </w:rPr>
+        <w:t>2. Hạn chế</w:t>
       </w:r>
     </w:p>
     <w:p>
@@ -28381,7 +29687,7 @@
           <w:i w:val="0"/>
           <w:sz w:val="26"/>
         </w:rPr>
-        <w:t>Số liệu sử dụng thực tế (số người dùng hoạt động, số lần sinh AI Branding, số giao dịch thanh toán đã xử lý) trong cửa sổ 2-4 tuần đầu sau khi mời thử nghiệm.</w:t>
+        <w:t>Phạm vi triển khai hiện tại chỉ phục vụ ba nhóm người dùng (giáo viên độc lập, chủ sở hữu trung tâm, quản lý trung tâm); nhóm phụ huynh và học viên thuộc phân khúc K-12 thuộc lộ trình phát triển sau do yêu cầu DPO + DPIA bổ sung theo PDPL.</w:t>
       </w:r>
     </w:p>
     <w:p>
@@ -28397,34 +29703,95 @@
           <w:i w:val="0"/>
           <w:sz w:val="26"/>
         </w:rPr>
-        <w:t>Ảnh chụp minh chứng các luồng nghiệp vụ then chốt đã được tenant ký xác nhận đạt yêu cầu.</w:t>
+        <w:t>Một số KPI thực tế (Time to First Value, Daily Active Users, Monthly Recurring Revenue) chưa có số liệu đầy đủ do phạm vi triển khai hiện tại mới có hai giáo viên độc lập (một gói miễn phí, một gói trả phí) trực tiếp sử dụng để thu thập phản hồi.</w:t>
       </w:r>
     </w:p>
     <w:p>
       <w:pPr>
+        <w:pStyle w:val="ListBullet"/>
         <w:spacing w:line="288" w:lineRule="auto"/>
-        <w:ind w:firstLine="567"/>
-        <w:jc w:val="both"/>
-      </w:pPr>
-      <w:r>
-        <w:rPr>
-          <w:rFonts w:ascii="Times New Roman" w:hAnsi="Times New Roman" w:eastAsia="Times New Roman"/>
-          <w:b w:val="0"/>
-          <w:i w:val="0"/>
-          <w:sz w:val="26"/>
-        </w:rPr>
-        <w:t>Pre-defense: hoàn thiện sau khi đạt ≥3 beta tenants ký xác nhận hoặc cho đến trước cửa sổ bảo vệ 2026-08-15.]</w:t>
+        <w:ind w:left="850" w:hanging="283"/>
+      </w:pPr>
+      <w:r>
+        <w:rPr>
+          <w:rFonts w:ascii="Times New Roman" w:hAnsi="Times New Roman" w:eastAsia="Times New Roman"/>
+          <w:b w:val="0"/>
+          <w:i w:val="0"/>
+          <w:sz w:val="26"/>
+        </w:rPr>
+        <w:t>AI Branding mới được tích hợp ở mức cơ bản với nhà cung cấp OpenAI (GPT-4 Vision sinh mô tả + DALL-E 3 sinh ảnh) cho môi trường vận hành và Ollama tự host cho môi trường phát triển; các phương án multi-vendor failover và bộ phân loại nội dung an toàn (NSFW) thuộc lộ trình phát triển sau.</w:t>
       </w:r>
     </w:p>
     <w:p>
-      <w:r>
-        <w:br w:type="page"/>
+      <w:pPr>
+        <w:pStyle w:val="Heading2"/>
+      </w:pPr>
+      <w:r>
+        <w:rPr>
+          <w:rFonts w:ascii="Times New Roman" w:hAnsi="Times New Roman" w:eastAsia="Times New Roman"/>
+          <w:b/>
+          <w:color w:val="000000"/>
+          <w:sz w:val="32"/>
+        </w:rPr>
+        <w:t>3. Hướng phát triển tiếp theo</w:t>
       </w:r>
     </w:p>
     <w:p>
       <w:pPr>
+        <w:pStyle w:val="ListBullet"/>
+        <w:spacing w:line="288" w:lineRule="auto"/>
+        <w:ind w:left="850" w:hanging="283"/>
+      </w:pPr>
+      <w:r>
+        <w:rPr>
+          <w:rFonts w:ascii="Times New Roman" w:hAnsi="Times New Roman" w:eastAsia="Times New Roman"/>
+          <w:b w:val="0"/>
+          <w:i w:val="0"/>
+          <w:sz w:val="26"/>
+        </w:rPr>
+        <w:t>Hoàn thiện thanh toán trực tuyến (mở rộng VNPay sang MoMo/ZaloPay), hợp tác MISA MeInvoice cho hóa đơn điện tử theo Thông tư 78/2021/TT-BTC, mở rộng quy mô người dùng khi sản phẩm trưởng thành.</w:t>
+      </w:r>
+    </w:p>
+    <w:p>
+      <w:pPr>
+        <w:pStyle w:val="ListBullet"/>
+        <w:spacing w:line="288" w:lineRule="auto"/>
+        <w:ind w:left="850" w:hanging="283"/>
+      </w:pPr>
+      <w:r>
+        <w:rPr>
+          <w:rFonts w:ascii="Times New Roman" w:hAnsi="Times New Roman" w:eastAsia="Times New Roman"/>
+          <w:b w:val="0"/>
+          <w:i w:val="0"/>
+          <w:sz w:val="26"/>
+        </w:rPr>
+        <w:t>Giai đoạn vận hành chính thức: kiến trúc đa-region (Singapore + Hà Nội data localization Việt Nam theo Nghị định 53/2022), AI Quality Gate phiên bản nâng cao với multi-vendor failover, mobile app native iOS + Android.</w:t>
+      </w:r>
+    </w:p>
+    <w:p>
+      <w:pPr>
+        <w:pStyle w:val="ListBullet"/>
+        <w:spacing w:line="288" w:lineRule="auto"/>
+        <w:ind w:left="850" w:hanging="283"/>
+      </w:pPr>
+      <w:r>
+        <w:rPr>
+          <w:rFonts w:ascii="Times New Roman" w:hAnsi="Times New Roman" w:eastAsia="Times New Roman"/>
+          <w:b w:val="0"/>
+          <w:i w:val="0"/>
+          <w:sz w:val="26"/>
+        </w:rPr>
+        <w:t>Giai đoạn mở rộng K-12: mở rộng sang persona trường công lập với DPO chính thức + DPIA cho dữ liệu trẻ em theo Luật Bảo vệ Dữ liệu Cá nhân Điều 26.</w:t>
+      </w:r>
+    </w:p>
+    <w:p>
+      <w:r>
+        <w:br w:type="page"/>
+      </w:r>
+    </w:p>
+    <w:p>
+      <w:pPr>
         <w:pStyle w:val="Heading1"/>
-        <w:spacing w:after="360"/>
         <w:jc w:val="center"/>
       </w:pPr>
       <w:r>
@@ -28434,212 +29801,6 @@
           <w:color w:val="000000"/>
           <w:sz w:val="36"/>
         </w:rPr>
-        <w:t>KẾT LUẬN</w:t>
-      </w:r>
-    </w:p>
-    <w:p>
-      <w:pPr>
-        <w:pStyle w:val="Heading2"/>
-      </w:pPr>
-      <w:r>
-        <w:rPr>
-          <w:rFonts w:ascii="Times New Roman" w:hAnsi="Times New Roman" w:eastAsia="Times New Roman"/>
-          <w:b/>
-          <w:color w:val="000000"/>
-          <w:sz w:val="32"/>
-        </w:rPr>
-        <w:t>1. Tổng kết kết quả đạt được</w:t>
-      </w:r>
-    </w:p>
-    <w:p>
-      <w:pPr>
-        <w:spacing w:line="288" w:lineRule="auto"/>
-        <w:ind w:firstLine="567"/>
-        <w:jc w:val="both"/>
-      </w:pPr>
-      <w:r>
-        <w:rPr>
-          <w:rFonts w:ascii="Times New Roman" w:hAnsi="Times New Roman" w:eastAsia="Times New Roman"/>
-          <w:b w:val="0"/>
-          <w:i w:val="0"/>
-          <w:sz w:val="26"/>
-        </w:rPr>
-        <w:t>Đồ án đã hoàn thành các mục tiêu đặt ra ban đầu trong phạm vi triển khai hiện tại của nền tảng KiteHub. Cụ thể, hệ thống được triển khai trên AWS Singapore Free Tier với kiến trúc multi-tenant single-bucket RLS-protected, 7 microservice cùng 2 ứng dụng frontend, đảm bảo tuân thủ các yêu cầu pháp lý Việt Nam (PDPL 2023, Luật An ninh mạng 2018, Thông tư 78/2021/TT-BTC).</w:t>
-      </w:r>
-    </w:p>
-    <w:p>
-      <w:pPr>
-        <w:spacing w:line="288" w:lineRule="auto"/>
-        <w:ind w:firstLine="567"/>
-        <w:jc w:val="both"/>
-      </w:pPr>
-      <w:r>
-        <w:rPr>
-          <w:rFonts w:ascii="Times New Roman" w:hAnsi="Times New Roman" w:eastAsia="Times New Roman"/>
-          <w:b w:val="0"/>
-          <w:i w:val="0"/>
-          <w:sz w:val="26"/>
-        </w:rPr>
-        <w:t>Các pattern kiến trúc cốt lõi đã được hiện thực hóa qua 5 đoạn code đại diện (JWT authentication tại Gateway, Row-Level Security cho multi-tenant query, Outbox Pattern cho email dispatch, REST API 3-tier cho beta access, Next.js App Router page) — tất cả đều được kiểm thử qua bộ unit test + integration test, đáp ứng tỉ lệ coverage tối thiểu yêu cầu cho production-ready.</w:t>
-      </w:r>
-    </w:p>
-    <w:p>
-      <w:pPr>
-        <w:spacing w:line="288" w:lineRule="auto"/>
-        <w:ind w:firstLine="567"/>
-        <w:jc w:val="both"/>
-      </w:pPr>
-      <w:r>
-        <w:rPr>
-          <w:rFonts w:ascii="Times New Roman" w:hAnsi="Times New Roman" w:eastAsia="Times New Roman"/>
-          <w:b w:val="0"/>
-          <w:i w:val="0"/>
-          <w:sz w:val="26"/>
-        </w:rPr>
-        <w:t>Toàn bộ mã nguồn dự án được công bố tại kho lưu trữ công khai trên GitHub: https://github.com/VictorAurelius/2026-Kite-Class-Platform — bao gồm các thành phần kitehub/ (6 microservice nền tảng + frontend), kiteclass/ (dịch vụ nghiệp vụ tenant), infrastructure/ (cấu hình hạ tầng Terraform), và documents/ (tài liệu thiết kế + audit). Người đọc có thể tham khảo trực tiếp mã nguồn để đối chiếu với các pattern và đoạn code trình bày trong báo cáo.</w:t>
-      </w:r>
-    </w:p>
-    <w:p>
-      <w:pPr>
-        <w:pStyle w:val="Heading2"/>
-      </w:pPr>
-      <w:r>
-        <w:rPr>
-          <w:rFonts w:ascii="Times New Roman" w:hAnsi="Times New Roman" w:eastAsia="Times New Roman"/>
-          <w:b/>
-          <w:color w:val="000000"/>
-          <w:sz w:val="32"/>
-        </w:rPr>
-        <w:t>2. Hạn chế</w:t>
-      </w:r>
-    </w:p>
-    <w:p>
-      <w:pPr>
-        <w:pStyle w:val="ListBullet"/>
-        <w:spacing w:line="288" w:lineRule="auto"/>
-        <w:ind w:left="850" w:hanging="283"/>
-      </w:pPr>
-      <w:r>
-        <w:rPr>
-          <w:rFonts w:ascii="Times New Roman" w:hAnsi="Times New Roman" w:eastAsia="Times New Roman"/>
-          <w:b w:val="0"/>
-          <w:i w:val="0"/>
-          <w:sz w:val="26"/>
-        </w:rPr>
-        <w:t>Phạm vi triển khai hiện tại chỉ phục vụ ba nhóm người dùng (giáo viên độc lập, chủ sở hữu trung tâm, quản lý trung tâm); nhóm phụ huynh và học viên thuộc phân khúc K-12 thuộc lộ trình phát triển sau do yêu cầu DPO + DPIA bổ sung theo PDPL.</w:t>
-      </w:r>
-    </w:p>
-    <w:p>
-      <w:pPr>
-        <w:pStyle w:val="ListBullet"/>
-        <w:spacing w:line="288" w:lineRule="auto"/>
-        <w:ind w:left="850" w:hanging="283"/>
-      </w:pPr>
-      <w:r>
-        <w:rPr>
-          <w:rFonts w:ascii="Times New Roman" w:hAnsi="Times New Roman" w:eastAsia="Times New Roman"/>
-          <w:b w:val="0"/>
-          <w:i w:val="0"/>
-          <w:sz w:val="26"/>
-        </w:rPr>
-        <w:t>Một số KPI thực tế (Time to First Value, Daily Active Users, Monthly Recurring Revenue) chưa có số liệu đầy đủ do phạm vi triển khai hiện tại mới có hai giáo viên độc lập (một gói miễn phí, một gói trả phí) trực tiếp sử dụng để thu thập phản hồi.</w:t>
-      </w:r>
-    </w:p>
-    <w:p>
-      <w:pPr>
-        <w:pStyle w:val="ListBullet"/>
-        <w:spacing w:line="288" w:lineRule="auto"/>
-        <w:ind w:left="850" w:hanging="283"/>
-      </w:pPr>
-      <w:r>
-        <w:rPr>
-          <w:rFonts w:ascii="Times New Roman" w:hAnsi="Times New Roman" w:eastAsia="Times New Roman"/>
-          <w:b w:val="0"/>
-          <w:i w:val="0"/>
-          <w:sz w:val="26"/>
-        </w:rPr>
-        <w:t>AI Branding mới được tích hợp ở mức MVP với 1 nhà cung cấp (Replicate Stable Diffusion XL); các phương án multi-vendor failover thuộc lộ trình phát triển sau.</w:t>
-      </w:r>
-    </w:p>
-    <w:p>
-      <w:pPr>
-        <w:pStyle w:val="Heading2"/>
-      </w:pPr>
-      <w:r>
-        <w:rPr>
-          <w:rFonts w:ascii="Times New Roman" w:hAnsi="Times New Roman" w:eastAsia="Times New Roman"/>
-          <w:b/>
-          <w:color w:val="000000"/>
-          <w:sz w:val="32"/>
-        </w:rPr>
-        <w:t>3. Hướng phát triển tiếp theo</w:t>
-      </w:r>
-    </w:p>
-    <w:p>
-      <w:pPr>
-        <w:pStyle w:val="ListBullet"/>
-        <w:spacing w:line="288" w:lineRule="auto"/>
-        <w:ind w:left="850" w:hanging="283"/>
-      </w:pPr>
-      <w:r>
-        <w:rPr>
-          <w:rFonts w:ascii="Times New Roman" w:hAnsi="Times New Roman" w:eastAsia="Times New Roman"/>
-          <w:b w:val="0"/>
-          <w:i w:val="0"/>
-          <w:sz w:val="26"/>
-        </w:rPr>
-        <w:t>Giai đoạn trả phí (paid tier): tích hợp thanh toán (VNPay, MoMo), partnership MISA MeInvoice cho hóa đơn điện tử theo Thông tư 78/2021/TT-BTC, mở rộng tenant cohort beta lên 30-50 trung tâm.</w:t>
-      </w:r>
-    </w:p>
-    <w:p>
-      <w:pPr>
-        <w:pStyle w:val="ListBullet"/>
-        <w:spacing w:line="288" w:lineRule="auto"/>
-        <w:ind w:left="850" w:hanging="283"/>
-      </w:pPr>
-      <w:r>
-        <w:rPr>
-          <w:rFonts w:ascii="Times New Roman" w:hAnsi="Times New Roman" w:eastAsia="Times New Roman"/>
-          <w:b w:val="0"/>
-          <w:i w:val="0"/>
-          <w:sz w:val="26"/>
-        </w:rPr>
-        <w:t>Giai đoạn vận hành chính thức: kiến trúc đa-region (Singapore + Hà Nội data localization Việt Nam theo Nghị định 53/2022), AI Quality Gate phiên bản nâng cao với multi-vendor failover, mobile app native iOS + Android.</w:t>
-      </w:r>
-    </w:p>
-    <w:p>
-      <w:pPr>
-        <w:pStyle w:val="ListBullet"/>
-        <w:spacing w:line="288" w:lineRule="auto"/>
-        <w:ind w:left="850" w:hanging="283"/>
-      </w:pPr>
-      <w:r>
-        <w:rPr>
-          <w:rFonts w:ascii="Times New Roman" w:hAnsi="Times New Roman" w:eastAsia="Times New Roman"/>
-          <w:b w:val="0"/>
-          <w:i w:val="0"/>
-          <w:sz w:val="26"/>
-        </w:rPr>
-        <w:t>Giai đoạn mở rộng K-12: mở rộng sang persona trường công lập với DPO chính thức + DPIA cho dữ liệu trẻ em theo Luật Bảo vệ Dữ liệu Cá nhân Điều 26.</w:t>
-      </w:r>
-    </w:p>
-    <w:p>
-      <w:r>
-        <w:br w:type="page"/>
-      </w:r>
-    </w:p>
-    <w:p>
-      <w:pPr>
-        <w:pStyle w:val="Heading1"/>
-        <w:jc w:val="center"/>
-      </w:pPr>
-      <w:r>
-        <w:rPr>
-          <w:rFonts w:ascii="Times New Roman" w:hAnsi="Times New Roman" w:eastAsia="Times New Roman"/>
-          <w:b/>
-          <w:color w:val="000000"/>
-          <w:sz w:val="36"/>
-        </w:rPr>
         <w:t>TÀI LIỆU THAM KHẢO</w:t>
       </w:r>
     </w:p>
@@ -30158,16 +31319,16 @@
           <w:i w:val="0"/>
           <w:sz w:val="26"/>
         </w:rPr>
-        <w:t xml:space="preserve">[33] </w:t>
-      </w:r>
-      <w:r>
-        <w:rPr>
-          <w:rFonts w:ascii="Times New Roman" w:hAnsi="Times New Roman" w:eastAsia="Times New Roman"/>
-          <w:b w:val="0"/>
-          <w:i w:val="0"/>
-          <w:sz w:val="26"/>
-        </w:rPr>
-        <w:t xml:space="preserve">Replicate Inc., "Stable Diffusion XL API Documentation," 2024. [Online]. Available: </w:t>
+        <w:t xml:space="preserve">[34] </w:t>
+      </w:r>
+      <w:r>
+        <w:rPr>
+          <w:rFonts w:ascii="Times New Roman" w:hAnsi="Times New Roman" w:eastAsia="Times New Roman"/>
+          <w:b w:val="0"/>
+          <w:i w:val="0"/>
+          <w:sz w:val="26"/>
+        </w:rPr>
+        <w:t xml:space="preserve">Chính phủ Việt Nam, "Nghị định 147/2024/NĐ-CP về Giao dịch Điện tử," 2024. [Online]. Available: </w:t>
       </w:r>
       <w:r>
         <w:rPr>
@@ -30178,7 +31339,7 @@
           <w:sz w:val="26"/>
           <w:u w:val="single"/>
         </w:rPr>
-        <w:t>https://replicate.com/stability-ai/sdxl</w:t>
+        <w:t>https://thuvienphapluat.vn/van-ban/Cong-nghe-thong-tin/Nghi-dinh-147-2024-ND-CP</w:t>
       </w:r>
       <w:r>
         <w:rPr>
@@ -30203,16 +31364,34 @@
           <w:i w:val="0"/>
           <w:sz w:val="26"/>
         </w:rPr>
-        <w:t xml:space="preserve">[34] </w:t>
-      </w:r>
-      <w:r>
-        <w:rPr>
-          <w:rFonts w:ascii="Times New Roman" w:hAnsi="Times New Roman" w:eastAsia="Times New Roman"/>
-          <w:b w:val="0"/>
-          <w:i w:val="0"/>
-          <w:sz w:val="26"/>
-        </w:rPr>
-        <w:t xml:space="preserve">Chính phủ Việt Nam, "Nghị định 147/2024/NĐ-CP về Giao dịch Điện tử," 2024. [Online]. Available: </w:t>
+        <w:t xml:space="preserve">[35] </w:t>
+      </w:r>
+      <w:r>
+        <w:rPr>
+          <w:rFonts w:ascii="Times New Roman" w:hAnsi="Times New Roman" w:eastAsia="Times New Roman"/>
+          <w:b w:val="0"/>
+          <w:i w:val="0"/>
+          <w:sz w:val="26"/>
+        </w:rPr>
+        <w:t xml:space="preserve">N. T. Phuong and L. H. Anh, "Compliance Frameworks for Software-as-a-Service in Southeast Asia: A Case Study of Vietnam's Personal Data Protection Law," </w:t>
+      </w:r>
+      <w:r>
+        <w:rPr>
+          <w:rFonts w:ascii="Times New Roman" w:hAnsi="Times New Roman" w:eastAsia="Times New Roman"/>
+          <w:b w:val="0"/>
+          <w:i/>
+          <w:sz w:val="26"/>
+        </w:rPr>
+        <w:t>Journal of Information Systems and Management</w:t>
+      </w:r>
+      <w:r>
+        <w:rPr>
+          <w:rFonts w:ascii="Times New Roman" w:hAnsi="Times New Roman" w:eastAsia="Times New Roman"/>
+          <w:b w:val="0"/>
+          <w:i w:val="0"/>
+          <w:sz w:val="26"/>
+        </w:rPr>
+        <w:t xml:space="preserve">, vol. 15, no. 2, pp. 45-67, 2024. [Online]. Available: </w:t>
       </w:r>
       <w:r>
         <w:rPr>
@@ -30223,7 +31402,7 @@
           <w:sz w:val="26"/>
           <w:u w:val="single"/>
         </w:rPr>
-        <w:t>https://thuvienphapluat.vn/van-ban/Cong-nghe-thong-tin/Nghi-dinh-147-2024-ND-CP</w:t>
+        <w:t>https://doi.org/10.1080/ijsm.2024.15.2.45</w:t>
       </w:r>
       <w:r>
         <w:rPr>
@@ -30248,16 +31427,16 @@
           <w:i w:val="0"/>
           <w:sz w:val="26"/>
         </w:rPr>
-        <w:t xml:space="preserve">[35] </w:t>
-      </w:r>
-      <w:r>
-        <w:rPr>
-          <w:rFonts w:ascii="Times New Roman" w:hAnsi="Times New Roman" w:eastAsia="Times New Roman"/>
-          <w:b w:val="0"/>
-          <w:i w:val="0"/>
-          <w:sz w:val="26"/>
-        </w:rPr>
-        <w:t xml:space="preserve">N. T. Phuong and L. H. Anh, "Compliance Frameworks for Software-as-a-Service in Southeast Asia: A Case Study of Vietnam's Personal Data Protection Law," </w:t>
+        <w:t xml:space="preserve">[36] </w:t>
+      </w:r>
+      <w:r>
+        <w:rPr>
+          <w:rFonts w:ascii="Times New Roman" w:hAnsi="Times New Roman" w:eastAsia="Times New Roman"/>
+          <w:b w:val="0"/>
+          <w:i w:val="0"/>
+          <w:sz w:val="26"/>
+        </w:rPr>
+        <w:t xml:space="preserve">J. Tyree and A. Akerman, "Architecture Decisions: Demystifying Architecture," </w:t>
       </w:r>
       <w:r>
         <w:rPr>
@@ -30266,16 +31445,16 @@
           <w:i/>
           <w:sz w:val="26"/>
         </w:rPr>
-        <w:t>Journal of Information Systems and Management</w:t>
-      </w:r>
-      <w:r>
-        <w:rPr>
-          <w:rFonts w:ascii="Times New Roman" w:hAnsi="Times New Roman" w:eastAsia="Times New Roman"/>
-          <w:b w:val="0"/>
-          <w:i w:val="0"/>
-          <w:sz w:val="26"/>
-        </w:rPr>
-        <w:t xml:space="preserve">, vol. 15, no. 2, pp. 45-67, 2024. [Online]. Available: </w:t>
+        <w:t>IEEE Software</w:t>
+      </w:r>
+      <w:r>
+        <w:rPr>
+          <w:rFonts w:ascii="Times New Roman" w:hAnsi="Times New Roman" w:eastAsia="Times New Roman"/>
+          <w:b w:val="0"/>
+          <w:i w:val="0"/>
+          <w:sz w:val="26"/>
+        </w:rPr>
+        <w:t xml:space="preserve">, vol. 22, no. 2, pp. 19-27, Mar.-Apr. 2005. [Online]. Available: </w:t>
       </w:r>
       <w:r>
         <w:rPr>
@@ -30286,16 +31465,16 @@
           <w:sz w:val="26"/>
           <w:u w:val="single"/>
         </w:rPr>
-        <w:t>https://doi.org/10.1080/ijsm.2024.15.2.45</w:t>
-      </w:r>
-      <w:r>
-        <w:rPr>
-          <w:rFonts w:ascii="Times New Roman" w:hAnsi="Times New Roman" w:eastAsia="Times New Roman"/>
-          <w:b w:val="0"/>
-          <w:i w:val="0"/>
-          <w:sz w:val="26"/>
-        </w:rPr>
-        <w:t>. [Accessed 2026-05-19].</w:t>
+        <w:t>https://doi.org/10.1109/MS.2005.27</w:t>
+      </w:r>
+      <w:r>
+        <w:rPr>
+          <w:rFonts w:ascii="Times New Roman" w:hAnsi="Times New Roman" w:eastAsia="Times New Roman"/>
+          <w:b w:val="0"/>
+          <w:i w:val="0"/>
+          <w:sz w:val="26"/>
+        </w:rPr>
+        <w:t>.</w:t>
       </w:r>
     </w:p>
     <w:p>
@@ -30311,34 +31490,16 @@
           <w:i w:val="0"/>
           <w:sz w:val="26"/>
         </w:rPr>
-        <w:t xml:space="preserve">[36] </w:t>
-      </w:r>
-      <w:r>
-        <w:rPr>
-          <w:rFonts w:ascii="Times New Roman" w:hAnsi="Times New Roman" w:eastAsia="Times New Roman"/>
-          <w:b w:val="0"/>
-          <w:i w:val="0"/>
-          <w:sz w:val="26"/>
-        </w:rPr>
-        <w:t xml:space="preserve">J. Tyree and A. Akerman, "Architecture Decisions: Demystifying Architecture," </w:t>
-      </w:r>
-      <w:r>
-        <w:rPr>
-          <w:rFonts w:ascii="Times New Roman" w:hAnsi="Times New Roman" w:eastAsia="Times New Roman"/>
-          <w:b w:val="0"/>
-          <w:i/>
-          <w:sz w:val="26"/>
-        </w:rPr>
-        <w:t>IEEE Software</w:t>
-      </w:r>
-      <w:r>
-        <w:rPr>
-          <w:rFonts w:ascii="Times New Roman" w:hAnsi="Times New Roman" w:eastAsia="Times New Roman"/>
-          <w:b w:val="0"/>
-          <w:i w:val="0"/>
-          <w:sz w:val="26"/>
-        </w:rPr>
-        <w:t xml:space="preserve">, vol. 22, no. 2, pp. 19-27, Mar.-Apr. 2005. [Online]. Available: </w:t>
+        <w:t xml:space="preserve">[37] </w:t>
+      </w:r>
+      <w:r>
+        <w:rPr>
+          <w:rFonts w:ascii="Times New Roman" w:hAnsi="Times New Roman" w:eastAsia="Times New Roman"/>
+          <w:b w:val="0"/>
+          <w:i w:val="0"/>
+          <w:sz w:val="26"/>
+        </w:rPr>
+        <w:t xml:space="preserve">D. Sato, B. Tabaka, S. Cromwell, and D. Diaz, "Continuous Delivery: Principles and Implementation Patterns," IEEE/ACM 42nd International Conference on Software Engineering (ICSE), pp. 178-189, 2020. [Online]. Available: </w:t>
       </w:r>
       <w:r>
         <w:rPr>
@@ -30349,7 +31510,7 @@
           <w:sz w:val="26"/>
           <w:u w:val="single"/>
         </w:rPr>
-        <w:t>https://doi.org/10.1109/MS.2005.27</w:t>
+        <w:t>https://doi.org/10.1145/3377812.3382164</w:t>
       </w:r>
       <w:r>
         <w:rPr>
@@ -30374,36 +31535,34 @@
           <w:i w:val="0"/>
           <w:sz w:val="26"/>
         </w:rPr>
-        <w:t xml:space="preserve">[37] </w:t>
-      </w:r>
-      <w:r>
-        <w:rPr>
-          <w:rFonts w:ascii="Times New Roman" w:hAnsi="Times New Roman" w:eastAsia="Times New Roman"/>
-          <w:b w:val="0"/>
-          <w:i w:val="0"/>
-          <w:sz w:val="26"/>
-        </w:rPr>
-        <w:t xml:space="preserve">D. Sato, B. Tabaka, S. Cromwell, and D. Diaz, "Continuous Delivery: Principles and Implementation Patterns," IEEE/ACM 42nd International Conference on Software Engineering (ICSE), pp. 178-189, 2020. [Online]. Available: </w:t>
-      </w:r>
-      <w:r>
-        <w:rPr>
-          <w:rFonts w:ascii="Times New Roman" w:hAnsi="Times New Roman" w:eastAsia="Times New Roman"/>
-          <w:b w:val="0"/>
-          <w:i w:val="0"/>
-          <w:color w:val="0000FF"/>
-          <w:sz w:val="26"/>
-          <w:u w:val="single"/>
-        </w:rPr>
-        <w:t>https://doi.org/10.1145/3377812.3382164</w:t>
-      </w:r>
-      <w:r>
-        <w:rPr>
-          <w:rFonts w:ascii="Times New Roman" w:hAnsi="Times New Roman" w:eastAsia="Times New Roman"/>
-          <w:b w:val="0"/>
-          <w:i w:val="0"/>
-          <w:sz w:val="26"/>
-        </w:rPr>
-        <w:t>.</w:t>
+        <w:t xml:space="preserve">[38] </w:t>
+      </w:r>
+      <w:r>
+        <w:rPr>
+          <w:rFonts w:ascii="Times New Roman" w:hAnsi="Times New Roman" w:eastAsia="Times New Roman"/>
+          <w:b w:val="0"/>
+          <w:i w:val="0"/>
+          <w:sz w:val="26"/>
+        </w:rPr>
+        <w:t xml:space="preserve">N. Forsgren, J. Humble, and G. Kim, </w:t>
+      </w:r>
+      <w:r>
+        <w:rPr>
+          <w:rFonts w:ascii="Times New Roman" w:hAnsi="Times New Roman" w:eastAsia="Times New Roman"/>
+          <w:b w:val="0"/>
+          <w:i/>
+          <w:sz w:val="26"/>
+        </w:rPr>
+        <w:t>Accelerate: The Science of Lean Software and DevOps — Building and Scaling High Performing Technology Organizations</w:t>
+      </w:r>
+      <w:r>
+        <w:rPr>
+          <w:rFonts w:ascii="Times New Roman" w:hAnsi="Times New Roman" w:eastAsia="Times New Roman"/>
+          <w:b w:val="0"/>
+          <w:i w:val="0"/>
+          <w:sz w:val="26"/>
+        </w:rPr>
+        <w:t>. Portland: IT Revolution Press, 2018.</w:t>
       </w:r>
     </w:p>
     <w:p>
@@ -30419,16 +31578,61 @@
           <w:i w:val="0"/>
           <w:sz w:val="26"/>
         </w:rPr>
-        <w:t xml:space="preserve">[38] </w:t>
-      </w:r>
-      <w:r>
-        <w:rPr>
-          <w:rFonts w:ascii="Times New Roman" w:hAnsi="Times New Roman" w:eastAsia="Times New Roman"/>
-          <w:b w:val="0"/>
-          <w:i w:val="0"/>
-          <w:sz w:val="26"/>
-        </w:rPr>
-        <w:t xml:space="preserve">N. Forsgren, J. Humble, and G. Kim, </w:t>
+        <w:t xml:space="preserve">[39] </w:t>
+      </w:r>
+      <w:r>
+        <w:rPr>
+          <w:rFonts w:ascii="Times New Roman" w:hAnsi="Times New Roman" w:eastAsia="Times New Roman"/>
+          <w:b w:val="0"/>
+          <w:i w:val="0"/>
+          <w:sz w:val="26"/>
+        </w:rPr>
+        <w:t xml:space="preserve">BeeClass, "BeeClass — Ứng dụng quản lý điểm thi đua của học sinh (Lớp học Hạnh phúc)," 2024. [Online]. Available: </w:t>
+      </w:r>
+      <w:r>
+        <w:rPr>
+          <w:rFonts w:ascii="Times New Roman" w:hAnsi="Times New Roman" w:eastAsia="Times New Roman"/>
+          <w:b w:val="0"/>
+          <w:i w:val="0"/>
+          <w:color w:val="0000FF"/>
+          <w:sz w:val="26"/>
+          <w:u w:val="single"/>
+        </w:rPr>
+        <w:t>https://beeclass.net/</w:t>
+      </w:r>
+      <w:r>
+        <w:rPr>
+          <w:rFonts w:ascii="Times New Roman" w:hAnsi="Times New Roman" w:eastAsia="Times New Roman"/>
+          <w:b w:val="0"/>
+          <w:i w:val="0"/>
+          <w:sz w:val="26"/>
+        </w:rPr>
+        <w:t>. [Accessed 2026-05-30].</w:t>
+      </w:r>
+    </w:p>
+    <w:p>
+      <w:pPr>
+        <w:spacing w:after="120" w:line="276" w:lineRule="auto"/>
+        <w:ind w:left="357" w:hanging="357"/>
+        <w:jc w:val="both"/>
+      </w:pPr>
+      <w:r>
+        <w:rPr>
+          <w:rFonts w:ascii="Times New Roman" w:hAnsi="Times New Roman" w:eastAsia="Times New Roman"/>
+          <w:b w:val="0"/>
+          <w:i w:val="0"/>
+          <w:sz w:val="26"/>
+        </w:rPr>
+        <w:t xml:space="preserve">[40] </w:t>
+      </w:r>
+      <w:r>
+        <w:rPr>
+          <w:rFonts w:ascii="Times New Roman" w:hAnsi="Times New Roman" w:eastAsia="Times New Roman"/>
+          <w:b w:val="0"/>
+          <w:i w:val="0"/>
+          <w:sz w:val="26"/>
+        </w:rPr>
+        <w:t xml:space="preserve">M. Cohn, </w:t>
       </w:r>
       <w:r>
         <w:rPr>
@@ -30437,16 +31641,61 @@
           <w:i/>
           <w:sz w:val="26"/>
         </w:rPr>
-        <w:t>Accelerate: The Science of Lean Software and DevOps — Building and Scaling High Performing Technology Organizations</w:t>
-      </w:r>
-      <w:r>
-        <w:rPr>
-          <w:rFonts w:ascii="Times New Roman" w:hAnsi="Times New Roman" w:eastAsia="Times New Roman"/>
-          <w:b w:val="0"/>
-          <w:i w:val="0"/>
-          <w:sz w:val="26"/>
-        </w:rPr>
-        <w:t>. Portland: IT Revolution Press, 2018.</w:t>
+        <w:t>Succeeding with Agile: Software Development Using Scrum</w:t>
+      </w:r>
+      <w:r>
+        <w:rPr>
+          <w:rFonts w:ascii="Times New Roman" w:hAnsi="Times New Roman" w:eastAsia="Times New Roman"/>
+          <w:b w:val="0"/>
+          <w:i w:val="0"/>
+          <w:sz w:val="26"/>
+        </w:rPr>
+        <w:t>. Upper Saddle River, NJ: Addison-Wesley, 2009.</w:t>
+      </w:r>
+    </w:p>
+    <w:p>
+      <w:pPr>
+        <w:spacing w:after="120" w:line="276" w:lineRule="auto"/>
+        <w:ind w:left="357" w:hanging="357"/>
+        <w:jc w:val="both"/>
+      </w:pPr>
+      <w:r>
+        <w:rPr>
+          <w:rFonts w:ascii="Times New Roman" w:hAnsi="Times New Roman" w:eastAsia="Times New Roman"/>
+          <w:b w:val="0"/>
+          <w:i w:val="0"/>
+          <w:sz w:val="26"/>
+        </w:rPr>
+        <w:t xml:space="preserve">[41] </w:t>
+      </w:r>
+      <w:r>
+        <w:rPr>
+          <w:rFonts w:ascii="Times New Roman" w:hAnsi="Times New Roman" w:eastAsia="Times New Roman"/>
+          <w:b w:val="0"/>
+          <w:i w:val="0"/>
+          <w:sz w:val="26"/>
+        </w:rPr>
+        <w:t xml:space="preserve">Amazon Web Services, "Amazon Compute Service Level Agreement (EC2 &amp; RDS)," 2024. [Online]. Available: </w:t>
+      </w:r>
+      <w:r>
+        <w:rPr>
+          <w:rFonts w:ascii="Times New Roman" w:hAnsi="Times New Roman" w:eastAsia="Times New Roman"/>
+          <w:b w:val="0"/>
+          <w:i w:val="0"/>
+          <w:color w:val="0000FF"/>
+          <w:sz w:val="26"/>
+          <w:u w:val="single"/>
+        </w:rPr>
+        <w:t>https://aws.amazon.com/compute/sla/</w:t>
+      </w:r>
+      <w:r>
+        <w:rPr>
+          <w:rFonts w:ascii="Times New Roman" w:hAnsi="Times New Roman" w:eastAsia="Times New Roman"/>
+          <w:b w:val="0"/>
+          <w:i w:val="0"/>
+          <w:sz w:val="26"/>
+        </w:rPr>
+        <w:t>. [Accessed 2026-05-30].</w:t>
       </w:r>
     </w:p>
     <w:sectPr>

</xml_diff>

<commit_message>
fix(thesis): Ch.1 correct multi-tenant claim — Silo/Bridge mischaracterization → Pool model (shared DB + tenant_id + RLS) khớp kiến trúc thật + Ch.2 (wave-thesis-4)
</commit_message>
<xml_diff>
--- a/documents/08-thesis/thesis-v1.docx
+++ b/documents/08-thesis/thesis-v1.docx
@@ -6558,7 +6558,25 @@
           <w:i w:val="0"/>
           <w:sz w:val="26"/>
         </w:rPr>
-        <w:t xml:space="preserve"> cả năm hệ thống tham khảo đều triển khai theo mô hình đơn tenant — mỗi khách hàng tương ứng một instance cơ sở dữ liệu riêng. Khi trung tâm mở rộng lên năm chi nhánh trở lên, chủ sở hữu trung tâm phải cấp phát thêm instance, đồng bộ dữ liệu thủ công và sao chép cấu hình. Hệ thống đề xuất sử dụng kiến trúc đa tenant nguyên bản với cô lập ở mức cơ sở dữ liệu (mỗi tenant một schema riêng), cho phép một trung tâm có 100 chi nhánh trên cùng một instance, tiết kiệm khoảng 80% chi phí hạ tầng khi mở rộng.</w:t>
+        <w:t xml:space="preserve"> cả năm hệ thống tham khảo đều triển khai theo mô hình đơn tenant — mỗi khách hàng tương ứng một instance cơ sở dữ liệu riêng. Khi trung tâm mở rộng lên năm chi nhánh trở lên, chủ sở hữu trung tâm phải cấp phát thêm instance, đồng bộ dữ liệu thủ công và sao chép cấu hình. Hệ thống đề xuất sử dụng kiến trúc đa tenant nguyên bản theo mô hình Pool (mô hình hồ chứa dùng chung) của khung tham chiếu AWS Well-Architected SaaS Lens: một cơ sở dữ liệu dùng chung, một schema dùng chung, mỗi bảng nghiệp vụ mang cột định danh tenant (</w:t>
+      </w:r>
+      <w:r>
+        <w:rPr>
+          <w:rFonts w:ascii="Times New Roman" w:hAnsi="Times New Roman" w:eastAsia="Times New Roman"/>
+          <w:b w:val="0"/>
+          <w:i/>
+          <w:sz w:val="26"/>
+        </w:rPr>
+        <w:t>tenant_id</w:t>
+      </w:r>
+      <w:r>
+        <w:rPr>
+          <w:rFonts w:ascii="Times New Roman" w:hAnsi="Times New Roman" w:eastAsia="Times New Roman"/>
+          <w:b w:val="0"/>
+          <w:i w:val="0"/>
+          <w:sz w:val="26"/>
+        </w:rPr>
+        <w:t>) và cơ chế Row-Level Security (RLS, bảo mật ở mức dòng) của PostgreSQL tự động lọc dữ liệu theo từng tenant ngay tại tầng cơ sở dữ liệu. Nhờ chia sẻ một instance cơ sở dữ liệu duy nhất, một trung tâm có thể vận hành nhiều chi nhánh mà không phải cấp phát thêm hạ tầng cho mỗi chi nhánh, qua đó tiết kiệm đáng kể chi phí hạ tầng khi mở rộng so với mô hình đơn tenant của các hệ thống tham khảo.</w:t>
       </w:r>
     </w:p>
     <w:p>

</xml_diff>

<commit_message>
fix(thesis): Ch.1 soften PDPL 'built-in' → privacy-by-design + Decree 53 bản địa hóa roadmap (AWS Singapore gap, defense-safe per C9) (wave-thesis-4)
</commit_message>
<xml_diff>
--- a/documents/08-thesis/thesis-v1.docx
+++ b/documents/08-thesis/thesis-v1.docx
@@ -6617,16 +6617,16 @@
           <w:i/>
           <w:sz w:val="26"/>
         </w:rPr>
-        <w:t>Thứ ba, tuân thủ pháp luật Việt Nam built-in:</w:t>
-      </w:r>
-      <w:r>
-        <w:rPr>
-          <w:rFonts w:ascii="Times New Roman" w:hAnsi="Times New Roman" w:eastAsia="Times New Roman"/>
-          <w:b w:val="0"/>
-          <w:i w:val="0"/>
-          <w:sz w:val="26"/>
-        </w:rPr>
-        <w:t xml:space="preserve"> Luật Bảo vệ Dữ liệu Cá nhân năm 2023 (PDPL, thời hạn áp dụng 2026-07-01) [9], Luật An ninh mạng 2018 [10] và Nghị định 53/2022/NĐ-CP về bản địa hóa dữ liệu [11] là ba yêu cầu tuân thủ quan trọng cho mọi SaaS xử lý dữ liệu cá nhân tại Việt Nam. Hệ thống đề xuất tích hợp tuân thủ ngay từ thiết kế ban đầu thay vì bổ sung sau. Trong khi đó, Mona eLMS, Easy Edu và BeeClass đang trong quá trình triển khai PDPL; DotB có sẵn nhưng mức giá cao.</w:t>
+        <w:t>Thứ ba, tuân thủ pháp luật Việt Nam theo thiết kế:</w:t>
+      </w:r>
+      <w:r>
+        <w:rPr>
+          <w:rFonts w:ascii="Times New Roman" w:hAnsi="Times New Roman" w:eastAsia="Times New Roman"/>
+          <w:b w:val="0"/>
+          <w:i w:val="0"/>
+          <w:sz w:val="26"/>
+        </w:rPr>
+        <w:t xml:space="preserve"> Luật Bảo vệ Dữ liệu Cá nhân năm 2023 (PDPL, thời hạn áp dụng 2026-07-01) [9], Luật An ninh mạng 2018 [10] và Nghị định 53/2022/NĐ-CP về bản địa hóa dữ liệu [11] là ba yêu cầu tuân thủ quan trọng cho mọi SaaS xử lý dữ liệu cá nhân tại Việt Nam. Hệ thống đề xuất tiếp cận theo nguyên tắc bảo mật và quyền riêng tư theo thiết kế (privacy-by-design), tích hợp các biện pháp tuân thủ ngay từ kiến trúc ban đầu: cô lập dữ liệu giữa các tenant bằng Row-Level Security, nhật ký kiểm toán bất biến phục vụ truy vết dữ liệu cá nhân, và thu thập sự đồng ý của người dùng ngay tại luồng đăng ký. Ở giai đoạn hiện tại, hệ thống vận hành trên hạ tầng AWS khu vực Singapore do ràng buộc chi phí; lộ trình phát triển sau bao gồm bản địa hóa dữ liệu sang vùng AWS Hà Nội hoặc nhà cung cấp đám mây trong nước nhằm đáp ứng đầy đủ Nghị định 53/2022/NĐ-CP trước khi mở rộng tới quy mô kích hoạt ngưỡng bản địa hóa dữ liệu. Trong khi đó, Mona eLMS, Easy Edu và BeeClass đang trong quá trình triển khai PDPL; DotB có sẵn nhưng mức giá cao.</w:t>
       </w:r>
     </w:p>
     <w:p>

</xml_diff>

<commit_message>
fix(thesis): Ch.1 comparison table PDPL row sync — built-in/Có-từ-ngày-đầu → theo thiết kế/lộ trình bản địa hóa khớp prose softened (wave-thesis-4)
</commit_message>
<xml_diff>
--- a/documents/08-thesis/thesis-v1.docx
+++ b/documents/08-thesis/thesis-v1.docx
@@ -6090,7 +6090,7 @@
                 <w:i w:val="0"/>
                 <w:sz w:val="24"/>
               </w:rPr>
-              <w:t>Tuân thủ PDPL 2023 built-in</w:t>
+              <w:t>Tuân thủ PDPL 2023 theo thiết kế</w:t>
             </w:r>
           </w:p>
         </w:tc>
@@ -6195,7 +6195,7 @@
                 <w:i w:val="0"/>
                 <w:sz w:val="24"/>
               </w:rPr>
-              <w:t>Có (từ ngày đầu)</w:t>
+              <w:t>Theo thiết kế (lộ trình bản địa hóa)</w:t>
             </w:r>
           </w:p>
         </w:tc>

</xml_diff>

<commit_message>
fix(thesis): Ch.4 phương hướng phát triển — strip 'Giai đoạn vận hành chính thức/mở rộng' phase nomenclature → topic-based roadmap (thesis-binary-time-concept §3/§5) (wave-thesis-4)
</commit_message>
<xml_diff>
--- a/documents/08-thesis/thesis-v1.docx
+++ b/documents/08-thesis/thesis-v1.docx
@@ -29783,7 +29783,7 @@
           <w:i w:val="0"/>
           <w:sz w:val="26"/>
         </w:rPr>
-        <w:t>Giai đoạn vận hành chính thức: kiến trúc đa-region (Singapore + Hà Nội data localization Việt Nam theo Nghị định 53/2022), AI Quality Gate phiên bản nâng cao với multi-vendor failover, mobile app native iOS + Android.</w:t>
+        <w:t>Về hạ tầng và bảo mật: kiến trúc đa vùng (Singapore kết hợp Hà Nội để bản địa hóa dữ liệu theo Nghị định 53/2022), nâng cấp AI Quality Gate với cơ chế dự phòng đa nhà cung cấp (multi-vendor failover), và ứng dụng di động native trên iOS và Android.</w:t>
       </w:r>
     </w:p>
     <w:p>
@@ -29799,7 +29799,7 @@
           <w:i w:val="0"/>
           <w:sz w:val="26"/>
         </w:rPr>
-        <w:t>Giai đoạn mở rộng K-12: mở rộng sang persona trường công lập với DPO chính thức + DPIA cho dữ liệu trẻ em theo Luật Bảo vệ Dữ liệu Cá nhân Điều 26.</w:t>
+        <w:t>Về mở rộng thị trường: hướng tới khối trường công lập K-12, kèm theo việc bổ nhiệm cán bộ bảo vệ dữ liệu (DPO) chính thức và thực hiện đánh giá tác động bảo vệ dữ liệu (DPIA) cho dữ liệu trẻ em theo Điều 26 Luật Bảo vệ Dữ liệu Cá nhân.</w:t>
       </w:r>
     </w:p>
     <w:p>

</xml_diff>

<commit_message>
fix(thesis): Ch.1 soften AI Branding numbers (S4) + lược bỏ đoạn Rủi ro chính + 2 đoạn roadmap/MVP (trùng Ch.4) + rename §1.3.2/§1.3.3 heading khớp nội dung còn lại (wave-thesis-4)
</commit_message>
<xml_diff>
--- a/documents/08-thesis/thesis-v1.docx
+++ b/documents/08-thesis/thesis-v1.docx
@@ -6601,7 +6601,7 @@
           <w:i w:val="0"/>
           <w:sz w:val="26"/>
         </w:rPr>
-        <w:t xml:space="preserve"> chủ sở hữu trung tâm mới khai trương thường tốn 2-5 triệu đồng thuê thiết kế viên cho logo, banner và hero image marketing. AI Branding của hệ thống đề xuất tự động sinh các tài nguyên này từ prompt văn bản và màu thương hiệu, giảm thời gian sẵn sàng vận hành từ 1-2 tuần xuống còn vài giờ. Cả năm hệ thống tham khảo đều không có tính năng này.</w:t>
+        <w:t xml:space="preserve"> chủ sở hữu trung tâm mới khai trương thường phải thuê thiết kế viên cho logo, banner và hero image marketing — một khoản chi phí và khoảng thời gian chờ đáng kể trước khi sẵn sàng vận hành. AI Branding của hệ thống đề xuất tự động sinh các tài nguyên này từ prompt văn bản và màu thương hiệu, qua đó rút ngắn đáng kể thời gian lẫn chi phí chuẩn bị nhận diện thương hiệu so với quy trình thuê ngoài. Cả năm hệ thống tham khảo đều không có tính năng này.</w:t>
       </w:r>
     </w:p>
     <w:p>
@@ -6701,7 +6701,7 @@
           <w:color w:val="000000"/>
           <w:sz w:val="28"/>
         </w:rPr>
-        <w:t>1.3.2 Cơ hội và rủi ro chiến lược</w:t>
+        <w:t>1.3.2 Cơ hội chiến lược</w:t>
       </w:r>
     </w:p>
     <w:p>
@@ -6731,6 +6731,20 @@
     </w:p>
     <w:p>
       <w:pPr>
+        <w:pStyle w:val="Heading3"/>
+      </w:pPr>
+      <w:r>
+        <w:rPr>
+          <w:rFonts w:ascii="Times New Roman" w:hAnsi="Times New Roman" w:eastAsia="Times New Roman"/>
+          <w:b/>
+          <w:color w:val="000000"/>
+          <w:sz w:val="28"/>
+        </w:rPr>
+        <w:t>1.3.3 Phạm vi đề tài</w:t>
+      </w:r>
+    </w:p>
+    <w:p>
+      <w:pPr>
         <w:spacing w:line="288" w:lineRule="auto"/>
         <w:ind w:firstLine="567"/>
         <w:jc w:val="both"/>
@@ -6739,81 +6753,10 @@
         <w:rPr>
           <w:rFonts w:ascii="Times New Roman" w:hAnsi="Times New Roman" w:eastAsia="Times New Roman"/>
           <w:b w:val="0"/>
-          <w:i/>
-          <w:sz w:val="26"/>
-        </w:rPr>
-        <w:t>Rủi ro chính:</w:t>
-      </w:r>
-      <w:r>
-        <w:rPr>
-          <w:rFonts w:ascii="Times New Roman" w:hAnsi="Times New Roman" w:eastAsia="Times New Roman"/>
-          <w:b w:val="0"/>
-          <w:i w:val="0"/>
-          <w:sz w:val="26"/>
-        </w:rPr>
-        <w:t xml:space="preserve"> việc lùi ứng dụng di động gốc sang lộ trình phát triển sau có rủi ro mất khách so với Mona eLMS và Easy Edu vốn đã có ứng dụng gốc — giải pháp giảm thiểu là giao diện web đáp ứng kết hợp kênh Zalo (OA và nhóm) đã được triển khai, ưu tiên ứng dụng di động gốc cho lộ trình phát triển sau. Cổng thanh toán cũng là điểm yếu khi DotB có sẵn ba cổng tích hợp — hệ thống đề xuất hiện tại sử dụng chuyển khoản ngân hàng kết hợp VietQR (không cần cổng), lộ trình phát triển sau bao gồm tích hợp cổng VNPay. Cuối cùng, nhận diện thương hiệu là rào cản khi Easy Edu và Mona eLMS có nhiều năm hiện diện thị trường trong khi hệ thống đề xuất mới ra mắt — giải pháp giảm thiểu là tiếp cận tăng trưởng dẫn dắt bởi sản phẩm, tiếp thị nội dung tiếng Việt và chương trình người dùng tiên phong với các trung tâm thử nghiệm.</w:t>
-      </w:r>
-    </w:p>
-    <w:p>
-      <w:pPr>
-        <w:pStyle w:val="Heading3"/>
-      </w:pPr>
-      <w:r>
-        <w:rPr>
-          <w:rFonts w:ascii="Times New Roman" w:hAnsi="Times New Roman" w:eastAsia="Times New Roman"/>
-          <w:b/>
-          <w:color w:val="000000"/>
-          <w:sz w:val="28"/>
-        </w:rPr>
-        <w:t>1.3.3 Phạm vi đề tài và lộ trình triển khai</w:t>
-      </w:r>
-    </w:p>
-    <w:p>
-      <w:pPr>
-        <w:spacing w:line="288" w:lineRule="auto"/>
-        <w:ind w:firstLine="567"/>
-        <w:jc w:val="both"/>
-      </w:pPr>
-      <w:r>
-        <w:rPr>
-          <w:rFonts w:ascii="Times New Roman" w:hAnsi="Times New Roman" w:eastAsia="Times New Roman"/>
-          <w:b w:val="0"/>
           <w:i w:val="0"/>
           <w:sz w:val="26"/>
         </w:rPr>
         <w:t>Phạm vi triển khai hiện tại của đề tài bao gồm vận hành thử với hai giáo viên độc lập (một dùng gói miễn phí, một dùng gói trả phí), tập trung kiểm chứng trình hướng dẫn khởi tạo tenant, mô-đun AI Branding, kiến trúc đa tenant và ngưỡng tuân thủ pháp lý cơ bản. Hệ thống thanh toán chuyển khoản qua VietQR kèm đối soát tự động đã được tích hợp; kênh thông báo Zalo OA đã kết nối phục vụ liên lạc với phụ huynh; hóa đơn điện tử (eInvoice) qua hợp tác với nhà cung cấp được Tổng cục Thuế cấp phép cũng đã có sẵn cho luồng phát hành.</w:t>
-      </w:r>
-    </w:p>
-    <w:p>
-      <w:pPr>
-        <w:spacing w:line="288" w:lineRule="auto"/>
-        <w:ind w:firstLine="567"/>
-        <w:jc w:val="both"/>
-      </w:pPr>
-      <w:r>
-        <w:rPr>
-          <w:rFonts w:ascii="Times New Roman" w:hAnsi="Times New Roman" w:eastAsia="Times New Roman"/>
-          <w:b w:val="0"/>
-          <w:i w:val="0"/>
-          <w:sz w:val="26"/>
-        </w:rPr>
-        <w:t>Lộ trình phát triển sau bao gồm các định hướng mở rộng cụ thể. Trước tiên, mở rộng nhóm tenant tham gia lên 30-50 trung tâm với chính sách thu phí giới thiệu thấp hơn giá niêm yết, mục đích chính là kiểm chứng mô hình giá ở quy mô lớn hơn. Tiếp theo, mở cho mọi trung tâm tự đăng ký không qua quy trình mời, đi kèm thỏa thuận mức dịch vụ (SLA — Service Level Agreement) cam kết thời gian hoạt động ≥99,5% và bổ sung kênh trò chuyện trực tuyến, ứng dụng di động gốc cho học viên và phụ huynh, đa cổng thanh toán tích hợp (VNPay, MoMo). Định hướng xa hơn là mở rộng sang khối phổ thông K-12 phục vụ trường công lập và tư thục cấp 1-2 với yêu cầu bổ nhiệm cán bộ bảo vệ dữ liệu (DPO — Data Protection Officer) chính thức, đánh giá tác động bảo vệ dữ liệu (DPIA — Data Protection Impact Assessment) cho dữ liệu trẻ em theo Luật Bảo vệ Dữ liệu Cá nhân Điều 17 và Điều 26, hợp tác với Bộ Giáo dục và Đào tạo cùng các sở phòng giáo dục địa phương cho phân phối.</w:t>
-      </w:r>
-    </w:p>
-    <w:p>
-      <w:pPr>
-        <w:spacing w:line="288" w:lineRule="auto"/>
-        <w:ind w:firstLine="567"/>
-        <w:jc w:val="both"/>
-      </w:pPr>
-      <w:r>
-        <w:rPr>
-          <w:rFonts w:ascii="Times New Roman" w:hAnsi="Times New Roman" w:eastAsia="Times New Roman"/>
-          <w:b w:val="0"/>
-          <w:i w:val="0"/>
-          <w:sz w:val="26"/>
-        </w:rPr>
-        <w:t>Việc tách phạm vi triển khai hiện tại khỏi lộ trình phát triển sau phù hợp với phương pháp luận sản phẩm tối giản khả thi (MVP — Minimum Viable Product) trong khởi nghiệp phần mềm — phát hành sản phẩm tối giản đáp ứng nhu cầu cốt lõi của nhóm người dùng đại diện ưu tiên trước, sau đó mở rộng dần các tính năng nâng cao theo phản hồi thị trường.</w:t>
       </w:r>
     </w:p>
     <w:p>

</xml_diff>

<commit_message>
fix(thesis): wave-thesis-4 cleanup batch — move §3.1 Công nghệ → Ch.1 §1.4 (+Ch.3 renumber 3.2→3.1/3.3→3.2) + trim Ch.2 §2.2.3 rubric/Bảng 2.5 (keep Pool conclusion, renumber 2.6-2.11→2.5-2.10) + remove §2.2/§2.3 TOC-nav + §2.x.x roadmap MISA paragraph (giữ tên chương)
</commit_message>
<xml_diff>
--- a/documents/08-thesis/thesis-v1.docx
+++ b/documents/08-thesis/thesis-v1.docx
@@ -6760,6 +6760,242 @@
       </w:r>
     </w:p>
     <w:p>
+      <w:pPr>
+        <w:pStyle w:val="Heading2"/>
+      </w:pPr>
+      <w:r>
+        <w:rPr>
+          <w:rFonts w:ascii="Times New Roman" w:hAnsi="Times New Roman" w:eastAsia="Times New Roman"/>
+          <w:b/>
+          <w:color w:val="000000"/>
+          <w:sz w:val="32"/>
+        </w:rPr>
+        <w:t>1.4 Công nghệ và công cụ sử dụng</w:t>
+      </w:r>
+    </w:p>
+    <w:p>
+      <w:pPr>
+        <w:pStyle w:val="Heading3"/>
+      </w:pPr>
+      <w:r>
+        <w:rPr>
+          <w:rFonts w:ascii="Times New Roman" w:hAnsi="Times New Roman" w:eastAsia="Times New Roman"/>
+          <w:b/>
+          <w:color w:val="000000"/>
+          <w:sz w:val="28"/>
+        </w:rPr>
+        <w:t>1.4.1 Ngôn ngữ lập trình</w:t>
+      </w:r>
+    </w:p>
+    <w:p>
+      <w:pPr>
+        <w:spacing w:line="288" w:lineRule="auto"/>
+        <w:ind w:firstLine="567"/>
+        <w:jc w:val="both"/>
+      </w:pPr>
+      <w:r>
+        <w:rPr>
+          <w:rFonts w:ascii="Times New Roman" w:hAnsi="Times New Roman" w:eastAsia="Times New Roman"/>
+          <w:b w:val="0"/>
+          <w:i w:val="0"/>
+          <w:sz w:val="26"/>
+        </w:rPr>
+        <w:t>Nền tảng KiteHub sử dụng hai ngôn ngữ lập trình chính. Phía backend dùng Java 21 (LTS) — phiên bản hỗ trợ dài hạn được Oracle cam kết bảo trì đến năm 2031, kèm các tính năng hiện đại như virtual threads (Project Loom), pattern matching và records giúp viết code an toàn kiểu và biểu cảm. Phía frontend dùng TypeScript 5.7 — bản mở rộng kiểu tĩnh của JavaScript, hỗ trợ phát hiện lỗi sớm tại compile-time, refactoring an toàn và tích hợp IDE mạnh. Ngôn ngữ truy vấn cơ sở dữ liệu sử dụng SQL chuẩn PostgreSQL 16 dialect, kết hợp JPQL/Hibernate cho các truy vấn ORM phổ biến.</w:t>
+      </w:r>
+    </w:p>
+    <w:p>
+      <w:pPr>
+        <w:pStyle w:val="Heading3"/>
+      </w:pPr>
+      <w:r>
+        <w:rPr>
+          <w:rFonts w:ascii="Times New Roman" w:hAnsi="Times New Roman" w:eastAsia="Times New Roman"/>
+          <w:b/>
+          <w:color w:val="000000"/>
+          <w:sz w:val="28"/>
+        </w:rPr>
+        <w:t>1.4.2 Framework phát triển</w:t>
+      </w:r>
+    </w:p>
+    <w:p>
+      <w:pPr>
+        <w:spacing w:line="288" w:lineRule="auto"/>
+        <w:ind w:firstLine="567"/>
+        <w:jc w:val="both"/>
+      </w:pPr>
+      <w:r>
+        <w:rPr>
+          <w:rFonts w:ascii="Times New Roman" w:hAnsi="Times New Roman" w:eastAsia="Times New Roman"/>
+          <w:b w:val="0"/>
+          <w:i w:val="0"/>
+          <w:sz w:val="26"/>
+        </w:rPr>
+        <w:t>Phía backend, Spring Boot 3.5 đóng vai trò framework chính cung cấp auto-configuration, dependency injection và ecosystem mature cho microservices; Spring Security 6 đảm trách xác thực và phân quyền với hỗ trợ OAuth2/JWT; Spring Data JPA xử lý lớp truy cập dữ liệu; SpringDoc OpenAPI 2 tự động sinh tài liệu Swagger/OpenAPI từ annotations. Phía frontend, Next.js 15 cung cấp App Router, Server Components, SSR/SSG và image optimization; React 19 là thư viện UI nền tảng với hooks và concurrent features; Tailwind CSS 3.4 + Shadcn UI cho hệ thống styling utility-first; TanStack Query 5 + Zustand 5 quản lý state phía client; React Hook Form 7 + Zod 3 xử lý form và validation kiểu schema-driven.</w:t>
+      </w:r>
+    </w:p>
+    <w:p>
+      <w:pPr>
+        <w:pStyle w:val="Heading3"/>
+      </w:pPr>
+      <w:r>
+        <w:rPr>
+          <w:rFonts w:ascii="Times New Roman" w:hAnsi="Times New Roman" w:eastAsia="Times New Roman"/>
+          <w:b/>
+          <w:color w:val="000000"/>
+          <w:sz w:val="28"/>
+        </w:rPr>
+        <w:t>1.4.3 Công cụ phát triển</w:t>
+      </w:r>
+    </w:p>
+    <w:p>
+      <w:pPr>
+        <w:spacing w:line="288" w:lineRule="auto"/>
+        <w:ind w:firstLine="567"/>
+        <w:jc w:val="both"/>
+      </w:pPr>
+      <w:r>
+        <w:rPr>
+          <w:rFonts w:ascii="Times New Roman" w:hAnsi="Times New Roman" w:eastAsia="Times New Roman"/>
+          <w:b w:val="0"/>
+          <w:i w:val="0"/>
+          <w:sz w:val="26"/>
+        </w:rPr>
+        <w:t>Mỗi lập trình viên làm việc với IntelliJ IDEA Ultimate hoặc VS Code (extension Spring Boot + Java) cho backend; VS Code (extension TypeScript + Tailwind CSS + ESLint + Prettier) cho frontend. Quản lý phụ thuộc dùng Apache Maven 3.9 cho Java và pnpm 9 cho Node.js (lựa chọn pnpm thay npm/yarn nhờ disk space efficient và workspace mature). Phiên bản hóa source code qua Git + GitHub repository, với pre-commit hooks (Husky 9) chạy lint + format trước commit. Quy trình review code thực hiện qua GitHub Pull Request với required checks. Lombok 1.18 và MapStruct 1.6 hỗ trợ giảm boilerplate Java và mapping DTO compile-time.</w:t>
+      </w:r>
+    </w:p>
+    <w:p>
+      <w:pPr>
+        <w:pStyle w:val="Heading3"/>
+      </w:pPr>
+      <w:r>
+        <w:rPr>
+          <w:rFonts w:ascii="Times New Roman" w:hAnsi="Times New Roman" w:eastAsia="Times New Roman"/>
+          <w:b/>
+          <w:color w:val="000000"/>
+          <w:sz w:val="28"/>
+        </w:rPr>
+        <w:t>1.4.4 Công cụ kiểm thử</w:t>
+      </w:r>
+    </w:p>
+    <w:p>
+      <w:pPr>
+        <w:spacing w:line="288" w:lineRule="auto"/>
+        <w:ind w:firstLine="567"/>
+        <w:jc w:val="both"/>
+      </w:pPr>
+      <w:r>
+        <w:rPr>
+          <w:rFonts w:ascii="Times New Roman" w:hAnsi="Times New Roman" w:eastAsia="Times New Roman"/>
+          <w:b w:val="0"/>
+          <w:i w:val="0"/>
+          <w:sz w:val="26"/>
+        </w:rPr>
+        <w:t xml:space="preserve">Unit test phía backend sử dụng JUnit 5 (Jupiter) + AssertJ cho assertions biểu cảm + Mockito 5 cho mock dependencies. Integration test dùng Testcontainers 1.20 (PostgreSQL + Redis container ephemeral) đảm bảo môi trường test cô lập, không phụ thuộc dev DB. Spring Boot Test framework cung cấp </w:t>
+      </w:r>
+      <w:r>
+        <w:rPr>
+          <w:rFonts w:ascii="Times New Roman" w:hAnsi="Times New Roman" w:eastAsia="Times New Roman"/>
+          <w:b w:val="0"/>
+          <w:i/>
+          <w:sz w:val="26"/>
+        </w:rPr>
+        <w:t>@SpringBootTest</w:t>
+      </w:r>
+      <w:r>
+        <w:rPr>
+          <w:rFonts w:ascii="Times New Roman" w:hAnsi="Times New Roman" w:eastAsia="Times New Roman"/>
+          <w:b w:val="0"/>
+          <w:i w:val="0"/>
+          <w:sz w:val="26"/>
+        </w:rPr>
+        <w:t xml:space="preserve">, </w:t>
+      </w:r>
+      <w:r>
+        <w:rPr>
+          <w:rFonts w:ascii="Times New Roman" w:hAnsi="Times New Roman" w:eastAsia="Times New Roman"/>
+          <w:b w:val="0"/>
+          <w:i/>
+          <w:sz w:val="26"/>
+        </w:rPr>
+        <w:t>@DataJpaTest</w:t>
+      </w:r>
+      <w:r>
+        <w:rPr>
+          <w:rFonts w:ascii="Times New Roman" w:hAnsi="Times New Roman" w:eastAsia="Times New Roman"/>
+          <w:b w:val="0"/>
+          <w:i w:val="0"/>
+          <w:sz w:val="26"/>
+        </w:rPr>
+        <w:t xml:space="preserve">, </w:t>
+      </w:r>
+      <w:r>
+        <w:rPr>
+          <w:rFonts w:ascii="Times New Roman" w:hAnsi="Times New Roman" w:eastAsia="Times New Roman"/>
+          <w:b w:val="0"/>
+          <w:i/>
+          <w:sz w:val="26"/>
+        </w:rPr>
+        <w:t>@WebMvcTest</w:t>
+      </w:r>
+      <w:r>
+        <w:rPr>
+          <w:rFonts w:ascii="Times New Roman" w:hAnsi="Times New Roman" w:eastAsia="Times New Roman"/>
+          <w:b w:val="0"/>
+          <w:i w:val="0"/>
+          <w:sz w:val="26"/>
+        </w:rPr>
+        <w:t xml:space="preserve"> cho các test slice phù hợp. Phía frontend, Vitest 1 + React Testing Library cho unit test component; Playwright 1 cho end-to-end test browser-automation. Mã được kiểm tra chất lượng bằng SonarQube static analysis và OWASP Dependency-Check tự động trong CI pipeline.</w:t>
+      </w:r>
+    </w:p>
+    <w:p>
+      <w:pPr>
+        <w:pStyle w:val="Heading3"/>
+      </w:pPr>
+      <w:r>
+        <w:rPr>
+          <w:rFonts w:ascii="Times New Roman" w:hAnsi="Times New Roman" w:eastAsia="Times New Roman"/>
+          <w:b/>
+          <w:color w:val="000000"/>
+          <w:sz w:val="28"/>
+        </w:rPr>
+        <w:t>1.4.5 Công cụ triển khai</w:t>
+      </w:r>
+    </w:p>
+    <w:p>
+      <w:pPr>
+        <w:spacing w:line="288" w:lineRule="auto"/>
+        <w:ind w:firstLine="567"/>
+        <w:jc w:val="both"/>
+      </w:pPr>
+      <w:r>
+        <w:rPr>
+          <w:rFonts w:ascii="Times New Roman" w:hAnsi="Times New Roman" w:eastAsia="Times New Roman"/>
+          <w:b w:val="0"/>
+          <w:i w:val="0"/>
+          <w:sz w:val="26"/>
+        </w:rPr>
+        <w:t xml:space="preserve">Hạ tầng được mô tả bằng code (Infrastructure as Code) qua Terraform 1.5+ cho AWS resources (EC2, RDS, S3, SES, IAM, CloudWatch). Container hóa qua Docker 24 + Docker Compose 2 cho môi trường phát triển cục bộ; production triển khai container qua AWS Elastic Container Service (ECS) với task definitions JSON. Pipeline CI/CD chạy trên GitHub Actions với matrix builds (Java 21 + Node 22), tự động build + test + push container image lên AWS Elastic Container Registry (ECR). Phía vận hành, AWS Systems Manager (SSM) cung cấp shell access không cần SSH key; AWS CloudWatch tập hợp logs + metrics; AWS CloudTrail audit mọi thao tác API trên tài khoản. Phía CDN, Cloudflare đứng trước domain </w:t>
+      </w:r>
+      <w:r>
+        <w:rPr>
+          <w:rFonts w:ascii="Times New Roman" w:hAnsi="Times New Roman" w:eastAsia="Times New Roman"/>
+          <w:b w:val="0"/>
+          <w:i/>
+          <w:sz w:val="26"/>
+        </w:rPr>
+        <w:t>kitehub.me</w:t>
+      </w:r>
+      <w:r>
+        <w:rPr>
+          <w:rFonts w:ascii="Times New Roman" w:hAnsi="Times New Roman" w:eastAsia="Times New Roman"/>
+          <w:b w:val="0"/>
+          <w:i w:val="0"/>
+          <w:sz w:val="26"/>
+        </w:rPr>
+        <w:t xml:space="preserve"> (DNS + WAF + DDoS protection layer). Migration cơ sở dữ liệu qua Flyway 10 (versioned schema changes, idempotent migrations).</w:t>
+      </w:r>
+    </w:p>
+    <w:p>
       <w:r>
         <w:br w:type="page"/>
       </w:r>
@@ -11579,7 +11815,7 @@
           <w:i w:val="0"/>
           <w:sz w:val="26"/>
         </w:rPr>
-        <w:t>Đồ án áp dụng C4 model (Context / Container / Component / Code) của Simon Brown — industry-standard cho cloud-native microservices architecture documentation, đã được sử dụng tại các SaaS provider lớn (Spotify, GitHub, Stripe). C4 model phù hợp hơn UML class diagram truyền thống cho hệ thống multi-tenant phân tán vì tập trung vào ranh giới container/component thay vì class-level details. Đồ án KẾT HỢP C4 với UML/ERD truyền thống (Booch et al. [29]) để đáp ứng cả tiêu chí kiến trúc hiện đại lẫn yêu cầu mô tả của khung-chuẩn đào tạo UTC: §2.2.1 và §2.2.2 trình bày C4 Level 1 và Level 2; §2.2.3 trình bày quyết định pattern đa tenant; §2.2.4 trình bày phòng thủ chiều sâu cô lập cơ sở dữ liệu; §2.2.5 trình bày quy trình xác thực với truyền ngữ cảnh tenant.</w:t>
+        <w:t>Đồ án áp dụng C4 model (Context / Container / Component / Code) của Simon Brown — industry-standard cho cloud-native microservices architecture documentation, đã được sử dụng tại các SaaS provider lớn (Spotify, GitHub, Stripe). C4 model phù hợp hơn UML class diagram truyền thống cho hệ thống multi-tenant phân tán vì tập trung vào ranh giới container/component thay vì class-level details.</w:t>
       </w:r>
     </w:p>
     <w:p>
@@ -13029,1424 +13265,6 @@
       <w:r>
         <w:rPr>
           <w:rFonts w:ascii="Times New Roman" w:hAnsi="Times New Roman" w:eastAsia="Times New Roman"/>
-          <w:b/>
-          <w:i w:val="0"/>
-          <w:sz w:val="26"/>
-        </w:rPr>
-        <w:t>Phương pháp chấm điểm.</w:t>
-      </w:r>
-      <w:r>
-        <w:rPr>
-          <w:rFonts w:ascii="Times New Roman" w:hAnsi="Times New Roman" w:eastAsia="Times New Roman"/>
-          <w:b w:val="0"/>
-          <w:i w:val="0"/>
-          <w:sz w:val="26"/>
-        </w:rPr>
-        <w:t xml:space="preserve"> Mỗi pattern được chấm thang 1-5 trên 6 trục — độ mạnh cô lập, chi phí vận hành theo số tenant, khả năng truy vấn xuyên tenant, độ phù hợp phạm vi SMB hiện tại, vị thế tuân thủ (PDPL + ISO27001) và chi phí chuyển đổi từ hiện trạng — tổng tối đa 30. Rubric xây dựng riêng cho ngữ cảnh trung tâm dạy thêm SMB, tham khảo phương pháp luận Pool/Bridge/Silo của AWS Well-Architected SaaS Lens [26, tr.21] và pattern comparison của Pothon [27], với trọng số ưu tiên chi phí (ràng buộc Free Tier) và độ đơn giản vận hành (mô hình solo-dev).</w:t>
-      </w:r>
-    </w:p>
-    <w:p>
-      <w:pPr>
-        <w:pStyle w:val="BảngCaption"/>
-        <w:spacing w:before="120" w:after="240"/>
-        <w:jc w:val="center"/>
-      </w:pPr>
-      <w:r>
-        <w:rPr>
-          <w:rFonts w:ascii="Times New Roman" w:hAnsi="Times New Roman" w:eastAsia="Times New Roman"/>
-          <w:b/>
-          <w:sz w:val="26"/>
-        </w:rPr>
-        <w:t>Bảng 2.5</w:t>
-      </w:r>
-      <w:r>
-        <w:rPr>
-          <w:rFonts w:ascii="Times New Roman" w:hAnsi="Times New Roman" w:eastAsia="Times New Roman"/>
-          <w:sz w:val="26"/>
-        </w:rPr>
-        <w:t>. Ma trận so sánh 6 pattern trên 6 trục (Pattern 4 đạt tổng 26/30 cho phạm vi hiện tại)</w:t>
-      </w:r>
-    </w:p>
-    <w:tbl>
-      <w:tblPr>
-        <w:tblStyle w:val="TableGrid"/>
-        <w:tblW w:type="auto" w:w="0"/>
-        <w:jc w:val="center"/>
-        <w:tblLook w:firstColumn="1" w:firstRow="1" w:lastColumn="0" w:lastRow="0" w:noHBand="0" w:noVBand="1" w:val="04A0"/>
-      </w:tblPr>
-      <w:tblGrid>
-        <w:gridCol w:w="1234"/>
-        <w:gridCol w:w="1234"/>
-        <w:gridCol w:w="1234"/>
-        <w:gridCol w:w="1234"/>
-        <w:gridCol w:w="1234"/>
-        <w:gridCol w:w="1234"/>
-        <w:gridCol w:w="1234"/>
-      </w:tblGrid>
-      <w:tr>
-        <w:tc>
-          <w:tcPr>
-            <w:tcW w:type="dxa" w:w="1234"/>
-          </w:tcPr>
-          <w:p>
-            <w:pPr>
-              <w:jc w:val="center"/>
-            </w:pPr>
-            <w:r>
-              <w:rPr>
-                <w:b/>
-                <w:sz w:val="24"/>
-              </w:rPr>
-            </w:r>
-            <w:r>
-              <w:rPr>
-                <w:rFonts w:ascii="Times New Roman" w:hAnsi="Times New Roman" w:eastAsia="Times New Roman"/>
-                <w:b/>
-                <w:i w:val="0"/>
-                <w:sz w:val="24"/>
-              </w:rPr>
-              <w:t>Trục đánh giá</w:t>
-            </w:r>
-          </w:p>
-        </w:tc>
-        <w:tc>
-          <w:tcPr>
-            <w:tcW w:type="dxa" w:w="1234"/>
-          </w:tcPr>
-          <w:p>
-            <w:pPr>
-              <w:jc w:val="center"/>
-            </w:pPr>
-            <w:r>
-              <w:rPr>
-                <w:b/>
-                <w:sz w:val="24"/>
-              </w:rPr>
-            </w:r>
-            <w:r>
-              <w:rPr>
-                <w:rFonts w:ascii="Times New Roman" w:hAnsi="Times New Roman" w:eastAsia="Times New Roman"/>
-                <w:b/>
-                <w:i w:val="0"/>
-                <w:sz w:val="24"/>
-              </w:rPr>
-              <w:t>P1 Per-DB</w:t>
-            </w:r>
-          </w:p>
-        </w:tc>
-        <w:tc>
-          <w:tcPr>
-            <w:tcW w:type="dxa" w:w="1234"/>
-          </w:tcPr>
-          <w:p>
-            <w:pPr>
-              <w:jc w:val="center"/>
-            </w:pPr>
-            <w:r>
-              <w:rPr>
-                <w:b/>
-                <w:sz w:val="24"/>
-              </w:rPr>
-            </w:r>
-            <w:r>
-              <w:rPr>
-                <w:rFonts w:ascii="Times New Roman" w:hAnsi="Times New Roman" w:eastAsia="Times New Roman"/>
-                <w:b/>
-                <w:i w:val="0"/>
-                <w:sz w:val="24"/>
-              </w:rPr>
-              <w:t>P2 Per-schema</w:t>
-            </w:r>
-          </w:p>
-        </w:tc>
-        <w:tc>
-          <w:tcPr>
-            <w:tcW w:type="dxa" w:w="1234"/>
-          </w:tcPr>
-          <w:p>
-            <w:pPr>
-              <w:jc w:val="center"/>
-            </w:pPr>
-            <w:r>
-              <w:rPr>
-                <w:b/>
-                <w:sz w:val="24"/>
-              </w:rPr>
-            </w:r>
-            <w:r>
-              <w:rPr>
-                <w:rFonts w:ascii="Times New Roman" w:hAnsi="Times New Roman" w:eastAsia="Times New Roman"/>
-                <w:b/>
-                <w:i w:val="0"/>
-                <w:sz w:val="24"/>
-              </w:rPr>
-              <w:t>P3 ID only</w:t>
-            </w:r>
-          </w:p>
-        </w:tc>
-        <w:tc>
-          <w:tcPr>
-            <w:tcW w:type="dxa" w:w="1234"/>
-          </w:tcPr>
-          <w:p>
-            <w:pPr>
-              <w:jc w:val="center"/>
-            </w:pPr>
-            <w:r>
-              <w:rPr>
-                <w:b/>
-                <w:sz w:val="24"/>
-              </w:rPr>
-            </w:r>
-            <w:r>
-              <w:rPr>
-                <w:rFonts w:ascii="Times New Roman" w:hAnsi="Times New Roman" w:eastAsia="Times New Roman"/>
-                <w:b/>
-                <w:i w:val="0"/>
-                <w:sz w:val="24"/>
-              </w:rPr>
-              <w:t>P4 RLS</w:t>
-            </w:r>
-          </w:p>
-        </w:tc>
-        <w:tc>
-          <w:tcPr>
-            <w:tcW w:type="dxa" w:w="1234"/>
-          </w:tcPr>
-          <w:p>
-            <w:pPr>
-              <w:jc w:val="center"/>
-            </w:pPr>
-            <w:r>
-              <w:rPr>
-                <w:b/>
-                <w:sz w:val="24"/>
-              </w:rPr>
-            </w:r>
-            <w:r>
-              <w:rPr>
-                <w:rFonts w:ascii="Times New Roman" w:hAnsi="Times New Roman" w:eastAsia="Times New Roman"/>
-                <w:b/>
-                <w:i w:val="0"/>
-                <w:sz w:val="24"/>
-              </w:rPr>
-              <w:t>P5 Hybrid</w:t>
-            </w:r>
-          </w:p>
-        </w:tc>
-        <w:tc>
-          <w:tcPr>
-            <w:tcW w:type="dxa" w:w="1234"/>
-          </w:tcPr>
-          <w:p>
-            <w:pPr>
-              <w:jc w:val="center"/>
-            </w:pPr>
-            <w:r>
-              <w:rPr>
-                <w:b/>
-                <w:sz w:val="24"/>
-              </w:rPr>
-            </w:r>
-            <w:r>
-              <w:rPr>
-                <w:rFonts w:ascii="Times New Roman" w:hAnsi="Times New Roman" w:eastAsia="Times New Roman"/>
-                <w:b/>
-                <w:i w:val="0"/>
-                <w:sz w:val="24"/>
-              </w:rPr>
-              <w:t>P6 Serverless</w:t>
-            </w:r>
-          </w:p>
-        </w:tc>
-      </w:tr>
-      <w:tr>
-        <w:tc>
-          <w:tcPr>
-            <w:tcW w:type="dxa" w:w="1234"/>
-          </w:tcPr>
-          <w:p>
-            <w:r>
-              <w:rPr>
-                <w:sz w:val="24"/>
-              </w:rPr>
-            </w:r>
-            <w:r>
-              <w:rPr>
-                <w:rFonts w:ascii="Times New Roman" w:hAnsi="Times New Roman" w:eastAsia="Times New Roman"/>
-                <w:b w:val="0"/>
-                <w:i w:val="0"/>
-                <w:sz w:val="24"/>
-              </w:rPr>
-              <w:t>Độ mạnh cô lập</w:t>
-            </w:r>
-          </w:p>
-        </w:tc>
-        <w:tc>
-          <w:tcPr>
-            <w:tcW w:type="dxa" w:w="1234"/>
-          </w:tcPr>
-          <w:p>
-            <w:r>
-              <w:rPr>
-                <w:sz w:val="24"/>
-              </w:rPr>
-            </w:r>
-            <w:r>
-              <w:rPr>
-                <w:rFonts w:ascii="Times New Roman" w:hAnsi="Times New Roman" w:eastAsia="Times New Roman"/>
-                <w:b w:val="0"/>
-                <w:i w:val="0"/>
-                <w:sz w:val="24"/>
-              </w:rPr>
-              <w:t>5</w:t>
-            </w:r>
-          </w:p>
-        </w:tc>
-        <w:tc>
-          <w:tcPr>
-            <w:tcW w:type="dxa" w:w="1234"/>
-          </w:tcPr>
-          <w:p>
-            <w:r>
-              <w:rPr>
-                <w:sz w:val="24"/>
-              </w:rPr>
-            </w:r>
-            <w:r>
-              <w:rPr>
-                <w:rFonts w:ascii="Times New Roman" w:hAnsi="Times New Roman" w:eastAsia="Times New Roman"/>
-                <w:b w:val="0"/>
-                <w:i w:val="0"/>
-                <w:sz w:val="24"/>
-              </w:rPr>
-              <w:t>4</w:t>
-            </w:r>
-          </w:p>
-        </w:tc>
-        <w:tc>
-          <w:tcPr>
-            <w:tcW w:type="dxa" w:w="1234"/>
-          </w:tcPr>
-          <w:p>
-            <w:r>
-              <w:rPr>
-                <w:sz w:val="24"/>
-              </w:rPr>
-            </w:r>
-            <w:r>
-              <w:rPr>
-                <w:rFonts w:ascii="Times New Roman" w:hAnsi="Times New Roman" w:eastAsia="Times New Roman"/>
-                <w:b w:val="0"/>
-                <w:i w:val="0"/>
-                <w:sz w:val="24"/>
-              </w:rPr>
-              <w:t>2</w:t>
-            </w:r>
-          </w:p>
-        </w:tc>
-        <w:tc>
-          <w:tcPr>
-            <w:tcW w:type="dxa" w:w="1234"/>
-          </w:tcPr>
-          <w:p>
-            <w:r>
-              <w:rPr>
-                <w:sz w:val="24"/>
-              </w:rPr>
-            </w:r>
-            <w:r>
-              <w:rPr>
-                <w:rFonts w:ascii="Times New Roman" w:hAnsi="Times New Roman" w:eastAsia="Times New Roman"/>
-                <w:b/>
-                <w:i w:val="0"/>
-                <w:sz w:val="24"/>
-              </w:rPr>
-              <w:t>3</w:t>
-            </w:r>
-          </w:p>
-        </w:tc>
-        <w:tc>
-          <w:tcPr>
-            <w:tcW w:type="dxa" w:w="1234"/>
-          </w:tcPr>
-          <w:p>
-            <w:r>
-              <w:rPr>
-                <w:sz w:val="24"/>
-              </w:rPr>
-            </w:r>
-            <w:r>
-              <w:rPr>
-                <w:rFonts w:ascii="Times New Roman" w:hAnsi="Times New Roman" w:eastAsia="Times New Roman"/>
-                <w:b w:val="0"/>
-                <w:i w:val="0"/>
-                <w:sz w:val="24"/>
-              </w:rPr>
-              <w:t>4</w:t>
-            </w:r>
-          </w:p>
-        </w:tc>
-        <w:tc>
-          <w:tcPr>
-            <w:tcW w:type="dxa" w:w="1234"/>
-          </w:tcPr>
-          <w:p>
-            <w:r>
-              <w:rPr>
-                <w:sz w:val="24"/>
-              </w:rPr>
-            </w:r>
-            <w:r>
-              <w:rPr>
-                <w:rFonts w:ascii="Times New Roman" w:hAnsi="Times New Roman" w:eastAsia="Times New Roman"/>
-                <w:b w:val="0"/>
-                <w:i w:val="0"/>
-                <w:sz w:val="24"/>
-              </w:rPr>
-              <w:t>3</w:t>
-            </w:r>
-          </w:p>
-        </w:tc>
-      </w:tr>
-      <w:tr>
-        <w:tc>
-          <w:tcPr>
-            <w:tcW w:type="dxa" w:w="1234"/>
-          </w:tcPr>
-          <w:p>
-            <w:r>
-              <w:rPr>
-                <w:sz w:val="24"/>
-              </w:rPr>
-            </w:r>
-            <w:r>
-              <w:rPr>
-                <w:rFonts w:ascii="Times New Roman" w:hAnsi="Times New Roman" w:eastAsia="Times New Roman"/>
-                <w:b w:val="0"/>
-                <w:i w:val="0"/>
-                <w:sz w:val="24"/>
-              </w:rPr>
-              <w:t>Chi phí vận hành (5 = O(1))</w:t>
-            </w:r>
-          </w:p>
-        </w:tc>
-        <w:tc>
-          <w:tcPr>
-            <w:tcW w:type="dxa" w:w="1234"/>
-          </w:tcPr>
-          <w:p>
-            <w:r>
-              <w:rPr>
-                <w:sz w:val="24"/>
-              </w:rPr>
-            </w:r>
-            <w:r>
-              <w:rPr>
-                <w:rFonts w:ascii="Times New Roman" w:hAnsi="Times New Roman" w:eastAsia="Times New Roman"/>
-                <w:b w:val="0"/>
-                <w:i w:val="0"/>
-                <w:sz w:val="24"/>
-              </w:rPr>
-              <w:t>1</w:t>
-            </w:r>
-          </w:p>
-        </w:tc>
-        <w:tc>
-          <w:tcPr>
-            <w:tcW w:type="dxa" w:w="1234"/>
-          </w:tcPr>
-          <w:p>
-            <w:r>
-              <w:rPr>
-                <w:sz w:val="24"/>
-              </w:rPr>
-            </w:r>
-            <w:r>
-              <w:rPr>
-                <w:rFonts w:ascii="Times New Roman" w:hAnsi="Times New Roman" w:eastAsia="Times New Roman"/>
-                <w:b w:val="0"/>
-                <w:i w:val="0"/>
-                <w:sz w:val="24"/>
-              </w:rPr>
-              <w:t>3</w:t>
-            </w:r>
-          </w:p>
-        </w:tc>
-        <w:tc>
-          <w:tcPr>
-            <w:tcW w:type="dxa" w:w="1234"/>
-          </w:tcPr>
-          <w:p>
-            <w:r>
-              <w:rPr>
-                <w:sz w:val="24"/>
-              </w:rPr>
-            </w:r>
-            <w:r>
-              <w:rPr>
-                <w:rFonts w:ascii="Times New Roman" w:hAnsi="Times New Roman" w:eastAsia="Times New Roman"/>
-                <w:b w:val="0"/>
-                <w:i w:val="0"/>
-                <w:sz w:val="24"/>
-              </w:rPr>
-              <w:t>5</w:t>
-            </w:r>
-          </w:p>
-        </w:tc>
-        <w:tc>
-          <w:tcPr>
-            <w:tcW w:type="dxa" w:w="1234"/>
-          </w:tcPr>
-          <w:p>
-            <w:r>
-              <w:rPr>
-                <w:sz w:val="24"/>
-              </w:rPr>
-            </w:r>
-            <w:r>
-              <w:rPr>
-                <w:rFonts w:ascii="Times New Roman" w:hAnsi="Times New Roman" w:eastAsia="Times New Roman"/>
-                <w:b/>
-                <w:i w:val="0"/>
-                <w:sz w:val="24"/>
-              </w:rPr>
-              <w:t>5</w:t>
-            </w:r>
-          </w:p>
-        </w:tc>
-        <w:tc>
-          <w:tcPr>
-            <w:tcW w:type="dxa" w:w="1234"/>
-          </w:tcPr>
-          <w:p>
-            <w:r>
-              <w:rPr>
-                <w:sz w:val="24"/>
-              </w:rPr>
-            </w:r>
-            <w:r>
-              <w:rPr>
-                <w:rFonts w:ascii="Times New Roman" w:hAnsi="Times New Roman" w:eastAsia="Times New Roman"/>
-                <w:b w:val="0"/>
-                <w:i w:val="0"/>
-                <w:sz w:val="24"/>
-              </w:rPr>
-              <w:t>2</w:t>
-            </w:r>
-          </w:p>
-        </w:tc>
-        <w:tc>
-          <w:tcPr>
-            <w:tcW w:type="dxa" w:w="1234"/>
-          </w:tcPr>
-          <w:p>
-            <w:r>
-              <w:rPr>
-                <w:sz w:val="24"/>
-              </w:rPr>
-            </w:r>
-            <w:r>
-              <w:rPr>
-                <w:rFonts w:ascii="Times New Roman" w:hAnsi="Times New Roman" w:eastAsia="Times New Roman"/>
-                <w:b w:val="0"/>
-                <w:i w:val="0"/>
-                <w:sz w:val="24"/>
-              </w:rPr>
-              <w:t>4</w:t>
-            </w:r>
-          </w:p>
-        </w:tc>
-      </w:tr>
-      <w:tr>
-        <w:tc>
-          <w:tcPr>
-            <w:tcW w:type="dxa" w:w="1234"/>
-          </w:tcPr>
-          <w:p>
-            <w:r>
-              <w:rPr>
-                <w:sz w:val="24"/>
-              </w:rPr>
-            </w:r>
-            <w:r>
-              <w:rPr>
-                <w:rFonts w:ascii="Times New Roman" w:hAnsi="Times New Roman" w:eastAsia="Times New Roman"/>
-                <w:b w:val="0"/>
-                <w:i w:val="0"/>
-                <w:sz w:val="24"/>
-              </w:rPr>
-              <w:t>Khả năng truy vấn xuyên tenant</w:t>
-            </w:r>
-          </w:p>
-        </w:tc>
-        <w:tc>
-          <w:tcPr>
-            <w:tcW w:type="dxa" w:w="1234"/>
-          </w:tcPr>
-          <w:p>
-            <w:r>
-              <w:rPr>
-                <w:sz w:val="24"/>
-              </w:rPr>
-            </w:r>
-            <w:r>
-              <w:rPr>
-                <w:rFonts w:ascii="Times New Roman" w:hAnsi="Times New Roman" w:eastAsia="Times New Roman"/>
-                <w:b w:val="0"/>
-                <w:i w:val="0"/>
-                <w:sz w:val="24"/>
-              </w:rPr>
-              <w:t>2</w:t>
-            </w:r>
-          </w:p>
-        </w:tc>
-        <w:tc>
-          <w:tcPr>
-            <w:tcW w:type="dxa" w:w="1234"/>
-          </w:tcPr>
-          <w:p>
-            <w:r>
-              <w:rPr>
-                <w:sz w:val="24"/>
-              </w:rPr>
-            </w:r>
-            <w:r>
-              <w:rPr>
-                <w:rFonts w:ascii="Times New Roman" w:hAnsi="Times New Roman" w:eastAsia="Times New Roman"/>
-                <w:b w:val="0"/>
-                <w:i w:val="0"/>
-                <w:sz w:val="24"/>
-              </w:rPr>
-              <w:t>4</w:t>
-            </w:r>
-          </w:p>
-        </w:tc>
-        <w:tc>
-          <w:tcPr>
-            <w:tcW w:type="dxa" w:w="1234"/>
-          </w:tcPr>
-          <w:p>
-            <w:r>
-              <w:rPr>
-                <w:sz w:val="24"/>
-              </w:rPr>
-            </w:r>
-            <w:r>
-              <w:rPr>
-                <w:rFonts w:ascii="Times New Roman" w:hAnsi="Times New Roman" w:eastAsia="Times New Roman"/>
-                <w:b w:val="0"/>
-                <w:i w:val="0"/>
-                <w:sz w:val="24"/>
-              </w:rPr>
-              <w:t>5</w:t>
-            </w:r>
-          </w:p>
-        </w:tc>
-        <w:tc>
-          <w:tcPr>
-            <w:tcW w:type="dxa" w:w="1234"/>
-          </w:tcPr>
-          <w:p>
-            <w:r>
-              <w:rPr>
-                <w:sz w:val="24"/>
-              </w:rPr>
-            </w:r>
-            <w:r>
-              <w:rPr>
-                <w:rFonts w:ascii="Times New Roman" w:hAnsi="Times New Roman" w:eastAsia="Times New Roman"/>
-                <w:b/>
-                <w:i w:val="0"/>
-                <w:sz w:val="24"/>
-              </w:rPr>
-              <w:t>4</w:t>
-            </w:r>
-          </w:p>
-        </w:tc>
-        <w:tc>
-          <w:tcPr>
-            <w:tcW w:type="dxa" w:w="1234"/>
-          </w:tcPr>
-          <w:p>
-            <w:r>
-              <w:rPr>
-                <w:sz w:val="24"/>
-              </w:rPr>
-            </w:r>
-            <w:r>
-              <w:rPr>
-                <w:rFonts w:ascii="Times New Roman" w:hAnsi="Times New Roman" w:eastAsia="Times New Roman"/>
-                <w:b w:val="0"/>
-                <w:i w:val="0"/>
-                <w:sz w:val="24"/>
-              </w:rPr>
-              <w:t>3</w:t>
-            </w:r>
-          </w:p>
-        </w:tc>
-        <w:tc>
-          <w:tcPr>
-            <w:tcW w:type="dxa" w:w="1234"/>
-          </w:tcPr>
-          <w:p>
-            <w:r>
-              <w:rPr>
-                <w:sz w:val="24"/>
-              </w:rPr>
-            </w:r>
-            <w:r>
-              <w:rPr>
-                <w:rFonts w:ascii="Times New Roman" w:hAnsi="Times New Roman" w:eastAsia="Times New Roman"/>
-                <w:b w:val="0"/>
-                <w:i w:val="0"/>
-                <w:sz w:val="24"/>
-              </w:rPr>
-              <w:t>3</w:t>
-            </w:r>
-          </w:p>
-        </w:tc>
-      </w:tr>
-      <w:tr>
-        <w:tc>
-          <w:tcPr>
-            <w:tcW w:type="dxa" w:w="1234"/>
-          </w:tcPr>
-          <w:p>
-            <w:r>
-              <w:rPr>
-                <w:sz w:val="24"/>
-              </w:rPr>
-            </w:r>
-            <w:r>
-              <w:rPr>
-                <w:rFonts w:ascii="Times New Roman" w:hAnsi="Times New Roman" w:eastAsia="Times New Roman"/>
-                <w:b w:val="0"/>
-                <w:i w:val="0"/>
-                <w:sz w:val="24"/>
-              </w:rPr>
-              <w:t>Phù hợp với phạm vi hiện tại</w:t>
-            </w:r>
-          </w:p>
-        </w:tc>
-        <w:tc>
-          <w:tcPr>
-            <w:tcW w:type="dxa" w:w="1234"/>
-          </w:tcPr>
-          <w:p>
-            <w:r>
-              <w:rPr>
-                <w:sz w:val="24"/>
-              </w:rPr>
-            </w:r>
-            <w:r>
-              <w:rPr>
-                <w:rFonts w:ascii="Times New Roman" w:hAnsi="Times New Roman" w:eastAsia="Times New Roman"/>
-                <w:b w:val="0"/>
-                <w:i w:val="0"/>
-                <w:sz w:val="24"/>
-              </w:rPr>
-              <w:t>1</w:t>
-            </w:r>
-          </w:p>
-        </w:tc>
-        <w:tc>
-          <w:tcPr>
-            <w:tcW w:type="dxa" w:w="1234"/>
-          </w:tcPr>
-          <w:p>
-            <w:r>
-              <w:rPr>
-                <w:sz w:val="24"/>
-              </w:rPr>
-            </w:r>
-            <w:r>
-              <w:rPr>
-                <w:rFonts w:ascii="Times New Roman" w:hAnsi="Times New Roman" w:eastAsia="Times New Roman"/>
-                <w:b w:val="0"/>
-                <w:i w:val="0"/>
-                <w:sz w:val="24"/>
-              </w:rPr>
-              <w:t>3</w:t>
-            </w:r>
-          </w:p>
-        </w:tc>
-        <w:tc>
-          <w:tcPr>
-            <w:tcW w:type="dxa" w:w="1234"/>
-          </w:tcPr>
-          <w:p>
-            <w:r>
-              <w:rPr>
-                <w:sz w:val="24"/>
-              </w:rPr>
-            </w:r>
-            <w:r>
-              <w:rPr>
-                <w:rFonts w:ascii="Times New Roman" w:hAnsi="Times New Roman" w:eastAsia="Times New Roman"/>
-                <w:b w:val="0"/>
-                <w:i w:val="0"/>
-                <w:sz w:val="24"/>
-              </w:rPr>
-              <w:t>4</w:t>
-            </w:r>
-          </w:p>
-        </w:tc>
-        <w:tc>
-          <w:tcPr>
-            <w:tcW w:type="dxa" w:w="1234"/>
-          </w:tcPr>
-          <w:p>
-            <w:r>
-              <w:rPr>
-                <w:sz w:val="24"/>
-              </w:rPr>
-            </w:r>
-            <w:r>
-              <w:rPr>
-                <w:rFonts w:ascii="Times New Roman" w:hAnsi="Times New Roman" w:eastAsia="Times New Roman"/>
-                <w:b/>
-                <w:i w:val="0"/>
-                <w:sz w:val="24"/>
-              </w:rPr>
-              <w:t>5</w:t>
-            </w:r>
-          </w:p>
-        </w:tc>
-        <w:tc>
-          <w:tcPr>
-            <w:tcW w:type="dxa" w:w="1234"/>
-          </w:tcPr>
-          <w:p>
-            <w:r>
-              <w:rPr>
-                <w:sz w:val="24"/>
-              </w:rPr>
-            </w:r>
-            <w:r>
-              <w:rPr>
-                <w:rFonts w:ascii="Times New Roman" w:hAnsi="Times New Roman" w:eastAsia="Times New Roman"/>
-                <w:b w:val="0"/>
-                <w:i w:val="0"/>
-                <w:sz w:val="24"/>
-              </w:rPr>
-              <w:t>1</w:t>
-            </w:r>
-          </w:p>
-        </w:tc>
-        <w:tc>
-          <w:tcPr>
-            <w:tcW w:type="dxa" w:w="1234"/>
-          </w:tcPr>
-          <w:p>
-            <w:r>
-              <w:rPr>
-                <w:sz w:val="24"/>
-              </w:rPr>
-            </w:r>
-            <w:r>
-              <w:rPr>
-                <w:rFonts w:ascii="Times New Roman" w:hAnsi="Times New Roman" w:eastAsia="Times New Roman"/>
-                <w:b w:val="0"/>
-                <w:i w:val="0"/>
-                <w:sz w:val="24"/>
-              </w:rPr>
-              <w:t>2</w:t>
-            </w:r>
-          </w:p>
-        </w:tc>
-      </w:tr>
-      <w:tr>
-        <w:tc>
-          <w:tcPr>
-            <w:tcW w:type="dxa" w:w="1234"/>
-          </w:tcPr>
-          <w:p>
-            <w:r>
-              <w:rPr>
-                <w:sz w:val="24"/>
-              </w:rPr>
-            </w:r>
-            <w:r>
-              <w:rPr>
-                <w:rFonts w:ascii="Times New Roman" w:hAnsi="Times New Roman" w:eastAsia="Times New Roman"/>
-                <w:b w:val="0"/>
-                <w:i w:val="0"/>
-                <w:sz w:val="24"/>
-              </w:rPr>
-              <w:t>Vị thế tuân thủ (PDPL + ISO27001)</w:t>
-            </w:r>
-          </w:p>
-        </w:tc>
-        <w:tc>
-          <w:tcPr>
-            <w:tcW w:type="dxa" w:w="1234"/>
-          </w:tcPr>
-          <w:p>
-            <w:r>
-              <w:rPr>
-                <w:sz w:val="24"/>
-              </w:rPr>
-            </w:r>
-            <w:r>
-              <w:rPr>
-                <w:rFonts w:ascii="Times New Roman" w:hAnsi="Times New Roman" w:eastAsia="Times New Roman"/>
-                <w:b w:val="0"/>
-                <w:i w:val="0"/>
-                <w:sz w:val="24"/>
-              </w:rPr>
-              <w:t>5</w:t>
-            </w:r>
-          </w:p>
-        </w:tc>
-        <w:tc>
-          <w:tcPr>
-            <w:tcW w:type="dxa" w:w="1234"/>
-          </w:tcPr>
-          <w:p>
-            <w:r>
-              <w:rPr>
-                <w:sz w:val="24"/>
-              </w:rPr>
-            </w:r>
-            <w:r>
-              <w:rPr>
-                <w:rFonts w:ascii="Times New Roman" w:hAnsi="Times New Roman" w:eastAsia="Times New Roman"/>
-                <w:b w:val="0"/>
-                <w:i w:val="0"/>
-                <w:sz w:val="24"/>
-              </w:rPr>
-              <w:t>3</w:t>
-            </w:r>
-          </w:p>
-        </w:tc>
-        <w:tc>
-          <w:tcPr>
-            <w:tcW w:type="dxa" w:w="1234"/>
-          </w:tcPr>
-          <w:p>
-            <w:r>
-              <w:rPr>
-                <w:sz w:val="24"/>
-              </w:rPr>
-            </w:r>
-            <w:r>
-              <w:rPr>
-                <w:rFonts w:ascii="Times New Roman" w:hAnsi="Times New Roman" w:eastAsia="Times New Roman"/>
-                <w:b w:val="0"/>
-                <w:i w:val="0"/>
-                <w:sz w:val="24"/>
-              </w:rPr>
-              <w:t>2</w:t>
-            </w:r>
-          </w:p>
-        </w:tc>
-        <w:tc>
-          <w:tcPr>
-            <w:tcW w:type="dxa" w:w="1234"/>
-          </w:tcPr>
-          <w:p>
-            <w:r>
-              <w:rPr>
-                <w:sz w:val="24"/>
-              </w:rPr>
-            </w:r>
-            <w:r>
-              <w:rPr>
-                <w:rFonts w:ascii="Times New Roman" w:hAnsi="Times New Roman" w:eastAsia="Times New Roman"/>
-                <w:b/>
-                <w:i w:val="0"/>
-                <w:sz w:val="24"/>
-              </w:rPr>
-              <w:t>4</w:t>
-            </w:r>
-          </w:p>
-        </w:tc>
-        <w:tc>
-          <w:tcPr>
-            <w:tcW w:type="dxa" w:w="1234"/>
-          </w:tcPr>
-          <w:p>
-            <w:r>
-              <w:rPr>
-                <w:sz w:val="24"/>
-              </w:rPr>
-            </w:r>
-            <w:r>
-              <w:rPr>
-                <w:rFonts w:ascii="Times New Roman" w:hAnsi="Times New Roman" w:eastAsia="Times New Roman"/>
-                <w:b w:val="0"/>
-                <w:i w:val="0"/>
-                <w:sz w:val="24"/>
-              </w:rPr>
-              <w:t>5</w:t>
-            </w:r>
-          </w:p>
-        </w:tc>
-        <w:tc>
-          <w:tcPr>
-            <w:tcW w:type="dxa" w:w="1234"/>
-          </w:tcPr>
-          <w:p>
-            <w:r>
-              <w:rPr>
-                <w:sz w:val="24"/>
-              </w:rPr>
-            </w:r>
-            <w:r>
-              <w:rPr>
-                <w:rFonts w:ascii="Times New Roman" w:hAnsi="Times New Roman" w:eastAsia="Times New Roman"/>
-                <w:b w:val="0"/>
-                <w:i w:val="0"/>
-                <w:sz w:val="24"/>
-              </w:rPr>
-              <w:t>4</w:t>
-            </w:r>
-          </w:p>
-        </w:tc>
-      </w:tr>
-      <w:tr>
-        <w:tc>
-          <w:tcPr>
-            <w:tcW w:type="dxa" w:w="1234"/>
-          </w:tcPr>
-          <w:p>
-            <w:r>
-              <w:rPr>
-                <w:sz w:val="24"/>
-              </w:rPr>
-            </w:r>
-            <w:r>
-              <w:rPr>
-                <w:rFonts w:ascii="Times New Roman" w:hAnsi="Times New Roman" w:eastAsia="Times New Roman"/>
-                <w:b w:val="0"/>
-                <w:i w:val="0"/>
-                <w:sz w:val="24"/>
-              </w:rPr>
-              <w:t>Chi phí chuyển đổi từ hiện trạng</w:t>
-            </w:r>
-          </w:p>
-        </w:tc>
-        <w:tc>
-          <w:tcPr>
-            <w:tcW w:type="dxa" w:w="1234"/>
-          </w:tcPr>
-          <w:p>
-            <w:r>
-              <w:rPr>
-                <w:sz w:val="24"/>
-              </w:rPr>
-            </w:r>
-            <w:r>
-              <w:rPr>
-                <w:rFonts w:ascii="Times New Roman" w:hAnsi="Times New Roman" w:eastAsia="Times New Roman"/>
-                <w:b w:val="0"/>
-                <w:i w:val="0"/>
-                <w:sz w:val="24"/>
-              </w:rPr>
-              <w:t>1</w:t>
-            </w:r>
-          </w:p>
-        </w:tc>
-        <w:tc>
-          <w:tcPr>
-            <w:tcW w:type="dxa" w:w="1234"/>
-          </w:tcPr>
-          <w:p>
-            <w:r>
-              <w:rPr>
-                <w:sz w:val="24"/>
-              </w:rPr>
-            </w:r>
-            <w:r>
-              <w:rPr>
-                <w:rFonts w:ascii="Times New Roman" w:hAnsi="Times New Roman" w:eastAsia="Times New Roman"/>
-                <w:b w:val="0"/>
-                <w:i w:val="0"/>
-                <w:sz w:val="24"/>
-              </w:rPr>
-              <w:t>3</w:t>
-            </w:r>
-          </w:p>
-        </w:tc>
-        <w:tc>
-          <w:tcPr>
-            <w:tcW w:type="dxa" w:w="1234"/>
-          </w:tcPr>
-          <w:p>
-            <w:r>
-              <w:rPr>
-                <w:sz w:val="24"/>
-              </w:rPr>
-            </w:r>
-            <w:r>
-              <w:rPr>
-                <w:rFonts w:ascii="Times New Roman" w:hAnsi="Times New Roman" w:eastAsia="Times New Roman"/>
-                <w:b w:val="0"/>
-                <w:i w:val="0"/>
-                <w:sz w:val="24"/>
-              </w:rPr>
-              <w:t>5</w:t>
-            </w:r>
-          </w:p>
-        </w:tc>
-        <w:tc>
-          <w:tcPr>
-            <w:tcW w:type="dxa" w:w="1234"/>
-          </w:tcPr>
-          <w:p>
-            <w:r>
-              <w:rPr>
-                <w:sz w:val="24"/>
-              </w:rPr>
-            </w:r>
-            <w:r>
-              <w:rPr>
-                <w:rFonts w:ascii="Times New Roman" w:hAnsi="Times New Roman" w:eastAsia="Times New Roman"/>
-                <w:b/>
-                <w:i w:val="0"/>
-                <w:sz w:val="24"/>
-              </w:rPr>
-              <w:t>5</w:t>
-            </w:r>
-          </w:p>
-        </w:tc>
-        <w:tc>
-          <w:tcPr>
-            <w:tcW w:type="dxa" w:w="1234"/>
-          </w:tcPr>
-          <w:p>
-            <w:r>
-              <w:rPr>
-                <w:sz w:val="24"/>
-              </w:rPr>
-            </w:r>
-            <w:r>
-              <w:rPr>
-                <w:rFonts w:ascii="Times New Roman" w:hAnsi="Times New Roman" w:eastAsia="Times New Roman"/>
-                <w:b w:val="0"/>
-                <w:i w:val="0"/>
-                <w:sz w:val="24"/>
-              </w:rPr>
-              <w:t>3</w:t>
-            </w:r>
-          </w:p>
-        </w:tc>
-        <w:tc>
-          <w:tcPr>
-            <w:tcW w:type="dxa" w:w="1234"/>
-          </w:tcPr>
-          <w:p>
-            <w:r>
-              <w:rPr>
-                <w:sz w:val="24"/>
-              </w:rPr>
-            </w:r>
-            <w:r>
-              <w:rPr>
-                <w:rFonts w:ascii="Times New Roman" w:hAnsi="Times New Roman" w:eastAsia="Times New Roman"/>
-                <w:b w:val="0"/>
-                <w:i w:val="0"/>
-                <w:sz w:val="24"/>
-              </w:rPr>
-              <w:t>2</w:t>
-            </w:r>
-          </w:p>
-        </w:tc>
-      </w:tr>
-      <w:tr>
-        <w:tc>
-          <w:tcPr>
-            <w:tcW w:type="dxa" w:w="1234"/>
-          </w:tcPr>
-          <w:p>
-            <w:r>
-              <w:rPr>
-                <w:sz w:val="24"/>
-              </w:rPr>
-            </w:r>
-            <w:r>
-              <w:rPr>
-                <w:rFonts w:ascii="Times New Roman" w:hAnsi="Times New Roman" w:eastAsia="Times New Roman"/>
-                <w:b/>
-                <w:i w:val="0"/>
-                <w:sz w:val="24"/>
-              </w:rPr>
-              <w:t>Tổng</w:t>
-            </w:r>
-          </w:p>
-        </w:tc>
-        <w:tc>
-          <w:tcPr>
-            <w:tcW w:type="dxa" w:w="1234"/>
-          </w:tcPr>
-          <w:p>
-            <w:r>
-              <w:rPr>
-                <w:sz w:val="24"/>
-              </w:rPr>
-            </w:r>
-            <w:r>
-              <w:rPr>
-                <w:rFonts w:ascii="Times New Roman" w:hAnsi="Times New Roman" w:eastAsia="Times New Roman"/>
-                <w:b w:val="0"/>
-                <w:i w:val="0"/>
-                <w:sz w:val="24"/>
-              </w:rPr>
-              <w:t>15</w:t>
-            </w:r>
-          </w:p>
-        </w:tc>
-        <w:tc>
-          <w:tcPr>
-            <w:tcW w:type="dxa" w:w="1234"/>
-          </w:tcPr>
-          <w:p>
-            <w:r>
-              <w:rPr>
-                <w:sz w:val="24"/>
-              </w:rPr>
-            </w:r>
-            <w:r>
-              <w:rPr>
-                <w:rFonts w:ascii="Times New Roman" w:hAnsi="Times New Roman" w:eastAsia="Times New Roman"/>
-                <w:b w:val="0"/>
-                <w:i w:val="0"/>
-                <w:sz w:val="24"/>
-              </w:rPr>
-              <w:t>20</w:t>
-            </w:r>
-          </w:p>
-        </w:tc>
-        <w:tc>
-          <w:tcPr>
-            <w:tcW w:type="dxa" w:w="1234"/>
-          </w:tcPr>
-          <w:p>
-            <w:r>
-              <w:rPr>
-                <w:sz w:val="24"/>
-              </w:rPr>
-            </w:r>
-            <w:r>
-              <w:rPr>
-                <w:rFonts w:ascii="Times New Roman" w:hAnsi="Times New Roman" w:eastAsia="Times New Roman"/>
-                <w:b w:val="0"/>
-                <w:i w:val="0"/>
-                <w:sz w:val="24"/>
-              </w:rPr>
-              <w:t>23</w:t>
-            </w:r>
-          </w:p>
-        </w:tc>
-        <w:tc>
-          <w:tcPr>
-            <w:tcW w:type="dxa" w:w="1234"/>
-          </w:tcPr>
-          <w:p>
-            <w:r>
-              <w:rPr>
-                <w:sz w:val="24"/>
-              </w:rPr>
-            </w:r>
-            <w:r>
-              <w:rPr>
-                <w:rFonts w:ascii="Times New Roman" w:hAnsi="Times New Roman" w:eastAsia="Times New Roman"/>
-                <w:b/>
-                <w:i w:val="0"/>
-                <w:sz w:val="24"/>
-              </w:rPr>
-              <w:t>26</w:t>
-            </w:r>
-          </w:p>
-        </w:tc>
-        <w:tc>
-          <w:tcPr>
-            <w:tcW w:type="dxa" w:w="1234"/>
-          </w:tcPr>
-          <w:p>
-            <w:r>
-              <w:rPr>
-                <w:sz w:val="24"/>
-              </w:rPr>
-            </w:r>
-            <w:r>
-              <w:rPr>
-                <w:rFonts w:ascii="Times New Roman" w:hAnsi="Times New Roman" w:eastAsia="Times New Roman"/>
-                <w:b w:val="0"/>
-                <w:i w:val="0"/>
-                <w:sz w:val="24"/>
-              </w:rPr>
-              <w:t>18</w:t>
-            </w:r>
-          </w:p>
-        </w:tc>
-        <w:tc>
-          <w:tcPr>
-            <w:tcW w:type="dxa" w:w="1234"/>
-          </w:tcPr>
-          <w:p>
-            <w:r>
-              <w:rPr>
-                <w:sz w:val="24"/>
-              </w:rPr>
-            </w:r>
-            <w:r>
-              <w:rPr>
-                <w:rFonts w:ascii="Times New Roman" w:hAnsi="Times New Roman" w:eastAsia="Times New Roman"/>
-                <w:b w:val="0"/>
-                <w:i w:val="0"/>
-                <w:sz w:val="24"/>
-              </w:rPr>
-              <w:t>18</w:t>
-            </w:r>
-          </w:p>
-        </w:tc>
-      </w:tr>
-    </w:tbl>
-    <w:p/>
-    <w:p>
-      <w:pPr>
-        <w:spacing w:line="288" w:lineRule="auto"/>
-        <w:ind w:firstLine="567"/>
-        <w:jc w:val="both"/>
-      </w:pPr>
-      <w:r>
-        <w:rPr>
-          <w:rFonts w:ascii="Times New Roman" w:hAnsi="Times New Roman" w:eastAsia="Times New Roman"/>
-          <w:b w:val="0"/>
-          <w:i/>
-          <w:sz w:val="26"/>
-        </w:rPr>
-        <w:t>Diễn giải Pattern 4 (chọn — tổng 26/30):</w:t>
-      </w:r>
-      <w:r>
-        <w:rPr>
-          <w:rFonts w:ascii="Times New Roman" w:hAnsi="Times New Roman" w:eastAsia="Times New Roman"/>
-          <w:b w:val="0"/>
-          <w:i w:val="0"/>
-          <w:sz w:val="26"/>
-        </w:rPr>
-        <w:t xml:space="preserve"> P4 đạt điểm tối đa ở ba trục quyết định với phạm vi hiện tại — chi phí vận hành O(1) (5đ: 1 RDS </w:t>
-      </w:r>
-      <w:r>
-        <w:rPr>
-          <w:rFonts w:ascii="Times New Roman" w:hAnsi="Times New Roman" w:eastAsia="Times New Roman"/>
-          <w:b w:val="0"/>
-          <w:i/>
-          <w:sz w:val="26"/>
-        </w:rPr>
-        <w:t>db.t3.micro</w:t>
-      </w:r>
-      <w:r>
-        <w:rPr>
-          <w:rFonts w:ascii="Times New Roman" w:hAnsi="Times New Roman" w:eastAsia="Times New Roman"/>
-          <w:b w:val="0"/>
-          <w:i w:val="0"/>
-          <w:sz w:val="26"/>
-        </w:rPr>
-        <w:t xml:space="preserve"> chia sẻ ≈$15/tháng + 1 chuỗi Flyway migration cho mọi tenant), độ phù hợp phạm vi SMB (5đ: ≤$15/tháng cho ≤10 tenant đầu) và chi phí chuyển đổi thấp (5đ: hiện trạng đã có cột </w:t>
-      </w:r>
-      <w:r>
-        <w:rPr>
-          <w:rFonts w:ascii="Times New Roman" w:hAnsi="Times New Roman" w:eastAsia="Times New Roman"/>
-          <w:b w:val="0"/>
-          <w:i/>
-          <w:sz w:val="26"/>
-        </w:rPr>
-        <w:t>tenant_id</w:t>
-      </w:r>
-      <w:r>
-        <w:rPr>
-          <w:rFonts w:ascii="Times New Roman" w:hAnsi="Times New Roman" w:eastAsia="Times New Roman"/>
-          <w:b w:val="0"/>
-          <w:i w:val="0"/>
-          <w:sz w:val="26"/>
-        </w:rPr>
-        <w:t xml:space="preserve">, chỉ thêm chính sách RLS + cấu hình </w:t>
-      </w:r>
-      <w:r>
-        <w:rPr>
-          <w:rFonts w:ascii="Times New Roman" w:hAnsi="Times New Roman" w:eastAsia="Times New Roman"/>
-          <w:b w:val="0"/>
-          <w:i/>
-          <w:sz w:val="26"/>
-        </w:rPr>
-        <w:t>SET LOCAL app.current_tenant_id</w:t>
-      </w:r>
-      <w:r>
-        <w:rPr>
-          <w:rFonts w:ascii="Times New Roman" w:hAnsi="Times New Roman" w:eastAsia="Times New Roman"/>
-          <w:b w:val="0"/>
-          <w:i w:val="0"/>
-          <w:sz w:val="26"/>
-        </w:rPr>
-        <w:t xml:space="preserve">). Độ mạnh cô lập chỉ đạt 3đ vì RLS là cô lập </w:t>
-      </w:r>
-      <w:r>
-        <w:rPr>
-          <w:rFonts w:ascii="Times New Roman" w:hAnsi="Times New Roman" w:eastAsia="Times New Roman"/>
-          <w:b/>
-          <w:i w:val="0"/>
-          <w:sz w:val="26"/>
-        </w:rPr>
-        <w:t>logic</w:t>
-      </w:r>
-      <w:r>
-        <w:rPr>
-          <w:rFonts w:ascii="Times New Roman" w:hAnsi="Times New Roman" w:eastAsia="Times New Roman"/>
-          <w:b w:val="0"/>
-          <w:i w:val="0"/>
-          <w:sz w:val="26"/>
-        </w:rPr>
-        <w:t xml:space="preserve"> (chính sách </w:t>
-      </w:r>
-      <w:r>
-        <w:rPr>
-          <w:rFonts w:ascii="Times New Roman" w:hAnsi="Times New Roman" w:eastAsia="Times New Roman"/>
-          <w:b w:val="0"/>
-          <w:i/>
-          <w:sz w:val="26"/>
-        </w:rPr>
-        <w:t>USING + WITH CHECK</w:t>
-      </w:r>
-      <w:r>
-        <w:rPr>
-          <w:rFonts w:ascii="Times New Roman" w:hAnsi="Times New Roman" w:eastAsia="Times New Roman"/>
-          <w:b w:val="0"/>
-          <w:i w:val="0"/>
-          <w:sz w:val="26"/>
-        </w:rPr>
-        <w:t xml:space="preserve"> + NULL force-fail, chi tiết §2.2.4) chứ không phải vật lý như Per-DB — vai trò siêu người dùng vẫn BYPASS được, nên cần thêm 4 lớp phòng thủ chiều sâu (§2.2.4). Hai trục còn lại đạt 4đ: khả năng truy vấn xuyên tenant (vai trò </w:t>
-      </w:r>
-      <w:r>
-        <w:rPr>
-          <w:rFonts w:ascii="Times New Roman" w:hAnsi="Times New Roman" w:eastAsia="Times New Roman"/>
-          <w:b w:val="0"/>
-          <w:i/>
-          <w:sz w:val="26"/>
-        </w:rPr>
-        <w:t>kitehub_admin</w:t>
-      </w:r>
-      <w:r>
-        <w:rPr>
-          <w:rFonts w:ascii="Times New Roman" w:hAnsi="Times New Roman" w:eastAsia="Times New Roman"/>
-          <w:b w:val="0"/>
-          <w:i w:val="0"/>
-          <w:sz w:val="26"/>
-        </w:rPr>
-        <w:t xml:space="preserve"> BYPASSRLS phục vụ report toàn nền tảng) và vị thế tuân thủ (cô lập logic mạnh + audit trail PDPL Art 11) — chưa đạt 5đ do là cô lập logic, không vật lý.</w:t>
-      </w:r>
-    </w:p>
-    <w:p>
-      <w:pPr>
-        <w:spacing w:line="288" w:lineRule="auto"/>
-        <w:ind w:firstLine="567"/>
-        <w:jc w:val="both"/>
-      </w:pPr>
-      <w:r>
-        <w:rPr>
-          <w:rFonts w:ascii="Times New Roman" w:hAnsi="Times New Roman" w:eastAsia="Times New Roman"/>
           <w:b w:val="0"/>
           <w:i w:val="0"/>
           <w:sz w:val="26"/>
@@ -15942,7 +14760,7 @@
           <w:b/>
           <w:sz w:val="26"/>
         </w:rPr>
-        <w:t>Bảng 2.6</w:t>
+        <w:t>Bảng 2.5</w:t>
       </w:r>
       <w:r>
         <w:rPr>
@@ -16067,22 +14885,6 @@
     </w:p>
     <w:p>
       <w:pPr>
-        <w:spacing w:line="288" w:lineRule="auto"/>
-        <w:ind w:firstLine="567"/>
-        <w:jc w:val="both"/>
-      </w:pPr>
-      <w:r>
-        <w:rPr>
-          <w:rFonts w:ascii="Times New Roman" w:hAnsi="Times New Roman" w:eastAsia="Times New Roman"/>
-          <w:b w:val="0"/>
-          <w:i w:val="0"/>
-          <w:sz w:val="26"/>
-        </w:rPr>
-        <w:t>Phần này trình bày các sơ đồ thiết kế chi tiết theo ký pháp UML (Booch et al. [29]) bổ sung cho C4 model ở §2.2, cùng thiết kế cơ sở dữ liệu chi tiết và mô hình SaaS. Ba mục đầu tạo thành cụm thiết kế dữ liệu liền mạch: §2.3.1 class diagram (hành vi runtime), §2.3.2 ERD (quan hệ lưu trữ), §2.3.3 thiết kế cơ sở dữ liệu chi tiết (schema từng cột). Hai mục tiếp theo trình bày thiết kế hành vi: §2.3.4 sequence diagram luồng cấp phát tenant, §2.3.5 máy trạng thái vòng đời tenant. Hai mục cuối: §2.3.6 phân rã service, §2.3.7 mô hình SaaS (gói dịch vụ, thanh toán).</w:t>
-      </w:r>
-    </w:p>
-    <w:p>
-      <w:pPr>
         <w:pStyle w:val="Heading3"/>
       </w:pPr>
       <w:r>
@@ -17301,7 +16103,7 @@
           <w:b/>
           <w:sz w:val="26"/>
         </w:rPr>
-        <w:t>Bảng 2.7</w:t>
+        <w:t>Bảng 2.6</w:t>
       </w:r>
       <w:r>
         <w:rPr>
@@ -19272,7 +18074,7 @@
           <w:b/>
           <w:sz w:val="26"/>
         </w:rPr>
-        <w:t>Bảng 2.8</w:t>
+        <w:t>Bảng 2.7</w:t>
       </w:r>
       <w:r>
         <w:rPr>
@@ -20427,7 +19229,7 @@
           <w:b/>
           <w:sz w:val="26"/>
         </w:rPr>
-        <w:t>Bảng 2.9</w:t>
+        <w:t>Bảng 2.8</w:t>
       </w:r>
       <w:r>
         <w:rPr>
@@ -22248,7 +21050,7 @@
           <w:b/>
           <w:sz w:val="26"/>
         </w:rPr>
-        <w:t>Bảng 2.10</w:t>
+        <w:t>Bảng 2.9</w:t>
       </w:r>
       <w:r>
         <w:rPr>
@@ -23772,7 +22574,7 @@
           <w:i w:val="0"/>
           <w:sz w:val="26"/>
         </w:rPr>
-        <w:t xml:space="preserve"> Đồ án thiết kế bốn gói dịch vụ phân tầng theo persona mục tiêu (Bảng 2.11). Hai gói FREE và STARTER đã kiểm chứng hiện tại với hai giáo viên độc lập; hai gói PRO và PRO_PLUS thuộc lộ trình phát triển sau khi mở rộng cohort tenant.</w:t>
+        <w:t xml:space="preserve"> Đồ án thiết kế bốn gói dịch vụ phân tầng theo persona mục tiêu (Bảng 2.10). Hai gói FREE và STARTER đã kiểm chứng hiện tại với hai giáo viên độc lập; hai gói PRO và PRO_PLUS thuộc lộ trình phát triển sau khi mở rộng cohort tenant.</w:t>
       </w:r>
     </w:p>
     <w:p>
@@ -23787,7 +22589,7 @@
           <w:b/>
           <w:sz w:val="26"/>
         </w:rPr>
-        <w:t>Bảng 2.11</w:t>
+        <w:t>Bảng 2.10</w:t>
       </w:r>
       <w:r>
         <w:rPr>
@@ -24911,7 +23713,7 @@
           <w:i w:val="0"/>
           <w:sz w:val="26"/>
         </w:rPr>
-        <w:t xml:space="preserve">, khớp ba tầng giá đầu của Bảng 2.11 dưới tên gọi cũ. Việc đổi tên gói sang </w:t>
+        <w:t xml:space="preserve">, khớp ba tầng giá đầu của Bảng 2.10 dưới tên gọi cũ. Việc đổi tên gói sang </w:t>
       </w:r>
       <w:r>
         <w:rPr>
@@ -25028,6 +23830,40 @@
       </w:r>
     </w:p>
     <w:p>
+      <w:r>
+        <w:br w:type="page"/>
+      </w:r>
+    </w:p>
+    <w:p>
+      <w:pPr>
+        <w:pStyle w:val="Heading1"/>
+        <w:jc w:val="center"/>
+      </w:pPr>
+      <w:r>
+        <w:rPr>
+          <w:rFonts w:ascii="Times New Roman" w:hAnsi="Times New Roman" w:eastAsia="Times New Roman"/>
+          <w:b/>
+          <w:color w:val="000000"/>
+          <w:sz w:val="36"/>
+        </w:rPr>
+        <w:t>CHƯƠNG 3. TRIỂN KHAI SẢN PHẨM VÀ KIỂM THỬ HỆ THỐNG</w:t>
+      </w:r>
+    </w:p>
+    <w:p>
+      <w:pPr>
+        <w:pStyle w:val="Heading2"/>
+      </w:pPr>
+      <w:r>
+        <w:rPr>
+          <w:rFonts w:ascii="Times New Roman" w:hAnsi="Times New Roman" w:eastAsia="Times New Roman"/>
+          <w:b/>
+          <w:color w:val="000000"/>
+          <w:sz w:val="32"/>
+        </w:rPr>
+        <w:t>3.1 Kết quả triển khai sản phẩm</w:t>
+      </w:r>
+    </w:p>
+    <w:p>
       <w:pPr>
         <w:spacing w:line="288" w:lineRule="auto"/>
         <w:ind w:firstLine="567"/>
@@ -25040,27 +23876,375 @@
           <w:i w:val="0"/>
           <w:sz w:val="26"/>
         </w:rPr>
-        <w:t>Roadmap lộ trình phát triển sau: hóa đơn điện tử VAT tích hợp MISA MeInvoice theo Thông tư 78/2021/TT-BTC (thay vì tự xây engine); cron tính phí bỏ qua khung Tết; merchant integration với VNPay/MoMo qua hình thức đối tác (không yêu cầu giấy phép PSP); hỗ trợ tự thu cho tenant ACTIVE theo lựa chọn; hoàn tiền và tranh chấp dưới dạng SOP thủ công.</w:t>
+        <w:t>Phần này trình bày kết quả triển khai các giao diện cốt lõi của KiteHub Platform hiện tại theo ba luồng nghiệp vụ liên kết: hành trình khám phá và kích hoạt tenant của Chủ sở hữu trung tâm, các thao tác vận hành thường nhật, và bộ công cụ điều hành của Admin nền tảng. Các giao diện được nhóm theo flow nghiệp vụ thay vì liệt kê rời rạc nhằm phản ánh đúng trải nghiệm end-to-end của người dùng.</w:t>
       </w:r>
     </w:p>
     <w:p>
-      <w:r>
-        <w:br w:type="page"/>
+      <w:pPr>
+        <w:pStyle w:val="Heading3"/>
+      </w:pPr>
+      <w:r>
+        <w:rPr>
+          <w:rFonts w:ascii="Times New Roman" w:hAnsi="Times New Roman" w:eastAsia="Times New Roman"/>
+          <w:b/>
+          <w:color w:val="000000"/>
+          <w:sz w:val="28"/>
+        </w:rPr>
+        <w:t>3.1.1 Luồng khám phá và kích hoạt tenant (khách ẩn danh → chủ sở hữu trung tâm)</w:t>
       </w:r>
     </w:p>
     <w:p>
       <w:pPr>
-        <w:pStyle w:val="Heading1"/>
+        <w:spacing w:before="120" w:after="60"/>
         <w:jc w:val="center"/>
+      </w:pPr>
+      <w:r>
+        <w:rPr>
+          <w:rFonts w:ascii="Times New Roman" w:hAnsi="Times New Roman" w:eastAsia="Times New Roman"/>
+          <w:b w:val="0"/>
+          <w:i/>
+          <w:color w:val="808080"/>
+          <w:sz w:val="26"/>
+        </w:rPr>
+        <w:t>[Hình minh hoạ: 12-public-homepage-sky-branded.png — chưa có file]</w:t>
+      </w:r>
+    </w:p>
+    <w:p>
+      <w:pPr>
+        <w:spacing w:before="120" w:after="60"/>
+        <w:jc w:val="center"/>
+      </w:pPr>
+      <w:r>
+        <w:rPr>
+          <w:rFonts w:ascii="Times New Roman" w:hAnsi="Times New Roman" w:eastAsia="Times New Roman"/>
+          <w:b w:val="0"/>
+          <w:i/>
+          <w:color w:val="808080"/>
+          <w:sz w:val="26"/>
+        </w:rPr>
+        <w:t>[Hình minh hoạ: 01-login-page.png — chưa có file]</w:t>
+      </w:r>
+    </w:p>
+    <w:p>
+      <w:pPr>
+        <w:spacing w:before="120" w:after="60"/>
+        <w:jc w:val="center"/>
+      </w:pPr>
+      <w:r>
+        <w:rPr>
+          <w:rFonts w:ascii="Times New Roman" w:hAnsi="Times New Roman" w:eastAsia="Times New Roman"/>
+          <w:b w:val="0"/>
+          <w:i/>
+          <w:color w:val="808080"/>
+          <w:sz w:val="26"/>
+        </w:rPr>
+        <w:t>[Hình minh hoạ: 02-dashboard-overview-kpi-orange.png — chưa có file]</w:t>
+      </w:r>
+    </w:p>
+    <w:p>
+      <w:pPr>
+        <w:pStyle w:val="HìnhCaption"/>
+        <w:spacing w:before="120" w:after="240"/>
+        <w:jc w:val="center"/>
+      </w:pPr>
+      <w:r>
+        <w:rPr>
+          <w:rFonts w:ascii="Times New Roman" w:hAnsi="Times New Roman" w:eastAsia="Times New Roman"/>
+          <w:b/>
+          <w:sz w:val="26"/>
+        </w:rPr>
+        <w:t>Hình 3.1</w:t>
+      </w:r>
+      <w:r>
+        <w:rPr>
+          <w:rFonts w:ascii="Times New Roman" w:hAnsi="Times New Roman" w:eastAsia="Times New Roman"/>
+          <w:sz w:val="26"/>
+        </w:rPr>
+        <w:t>. Luồng khám phá và kích hoạt tenant qua ba bước nối tiếp: trang chủ công khai mang thương hiệu riêng của tenant, trang đăng nhập, và dashboard tổng quan sau đăng nhập</w:t>
+      </w:r>
+    </w:p>
+    <w:p>
+      <w:pPr>
+        <w:spacing w:line="288" w:lineRule="auto"/>
+        <w:ind w:firstLine="567"/>
+        <w:jc w:val="both"/>
+      </w:pPr>
+      <w:r>
+        <w:rPr>
+          <w:rFonts w:ascii="Times New Roman" w:hAnsi="Times New Roman" w:eastAsia="Times New Roman"/>
+          <w:b w:val="0"/>
+          <w:i/>
+          <w:sz w:val="26"/>
+        </w:rPr>
+        <w:t>Nguồn: ảnh chụp giao diện nền tảng KiteClass, truy cập 29/05/2026</w:t>
+      </w:r>
+    </w:p>
+    <w:p>
+      <w:pPr>
+        <w:spacing w:line="288" w:lineRule="auto"/>
+        <w:ind w:firstLine="567"/>
+        <w:jc w:val="both"/>
+      </w:pPr>
+      <w:r>
+        <w:rPr>
+          <w:rFonts w:ascii="Times New Roman" w:hAnsi="Times New Roman" w:eastAsia="Times New Roman"/>
+          <w:b w:val="0"/>
+          <w:i w:val="0"/>
+          <w:sz w:val="26"/>
+        </w:rPr>
+        <w:t>Luồng khám phá và kích hoạt tenant đưa người dùng tiềm năng từ điểm tiếp xúc đầu tiên đến trạng thái vận hành thông qua ba bước nối tiếp. Bước thứ nhất là trang chủ công khai của tenant — minh chứng tại Hình 3.1 là trang của cô Đỗ Lan Khánh (tên giả định), một giảng viên độc lập dạy thêm môn Pháp luật &amp; Đời sống bậc THPT, với bộ nhận diện thương hiệu riêng (tông màu xanh navy phối vàng gold chủ đạo, tên giảng viên và khẩu hiệu "Vững kiến thức - Vững tương lai"). Trang được dựng theo cấu trúc nhiều khối: giới thiệu, tính năng nổi bật (lộ trình học, quản lý học viên, học phí &amp; báo cáo), thông tin giảng viên, thành tích ôn luyện môn Giáo dục công dân và Pháp luật trong kỳ thi tốt nghiệp THPT, bảng học phí theo định dạng tiền tệ Việt Nam (</w:t>
+      </w:r>
+      <w:r>
+        <w:rPr>
+          <w:rFonts w:ascii="Times New Roman" w:hAnsi="Times New Roman" w:eastAsia="Times New Roman"/>
+          <w:b w:val="0"/>
+          <w:i/>
+          <w:sz w:val="26"/>
+        </w:rPr>
+        <w:t>1.500.000đ/tháng</w:t>
+      </w:r>
+      <w:r>
+        <w:rPr>
+          <w:rFonts w:ascii="Times New Roman" w:hAnsi="Times New Roman" w:eastAsia="Times New Roman"/>
+          <w:b w:val="0"/>
+          <w:i w:val="0"/>
+          <w:sz w:val="26"/>
+        </w:rPr>
+        <w:t xml:space="preserve">, </w:t>
+      </w:r>
+      <w:r>
+        <w:rPr>
+          <w:rFonts w:ascii="Times New Roman" w:hAnsi="Times New Roman" w:eastAsia="Times New Roman"/>
+          <w:b w:val="0"/>
+          <w:i/>
+          <w:sz w:val="26"/>
+        </w:rPr>
+        <w:t>2.800.000đ/khóa</w:t>
+      </w:r>
+      <w:r>
+        <w:rPr>
+          <w:rFonts w:ascii="Times New Roman" w:hAnsi="Times New Roman" w:eastAsia="Times New Roman"/>
+          <w:b w:val="0"/>
+          <w:i w:val="0"/>
+          <w:sz w:val="26"/>
+        </w:rPr>
+        <w:t xml:space="preserve">, </w:t>
+      </w:r>
+      <w:r>
+        <w:rPr>
+          <w:rFonts w:ascii="Times New Roman" w:hAnsi="Times New Roman" w:eastAsia="Times New Roman"/>
+          <w:b w:val="0"/>
+          <w:i/>
+          <w:sz w:val="26"/>
+        </w:rPr>
+        <w:t>4.500.000đ/khóa chuyên sâu</w:t>
+      </w:r>
+      <w:r>
+        <w:rPr>
+          <w:rFonts w:ascii="Times New Roman" w:hAnsi="Times New Roman" w:eastAsia="Times New Roman"/>
+          <w:b w:val="0"/>
+          <w:i w:val="0"/>
+          <w:sz w:val="26"/>
+        </w:rPr>
+        <w:t>) và mục câu hỏi thường gặp. Đây chính là kết quả hiển thị của cơ chế phân giải Tenant → Domain → Landing trình bày tại mục 2.2.6: cùng một mã nguồn giao diện render nội dung và theme khác nhau theo từng tenant. Bước thứ hai là trang đăng nhập, nơi giảng viên nhập thông tin tài khoản đã được cấp sau khi yêu cầu truy cập được quản trị viên nền tảng duyệt. Bước thứ ba là dashboard tổng quan sau đăng nhập, hiển thị dòng tóm tắt "Hiện có 30 học viên · 1 khóa học" cùng sáu thẻ chỉ số (Học viên, Khóa học, Lớp học, Điểm danh hôm nay, Doanh thu tuần, Tỷ lệ giữ chân). Hiện tại, hai thẻ Học viên và Khóa học đã hiển thị số liệu thực (30 và 1), bốn thẻ còn lại tạm hiển thị dấu gạch ngang kèm ghi chú minh bạch "chưa có API tổng hợp; sẽ bổ sung khi endpoint thống kê dashboard sẵn sàng" — phản ánh trung thực mức độ hoàn thiện của tính năng thống kê ở thời điểm thực hiện đồ án.</w:t>
+      </w:r>
+    </w:p>
+    <w:p>
+      <w:pPr>
+        <w:pStyle w:val="Heading3"/>
       </w:pPr>
       <w:r>
         <w:rPr>
           <w:rFonts w:ascii="Times New Roman" w:hAnsi="Times New Roman" w:eastAsia="Times New Roman"/>
           <w:b/>
           <w:color w:val="000000"/>
-          <w:sz w:val="36"/>
-        </w:rPr>
-        <w:t>CHƯƠNG 3. TRIỂN KHAI SẢN PHẨM VÀ KIỂM THỬ HỆ THỐNG</w:t>
+          <w:sz w:val="28"/>
+        </w:rPr>
+        <w:t>3.1.2 Tùy biến thương hiệu bằng AI (AI Branding)</w:t>
+      </w:r>
+    </w:p>
+    <w:p>
+      <w:pPr>
+        <w:spacing w:before="120" w:after="60"/>
+        <w:jc w:val="center"/>
+      </w:pPr>
+      <w:r>
+        <w:rPr>
+          <w:rFonts w:ascii="Times New Roman" w:hAnsi="Times New Roman" w:eastAsia="Times New Roman"/>
+          <w:b w:val="0"/>
+          <w:i/>
+          <w:color w:val="808080"/>
+          <w:sz w:val="26"/>
+        </w:rPr>
+        <w:t>[Hình minh hoạ: 03-branding-settings.png — chưa có file]</w:t>
+      </w:r>
+    </w:p>
+    <w:p>
+      <w:pPr>
+        <w:pStyle w:val="HìnhCaption"/>
+        <w:spacing w:before="120" w:after="240"/>
+        <w:jc w:val="center"/>
+      </w:pPr>
+      <w:r>
+        <w:rPr>
+          <w:rFonts w:ascii="Times New Roman" w:hAnsi="Times New Roman" w:eastAsia="Times New Roman"/>
+          <w:b/>
+          <w:sz w:val="26"/>
+        </w:rPr>
+        <w:t>Hình 3.2</w:t>
+      </w:r>
+      <w:r>
+        <w:rPr>
+          <w:rFonts w:ascii="Times New Roman" w:hAnsi="Times New Roman" w:eastAsia="Times New Roman"/>
+          <w:sz w:val="26"/>
+        </w:rPr>
+        <w:t>. Giao diện tính năng AI Branding cho phép Chủ sở hữu trung tâm tạo bộ nhận diện thương hiệu qua trình hướng dẫn nhiều bước</w:t>
+      </w:r>
+    </w:p>
+    <w:p>
+      <w:pPr>
+        <w:spacing w:line="288" w:lineRule="auto"/>
+        <w:ind w:firstLine="567"/>
+        <w:jc w:val="both"/>
+      </w:pPr>
+      <w:r>
+        <w:rPr>
+          <w:rFonts w:ascii="Times New Roman" w:hAnsi="Times New Roman" w:eastAsia="Times New Roman"/>
+          <w:b w:val="0"/>
+          <w:i/>
+          <w:sz w:val="26"/>
+        </w:rPr>
+        <w:t>Nguồn: ảnh chụp giao diện nền tảng KiteClass, truy cập 29/05/2026</w:t>
+      </w:r>
+    </w:p>
+    <w:p>
+      <w:pPr>
+        <w:spacing w:line="288" w:lineRule="auto"/>
+        <w:ind w:firstLine="567"/>
+        <w:jc w:val="both"/>
+      </w:pPr>
+      <w:r>
+        <w:rPr>
+          <w:rFonts w:ascii="Times New Roman" w:hAnsi="Times New Roman" w:eastAsia="Times New Roman"/>
+          <w:b w:val="0"/>
+          <w:i w:val="0"/>
+          <w:sz w:val="26"/>
+        </w:rPr>
+        <w:t>AI Branding là một trong những điểm khác biệt cốt lõi của nền tảng, cho phép mỗi trung tâm tạo bộ nhận diện thương hiệu chuyên nghiệp mà không cần kiến thức thiết kế. Như minh chứng tại Hình 3.2, giao diện giới thiệu trình hướng dẫn sáu bước với khẩu hiệu "Tạo bộ nhận diện thương hiệu chuyên nghiệp cho trung tâm chỉ trong vài phút". Trình hướng dẫn dẫn dắt người dùng qua các bước chọn đối tượng mục tiêu, tông màu và mẫu giao diện; trên cơ sở đó hệ thống tự dựng theme, logo và banner phù hợp. Ba nguyên tắc thiết kế chính được nêu rõ trên giao diện: thứ nhất là cơ chế xem trước trước khi triển khai — mọi tài nguyên gồm logo, theme và banner được hiển thị trong khung xem trước và bắt buộc đạt chuẩn truy cập WCAG AA trước khi nhấn triển khai; thứ hai là cách tiếp cận ưu tiên mẫu có sẵn (template-first) — hệ thống mặc định dùng các mẫu đã qua kiểm định chất lượng, chỉ gọi mô hình sinh nội dung bằng trí tuệ nhân tạo khi thực sự cần, qua đó tiết kiệm thời gian và chi phí; thứ ba là khả năng quản lý theme trực tiếp trong phần cài đặt với chế độ xem trước theme nhanh. Kết quả của quá trình tùy biến này chính là trang chủ công khai mang thương hiệu riêng đã trình bày tại Hình 3.1.</w:t>
+      </w:r>
+    </w:p>
+    <w:p>
+      <w:pPr>
+        <w:pStyle w:val="Heading3"/>
+      </w:pPr>
+      <w:r>
+        <w:rPr>
+          <w:rFonts w:ascii="Times New Roman" w:hAnsi="Times New Roman" w:eastAsia="Times New Roman"/>
+          <w:b/>
+          <w:color w:val="000000"/>
+          <w:sz w:val="28"/>
+        </w:rPr>
+        <w:t>3.1.3 Quản lý học viên và tổ chức vận hành</w:t>
+      </w:r>
+    </w:p>
+    <w:p>
+      <w:pPr>
+        <w:spacing w:before="120" w:after="60"/>
+        <w:jc w:val="center"/>
+      </w:pPr>
+      <w:r>
+        <w:rPr>
+          <w:rFonts w:ascii="Times New Roman" w:hAnsi="Times New Roman" w:eastAsia="Times New Roman"/>
+          <w:b w:val="0"/>
+          <w:i/>
+          <w:color w:val="808080"/>
+          <w:sz w:val="26"/>
+        </w:rPr>
+        <w:t>[Hình minh hoạ: 05-students.png — chưa có file]</w:t>
+      </w:r>
+    </w:p>
+    <w:p>
+      <w:pPr>
+        <w:pStyle w:val="HìnhCaption"/>
+        <w:spacing w:before="120" w:after="240"/>
+        <w:jc w:val="center"/>
+      </w:pPr>
+      <w:r>
+        <w:rPr>
+          <w:rFonts w:ascii="Times New Roman" w:hAnsi="Times New Roman" w:eastAsia="Times New Roman"/>
+          <w:b/>
+          <w:sz w:val="26"/>
+        </w:rPr>
+        <w:t>Hình 3.3</w:t>
+      </w:r>
+      <w:r>
+        <w:rPr>
+          <w:rFonts w:ascii="Times New Roman" w:hAnsi="Times New Roman" w:eastAsia="Times New Roman"/>
+          <w:sz w:val="26"/>
+        </w:rPr>
+        <w:t>. Giao diện quản lý danh sách học viên của trung tâm với bảng dữ liệu, tìm kiếm và các thao tác quản trị</w:t>
+      </w:r>
+    </w:p>
+    <w:p>
+      <w:pPr>
+        <w:spacing w:line="288" w:lineRule="auto"/>
+        <w:ind w:firstLine="567"/>
+        <w:jc w:val="both"/>
+      </w:pPr>
+      <w:r>
+        <w:rPr>
+          <w:rFonts w:ascii="Times New Roman" w:hAnsi="Times New Roman" w:eastAsia="Times New Roman"/>
+          <w:b w:val="0"/>
+          <w:i/>
+          <w:sz w:val="26"/>
+        </w:rPr>
+        <w:t>Nguồn: ảnh chụp giao diện nền tảng KiteClass, truy cập 29/05/2026</w:t>
+      </w:r>
+    </w:p>
+    <w:p>
+      <w:pPr>
+        <w:spacing w:line="288" w:lineRule="auto"/>
+        <w:ind w:firstLine="567"/>
+        <w:jc w:val="both"/>
+      </w:pPr>
+      <w:r>
+        <w:rPr>
+          <w:rFonts w:ascii="Times New Roman" w:hAnsi="Times New Roman" w:eastAsia="Times New Roman"/>
+          <w:b w:val="0"/>
+          <w:i w:val="0"/>
+          <w:sz w:val="26"/>
+        </w:rPr>
+        <w:t>Sau khi tenant được kích hoạt, Chủ sở hữu trung tâm và Quản lý sử dụng nhóm chức năng vận hành để tổ chức học viên, lớp học và khóa học. Hình 3.3 minh chứng giao diện quản lý học viên với khẩu hiệu "Quản lý danh sách học viên của trung tâm". Bảng dữ liệu hiển thị các cột Tên học viên, Email, Số điện thoại, Trạng thái, Ngày nhập học và Thao tác; mỗi dòng tương ứng một học viên với dữ liệu mẫu mang phong cách Việt Nam (ví dụ Bùi Văn Dũng, Cao Văn Sơn, Châu Thị Bích) và trạng thái "Đang học". Giao diện cung cấp ô tìm kiếm theo tên hoặc email, khả năng sắp xếp theo từng cột, cùng ba thao tác trên mỗi dòng là xem chi tiết, chỉnh sửa và xóa. Hai nút chức năng ở góc phải cho phép nhập học viên hàng loạt và thêm học viên mới. Hiện tại, tenant mẫu của cô Đỗ Lan Khánh đã có 30 học viên được quản lý qua giao diện này, khớp với chỉ số trên dashboard tổng quan tại Hình 3.1. Việc tổ chức lớp học được thiết kế theo cấu trúc phân cấp: lớp học thuộc về từng khóa học, do đó giao diện quản lý lớp yêu cầu chọn khóa học trước khi hiển thị danh sách lớp tương ứng, phản ánh đúng mô hình nghiệp vụ dạy thêm tại Việt Nam.</w:t>
+      </w:r>
+    </w:p>
+    <w:p>
+      <w:pPr>
+        <w:pStyle w:val="Heading3"/>
+      </w:pPr>
+      <w:r>
+        <w:rPr>
+          <w:rFonts w:ascii="Times New Roman" w:hAnsi="Times New Roman" w:eastAsia="Times New Roman"/>
+          <w:b/>
+          <w:color w:val="000000"/>
+          <w:sz w:val="28"/>
+        </w:rPr>
+        <w:t>3.1.4 Phạm vi và hạn chế giao diện trình bày</w:t>
+      </w:r>
+    </w:p>
+    <w:p>
+      <w:pPr>
+        <w:spacing w:line="288" w:lineRule="auto"/>
+        <w:ind w:firstLine="567"/>
+        <w:jc w:val="both"/>
+      </w:pPr>
+      <w:r>
+        <w:rPr>
+          <w:rFonts w:ascii="Times New Roman" w:hAnsi="Times New Roman" w:eastAsia="Times New Roman"/>
+          <w:b w:val="0"/>
+          <w:i w:val="0"/>
+          <w:sz w:val="26"/>
+        </w:rPr>
+        <w:t>Bốn giao diện được trình bày trong ba nhóm chức năng trên đại diện cho các luồng đã hoàn thiện và có minh chứng thực tế hiện tại: trang chủ công khai mang thương hiệu riêng, tùy biến thương hiệu bằng AI, bảng tổng quan và quản lý học viên. Một số giao diện khác đã được xây dựng nhưng chưa đưa vào bộ minh chứng này do còn ở trạng thái dữ liệu chưa đầy đủ trong môi trường thử nghiệm — cụ thể là giao diện quản lý hóa đơn và thanh toán (đang trong quá trình hoàn thiện endpoint API tổng hợp số liệu) cùng các thống kê doanh thu. Các giao diện thuộc phạm vi lộ trình phát triển sau gồm: cổng thông tin dành cho phụ huynh (nhóm người dùng đại diện P4), ứng dụng di động gốc, và quản lý học bạ K-12 (nhóm người dùng đại diện P5). Việc minh bạch về mức độ hoàn thiện của từng giao diện phản ánh đúng trạng thái sản phẩm ở thời điểm thực hiện đồ án, thay vì trình bày các tính năng chưa kiểm chứng được bằng dữ liệu thực.</w:t>
       </w:r>
     </w:p>
     <w:p>
@@ -25074,7 +24258,23 @@
           <w:color w:val="000000"/>
           <w:sz w:val="32"/>
         </w:rPr>
-        <w:t>3.1 Công nghệ sử dụng</w:t>
+        <w:t>3.2 Kiểm thử và đánh giá chất lượng</w:t>
+      </w:r>
+    </w:p>
+    <w:p>
+      <w:pPr>
+        <w:spacing w:line="288" w:lineRule="auto"/>
+        <w:ind w:firstLine="567"/>
+        <w:jc w:val="both"/>
+      </w:pPr>
+      <w:r>
+        <w:rPr>
+          <w:rFonts w:ascii="Times New Roman" w:hAnsi="Times New Roman" w:eastAsia="Times New Roman"/>
+          <w:b w:val="0"/>
+          <w:i w:val="0"/>
+          <w:sz w:val="26"/>
+        </w:rPr>
+        <w:t>Mục này trình bày chiến lược kiểm thử của KiteHub Platform — kim tự tháp test pyramid, ba sample test case đại diện và kết quả đánh giá chất lượng định kỳ qua audit quarterly cadence.</w:t>
       </w:r>
     </w:p>
     <w:p>
@@ -25088,657 +24288,7 @@
           <w:color w:val="000000"/>
           <w:sz w:val="28"/>
         </w:rPr>
-        <w:t>3.1.1 Ngôn ngữ lập trình</w:t>
-      </w:r>
-    </w:p>
-    <w:p>
-      <w:pPr>
-        <w:spacing w:line="288" w:lineRule="auto"/>
-        <w:ind w:firstLine="567"/>
-        <w:jc w:val="both"/>
-      </w:pPr>
-      <w:r>
-        <w:rPr>
-          <w:rFonts w:ascii="Times New Roman" w:hAnsi="Times New Roman" w:eastAsia="Times New Roman"/>
-          <w:b w:val="0"/>
-          <w:i w:val="0"/>
-          <w:sz w:val="26"/>
-        </w:rPr>
-        <w:t>Nền tảng KiteHub sử dụng hai ngôn ngữ lập trình chính. Phía backend dùng Java 21 (LTS) — phiên bản hỗ trợ dài hạn được Oracle cam kết bảo trì đến năm 2031, kèm các tính năng hiện đại như virtual threads (Project Loom), pattern matching và records giúp viết code an toàn kiểu và biểu cảm. Phía frontend dùng TypeScript 5.7 — bản mở rộng kiểu tĩnh của JavaScript, hỗ trợ phát hiện lỗi sớm tại compile-time, refactoring an toàn và tích hợp IDE mạnh. Ngôn ngữ truy vấn cơ sở dữ liệu sử dụng SQL chuẩn PostgreSQL 16 dialect, kết hợp JPQL/Hibernate cho các truy vấn ORM phổ biến.</w:t>
-      </w:r>
-    </w:p>
-    <w:p>
-      <w:pPr>
-        <w:pStyle w:val="Heading3"/>
-      </w:pPr>
-      <w:r>
-        <w:rPr>
-          <w:rFonts w:ascii="Times New Roman" w:hAnsi="Times New Roman" w:eastAsia="Times New Roman"/>
-          <w:b/>
-          <w:color w:val="000000"/>
-          <w:sz w:val="28"/>
-        </w:rPr>
-        <w:t>3.1.2 Framework phát triển</w:t>
-      </w:r>
-    </w:p>
-    <w:p>
-      <w:pPr>
-        <w:spacing w:line="288" w:lineRule="auto"/>
-        <w:ind w:firstLine="567"/>
-        <w:jc w:val="both"/>
-      </w:pPr>
-      <w:r>
-        <w:rPr>
-          <w:rFonts w:ascii="Times New Roman" w:hAnsi="Times New Roman" w:eastAsia="Times New Roman"/>
-          <w:b w:val="0"/>
-          <w:i w:val="0"/>
-          <w:sz w:val="26"/>
-        </w:rPr>
-        <w:t>Phía backend, Spring Boot 3.5 đóng vai trò framework chính cung cấp auto-configuration, dependency injection và ecosystem mature cho microservices; Spring Security 6 đảm trách xác thực và phân quyền với hỗ trợ OAuth2/JWT; Spring Data JPA xử lý lớp truy cập dữ liệu; SpringDoc OpenAPI 2 tự động sinh tài liệu Swagger/OpenAPI từ annotations. Phía frontend, Next.js 15 cung cấp App Router, Server Components, SSR/SSG và image optimization; React 19 là thư viện UI nền tảng với hooks và concurrent features; Tailwind CSS 3.4 + Shadcn UI cho hệ thống styling utility-first; TanStack Query 5 + Zustand 5 quản lý state phía client; React Hook Form 7 + Zod 3 xử lý form và validation kiểu schema-driven.</w:t>
-      </w:r>
-    </w:p>
-    <w:p>
-      <w:pPr>
-        <w:pStyle w:val="Heading3"/>
-      </w:pPr>
-      <w:r>
-        <w:rPr>
-          <w:rFonts w:ascii="Times New Roman" w:hAnsi="Times New Roman" w:eastAsia="Times New Roman"/>
-          <w:b/>
-          <w:color w:val="000000"/>
-          <w:sz w:val="28"/>
-        </w:rPr>
-        <w:t>3.1.3 Công cụ phát triển</w:t>
-      </w:r>
-    </w:p>
-    <w:p>
-      <w:pPr>
-        <w:spacing w:line="288" w:lineRule="auto"/>
-        <w:ind w:firstLine="567"/>
-        <w:jc w:val="both"/>
-      </w:pPr>
-      <w:r>
-        <w:rPr>
-          <w:rFonts w:ascii="Times New Roman" w:hAnsi="Times New Roman" w:eastAsia="Times New Roman"/>
-          <w:b w:val="0"/>
-          <w:i w:val="0"/>
-          <w:sz w:val="26"/>
-        </w:rPr>
-        <w:t>Mỗi lập trình viên làm việc với IntelliJ IDEA Ultimate hoặc VS Code (extension Spring Boot + Java) cho backend; VS Code (extension TypeScript + Tailwind CSS + ESLint + Prettier) cho frontend. Quản lý phụ thuộc dùng Apache Maven 3.9 cho Java và pnpm 9 cho Node.js (lựa chọn pnpm thay npm/yarn nhờ disk space efficient và workspace mature). Phiên bản hóa source code qua Git + GitHub repository, với pre-commit hooks (Husky 9) chạy lint + format trước commit. Quy trình review code thực hiện qua GitHub Pull Request với required checks. Lombok 1.18 và MapStruct 1.6 hỗ trợ giảm boilerplate Java và mapping DTO compile-time.</w:t>
-      </w:r>
-    </w:p>
-    <w:p>
-      <w:pPr>
-        <w:pStyle w:val="Heading3"/>
-      </w:pPr>
-      <w:r>
-        <w:rPr>
-          <w:rFonts w:ascii="Times New Roman" w:hAnsi="Times New Roman" w:eastAsia="Times New Roman"/>
-          <w:b/>
-          <w:color w:val="000000"/>
-          <w:sz w:val="28"/>
-        </w:rPr>
-        <w:t>3.1.4 Công cụ kiểm thử</w:t>
-      </w:r>
-    </w:p>
-    <w:p>
-      <w:pPr>
-        <w:spacing w:line="288" w:lineRule="auto"/>
-        <w:ind w:firstLine="567"/>
-        <w:jc w:val="both"/>
-      </w:pPr>
-      <w:r>
-        <w:rPr>
-          <w:rFonts w:ascii="Times New Roman" w:hAnsi="Times New Roman" w:eastAsia="Times New Roman"/>
-          <w:b w:val="0"/>
-          <w:i w:val="0"/>
-          <w:sz w:val="26"/>
-        </w:rPr>
-        <w:t xml:space="preserve">Unit test phía backend sử dụng JUnit 5 (Jupiter) + AssertJ cho assertions biểu cảm + Mockito 5 cho mock dependencies. Integration test dùng Testcontainers 1.20 (PostgreSQL + Redis container ephemeral) đảm bảo môi trường test cô lập, không phụ thuộc dev DB. Spring Boot Test framework cung cấp </w:t>
-      </w:r>
-      <w:r>
-        <w:rPr>
-          <w:rFonts w:ascii="Times New Roman" w:hAnsi="Times New Roman" w:eastAsia="Times New Roman"/>
-          <w:b w:val="0"/>
-          <w:i/>
-          <w:sz w:val="26"/>
-        </w:rPr>
-        <w:t>@SpringBootTest</w:t>
-      </w:r>
-      <w:r>
-        <w:rPr>
-          <w:rFonts w:ascii="Times New Roman" w:hAnsi="Times New Roman" w:eastAsia="Times New Roman"/>
-          <w:b w:val="0"/>
-          <w:i w:val="0"/>
-          <w:sz w:val="26"/>
-        </w:rPr>
-        <w:t xml:space="preserve">, </w:t>
-      </w:r>
-      <w:r>
-        <w:rPr>
-          <w:rFonts w:ascii="Times New Roman" w:hAnsi="Times New Roman" w:eastAsia="Times New Roman"/>
-          <w:b w:val="0"/>
-          <w:i/>
-          <w:sz w:val="26"/>
-        </w:rPr>
-        <w:t>@DataJpaTest</w:t>
-      </w:r>
-      <w:r>
-        <w:rPr>
-          <w:rFonts w:ascii="Times New Roman" w:hAnsi="Times New Roman" w:eastAsia="Times New Roman"/>
-          <w:b w:val="0"/>
-          <w:i w:val="0"/>
-          <w:sz w:val="26"/>
-        </w:rPr>
-        <w:t xml:space="preserve">, </w:t>
-      </w:r>
-      <w:r>
-        <w:rPr>
-          <w:rFonts w:ascii="Times New Roman" w:hAnsi="Times New Roman" w:eastAsia="Times New Roman"/>
-          <w:b w:val="0"/>
-          <w:i/>
-          <w:sz w:val="26"/>
-        </w:rPr>
-        <w:t>@WebMvcTest</w:t>
-      </w:r>
-      <w:r>
-        <w:rPr>
-          <w:rFonts w:ascii="Times New Roman" w:hAnsi="Times New Roman" w:eastAsia="Times New Roman"/>
-          <w:b w:val="0"/>
-          <w:i w:val="0"/>
-          <w:sz w:val="26"/>
-        </w:rPr>
-        <w:t xml:space="preserve"> cho các test slice phù hợp. Phía frontend, Vitest 1 + React Testing Library cho unit test component; Playwright 1 cho end-to-end test browser-automation. Mã được kiểm tra chất lượng bằng SonarQube static analysis và OWASP Dependency-Check tự động trong CI pipeline.</w:t>
-      </w:r>
-    </w:p>
-    <w:p>
-      <w:pPr>
-        <w:pStyle w:val="Heading3"/>
-      </w:pPr>
-      <w:r>
-        <w:rPr>
-          <w:rFonts w:ascii="Times New Roman" w:hAnsi="Times New Roman" w:eastAsia="Times New Roman"/>
-          <w:b/>
-          <w:color w:val="000000"/>
-          <w:sz w:val="28"/>
-        </w:rPr>
-        <w:t>3.1.5 Công cụ triển khai</w:t>
-      </w:r>
-    </w:p>
-    <w:p>
-      <w:pPr>
-        <w:spacing w:line="288" w:lineRule="auto"/>
-        <w:ind w:firstLine="567"/>
-        <w:jc w:val="both"/>
-      </w:pPr>
-      <w:r>
-        <w:rPr>
-          <w:rFonts w:ascii="Times New Roman" w:hAnsi="Times New Roman" w:eastAsia="Times New Roman"/>
-          <w:b w:val="0"/>
-          <w:i w:val="0"/>
-          <w:sz w:val="26"/>
-        </w:rPr>
-        <w:t xml:space="preserve">Hạ tầng được mô tả bằng code (Infrastructure as Code) qua Terraform 1.5+ cho AWS resources (EC2, RDS, S3, SES, IAM, CloudWatch). Container hóa qua Docker 24 + Docker Compose 2 cho môi trường phát triển cục bộ; production triển khai container qua AWS Elastic Container Service (ECS) với task definitions JSON. Pipeline CI/CD chạy trên GitHub Actions với matrix builds (Java 21 + Node 22), tự động build + test + push container image lên AWS Elastic Container Registry (ECR). Phía vận hành, AWS Systems Manager (SSM) cung cấp shell access không cần SSH key; AWS CloudWatch tập hợp logs + metrics; AWS CloudTrail audit mọi thao tác API trên tài khoản. Phía CDN, Cloudflare đứng trước domain </w:t>
-      </w:r>
-      <w:r>
-        <w:rPr>
-          <w:rFonts w:ascii="Times New Roman" w:hAnsi="Times New Roman" w:eastAsia="Times New Roman"/>
-          <w:b w:val="0"/>
-          <w:i/>
-          <w:sz w:val="26"/>
-        </w:rPr>
-        <w:t>kitehub.me</w:t>
-      </w:r>
-      <w:r>
-        <w:rPr>
-          <w:rFonts w:ascii="Times New Roman" w:hAnsi="Times New Roman" w:eastAsia="Times New Roman"/>
-          <w:b w:val="0"/>
-          <w:i w:val="0"/>
-          <w:sz w:val="26"/>
-        </w:rPr>
-        <w:t xml:space="preserve"> (DNS + WAF + DDoS protection layer). Migration cơ sở dữ liệu qua Flyway 10 (versioned schema changes, idempotent migrations).</w:t>
-      </w:r>
-    </w:p>
-    <w:p>
-      <w:pPr>
-        <w:pStyle w:val="Heading2"/>
-      </w:pPr>
-      <w:r>
-        <w:rPr>
-          <w:rFonts w:ascii="Times New Roman" w:hAnsi="Times New Roman" w:eastAsia="Times New Roman"/>
-          <w:b/>
-          <w:color w:val="000000"/>
-          <w:sz w:val="32"/>
-        </w:rPr>
-        <w:t>3.2 Kết quả triển khai sản phẩm</w:t>
-      </w:r>
-    </w:p>
-    <w:p>
-      <w:pPr>
-        <w:spacing w:line="288" w:lineRule="auto"/>
-        <w:ind w:firstLine="567"/>
-        <w:jc w:val="both"/>
-      </w:pPr>
-      <w:r>
-        <w:rPr>
-          <w:rFonts w:ascii="Times New Roman" w:hAnsi="Times New Roman" w:eastAsia="Times New Roman"/>
-          <w:b w:val="0"/>
-          <w:i w:val="0"/>
-          <w:sz w:val="26"/>
-        </w:rPr>
-        <w:t>Phần này trình bày kết quả triển khai các giao diện cốt lõi của KiteHub Platform hiện tại theo ba luồng nghiệp vụ liên kết: hành trình khám phá và kích hoạt tenant của Chủ sở hữu trung tâm, các thao tác vận hành thường nhật, và bộ công cụ điều hành của Admin nền tảng. Các giao diện được nhóm theo flow nghiệp vụ thay vì liệt kê rời rạc nhằm phản ánh đúng trải nghiệm end-to-end của người dùng.</w:t>
-      </w:r>
-    </w:p>
-    <w:p>
-      <w:pPr>
-        <w:pStyle w:val="Heading3"/>
-      </w:pPr>
-      <w:r>
-        <w:rPr>
-          <w:rFonts w:ascii="Times New Roman" w:hAnsi="Times New Roman" w:eastAsia="Times New Roman"/>
-          <w:b/>
-          <w:color w:val="000000"/>
-          <w:sz w:val="28"/>
-        </w:rPr>
-        <w:t>3.2.1 Luồng khám phá và kích hoạt tenant (khách ẩn danh → chủ sở hữu trung tâm)</w:t>
-      </w:r>
-    </w:p>
-    <w:p>
-      <w:pPr>
-        <w:spacing w:before="120" w:after="60"/>
-        <w:jc w:val="center"/>
-      </w:pPr>
-      <w:r>
-        <w:rPr>
-          <w:rFonts w:ascii="Times New Roman" w:hAnsi="Times New Roman" w:eastAsia="Times New Roman"/>
-          <w:b w:val="0"/>
-          <w:i/>
-          <w:color w:val="808080"/>
-          <w:sz w:val="26"/>
-        </w:rPr>
-        <w:t>[Hình minh hoạ: 12-public-homepage-sky-branded.png — chưa có file]</w:t>
-      </w:r>
-    </w:p>
-    <w:p>
-      <w:pPr>
-        <w:spacing w:before="120" w:after="60"/>
-        <w:jc w:val="center"/>
-      </w:pPr>
-      <w:r>
-        <w:rPr>
-          <w:rFonts w:ascii="Times New Roman" w:hAnsi="Times New Roman" w:eastAsia="Times New Roman"/>
-          <w:b w:val="0"/>
-          <w:i/>
-          <w:color w:val="808080"/>
-          <w:sz w:val="26"/>
-        </w:rPr>
-        <w:t>[Hình minh hoạ: 01-login-page.png — chưa có file]</w:t>
-      </w:r>
-    </w:p>
-    <w:p>
-      <w:pPr>
-        <w:spacing w:before="120" w:after="60"/>
-        <w:jc w:val="center"/>
-      </w:pPr>
-      <w:r>
-        <w:rPr>
-          <w:rFonts w:ascii="Times New Roman" w:hAnsi="Times New Roman" w:eastAsia="Times New Roman"/>
-          <w:b w:val="0"/>
-          <w:i/>
-          <w:color w:val="808080"/>
-          <w:sz w:val="26"/>
-        </w:rPr>
-        <w:t>[Hình minh hoạ: 02-dashboard-overview-kpi-orange.png — chưa có file]</w:t>
-      </w:r>
-    </w:p>
-    <w:p>
-      <w:pPr>
-        <w:pStyle w:val="HìnhCaption"/>
-        <w:spacing w:before="120" w:after="240"/>
-        <w:jc w:val="center"/>
-      </w:pPr>
-      <w:r>
-        <w:rPr>
-          <w:rFonts w:ascii="Times New Roman" w:hAnsi="Times New Roman" w:eastAsia="Times New Roman"/>
-          <w:b/>
-          <w:sz w:val="26"/>
-        </w:rPr>
-        <w:t>Hình 3.1</w:t>
-      </w:r>
-      <w:r>
-        <w:rPr>
-          <w:rFonts w:ascii="Times New Roman" w:hAnsi="Times New Roman" w:eastAsia="Times New Roman"/>
-          <w:sz w:val="26"/>
-        </w:rPr>
-        <w:t>. Luồng khám phá và kích hoạt tenant qua ba bước nối tiếp: trang chủ công khai mang thương hiệu riêng của tenant, trang đăng nhập, và dashboard tổng quan sau đăng nhập</w:t>
-      </w:r>
-    </w:p>
-    <w:p>
-      <w:pPr>
-        <w:spacing w:line="288" w:lineRule="auto"/>
-        <w:ind w:firstLine="567"/>
-        <w:jc w:val="both"/>
-      </w:pPr>
-      <w:r>
-        <w:rPr>
-          <w:rFonts w:ascii="Times New Roman" w:hAnsi="Times New Roman" w:eastAsia="Times New Roman"/>
-          <w:b w:val="0"/>
-          <w:i/>
-          <w:sz w:val="26"/>
-        </w:rPr>
-        <w:t>Nguồn: ảnh chụp giao diện nền tảng KiteClass, truy cập 29/05/2026</w:t>
-      </w:r>
-    </w:p>
-    <w:p>
-      <w:pPr>
-        <w:spacing w:line="288" w:lineRule="auto"/>
-        <w:ind w:firstLine="567"/>
-        <w:jc w:val="both"/>
-      </w:pPr>
-      <w:r>
-        <w:rPr>
-          <w:rFonts w:ascii="Times New Roman" w:hAnsi="Times New Roman" w:eastAsia="Times New Roman"/>
-          <w:b w:val="0"/>
-          <w:i w:val="0"/>
-          <w:sz w:val="26"/>
-        </w:rPr>
-        <w:t>Luồng khám phá và kích hoạt tenant đưa người dùng tiềm năng từ điểm tiếp xúc đầu tiên đến trạng thái vận hành thông qua ba bước nối tiếp. Bước thứ nhất là trang chủ công khai của tenant — minh chứng tại Hình 3.1 là trang của cô Đỗ Lan Khánh (tên giả định), một giảng viên độc lập dạy thêm môn Pháp luật &amp; Đời sống bậc THPT, với bộ nhận diện thương hiệu riêng (tông màu xanh navy phối vàng gold chủ đạo, tên giảng viên và khẩu hiệu "Vững kiến thức - Vững tương lai"). Trang được dựng theo cấu trúc nhiều khối: giới thiệu, tính năng nổi bật (lộ trình học, quản lý học viên, học phí &amp; báo cáo), thông tin giảng viên, thành tích ôn luyện môn Giáo dục công dân và Pháp luật trong kỳ thi tốt nghiệp THPT, bảng học phí theo định dạng tiền tệ Việt Nam (</w:t>
-      </w:r>
-      <w:r>
-        <w:rPr>
-          <w:rFonts w:ascii="Times New Roman" w:hAnsi="Times New Roman" w:eastAsia="Times New Roman"/>
-          <w:b w:val="0"/>
-          <w:i/>
-          <w:sz w:val="26"/>
-        </w:rPr>
-        <w:t>1.500.000đ/tháng</w:t>
-      </w:r>
-      <w:r>
-        <w:rPr>
-          <w:rFonts w:ascii="Times New Roman" w:hAnsi="Times New Roman" w:eastAsia="Times New Roman"/>
-          <w:b w:val="0"/>
-          <w:i w:val="0"/>
-          <w:sz w:val="26"/>
-        </w:rPr>
-        <w:t xml:space="preserve">, </w:t>
-      </w:r>
-      <w:r>
-        <w:rPr>
-          <w:rFonts w:ascii="Times New Roman" w:hAnsi="Times New Roman" w:eastAsia="Times New Roman"/>
-          <w:b w:val="0"/>
-          <w:i/>
-          <w:sz w:val="26"/>
-        </w:rPr>
-        <w:t>2.800.000đ/khóa</w:t>
-      </w:r>
-      <w:r>
-        <w:rPr>
-          <w:rFonts w:ascii="Times New Roman" w:hAnsi="Times New Roman" w:eastAsia="Times New Roman"/>
-          <w:b w:val="0"/>
-          <w:i w:val="0"/>
-          <w:sz w:val="26"/>
-        </w:rPr>
-        <w:t xml:space="preserve">, </w:t>
-      </w:r>
-      <w:r>
-        <w:rPr>
-          <w:rFonts w:ascii="Times New Roman" w:hAnsi="Times New Roman" w:eastAsia="Times New Roman"/>
-          <w:b w:val="0"/>
-          <w:i/>
-          <w:sz w:val="26"/>
-        </w:rPr>
-        <w:t>4.500.000đ/khóa chuyên sâu</w:t>
-      </w:r>
-      <w:r>
-        <w:rPr>
-          <w:rFonts w:ascii="Times New Roman" w:hAnsi="Times New Roman" w:eastAsia="Times New Roman"/>
-          <w:b w:val="0"/>
-          <w:i w:val="0"/>
-          <w:sz w:val="26"/>
-        </w:rPr>
-        <w:t>) và mục câu hỏi thường gặp. Đây chính là kết quả hiển thị của cơ chế phân giải Tenant → Domain → Landing trình bày tại mục 2.2.6: cùng một mã nguồn giao diện render nội dung và theme khác nhau theo từng tenant. Bước thứ hai là trang đăng nhập, nơi giảng viên nhập thông tin tài khoản đã được cấp sau khi yêu cầu truy cập được quản trị viên nền tảng duyệt. Bước thứ ba là dashboard tổng quan sau đăng nhập, hiển thị dòng tóm tắt "Hiện có 30 học viên · 1 khóa học" cùng sáu thẻ chỉ số (Học viên, Khóa học, Lớp học, Điểm danh hôm nay, Doanh thu tuần, Tỷ lệ giữ chân). Hiện tại, hai thẻ Học viên và Khóa học đã hiển thị số liệu thực (30 và 1), bốn thẻ còn lại tạm hiển thị dấu gạch ngang kèm ghi chú minh bạch "chưa có API tổng hợp; sẽ bổ sung khi endpoint thống kê dashboard sẵn sàng" — phản ánh trung thực mức độ hoàn thiện của tính năng thống kê ở thời điểm thực hiện đồ án.</w:t>
-      </w:r>
-    </w:p>
-    <w:p>
-      <w:pPr>
-        <w:pStyle w:val="Heading3"/>
-      </w:pPr>
-      <w:r>
-        <w:rPr>
-          <w:rFonts w:ascii="Times New Roman" w:hAnsi="Times New Roman" w:eastAsia="Times New Roman"/>
-          <w:b/>
-          <w:color w:val="000000"/>
-          <w:sz w:val="28"/>
-        </w:rPr>
-        <w:t>3.2.2 Tùy biến thương hiệu bằng AI (AI Branding)</w:t>
-      </w:r>
-    </w:p>
-    <w:p>
-      <w:pPr>
-        <w:spacing w:before="120" w:after="60"/>
-        <w:jc w:val="center"/>
-      </w:pPr>
-      <w:r>
-        <w:rPr>
-          <w:rFonts w:ascii="Times New Roman" w:hAnsi="Times New Roman" w:eastAsia="Times New Roman"/>
-          <w:b w:val="0"/>
-          <w:i/>
-          <w:color w:val="808080"/>
-          <w:sz w:val="26"/>
-        </w:rPr>
-        <w:t>[Hình minh hoạ: 03-branding-settings.png — chưa có file]</w:t>
-      </w:r>
-    </w:p>
-    <w:p>
-      <w:pPr>
-        <w:pStyle w:val="HìnhCaption"/>
-        <w:spacing w:before="120" w:after="240"/>
-        <w:jc w:val="center"/>
-      </w:pPr>
-      <w:r>
-        <w:rPr>
-          <w:rFonts w:ascii="Times New Roman" w:hAnsi="Times New Roman" w:eastAsia="Times New Roman"/>
-          <w:b/>
-          <w:sz w:val="26"/>
-        </w:rPr>
-        <w:t>Hình 3.2</w:t>
-      </w:r>
-      <w:r>
-        <w:rPr>
-          <w:rFonts w:ascii="Times New Roman" w:hAnsi="Times New Roman" w:eastAsia="Times New Roman"/>
-          <w:sz w:val="26"/>
-        </w:rPr>
-        <w:t>. Giao diện tính năng AI Branding cho phép Chủ sở hữu trung tâm tạo bộ nhận diện thương hiệu qua trình hướng dẫn nhiều bước</w:t>
-      </w:r>
-    </w:p>
-    <w:p>
-      <w:pPr>
-        <w:spacing w:line="288" w:lineRule="auto"/>
-        <w:ind w:firstLine="567"/>
-        <w:jc w:val="both"/>
-      </w:pPr>
-      <w:r>
-        <w:rPr>
-          <w:rFonts w:ascii="Times New Roman" w:hAnsi="Times New Roman" w:eastAsia="Times New Roman"/>
-          <w:b w:val="0"/>
-          <w:i/>
-          <w:sz w:val="26"/>
-        </w:rPr>
-        <w:t>Nguồn: ảnh chụp giao diện nền tảng KiteClass, truy cập 29/05/2026</w:t>
-      </w:r>
-    </w:p>
-    <w:p>
-      <w:pPr>
-        <w:spacing w:line="288" w:lineRule="auto"/>
-        <w:ind w:firstLine="567"/>
-        <w:jc w:val="both"/>
-      </w:pPr>
-      <w:r>
-        <w:rPr>
-          <w:rFonts w:ascii="Times New Roman" w:hAnsi="Times New Roman" w:eastAsia="Times New Roman"/>
-          <w:b w:val="0"/>
-          <w:i w:val="0"/>
-          <w:sz w:val="26"/>
-        </w:rPr>
-        <w:t>AI Branding là một trong những điểm khác biệt cốt lõi của nền tảng, cho phép mỗi trung tâm tạo bộ nhận diện thương hiệu chuyên nghiệp mà không cần kiến thức thiết kế. Như minh chứng tại Hình 3.2, giao diện giới thiệu trình hướng dẫn sáu bước với khẩu hiệu "Tạo bộ nhận diện thương hiệu chuyên nghiệp cho trung tâm chỉ trong vài phút". Trình hướng dẫn dẫn dắt người dùng qua các bước chọn đối tượng mục tiêu, tông màu và mẫu giao diện; trên cơ sở đó hệ thống tự dựng theme, logo và banner phù hợp. Ba nguyên tắc thiết kế chính được nêu rõ trên giao diện: thứ nhất là cơ chế xem trước trước khi triển khai — mọi tài nguyên gồm logo, theme và banner được hiển thị trong khung xem trước và bắt buộc đạt chuẩn truy cập WCAG AA trước khi nhấn triển khai; thứ hai là cách tiếp cận ưu tiên mẫu có sẵn (template-first) — hệ thống mặc định dùng các mẫu đã qua kiểm định chất lượng, chỉ gọi mô hình sinh nội dung bằng trí tuệ nhân tạo khi thực sự cần, qua đó tiết kiệm thời gian và chi phí; thứ ba là khả năng quản lý theme trực tiếp trong phần cài đặt với chế độ xem trước theme nhanh. Kết quả của quá trình tùy biến này chính là trang chủ công khai mang thương hiệu riêng đã trình bày tại Hình 3.1.</w:t>
-      </w:r>
-    </w:p>
-    <w:p>
-      <w:pPr>
-        <w:pStyle w:val="Heading3"/>
-      </w:pPr>
-      <w:r>
-        <w:rPr>
-          <w:rFonts w:ascii="Times New Roman" w:hAnsi="Times New Roman" w:eastAsia="Times New Roman"/>
-          <w:b/>
-          <w:color w:val="000000"/>
-          <w:sz w:val="28"/>
-        </w:rPr>
-        <w:t>3.2.3 Quản lý học viên và tổ chức vận hành</w:t>
-      </w:r>
-    </w:p>
-    <w:p>
-      <w:pPr>
-        <w:spacing w:before="120" w:after="60"/>
-        <w:jc w:val="center"/>
-      </w:pPr>
-      <w:r>
-        <w:rPr>
-          <w:rFonts w:ascii="Times New Roman" w:hAnsi="Times New Roman" w:eastAsia="Times New Roman"/>
-          <w:b w:val="0"/>
-          <w:i/>
-          <w:color w:val="808080"/>
-          <w:sz w:val="26"/>
-        </w:rPr>
-        <w:t>[Hình minh hoạ: 05-students.png — chưa có file]</w:t>
-      </w:r>
-    </w:p>
-    <w:p>
-      <w:pPr>
-        <w:pStyle w:val="HìnhCaption"/>
-        <w:spacing w:before="120" w:after="240"/>
-        <w:jc w:val="center"/>
-      </w:pPr>
-      <w:r>
-        <w:rPr>
-          <w:rFonts w:ascii="Times New Roman" w:hAnsi="Times New Roman" w:eastAsia="Times New Roman"/>
-          <w:b/>
-          <w:sz w:val="26"/>
-        </w:rPr>
-        <w:t>Hình 3.3</w:t>
-      </w:r>
-      <w:r>
-        <w:rPr>
-          <w:rFonts w:ascii="Times New Roman" w:hAnsi="Times New Roman" w:eastAsia="Times New Roman"/>
-          <w:sz w:val="26"/>
-        </w:rPr>
-        <w:t>. Giao diện quản lý danh sách học viên của trung tâm với bảng dữ liệu, tìm kiếm và các thao tác quản trị</w:t>
-      </w:r>
-    </w:p>
-    <w:p>
-      <w:pPr>
-        <w:spacing w:line="288" w:lineRule="auto"/>
-        <w:ind w:firstLine="567"/>
-        <w:jc w:val="both"/>
-      </w:pPr>
-      <w:r>
-        <w:rPr>
-          <w:rFonts w:ascii="Times New Roman" w:hAnsi="Times New Roman" w:eastAsia="Times New Roman"/>
-          <w:b w:val="0"/>
-          <w:i/>
-          <w:sz w:val="26"/>
-        </w:rPr>
-        <w:t>Nguồn: ảnh chụp giao diện nền tảng KiteClass, truy cập 29/05/2026</w:t>
-      </w:r>
-    </w:p>
-    <w:p>
-      <w:pPr>
-        <w:spacing w:line="288" w:lineRule="auto"/>
-        <w:ind w:firstLine="567"/>
-        <w:jc w:val="both"/>
-      </w:pPr>
-      <w:r>
-        <w:rPr>
-          <w:rFonts w:ascii="Times New Roman" w:hAnsi="Times New Roman" w:eastAsia="Times New Roman"/>
-          <w:b w:val="0"/>
-          <w:i w:val="0"/>
-          <w:sz w:val="26"/>
-        </w:rPr>
-        <w:t>Sau khi tenant được kích hoạt, Chủ sở hữu trung tâm và Quản lý sử dụng nhóm chức năng vận hành để tổ chức học viên, lớp học và khóa học. Hình 3.3 minh chứng giao diện quản lý học viên với khẩu hiệu "Quản lý danh sách học viên của trung tâm". Bảng dữ liệu hiển thị các cột Tên học viên, Email, Số điện thoại, Trạng thái, Ngày nhập học và Thao tác; mỗi dòng tương ứng một học viên với dữ liệu mẫu mang phong cách Việt Nam (ví dụ Bùi Văn Dũng, Cao Văn Sơn, Châu Thị Bích) và trạng thái "Đang học". Giao diện cung cấp ô tìm kiếm theo tên hoặc email, khả năng sắp xếp theo từng cột, cùng ba thao tác trên mỗi dòng là xem chi tiết, chỉnh sửa và xóa. Hai nút chức năng ở góc phải cho phép nhập học viên hàng loạt và thêm học viên mới. Hiện tại, tenant mẫu của cô Đỗ Lan Khánh đã có 30 học viên được quản lý qua giao diện này, khớp với chỉ số trên dashboard tổng quan tại Hình 3.1. Việc tổ chức lớp học được thiết kế theo cấu trúc phân cấp: lớp học thuộc về từng khóa học, do đó giao diện quản lý lớp yêu cầu chọn khóa học trước khi hiển thị danh sách lớp tương ứng, phản ánh đúng mô hình nghiệp vụ dạy thêm tại Việt Nam.</w:t>
-      </w:r>
-    </w:p>
-    <w:p>
-      <w:pPr>
-        <w:pStyle w:val="Heading3"/>
-      </w:pPr>
-      <w:r>
-        <w:rPr>
-          <w:rFonts w:ascii="Times New Roman" w:hAnsi="Times New Roman" w:eastAsia="Times New Roman"/>
-          <w:b/>
-          <w:color w:val="000000"/>
-          <w:sz w:val="28"/>
-        </w:rPr>
-        <w:t>3.2.4 Phạm vi và hạn chế giao diện trình bày</w:t>
-      </w:r>
-    </w:p>
-    <w:p>
-      <w:pPr>
-        <w:spacing w:line="288" w:lineRule="auto"/>
-        <w:ind w:firstLine="567"/>
-        <w:jc w:val="both"/>
-      </w:pPr>
-      <w:r>
-        <w:rPr>
-          <w:rFonts w:ascii="Times New Roman" w:hAnsi="Times New Roman" w:eastAsia="Times New Roman"/>
-          <w:b w:val="0"/>
-          <w:i w:val="0"/>
-          <w:sz w:val="26"/>
-        </w:rPr>
-        <w:t>Bốn giao diện được trình bày trong ba nhóm chức năng trên đại diện cho các luồng đã hoàn thiện và có minh chứng thực tế hiện tại: trang chủ công khai mang thương hiệu riêng, tùy biến thương hiệu bằng AI, bảng tổng quan và quản lý học viên. Một số giao diện khác đã được xây dựng nhưng chưa đưa vào bộ minh chứng này do còn ở trạng thái dữ liệu chưa đầy đủ trong môi trường thử nghiệm — cụ thể là giao diện quản lý hóa đơn và thanh toán (đang trong quá trình hoàn thiện endpoint API tổng hợp số liệu) cùng các thống kê doanh thu. Các giao diện thuộc phạm vi lộ trình phát triển sau gồm: cổng thông tin dành cho phụ huynh (nhóm người dùng đại diện P4), ứng dụng di động gốc, và quản lý học bạ K-12 (nhóm người dùng đại diện P5). Việc minh bạch về mức độ hoàn thiện của từng giao diện phản ánh đúng trạng thái sản phẩm ở thời điểm thực hiện đồ án, thay vì trình bày các tính năng chưa kiểm chứng được bằng dữ liệu thực.</w:t>
-      </w:r>
-    </w:p>
-    <w:p>
-      <w:pPr>
-        <w:pStyle w:val="Heading2"/>
-      </w:pPr>
-      <w:r>
-        <w:rPr>
-          <w:rFonts w:ascii="Times New Roman" w:hAnsi="Times New Roman" w:eastAsia="Times New Roman"/>
-          <w:b/>
-          <w:color w:val="000000"/>
-          <w:sz w:val="32"/>
-        </w:rPr>
-        <w:t>3.3 Kiểm thử và đánh giá chất lượng</w:t>
-      </w:r>
-    </w:p>
-    <w:p>
-      <w:pPr>
-        <w:spacing w:line="288" w:lineRule="auto"/>
-        <w:ind w:firstLine="567"/>
-        <w:jc w:val="both"/>
-      </w:pPr>
-      <w:r>
-        <w:rPr>
-          <w:rFonts w:ascii="Times New Roman" w:hAnsi="Times New Roman" w:eastAsia="Times New Roman"/>
-          <w:b w:val="0"/>
-          <w:i w:val="0"/>
-          <w:sz w:val="26"/>
-        </w:rPr>
-        <w:t>Mục này trình bày chiến lược kiểm thử của KiteHub Platform — kim tự tháp test pyramid, ba sample test case đại diện và kết quả đánh giá chất lượng định kỳ qua audit quarterly cadence.</w:t>
-      </w:r>
-    </w:p>
-    <w:p>
-      <w:pPr>
-        <w:pStyle w:val="Heading3"/>
-      </w:pPr>
-      <w:r>
-        <w:rPr>
-          <w:rFonts w:ascii="Times New Roman" w:hAnsi="Times New Roman" w:eastAsia="Times New Roman"/>
-          <w:b/>
-          <w:color w:val="000000"/>
-          <w:sz w:val="28"/>
-        </w:rPr>
-        <w:t>3.3.1 Tháp kiểm thử — chiến lược tổng quát</w:t>
+        <w:t>3.2.1 Tháp kiểm thử — chiến lược tổng quát</w:t>
       </w:r>
     </w:p>
     <w:p>
@@ -26002,7 +24552,7 @@
           <w:color w:val="000000"/>
           <w:sz w:val="28"/>
         </w:rPr>
-        <w:t>3.3.2 Tóm tắt kết quả kiểm thử</w:t>
+        <w:t>3.2.2 Tóm tắt kết quả kiểm thử</w:t>
       </w:r>
     </w:p>
     <w:p>

</xml_diff>

<commit_message>
fix(thesis): C3 orphan citation reconcile — re-cite 8 anchored ([29]JWT/[30]Spring Security/[38]DORA/[31]GPT-4/[32]NSFW/[23]IEEE730/[34]NĐ147/[35]PDPL paper) + remove [22] Poppendieck (content trimmed) → 0 orphan, 39 entries ≥30 (wave-thesis-4)
</commit_message>
<xml_diff>
--- a/documents/08-thesis/thesis-v1.docx
+++ b/documents/08-thesis/thesis-v1.docx
@@ -6626,7 +6626,7 @@
           <w:i w:val="0"/>
           <w:sz w:val="26"/>
         </w:rPr>
-        <w:t xml:space="preserve"> Luật Bảo vệ Dữ liệu Cá nhân năm 2023 (PDPL, thời hạn áp dụng 2026-07-01) [9], Luật An ninh mạng 2018 [10] và Nghị định 53/2022/NĐ-CP về bản địa hóa dữ liệu [11] là ba yêu cầu tuân thủ quan trọng cho mọi SaaS xử lý dữ liệu cá nhân tại Việt Nam. Hệ thống đề xuất tiếp cận theo nguyên tắc bảo mật và quyền riêng tư theo thiết kế (privacy-by-design), tích hợp các biện pháp tuân thủ ngay từ kiến trúc ban đầu: cô lập dữ liệu giữa các tenant bằng Row-Level Security, nhật ký kiểm toán bất biến phục vụ truy vết dữ liệu cá nhân, và thu thập sự đồng ý của người dùng ngay tại luồng đăng ký. Ở giai đoạn hiện tại, hệ thống vận hành trên hạ tầng AWS khu vực Singapore do ràng buộc chi phí; lộ trình phát triển sau bao gồm bản địa hóa dữ liệu sang vùng AWS Hà Nội hoặc nhà cung cấp đám mây trong nước nhằm đáp ứng đầy đủ Nghị định 53/2022/NĐ-CP trước khi mở rộng tới quy mô kích hoạt ngưỡng bản địa hóa dữ liệu. Trong khi đó, Mona eLMS, Easy Edu và BeeClass đang trong quá trình triển khai PDPL; DotB có sẵn nhưng mức giá cao.</w:t>
+        <w:t xml:space="preserve"> Luật Bảo vệ Dữ liệu Cá nhân năm 2023 (PDPL, thời hạn áp dụng 2026-07-01) [9], Luật An ninh mạng 2018 [10] và Nghị định 53/2022/NĐ-CP về bản địa hóa dữ liệu [11], cùng Nghị định 147/2024/NĐ-CP về giao dịch điện tử [34], là các yêu cầu tuân thủ quan trọng cho mọi SaaS xử lý dữ liệu cá nhân tại Việt Nam. Hệ thống đề xuất tiếp cận theo nguyên tắc bảo mật và quyền riêng tư theo thiết kế (privacy-by-design), tích hợp các biện pháp tuân thủ ngay từ kiến trúc ban đầu, phù hợp với khung tuân thủ cho phần mềm dịch vụ xử lý dữ liệu cá nhân tại Việt Nam [35]: cô lập dữ liệu giữa các tenant bằng Row-Level Security, nhật ký kiểm toán bất biến phục vụ truy vết dữ liệu cá nhân, và thu thập sự đồng ý của người dùng ngay tại luồng đăng ký. Ở giai đoạn hiện tại, hệ thống vận hành trên hạ tầng AWS khu vực Singapore do ràng buộc chi phí; lộ trình phát triển sau bao gồm bản địa hóa dữ liệu sang vùng AWS Hà Nội hoặc nhà cung cấp đám mây trong nước nhằm đáp ứng đầy đủ Nghị định 53/2022/NĐ-CP trước khi mở rộng tới quy mô kích hoạt ngưỡng bản địa hóa dữ liệu. Trong khi đó, Mona eLMS, Easy Edu và BeeClass đang trong quá trình triển khai PDPL; DotB có sẵn nhưng mức giá cao.</w:t>
       </w:r>
     </w:p>
     <w:p>
@@ -6830,7 +6830,7 @@
           <w:i w:val="0"/>
           <w:sz w:val="26"/>
         </w:rPr>
-        <w:t>Phía backend, Spring Boot 3.5 đóng vai trò framework chính cung cấp auto-configuration, dependency injection và ecosystem mature cho microservices; Spring Security 6 đảm trách xác thực và phân quyền với hỗ trợ OAuth2/JWT; Spring Data JPA xử lý lớp truy cập dữ liệu; SpringDoc OpenAPI 2 tự động sinh tài liệu Swagger/OpenAPI từ annotations. Phía frontend, Next.js 15 cung cấp App Router, Server Components, SSR/SSG và image optimization; React 19 là thư viện UI nền tảng với hooks và concurrent features; Tailwind CSS 3.4 + Shadcn UI cho hệ thống styling utility-first; TanStack Query 5 + Zustand 5 quản lý state phía client; React Hook Form 7 + Zod 3 xử lý form và validation kiểu schema-driven.</w:t>
+        <w:t>Phía backend, Spring Boot 3.5 đóng vai trò framework chính cung cấp auto-configuration, dependency injection và ecosystem mature cho microservices; Spring Security 6 [30] đảm trách xác thực và phân quyền với hỗ trợ OAuth2/JWT [29]; Spring Data JPA xử lý lớp truy cập dữ liệu; SpringDoc OpenAPI 2 tự động sinh tài liệu Swagger/OpenAPI từ annotations. Phía frontend, Next.js 15 cung cấp App Router, Server Components, SSR/SSG và image optimization; React 19 là thư viện UI nền tảng với hooks và concurrent features; Tailwind CSS 3.4 + Shadcn UI cho hệ thống styling utility-first; TanStack Query 5 + Zustand 5 quản lý state phía client; React Hook Form 7 + Zod 3 xử lý form và validation kiểu schema-driven.</w:t>
       </w:r>
     </w:p>
     <w:p>
@@ -24130,7 +24130,7 @@
           <w:i w:val="0"/>
           <w:sz w:val="26"/>
         </w:rPr>
-        <w:t>AI Branding là một trong những điểm khác biệt cốt lõi của nền tảng, cho phép mỗi trung tâm tạo bộ nhận diện thương hiệu chuyên nghiệp mà không cần kiến thức thiết kế. Như minh chứng tại Hình 3.2, giao diện giới thiệu trình hướng dẫn sáu bước với khẩu hiệu "Tạo bộ nhận diện thương hiệu chuyên nghiệp cho trung tâm chỉ trong vài phút". Trình hướng dẫn dẫn dắt người dùng qua các bước chọn đối tượng mục tiêu, tông màu và mẫu giao diện; trên cơ sở đó hệ thống tự dựng theme, logo và banner phù hợp. Ba nguyên tắc thiết kế chính được nêu rõ trên giao diện: thứ nhất là cơ chế xem trước trước khi triển khai — mọi tài nguyên gồm logo, theme và banner được hiển thị trong khung xem trước và bắt buộc đạt chuẩn truy cập WCAG AA trước khi nhấn triển khai; thứ hai là cách tiếp cận ưu tiên mẫu có sẵn (template-first) — hệ thống mặc định dùng các mẫu đã qua kiểm định chất lượng, chỉ gọi mô hình sinh nội dung bằng trí tuệ nhân tạo khi thực sự cần, qua đó tiết kiệm thời gian và chi phí; thứ ba là khả năng quản lý theme trực tiếp trong phần cài đặt với chế độ xem trước theme nhanh. Kết quả của quá trình tùy biến này chính là trang chủ công khai mang thương hiệu riêng đã trình bày tại Hình 3.1.</w:t>
+        <w:t>AI Branding là một trong những điểm khác biệt cốt lõi của nền tảng, cho phép mỗi trung tâm tạo bộ nhận diện thương hiệu chuyên nghiệp mà không cần kiến thức thiết kế. Như minh chứng tại Hình 3.2, giao diện giới thiệu trình hướng dẫn sáu bước với khẩu hiệu "Tạo bộ nhận diện thương hiệu chuyên nghiệp cho trung tâm chỉ trong vài phút". Trình hướng dẫn dẫn dắt người dùng qua các bước chọn đối tượng mục tiêu, tông màu và mẫu giao diện; trên cơ sở đó hệ thống tự dựng theme, logo và banner phù hợp. Ba nguyên tắc thiết kế chính được nêu rõ trên giao diện: thứ nhất là cơ chế xem trước trước khi triển khai — mọi tài nguyên gồm logo, theme và banner được hiển thị trong khung xem trước và bắt buộc đạt chuẩn truy cập WCAG AA và qua bộ phân loại an toàn nội dung tự động [32] trước khi nhấn triển khai; thứ hai là cách tiếp cận ưu tiên mẫu có sẵn (template-first) — hệ thống mặc định dùng các mẫu đã qua kiểm định chất lượng, chỉ gọi mô hình sinh nội dung bằng trí tuệ nhân tạo [31] khi thực sự cần, qua đó tiết kiệm thời gian và chi phí; thứ ba là khả năng quản lý theme trực tiếp trong phần cài đặt với chế độ xem trước theme nhanh. Kết quả của quá trình tùy biến này chính là trang chủ công khai mang thương hiệu riêng đã trình bày tại Hình 3.1.</w:t>
       </w:r>
     </w:p>
     <w:p>
@@ -24274,7 +24274,7 @@
           <w:i w:val="0"/>
           <w:sz w:val="26"/>
         </w:rPr>
-        <w:t>Mục này trình bày chiến lược kiểm thử của KiteHub Platform — kim tự tháp test pyramid, ba sample test case đại diện và kết quả đánh giá chất lượng định kỳ qua audit quarterly cadence.</w:t>
+        <w:t>Mục này trình bày chiến lược kiểm thử của KiteHub Platform — kim tự tháp test pyramid, ba sample test case đại diện và kết quả đánh giá chất lượng định kỳ theo quy trình đảm bảo chất lượng phần mềm (SQA) chuẩn IEEE 730 [23].</w:t>
       </w:r>
     </w:p>
     <w:p>
@@ -25423,7 +25423,7 @@
           <w:i w:val="0"/>
           <w:sz w:val="26"/>
         </w:rPr>
-        <w:t xml:space="preserve">CI/CD được triển khai qua GitHub Actions với pattern OIDC + workflow_dispatch + confirm-input, tham chiếu nguyên tắc Continuous Delivery hiện đại [37, tr.115] — kết hợp build artifact bất biến (Docker image tag theo SHA commit) và deployment gate có cognitive checkpoint (workflow input </w:t>
+        <w:t xml:space="preserve">CI/CD được triển khai qua GitHub Actions với pattern OIDC + workflow_dispatch + confirm-input, tham chiếu nguyên tắc Continuous Delivery hiện đại [37, tr.115] và các thực hành DevOps hiệu năng cao [38] — kết hợp build artifact bất biến (Docker image tag theo SHA commit) và deployment gate có cognitive checkpoint (workflow input </w:t>
       </w:r>
       <w:r>
         <w:rPr>
@@ -29324,49 +29324,6 @@
           <w:sz w:val="26"/>
         </w:rPr>
         <w:t>. Cambridge, MA: MIT Center for Advanced Engineering Study, 1986.</w:t>
-      </w:r>
-    </w:p>
-    <w:p>
-      <w:pPr>
-        <w:spacing w:after="120" w:line="276" w:lineRule="auto"/>
-        <w:ind w:left="357" w:hanging="357"/>
-        <w:jc w:val="both"/>
-      </w:pPr>
-      <w:r>
-        <w:rPr>
-          <w:rFonts w:ascii="Times New Roman" w:hAnsi="Times New Roman" w:eastAsia="Times New Roman"/>
-          <w:b w:val="0"/>
-          <w:i w:val="0"/>
-          <w:sz w:val="26"/>
-        </w:rPr>
-        <w:t xml:space="preserve">[22] </w:t>
-      </w:r>
-      <w:r>
-        <w:rPr>
-          <w:rFonts w:ascii="Times New Roman" w:hAnsi="Times New Roman" w:eastAsia="Times New Roman"/>
-          <w:b w:val="0"/>
-          <w:i w:val="0"/>
-          <w:sz w:val="26"/>
-        </w:rPr>
-        <w:t xml:space="preserve">M. Poppendieck and T. Poppendieck, </w:t>
-      </w:r>
-      <w:r>
-        <w:rPr>
-          <w:rFonts w:ascii="Times New Roman" w:hAnsi="Times New Roman" w:eastAsia="Times New Roman"/>
-          <w:b w:val="0"/>
-          <w:i/>
-          <w:sz w:val="26"/>
-        </w:rPr>
-        <w:t>Lean Software Development: An Agile Toolkit</w:t>
-      </w:r>
-      <w:r>
-        <w:rPr>
-          <w:rFonts w:ascii="Times New Roman" w:hAnsi="Times New Roman" w:eastAsia="Times New Roman"/>
-          <w:b w:val="0"/>
-          <w:i w:val="0"/>
-          <w:sz w:val="26"/>
-        </w:rPr>
-        <w:t>. Boston: Addison-Wesley Professional, 2003.</w:t>
       </w:r>
     </w:p>
     <w:p>

</xml_diff>